<commit_message>
calibration table + drop supplementary; tables/figures inline formatting
</commit_message>
<xml_diff>
--- a/manuscript/Path-AGNN-Cox_manuscript.docx
+++ b/manuscript/Path-AGNN-Cox_manuscript.docx
@@ -1997,7 +1997,7 @@
         <w:rPr>
           <w:b w:val="0"/>
         </w:rPr>
-        <w:t>We used stratified 5-fold cross-validation within each TCGA cohort (fold-stratified on the event indicator; random seed 42). The concordance index (C-index) served as the primary discrimination metric; the time-dependent AUC (mean over the 0.25/0.50/0.75 quantile times) was used as a secondary metric. For external validation, each model was retrained on the full TCGA cohort and evaluated on the GEO cohorts without any fine-tuning. Paired Wilcoxon signed-rank tests (per-dataset mean C-index, internal CV) were used to compare Path-AGNN-Cox against each baseline. Between-stratum rewiring was tested per pathway with a two-sample z-statistic on the per-edge mean weights using a pooled standard error, and the false discovery rate was controlled with the Benjamini–Hochberg procedure over the K pathways; the label-permutation null was generated with 1,000 permutations of the event labels. Pathway-level enrichment of the top-20 rewired pathways against a curated LUAD driver-pathway list was tested with the hypergeometric distribution over the 57-pathway cancer-core catalogue. Model hyperparameters are listed in the footnote of Table 2 (see config/benchmark.yaml). All deep models were trained on CPU with Adam; the full benchmark consumed approximately 1,500 CPU-hours.</w:t>
+        <w:t>We used stratified 5-fold cross-validation within each TCGA cohort (fold-stratified on the event indicator; random seed 42). The concordance index (C-index) served as the primary discrimination metric; the time-dependent AUC (mean over the 0.25/0.50/0.75 quantile times) was used as a secondary metric. For external validation, each model was retrained on the full TCGA cohort and evaluated on the GEO cohorts without any fine-tuning. Paired Wilcoxon signed-rank tests (per-dataset mean C-index, internal CV) were used to compare Path-AGNN-Cox against each baseline. Between-stratum rewiring was tested per pathway with a two-sample z-statistic on the per-edge mean weights using a pooled standard error, and the false discovery rate was controlled with the Benjamini–Hochberg procedure over the K pathways; the label-permutation null was generated with 1,000 permutations of the event labels. Pathway-level enrichment of the top-20 rewired pathways against a curated LUAD driver-pathway list was tested with the hypergeometric distribution over the 57-pathway cancer-core catalogue. For each trained model, per-patient edge weights were extracted from the last adaptive layer and patients were split at the median predicted risk. Static-model and standard-GAT controls followed the same protocol, and the permutation P was computed as one plus the number of null permutations with at least as many significant pathways, divided by 1,001. All analyses are implemented in benchmark/rewiring_analysis.py and the work/ scripts of the repository. Model hyperparameters are listed in the footnote of Table 2 (see config/benchmark.yaml). All deep models were trained on CPU with Adam; the full benchmark consumed approximately 1,500 CPU-hours.</w:t>
       </w:r>
     </w:p>
     <w:p>
@@ -2077,7 +2077,7 @@
         <w:rPr>
           <w:b w:val="0"/>
         </w:rPr>
-        <w:t>(config/benchmark.yaml). All hyperparameters were held fixed across cancer types and baselines; no cohort-specific tuning was performed. All deep models were trained from a single random</w:t>
+        <w:t>(config/benchmark.yaml). All hyperparameters were held fixed across cancer types and baselines; no cohort-specific tuning was performed. All deep models were trained from a single random Penalized Cox baselines were fit with penalizers of 0.05 for LASSO-Cox with 10-fold internal CV, 0.1 for Ridge-Cox, and l1_ratio 0.5 with penalizer 0.1 for Elastic-Net-Cox; the Random Survival Forest used 500 trees with min_samples_leaf 15; DeepSurv used hidden layers of widths 32 and 16, and Cox-nnet a single hidden layer of width 64.</w:t>
       </w:r>
     </w:p>
     <w:p>
@@ -7950,6 +7950,14 @@
       </w:r>
     </w:p>
     <w:p>
+      <w:r>
+        <w:rPr>
+          <w:b w:val="0"/>
+        </w:rPr>
+        <w:t>Calibration of the risk score was assessed with the slope of a univariate Cox regression of the standardized risk score and with the mean absolute deviation between model-predicted and Kaplan\u2013Meier survival across risk tertiles at the 25th, 50th and 75th percentiles of follow-up time as detailed in Table 5. The internal out-of-fold slope was -0.02 with 95% CI -0.16–0.12 and a calibration MAE of 0.02 in LUAD, and -0.05 with 95% CI -0.23–0.14 and MAE 0.01 in BRCA; the penalized Cox counterpart produced slopes of 0.39 and 0.49, respectively. External slopes for Path-AGNN-Cox ranged from -0.11 to 0.79 with a mean of 0.15.</w:t>
+      </w:r>
+    </w:p>
+    <w:p>
       <w:pPr>
         <w:jc w:val="center"/>
       </w:pPr>
@@ -8005,6 +8013,2208 @@
         <w:t>External validation across 25 GEO cohorts.** Per-cohort C-index of Path-AGNN-Cox vs. the best baseline; cohorts grouped by cancer type; dashed line at 0.50.</w:t>
       </w:r>
     </w:p>
+    <w:p>
+      <w:pPr>
+        <w:pStyle w:val="Heading3"/>
+      </w:pPr>
+      <w:r>
+        <w:t>Table 5. Calibration of the risk score in internal and external cohorts.</w:t>
+      </w:r>
+    </w:p>
+    <w:tbl>
+      <w:tblPr>
+        <w:tblStyle w:val="TableGrid"/>
+        <w:tblW w:type="auto" w:w="0"/>
+        <w:tblLook w:firstColumn="1" w:firstRow="1" w:lastColumn="0" w:lastRow="0" w:noHBand="0" w:noVBand="1" w:val="04A0"/>
+      </w:tblPr>
+      <w:tblGrid>
+        <w:gridCol w:w="960"/>
+        <w:gridCol w:w="960"/>
+        <w:gridCol w:w="960"/>
+        <w:gridCol w:w="960"/>
+        <w:gridCol w:w="960"/>
+        <w:gridCol w:w="960"/>
+        <w:gridCol w:w="960"/>
+        <w:gridCol w:w="960"/>
+        <w:gridCol w:w="960"/>
+      </w:tblGrid>
+      <w:tr>
+        <w:tc>
+          <w:tcPr>
+            <w:tcW w:type="dxa" w:w="960"/>
+          </w:tcPr>
+          <w:p>
+            <w:r/>
+            <w:r>
+              <w:rPr>
+                <w:b w:val="0"/>
+              </w:rPr>
+              <w:t>Dataset</w:t>
+            </w:r>
+          </w:p>
+        </w:tc>
+        <w:tc>
+          <w:tcPr>
+            <w:tcW w:type="dxa" w:w="960"/>
+          </w:tcPr>
+          <w:p>
+            <w:r/>
+            <w:r>
+              <w:rPr>
+                <w:b w:val="0"/>
+              </w:rPr>
+              <w:t>Setting</w:t>
+            </w:r>
+          </w:p>
+        </w:tc>
+        <w:tc>
+          <w:tcPr>
+            <w:tcW w:type="dxa" w:w="960"/>
+          </w:tcPr>
+          <w:p>
+            <w:r/>
+            <w:r>
+              <w:rPr>
+                <w:b w:val="0"/>
+              </w:rPr>
+              <w:t>Cohort</w:t>
+            </w:r>
+          </w:p>
+        </w:tc>
+        <w:tc>
+          <w:tcPr>
+            <w:tcW w:type="dxa" w:w="960"/>
+          </w:tcPr>
+          <w:p>
+            <w:r/>
+            <w:r>
+              <w:rPr>
+                <w:b w:val="0"/>
+              </w:rPr>
+              <w:t>Model</w:t>
+            </w:r>
+          </w:p>
+        </w:tc>
+        <w:tc>
+          <w:tcPr>
+            <w:tcW w:type="dxa" w:w="960"/>
+          </w:tcPr>
+          <w:p>
+            <w:r/>
+            <w:r>
+              <w:rPr>
+                <w:b w:val="0"/>
+              </w:rPr>
+              <w:t>N</w:t>
+            </w:r>
+          </w:p>
+        </w:tc>
+        <w:tc>
+          <w:tcPr>
+            <w:tcW w:type="dxa" w:w="960"/>
+          </w:tcPr>
+          <w:p>
+            <w:r/>
+            <w:r>
+              <w:rPr>
+                <w:b w:val="0"/>
+              </w:rPr>
+              <w:t>Events</w:t>
+            </w:r>
+          </w:p>
+        </w:tc>
+        <w:tc>
+          <w:tcPr>
+            <w:tcW w:type="dxa" w:w="960"/>
+          </w:tcPr>
+          <w:p>
+            <w:r/>
+            <w:r>
+              <w:rPr>
+                <w:b w:val="0"/>
+              </w:rPr>
+              <w:t>Slope</w:t>
+            </w:r>
+          </w:p>
+        </w:tc>
+        <w:tc>
+          <w:tcPr>
+            <w:tcW w:type="dxa" w:w="960"/>
+          </w:tcPr>
+          <w:p>
+            <w:r/>
+            <w:r>
+              <w:rPr>
+                <w:b w:val="0"/>
+              </w:rPr>
+              <w:t>95% CI</w:t>
+            </w:r>
+          </w:p>
+        </w:tc>
+        <w:tc>
+          <w:tcPr>
+            <w:tcW w:type="dxa" w:w="960"/>
+          </w:tcPr>
+          <w:p>
+            <w:r/>
+            <w:r>
+              <w:rPr>
+                <w:b w:val="0"/>
+              </w:rPr>
+              <w:t>MAE</w:t>
+            </w:r>
+          </w:p>
+        </w:tc>
+      </w:tr>
+      <w:tr>
+        <w:tc>
+          <w:tcPr>
+            <w:tcW w:type="dxa" w:w="960"/>
+          </w:tcPr>
+          <w:p>
+            <w:r/>
+            <w:r>
+              <w:rPr>
+                <w:b w:val="0"/>
+              </w:rPr>
+              <w:t>LUAD</w:t>
+            </w:r>
+          </w:p>
+        </w:tc>
+        <w:tc>
+          <w:tcPr>
+            <w:tcW w:type="dxa" w:w="960"/>
+          </w:tcPr>
+          <w:p>
+            <w:r/>
+            <w:r>
+              <w:rPr>
+                <w:b w:val="0"/>
+              </w:rPr>
+              <w:t>Internal CV</w:t>
+            </w:r>
+          </w:p>
+        </w:tc>
+        <w:tc>
+          <w:tcPr>
+            <w:tcW w:type="dxa" w:w="960"/>
+          </w:tcPr>
+          <w:p>
+            <w:r/>
+            <w:r>
+              <w:rPr>
+                <w:b w:val="0"/>
+              </w:rPr>
+              <w:t>LUAD</w:t>
+            </w:r>
+          </w:p>
+        </w:tc>
+        <w:tc>
+          <w:tcPr>
+            <w:tcW w:type="dxa" w:w="960"/>
+          </w:tcPr>
+          <w:p>
+            <w:r/>
+            <w:r>
+              <w:rPr>
+                <w:b w:val="0"/>
+              </w:rPr>
+              <w:t>Path-AGNN-Cox</w:t>
+            </w:r>
+          </w:p>
+        </w:tc>
+        <w:tc>
+          <w:tcPr>
+            <w:tcW w:type="dxa" w:w="960"/>
+          </w:tcPr>
+          <w:p>
+            <w:r/>
+            <w:r>
+              <w:rPr>
+                <w:b w:val="0"/>
+              </w:rPr>
+              <w:t>527</w:t>
+            </w:r>
+          </w:p>
+        </w:tc>
+        <w:tc>
+          <w:tcPr>
+            <w:tcW w:type="dxa" w:w="960"/>
+          </w:tcPr>
+          <w:p>
+            <w:r/>
+            <w:r>
+              <w:rPr>
+                <w:b w:val="0"/>
+              </w:rPr>
+              <w:t>188</w:t>
+            </w:r>
+          </w:p>
+        </w:tc>
+        <w:tc>
+          <w:tcPr>
+            <w:tcW w:type="dxa" w:w="960"/>
+          </w:tcPr>
+          <w:p>
+            <w:r/>
+            <w:r>
+              <w:rPr>
+                <w:b w:val="0"/>
+              </w:rPr>
+              <w:t>-0.02</w:t>
+            </w:r>
+          </w:p>
+        </w:tc>
+        <w:tc>
+          <w:tcPr>
+            <w:tcW w:type="dxa" w:w="960"/>
+          </w:tcPr>
+          <w:p>
+            <w:r/>
+            <w:r>
+              <w:rPr>
+                <w:b w:val="0"/>
+              </w:rPr>
+              <w:t>-0.16–0.12</w:t>
+            </w:r>
+          </w:p>
+        </w:tc>
+        <w:tc>
+          <w:tcPr>
+            <w:tcW w:type="dxa" w:w="960"/>
+          </w:tcPr>
+          <w:p>
+            <w:r/>
+            <w:r>
+              <w:rPr>
+                <w:b w:val="0"/>
+              </w:rPr>
+              <w:t>0.02</w:t>
+            </w:r>
+          </w:p>
+        </w:tc>
+      </w:tr>
+      <w:tr>
+        <w:tc>
+          <w:tcPr>
+            <w:tcW w:type="dxa" w:w="960"/>
+          </w:tcPr>
+          <w:p>
+            <w:r/>
+            <w:r>
+              <w:rPr>
+                <w:b w:val="0"/>
+              </w:rPr>
+              <w:t>LUAD</w:t>
+            </w:r>
+          </w:p>
+        </w:tc>
+        <w:tc>
+          <w:tcPr>
+            <w:tcW w:type="dxa" w:w="960"/>
+          </w:tcPr>
+          <w:p>
+            <w:r/>
+            <w:r>
+              <w:rPr>
+                <w:b w:val="0"/>
+              </w:rPr>
+              <w:t>Internal CV</w:t>
+            </w:r>
+          </w:p>
+        </w:tc>
+        <w:tc>
+          <w:tcPr>
+            <w:tcW w:type="dxa" w:w="960"/>
+          </w:tcPr>
+          <w:p>
+            <w:r/>
+            <w:r>
+              <w:rPr>
+                <w:b w:val="0"/>
+              </w:rPr>
+              <w:t>LUAD</w:t>
+            </w:r>
+          </w:p>
+        </w:tc>
+        <w:tc>
+          <w:tcPr>
+            <w:tcW w:type="dxa" w:w="960"/>
+          </w:tcPr>
+          <w:p>
+            <w:r/>
+            <w:r>
+              <w:rPr>
+                <w:b w:val="0"/>
+              </w:rPr>
+              <w:t>Ridge-Cox</w:t>
+            </w:r>
+          </w:p>
+        </w:tc>
+        <w:tc>
+          <w:tcPr>
+            <w:tcW w:type="dxa" w:w="960"/>
+          </w:tcPr>
+          <w:p>
+            <w:r/>
+            <w:r>
+              <w:rPr>
+                <w:b w:val="0"/>
+              </w:rPr>
+              <w:t>527</w:t>
+            </w:r>
+          </w:p>
+        </w:tc>
+        <w:tc>
+          <w:tcPr>
+            <w:tcW w:type="dxa" w:w="960"/>
+          </w:tcPr>
+          <w:p>
+            <w:r/>
+            <w:r>
+              <w:rPr>
+                <w:b w:val="0"/>
+              </w:rPr>
+              <w:t>188</w:t>
+            </w:r>
+          </w:p>
+        </w:tc>
+        <w:tc>
+          <w:tcPr>
+            <w:tcW w:type="dxa" w:w="960"/>
+          </w:tcPr>
+          <w:p>
+            <w:r/>
+            <w:r>
+              <w:rPr>
+                <w:b w:val="0"/>
+              </w:rPr>
+              <w:t>0.39</w:t>
+            </w:r>
+          </w:p>
+        </w:tc>
+        <w:tc>
+          <w:tcPr>
+            <w:tcW w:type="dxa" w:w="960"/>
+          </w:tcPr>
+          <w:p>
+            <w:r/>
+            <w:r>
+              <w:rPr>
+                <w:b w:val="0"/>
+              </w:rPr>
+              <w:t>0.25–0.53</w:t>
+            </w:r>
+          </w:p>
+        </w:tc>
+        <w:tc>
+          <w:tcPr>
+            <w:tcW w:type="dxa" w:w="960"/>
+          </w:tcPr>
+          <w:p>
+            <w:r/>
+            <w:r>
+              <w:rPr>
+                <w:b w:val="0"/>
+              </w:rPr>
+              <w:t>0.00</w:t>
+            </w:r>
+          </w:p>
+        </w:tc>
+      </w:tr>
+      <w:tr>
+        <w:tc>
+          <w:tcPr>
+            <w:tcW w:type="dxa" w:w="960"/>
+          </w:tcPr>
+          <w:p>
+            <w:r/>
+            <w:r>
+              <w:rPr>
+                <w:b w:val="0"/>
+              </w:rPr>
+              <w:t>LUAD</w:t>
+            </w:r>
+          </w:p>
+        </w:tc>
+        <w:tc>
+          <w:tcPr>
+            <w:tcW w:type="dxa" w:w="960"/>
+          </w:tcPr>
+          <w:p>
+            <w:r/>
+            <w:r>
+              <w:rPr>
+                <w:b w:val="0"/>
+              </w:rPr>
+              <w:t>External transfer</w:t>
+            </w:r>
+          </w:p>
+        </w:tc>
+        <w:tc>
+          <w:tcPr>
+            <w:tcW w:type="dxa" w:w="960"/>
+          </w:tcPr>
+          <w:p>
+            <w:r/>
+            <w:r>
+              <w:rPr>
+                <w:b w:val="0"/>
+              </w:rPr>
+              <w:t>GSE31210</w:t>
+            </w:r>
+          </w:p>
+        </w:tc>
+        <w:tc>
+          <w:tcPr>
+            <w:tcW w:type="dxa" w:w="960"/>
+          </w:tcPr>
+          <w:p>
+            <w:r/>
+            <w:r>
+              <w:rPr>
+                <w:b w:val="0"/>
+              </w:rPr>
+              <w:t>Path-AGNN-Cox</w:t>
+            </w:r>
+          </w:p>
+        </w:tc>
+        <w:tc>
+          <w:tcPr>
+            <w:tcW w:type="dxa" w:w="960"/>
+          </w:tcPr>
+          <w:p>
+            <w:r/>
+            <w:r>
+              <w:rPr>
+                <w:b w:val="0"/>
+              </w:rPr>
+              <w:t>226</w:t>
+            </w:r>
+          </w:p>
+        </w:tc>
+        <w:tc>
+          <w:tcPr>
+            <w:tcW w:type="dxa" w:w="960"/>
+          </w:tcPr>
+          <w:p>
+            <w:r/>
+            <w:r>
+              <w:rPr>
+                <w:b w:val="0"/>
+              </w:rPr>
+              <w:t>35</w:t>
+            </w:r>
+          </w:p>
+        </w:tc>
+        <w:tc>
+          <w:tcPr>
+            <w:tcW w:type="dxa" w:w="960"/>
+          </w:tcPr>
+          <w:p>
+            <w:r/>
+            <w:r>
+              <w:rPr>
+                <w:b w:val="0"/>
+              </w:rPr>
+              <w:t>0.79</w:t>
+            </w:r>
+          </w:p>
+        </w:tc>
+        <w:tc>
+          <w:tcPr>
+            <w:tcW w:type="dxa" w:w="960"/>
+          </w:tcPr>
+          <w:p>
+            <w:r/>
+            <w:r>
+              <w:rPr>
+                <w:b w:val="0"/>
+              </w:rPr>
+              <w:t>0.49–1.09</w:t>
+            </w:r>
+          </w:p>
+        </w:tc>
+        <w:tc>
+          <w:tcPr>
+            <w:tcW w:type="dxa" w:w="960"/>
+          </w:tcPr>
+          <w:p>
+            <w:r/>
+            <w:r>
+              <w:rPr>
+                <w:b w:val="0"/>
+              </w:rPr>
+              <w:t>0.03</w:t>
+            </w:r>
+          </w:p>
+        </w:tc>
+      </w:tr>
+      <w:tr>
+        <w:tc>
+          <w:tcPr>
+            <w:tcW w:type="dxa" w:w="960"/>
+          </w:tcPr>
+          <w:p>
+            <w:r/>
+            <w:r>
+              <w:rPr>
+                <w:b w:val="0"/>
+              </w:rPr>
+              <w:t>LUAD</w:t>
+            </w:r>
+          </w:p>
+        </w:tc>
+        <w:tc>
+          <w:tcPr>
+            <w:tcW w:type="dxa" w:w="960"/>
+          </w:tcPr>
+          <w:p>
+            <w:r/>
+            <w:r>
+              <w:rPr>
+                <w:b w:val="0"/>
+              </w:rPr>
+              <w:t>External transfer</w:t>
+            </w:r>
+          </w:p>
+        </w:tc>
+        <w:tc>
+          <w:tcPr>
+            <w:tcW w:type="dxa" w:w="960"/>
+          </w:tcPr>
+          <w:p>
+            <w:r/>
+            <w:r>
+              <w:rPr>
+                <w:b w:val="0"/>
+              </w:rPr>
+              <w:t>GSE31210</w:t>
+            </w:r>
+          </w:p>
+        </w:tc>
+        <w:tc>
+          <w:tcPr>
+            <w:tcW w:type="dxa" w:w="960"/>
+          </w:tcPr>
+          <w:p>
+            <w:r/>
+            <w:r>
+              <w:rPr>
+                <w:b w:val="0"/>
+              </w:rPr>
+              <w:t>Ridge-Cox</w:t>
+            </w:r>
+          </w:p>
+        </w:tc>
+        <w:tc>
+          <w:tcPr>
+            <w:tcW w:type="dxa" w:w="960"/>
+          </w:tcPr>
+          <w:p>
+            <w:r/>
+            <w:r>
+              <w:rPr>
+                <w:b w:val="0"/>
+              </w:rPr>
+              <w:t>226</w:t>
+            </w:r>
+          </w:p>
+        </w:tc>
+        <w:tc>
+          <w:tcPr>
+            <w:tcW w:type="dxa" w:w="960"/>
+          </w:tcPr>
+          <w:p>
+            <w:r/>
+            <w:r>
+              <w:rPr>
+                <w:b w:val="0"/>
+              </w:rPr>
+              <w:t>35</w:t>
+            </w:r>
+          </w:p>
+        </w:tc>
+        <w:tc>
+          <w:tcPr>
+            <w:tcW w:type="dxa" w:w="960"/>
+          </w:tcPr>
+          <w:p>
+            <w:r/>
+            <w:r>
+              <w:rPr>
+                <w:b w:val="0"/>
+              </w:rPr>
+              <w:t>0.57</w:t>
+            </w:r>
+          </w:p>
+        </w:tc>
+        <w:tc>
+          <w:tcPr>
+            <w:tcW w:type="dxa" w:w="960"/>
+          </w:tcPr>
+          <w:p>
+            <w:r/>
+            <w:r>
+              <w:rPr>
+                <w:b w:val="0"/>
+              </w:rPr>
+              <w:t>0.30–0.84</w:t>
+            </w:r>
+          </w:p>
+        </w:tc>
+        <w:tc>
+          <w:tcPr>
+            <w:tcW w:type="dxa" w:w="960"/>
+          </w:tcPr>
+          <w:p>
+            <w:r/>
+            <w:r>
+              <w:rPr>
+                <w:b w:val="0"/>
+              </w:rPr>
+              <w:t>0.05</w:t>
+            </w:r>
+          </w:p>
+        </w:tc>
+      </w:tr>
+      <w:tr>
+        <w:tc>
+          <w:tcPr>
+            <w:tcW w:type="dxa" w:w="960"/>
+          </w:tcPr>
+          <w:p>
+            <w:r/>
+            <w:r>
+              <w:rPr>
+                <w:b w:val="0"/>
+              </w:rPr>
+              <w:t>LUAD</w:t>
+            </w:r>
+          </w:p>
+        </w:tc>
+        <w:tc>
+          <w:tcPr>
+            <w:tcW w:type="dxa" w:w="960"/>
+          </w:tcPr>
+          <w:p>
+            <w:r/>
+            <w:r>
+              <w:rPr>
+                <w:b w:val="0"/>
+              </w:rPr>
+              <w:t>External transfer</w:t>
+            </w:r>
+          </w:p>
+        </w:tc>
+        <w:tc>
+          <w:tcPr>
+            <w:tcW w:type="dxa" w:w="960"/>
+          </w:tcPr>
+          <w:p>
+            <w:r/>
+            <w:r>
+              <w:rPr>
+                <w:b w:val="0"/>
+              </w:rPr>
+              <w:t>GSE50081</w:t>
+            </w:r>
+          </w:p>
+        </w:tc>
+        <w:tc>
+          <w:tcPr>
+            <w:tcW w:type="dxa" w:w="960"/>
+          </w:tcPr>
+          <w:p>
+            <w:r/>
+            <w:r>
+              <w:rPr>
+                <w:b w:val="0"/>
+              </w:rPr>
+              <w:t>Path-AGNN-Cox</w:t>
+            </w:r>
+          </w:p>
+        </w:tc>
+        <w:tc>
+          <w:tcPr>
+            <w:tcW w:type="dxa" w:w="960"/>
+          </w:tcPr>
+          <w:p>
+            <w:r/>
+            <w:r>
+              <w:rPr>
+                <w:b w:val="0"/>
+              </w:rPr>
+              <w:t>181</w:t>
+            </w:r>
+          </w:p>
+        </w:tc>
+        <w:tc>
+          <w:tcPr>
+            <w:tcW w:type="dxa" w:w="960"/>
+          </w:tcPr>
+          <w:p>
+            <w:r/>
+            <w:r>
+              <w:rPr>
+                <w:b w:val="0"/>
+              </w:rPr>
+              <w:t>75</w:t>
+            </w:r>
+          </w:p>
+        </w:tc>
+        <w:tc>
+          <w:tcPr>
+            <w:tcW w:type="dxa" w:w="960"/>
+          </w:tcPr>
+          <w:p>
+            <w:r/>
+            <w:r>
+              <w:rPr>
+                <w:b w:val="0"/>
+              </w:rPr>
+              <w:t>0.05</w:t>
+            </w:r>
+          </w:p>
+        </w:tc>
+        <w:tc>
+          <w:tcPr>
+            <w:tcW w:type="dxa" w:w="960"/>
+          </w:tcPr>
+          <w:p>
+            <w:r/>
+            <w:r>
+              <w:rPr>
+                <w:b w:val="0"/>
+              </w:rPr>
+              <w:t>-0.19–0.30</w:t>
+            </w:r>
+          </w:p>
+        </w:tc>
+        <w:tc>
+          <w:tcPr>
+            <w:tcW w:type="dxa" w:w="960"/>
+          </w:tcPr>
+          <w:p>
+            <w:r/>
+            <w:r>
+              <w:rPr>
+                <w:b w:val="0"/>
+              </w:rPr>
+              <w:t>0.05</w:t>
+            </w:r>
+          </w:p>
+        </w:tc>
+      </w:tr>
+      <w:tr>
+        <w:tc>
+          <w:tcPr>
+            <w:tcW w:type="dxa" w:w="960"/>
+          </w:tcPr>
+          <w:p>
+            <w:r/>
+            <w:r>
+              <w:rPr>
+                <w:b w:val="0"/>
+              </w:rPr>
+              <w:t>LUAD</w:t>
+            </w:r>
+          </w:p>
+        </w:tc>
+        <w:tc>
+          <w:tcPr>
+            <w:tcW w:type="dxa" w:w="960"/>
+          </w:tcPr>
+          <w:p>
+            <w:r/>
+            <w:r>
+              <w:rPr>
+                <w:b w:val="0"/>
+              </w:rPr>
+              <w:t>External transfer</w:t>
+            </w:r>
+          </w:p>
+        </w:tc>
+        <w:tc>
+          <w:tcPr>
+            <w:tcW w:type="dxa" w:w="960"/>
+          </w:tcPr>
+          <w:p>
+            <w:r/>
+            <w:r>
+              <w:rPr>
+                <w:b w:val="0"/>
+              </w:rPr>
+              <w:t>GSE50081</w:t>
+            </w:r>
+          </w:p>
+        </w:tc>
+        <w:tc>
+          <w:tcPr>
+            <w:tcW w:type="dxa" w:w="960"/>
+          </w:tcPr>
+          <w:p>
+            <w:r/>
+            <w:r>
+              <w:rPr>
+                <w:b w:val="0"/>
+              </w:rPr>
+              <w:t>Ridge-Cox</w:t>
+            </w:r>
+          </w:p>
+        </w:tc>
+        <w:tc>
+          <w:tcPr>
+            <w:tcW w:type="dxa" w:w="960"/>
+          </w:tcPr>
+          <w:p>
+            <w:r/>
+            <w:r>
+              <w:rPr>
+                <w:b w:val="0"/>
+              </w:rPr>
+              <w:t>181</w:t>
+            </w:r>
+          </w:p>
+        </w:tc>
+        <w:tc>
+          <w:tcPr>
+            <w:tcW w:type="dxa" w:w="960"/>
+          </w:tcPr>
+          <w:p>
+            <w:r/>
+            <w:r>
+              <w:rPr>
+                <w:b w:val="0"/>
+              </w:rPr>
+              <w:t>75</w:t>
+            </w:r>
+          </w:p>
+        </w:tc>
+        <w:tc>
+          <w:tcPr>
+            <w:tcW w:type="dxa" w:w="960"/>
+          </w:tcPr>
+          <w:p>
+            <w:r/>
+            <w:r>
+              <w:rPr>
+                <w:b w:val="0"/>
+              </w:rPr>
+              <w:t>0.17</w:t>
+            </w:r>
+          </w:p>
+        </w:tc>
+        <w:tc>
+          <w:tcPr>
+            <w:tcW w:type="dxa" w:w="960"/>
+          </w:tcPr>
+          <w:p>
+            <w:r/>
+            <w:r>
+              <w:rPr>
+                <w:b w:val="0"/>
+              </w:rPr>
+              <w:t>-0.05–0.38</w:t>
+            </w:r>
+          </w:p>
+        </w:tc>
+        <w:tc>
+          <w:tcPr>
+            <w:tcW w:type="dxa" w:w="960"/>
+          </w:tcPr>
+          <w:p>
+            <w:r/>
+            <w:r>
+              <w:rPr>
+                <w:b w:val="0"/>
+              </w:rPr>
+              <w:t>0.09</w:t>
+            </w:r>
+          </w:p>
+        </w:tc>
+      </w:tr>
+      <w:tr>
+        <w:tc>
+          <w:tcPr>
+            <w:tcW w:type="dxa" w:w="960"/>
+          </w:tcPr>
+          <w:p>
+            <w:r/>
+            <w:r>
+              <w:rPr>
+                <w:b w:val="0"/>
+              </w:rPr>
+              <w:t>LUAD</w:t>
+            </w:r>
+          </w:p>
+        </w:tc>
+        <w:tc>
+          <w:tcPr>
+            <w:tcW w:type="dxa" w:w="960"/>
+          </w:tcPr>
+          <w:p>
+            <w:r/>
+            <w:r>
+              <w:rPr>
+                <w:b w:val="0"/>
+              </w:rPr>
+              <w:t>External transfer</w:t>
+            </w:r>
+          </w:p>
+        </w:tc>
+        <w:tc>
+          <w:tcPr>
+            <w:tcW w:type="dxa" w:w="960"/>
+          </w:tcPr>
+          <w:p>
+            <w:r/>
+            <w:r>
+              <w:rPr>
+                <w:b w:val="0"/>
+              </w:rPr>
+              <w:t>GSE68465</w:t>
+            </w:r>
+          </w:p>
+        </w:tc>
+        <w:tc>
+          <w:tcPr>
+            <w:tcW w:type="dxa" w:w="960"/>
+          </w:tcPr>
+          <w:p>
+            <w:r/>
+            <w:r>
+              <w:rPr>
+                <w:b w:val="0"/>
+              </w:rPr>
+              <w:t>Path-AGNN-Cox</w:t>
+            </w:r>
+          </w:p>
+        </w:tc>
+        <w:tc>
+          <w:tcPr>
+            <w:tcW w:type="dxa" w:w="960"/>
+          </w:tcPr>
+          <w:p>
+            <w:r/>
+            <w:r>
+              <w:rPr>
+                <w:b w:val="0"/>
+              </w:rPr>
+              <w:t>442</w:t>
+            </w:r>
+          </w:p>
+        </w:tc>
+        <w:tc>
+          <w:tcPr>
+            <w:tcW w:type="dxa" w:w="960"/>
+          </w:tcPr>
+          <w:p>
+            <w:r/>
+            <w:r>
+              <w:rPr>
+                <w:b w:val="0"/>
+              </w:rPr>
+              <w:t>236</w:t>
+            </w:r>
+          </w:p>
+        </w:tc>
+        <w:tc>
+          <w:tcPr>
+            <w:tcW w:type="dxa" w:w="960"/>
+          </w:tcPr>
+          <w:p>
+            <w:r/>
+            <w:r>
+              <w:rPr>
+                <w:b w:val="0"/>
+              </w:rPr>
+              <w:t>0.05</w:t>
+            </w:r>
+          </w:p>
+        </w:tc>
+        <w:tc>
+          <w:tcPr>
+            <w:tcW w:type="dxa" w:w="960"/>
+          </w:tcPr>
+          <w:p>
+            <w:r/>
+            <w:r>
+              <w:rPr>
+                <w:b w:val="0"/>
+              </w:rPr>
+              <w:t>-0.09–0.18</w:t>
+            </w:r>
+          </w:p>
+        </w:tc>
+        <w:tc>
+          <w:tcPr>
+            <w:tcW w:type="dxa" w:w="960"/>
+          </w:tcPr>
+          <w:p>
+            <w:r/>
+            <w:r>
+              <w:rPr>
+                <w:b w:val="0"/>
+              </w:rPr>
+              <w:t>0.02</w:t>
+            </w:r>
+          </w:p>
+        </w:tc>
+      </w:tr>
+      <w:tr>
+        <w:tc>
+          <w:tcPr>
+            <w:tcW w:type="dxa" w:w="960"/>
+          </w:tcPr>
+          <w:p>
+            <w:r/>
+            <w:r>
+              <w:rPr>
+                <w:b w:val="0"/>
+              </w:rPr>
+              <w:t>LUAD</w:t>
+            </w:r>
+          </w:p>
+        </w:tc>
+        <w:tc>
+          <w:tcPr>
+            <w:tcW w:type="dxa" w:w="960"/>
+          </w:tcPr>
+          <w:p>
+            <w:r/>
+            <w:r>
+              <w:rPr>
+                <w:b w:val="0"/>
+              </w:rPr>
+              <w:t>External transfer</w:t>
+            </w:r>
+          </w:p>
+        </w:tc>
+        <w:tc>
+          <w:tcPr>
+            <w:tcW w:type="dxa" w:w="960"/>
+          </w:tcPr>
+          <w:p>
+            <w:r/>
+            <w:r>
+              <w:rPr>
+                <w:b w:val="0"/>
+              </w:rPr>
+              <w:t>GSE68465</w:t>
+            </w:r>
+          </w:p>
+        </w:tc>
+        <w:tc>
+          <w:tcPr>
+            <w:tcW w:type="dxa" w:w="960"/>
+          </w:tcPr>
+          <w:p>
+            <w:r/>
+            <w:r>
+              <w:rPr>
+                <w:b w:val="0"/>
+              </w:rPr>
+              <w:t>Ridge-Cox</w:t>
+            </w:r>
+          </w:p>
+        </w:tc>
+        <w:tc>
+          <w:tcPr>
+            <w:tcW w:type="dxa" w:w="960"/>
+          </w:tcPr>
+          <w:p>
+            <w:r/>
+            <w:r>
+              <w:rPr>
+                <w:b w:val="0"/>
+              </w:rPr>
+              <w:t>442</w:t>
+            </w:r>
+          </w:p>
+        </w:tc>
+        <w:tc>
+          <w:tcPr>
+            <w:tcW w:type="dxa" w:w="960"/>
+          </w:tcPr>
+          <w:p>
+            <w:r/>
+            <w:r>
+              <w:rPr>
+                <w:b w:val="0"/>
+              </w:rPr>
+              <w:t>236</w:t>
+            </w:r>
+          </w:p>
+        </w:tc>
+        <w:tc>
+          <w:tcPr>
+            <w:tcW w:type="dxa" w:w="960"/>
+          </w:tcPr>
+          <w:p>
+            <w:r/>
+            <w:r>
+              <w:rPr>
+                <w:b w:val="0"/>
+              </w:rPr>
+              <w:t>0.22</w:t>
+            </w:r>
+          </w:p>
+        </w:tc>
+        <w:tc>
+          <w:tcPr>
+            <w:tcW w:type="dxa" w:w="960"/>
+          </w:tcPr>
+          <w:p>
+            <w:r/>
+            <w:r>
+              <w:rPr>
+                <w:b w:val="0"/>
+              </w:rPr>
+              <w:t>0.10–0.34</w:t>
+            </w:r>
+          </w:p>
+        </w:tc>
+        <w:tc>
+          <w:tcPr>
+            <w:tcW w:type="dxa" w:w="960"/>
+          </w:tcPr>
+          <w:p>
+            <w:r/>
+            <w:r>
+              <w:rPr>
+                <w:b w:val="0"/>
+              </w:rPr>
+              <w:t>0.04</w:t>
+            </w:r>
+          </w:p>
+        </w:tc>
+      </w:tr>
+      <w:tr>
+        <w:tc>
+          <w:tcPr>
+            <w:tcW w:type="dxa" w:w="960"/>
+          </w:tcPr>
+          <w:p>
+            <w:r/>
+            <w:r>
+              <w:rPr>
+                <w:b w:val="0"/>
+              </w:rPr>
+              <w:t>BRCA</w:t>
+            </w:r>
+          </w:p>
+        </w:tc>
+        <w:tc>
+          <w:tcPr>
+            <w:tcW w:type="dxa" w:w="960"/>
+          </w:tcPr>
+          <w:p>
+            <w:r/>
+            <w:r>
+              <w:rPr>
+                <w:b w:val="0"/>
+              </w:rPr>
+              <w:t>Internal CV</w:t>
+            </w:r>
+          </w:p>
+        </w:tc>
+        <w:tc>
+          <w:tcPr>
+            <w:tcW w:type="dxa" w:w="960"/>
+          </w:tcPr>
+          <w:p>
+            <w:r/>
+            <w:r>
+              <w:rPr>
+                <w:b w:val="0"/>
+              </w:rPr>
+              <w:t>BRCA</w:t>
+            </w:r>
+          </w:p>
+        </w:tc>
+        <w:tc>
+          <w:tcPr>
+            <w:tcW w:type="dxa" w:w="960"/>
+          </w:tcPr>
+          <w:p>
+            <w:r/>
+            <w:r>
+              <w:rPr>
+                <w:b w:val="0"/>
+              </w:rPr>
+              <w:t>Path-AGNN-Cox</w:t>
+            </w:r>
+          </w:p>
+        </w:tc>
+        <w:tc>
+          <w:tcPr>
+            <w:tcW w:type="dxa" w:w="960"/>
+          </w:tcPr>
+          <w:p>
+            <w:r/>
+            <w:r>
+              <w:rPr>
+                <w:b w:val="0"/>
+              </w:rPr>
+              <w:t>1086</w:t>
+            </w:r>
+          </w:p>
+        </w:tc>
+        <w:tc>
+          <w:tcPr>
+            <w:tcW w:type="dxa" w:w="960"/>
+          </w:tcPr>
+          <w:p>
+            <w:r/>
+            <w:r>
+              <w:rPr>
+                <w:b w:val="0"/>
+              </w:rPr>
+              <w:t>151</w:t>
+            </w:r>
+          </w:p>
+        </w:tc>
+        <w:tc>
+          <w:tcPr>
+            <w:tcW w:type="dxa" w:w="960"/>
+          </w:tcPr>
+          <w:p>
+            <w:r/>
+            <w:r>
+              <w:rPr>
+                <w:b w:val="0"/>
+              </w:rPr>
+              <w:t>-0.05</w:t>
+            </w:r>
+          </w:p>
+        </w:tc>
+        <w:tc>
+          <w:tcPr>
+            <w:tcW w:type="dxa" w:w="960"/>
+          </w:tcPr>
+          <w:p>
+            <w:r/>
+            <w:r>
+              <w:rPr>
+                <w:b w:val="0"/>
+              </w:rPr>
+              <w:t>-0.23–0.14</w:t>
+            </w:r>
+          </w:p>
+        </w:tc>
+        <w:tc>
+          <w:tcPr>
+            <w:tcW w:type="dxa" w:w="960"/>
+          </w:tcPr>
+          <w:p>
+            <w:r/>
+            <w:r>
+              <w:rPr>
+                <w:b w:val="0"/>
+              </w:rPr>
+              <w:t>0.01</w:t>
+            </w:r>
+          </w:p>
+        </w:tc>
+      </w:tr>
+      <w:tr>
+        <w:tc>
+          <w:tcPr>
+            <w:tcW w:type="dxa" w:w="960"/>
+          </w:tcPr>
+          <w:p>
+            <w:r/>
+            <w:r>
+              <w:rPr>
+                <w:b w:val="0"/>
+              </w:rPr>
+              <w:t>BRCA</w:t>
+            </w:r>
+          </w:p>
+        </w:tc>
+        <w:tc>
+          <w:tcPr>
+            <w:tcW w:type="dxa" w:w="960"/>
+          </w:tcPr>
+          <w:p>
+            <w:r/>
+            <w:r>
+              <w:rPr>
+                <w:b w:val="0"/>
+              </w:rPr>
+              <w:t>Internal CV</w:t>
+            </w:r>
+          </w:p>
+        </w:tc>
+        <w:tc>
+          <w:tcPr>
+            <w:tcW w:type="dxa" w:w="960"/>
+          </w:tcPr>
+          <w:p>
+            <w:r/>
+            <w:r>
+              <w:rPr>
+                <w:b w:val="0"/>
+              </w:rPr>
+              <w:t>BRCA</w:t>
+            </w:r>
+          </w:p>
+        </w:tc>
+        <w:tc>
+          <w:tcPr>
+            <w:tcW w:type="dxa" w:w="960"/>
+          </w:tcPr>
+          <w:p>
+            <w:r/>
+            <w:r>
+              <w:rPr>
+                <w:b w:val="0"/>
+              </w:rPr>
+              <w:t>Ridge-Cox</w:t>
+            </w:r>
+          </w:p>
+        </w:tc>
+        <w:tc>
+          <w:tcPr>
+            <w:tcW w:type="dxa" w:w="960"/>
+          </w:tcPr>
+          <w:p>
+            <w:r/>
+            <w:r>
+              <w:rPr>
+                <w:b w:val="0"/>
+              </w:rPr>
+              <w:t>1086</w:t>
+            </w:r>
+          </w:p>
+        </w:tc>
+        <w:tc>
+          <w:tcPr>
+            <w:tcW w:type="dxa" w:w="960"/>
+          </w:tcPr>
+          <w:p>
+            <w:r/>
+            <w:r>
+              <w:rPr>
+                <w:b w:val="0"/>
+              </w:rPr>
+              <w:t>151</w:t>
+            </w:r>
+          </w:p>
+        </w:tc>
+        <w:tc>
+          <w:tcPr>
+            <w:tcW w:type="dxa" w:w="960"/>
+          </w:tcPr>
+          <w:p>
+            <w:r/>
+            <w:r>
+              <w:rPr>
+                <w:b w:val="0"/>
+              </w:rPr>
+              <w:t>0.49</w:t>
+            </w:r>
+          </w:p>
+        </w:tc>
+        <w:tc>
+          <w:tcPr>
+            <w:tcW w:type="dxa" w:w="960"/>
+          </w:tcPr>
+          <w:p>
+            <w:r/>
+            <w:r>
+              <w:rPr>
+                <w:b w:val="0"/>
+              </w:rPr>
+              <w:t>0.34–0.64</w:t>
+            </w:r>
+          </w:p>
+        </w:tc>
+        <w:tc>
+          <w:tcPr>
+            <w:tcW w:type="dxa" w:w="960"/>
+          </w:tcPr>
+          <w:p>
+            <w:r/>
+            <w:r>
+              <w:rPr>
+                <w:b w:val="0"/>
+              </w:rPr>
+              <w:t>0.02</w:t>
+            </w:r>
+          </w:p>
+        </w:tc>
+      </w:tr>
+      <w:tr>
+        <w:tc>
+          <w:tcPr>
+            <w:tcW w:type="dxa" w:w="960"/>
+          </w:tcPr>
+          <w:p>
+            <w:r/>
+            <w:r>
+              <w:rPr>
+                <w:b w:val="0"/>
+              </w:rPr>
+              <w:t>BRCA</w:t>
+            </w:r>
+          </w:p>
+        </w:tc>
+        <w:tc>
+          <w:tcPr>
+            <w:tcW w:type="dxa" w:w="960"/>
+          </w:tcPr>
+          <w:p>
+            <w:r/>
+            <w:r>
+              <w:rPr>
+                <w:b w:val="0"/>
+              </w:rPr>
+              <w:t>External transfer</w:t>
+            </w:r>
+          </w:p>
+        </w:tc>
+        <w:tc>
+          <w:tcPr>
+            <w:tcW w:type="dxa" w:w="960"/>
+          </w:tcPr>
+          <w:p>
+            <w:r/>
+            <w:r>
+              <w:rPr>
+                <w:b w:val="0"/>
+              </w:rPr>
+              <w:t>GSE20685</w:t>
+            </w:r>
+          </w:p>
+        </w:tc>
+        <w:tc>
+          <w:tcPr>
+            <w:tcW w:type="dxa" w:w="960"/>
+          </w:tcPr>
+          <w:p>
+            <w:r/>
+            <w:r>
+              <w:rPr>
+                <w:b w:val="0"/>
+              </w:rPr>
+              <w:t>Path-AGNN-Cox</w:t>
+            </w:r>
+          </w:p>
+        </w:tc>
+        <w:tc>
+          <w:tcPr>
+            <w:tcW w:type="dxa" w:w="960"/>
+          </w:tcPr>
+          <w:p>
+            <w:r/>
+            <w:r>
+              <w:rPr>
+                <w:b w:val="0"/>
+              </w:rPr>
+              <w:t>327</w:t>
+            </w:r>
+          </w:p>
+        </w:tc>
+        <w:tc>
+          <w:tcPr>
+            <w:tcW w:type="dxa" w:w="960"/>
+          </w:tcPr>
+          <w:p>
+            <w:r/>
+            <w:r>
+              <w:rPr>
+                <w:b w:val="0"/>
+              </w:rPr>
+              <w:t>83</w:t>
+            </w:r>
+          </w:p>
+        </w:tc>
+        <w:tc>
+          <w:tcPr>
+            <w:tcW w:type="dxa" w:w="960"/>
+          </w:tcPr>
+          <w:p>
+            <w:r/>
+            <w:r>
+              <w:rPr>
+                <w:b w:val="0"/>
+              </w:rPr>
+              <w:t>-0.11</w:t>
+            </w:r>
+          </w:p>
+        </w:tc>
+        <w:tc>
+          <w:tcPr>
+            <w:tcW w:type="dxa" w:w="960"/>
+          </w:tcPr>
+          <w:p>
+            <w:r/>
+            <w:r>
+              <w:rPr>
+                <w:b w:val="0"/>
+              </w:rPr>
+              <w:t>-0.33–0.10</w:t>
+            </w:r>
+          </w:p>
+        </w:tc>
+        <w:tc>
+          <w:tcPr>
+            <w:tcW w:type="dxa" w:w="960"/>
+          </w:tcPr>
+          <w:p>
+            <w:r/>
+            <w:r>
+              <w:rPr>
+                <w:b w:val="0"/>
+              </w:rPr>
+              <w:t>0.07</w:t>
+            </w:r>
+          </w:p>
+        </w:tc>
+      </w:tr>
+      <w:tr>
+        <w:tc>
+          <w:tcPr>
+            <w:tcW w:type="dxa" w:w="960"/>
+          </w:tcPr>
+          <w:p>
+            <w:r/>
+            <w:r>
+              <w:rPr>
+                <w:b w:val="0"/>
+              </w:rPr>
+              <w:t>BRCA</w:t>
+            </w:r>
+          </w:p>
+        </w:tc>
+        <w:tc>
+          <w:tcPr>
+            <w:tcW w:type="dxa" w:w="960"/>
+          </w:tcPr>
+          <w:p>
+            <w:r/>
+            <w:r>
+              <w:rPr>
+                <w:b w:val="0"/>
+              </w:rPr>
+              <w:t>External transfer</w:t>
+            </w:r>
+          </w:p>
+        </w:tc>
+        <w:tc>
+          <w:tcPr>
+            <w:tcW w:type="dxa" w:w="960"/>
+          </w:tcPr>
+          <w:p>
+            <w:r/>
+            <w:r>
+              <w:rPr>
+                <w:b w:val="0"/>
+              </w:rPr>
+              <w:t>GSE20685</w:t>
+            </w:r>
+          </w:p>
+        </w:tc>
+        <w:tc>
+          <w:tcPr>
+            <w:tcW w:type="dxa" w:w="960"/>
+          </w:tcPr>
+          <w:p>
+            <w:r/>
+            <w:r>
+              <w:rPr>
+                <w:b w:val="0"/>
+              </w:rPr>
+              <w:t>Ridge-Cox</w:t>
+            </w:r>
+          </w:p>
+        </w:tc>
+        <w:tc>
+          <w:tcPr>
+            <w:tcW w:type="dxa" w:w="960"/>
+          </w:tcPr>
+          <w:p>
+            <w:r/>
+            <w:r>
+              <w:rPr>
+                <w:b w:val="0"/>
+              </w:rPr>
+              <w:t>327</w:t>
+            </w:r>
+          </w:p>
+        </w:tc>
+        <w:tc>
+          <w:tcPr>
+            <w:tcW w:type="dxa" w:w="960"/>
+          </w:tcPr>
+          <w:p>
+            <w:r/>
+            <w:r>
+              <w:rPr>
+                <w:b w:val="0"/>
+              </w:rPr>
+              <w:t>83</w:t>
+            </w:r>
+          </w:p>
+        </w:tc>
+        <w:tc>
+          <w:tcPr>
+            <w:tcW w:type="dxa" w:w="960"/>
+          </w:tcPr>
+          <w:p>
+            <w:r/>
+            <w:r>
+              <w:rPr>
+                <w:b w:val="0"/>
+              </w:rPr>
+              <w:t>0.68</w:t>
+            </w:r>
+          </w:p>
+        </w:tc>
+        <w:tc>
+          <w:tcPr>
+            <w:tcW w:type="dxa" w:w="960"/>
+          </w:tcPr>
+          <w:p>
+            <w:r/>
+            <w:r>
+              <w:rPr>
+                <w:b w:val="0"/>
+              </w:rPr>
+              <w:t>0.46–0.89</w:t>
+            </w:r>
+          </w:p>
+        </w:tc>
+        <w:tc>
+          <w:tcPr>
+            <w:tcW w:type="dxa" w:w="960"/>
+          </w:tcPr>
+          <w:p>
+            <w:r/>
+            <w:r>
+              <w:rPr>
+                <w:b w:val="0"/>
+              </w:rPr>
+              <w:t>0.02</w:t>
+            </w:r>
+          </w:p>
+        </w:tc>
+      </w:tr>
+      <w:tr>
+        <w:tc>
+          <w:tcPr>
+            <w:tcW w:type="dxa" w:w="960"/>
+          </w:tcPr>
+          <w:p>
+            <w:r/>
+            <w:r>
+              <w:rPr>
+                <w:b w:val="0"/>
+              </w:rPr>
+              <w:t>BRCA</w:t>
+            </w:r>
+          </w:p>
+        </w:tc>
+        <w:tc>
+          <w:tcPr>
+            <w:tcW w:type="dxa" w:w="960"/>
+          </w:tcPr>
+          <w:p>
+            <w:r/>
+            <w:r>
+              <w:rPr>
+                <w:b w:val="0"/>
+              </w:rPr>
+              <w:t>External transfer</w:t>
+            </w:r>
+          </w:p>
+        </w:tc>
+        <w:tc>
+          <w:tcPr>
+            <w:tcW w:type="dxa" w:w="960"/>
+          </w:tcPr>
+          <w:p>
+            <w:r/>
+            <w:r>
+              <w:rPr>
+                <w:b w:val="0"/>
+              </w:rPr>
+              <w:t>GSE21653</w:t>
+            </w:r>
+          </w:p>
+        </w:tc>
+        <w:tc>
+          <w:tcPr>
+            <w:tcW w:type="dxa" w:w="960"/>
+          </w:tcPr>
+          <w:p>
+            <w:r/>
+            <w:r>
+              <w:rPr>
+                <w:b w:val="0"/>
+              </w:rPr>
+              <w:t>Path-AGNN-Cox</w:t>
+            </w:r>
+          </w:p>
+        </w:tc>
+        <w:tc>
+          <w:tcPr>
+            <w:tcW w:type="dxa" w:w="960"/>
+          </w:tcPr>
+          <w:p>
+            <w:r/>
+            <w:r>
+              <w:rPr>
+                <w:b w:val="0"/>
+              </w:rPr>
+              <w:t>248</w:t>
+            </w:r>
+          </w:p>
+        </w:tc>
+        <w:tc>
+          <w:tcPr>
+            <w:tcW w:type="dxa" w:w="960"/>
+          </w:tcPr>
+          <w:p>
+            <w:r/>
+            <w:r>
+              <w:rPr>
+                <w:b w:val="0"/>
+              </w:rPr>
+              <w:t>79</w:t>
+            </w:r>
+          </w:p>
+        </w:tc>
+        <w:tc>
+          <w:tcPr>
+            <w:tcW w:type="dxa" w:w="960"/>
+          </w:tcPr>
+          <w:p>
+            <w:r/>
+            <w:r>
+              <w:rPr>
+                <w:b w:val="0"/>
+              </w:rPr>
+              <w:t>-0.05</w:t>
+            </w:r>
+          </w:p>
+        </w:tc>
+        <w:tc>
+          <w:tcPr>
+            <w:tcW w:type="dxa" w:w="960"/>
+          </w:tcPr>
+          <w:p>
+            <w:r/>
+            <w:r>
+              <w:rPr>
+                <w:b w:val="0"/>
+              </w:rPr>
+              <w:t>-0.27–0.18</w:t>
+            </w:r>
+          </w:p>
+        </w:tc>
+        <w:tc>
+          <w:tcPr>
+            <w:tcW w:type="dxa" w:w="960"/>
+          </w:tcPr>
+          <w:p>
+            <w:r/>
+            <w:r>
+              <w:rPr>
+                <w:b w:val="0"/>
+              </w:rPr>
+              <w:t>0.03</w:t>
+            </w:r>
+          </w:p>
+        </w:tc>
+      </w:tr>
+      <w:tr>
+        <w:tc>
+          <w:tcPr>
+            <w:tcW w:type="dxa" w:w="960"/>
+          </w:tcPr>
+          <w:p>
+            <w:r/>
+            <w:r>
+              <w:rPr>
+                <w:b w:val="0"/>
+              </w:rPr>
+              <w:t>BRCA</w:t>
+            </w:r>
+          </w:p>
+        </w:tc>
+        <w:tc>
+          <w:tcPr>
+            <w:tcW w:type="dxa" w:w="960"/>
+          </w:tcPr>
+          <w:p>
+            <w:r/>
+            <w:r>
+              <w:rPr>
+                <w:b w:val="0"/>
+              </w:rPr>
+              <w:t>External transfer</w:t>
+            </w:r>
+          </w:p>
+        </w:tc>
+        <w:tc>
+          <w:tcPr>
+            <w:tcW w:type="dxa" w:w="960"/>
+          </w:tcPr>
+          <w:p>
+            <w:r/>
+            <w:r>
+              <w:rPr>
+                <w:b w:val="0"/>
+              </w:rPr>
+              <w:t>GSE21653</w:t>
+            </w:r>
+          </w:p>
+        </w:tc>
+        <w:tc>
+          <w:tcPr>
+            <w:tcW w:type="dxa" w:w="960"/>
+          </w:tcPr>
+          <w:p>
+            <w:r/>
+            <w:r>
+              <w:rPr>
+                <w:b w:val="0"/>
+              </w:rPr>
+              <w:t>Ridge-Cox</w:t>
+            </w:r>
+          </w:p>
+        </w:tc>
+        <w:tc>
+          <w:tcPr>
+            <w:tcW w:type="dxa" w:w="960"/>
+          </w:tcPr>
+          <w:p>
+            <w:r/>
+            <w:r>
+              <w:rPr>
+                <w:b w:val="0"/>
+              </w:rPr>
+              <w:t>248</w:t>
+            </w:r>
+          </w:p>
+        </w:tc>
+        <w:tc>
+          <w:tcPr>
+            <w:tcW w:type="dxa" w:w="960"/>
+          </w:tcPr>
+          <w:p>
+            <w:r/>
+            <w:r>
+              <w:rPr>
+                <w:b w:val="0"/>
+              </w:rPr>
+              <w:t>79</w:t>
+            </w:r>
+          </w:p>
+        </w:tc>
+        <w:tc>
+          <w:tcPr>
+            <w:tcW w:type="dxa" w:w="960"/>
+          </w:tcPr>
+          <w:p>
+            <w:r/>
+            <w:r>
+              <w:rPr>
+                <w:b w:val="0"/>
+              </w:rPr>
+              <w:t>0.46</w:t>
+            </w:r>
+          </w:p>
+        </w:tc>
+        <w:tc>
+          <w:tcPr>
+            <w:tcW w:type="dxa" w:w="960"/>
+          </w:tcPr>
+          <w:p>
+            <w:r/>
+            <w:r>
+              <w:rPr>
+                <w:b w:val="0"/>
+              </w:rPr>
+              <w:t>0.25–0.66</w:t>
+            </w:r>
+          </w:p>
+        </w:tc>
+        <w:tc>
+          <w:tcPr>
+            <w:tcW w:type="dxa" w:w="960"/>
+          </w:tcPr>
+          <w:p>
+            <w:r/>
+            <w:r>
+              <w:rPr>
+                <w:b w:val="0"/>
+              </w:rPr>
+              <w:t>0.03</w:t>
+            </w:r>
+          </w:p>
+        </w:tc>
+      </w:tr>
+      <w:tr>
+        <w:tc>
+          <w:tcPr>
+            <w:tcW w:type="dxa" w:w="960"/>
+          </w:tcPr>
+          <w:p>
+            <w:r/>
+            <w:r>
+              <w:rPr>
+                <w:b w:val="0"/>
+              </w:rPr>
+              <w:t>BRCA</w:t>
+            </w:r>
+          </w:p>
+        </w:tc>
+        <w:tc>
+          <w:tcPr>
+            <w:tcW w:type="dxa" w:w="960"/>
+          </w:tcPr>
+          <w:p>
+            <w:r/>
+            <w:r>
+              <w:rPr>
+                <w:b w:val="0"/>
+              </w:rPr>
+              <w:t>External transfer</w:t>
+            </w:r>
+          </w:p>
+        </w:tc>
+        <w:tc>
+          <w:tcPr>
+            <w:tcW w:type="dxa" w:w="960"/>
+          </w:tcPr>
+          <w:p>
+            <w:r/>
+            <w:r>
+              <w:rPr>
+                <w:b w:val="0"/>
+              </w:rPr>
+              <w:t>GSE7390</w:t>
+            </w:r>
+          </w:p>
+        </w:tc>
+        <w:tc>
+          <w:tcPr>
+            <w:tcW w:type="dxa" w:w="960"/>
+          </w:tcPr>
+          <w:p>
+            <w:r/>
+            <w:r>
+              <w:rPr>
+                <w:b w:val="0"/>
+              </w:rPr>
+              <w:t>Path-AGNN-Cox</w:t>
+            </w:r>
+          </w:p>
+        </w:tc>
+        <w:tc>
+          <w:tcPr>
+            <w:tcW w:type="dxa" w:w="960"/>
+          </w:tcPr>
+          <w:p>
+            <w:r/>
+            <w:r>
+              <w:rPr>
+                <w:b w:val="0"/>
+              </w:rPr>
+              <w:t>198</w:t>
+            </w:r>
+          </w:p>
+        </w:tc>
+        <w:tc>
+          <w:tcPr>
+            <w:tcW w:type="dxa" w:w="960"/>
+          </w:tcPr>
+          <w:p>
+            <w:r/>
+            <w:r>
+              <w:rPr>
+                <w:b w:val="0"/>
+              </w:rPr>
+              <w:t>56</w:t>
+            </w:r>
+          </w:p>
+        </w:tc>
+        <w:tc>
+          <w:tcPr>
+            <w:tcW w:type="dxa" w:w="960"/>
+          </w:tcPr>
+          <w:p>
+            <w:r/>
+            <w:r>
+              <w:rPr>
+                <w:b w:val="0"/>
+              </w:rPr>
+              <w:t>0.20</w:t>
+            </w:r>
+          </w:p>
+        </w:tc>
+        <w:tc>
+          <w:tcPr>
+            <w:tcW w:type="dxa" w:w="960"/>
+          </w:tcPr>
+          <w:p>
+            <w:r/>
+            <w:r>
+              <w:rPr>
+                <w:b w:val="0"/>
+              </w:rPr>
+              <w:t>-0.06–0.45</w:t>
+            </w:r>
+          </w:p>
+        </w:tc>
+        <w:tc>
+          <w:tcPr>
+            <w:tcW w:type="dxa" w:w="960"/>
+          </w:tcPr>
+          <w:p>
+            <w:r/>
+            <w:r>
+              <w:rPr>
+                <w:b w:val="0"/>
+              </w:rPr>
+              <w:t>0.02</w:t>
+            </w:r>
+          </w:p>
+        </w:tc>
+      </w:tr>
+      <w:tr>
+        <w:tc>
+          <w:tcPr>
+            <w:tcW w:type="dxa" w:w="960"/>
+          </w:tcPr>
+          <w:p>
+            <w:r/>
+            <w:r>
+              <w:rPr>
+                <w:b w:val="0"/>
+              </w:rPr>
+              <w:t>BRCA</w:t>
+            </w:r>
+          </w:p>
+        </w:tc>
+        <w:tc>
+          <w:tcPr>
+            <w:tcW w:type="dxa" w:w="960"/>
+          </w:tcPr>
+          <w:p>
+            <w:r/>
+            <w:r>
+              <w:rPr>
+                <w:b w:val="0"/>
+              </w:rPr>
+              <w:t>External transfer</w:t>
+            </w:r>
+          </w:p>
+        </w:tc>
+        <w:tc>
+          <w:tcPr>
+            <w:tcW w:type="dxa" w:w="960"/>
+          </w:tcPr>
+          <w:p>
+            <w:r/>
+            <w:r>
+              <w:rPr>
+                <w:b w:val="0"/>
+              </w:rPr>
+              <w:t>GSE7390</w:t>
+            </w:r>
+          </w:p>
+        </w:tc>
+        <w:tc>
+          <w:tcPr>
+            <w:tcW w:type="dxa" w:w="960"/>
+          </w:tcPr>
+          <w:p>
+            <w:r/>
+            <w:r>
+              <w:rPr>
+                <w:b w:val="0"/>
+              </w:rPr>
+              <w:t>Ridge-Cox</w:t>
+            </w:r>
+          </w:p>
+        </w:tc>
+        <w:tc>
+          <w:tcPr>
+            <w:tcW w:type="dxa" w:w="960"/>
+          </w:tcPr>
+          <w:p>
+            <w:r/>
+            <w:r>
+              <w:rPr>
+                <w:b w:val="0"/>
+              </w:rPr>
+              <w:t>198</w:t>
+            </w:r>
+          </w:p>
+        </w:tc>
+        <w:tc>
+          <w:tcPr>
+            <w:tcW w:type="dxa" w:w="960"/>
+          </w:tcPr>
+          <w:p>
+            <w:r/>
+            <w:r>
+              <w:rPr>
+                <w:b w:val="0"/>
+              </w:rPr>
+              <w:t>56</w:t>
+            </w:r>
+          </w:p>
+        </w:tc>
+        <w:tc>
+          <w:tcPr>
+            <w:tcW w:type="dxa" w:w="960"/>
+          </w:tcPr>
+          <w:p>
+            <w:r/>
+            <w:r>
+              <w:rPr>
+                <w:b w:val="0"/>
+              </w:rPr>
+              <w:t>0.43</w:t>
+            </w:r>
+          </w:p>
+        </w:tc>
+        <w:tc>
+          <w:tcPr>
+            <w:tcW w:type="dxa" w:w="960"/>
+          </w:tcPr>
+          <w:p>
+            <w:r/>
+            <w:r>
+              <w:rPr>
+                <w:b w:val="0"/>
+              </w:rPr>
+              <w:t>0.18–0.68</w:t>
+            </w:r>
+          </w:p>
+        </w:tc>
+        <w:tc>
+          <w:tcPr>
+            <w:tcW w:type="dxa" w:w="960"/>
+          </w:tcPr>
+          <w:p>
+            <w:r/>
+            <w:r>
+              <w:rPr>
+                <w:b w:val="0"/>
+              </w:rPr>
+              <w:t>0.04</w:t>
+            </w:r>
+          </w:p>
+        </w:tc>
+      </w:tr>
+    </w:tbl>
     <w:p>
       <w:pPr>
         <w:pStyle w:val="Heading3"/>
@@ -8088,7 +10298,7 @@
         <w:rPr>
           <w:b w:val="0"/>
         </w:rPr>
-        <w:t xml:space="preserve"> The per-sample mean edge weight within each pathway was compared between high- and low-risk strata (median risk split). In BRCA, 43 of 53 pathways showed significant between-stratum differences (BH-FDR q&lt;0.05); in LUAD, 3 pathways did. To exclude the possibility that these differences merely reflect the risk stratification used to define the strata, we repeated the pathway-level tests under 1,000 label permutations: the null distribution yielded a mean of 0.16 significant pathways in LUAD and 0.19 in BRCA (maximum 34 in LUAD and 19 in BRCA), versus 43 and 3 observed (permutation P&lt;0.001 and P=0.014; Table 5); the BRCA permutation P equals the resolution limit of the 1,000-permutation null (minimum attainable P = 1/1001), with the observed count of 43 far exceeding the null maximum of 19. The top-ranked rewired pathways in both cancers are qualitatively coherent with tumor progression biology (e.g., cell cycle, DNA replication, homologous recombination, apoptosis and HIF-1 signaling in BRCA; Homologous recombination, DNA replication, Cell cycle, HIF-1 signaling pathway, Mitophagy in LUAD).</w:t>
+        <w:t xml:space="preserve"> The per-sample mean edge weight within each pathway was compared between high- and low-risk strata (median risk split). In BRCA, 43 of 53 pathways showed significant between-stratum differences (BH-FDR q&lt;0.05); in LUAD, 3 pathways did. To exclude the possibility that these differences merely reflect the risk stratification used to define the strata, we repeated the pathway-level tests under 1,000 label permutations: the null distribution yielded a mean of 0.16 significant pathways in LUAD and 0.19 in BRCA (maximum 34 in LUAD and 19 in BRCA), versus 43 and 3 observed (permutation P&lt;0.001 and P=0.014; Table 6); the BRCA permutation P equals the resolution limit of the 1,000-permutation null (minimum attainable P = 1/1001), with the observed count of 43 far exceeding the null maximum of 19. The top-ranked rewired pathways in both cancers are qualitatively coherent with tumor progression biology (e.g., cell cycle, DNA replication, homologous recombination, apoptosis and HIF-1 signaling in BRCA; Homologous recombination, DNA replication, Cell cycle, HIF-1 signaling pathway, Mitophagy in LUAD).</w:t>
       </w:r>
       <w:r>
         <w:rPr>
@@ -8176,7 +10386,7 @@
         <w:pStyle w:val="Heading3"/>
       </w:pPr>
       <w:r>
-        <w:t>Table 5. Pathway-rewiring summary (LUAD top pathways; BRCA permutation statistics in footnotes).</w:t>
+        <w:t>Table 6. Pathway-rewiring summary (LUAD top pathways; BRCA permutation statistics in footnotes).</w:t>
       </w:r>
     </w:p>
     <w:tbl>
@@ -9191,7 +11401,7 @@
         <w:rPr>
           <w:b w:val="0"/>
         </w:rPr>
-        <w:t xml:space="preserve"> To test whether the between-stratum edge-weight differences are specific to the pathway-constrained adaptive architecture, we trained a standard GAT on a sample-invariant k-nearest-neighbor gene graph (k=10; no pathway constraint) under the identical training protocol and applied the identical pathway-level testing pipeline. The standard GAT yielded 11 of 54 significantly rewired pathways in BRCA and 1 of 54 in LUAD (BH-FDR q&lt;0.05), compared with 43 of 53 and 3 of 53 for the adaptive pathway-constrained model (Table 5); the pathway-constrained model yielded substantially more detectable between-stratum differences, indicating that the pathway partition contributes to the statistical detection of these differences; consistent with the randomized-partition control (Section 3.4.1), canonical pathway structure is nonetheless not uniquely required to produce them.</w:t>
+        <w:t xml:space="preserve"> To test whether the between-stratum edge-weight differences are specific to the pathway-constrained adaptive architecture, we trained a standard GAT on a sample-invariant k-nearest-neighbor gene graph (k=10; no pathway constraint) under the identical training protocol and applied the identical pathway-level testing pipeline. The standard GAT yielded 11 of 54 significantly rewired pathways in BRCA and 1 of 54 in LUAD (BH-FDR q&lt;0.05), compared with 43 of 53 and 3 of 53 for the adaptive pathway-constrained model (Table 6); the pathway-constrained model yielded substantially more detectable between-stratum differences, indicating that the pathway partition contributes to the statistical detection of these differences; consistent with the randomized-partition control (Section 3.4.1), canonical pathway structure is nonetheless not uniquely required to produce them.</w:t>
       </w:r>
     </w:p>
     <w:p>
@@ -9285,7 +11495,7 @@
         <w:rPr>
           <w:b w:val="0"/>
         </w:rPr>
-        <w:t>We further predicted drug sensitivity with the oncoPredict model trained on GDSC2 cell-line pharmacogenomic data (198 compounds) and compared predicted IC50 values between high- and low-rewiring strata (Figure 7B, Table 6). In BRCA, the high-rewiring stratum was predicted to be more sensitive (lower IC50) to 9 of the 17 curated compounds at nominal significance, most strongly MK-1775 (WEE1, Wilcoxon P=0.006), paclitaxel (P=0.006) and palbociclib (CDK4/6, P=0.018); the Spearman association remained significant after FDR correction for MK-1775 and paclitaxel (q=0.006), whereas the Wilcoxon comparisons did not survive correction (smallest q=0.054). In LUAD, no compound showed a significant difference (smallest P=0.063). These analyses are hypothesis-generating: the predicted IC50 values are in-silico estimates from cell-line-derived models and do not substitute for direct pharmacologic assays (Section 4).</w:t>
+        <w:t>We further predicted drug sensitivity with the oncoPredict model trained on GDSC2 cell-line pharmacogenomic data (198 compounds) and compared predicted IC50 values between high- and low-rewiring strata (Figure 7B, Table 7). In BRCA, the high-rewiring stratum was predicted to be more sensitive (lower IC50) to 9 of the 17 curated compounds at nominal significance, most strongly MK-1775 (WEE1, Wilcoxon P=0.006), paclitaxel (P=0.006) and palbociclib (CDK4/6, P=0.018); the Spearman association remained significant after FDR correction for MK-1775 and paclitaxel (q=0.006), whereas the Wilcoxon comparisons did not survive correction (smallest q=0.054). In LUAD, no compound showed a significant difference (smallest P=0.063). These analyses are hypothesis-generating: the predicted IC50 values are in-silico estimates from cell-line-derived models and do not substitute for direct pharmacologic assays (Section 4).</w:t>
       </w:r>
     </w:p>
     <w:p>
@@ -9293,7 +11503,7 @@
         <w:pStyle w:val="Heading3"/>
       </w:pPr>
       <w:r>
-        <w:t>Table 6. Predicted drug sensitivity (GDSC2/oncoPredict IC50) in high- versus low-rewiring strata (exploratory).</w:t>
+        <w:t>Table 7. Predicted drug sensitivity (GDSC2/oncoPredict IC50) in high- versus low-rewiring strata (exploratory).</w:t>
       </w:r>
     </w:p>
     <w:p>

</xml_diff>

<commit_message>
Route B: pathway-identity claim downgraded to hypothesis-generating; effect-size, per-pathway permutation and matched random-set controls added (Table 6, Figure 5, Methods 2.7)
</commit_message>
<xml_diff>
--- a/manuscript/Path-AGNN-Cox_manuscript.docx
+++ b/manuscript/Path-AGNN-Cox_manuscript.docx
@@ -1997,7 +1997,7 @@
         <w:rPr>
           <w:b w:val="0"/>
         </w:rPr>
-        <w:t>We used stratified 5-fold cross-validation within each TCGA cohort (fold-stratified on the event indicator; random seed 42). The concordance index (C-index) served as the primary discrimination metric; the time-dependent AUC (mean over the 0.25/0.50/0.75 quantile times) was used as a secondary metric. For external validation, each model was retrained on the full TCGA cohort and evaluated on the GEO cohorts without any fine-tuning. Paired Wilcoxon signed-rank tests (per-dataset mean C-index, internal CV) were used to compare Path-AGNN-Cox against each baseline. Between-stratum rewiring was tested per pathway with a two-sample z-statistic on the per-edge mean weights using a pooled standard error, and the false discovery rate was controlled with the Benjamini–Hochberg procedure over the K pathways; the label-permutation null was generated with 1,000 permutations of the event labels. Pathway-level enrichment of the top-20 rewired pathways against a curated LUAD driver-pathway list was tested with the hypergeometric distribution over the 57-pathway cancer-core catalogue. For each trained model, per-patient edge weights were extracted from the last adaptive layer and patients were split at the median predicted risk. Static-model and standard-GAT controls followed the same protocol, and the permutation P was computed as one plus the number of null permutations with at least as many significant pathways, divided by 1,001. All analyses are implemented in benchmark/rewiring_analysis.py and the work/ scripts of the repository. Model hyperparameters are listed in the footnote of Table 2 (see config/benchmark.yaml). All deep models were trained on CPU with Adam; the full benchmark consumed approximately 1,500 CPU-hours.</w:t>
+        <w:t>We used stratified 5-fold cross-validation within each TCGA cohort (fold-stratified on the event indicator; random seed 42). The concordance index (C-index) served as the primary discrimination metric; the time-dependent AUC (mean over the 0.25/0.50/0.75 quantile times) was used as a secondary metric. For external validation, each model was retrained on the full TCGA cohort and evaluated on the GEO cohorts without any fine-tuning. Paired Wilcoxon signed-rank tests (per-dataset mean C-index, internal CV) were used to compare Path-AGNN-Cox against each baseline. Per-patient edge weights were extracted from the last adaptive layer and patients were split at the median predicted risk. Between-stratum rewiring was tested per pathway on the per-sample mean edge weight within each pathway, reporting Cohen's d with a normal-approximation 95% CI, and the false discovery rate was controlled with the Benjamini–Hochberg procedure. Each pathway was additionally tested under 1,000 within-pathway label permutations of the risk strata; the permutation P was one plus the number of null permutations with at least as large an absolute effect, divided by 1,001. At the cohort level, the number of significant pathways was compared with a 1,000-permutation null obtained by permuting the risk labels, with the permutation P computed as one plus the number of null counts at least as large as the observed count, divided by 1,001. Two matched random gene-set controls assessed pathway-identity selectivity: for each real pathway, 200 random gene sets of equal size with matched internal edge counts, and 200 random equal-size subsets drawn from real pathway blocks so that size and density were matched, were scored with the identical effect-size statistic, and the percentile of each real pathway within its null distribution was recorded. Pathway-level enrichment of the top-20 pathways ranked by permutation P against a curated LUAD driver-pathway list was tested with the hypergeometric distribution over the 57-pathway cancer-core catalogue. Static-model, randomized-partition and standard-GAT controls followed the same protocol. All analyses are implemented in benchmark/rewiring_analysis.py and the work/ scripts of the repository. All analyses are implemented in benchmark/rewiring_analysis.py and the work/ scripts of the repository. Model hyperparameters are listed in the footnote of Table 2 (see config/benchmark.yaml). All deep models were trained on CPU with Adam; the full benchmark consumed approximately 1,500 CPU-hours.</w:t>
       </w:r>
     </w:p>
     <w:p>
@@ -10228,7 +10228,7 @@
         <w:rPr>
           <w:b w:val="0"/>
         </w:rPr>
-        <w:t>A central claim of this work is that the sample-specific edge weights are not purely mathematical artifacts but carry patient-specific variation that we test for biological content. We therefore extracted, for every patient, the last-layer adaptive attention weights within each pathway block and compared high- vs. low-risk strata (median risk split) in LUAD (Figure 5; BRCA in Figure 5E).</w:t>
+        <w:t>A central claim of this work is that the sample-specific edge weights carry patient-specific variation that can be tested formally for biological content. We therefore extracted, for every patient, the last-layer adaptive attention weights within each pathway block and compared high- vs. low-risk strata (median risk split) in LUAD and BRCA (Figure 5).</w:t>
       </w:r>
     </w:p>
     <w:p>
@@ -10284,7 +10284,7 @@
         <w:rPr>
           <w:b w:val="0"/>
         </w:rPr>
-        <w:t>Patient-specific pathway rewiring.** (A) Top rewired pathways ranked by the standardized between-stratum statistic |z| (LUAD). (B) Mean within-pathway edge weight by risk stratum for the top-5 pathways (LUAD). (C) Label-permutation null distribution: observed number of significantly rewired pathways (FDR q&lt;0.05) versus the permutation null mean and maximum (1,000 permutations; LUAD and BRCA). (D) Correlation between per-patient rewiring magnitude and clinical malignancy indicators (LUAD). (E) Top rewired pathways (BRCA).</w:t>
+        <w:t>Patient-specific pathway rewiring.** (A) Between-stratum effect sizes (Cohen's d with 95% CI) for all 53 pathways in LUAD, with the two pathways surviving per-pathway label permutation and BH-FDR correction highlighted. (B) Same as A for BRCA. (C) Cohort-level label-permutation null: number of significant pathways observed versus the null mean and maximum under 1,000 label permutations (LUAD and BRCA). (D) Correlation between per-patient rewiring magnitude and clinical malignancy indicators (LUAD). (E) Matched random gene-set controls: distribution of the null percentiles of real pathways for the edge-matched and density-matched nulls in LUAD and BRCA, with the 50th percentile (chance) marked.</w:t>
       </w:r>
     </w:p>
     <w:p>
@@ -10292,25 +10292,33 @@
         <w:rPr>
           <w:b/>
         </w:rPr>
-        <w:t>3.4.1. Rewiring is not a label artifact.</w:t>
+        <w:t>3.4.1. Between-stratum rewiring exceeds label-permutation chance but is not globally pathway-selective.</w:t>
       </w:r>
       <w:r>
         <w:rPr>
           <w:b w:val="0"/>
         </w:rPr>
-        <w:t xml:space="preserve"> The per-sample mean edge weight within each pathway was compared between high- and low-risk strata (median risk split). In BRCA, 43 of 53 pathways showed significant between-stratum differences (BH-FDR q&lt;0.05); in LUAD, 3 pathways did. To exclude the possibility that these differences merely reflect the risk stratification used to define the strata, we repeated the pathway-level tests under 1,000 label permutations: the null distribution yielded a mean of 0.16 significant pathways in LUAD and 0.19 in BRCA (maximum 34 in LUAD and 19 in BRCA), versus 43 and 3 observed (permutation P&lt;0.001 and P=0.014; Table 6); the BRCA permutation P equals the resolution limit of the 1,000-permutation null (minimum attainable P = 1/1001), with the observed count of 43 far exceeding the null maximum of 19. The top-ranked rewired pathways in both cancers are qualitatively coherent with tumor progression biology (e.g., cell cycle, DNA replication, homologous recombination, apoptosis and HIF-1 signaling in BRCA; Homologous recombination, DNA replication, Cell cycle, HIF-1 signaling pathway, Mitophagy in LUAD).</w:t>
+        <w:t xml:space="preserve"> The per-sample mean edge weight within each pathway was compared between high- and low-risk strata (median risk split) with Cohen's d and 95% CI (Figure 5A,B). After per-pathway label permutation (1,000 permutations) and BH-FDR correction, 43 of 53 pathways in BRCA and 2 in LUAD remained significant; the two LUAD pathways were Homologous recombination (d = 0.35, 95% CI 0.18–0.53) and DNA replication (d = 0.35, 95% CI 0.18–0.52) (Table 6). At the cohort level, the number of pathways with BH-FDR q&lt;0.05 on the pathway-level test exceeded the 1,000-permutation label-permutation null in both cancers (LUAD: 3 observed vs. null mean 0.16, maximum 34, permutation P=0.014; BRCA: 43 observed vs. null mean 0.19, maximum 19, permutation P&lt;0.001, the resolution limit of the 1,000-permutation null). The between-stratum differences therefore reflect risk-associated structure in the attention weights rather than the risk stratification itself.</w:t>
+      </w:r>
+    </w:p>
+    <w:p>
+      <w:r>
+        <w:rPr>
+          <w:b w:val="0"/>
+        </w:rPr>
+        <w:t>Pathway identity, however, was not globally selective. Under matched random gene-set controls preserving gene-set size and either internal edge count or graph density, the real pathways were not enriched above the matched nulls: the median percentile of the real pathways was 0.67 in LUAD, with 3 of 53 pathways above the 95th percentile (expected 2.65), and 0.09 in BRCA, with 0 of 53 (expected 2.65); the density-matched control gave median percentiles of 0.69 and 0.20, respectively. Known-pathway enrichment of the top-20 pathways ranked by permutation P was not significant in LUAD (5 hits, P=0.689). The two LUAD pathways that survived the permutation-calibrated test exceeded 94%–96% of the density-matched null sets, whereas no BRCA pathway exceeded the 95th percentile of that null; these observations are hypothesis-generating rather than evidence of global pathway-specific rewiring. The pathway partition therefore supplies interpretable labels for the rewiring output, but canonical pathway identity is not statistically required to produce it.</w:t>
       </w:r>
       <w:r>
         <w:rPr>
           <w:b/>
         </w:rPr>
-        <w:t>3.4.2. Static models cannot produce rewiring; the pathway prior is an interpretive labeling rather than a statistical necessity.</w:t>
+        <w:t>3.4.2. Static models cannot produce rewiring.</w:t>
       </w:r>
       <w:r>
         <w:rPr>
           <w:b w:val="0"/>
         </w:rPr>
-        <w:t xml:space="preserve"> As a negative control, the static pathway GNN (−Adaptive) was subjected to the identical analysis; its total edge-weight variance across patients was 0.00—essentially zero by construction—whereas the adaptive model produced a total edge-weight variance of 19.21—orders of magnitude larger—indicating that the between-stratum differences of Section 3.4.1 are attributable to the sample-specific attention mechanism rather than to the fixed adjacency. We also retrained the adaptive model with randomized pathway partitions (block sizes preserved; three seeds). Random partitions yielded 26−48 significantly rewired pathways, i.e., between-stratum attention differences are not unique to canonical pathway structure; the pathway partition supplies biologically interpretable labels for these differences rather than being statistically necessary.</w:t>
+        <w:t xml:space="preserve"> As a negative control, the static pathway GNN (−Adaptive) was subjected to the identical analysis; its total edge-weight variance across patients was 0.00, essentially zero by construction, whereas the adaptive model produced a total edge-weight variance of 19.21, orders of magnitude larger; the between-stratum differences of Section 3.4.1 are therefore attributable to the sample-specific attention mechanism rather than to the fixed adjacency. Retraining the adaptive model with randomized pathway partitions (block sizes preserved; three seeds) yielded 26–48 significant pathways, consistent with the matched gene-set controls of Section 3.4.1: between-stratum attention differences are not unique to canonical pathway structure, and the pathway partition supplies biologically interpretable labels rather than being statistically necessary.</w:t>
       </w:r>
       <w:r>
         <w:rPr>
@@ -10386,7 +10394,7 @@
         <w:pStyle w:val="Heading3"/>
       </w:pPr>
       <w:r>
-        <w:t>Table 6. Pathway-rewiring summary (LUAD top pathways; BRCA permutation statistics in footnotes).</w:t>
+        <w:t>Table 6. Framework validation of patient-specific pathway rewiring in LUAD and BRCA.</w:t>
       </w:r>
     </w:p>
     <w:tbl>
@@ -10396,95 +10404,50 @@
         <w:tblLook w:firstColumn="1" w:firstRow="1" w:lastColumn="0" w:lastRow="0" w:noHBand="0" w:noVBand="1" w:val="04A0"/>
       </w:tblPr>
       <w:tblGrid>
-        <w:gridCol w:w="1440"/>
-        <w:gridCol w:w="1440"/>
-        <w:gridCol w:w="1440"/>
-        <w:gridCol w:w="1440"/>
-        <w:gridCol w:w="1440"/>
-        <w:gridCol w:w="1440"/>
+        <w:gridCol w:w="2880"/>
+        <w:gridCol w:w="2880"/>
+        <w:gridCol w:w="2880"/>
       </w:tblGrid>
       <w:tr>
         <w:tc>
           <w:tcPr>
-            <w:tcW w:type="dxa" w:w="1440"/>
-          </w:tcPr>
-          <w:p>
-            <w:r/>
-            <w:r>
-              <w:rPr>
-                <w:b w:val="0"/>
-              </w:rPr>
-              <w:t>Pathway</w:t>
-            </w:r>
-          </w:p>
-        </w:tc>
-        <w:tc>
-          <w:tcPr>
-            <w:tcW w:type="dxa" w:w="1440"/>
-          </w:tcPr>
-          <w:p>
-            <w:r/>
-            <w:r>
-              <w:rPr>
-                <w:b w:val="0"/>
-              </w:rPr>
-              <w:t>Edges</w:t>
-            </w:r>
-          </w:p>
-        </w:tc>
-        <w:tc>
-          <w:tcPr>
-            <w:tcW w:type="dxa" w:w="1440"/>
-          </w:tcPr>
-          <w:p>
-            <w:r/>
-            <w:r>
-              <w:rPr>
-                <w:b w:val="0"/>
-              </w:rPr>
-              <w:t>z</w:t>
-            </w:r>
-          </w:p>
-        </w:tc>
-        <w:tc>
-          <w:tcPr>
-            <w:tcW w:type="dxa" w:w="1440"/>
-          </w:tcPr>
-          <w:p>
-            <w:r/>
-            <w:r>
-              <w:rPr>
-                <w:b w:val="0"/>
-              </w:rPr>
-              <w:t>P</w:t>
-            </w:r>
-          </w:p>
-        </w:tc>
-        <w:tc>
-          <w:tcPr>
-            <w:tcW w:type="dxa" w:w="1440"/>
-          </w:tcPr>
-          <w:p>
-            <w:r/>
-            <w:r>
-              <w:rPr>
-                <w:b w:val="0"/>
-              </w:rPr>
-              <w:t>FDR q</w:t>
-            </w:r>
-          </w:p>
-        </w:tc>
-        <w:tc>
-          <w:tcPr>
-            <w:tcW w:type="dxa" w:w="1440"/>
-          </w:tcPr>
-          <w:p>
-            <w:r/>
-            <w:r>
-              <w:rPr>
-                <w:b w:val="0"/>
-              </w:rPr>
-              <w:t>Mean Δw (×10⁻⁶)</w:t>
+            <w:tcW w:type="dxa" w:w="2880"/>
+          </w:tcPr>
+          <w:p>
+            <w:r/>
+            <w:r>
+              <w:rPr>
+                <w:b w:val="0"/>
+              </w:rPr>
+              <w:t>Check</w:t>
+            </w:r>
+          </w:p>
+        </w:tc>
+        <w:tc>
+          <w:tcPr>
+            <w:tcW w:type="dxa" w:w="2880"/>
+          </w:tcPr>
+          <w:p>
+            <w:r/>
+            <w:r>
+              <w:rPr>
+                <w:b w:val="0"/>
+              </w:rPr>
+              <w:t>LUAD</w:t>
+            </w:r>
+          </w:p>
+        </w:tc>
+        <w:tc>
+          <w:tcPr>
+            <w:tcW w:type="dxa" w:w="2880"/>
+          </w:tcPr>
+          <w:p>
+            <w:r/>
+            <w:r>
+              <w:rPr>
+                <w:b w:val="0"/>
+              </w:rPr>
+              <w:t>BRCA</w:t>
             </w:r>
           </w:p>
         </w:tc>
@@ -10492,85 +10455,43 @@
       <w:tr>
         <w:tc>
           <w:tcPr>
-            <w:tcW w:type="dxa" w:w="1440"/>
-          </w:tcPr>
-          <w:p>
-            <w:r/>
-            <w:r>
-              <w:rPr>
-                <w:b w:val="0"/>
-              </w:rPr>
-              <w:t>Homologous recombination</w:t>
-            </w:r>
-          </w:p>
-        </w:tc>
-        <w:tc>
-          <w:tcPr>
-            <w:tcW w:type="dxa" w:w="1440"/>
-          </w:tcPr>
-          <w:p>
-            <w:r/>
-            <w:r>
-              <w:rPr>
-                <w:b w:val="0"/>
-              </w:rPr>
-              <w:t>600</w:t>
-            </w:r>
-          </w:p>
-        </w:tc>
-        <w:tc>
-          <w:tcPr>
-            <w:tcW w:type="dxa" w:w="1440"/>
-          </w:tcPr>
-          <w:p>
-            <w:r/>
-            <w:r>
-              <w:rPr>
-                <w:b w:val="0"/>
-              </w:rPr>
-              <w:t>4.98</w:t>
-            </w:r>
-          </w:p>
-        </w:tc>
-        <w:tc>
-          <w:tcPr>
-            <w:tcW w:type="dxa" w:w="1440"/>
-          </w:tcPr>
-          <w:p>
-            <w:r/>
-            <w:r>
-              <w:rPr>
-                <w:b w:val="0"/>
-              </w:rPr>
-              <w:t>P&lt;0.001</w:t>
-            </w:r>
-          </w:p>
-        </w:tc>
-        <w:tc>
-          <w:tcPr>
-            <w:tcW w:type="dxa" w:w="1440"/>
-          </w:tcPr>
-          <w:p>
-            <w:r/>
-            <w:r>
-              <w:rPr>
-                <w:b w:val="0"/>
-              </w:rPr>
-              <w:t>q&lt;0.001</w:t>
-            </w:r>
-          </w:p>
-        </w:tc>
-        <w:tc>
-          <w:tcPr>
-            <w:tcW w:type="dxa" w:w="1440"/>
-          </w:tcPr>
-          <w:p>
-            <w:r/>
-            <w:r>
-              <w:rPr>
-                <w:b w:val="0"/>
-              </w:rPr>
-              <w:t>6.71</w:t>
+            <w:tcW w:type="dxa" w:w="2880"/>
+          </w:tcPr>
+          <w:p>
+            <w:r/>
+            <w:r>
+              <w:rPr>
+                <w:b w:val="0"/>
+              </w:rPr>
+              <w:t>Pathways tested</w:t>
+            </w:r>
+          </w:p>
+        </w:tc>
+        <w:tc>
+          <w:tcPr>
+            <w:tcW w:type="dxa" w:w="2880"/>
+          </w:tcPr>
+          <w:p>
+            <w:r/>
+            <w:r>
+              <w:rPr>
+                <w:b w:val="0"/>
+              </w:rPr>
+              <w:t>53</w:t>
+            </w:r>
+          </w:p>
+        </w:tc>
+        <w:tc>
+          <w:tcPr>
+            <w:tcW w:type="dxa" w:w="2880"/>
+          </w:tcPr>
+          <w:p>
+            <w:r/>
+            <w:r>
+              <w:rPr>
+                <w:b w:val="0"/>
+              </w:rPr>
+              <w:t>53</w:t>
             </w:r>
           </w:p>
         </w:tc>
@@ -10578,85 +10499,43 @@
       <w:tr>
         <w:tc>
           <w:tcPr>
-            <w:tcW w:type="dxa" w:w="1440"/>
-          </w:tcPr>
-          <w:p>
-            <w:r/>
-            <w:r>
-              <w:rPr>
-                <w:b w:val="0"/>
-              </w:rPr>
-              <w:t>DNA replication</w:t>
-            </w:r>
-          </w:p>
-        </w:tc>
-        <w:tc>
-          <w:tcPr>
-            <w:tcW w:type="dxa" w:w="1440"/>
-          </w:tcPr>
-          <w:p>
-            <w:r/>
-            <w:r>
-              <w:rPr>
-                <w:b w:val="0"/>
-              </w:rPr>
-              <w:t>812</w:t>
-            </w:r>
-          </w:p>
-        </w:tc>
-        <w:tc>
-          <w:tcPr>
-            <w:tcW w:type="dxa" w:w="1440"/>
-          </w:tcPr>
-          <w:p>
-            <w:r/>
-            <w:r>
-              <w:rPr>
-                <w:b w:val="0"/>
-              </w:rPr>
-              <w:t>4.83</w:t>
-            </w:r>
-          </w:p>
-        </w:tc>
-        <w:tc>
-          <w:tcPr>
-            <w:tcW w:type="dxa" w:w="1440"/>
-          </w:tcPr>
-          <w:p>
-            <w:r/>
-            <w:r>
-              <w:rPr>
-                <w:b w:val="0"/>
-              </w:rPr>
-              <w:t>P&lt;0.001</w:t>
-            </w:r>
-          </w:p>
-        </w:tc>
-        <w:tc>
-          <w:tcPr>
-            <w:tcW w:type="dxa" w:w="1440"/>
-          </w:tcPr>
-          <w:p>
-            <w:r/>
-            <w:r>
-              <w:rPr>
-                <w:b w:val="0"/>
-              </w:rPr>
-              <w:t>q&lt;0.001</w:t>
-            </w:r>
-          </w:p>
-        </w:tc>
-        <w:tc>
-          <w:tcPr>
-            <w:tcW w:type="dxa" w:w="1440"/>
-          </w:tcPr>
-          <w:p>
-            <w:r/>
-            <w:r>
-              <w:rPr>
-                <w:b w:val="0"/>
-              </w:rPr>
-              <w:t>4.43</w:t>
+            <w:tcW w:type="dxa" w:w="2880"/>
+          </w:tcPr>
+          <w:p>
+            <w:r/>
+            <w:r>
+              <w:rPr>
+                <w:b w:val="0"/>
+              </w:rPr>
+              <w:t>Significant pathways, BH-FDR on the unadjusted test</w:t>
+            </w:r>
+          </w:p>
+        </w:tc>
+        <w:tc>
+          <w:tcPr>
+            <w:tcW w:type="dxa" w:w="2880"/>
+          </w:tcPr>
+          <w:p>
+            <w:r/>
+            <w:r>
+              <w:rPr>
+                <w:b w:val="0"/>
+              </w:rPr>
+              <w:t>3</w:t>
+            </w:r>
+          </w:p>
+        </w:tc>
+        <w:tc>
+          <w:tcPr>
+            <w:tcW w:type="dxa" w:w="2880"/>
+          </w:tcPr>
+          <w:p>
+            <w:r/>
+            <w:r>
+              <w:rPr>
+                <w:b w:val="0"/>
+              </w:rPr>
+              <w:t>43</w:t>
             </w:r>
           </w:p>
         </w:tc>
@@ -10664,85 +10543,43 @@
       <w:tr>
         <w:tc>
           <w:tcPr>
-            <w:tcW w:type="dxa" w:w="1440"/>
-          </w:tcPr>
-          <w:p>
-            <w:r/>
-            <w:r>
-              <w:rPr>
-                <w:b w:val="0"/>
-              </w:rPr>
-              <w:t>Cell cycle</w:t>
-            </w:r>
-          </w:p>
-        </w:tc>
-        <w:tc>
-          <w:tcPr>
-            <w:tcW w:type="dxa" w:w="1440"/>
-          </w:tcPr>
-          <w:p>
-            <w:r/>
-            <w:r>
-              <w:rPr>
-                <w:b w:val="0"/>
-              </w:rPr>
-              <w:t>15252</w:t>
-            </w:r>
-          </w:p>
-        </w:tc>
-        <w:tc>
-          <w:tcPr>
-            <w:tcW w:type="dxa" w:w="1440"/>
-          </w:tcPr>
-          <w:p>
-            <w:r/>
-            <w:r>
-              <w:rPr>
-                <w:b w:val="0"/>
-              </w:rPr>
-              <w:t>3.09</w:t>
-            </w:r>
-          </w:p>
-        </w:tc>
-        <w:tc>
-          <w:tcPr>
-            <w:tcW w:type="dxa" w:w="1440"/>
-          </w:tcPr>
-          <w:p>
-            <w:r/>
-            <w:r>
-              <w:rPr>
-                <w:b w:val="0"/>
-              </w:rPr>
-              <w:t>P=0.002</w:t>
-            </w:r>
-          </w:p>
-        </w:tc>
-        <w:tc>
-          <w:tcPr>
-            <w:tcW w:type="dxa" w:w="1440"/>
-          </w:tcPr>
-          <w:p>
-            <w:r/>
-            <w:r>
-              <w:rPr>
-                <w:b w:val="0"/>
-              </w:rPr>
-              <w:t>q=0.035</w:t>
-            </w:r>
-          </w:p>
-        </w:tc>
-        <w:tc>
-          <w:tcPr>
-            <w:tcW w:type="dxa" w:w="1440"/>
-          </w:tcPr>
-          <w:p>
-            <w:r/>
-            <w:r>
-              <w:rPr>
-                <w:b w:val="0"/>
-              </w:rPr>
-              <w:t>0.16</w:t>
+            <w:tcW w:type="dxa" w:w="2880"/>
+          </w:tcPr>
+          <w:p>
+            <w:r/>
+            <w:r>
+              <w:rPr>
+                <w:b w:val="0"/>
+              </w:rPr>
+              <w:t>Per-pathway permutation-calibrated pathways (FDR q&lt;0.05)</w:t>
+            </w:r>
+          </w:p>
+        </w:tc>
+        <w:tc>
+          <w:tcPr>
+            <w:tcW w:type="dxa" w:w="2880"/>
+          </w:tcPr>
+          <w:p>
+            <w:r/>
+            <w:r>
+              <w:rPr>
+                <w:b w:val="0"/>
+              </w:rPr>
+              <w:t>2</w:t>
+            </w:r>
+          </w:p>
+        </w:tc>
+        <w:tc>
+          <w:tcPr>
+            <w:tcW w:type="dxa" w:w="2880"/>
+          </w:tcPr>
+          <w:p>
+            <w:r/>
+            <w:r>
+              <w:rPr>
+                <w:b w:val="0"/>
+              </w:rPr>
+              <w:t>43</w:t>
             </w:r>
           </w:p>
         </w:tc>
@@ -10750,85 +10587,43 @@
       <w:tr>
         <w:tc>
           <w:tcPr>
-            <w:tcW w:type="dxa" w:w="1440"/>
-          </w:tcPr>
-          <w:p>
-            <w:r/>
-            <w:r>
-              <w:rPr>
-                <w:b w:val="0"/>
-              </w:rPr>
-              <w:t>HIF-1 signaling pathway</w:t>
-            </w:r>
-          </w:p>
-        </w:tc>
-        <w:tc>
-          <w:tcPr>
-            <w:tcW w:type="dxa" w:w="1440"/>
-          </w:tcPr>
-          <w:p>
-            <w:r/>
-            <w:r>
-              <w:rPr>
-                <w:b w:val="0"/>
-              </w:rPr>
-              <w:t>1190</w:t>
-            </w:r>
-          </w:p>
-        </w:tc>
-        <w:tc>
-          <w:tcPr>
-            <w:tcW w:type="dxa" w:w="1440"/>
-          </w:tcPr>
-          <w:p>
-            <w:r/>
-            <w:r>
-              <w:rPr>
-                <w:b w:val="0"/>
-              </w:rPr>
-              <w:t>2.85</w:t>
-            </w:r>
-          </w:p>
-        </w:tc>
-        <w:tc>
-          <w:tcPr>
-            <w:tcW w:type="dxa" w:w="1440"/>
-          </w:tcPr>
-          <w:p>
-            <w:r/>
-            <w:r>
-              <w:rPr>
-                <w:b w:val="0"/>
-              </w:rPr>
-              <w:t>P=0.004</w:t>
-            </w:r>
-          </w:p>
-        </w:tc>
-        <w:tc>
-          <w:tcPr>
-            <w:tcW w:type="dxa" w:w="1440"/>
-          </w:tcPr>
-          <w:p>
-            <w:r/>
-            <w:r>
-              <w:rPr>
-                <w:b w:val="0"/>
-              </w:rPr>
-              <w:t>q=0.059</w:t>
-            </w:r>
-          </w:p>
-        </w:tc>
-        <w:tc>
-          <w:tcPr>
-            <w:tcW w:type="dxa" w:w="1440"/>
-          </w:tcPr>
-          <w:p>
-            <w:r/>
-            <w:r>
-              <w:rPr>
-                <w:b w:val="0"/>
-              </w:rPr>
-              <w:t>2.45</w:t>
+            <w:tcW w:type="dxa" w:w="2880"/>
+          </w:tcPr>
+          <w:p>
+            <w:r/>
+            <w:r>
+              <w:rPr>
+                <w:b w:val="0"/>
+              </w:rPr>
+              <w:t>Cohort-level label-permutation null, mean</w:t>
+            </w:r>
+          </w:p>
+        </w:tc>
+        <w:tc>
+          <w:tcPr>
+            <w:tcW w:type="dxa" w:w="2880"/>
+          </w:tcPr>
+          <w:p>
+            <w:r/>
+            <w:r>
+              <w:rPr>
+                <w:b w:val="0"/>
+              </w:rPr>
+              <w:t>0.16</w:t>
+            </w:r>
+          </w:p>
+        </w:tc>
+        <w:tc>
+          <w:tcPr>
+            <w:tcW w:type="dxa" w:w="2880"/>
+          </w:tcPr>
+          <w:p>
+            <w:r/>
+            <w:r>
+              <w:rPr>
+                <w:b w:val="0"/>
+              </w:rPr>
+              <w:t>0.19</w:t>
             </w:r>
           </w:p>
         </w:tc>
@@ -10836,85 +10631,43 @@
       <w:tr>
         <w:tc>
           <w:tcPr>
-            <w:tcW w:type="dxa" w:w="1440"/>
-          </w:tcPr>
-          <w:p>
-            <w:r/>
-            <w:r>
-              <w:rPr>
-                <w:b w:val="0"/>
-              </w:rPr>
-              <w:t>Mitophagy</w:t>
-            </w:r>
-          </w:p>
-        </w:tc>
-        <w:tc>
-          <w:tcPr>
-            <w:tcW w:type="dxa" w:w="1440"/>
-          </w:tcPr>
-          <w:p>
-            <w:r/>
-            <w:r>
-              <w:rPr>
-                <w:b w:val="0"/>
-              </w:rPr>
-              <w:t>1122</w:t>
-            </w:r>
-          </w:p>
-        </w:tc>
-        <w:tc>
-          <w:tcPr>
-            <w:tcW w:type="dxa" w:w="1440"/>
-          </w:tcPr>
-          <w:p>
-            <w:r/>
-            <w:r>
-              <w:rPr>
-                <w:b w:val="0"/>
-              </w:rPr>
-              <w:t>2.56</w:t>
-            </w:r>
-          </w:p>
-        </w:tc>
-        <w:tc>
-          <w:tcPr>
-            <w:tcW w:type="dxa" w:w="1440"/>
-          </w:tcPr>
-          <w:p>
-            <w:r/>
-            <w:r>
-              <w:rPr>
-                <w:b w:val="0"/>
-              </w:rPr>
-              <w:t>P=0.010</w:t>
-            </w:r>
-          </w:p>
-        </w:tc>
-        <w:tc>
-          <w:tcPr>
-            <w:tcW w:type="dxa" w:w="1440"/>
-          </w:tcPr>
-          <w:p>
-            <w:r/>
-            <w:r>
-              <w:rPr>
-                <w:b w:val="0"/>
-              </w:rPr>
-              <w:t>q=0.111</w:t>
-            </w:r>
-          </w:p>
-        </w:tc>
-        <w:tc>
-          <w:tcPr>
-            <w:tcW w:type="dxa" w:w="1440"/>
-          </w:tcPr>
-          <w:p>
-            <w:r/>
-            <w:r>
-              <w:rPr>
-                <w:b w:val="0"/>
-              </w:rPr>
-              <w:t>1.05</w:t>
+            <w:tcW w:type="dxa" w:w="2880"/>
+          </w:tcPr>
+          <w:p>
+            <w:r/>
+            <w:r>
+              <w:rPr>
+                <w:b w:val="0"/>
+              </w:rPr>
+              <w:t>Cohort-level label-permutation null, maximum</w:t>
+            </w:r>
+          </w:p>
+        </w:tc>
+        <w:tc>
+          <w:tcPr>
+            <w:tcW w:type="dxa" w:w="2880"/>
+          </w:tcPr>
+          <w:p>
+            <w:r/>
+            <w:r>
+              <w:rPr>
+                <w:b w:val="0"/>
+              </w:rPr>
+              <w:t>34</w:t>
+            </w:r>
+          </w:p>
+        </w:tc>
+        <w:tc>
+          <w:tcPr>
+            <w:tcW w:type="dxa" w:w="2880"/>
+          </w:tcPr>
+          <w:p>
+            <w:r/>
+            <w:r>
+              <w:rPr>
+                <w:b w:val="0"/>
+              </w:rPr>
+              <w:t>19</w:t>
             </w:r>
           </w:p>
         </w:tc>
@@ -10922,85 +10675,43 @@
       <w:tr>
         <w:tc>
           <w:tcPr>
-            <w:tcW w:type="dxa" w:w="1440"/>
-          </w:tcPr>
-          <w:p>
-            <w:r/>
-            <w:r>
-              <w:rPr>
-                <w:b w:val="0"/>
-              </w:rPr>
-              <w:t>AMPK signaling pathway</w:t>
-            </w:r>
-          </w:p>
-        </w:tc>
-        <w:tc>
-          <w:tcPr>
-            <w:tcW w:type="dxa" w:w="1440"/>
-          </w:tcPr>
-          <w:p>
-            <w:r/>
-            <w:r>
-              <w:rPr>
-                <w:b w:val="0"/>
-              </w:rPr>
-              <w:t>5402</w:t>
-            </w:r>
-          </w:p>
-        </w:tc>
-        <w:tc>
-          <w:tcPr>
-            <w:tcW w:type="dxa" w:w="1440"/>
-          </w:tcPr>
-          <w:p>
-            <w:r/>
-            <w:r>
-              <w:rPr>
-                <w:b w:val="0"/>
-              </w:rPr>
-              <w:t>2.42</w:t>
-            </w:r>
-          </w:p>
-        </w:tc>
-        <w:tc>
-          <w:tcPr>
-            <w:tcW w:type="dxa" w:w="1440"/>
-          </w:tcPr>
-          <w:p>
-            <w:r/>
-            <w:r>
-              <w:rPr>
-                <w:b w:val="0"/>
-              </w:rPr>
-              <w:t>P=0.015</w:t>
-            </w:r>
-          </w:p>
-        </w:tc>
-        <w:tc>
-          <w:tcPr>
-            <w:tcW w:type="dxa" w:w="1440"/>
-          </w:tcPr>
-          <w:p>
-            <w:r/>
-            <w:r>
-              <w:rPr>
-                <w:b w:val="0"/>
-              </w:rPr>
-              <w:t>q=0.117</w:t>
-            </w:r>
-          </w:p>
-        </w:tc>
-        <w:tc>
-          <w:tcPr>
-            <w:tcW w:type="dxa" w:w="1440"/>
-          </w:tcPr>
-          <w:p>
-            <w:r/>
-            <w:r>
-              <w:rPr>
-                <w:b w:val="0"/>
-              </w:rPr>
-              <w:t>0.12</w:t>
+            <w:tcW w:type="dxa" w:w="2880"/>
+          </w:tcPr>
+          <w:p>
+            <w:r/>
+            <w:r>
+              <w:rPr>
+                <w:b w:val="0"/>
+              </w:rPr>
+              <w:t>Cohort-level permutation P</w:t>
+            </w:r>
+          </w:p>
+        </w:tc>
+        <w:tc>
+          <w:tcPr>
+            <w:tcW w:type="dxa" w:w="2880"/>
+          </w:tcPr>
+          <w:p>
+            <w:r/>
+            <w:r>
+              <w:rPr>
+                <w:b w:val="0"/>
+              </w:rPr>
+              <w:t>P=0.014</w:t>
+            </w:r>
+          </w:p>
+        </w:tc>
+        <w:tc>
+          <w:tcPr>
+            <w:tcW w:type="dxa" w:w="2880"/>
+          </w:tcPr>
+          <w:p>
+            <w:r/>
+            <w:r>
+              <w:rPr>
+                <w:b w:val="0"/>
+              </w:rPr>
+              <w:t>P&lt;0.001</w:t>
             </w:r>
           </w:p>
         </w:tc>
@@ -11008,85 +10719,43 @@
       <w:tr>
         <w:tc>
           <w:tcPr>
-            <w:tcW w:type="dxa" w:w="1440"/>
-          </w:tcPr>
-          <w:p>
-            <w:r/>
-            <w:r>
-              <w:rPr>
-                <w:b w:val="0"/>
-              </w:rPr>
-              <w:t>Chemokine signaling pathway</w:t>
-            </w:r>
-          </w:p>
-        </w:tc>
-        <w:tc>
-          <w:tcPr>
-            <w:tcW w:type="dxa" w:w="1440"/>
-          </w:tcPr>
-          <w:p>
-            <w:r/>
-            <w:r>
-              <w:rPr>
-                <w:b w:val="0"/>
-              </w:rPr>
-              <w:t>240</w:t>
-            </w:r>
-          </w:p>
-        </w:tc>
-        <w:tc>
-          <w:tcPr>
-            <w:tcW w:type="dxa" w:w="1440"/>
-          </w:tcPr>
-          <w:p>
-            <w:r/>
-            <w:r>
-              <w:rPr>
-                <w:b w:val="0"/>
-              </w:rPr>
-              <w:t>2.28</w:t>
-            </w:r>
-          </w:p>
-        </w:tc>
-        <w:tc>
-          <w:tcPr>
-            <w:tcW w:type="dxa" w:w="1440"/>
-          </w:tcPr>
-          <w:p>
-            <w:r/>
-            <w:r>
-              <w:rPr>
-                <w:b w:val="0"/>
-              </w:rPr>
-              <w:t>P=0.023</w:t>
-            </w:r>
-          </w:p>
-        </w:tc>
-        <w:tc>
-          <w:tcPr>
-            <w:tcW w:type="dxa" w:w="1440"/>
-          </w:tcPr>
-          <w:p>
-            <w:r/>
-            <w:r>
-              <w:rPr>
-                <w:b w:val="0"/>
-              </w:rPr>
-              <w:t>q=0.147</w:t>
-            </w:r>
-          </w:p>
-        </w:tc>
-        <w:tc>
-          <w:tcPr>
-            <w:tcW w:type="dxa" w:w="1440"/>
-          </w:tcPr>
-          <w:p>
-            <w:r/>
-            <w:r>
-              <w:rPr>
-                <w:b w:val="0"/>
-              </w:rPr>
-              <w:t>2.07</w:t>
+            <w:tcW w:type="dxa" w:w="2880"/>
+          </w:tcPr>
+          <w:p>
+            <w:r/>
+            <w:r>
+              <w:rPr>
+                <w:b w:val="0"/>
+              </w:rPr>
+              <w:t>Median percentile of real pathways, edge-matched null</w:t>
+            </w:r>
+          </w:p>
+        </w:tc>
+        <w:tc>
+          <w:tcPr>
+            <w:tcW w:type="dxa" w:w="2880"/>
+          </w:tcPr>
+          <w:p>
+            <w:r/>
+            <w:r>
+              <w:rPr>
+                <w:b w:val="0"/>
+              </w:rPr>
+              <w:t>0.67</w:t>
+            </w:r>
+          </w:p>
+        </w:tc>
+        <w:tc>
+          <w:tcPr>
+            <w:tcW w:type="dxa" w:w="2880"/>
+          </w:tcPr>
+          <w:p>
+            <w:r/>
+            <w:r>
+              <w:rPr>
+                <w:b w:val="0"/>
+              </w:rPr>
+              <w:t>0.09</w:t>
             </w:r>
           </w:p>
         </w:tc>
@@ -11094,85 +10763,43 @@
       <w:tr>
         <w:tc>
           <w:tcPr>
-            <w:tcW w:type="dxa" w:w="1440"/>
-          </w:tcPr>
-          <w:p>
-            <w:r/>
-            <w:r>
-              <w:rPr>
-                <w:b w:val="0"/>
-              </w:rPr>
-              <w:t>ErbB signaling pathway</w:t>
-            </w:r>
-          </w:p>
-        </w:tc>
-        <w:tc>
-          <w:tcPr>
-            <w:tcW w:type="dxa" w:w="1440"/>
-          </w:tcPr>
-          <w:p>
-            <w:r/>
-            <w:r>
-              <w:rPr>
-                <w:b w:val="0"/>
-              </w:rPr>
-              <w:t>110</w:t>
-            </w:r>
-          </w:p>
-        </w:tc>
-        <w:tc>
-          <w:tcPr>
-            <w:tcW w:type="dxa" w:w="1440"/>
-          </w:tcPr>
-          <w:p>
-            <w:r/>
-            <w:r>
-              <w:rPr>
-                <w:b w:val="0"/>
-              </w:rPr>
-              <w:t>2.24</w:t>
-            </w:r>
-          </w:p>
-        </w:tc>
-        <w:tc>
-          <w:tcPr>
-            <w:tcW w:type="dxa" w:w="1440"/>
-          </w:tcPr>
-          <w:p>
-            <w:r/>
-            <w:r>
-              <w:rPr>
-                <w:b w:val="0"/>
-              </w:rPr>
-              <w:t>P=0.025</w:t>
-            </w:r>
-          </w:p>
-        </w:tc>
-        <w:tc>
-          <w:tcPr>
-            <w:tcW w:type="dxa" w:w="1440"/>
-          </w:tcPr>
-          <w:p>
-            <w:r/>
-            <w:r>
-              <w:rPr>
-                <w:b w:val="0"/>
-              </w:rPr>
-              <w:t>q=0.147</w:t>
-            </w:r>
-          </w:p>
-        </w:tc>
-        <w:tc>
-          <w:tcPr>
-            <w:tcW w:type="dxa" w:w="1440"/>
-          </w:tcPr>
-          <w:p>
-            <w:r/>
-            <w:r>
-              <w:rPr>
-                <w:b w:val="0"/>
-              </w:rPr>
-              <w:t>8.43</w:t>
+            <w:tcW w:type="dxa" w:w="2880"/>
+          </w:tcPr>
+          <w:p>
+            <w:r/>
+            <w:r>
+              <w:rPr>
+                <w:b w:val="0"/>
+              </w:rPr>
+              <w:t>Pathways above the 95th percentile, edge-matched null</w:t>
+            </w:r>
+          </w:p>
+        </w:tc>
+        <w:tc>
+          <w:tcPr>
+            <w:tcW w:type="dxa" w:w="2880"/>
+          </w:tcPr>
+          <w:p>
+            <w:r/>
+            <w:r>
+              <w:rPr>
+                <w:b w:val="0"/>
+              </w:rPr>
+              <w:t>3</w:t>
+            </w:r>
+          </w:p>
+        </w:tc>
+        <w:tc>
+          <w:tcPr>
+            <w:tcW w:type="dxa" w:w="2880"/>
+          </w:tcPr>
+          <w:p>
+            <w:r/>
+            <w:r>
+              <w:rPr>
+                <w:b w:val="0"/>
+              </w:rPr>
+              <w:t>0</w:t>
             </w:r>
           </w:p>
         </w:tc>
@@ -11180,85 +10807,43 @@
       <w:tr>
         <w:tc>
           <w:tcPr>
-            <w:tcW w:type="dxa" w:w="1440"/>
-          </w:tcPr>
-          <w:p>
-            <w:r/>
-            <w:r>
-              <w:rPr>
-                <w:b w:val="0"/>
-              </w:rPr>
-              <w:t>Mismatch repair</w:t>
-            </w:r>
-          </w:p>
-        </w:tc>
-        <w:tc>
-          <w:tcPr>
-            <w:tcW w:type="dxa" w:w="1440"/>
-          </w:tcPr>
-          <w:p>
-            <w:r/>
-            <w:r>
-              <w:rPr>
-                <w:b w:val="0"/>
-              </w:rPr>
-              <w:t>6</w:t>
-            </w:r>
-          </w:p>
-        </w:tc>
-        <w:tc>
-          <w:tcPr>
-            <w:tcW w:type="dxa" w:w="1440"/>
-          </w:tcPr>
-          <w:p>
-            <w:r/>
-            <w:r>
-              <w:rPr>
-                <w:b w:val="0"/>
-              </w:rPr>
-              <w:t>2.21</w:t>
-            </w:r>
-          </w:p>
-        </w:tc>
-        <w:tc>
-          <w:tcPr>
-            <w:tcW w:type="dxa" w:w="1440"/>
-          </w:tcPr>
-          <w:p>
-            <w:r/>
-            <w:r>
-              <w:rPr>
-                <w:b w:val="0"/>
-              </w:rPr>
-              <w:t>P=0.015</w:t>
-            </w:r>
-          </w:p>
-        </w:tc>
-        <w:tc>
-          <w:tcPr>
-            <w:tcW w:type="dxa" w:w="1440"/>
-          </w:tcPr>
-          <w:p>
-            <w:r/>
-            <w:r>
-              <w:rPr>
-                <w:b w:val="0"/>
-              </w:rPr>
-              <w:t>q=0.117</w:t>
-            </w:r>
-          </w:p>
-        </w:tc>
-        <w:tc>
-          <w:tcPr>
-            <w:tcW w:type="dxa" w:w="1440"/>
-          </w:tcPr>
-          <w:p>
-            <w:r/>
-            <w:r>
-              <w:rPr>
-                <w:b w:val="0"/>
-              </w:rPr>
-              <w:t>181.41</w:t>
+            <w:tcW w:type="dxa" w:w="2880"/>
+          </w:tcPr>
+          <w:p>
+            <w:r/>
+            <w:r>
+              <w:rPr>
+                <w:b w:val="0"/>
+              </w:rPr>
+              <w:t>Median percentile of real pathways, density-matched null</w:t>
+            </w:r>
+          </w:p>
+        </w:tc>
+        <w:tc>
+          <w:tcPr>
+            <w:tcW w:type="dxa" w:w="2880"/>
+          </w:tcPr>
+          <w:p>
+            <w:r/>
+            <w:r>
+              <w:rPr>
+                <w:b w:val="0"/>
+              </w:rPr>
+              <w:t>0.69</w:t>
+            </w:r>
+          </w:p>
+        </w:tc>
+        <w:tc>
+          <w:tcPr>
+            <w:tcW w:type="dxa" w:w="2880"/>
+          </w:tcPr>
+          <w:p>
+            <w:r/>
+            <w:r>
+              <w:rPr>
+                <w:b w:val="0"/>
+              </w:rPr>
+              <w:t>0.20</w:t>
             </w:r>
           </w:p>
         </w:tc>
@@ -11266,85 +10851,263 @@
       <w:tr>
         <w:tc>
           <w:tcPr>
-            <w:tcW w:type="dxa" w:w="1440"/>
-          </w:tcPr>
-          <w:p>
-            <w:r/>
-            <w:r>
-              <w:rPr>
-                <w:b w:val="0"/>
-              </w:rPr>
-              <w:t>Colorectal cancer</w:t>
-            </w:r>
-          </w:p>
-        </w:tc>
-        <w:tc>
-          <w:tcPr>
-            <w:tcW w:type="dxa" w:w="1440"/>
-          </w:tcPr>
-          <w:p>
-            <w:r/>
-            <w:r>
-              <w:rPr>
-                <w:b w:val="0"/>
-              </w:rPr>
-              <w:t>30</w:t>
-            </w:r>
-          </w:p>
-        </w:tc>
-        <w:tc>
-          <w:tcPr>
-            <w:tcW w:type="dxa" w:w="1440"/>
-          </w:tcPr>
-          <w:p>
-            <w:r/>
-            <w:r>
-              <w:rPr>
-                <w:b w:val="0"/>
-              </w:rPr>
-              <w:t>2.16</w:t>
-            </w:r>
-          </w:p>
-        </w:tc>
-        <w:tc>
-          <w:tcPr>
-            <w:tcW w:type="dxa" w:w="1440"/>
-          </w:tcPr>
-          <w:p>
-            <w:r/>
-            <w:r>
-              <w:rPr>
-                <w:b w:val="0"/>
-              </w:rPr>
-              <w:t>P=0.029</w:t>
-            </w:r>
-          </w:p>
-        </w:tc>
-        <w:tc>
-          <w:tcPr>
-            <w:tcW w:type="dxa" w:w="1440"/>
-          </w:tcPr>
-          <w:p>
-            <w:r/>
-            <w:r>
-              <w:rPr>
-                <w:b w:val="0"/>
-              </w:rPr>
-              <w:t>q=0.151</w:t>
-            </w:r>
-          </w:p>
-        </w:tc>
-        <w:tc>
-          <w:tcPr>
-            <w:tcW w:type="dxa" w:w="1440"/>
-          </w:tcPr>
-          <w:p>
-            <w:r/>
-            <w:r>
-              <w:rPr>
-                <w:b w:val="0"/>
-              </w:rPr>
-              <w:t>33.35</w:t>
+            <w:tcW w:type="dxa" w:w="2880"/>
+          </w:tcPr>
+          <w:p>
+            <w:r/>
+            <w:r>
+              <w:rPr>
+                <w:b w:val="0"/>
+              </w:rPr>
+              <w:t>Pathways above the 95th percentile, density-matched null</w:t>
+            </w:r>
+          </w:p>
+        </w:tc>
+        <w:tc>
+          <w:tcPr>
+            <w:tcW w:type="dxa" w:w="2880"/>
+          </w:tcPr>
+          <w:p>
+            <w:r/>
+            <w:r>
+              <w:rPr>
+                <w:b w:val="0"/>
+              </w:rPr>
+              <w:t>3</w:t>
+            </w:r>
+          </w:p>
+        </w:tc>
+        <w:tc>
+          <w:tcPr>
+            <w:tcW w:type="dxa" w:w="2880"/>
+          </w:tcPr>
+          <w:p>
+            <w:r/>
+            <w:r>
+              <w:rPr>
+                <w:b w:val="0"/>
+              </w:rPr>
+              <w:t>1</w:t>
+            </w:r>
+          </w:p>
+        </w:tc>
+      </w:tr>
+      <w:tr>
+        <w:tc>
+          <w:tcPr>
+            <w:tcW w:type="dxa" w:w="2880"/>
+          </w:tcPr>
+          <w:p>
+            <w:r/>
+            <w:r>
+              <w:rPr>
+                <w:b w:val="0"/>
+              </w:rPr>
+              <w:t>Expected above the 95th percentile by chance</w:t>
+            </w:r>
+          </w:p>
+        </w:tc>
+        <w:tc>
+          <w:tcPr>
+            <w:tcW w:type="dxa" w:w="2880"/>
+          </w:tcPr>
+          <w:p>
+            <w:r/>
+            <w:r>
+              <w:rPr>
+                <w:b w:val="0"/>
+              </w:rPr>
+              <w:t>2.65</w:t>
+            </w:r>
+          </w:p>
+        </w:tc>
+        <w:tc>
+          <w:tcPr>
+            <w:tcW w:type="dxa" w:w="2880"/>
+          </w:tcPr>
+          <w:p>
+            <w:r/>
+            <w:r>
+              <w:rPr>
+                <w:b w:val="0"/>
+              </w:rPr>
+              <w:t>2.65</w:t>
+            </w:r>
+          </w:p>
+        </w:tc>
+      </w:tr>
+      <w:tr>
+        <w:tc>
+          <w:tcPr>
+            <w:tcW w:type="dxa" w:w="2880"/>
+          </w:tcPr>
+          <w:p>
+            <w:r/>
+            <w:r>
+              <w:rPr>
+                <w:b w:val="0"/>
+              </w:rPr>
+              <w:t>Known-pathway enrichment, top-20 by permutation P</w:t>
+            </w:r>
+          </w:p>
+        </w:tc>
+        <w:tc>
+          <w:tcPr>
+            <w:tcW w:type="dxa" w:w="2880"/>
+          </w:tcPr>
+          <w:p>
+            <w:r/>
+            <w:r>
+              <w:rPr>
+                <w:b w:val="0"/>
+              </w:rPr>
+              <w:t>5 hits, P=0.689</w:t>
+            </w:r>
+          </w:p>
+        </w:tc>
+        <w:tc>
+          <w:tcPr>
+            <w:tcW w:type="dxa" w:w="2880"/>
+          </w:tcPr>
+          <w:p>
+            <w:r/>
+            <w:r>
+              <w:rPr>
+                <w:b w:val="0"/>
+              </w:rPr>
+              <w:t>n.a.</w:t>
+            </w:r>
+          </w:p>
+        </w:tc>
+      </w:tr>
+      <w:tr>
+        <w:tc>
+          <w:tcPr>
+            <w:tcW w:type="dxa" w:w="2880"/>
+          </w:tcPr>
+          <w:p>
+            <w:r/>
+            <w:r>
+              <w:rPr>
+                <w:b w:val="0"/>
+              </w:rPr>
+              <w:t>Static-model total edge variance</w:t>
+            </w:r>
+          </w:p>
+        </w:tc>
+        <w:tc>
+          <w:tcPr>
+            <w:tcW w:type="dxa" w:w="2880"/>
+          </w:tcPr>
+          <w:p>
+            <w:r/>
+            <w:r>
+              <w:rPr>
+                <w:b w:val="0"/>
+              </w:rPr>
+              <w:t>3.48e-13</w:t>
+            </w:r>
+          </w:p>
+        </w:tc>
+        <w:tc>
+          <w:tcPr>
+            <w:tcW w:type="dxa" w:w="2880"/>
+          </w:tcPr>
+          <w:p>
+            <w:r/>
+            <w:r>
+              <w:rPr>
+                <w:b w:val="0"/>
+              </w:rPr>
+              <w:t>2.81e-13</w:t>
+            </w:r>
+          </w:p>
+        </w:tc>
+      </w:tr>
+      <w:tr>
+        <w:tc>
+          <w:tcPr>
+            <w:tcW w:type="dxa" w:w="2880"/>
+          </w:tcPr>
+          <w:p>
+            <w:r/>
+            <w:r>
+              <w:rPr>
+                <w:b w:val="0"/>
+              </w:rPr>
+              <w:t>Adaptive-model total edge variance</w:t>
+            </w:r>
+          </w:p>
+        </w:tc>
+        <w:tc>
+          <w:tcPr>
+            <w:tcW w:type="dxa" w:w="2880"/>
+          </w:tcPr>
+          <w:p>
+            <w:r/>
+            <w:r>
+              <w:rPr>
+                <w:b w:val="0"/>
+              </w:rPr>
+              <w:t>1.92e+01</w:t>
+            </w:r>
+          </w:p>
+        </w:tc>
+        <w:tc>
+          <w:tcPr>
+            <w:tcW w:type="dxa" w:w="2880"/>
+          </w:tcPr>
+          <w:p>
+            <w:r/>
+            <w:r>
+              <w:rPr>
+                <w:b w:val="0"/>
+              </w:rPr>
+              <w:t>8.41e-02</w:t>
+            </w:r>
+          </w:p>
+        </w:tc>
+      </w:tr>
+      <w:tr>
+        <w:tc>
+          <w:tcPr>
+            <w:tcW w:type="dxa" w:w="2880"/>
+          </w:tcPr>
+          <w:p>
+            <w:r/>
+            <w:r>
+              <w:rPr>
+                <w:b w:val="0"/>
+              </w:rPr>
+              <w:t>Randomized-partition control, significant pathways (3 seeds)</w:t>
+            </w:r>
+          </w:p>
+        </w:tc>
+        <w:tc>
+          <w:tcPr>
+            <w:tcW w:type="dxa" w:w="2880"/>
+          </w:tcPr>
+          <w:p>
+            <w:r/>
+            <w:r>
+              <w:rPr>
+                <w:b w:val="0"/>
+              </w:rPr>
+              <w:t>26–48</w:t>
+            </w:r>
+          </w:p>
+        </w:tc>
+        <w:tc>
+          <w:tcPr>
+            <w:tcW w:type="dxa" w:w="2880"/>
+          </w:tcPr>
+          <w:p>
+            <w:r/>
+            <w:r>
+              <w:rPr>
+                <w:b w:val="0"/>
+              </w:rPr>
+              <w:t>n.a.</w:t>
             </w:r>
           </w:p>
         </w:tc>
@@ -11355,41 +11118,239 @@
         <w:rPr>
           <w:b w:val="0"/>
         </w:rPr>
-        <w:t>Permutation null: under 1,000 label permutations, a mean of 0.16 (LUAD) and 0.19 (BRCA) pathways reached FDR q&lt;0.05 by chance (maximum 34 in LUAD, 19 in BRCA); observed 3 (LUAD, P=0.014) and 43 (BRCA, P&lt;0.001).</w:t>
+        <w:t>Hypothesis-generating pathways that exceeded the per-pathway permutation null and the density-matched control:</w:t>
       </w:r>
     </w:p>
-    <w:p>
-      <w:r>
-        <w:rPr>
-          <w:b w:val="0"/>
-        </w:rPr>
-        <w:t>Randomized pathway partitions (3 seeds): 26–48 significant pathways.</w:t>
-      </w:r>
-    </w:p>
-    <w:p>
-      <w:r>
-        <w:rPr>
-          <w:b w:val="0"/>
-        </w:rPr>
-        <w:t>Static-model between-stratum edge variance: 3.48e-13 (essentially zero by construction).</w:t>
-      </w:r>
-    </w:p>
-    <w:p>
-      <w:r>
-        <w:rPr>
-          <w:b w:val="0"/>
-        </w:rPr>
-        <w:t>Clinical correlation (TMB): ρ=0.13, P=0.003, n=522.</w:t>
-      </w:r>
-    </w:p>
-    <w:p>
-      <w:r>
-        <w:rPr>
-          <w:b w:val="0"/>
-        </w:rPr>
-        <w:t>Multivariable Cox (risk score + stage + age): LUAD HR 1.22 per SD (95% CI 1.01–1.46, P=0.035); BRCA HR 1.27 (95% CI 1.06–1.53, P=0.010).</w:t>
-      </w:r>
-    </w:p>
+    <w:tbl>
+      <w:tblPr>
+        <w:tblStyle w:val="TableGrid"/>
+        <w:tblW w:type="auto" w:w="0"/>
+        <w:tblLook w:firstColumn="1" w:firstRow="1" w:lastColumn="0" w:lastRow="0" w:noHBand="0" w:noVBand="1" w:val="04A0"/>
+      </w:tblPr>
+      <w:tblGrid>
+        <w:gridCol w:w="1728"/>
+        <w:gridCol w:w="1728"/>
+        <w:gridCol w:w="1728"/>
+        <w:gridCol w:w="1728"/>
+        <w:gridCol w:w="1728"/>
+      </w:tblGrid>
+      <w:tr>
+        <w:tc>
+          <w:tcPr>
+            <w:tcW w:type="dxa" w:w="1728"/>
+          </w:tcPr>
+          <w:p>
+            <w:r/>
+            <w:r>
+              <w:rPr>
+                <w:b w:val="0"/>
+              </w:rPr>
+              <w:t>Cancer</w:t>
+            </w:r>
+          </w:p>
+        </w:tc>
+        <w:tc>
+          <w:tcPr>
+            <w:tcW w:type="dxa" w:w="1728"/>
+          </w:tcPr>
+          <w:p>
+            <w:r/>
+            <w:r>
+              <w:rPr>
+                <w:b w:val="0"/>
+              </w:rPr>
+              <w:t>Pathway</w:t>
+            </w:r>
+          </w:p>
+        </w:tc>
+        <w:tc>
+          <w:tcPr>
+            <w:tcW w:type="dxa" w:w="1728"/>
+          </w:tcPr>
+          <w:p>
+            <w:r/>
+            <w:r>
+              <w:rPr>
+                <w:b w:val="0"/>
+              </w:rPr>
+              <w:t>Cohen's d (95% CI)</w:t>
+            </w:r>
+          </w:p>
+        </w:tc>
+        <w:tc>
+          <w:tcPr>
+            <w:tcW w:type="dxa" w:w="1728"/>
+          </w:tcPr>
+          <w:p>
+            <w:r/>
+            <w:r>
+              <w:rPr>
+                <w:b w:val="0"/>
+              </w:rPr>
+              <w:t>Permutation q</w:t>
+            </w:r>
+          </w:p>
+        </w:tc>
+        <w:tc>
+          <w:tcPr>
+            <w:tcW w:type="dxa" w:w="1728"/>
+          </w:tcPr>
+          <w:p>
+            <w:r/>
+            <w:r>
+              <w:rPr>
+                <w:b w:val="0"/>
+              </w:rPr>
+              <w:t>Density-matched percentile</w:t>
+            </w:r>
+          </w:p>
+        </w:tc>
+      </w:tr>
+      <w:tr>
+        <w:tc>
+          <w:tcPr>
+            <w:tcW w:type="dxa" w:w="1728"/>
+          </w:tcPr>
+          <w:p>
+            <w:r/>
+            <w:r>
+              <w:rPr>
+                <w:b w:val="0"/>
+              </w:rPr>
+              <w:t>LUAD</w:t>
+            </w:r>
+          </w:p>
+        </w:tc>
+        <w:tc>
+          <w:tcPr>
+            <w:tcW w:type="dxa" w:w="1728"/>
+          </w:tcPr>
+          <w:p>
+            <w:r/>
+            <w:r>
+              <w:rPr>
+                <w:b w:val="0"/>
+              </w:rPr>
+              <w:t>Homologous recombination</w:t>
+            </w:r>
+          </w:p>
+        </w:tc>
+        <w:tc>
+          <w:tcPr>
+            <w:tcW w:type="dxa" w:w="1728"/>
+          </w:tcPr>
+          <w:p>
+            <w:r/>
+            <w:r>
+              <w:rPr>
+                <w:b w:val="0"/>
+              </w:rPr>
+              <w:t>0.35 (0.18–0.53)</w:t>
+            </w:r>
+          </w:p>
+        </w:tc>
+        <w:tc>
+          <w:tcPr>
+            <w:tcW w:type="dxa" w:w="1728"/>
+          </w:tcPr>
+          <w:p>
+            <w:r/>
+            <w:r>
+              <w:rPr>
+                <w:b w:val="0"/>
+              </w:rPr>
+              <w:t>q=0.026</w:t>
+            </w:r>
+          </w:p>
+        </w:tc>
+        <w:tc>
+          <w:tcPr>
+            <w:tcW w:type="dxa" w:w="1728"/>
+          </w:tcPr>
+          <w:p>
+            <w:r/>
+            <w:r>
+              <w:rPr>
+                <w:b w:val="0"/>
+              </w:rPr>
+              <w:t>96.0</w:t>
+            </w:r>
+          </w:p>
+        </w:tc>
+      </w:tr>
+      <w:tr>
+        <w:tc>
+          <w:tcPr>
+            <w:tcW w:type="dxa" w:w="1728"/>
+          </w:tcPr>
+          <w:p>
+            <w:r/>
+            <w:r>
+              <w:rPr>
+                <w:b w:val="0"/>
+              </w:rPr>
+              <w:t>LUAD</w:t>
+            </w:r>
+          </w:p>
+        </w:tc>
+        <w:tc>
+          <w:tcPr>
+            <w:tcW w:type="dxa" w:w="1728"/>
+          </w:tcPr>
+          <w:p>
+            <w:r/>
+            <w:r>
+              <w:rPr>
+                <w:b w:val="0"/>
+              </w:rPr>
+              <w:t>DNA replication</w:t>
+            </w:r>
+          </w:p>
+        </w:tc>
+        <w:tc>
+          <w:tcPr>
+            <w:tcW w:type="dxa" w:w="1728"/>
+          </w:tcPr>
+          <w:p>
+            <w:r/>
+            <w:r>
+              <w:rPr>
+                <w:b w:val="0"/>
+              </w:rPr>
+              <w:t>0.35 (0.18–0.52)</w:t>
+            </w:r>
+          </w:p>
+        </w:tc>
+        <w:tc>
+          <w:tcPr>
+            <w:tcW w:type="dxa" w:w="1728"/>
+          </w:tcPr>
+          <w:p>
+            <w:r/>
+            <w:r>
+              <w:rPr>
+                <w:b w:val="0"/>
+              </w:rPr>
+              <w:t>q=0.026</w:t>
+            </w:r>
+          </w:p>
+        </w:tc>
+        <w:tc>
+          <w:tcPr>
+            <w:tcW w:type="dxa" w:w="1728"/>
+          </w:tcPr>
+          <w:p>
+            <w:r/>
+            <w:r>
+              <w:rPr>
+                <w:b w:val="0"/>
+              </w:rPr>
+              <w:t>94.0</w:t>
+            </w:r>
+          </w:p>
+        </w:tc>
+      </w:tr>
+    </w:tbl>
     <w:p>
       <w:r>
         <w:rPr>
@@ -11401,7 +11362,7 @@
         <w:rPr>
           <w:b w:val="0"/>
         </w:rPr>
-        <w:t xml:space="preserve"> To test whether the between-stratum edge-weight differences are specific to the pathway-constrained adaptive architecture, we trained a standard GAT on a sample-invariant k-nearest-neighbor gene graph (k=10; no pathway constraint) under the identical training protocol and applied the identical pathway-level testing pipeline. The standard GAT yielded 11 of 54 significantly rewired pathways in BRCA and 1 of 54 in LUAD (BH-FDR q&lt;0.05), compared with 43 of 53 and 3 of 53 for the adaptive pathway-constrained model (Table 6); the pathway-constrained model yielded substantially more detectable between-stratum differences, indicating that the pathway partition contributes to the statistical detection of these differences; consistent with the randomized-partition control (Section 3.4.1), canonical pathway structure is nonetheless not uniquely required to produce them.</w:t>
+        <w:t xml:space="preserve"> To test whether the between-stratum edge-weight differences are specific to the pathway-constrained adaptive architecture, we trained a standard GAT on a sample-invariant k-nearest-neighbor gene graph (k=10; no pathway constraint) under the identical training protocol and applied the identical pathway-level testing pipeline. The standard GAT yielded 11 of 54 significantly rewired pathways in BRCA and 1 of 54 in LUAD (BH-FDR q&lt;0.05), compared with 43 of 53 and 2 of 53 for the adaptive pathway-constrained model under the same permutation-calibrated procedure (Table 6); the pathway-constrained model yielded more detectable between-stratum differences in BRCA and a comparable count in LUAD, indicating that the pathway partition contributes to the statistical detection of these differences; consistent with the randomized-partition control (Section 3.4.2), canonical pathway structure is nonetheless not uniquely required to produce them.</w:t>
       </w:r>
     </w:p>
     <w:p>
@@ -15287,7 +15248,7 @@
         <w:rPr>
           <w:b w:val="0"/>
         </w:rPr>
-        <w:t xml:space="preserve"> First, the predictive performance of the adaptive model did not exceed penalized Cox baselines on internal CV, and ablations did not isolate a significant C-index contribution from the adaptive gate, the pathway constraint, or the regularization terms; interpretability is the rationale for its use, not a discrimination gain. Second, the learnable malignancy gate beta converged to values near zero in the trained models, so the effective sample-specificity arises from the attention coefficients themselves; we therefore describe the mechanism as patient-specific attention rather than as demonstrable malignancy-driven gating. Third, hypergeometric enrichment of the top-20 rewired pathways against a curated LUAD driver-pathway list was not significant with P=0.875; an equivalent test was not performed for BRCA because no matched curated driver-pathway list was available, and enrichment should not be over-interpreted. Fourth, randomized pathway partitions produced comparable or larger numbers of between-stratum significant pathways, indicating that between-stratum attention differences are generic; the pathway prior supplies biological context for interpreting them. Fifth, attention weights provide hypothesis-generating, not causal, evidence, and all cohorts are retrospective; prospective validation is required. Sixth, the pan-cancer benchmark used a single seed; a three-seed sensitivity analysis on LUAD and BRCA, the cohorts used for the rewiring analyses, showed stable C-index values of 0.50 ± 0.04 in LUAD and 0.59 ± 0.04 in BRCA, but seed variance was not propagated to all cohorts.</w:t>
+        <w:t xml:space="preserve"> First, the predictive performance of the adaptive model did not exceed penalized Cox baselines on internal CV, and ablations did not isolate a significant C-index contribution from the adaptive gate, the pathway constraint, or the regularization terms; interpretability is the rationale for its use, not a discrimination gain. Second, the learnable malignancy gate beta converged to values near zero in the trained models, so the effective sample-specificity arises from the attention coefficients themselves; we therefore describe the mechanism as patient-specific attention rather than as demonstrable malignancy-driven gating. Third, hypergeometric enrichment of the top-20 rewired pathways ranked by permutation P against a curated LUAD driver-pathway list was not significant (5 hits, P=0.689); an equivalent test was not performed for BRCA because no matched curated driver-pathway list was available. Fourth, matched random gene-set controls did not show global selectivity of canonical pathway identity for the between-stratum differences, and the few pathways that exceeded both permutation and matched-set nulls remain hypothesis-generating; the pathway prior is retained as an interpretable organizing principle rather than as evidence of specific pathway activation. Fifth, attention weights provide hypothesis-generating, not causal, evidence, and all cohorts are retrospective; prospective validation is required. Sixth, the pan-cancer benchmark used a single seed; a three-seed sensitivity analysis on LUAD and BRCA, the cohorts used for the rewiring analyses, showed stable C-index values of 0.50 ± 0.04 in LUAD and 0.59 ± 0.04 in BRCA, but seed variance was not propagated to all cohorts.</w:t>
       </w:r>
     </w:p>
     <w:p>

</xml_diff>

<commit_message>
docs: real repo/PyPI/Zenodo links in manuscript, cover letter, notebooks, submission docs
</commit_message>
<xml_diff>
--- a/manuscript/Path-AGNN-Cox_manuscript.docx
+++ b/manuscript/Path-AGNN-Cox_manuscript.docx
@@ -194,7 +194,7 @@
         <w:rPr>
           <w:b w:val="0"/>
         </w:rPr>
-        <w:t xml:space="preserve"> Source code, preprocessing pipelines (R + Python), example notebooks, and the Python package `path_agnn_cox` (pip-installable from source) are available in a public GitHub repository; the repository URL will be registered upon acceptance.</w:t>
+        <w:t xml:space="preserve"> Source code, preprocessing pipelines (R + Python), example notebooks, and the Python package `path_agnn_cox` (installable via `pip install path-agnn-cox`) are available at https://github.com/wangzhipeng-1/Path-AGNN-Cox under the MIT license, with an archived snapshot at Zenodo (https://doi.org/10.5281/zenodo.22030045).</w:t>
       </w:r>
     </w:p>
     <w:p>
@@ -15289,7 +15289,7 @@
         <w:rPr>
           <w:b w:val="0"/>
         </w:rPr>
-        <w:t xml:space="preserve"> Public GitHub repository (Python package `path_agnn_cox`, R preprocessing scripts in `data/scripts/`; URL to be registered upon acceptance).</w:t>
+        <w:t xml:space="preserve"> https://github.com/wangzhipeng-1/Path-AGNN-Cox (MIT license; Python package `path_agnn_cox`; R preprocessing scripts in `data/scripts/`; Zenodo archive: https://doi.org/10.5281/zenodo.22030045).</w:t>
       </w:r>
     </w:p>
     <w:p>
@@ -15306,7 +15306,7 @@
         <w:rPr>
           <w:b w:val="0"/>
         </w:rPr>
-        <w:t xml:space="preserve"> `pip install .` from the repository (package `path_agnn_cox`); example notebooks under `examples/`.</w:t>
+        <w:t xml:space="preserve"> `pip install path-agnn-cox` (PyPI) or `pip install .` from the repository; example notebooks under `examples/`.</w:t>
       </w:r>
     </w:p>
     <w:p>

</xml_diff>

<commit_message>
manuscript: add repo/Zenodo links to intro, methods, conclusion; fix duplicated methods sentence
</commit_message>
<xml_diff>
--- a/manuscript/Path-AGNN-Cox_manuscript.docx
+++ b/manuscript/Path-AGNN-Cox_manuscript.docx
@@ -329,7 +329,7 @@
         <w:rPr>
           <w:b w:val="0"/>
         </w:rPr>
-        <w:t>—intra-pathway sparsity plus a consistency constraint—that directly optimizes prognostic risk while suppressing overfitting in high-heterogeneity cohorts. We benchmark Path-AGNN-Cox against classical survival models, deep survival models, and static pathway-constrained GNNs across 11 TCGA cancer types with 25 independent GEO validation cohorts—substantially broader external validation than comparable pathway-GNN studies—and isolate the contribution of each module through systematic ablations. Beyond predictive performance, we assess the biological content of the learned sample-specific edge weights: between-stratum rewiring exceeds label-permutation nulls, is qualitatively coherent with tumor progression biology, such as cell cycle and DNA replication, and correlates with clinical indicators of malignancy, whereas static models by construction cannot produce such signal. We release the model as an open-source Python package with reproducible pipelines.</w:t>
+        <w:t>—intra-pathway sparsity plus a consistency constraint—that directly optimizes prognostic risk while suppressing overfitting in high-heterogeneity cohorts. We benchmark Path-AGNN-Cox against classical survival models, deep survival models, and static pathway-constrained GNNs across 11 TCGA cancer types with 25 independent GEO validation cohorts—substantially broader external validation than comparable pathway-GNN studies—and isolate the contribution of each module through systematic ablations. Beyond predictive performance, we assess the biological content of the learned sample-specific edge weights: between-stratum rewiring exceeds label-permutation nulls, is qualitatively coherent with tumor progression biology, such as cell cycle and DNA replication, and correlates with clinical indicators of malignancy, whereas static models by construction cannot produce such signal. We release the model as an open-source Python package with reproducible pipelines; source code is available at https://github.com/wangzhipeng-1/Path-AGNN-Cox under the MIT license, and a versioned archive is available at https://doi.org/10.5281/zenodo.22030045.</w:t>
       </w:r>
     </w:p>
     <w:p>
@@ -1997,7 +1997,7 @@
         <w:rPr>
           <w:b w:val="0"/>
         </w:rPr>
-        <w:t>We used stratified 5-fold cross-validation within each TCGA cohort (fold-stratified on the event indicator; random seed 42). The concordance index (C-index) served as the primary discrimination metric; the time-dependent AUC (mean over the 0.25/0.50/0.75 quantile times) was used as a secondary metric. For external validation, each model was retrained on the full TCGA cohort and evaluated on the GEO cohorts without any fine-tuning. Paired Wilcoxon signed-rank tests (per-dataset mean C-index, internal CV) were used to compare Path-AGNN-Cox against each baseline. Per-patient edge weights were extracted from the last adaptive layer and patients were split at the median predicted risk. Between-stratum rewiring was tested per pathway on the per-sample mean edge weight within each pathway, reporting Cohen's d with a normal-approximation 95% CI, and the false discovery rate was controlled with the Benjamini–Hochberg procedure. Each pathway was additionally tested under 1,000 within-pathway label permutations of the risk strata; the permutation P was one plus the number of null permutations with at least as large an absolute effect, divided by 1,001. At the cohort level, the number of significant pathways was compared with a 1,000-permutation null obtained by permuting the risk labels, with the permutation P computed as one plus the number of null counts at least as large as the observed count, divided by 1,001. Two matched random gene-set controls assessed pathway-identity selectivity: for each real pathway, 200 random gene sets of equal size with matched internal edge counts, and 200 random equal-size subsets drawn from real pathway blocks so that size and density were matched, were scored with the identical effect-size statistic, and the percentile of each real pathway within its null distribution was recorded. Pathway-level enrichment of the top-20 pathways ranked by permutation P against a curated LUAD driver-pathway list was tested with the hypergeometric distribution over the 57-pathway cancer-core catalogue. Static-model, randomized-partition and standard-GAT controls followed the same protocol. All analyses are implemented in benchmark/rewiring_analysis.py and the work/ scripts of the repository. All analyses are implemented in benchmark/rewiring_analysis.py and the work/ scripts of the repository. Model hyperparameters are listed in the footnote of Table 2 (see config/benchmark.yaml). All deep models were trained on CPU with Adam; the full benchmark consumed approximately 1,500 CPU-hours.</w:t>
+        <w:t>We used stratified 5-fold cross-validation within each TCGA cohort (fold-stratified on the event indicator; random seed 42). The concordance index (C-index) served as the primary discrimination metric; the time-dependent AUC (mean over the 0.25/0.50/0.75 quantile times) was used as a secondary metric. For external validation, each model was retrained on the full TCGA cohort and evaluated on the GEO cohorts without any fine-tuning. Paired Wilcoxon signed-rank tests (per-dataset mean C-index, internal CV) were used to compare Path-AGNN-Cox against each baseline. Per-patient edge weights were extracted from the last adaptive layer and patients were split at the median predicted risk. Between-stratum rewiring was tested per pathway on the per-sample mean edge weight within each pathway, reporting Cohen's d with a normal-approximation 95% CI, and the false discovery rate was controlled with the Benjamini–Hochberg procedure. Each pathway was additionally tested under 1,000 within-pathway label permutations of the risk strata; the permutation P was one plus the number of null permutations with at least as large an absolute effect, divided by 1,001. At the cohort level, the number of significant pathways was compared with a 1,000-permutation null obtained by permuting the risk labels, with the permutation P computed as one plus the number of null counts at least as large as the observed count, divided by 1,001. Two matched random gene-set controls assessed pathway-identity selectivity: for each real pathway, 200 random gene sets of equal size with matched internal edge counts, and 200 random equal-size subsets drawn from real pathway blocks so that size and density were matched, were scored with the identical effect-size statistic, and the percentile of each real pathway within its null distribution was recorded. Pathway-level enrichment of the top-20 pathways ranked by permutation P against a curated LUAD driver-pathway list was tested with the hypergeometric distribution over the 57-pathway cancer-core catalogue. Static-model, randomized-partition and standard-GAT controls followed the same protocol. All analyses are implemented in benchmark/rewiring_analysis.py and the work/ scripts of the repository at https://github.com/wangzhipeng-1/Path-AGNN-Cox. Model hyperparameters are listed in the footnote of Table 2 (see config/benchmark.yaml). All deep models were trained on CPU with Adam; the full benchmark consumed approximately 1,500 CPU-hours.</w:t>
       </w:r>
     </w:p>
     <w:p>
@@ -15264,7 +15264,7 @@
         <w:rPr>
           <w:b w:val="0"/>
         </w:rPr>
-        <w:t>Path-AGNN-Cox couples a pathway-constrained GNN with patient-specific attention to a formal statistical framework for testing and clinically anchoring patient-specific pathway rewiring, while offering discrimination comparable to deep survival baselines. With 11 internal and 25 external cohorts, open-source code, and a pip-installable Python package, the framework is directly reusable for pan-cancer prognostic modeling and for interrogating the patient-specific graph dynamics that static pathway models cannot produce.</w:t>
+        <w:t>Path-AGNN-Cox couples a pathway-constrained GNN with patient-specific attention to a formal statistical framework for testing and clinically anchoring patient-specific pathway rewiring, while offering discrimination comparable to deep survival baselines. With 11 internal and 25 external cohorts, open-source code at https://github.com/wangzhipeng-1/Path-AGNN-Cox, a versioned Zenodo archive at https://doi.org/10.5281/zenodo.22030045, and a pip-installable Python package, the framework is directly reusable for pan-cancer prognostic modeling and for interrogating the patient-specific graph dynamics that static pathway models cannot produce.</w:t>
       </w:r>
     </w:p>
     <w:p>

</xml_diff>

<commit_message>
manuscript: expression-scale/z-score statement; differential-network positioning + 3 refs
</commit_message>
<xml_diff>
--- a/manuscript/Path-AGNN-Cox_manuscript.docx
+++ b/manuscript/Path-AGNN-Cox_manuscript.docx
@@ -1320,6 +1320,14 @@
           <w:b w:val="0"/>
         </w:rPr>
         <w:t>For the GEO cohorts, probes were mapped to gene symbols using the platform annotation tables downloaded from NCBI GEO (e.g., GPL570, GPL96, GPL6480); duplicate gene symbols were collapsed by maximum mean expression, and per-gene missing values were imputed with the gene-wise mean within each cohort. Survival endpoints were harmonized to overall survival in days: GEO follow-up times reported in months or years were converted with 365.25/12 or 365.25 days per unit, respectively, and TCGA overall-survival time was derived from GDC clinical annotations, that is, days to death or days to last follow-up. Because each TCGA cohort was modeled separately and each GEO cohort was validated independently without pooling, no cross-cohort batch correction was required.</w:t>
+      </w:r>
+    </w:p>
+    <w:p>
+      <w:r>
+        <w:rPr>
+          <w:b w:val="0"/>
+        </w:rPr>
+        <w:t>Expression values were analyzed at each cohort's native scale: TCGA RNA-seq values were log2(TPM+1) as provided by UCSC Xena GDC STAR-TPM, and GEO series matrices were used as provided, typically log2-scale microarray intensities. Before model fitting, every gene was z-scored with the training-cohort mean and standard deviation; external cohorts were standardized with the training statistics, and zero-variance genes were left unchanged.</w:t>
       </w:r>
     </w:p>
     <w:p>
@@ -15562,6 +15570,69 @@
           <w:b w:val="0"/>
         </w:rPr>
         <w:t>12. GSE accession references for the 25 external cohorts (full list in Table 1).</w:t>
+      </w:r>
+    </w:p>
+    <w:p>
+      <w:r>
+        <w:rPr>
+          <w:b w:val="0"/>
+        </w:rPr>
+        <w:t xml:space="preserve">13. Ha MJ, Baladandayuthapani V. DINGO: differential network analysis in genomics. </w:t>
+      </w:r>
+      <w:r>
+        <w:rPr>
+          <w:b w:val="0"/>
+          <w:i/>
+        </w:rPr>
+        <w:t>Bioinformatics</w:t>
+      </w:r>
+      <w:r>
+        <w:rPr>
+          <w:b w:val="0"/>
+        </w:rPr>
+        <w:t>. 2015;31(21):3413-3420.</w:t>
+      </w:r>
+    </w:p>
+    <w:p>
+      <w:r>
+        <w:rPr>
+          <w:b w:val="0"/>
+        </w:rPr>
+        <w:t xml:space="preserve">14. de la Fuente A. From 'differential expression' to 'differential networking': identification of dysfunctional regulatory networks in diseases. </w:t>
+      </w:r>
+      <w:r>
+        <w:rPr>
+          <w:b w:val="0"/>
+          <w:i/>
+        </w:rPr>
+        <w:t>Trends Genet</w:t>
+      </w:r>
+      <w:r>
+        <w:rPr>
+          <w:b w:val="0"/>
+        </w:rPr>
+        <w:t>. 2010;26(7):326-333.</w:t>
+      </w:r>
+    </w:p>
+    <w:p>
+      <w:r>
+        <w:rPr>
+          <w:b w:val="0"/>
+        </w:rPr>
+        <w:t xml:space="preserve">15. Gill R, Datta S, Datta S. A statistical framework for differential network analysis from microarray data. </w:t>
+      </w:r>
+      <w:r>
+        <w:rPr>
+          <w:b w:val="0"/>
+          <w:i/>
+        </w:rPr>
+        <w:t>BMC Bioinformatics</w:t>
+      </w:r>
+      <w:r>
+        <w:rPr>
+          <w:b w:val="0"/>
+        </w:rPr>
+        <w:t>. 2010;11:95.</w:t>
       </w:r>
     </w:p>
     <w:sectPr>

</xml_diff>

<commit_message>
rewiring: add KIRC third-cancer pipeline; pure-null matched-control simulation; correct percentile direction; external pathway-meta negative result in limitations
</commit_message>
<xml_diff>
--- a/manuscript/Path-AGNN-Cox_manuscript.docx
+++ b/manuscript/Path-AGNN-Cox_manuscript.docx
@@ -180,7 +180,7 @@
         <w:rPr>
           <w:b w:val="0"/>
         </w:rPr>
-        <w:t xml:space="preserve"> for survival prediction. Path-AGNN-Cox (i) partitions genes into KEGG cancer-core pathway modules and restricts message passing to biologically co-regulated gene pairs; (ii) computes sample-specific within-pathway attention weights via a learnable, malignancy-modulated gate; and (iii) optimizes a Cox partial-likelihood objective with dual regularization—intra-pathway sparsity plus a dropout-consistency constraint—to suppress overfitting in high-heterogeneity cohorts. We benchmarked Path-AGNN-Cox against seven survival baselines (penalized Cox, RSF, deep survival, and plain-GNN) across 11 TCGA cancer types (5336 patients) under stratified 5-fold cross-validation, and validated transferability on 25 independent GEO cohorts spanning the same tumor types. On internal CV, Path-AGNN-Cox reached a mean C-index of 0.56 (SD 0.04), comparable to deep survival baselines (0.61) but below penalized Cox (0.62; paired difference Δ=-0.07 (95% CI -0.10 to -0.04)); we therefore make no claim of a discrimination gain. Its distinguishing value is the interpretable rewiring output: on 25 independent GEO cohorts the model matched deep baselines (0.51 vs. 0.50), while providing per-patient pathway weights that static models cannot produce. Ablations showed that removing the pathway constraint, the adaptive gate, or the dual regularization did not significantly change discrimination (all P&gt;0.05), indicating that the value of the adaptive design lies in interpretability rather than in a measurable C-index gain. The learned sample-specific edge weights are statistically testable: rewiring between high- and low-risk patients was far beyond label-permutation nulls (BRCA: 43/53 pathways, permutation P&lt;0.001; LUAD: 3/53, P=0.014), correlated with clinical indicators of malignancy (Ki-67, TMB), and was absent by construction in static pathway models. In the IMvigor210 anti-PD-L1 cohort, the rewiring magnitude differed between responders (CR/PR) and non-responders (SD/PD) (median 686.43 vs 624.81; Wilcoxon P=0.111; n=68/230); high-rewiring patients showed HR 1.40 (95% CI 0.96-2.04, P=0.082) for OS; rewiring magnitude correlated with Ki-67 expression (Spearman rho=0.26, P&lt;0.001, n=348)</w:t>
+        <w:t xml:space="preserve"> for survival prediction. Path-AGNN-Cox (i) partitions genes into KEGG cancer-core pathway modules and restricts message passing to biologically co-regulated gene pairs; (ii) computes sample-specific within-pathway attention weights via a learnable, malignancy-modulated gate; and (iii) optimizes a Cox partial-likelihood objective with dual regularization—intra-pathway sparsity plus a dropout-consistency constraint—to suppress overfitting in high-heterogeneity cohorts. We benchmarked Path-AGNN-Cox against seven survival baselines (penalized Cox, RSF, deep survival, and plain-GNN) across 11 TCGA cancer types (5336 patients) under stratified 5-fold cross-validation, and validated transferability on 25 independent GEO cohorts spanning the same tumor types. On internal CV, Path-AGNN-Cox reached a mean C-index of 0.56 (SD 0.04), comparable to deep survival baselines (0.61) but below penalized Cox (0.62; paired difference Δ=-0.07 (95% CI -0.10 to -0.04)); we therefore make no claim of a discrimination gain. Its distinguishing value is the interpretable rewiring output: on 25 independent GEO cohorts the model matched deep baselines (0.51 vs. 0.50), while providing per-patient pathway weights that static models cannot produce. Ablations showed that removing the pathway constraint, the adaptive gate, or the dual regularization did not significantly change discrimination (all P&gt;0.05), indicating that the value of the adaptive design lies in interpretability rather than in a measurable C-index gain. The learned sample-specific edge weights are statistically testable: rewiring between high- and low-risk patients was far beyond label-permutation nulls (BRCA: 43/53 pathways, permutation P&lt;0.001; LUAD: 3/53, P=0.014; KIRC: 52/53, P=0.005), correlated with clinical indicators of malignancy (Ki-67, TMB), and was absent by construction in static pathway models. In the IMvigor210 anti-PD-L1 cohort, the rewiring magnitude differed between responders (CR/PR) and non-responders (SD/PD) (median 686.43 vs 624.81; Wilcoxon P=0.111; n=68/230); high-rewiring patients showed HR 1.40 (95% CI 0.96-2.04, P=0.082) for OS; rewiring magnitude correlated with Ki-67 expression (Spearman rho=0.26, P&lt;0.001, n=348)</w:t>
       </w:r>
     </w:p>
     <w:p>
@@ -10236,7 +10236,7 @@
         <w:rPr>
           <w:b w:val="0"/>
         </w:rPr>
-        <w:t>A central claim of this work is that the sample-specific edge weights carry patient-specific variation that can be tested formally for biological content. We therefore extracted, for every patient, the last-layer adaptive attention weights within each pathway block and compared high- vs. low-risk strata (median risk split) in LUAD and BRCA (Figure 5).</w:t>
+        <w:t>A central claim of this work is that the sample-specific edge weights carry patient-specific variation that can be tested formally for biological content. We therefore extracted, for every patient, the last-layer adaptive attention weights within each pathway block and compared high- vs. low-risk strata (median risk split) in LUAD, BRCA and KIRC (Figure 5).</w:t>
       </w:r>
     </w:p>
     <w:p>
@@ -10292,7 +10292,7 @@
         <w:rPr>
           <w:b w:val="0"/>
         </w:rPr>
-        <w:t>Patient-specific pathway rewiring.** (A) Between-stratum effect sizes (Cohen's d with 95% CI) for all 53 pathways in LUAD, with the two pathways surviving per-pathway label permutation and BH-FDR correction highlighted. (B) Same as A for BRCA. (C) Cohort-level label-permutation null: number of significant pathways observed versus the null mean and maximum under 1,000 label permutations (LUAD and BRCA). (D) Correlation between per-patient rewiring magnitude and clinical malignancy indicators (LUAD). (E) Matched random gene-set controls: distribution of the null percentiles of real pathways for the edge-matched and density-matched nulls in LUAD and BRCA, with the 50th percentile (chance) marked.</w:t>
+        <w:t>Patient-specific pathway rewiring.** (A) Between-stratum effect sizes (Cohen's d with 95% CI) for all 53 pathways in LUAD, with the two pathways surviving per-pathway label permutation and BH-FDR correction highlighted. (B) Same as A for BRCA. (C) Cohort-level label-permutation null: number of significant pathways observed versus the null mean and maximum under 1,000 label permutations (LUAD and BRCA). (D) Correlation between per-patient rewiring magnitude and clinical malignancy indicators (LUAD). (E) Matched random gene-set controls in LUAD, BRCA and KIRC: distribution of P(null effect ≥ real effect) for the edge-matched and density-matched nulls; low values indicate real pathway effects above the matched random sets. The simulated pure-null median of the density-matched statistic was 1.00 (LUAD and BRCA), so values below the simulated 5th percentile exceed the structural bias of row-normalized attention.</w:t>
       </w:r>
     </w:p>
     <w:p>
@@ -10300,13 +10300,13 @@
         <w:rPr>
           <w:b/>
         </w:rPr>
-        <w:t>3.4.1. Between-stratum rewiring exceeds label-permutation chance but is not globally pathway-selective.</w:t>
+        <w:t>3.4.1. Between-stratum rewiring exceeds label-permutation chance; matched-set selectivity is cohort-dependent.</w:t>
       </w:r>
       <w:r>
         <w:rPr>
           <w:b w:val="0"/>
         </w:rPr>
-        <w:t xml:space="preserve"> The per-sample mean edge weight within each pathway was compared between high- and low-risk strata (median risk split) with Cohen's d and 95% CI (Figure 5A,B). After per-pathway label permutation (1,000 permutations) and BH-FDR correction, 43 of 53 pathways in BRCA and 2 in LUAD remained significant; the two LUAD pathways were Homologous recombination (d = 0.35, 95% CI 0.18–0.53) and DNA replication (d = 0.35, 95% CI 0.18–0.52) (Table 6). At the cohort level, the number of pathways with BH-FDR q&lt;0.05 on the pathway-level test exceeded the 1,000-permutation label-permutation null in both cancers (LUAD: 3 observed vs. null mean 0.16, maximum 34, permutation P=0.014; BRCA: 43 observed vs. null mean 0.19, maximum 19, permutation P&lt;0.001, the resolution limit of the 1,000-permutation null). The between-stratum differences therefore reflect risk-associated structure in the attention weights rather than the risk stratification itself.</w:t>
+        <w:t xml:space="preserve"> The per-sample mean edge weight within each pathway was compared between high- and low-risk strata (median risk split) with Cohen's d and 95% CI (Figure 5A,B). After per-pathway label permutation (1,000 permutations) and BH-FDR correction, 43 of 53 pathways in BRCA, 2 in LUAD and 52 in KIRC remained significant; the two LUAD pathways were Homologous recombination (d = 0.35, 95% CI 0.18–0.53) and DNA replication (d = 0.35, 95% CI 0.18–0.52) (Table 6). At the cohort level, the number of pathways with BH-FDR q&lt;0.05 on the pathway-level test exceeded the cohort-level label-permutation null in all three cohorts (LUAD: 3 observed vs. null mean 0.16, maximum 34, permutation P=0.014; BRCA: 43 observed vs. null mean 0.19, maximum 19, permutation P&lt;0.001; KIRC: 52 observed vs. null mean 0.07, maximum 3, permutation P=0.005; 200 cohort-level permutations). The between-stratum differences therefore reflect risk-associated structure in the attention weights rather than the risk stratification itself.</w:t>
       </w:r>
     </w:p>
     <w:p>
@@ -10314,7 +10314,7 @@
         <w:rPr>
           <w:b w:val="0"/>
         </w:rPr>
-        <w:t>Pathway identity, however, was not globally selective. Under matched random gene-set controls preserving gene-set size and either internal edge count or graph density, the real pathways were not enriched above the matched nulls: the median percentile of the real pathways was 0.67 in LUAD, with 3 of 53 pathways above the 95th percentile (expected 2.65), and 0.09 in BRCA, with 0 of 53 (expected 2.65); the density-matched control gave median percentiles of 0.69 and 0.20, respectively. Known-pathway enrichment of the top-20 pathways ranked by permutation P was not significant in LUAD (5 hits, P=0.689). The two LUAD pathways that survived the permutation-calibrated test exceeded 94%–96% of the density-matched null sets, whereas no BRCA pathway exceeded the 95th percentile of that null; these observations are hypothesis-generating rather than evidence of global pathway-specific rewiring. The pathway partition therefore supplies interpretable labels for the rewiring output, but canonical pathway identity is not statistically required to produce it.</w:t>
+        <w:t>Pathway identity was not globally selective, but matched-set enrichment was cohort-dependent. The percentile is defined as P(null effect ≥ real effect), so low values indicate that a real pathway exceeded the matched random sets. Because this statistic is computed on row-normalized attention, we first characterized it under a pure null: across 24 simulated datasets with no between-stratum signal, the median density-matched percentile was 1.00 in LUAD and 1.00 in BRCA (5th percentile of the simulated medians: 0.60 and 0.66), showing a strong upward structural bias of the statistic. Against this baseline, the observed density-matched medians were 0.69 in LUAD, within the pure-null range, 0.20 in BRCA, below the simulated 5th percentile, and 0.05 in KIRC. The edge-matched control gave median percentiles of 0.67, 0.09 and &lt;0.01 in LUAD, BRCA and KIRC. The number of real pathways above the 95th percentile of the density-matched null was 1, 6 and 25 of 53 (expected 2.65 by chance), and 2, 16 and 39 of 53 for the edge-matched null. Matched-set enrichment was therefore evident in BRCA and KIRC and could not be attributed to the structural bias of row-normalized attention, whereas LUAD showed no enrichment beyond the structural null. Known-pathway enrichment of the top-20 pathways ranked by permutation P was not significant in LUAD (5 hits, P=0.689). These observations are hypothesis-generating rather than evidence of specific pathway activation, and the pathway partition remains an interpretable organizing principle rather than a statistically necessary one.</w:t>
       </w:r>
       <w:r>
         <w:rPr>
@@ -10326,7 +10326,7 @@
         <w:rPr>
           <w:b w:val="0"/>
         </w:rPr>
-        <w:t xml:space="preserve"> As a negative control, the static pathway GNN (−Adaptive) was subjected to the identical analysis; its total edge-weight variance across patients was 0.00, essentially zero by construction, whereas the adaptive model produced a total edge-weight variance of 19.21, orders of magnitude larger; the between-stratum differences of Section 3.4.1 are therefore attributable to the sample-specific attention mechanism rather than to the fixed adjacency. Retraining the adaptive model with randomized pathway partitions (block sizes preserved; three seeds) yielded 26–48 significant pathways, consistent with the matched gene-set controls of Section 3.4.1: between-stratum attention differences are not unique to canonical pathway structure, and the pathway partition supplies biologically interpretable labels rather than being statistically necessary.</w:t>
+        <w:t xml:space="preserve"> As a negative control, the static pathway GNN (−Adaptive) was subjected to the identical analysis; its total edge-weight variance across patients was 0.00, essentially zero by construction, whereas the adaptive model produced a total edge-weight variance of 19.21, orders of magnitude larger; the between-stratum differences of Section 3.4.1 are therefore attributable to the sample-specific attention mechanism rather than to the fixed adjacency. Retraining the adaptive model with randomized pathway partitions (block sizes preserved; three seeds) yielded 26–48 significant pathways in LUAD, indicating that between-stratum attention differences do not require the canonical partition. Combined with the matched-set results of Section 3.4.1, the pathway partition supplies biologically interpretable labels for the rewiring output; whether the canonical grouping itself contributes beyond any fixed grouping remains unresolved.</w:t>
       </w:r>
       <w:r>
         <w:rPr>
@@ -10402,7 +10402,7 @@
         <w:pStyle w:val="Heading3"/>
       </w:pPr>
       <w:r>
-        <w:t>Table 6. Framework validation of patient-specific pathway rewiring in LUAD and BRCA.</w:t>
+        <w:t>Table 6. Framework validation of patient-specific pathway rewiring in LUAD, BRCA and KIRC.</w:t>
       </w:r>
     </w:p>
     <w:tbl>
@@ -10412,14 +10412,15 @@
         <w:tblLook w:firstColumn="1" w:firstRow="1" w:lastColumn="0" w:lastRow="0" w:noHBand="0" w:noVBand="1" w:val="04A0"/>
       </w:tblPr>
       <w:tblGrid>
-        <w:gridCol w:w="2880"/>
-        <w:gridCol w:w="2880"/>
-        <w:gridCol w:w="2880"/>
+        <w:gridCol w:w="2160"/>
+        <w:gridCol w:w="2160"/>
+        <w:gridCol w:w="2160"/>
+        <w:gridCol w:w="2160"/>
       </w:tblGrid>
       <w:tr>
         <w:tc>
           <w:tcPr>
-            <w:tcW w:type="dxa" w:w="2880"/>
+            <w:tcW w:type="dxa" w:w="2160"/>
           </w:tcPr>
           <w:p>
             <w:r/>
@@ -10433,7 +10434,7 @@
         </w:tc>
         <w:tc>
           <w:tcPr>
-            <w:tcW w:type="dxa" w:w="2880"/>
+            <w:tcW w:type="dxa" w:w="2160"/>
           </w:tcPr>
           <w:p>
             <w:r/>
@@ -10447,7 +10448,7 @@
         </w:tc>
         <w:tc>
           <w:tcPr>
-            <w:tcW w:type="dxa" w:w="2880"/>
+            <w:tcW w:type="dxa" w:w="2160"/>
           </w:tcPr>
           <w:p>
             <w:r/>
@@ -10456,6 +10457,20 @@
                 <w:b w:val="0"/>
               </w:rPr>
               <w:t>BRCA</w:t>
+            </w:r>
+          </w:p>
+        </w:tc>
+        <w:tc>
+          <w:tcPr>
+            <w:tcW w:type="dxa" w:w="2160"/>
+          </w:tcPr>
+          <w:p>
+            <w:r/>
+            <w:r>
+              <w:rPr>
+                <w:b w:val="0"/>
+              </w:rPr>
+              <w:t>KIRC</w:t>
             </w:r>
           </w:p>
         </w:tc>
@@ -10463,7 +10478,7 @@
       <w:tr>
         <w:tc>
           <w:tcPr>
-            <w:tcW w:type="dxa" w:w="2880"/>
+            <w:tcW w:type="dxa" w:w="2160"/>
           </w:tcPr>
           <w:p>
             <w:r/>
@@ -10477,7 +10492,7 @@
         </w:tc>
         <w:tc>
           <w:tcPr>
-            <w:tcW w:type="dxa" w:w="2880"/>
+            <w:tcW w:type="dxa" w:w="2160"/>
           </w:tcPr>
           <w:p>
             <w:r/>
@@ -10491,7 +10506,21 @@
         </w:tc>
         <w:tc>
           <w:tcPr>
-            <w:tcW w:type="dxa" w:w="2880"/>
+            <w:tcW w:type="dxa" w:w="2160"/>
+          </w:tcPr>
+          <w:p>
+            <w:r/>
+            <w:r>
+              <w:rPr>
+                <w:b w:val="0"/>
+              </w:rPr>
+              <w:t>53</w:t>
+            </w:r>
+          </w:p>
+        </w:tc>
+        <w:tc>
+          <w:tcPr>
+            <w:tcW w:type="dxa" w:w="2160"/>
           </w:tcPr>
           <w:p>
             <w:r/>
@@ -10507,7 +10536,7 @@
       <w:tr>
         <w:tc>
           <w:tcPr>
-            <w:tcW w:type="dxa" w:w="2880"/>
+            <w:tcW w:type="dxa" w:w="2160"/>
           </w:tcPr>
           <w:p>
             <w:r/>
@@ -10521,7 +10550,7 @@
         </w:tc>
         <w:tc>
           <w:tcPr>
-            <w:tcW w:type="dxa" w:w="2880"/>
+            <w:tcW w:type="dxa" w:w="2160"/>
           </w:tcPr>
           <w:p>
             <w:r/>
@@ -10535,7 +10564,7 @@
         </w:tc>
         <w:tc>
           <w:tcPr>
-            <w:tcW w:type="dxa" w:w="2880"/>
+            <w:tcW w:type="dxa" w:w="2160"/>
           </w:tcPr>
           <w:p>
             <w:r/>
@@ -10544,6 +10573,20 @@
                 <w:b w:val="0"/>
               </w:rPr>
               <w:t>43</w:t>
+            </w:r>
+          </w:p>
+        </w:tc>
+        <w:tc>
+          <w:tcPr>
+            <w:tcW w:type="dxa" w:w="2160"/>
+          </w:tcPr>
+          <w:p>
+            <w:r/>
+            <w:r>
+              <w:rPr>
+                <w:b w:val="0"/>
+              </w:rPr>
+              <w:t>52</w:t>
             </w:r>
           </w:p>
         </w:tc>
@@ -10551,7 +10594,7 @@
       <w:tr>
         <w:tc>
           <w:tcPr>
-            <w:tcW w:type="dxa" w:w="2880"/>
+            <w:tcW w:type="dxa" w:w="2160"/>
           </w:tcPr>
           <w:p>
             <w:r/>
@@ -10565,7 +10608,7 @@
         </w:tc>
         <w:tc>
           <w:tcPr>
-            <w:tcW w:type="dxa" w:w="2880"/>
+            <w:tcW w:type="dxa" w:w="2160"/>
           </w:tcPr>
           <w:p>
             <w:r/>
@@ -10579,7 +10622,7 @@
         </w:tc>
         <w:tc>
           <w:tcPr>
-            <w:tcW w:type="dxa" w:w="2880"/>
+            <w:tcW w:type="dxa" w:w="2160"/>
           </w:tcPr>
           <w:p>
             <w:r/>
@@ -10588,6 +10631,20 @@
                 <w:b w:val="0"/>
               </w:rPr>
               <w:t>43</w:t>
+            </w:r>
+          </w:p>
+        </w:tc>
+        <w:tc>
+          <w:tcPr>
+            <w:tcW w:type="dxa" w:w="2160"/>
+          </w:tcPr>
+          <w:p>
+            <w:r/>
+            <w:r>
+              <w:rPr>
+                <w:b w:val="0"/>
+              </w:rPr>
+              <w:t>52</w:t>
             </w:r>
           </w:p>
         </w:tc>
@@ -10595,7 +10652,7 @@
       <w:tr>
         <w:tc>
           <w:tcPr>
-            <w:tcW w:type="dxa" w:w="2880"/>
+            <w:tcW w:type="dxa" w:w="2160"/>
           </w:tcPr>
           <w:p>
             <w:r/>
@@ -10609,7 +10666,7 @@
         </w:tc>
         <w:tc>
           <w:tcPr>
-            <w:tcW w:type="dxa" w:w="2880"/>
+            <w:tcW w:type="dxa" w:w="2160"/>
           </w:tcPr>
           <w:p>
             <w:r/>
@@ -10623,7 +10680,7 @@
         </w:tc>
         <w:tc>
           <w:tcPr>
-            <w:tcW w:type="dxa" w:w="2880"/>
+            <w:tcW w:type="dxa" w:w="2160"/>
           </w:tcPr>
           <w:p>
             <w:r/>
@@ -10632,6 +10689,20 @@
                 <w:b w:val="0"/>
               </w:rPr>
               <w:t>0.19</w:t>
+            </w:r>
+          </w:p>
+        </w:tc>
+        <w:tc>
+          <w:tcPr>
+            <w:tcW w:type="dxa" w:w="2160"/>
+          </w:tcPr>
+          <w:p>
+            <w:r/>
+            <w:r>
+              <w:rPr>
+                <w:b w:val="0"/>
+              </w:rPr>
+              <w:t>0.07</w:t>
             </w:r>
           </w:p>
         </w:tc>
@@ -10639,7 +10710,7 @@
       <w:tr>
         <w:tc>
           <w:tcPr>
-            <w:tcW w:type="dxa" w:w="2880"/>
+            <w:tcW w:type="dxa" w:w="2160"/>
           </w:tcPr>
           <w:p>
             <w:r/>
@@ -10653,7 +10724,7 @@
         </w:tc>
         <w:tc>
           <w:tcPr>
-            <w:tcW w:type="dxa" w:w="2880"/>
+            <w:tcW w:type="dxa" w:w="2160"/>
           </w:tcPr>
           <w:p>
             <w:r/>
@@ -10667,7 +10738,7 @@
         </w:tc>
         <w:tc>
           <w:tcPr>
-            <w:tcW w:type="dxa" w:w="2880"/>
+            <w:tcW w:type="dxa" w:w="2160"/>
           </w:tcPr>
           <w:p>
             <w:r/>
@@ -10676,6 +10747,20 @@
                 <w:b w:val="0"/>
               </w:rPr>
               <w:t>19</w:t>
+            </w:r>
+          </w:p>
+        </w:tc>
+        <w:tc>
+          <w:tcPr>
+            <w:tcW w:type="dxa" w:w="2160"/>
+          </w:tcPr>
+          <w:p>
+            <w:r/>
+            <w:r>
+              <w:rPr>
+                <w:b w:val="0"/>
+              </w:rPr>
+              <w:t>3</w:t>
             </w:r>
           </w:p>
         </w:tc>
@@ -10683,7 +10768,7 @@
       <w:tr>
         <w:tc>
           <w:tcPr>
-            <w:tcW w:type="dxa" w:w="2880"/>
+            <w:tcW w:type="dxa" w:w="2160"/>
           </w:tcPr>
           <w:p>
             <w:r/>
@@ -10697,7 +10782,7 @@
         </w:tc>
         <w:tc>
           <w:tcPr>
-            <w:tcW w:type="dxa" w:w="2880"/>
+            <w:tcW w:type="dxa" w:w="2160"/>
           </w:tcPr>
           <w:p>
             <w:r/>
@@ -10711,7 +10796,7 @@
         </w:tc>
         <w:tc>
           <w:tcPr>
-            <w:tcW w:type="dxa" w:w="2880"/>
+            <w:tcW w:type="dxa" w:w="2160"/>
           </w:tcPr>
           <w:p>
             <w:r/>
@@ -10720,6 +10805,20 @@
                 <w:b w:val="0"/>
               </w:rPr>
               <w:t>P&lt;0.001</w:t>
+            </w:r>
+          </w:p>
+        </w:tc>
+        <w:tc>
+          <w:tcPr>
+            <w:tcW w:type="dxa" w:w="2160"/>
+          </w:tcPr>
+          <w:p>
+            <w:r/>
+            <w:r>
+              <w:rPr>
+                <w:b w:val="0"/>
+              </w:rPr>
+              <w:t>P=0.005</w:t>
             </w:r>
           </w:p>
         </w:tc>
@@ -10727,7 +10826,7 @@
       <w:tr>
         <w:tc>
           <w:tcPr>
-            <w:tcW w:type="dxa" w:w="2880"/>
+            <w:tcW w:type="dxa" w:w="2160"/>
           </w:tcPr>
           <w:p>
             <w:r/>
@@ -10741,7 +10840,7 @@
         </w:tc>
         <w:tc>
           <w:tcPr>
-            <w:tcW w:type="dxa" w:w="2880"/>
+            <w:tcW w:type="dxa" w:w="2160"/>
           </w:tcPr>
           <w:p>
             <w:r/>
@@ -10755,7 +10854,7 @@
         </w:tc>
         <w:tc>
           <w:tcPr>
-            <w:tcW w:type="dxa" w:w="2880"/>
+            <w:tcW w:type="dxa" w:w="2160"/>
           </w:tcPr>
           <w:p>
             <w:r/>
@@ -10764,6 +10863,20 @@
                 <w:b w:val="0"/>
               </w:rPr>
               <w:t>0.09</w:t>
+            </w:r>
+          </w:p>
+        </w:tc>
+        <w:tc>
+          <w:tcPr>
+            <w:tcW w:type="dxa" w:w="2160"/>
+          </w:tcPr>
+          <w:p>
+            <w:r/>
+            <w:r>
+              <w:rPr>
+                <w:b w:val="0"/>
+              </w:rPr>
+              <w:t>&lt;0.01</w:t>
             </w:r>
           </w:p>
         </w:tc>
@@ -10771,43 +10884,57 @@
       <w:tr>
         <w:tc>
           <w:tcPr>
-            <w:tcW w:type="dxa" w:w="2880"/>
-          </w:tcPr>
-          <w:p>
-            <w:r/>
-            <w:r>
-              <w:rPr>
-                <w:b w:val="0"/>
-              </w:rPr>
-              <w:t>Pathways above the 95th percentile, edge-matched null</w:t>
-            </w:r>
-          </w:p>
-        </w:tc>
-        <w:tc>
-          <w:tcPr>
-            <w:tcW w:type="dxa" w:w="2880"/>
-          </w:tcPr>
-          <w:p>
-            <w:r/>
-            <w:r>
-              <w:rPr>
-                <w:b w:val="0"/>
-              </w:rPr>
-              <w:t>3</w:t>
-            </w:r>
-          </w:p>
-        </w:tc>
-        <w:tc>
-          <w:tcPr>
-            <w:tcW w:type="dxa" w:w="2880"/>
-          </w:tcPr>
-          <w:p>
-            <w:r/>
-            <w:r>
-              <w:rPr>
-                <w:b w:val="0"/>
-              </w:rPr>
-              <w:t>0</w:t>
+            <w:tcW w:type="dxa" w:w="2160"/>
+          </w:tcPr>
+          <w:p>
+            <w:r/>
+            <w:r>
+              <w:rPr>
+                <w:b w:val="0"/>
+              </w:rPr>
+              <w:t>Pathways above the 95th percentile of the edge-matched null</w:t>
+            </w:r>
+          </w:p>
+        </w:tc>
+        <w:tc>
+          <w:tcPr>
+            <w:tcW w:type="dxa" w:w="2160"/>
+          </w:tcPr>
+          <w:p>
+            <w:r/>
+            <w:r>
+              <w:rPr>
+                <w:b w:val="0"/>
+              </w:rPr>
+              <w:t>2</w:t>
+            </w:r>
+          </w:p>
+        </w:tc>
+        <w:tc>
+          <w:tcPr>
+            <w:tcW w:type="dxa" w:w="2160"/>
+          </w:tcPr>
+          <w:p>
+            <w:r/>
+            <w:r>
+              <w:rPr>
+                <w:b w:val="0"/>
+              </w:rPr>
+              <w:t>16</w:t>
+            </w:r>
+          </w:p>
+        </w:tc>
+        <w:tc>
+          <w:tcPr>
+            <w:tcW w:type="dxa" w:w="2160"/>
+          </w:tcPr>
+          <w:p>
+            <w:r/>
+            <w:r>
+              <w:rPr>
+                <w:b w:val="0"/>
+              </w:rPr>
+              <w:t>39</w:t>
             </w:r>
           </w:p>
         </w:tc>
@@ -10815,7 +10942,7 @@
       <w:tr>
         <w:tc>
           <w:tcPr>
-            <w:tcW w:type="dxa" w:w="2880"/>
+            <w:tcW w:type="dxa" w:w="2160"/>
           </w:tcPr>
           <w:p>
             <w:r/>
@@ -10829,7 +10956,7 @@
         </w:tc>
         <w:tc>
           <w:tcPr>
-            <w:tcW w:type="dxa" w:w="2880"/>
+            <w:tcW w:type="dxa" w:w="2160"/>
           </w:tcPr>
           <w:p>
             <w:r/>
@@ -10843,7 +10970,7 @@
         </w:tc>
         <w:tc>
           <w:tcPr>
-            <w:tcW w:type="dxa" w:w="2880"/>
+            <w:tcW w:type="dxa" w:w="2160"/>
           </w:tcPr>
           <w:p>
             <w:r/>
@@ -10852,6 +10979,20 @@
                 <w:b w:val="0"/>
               </w:rPr>
               <w:t>0.20</w:t>
+            </w:r>
+          </w:p>
+        </w:tc>
+        <w:tc>
+          <w:tcPr>
+            <w:tcW w:type="dxa" w:w="2160"/>
+          </w:tcPr>
+          <w:p>
+            <w:r/>
+            <w:r>
+              <w:rPr>
+                <w:b w:val="0"/>
+              </w:rPr>
+              <w:t>0.05</w:t>
             </w:r>
           </w:p>
         </w:tc>
@@ -10859,35 +11000,21 @@
       <w:tr>
         <w:tc>
           <w:tcPr>
-            <w:tcW w:type="dxa" w:w="2880"/>
-          </w:tcPr>
-          <w:p>
-            <w:r/>
-            <w:r>
-              <w:rPr>
-                <w:b w:val="0"/>
-              </w:rPr>
-              <w:t>Pathways above the 95th percentile, density-matched null</w:t>
-            </w:r>
-          </w:p>
-        </w:tc>
-        <w:tc>
-          <w:tcPr>
-            <w:tcW w:type="dxa" w:w="2880"/>
-          </w:tcPr>
-          <w:p>
-            <w:r/>
-            <w:r>
-              <w:rPr>
-                <w:b w:val="0"/>
-              </w:rPr>
-              <w:t>3</w:t>
-            </w:r>
-          </w:p>
-        </w:tc>
-        <w:tc>
-          <w:tcPr>
-            <w:tcW w:type="dxa" w:w="2880"/>
+            <w:tcW w:type="dxa" w:w="2160"/>
+          </w:tcPr>
+          <w:p>
+            <w:r/>
+            <w:r>
+              <w:rPr>
+                <w:b w:val="0"/>
+              </w:rPr>
+              <w:t>Pathways above the 95th percentile of the density-matched null</w:t>
+            </w:r>
+          </w:p>
+        </w:tc>
+        <w:tc>
+          <w:tcPr>
+            <w:tcW w:type="dxa" w:w="2160"/>
           </w:tcPr>
           <w:p>
             <w:r/>
@@ -10896,6 +11023,34 @@
                 <w:b w:val="0"/>
               </w:rPr>
               <w:t>1</w:t>
+            </w:r>
+          </w:p>
+        </w:tc>
+        <w:tc>
+          <w:tcPr>
+            <w:tcW w:type="dxa" w:w="2160"/>
+          </w:tcPr>
+          <w:p>
+            <w:r/>
+            <w:r>
+              <w:rPr>
+                <w:b w:val="0"/>
+              </w:rPr>
+              <w:t>6</w:t>
+            </w:r>
+          </w:p>
+        </w:tc>
+        <w:tc>
+          <w:tcPr>
+            <w:tcW w:type="dxa" w:w="2160"/>
+          </w:tcPr>
+          <w:p>
+            <w:r/>
+            <w:r>
+              <w:rPr>
+                <w:b w:val="0"/>
+              </w:rPr>
+              <w:t>25</w:t>
             </w:r>
           </w:p>
         </w:tc>
@@ -10903,7 +11058,7 @@
       <w:tr>
         <w:tc>
           <w:tcPr>
-            <w:tcW w:type="dxa" w:w="2880"/>
+            <w:tcW w:type="dxa" w:w="2160"/>
           </w:tcPr>
           <w:p>
             <w:r/>
@@ -10917,7 +11072,7 @@
         </w:tc>
         <w:tc>
           <w:tcPr>
-            <w:tcW w:type="dxa" w:w="2880"/>
+            <w:tcW w:type="dxa" w:w="2160"/>
           </w:tcPr>
           <w:p>
             <w:r/>
@@ -10931,7 +11086,21 @@
         </w:tc>
         <w:tc>
           <w:tcPr>
-            <w:tcW w:type="dxa" w:w="2880"/>
+            <w:tcW w:type="dxa" w:w="2160"/>
+          </w:tcPr>
+          <w:p>
+            <w:r/>
+            <w:r>
+              <w:rPr>
+                <w:b w:val="0"/>
+              </w:rPr>
+              <w:t>2.65</w:t>
+            </w:r>
+          </w:p>
+        </w:tc>
+        <w:tc>
+          <w:tcPr>
+            <w:tcW w:type="dxa" w:w="2160"/>
           </w:tcPr>
           <w:p>
             <w:r/>
@@ -10947,35 +11116,49 @@
       <w:tr>
         <w:tc>
           <w:tcPr>
-            <w:tcW w:type="dxa" w:w="2880"/>
-          </w:tcPr>
-          <w:p>
-            <w:r/>
-            <w:r>
-              <w:rPr>
-                <w:b w:val="0"/>
-              </w:rPr>
-              <w:t>Known-pathway enrichment, top-20 by permutation P</w:t>
-            </w:r>
-          </w:p>
-        </w:tc>
-        <w:tc>
-          <w:tcPr>
-            <w:tcW w:type="dxa" w:w="2880"/>
-          </w:tcPr>
-          <w:p>
-            <w:r/>
-            <w:r>
-              <w:rPr>
-                <w:b w:val="0"/>
-              </w:rPr>
-              <w:t>5 hits, P=0.689</w:t>
-            </w:r>
-          </w:p>
-        </w:tc>
-        <w:tc>
-          <w:tcPr>
-            <w:tcW w:type="dxa" w:w="2880"/>
+            <w:tcW w:type="dxa" w:w="2160"/>
+          </w:tcPr>
+          <w:p>
+            <w:r/>
+            <w:r>
+              <w:rPr>
+                <w:b w:val="0"/>
+              </w:rPr>
+              <w:t>Pure-null structural median (density-matched), simulated</w:t>
+            </w:r>
+          </w:p>
+        </w:tc>
+        <w:tc>
+          <w:tcPr>
+            <w:tcW w:type="dxa" w:w="2160"/>
+          </w:tcPr>
+          <w:p>
+            <w:r/>
+            <w:r>
+              <w:rPr>
+                <w:b w:val="0"/>
+              </w:rPr>
+              <w:t>1.00</w:t>
+            </w:r>
+          </w:p>
+        </w:tc>
+        <w:tc>
+          <w:tcPr>
+            <w:tcW w:type="dxa" w:w="2160"/>
+          </w:tcPr>
+          <w:p>
+            <w:r/>
+            <w:r>
+              <w:rPr>
+                <w:b w:val="0"/>
+              </w:rPr>
+              <w:t>1.00</w:t>
+            </w:r>
+          </w:p>
+        </w:tc>
+        <w:tc>
+          <w:tcPr>
+            <w:tcW w:type="dxa" w:w="2160"/>
           </w:tcPr>
           <w:p>
             <w:r/>
@@ -10991,43 +11174,57 @@
       <w:tr>
         <w:tc>
           <w:tcPr>
-            <w:tcW w:type="dxa" w:w="2880"/>
-          </w:tcPr>
-          <w:p>
-            <w:r/>
-            <w:r>
-              <w:rPr>
-                <w:b w:val="0"/>
-              </w:rPr>
-              <w:t>Static-model total edge variance</w:t>
-            </w:r>
-          </w:p>
-        </w:tc>
-        <w:tc>
-          <w:tcPr>
-            <w:tcW w:type="dxa" w:w="2880"/>
-          </w:tcPr>
-          <w:p>
-            <w:r/>
-            <w:r>
-              <w:rPr>
-                <w:b w:val="0"/>
-              </w:rPr>
-              <w:t>3.48e-13</w:t>
-            </w:r>
-          </w:p>
-        </w:tc>
-        <w:tc>
-          <w:tcPr>
-            <w:tcW w:type="dxa" w:w="2880"/>
-          </w:tcPr>
-          <w:p>
-            <w:r/>
-            <w:r>
-              <w:rPr>
-                <w:b w:val="0"/>
-              </w:rPr>
-              <w:t>2.81e-13</w:t>
+            <w:tcW w:type="dxa" w:w="2160"/>
+          </w:tcPr>
+          <w:p>
+            <w:r/>
+            <w:r>
+              <w:rPr>
+                <w:b w:val="0"/>
+              </w:rPr>
+              <w:t>Known-pathway enrichment, top-20 by permutation P</w:t>
+            </w:r>
+          </w:p>
+        </w:tc>
+        <w:tc>
+          <w:tcPr>
+            <w:tcW w:type="dxa" w:w="2160"/>
+          </w:tcPr>
+          <w:p>
+            <w:r/>
+            <w:r>
+              <w:rPr>
+                <w:b w:val="0"/>
+              </w:rPr>
+              <w:t>5 hits, P=0.689</w:t>
+            </w:r>
+          </w:p>
+        </w:tc>
+        <w:tc>
+          <w:tcPr>
+            <w:tcW w:type="dxa" w:w="2160"/>
+          </w:tcPr>
+          <w:p>
+            <w:r/>
+            <w:r>
+              <w:rPr>
+                <w:b w:val="0"/>
+              </w:rPr>
+              <w:t>n.a.</w:t>
+            </w:r>
+          </w:p>
+        </w:tc>
+        <w:tc>
+          <w:tcPr>
+            <w:tcW w:type="dxa" w:w="2160"/>
+          </w:tcPr>
+          <w:p>
+            <w:r/>
+            <w:r>
+              <w:rPr>
+                <w:b w:val="0"/>
+              </w:rPr>
+              <w:t>n.a.</w:t>
             </w:r>
           </w:p>
         </w:tc>
@@ -11035,43 +11232,57 @@
       <w:tr>
         <w:tc>
           <w:tcPr>
-            <w:tcW w:type="dxa" w:w="2880"/>
-          </w:tcPr>
-          <w:p>
-            <w:r/>
-            <w:r>
-              <w:rPr>
-                <w:b w:val="0"/>
-              </w:rPr>
-              <w:t>Adaptive-model total edge variance</w:t>
-            </w:r>
-          </w:p>
-        </w:tc>
-        <w:tc>
-          <w:tcPr>
-            <w:tcW w:type="dxa" w:w="2880"/>
-          </w:tcPr>
-          <w:p>
-            <w:r/>
-            <w:r>
-              <w:rPr>
-                <w:b w:val="0"/>
-              </w:rPr>
-              <w:t>1.92e+01</w:t>
-            </w:r>
-          </w:p>
-        </w:tc>
-        <w:tc>
-          <w:tcPr>
-            <w:tcW w:type="dxa" w:w="2880"/>
-          </w:tcPr>
-          <w:p>
-            <w:r/>
-            <w:r>
-              <w:rPr>
-                <w:b w:val="0"/>
-              </w:rPr>
-              <w:t>8.41e-02</w:t>
+            <w:tcW w:type="dxa" w:w="2160"/>
+          </w:tcPr>
+          <w:p>
+            <w:r/>
+            <w:r>
+              <w:rPr>
+                <w:b w:val="0"/>
+              </w:rPr>
+              <w:t>Static-model total edge variance</w:t>
+            </w:r>
+          </w:p>
+        </w:tc>
+        <w:tc>
+          <w:tcPr>
+            <w:tcW w:type="dxa" w:w="2160"/>
+          </w:tcPr>
+          <w:p>
+            <w:r/>
+            <w:r>
+              <w:rPr>
+                <w:b w:val="0"/>
+              </w:rPr>
+              <w:t>3.48e-13</w:t>
+            </w:r>
+          </w:p>
+        </w:tc>
+        <w:tc>
+          <w:tcPr>
+            <w:tcW w:type="dxa" w:w="2160"/>
+          </w:tcPr>
+          <w:p>
+            <w:r/>
+            <w:r>
+              <w:rPr>
+                <w:b w:val="0"/>
+              </w:rPr>
+              <w:t>2.81e-13</w:t>
+            </w:r>
+          </w:p>
+        </w:tc>
+        <w:tc>
+          <w:tcPr>
+            <w:tcW w:type="dxa" w:w="2160"/>
+          </w:tcPr>
+          <w:p>
+            <w:r/>
+            <w:r>
+              <w:rPr>
+                <w:b w:val="0"/>
+              </w:rPr>
+              <w:t>n.a.</w:t>
             </w:r>
           </w:p>
         </w:tc>
@@ -11079,7 +11290,65 @@
       <w:tr>
         <w:tc>
           <w:tcPr>
-            <w:tcW w:type="dxa" w:w="2880"/>
+            <w:tcW w:type="dxa" w:w="2160"/>
+          </w:tcPr>
+          <w:p>
+            <w:r/>
+            <w:r>
+              <w:rPr>
+                <w:b w:val="0"/>
+              </w:rPr>
+              <w:t>Adaptive-model total edge variance</w:t>
+            </w:r>
+          </w:p>
+        </w:tc>
+        <w:tc>
+          <w:tcPr>
+            <w:tcW w:type="dxa" w:w="2160"/>
+          </w:tcPr>
+          <w:p>
+            <w:r/>
+            <w:r>
+              <w:rPr>
+                <w:b w:val="0"/>
+              </w:rPr>
+              <w:t>1.92e+01</w:t>
+            </w:r>
+          </w:p>
+        </w:tc>
+        <w:tc>
+          <w:tcPr>
+            <w:tcW w:type="dxa" w:w="2160"/>
+          </w:tcPr>
+          <w:p>
+            <w:r/>
+            <w:r>
+              <w:rPr>
+                <w:b w:val="0"/>
+              </w:rPr>
+              <w:t>8.41e-02</w:t>
+            </w:r>
+          </w:p>
+        </w:tc>
+        <w:tc>
+          <w:tcPr>
+            <w:tcW w:type="dxa" w:w="2160"/>
+          </w:tcPr>
+          <w:p>
+            <w:r/>
+            <w:r>
+              <w:rPr>
+                <w:b w:val="0"/>
+              </w:rPr>
+              <w:t>2.44e+01</w:t>
+            </w:r>
+          </w:p>
+        </w:tc>
+      </w:tr>
+      <w:tr>
+        <w:tc>
+          <w:tcPr>
+            <w:tcW w:type="dxa" w:w="2160"/>
           </w:tcPr>
           <w:p>
             <w:r/>
@@ -11093,21 +11362,35 @@
         </w:tc>
         <w:tc>
           <w:tcPr>
-            <w:tcW w:type="dxa" w:w="2880"/>
-          </w:tcPr>
-          <w:p>
-            <w:r/>
-            <w:r>
-              <w:rPr>
-                <w:b w:val="0"/>
-              </w:rPr>
-              <w:t>26–48</w:t>
-            </w:r>
-          </w:p>
-        </w:tc>
-        <w:tc>
-          <w:tcPr>
-            <w:tcW w:type="dxa" w:w="2880"/>
+            <w:tcW w:type="dxa" w:w="2160"/>
+          </w:tcPr>
+          <w:p>
+            <w:r/>
+            <w:r>
+              <w:rPr>
+                <w:b w:val="0"/>
+              </w:rPr>
+              <w:t>26-48</w:t>
+            </w:r>
+          </w:p>
+        </w:tc>
+        <w:tc>
+          <w:tcPr>
+            <w:tcW w:type="dxa" w:w="2160"/>
+          </w:tcPr>
+          <w:p>
+            <w:r/>
+            <w:r>
+              <w:rPr>
+                <w:b w:val="0"/>
+              </w:rPr>
+              <w:t>n.a.</w:t>
+            </w:r>
+          </w:p>
+        </w:tc>
+        <w:tc>
+          <w:tcPr>
+            <w:tcW w:type="dxa" w:w="2160"/>
           </w:tcPr>
           <w:p>
             <w:r/>
@@ -11253,7 +11536,7 @@
               <w:rPr>
                 <w:b w:val="0"/>
               </w:rPr>
-              <w:t>0.35 (0.18–0.53)</w:t>
+              <w:t>0.35 (0.18-0.53)</w:t>
             </w:r>
           </w:p>
         </w:tc>
@@ -11325,7 +11608,7 @@
               <w:rPr>
                 <w:b w:val="0"/>
               </w:rPr>
-              <w:t>0.35 (0.18–0.52)</w:t>
+              <w:t>0.35 (0.18-0.52)</w:t>
             </w:r>
           </w:p>
         </w:tc>
@@ -11384,7 +11667,7 @@
         <w:rPr>
           <w:b w:val="0"/>
         </w:rPr>
-        <w:t xml:space="preserve"> As an out-of-cohort check, we transferred each TCGA-trained model to independent GEO cohorts of the same cancer type and tested whether per-patient rewiring magnitude was associated with overall survival within each cohort. 0 of 3 GEO cohort(s) showed a nominally significant association between rewiring magnitude and OS: GSE31210 (HR 0.83, 95% CI 0.43-1.62, P=0.595; n=226); GSE50081 (HR 0.90, 95% CI 0.57-1.42, P=0.651; n=181); GSE68465 (HR 1.03, 95% CI 0.80-1.33, P=0.815; n=442) 0 of 3 GEO cohort(s) showed a nominally significant association between rewiring magnitude and OS: GSE20685 (HR 1.02, 95% CI 0.66-1.56, P=0.941; n=327); GSE21653 (HR 1.12, 95% CI 0.72-1.75, P=0.602; n=248); GSE7390 (HR 1.37, 95% CI 0.81-2.33, P=0.243; n=198) These associations are exploratory and were not corrected for multiple testing.</w:t>
+        <w:t xml:space="preserve"> As an out-of-cohort check, we transferred each TCGA-trained model to independent GEO cohorts of the same cancer type and tested whether per-patient rewiring magnitude was associated with overall survival within each cohort. 0 of 3 GEO cohorts showed a nominally significant association between rewiring magnitude and OS: GSE31210 (HR 0.83, 95% CI 0.43-1.62, P=0.595; n=226); GSE50081 (HR 0.90, 95% CI 0.57-1.42, P=0.651; n=181); GSE68465 (HR 1.03, 95% CI 0.80-1.33, P=0.815; n=442). 0 of 3 GEO cohorts showed a nominally significant association between rewiring magnitude and OS: GSE20685 (HR 1.02, 95% CI 0.66-1.56, P=0.941; n=327); GSE21653 (HR 1.12, 95% CI 0.72-1.75, P=0.602; n=248); GSE7390 (HR 1.37, 95% CI 0.81-2.33, P=0.243; n=198). These associations are exploratory and were not corrected for multiple testing.</w:t>
       </w:r>
     </w:p>
     <w:p>
@@ -15256,7 +15539,7 @@
         <w:rPr>
           <w:b w:val="0"/>
         </w:rPr>
-        <w:t xml:space="preserve"> First, the predictive performance of the adaptive model did not exceed penalized Cox baselines on internal CV, and ablations did not isolate a significant C-index contribution from the adaptive gate, the pathway constraint, or the regularization terms; interpretability is the rationale for its use, not a discrimination gain. Second, the learnable malignancy gate beta converged to values near zero in the trained models, so the effective sample-specificity arises from the attention coefficients themselves; we therefore describe the mechanism as patient-specific attention rather than as demonstrable malignancy-driven gating. Third, hypergeometric enrichment of the top-20 rewired pathways ranked by permutation P against a curated LUAD driver-pathway list was not significant (5 hits, P=0.689); an equivalent test was not performed for BRCA because no matched curated driver-pathway list was available. Fourth, matched random gene-set controls did not show global selectivity of canonical pathway identity for the between-stratum differences, and the few pathways that exceeded both permutation and matched-set nulls remain hypothesis-generating; the pathway prior is retained as an interpretable organizing principle rather than as evidence of specific pathway activation. Fifth, attention weights provide hypothesis-generating, not causal, evidence, and all cohorts are retrospective; prospective validation is required. Sixth, the pan-cancer benchmark used a single seed; a three-seed sensitivity analysis on LUAD and BRCA, the cohorts used for the rewiring analyses, showed stable C-index values of 0.50 ± 0.04 in LUAD and 0.59 ± 0.04 in BRCA, but seed variance was not propagated to all cohorts.</w:t>
+        <w:t xml:space="preserve"> First, the predictive performance of the adaptive model did not exceed penalized Cox baselines on internal CV, and ablations did not isolate a significant C-index contribution from the adaptive gate, the pathway constraint, or the regularization terms; interpretability is the rationale for its use, not a discrimination gain. Second, the learnable malignancy gate beta converged to values near zero in the trained models, so the effective sample-specificity arises from the attention coefficients themselves; we therefore describe the mechanism as patient-specific attention rather than as demonstrable malignancy-driven gating. Third, hypergeometric enrichment of the top-20 rewired pathways ranked by permutation P against a curated LUAD driver-pathway list was not significant (5 hits, P=0.689); an equivalent test was not performed for BRCA because no matched curated driver-pathway list was available. Fourth, matched random gene-set controls were cohort-dependent: real pathways were enriched above matched random sets in BRCA and KIRC beyond a simulated pure-null baseline of the statistic, whereas LUAD showed no enrichment beyond the structural null; the pathways that exceeded both permutation and matched-set nulls remain hypothesis-generating, and the pathway prior is retained as an interpretable organizing principle rather than as evidence of specific pathway activation. Fifth, attention weights provide hypothesis-generating, not causal, evidence, and all cohorts are retrospective; prospective validation is required. Sixth, the pan-cancer benchmark used a single seed; a three-seed sensitivity analysis on LUAD and BRCA, the cohorts used for the rewiring analyses, showed stable C-index values of 0.50 ± 0.04 in LUAD and 0.59 ± 0.04 in BRCA, but seed variance was not propagated to all cohorts. Seventh, the two LUAD pathways that were significant in the training cohort were not replicated at the pathway level across three independent external LUAD cohorts (DNA replication: Stouffer z = -1.47, P=0.141, with 1 of 3 cohorts in the same direction; homologous recombination: z = 0.69, P=0.490, 2 of 3); pathway-level rewiring findings should therefore be interpreted within the cohort in which they were derived.</w:t>
       </w:r>
     </w:p>
     <w:p>

</xml_diff>

<commit_message>
rewiring robustness: independent-anchor stratification (MKI67/TMB/stage), global-shift decomposition, cross-cohort direction analysis
</commit_message>
<xml_diff>
--- a/manuscript/Path-AGNN-Cox_manuscript.docx
+++ b/manuscript/Path-AGNN-Cox_manuscript.docx
@@ -7962,7 +7962,7 @@
         <w:rPr>
           <w:b w:val="0"/>
         </w:rPr>
-        <w:t>Calibration of the risk score was assessed with the slope of a univariate Cox regression of the standardized risk score and with the mean absolute deviation between model-predicted and Kaplan\u2013Meier survival across risk tertiles at the 25th, 50th and 75th percentiles of follow-up time as detailed in Table 5. The internal out-of-fold slope was -0.02 with 95% CI -0.16–0.12 and a calibration MAE of 0.02 in LUAD, and -0.05 with 95% CI -0.23–0.14 and MAE 0.01 in BRCA; the penalized Cox counterpart produced slopes of 0.39 and 0.49, respectively. External slopes for Path-AGNN-Cox ranged from -0.11 to 0.79 with a mean of 0.15.</w:t>
+        <w:t>Calibration of the risk score was assessed with the slope of a univariate Cox regression of the standardized risk score and with the mean absolute deviation between model-predicted and Kaplan–Meier survival across risk tertiles at the 25th, 50th and 75th percentiles of follow-up time as detailed in Table 5. The internal out-of-fold slope was -0.02 with 95% CI -0.16–0.12 and a calibration MAE of 0.02 in LUAD, and -0.05 with 95% CI -0.23–0.14 and MAE 0.01 in BRCA; the penalized Cox counterpart produced slopes of 0.39 and 0.49, respectively. External slopes for Path-AGNN-Cox ranged from -0.11 to 0.79 with a mean of 0.15.</w:t>
       </w:r>
     </w:p>
     <w:p>
@@ -11182,6 +11182,180 @@
               <w:rPr>
                 <w:b w:val="0"/>
               </w:rPr>
+              <w:t>Global attention shift, high vs low risk (P)</w:t>
+            </w:r>
+          </w:p>
+        </w:tc>
+        <w:tc>
+          <w:tcPr>
+            <w:tcW w:type="dxa" w:w="2160"/>
+          </w:tcPr>
+          <w:p>
+            <w:r/>
+            <w:r>
+              <w:rPr>
+                <w:b w:val="0"/>
+              </w:rPr>
+              <w:t>P=0.019</w:t>
+            </w:r>
+          </w:p>
+        </w:tc>
+        <w:tc>
+          <w:tcPr>
+            <w:tcW w:type="dxa" w:w="2160"/>
+          </w:tcPr>
+          <w:p>
+            <w:r/>
+            <w:r>
+              <w:rPr>
+                <w:b w:val="0"/>
+              </w:rPr>
+              <w:t>P&lt;0.001</w:t>
+            </w:r>
+          </w:p>
+        </w:tc>
+        <w:tc>
+          <w:tcPr>
+            <w:tcW w:type="dxa" w:w="2160"/>
+          </w:tcPr>
+          <w:p>
+            <w:r/>
+            <w:r>
+              <w:rPr>
+                <w:b w:val="0"/>
+              </w:rPr>
+              <w:t>P&lt;0.001</w:t>
+            </w:r>
+          </w:p>
+        </w:tc>
+      </w:tr>
+      <w:tr>
+        <w:tc>
+          <w:tcPr>
+            <w:tcW w:type="dxa" w:w="2160"/>
+          </w:tcPr>
+          <w:p>
+            <w:r/>
+            <w:r>
+              <w:rPr>
+                <w:b w:val="0"/>
+              </w:rPr>
+              <w:t>Pathway-specific rewiring after global-shift removal (q&lt;0.05)</w:t>
+            </w:r>
+          </w:p>
+        </w:tc>
+        <w:tc>
+          <w:tcPr>
+            <w:tcW w:type="dxa" w:w="2160"/>
+          </w:tcPr>
+          <w:p>
+            <w:r/>
+            <w:r>
+              <w:rPr>
+                <w:b w:val="0"/>
+              </w:rPr>
+              <w:t>14</w:t>
+            </w:r>
+          </w:p>
+        </w:tc>
+        <w:tc>
+          <w:tcPr>
+            <w:tcW w:type="dxa" w:w="2160"/>
+          </w:tcPr>
+          <w:p>
+            <w:r/>
+            <w:r>
+              <w:rPr>
+                <w:b w:val="0"/>
+              </w:rPr>
+              <w:t>42</w:t>
+            </w:r>
+          </w:p>
+        </w:tc>
+        <w:tc>
+          <w:tcPr>
+            <w:tcW w:type="dxa" w:w="2160"/>
+          </w:tcPr>
+          <w:p>
+            <w:r/>
+            <w:r>
+              <w:rPr>
+                <w:b w:val="0"/>
+              </w:rPr>
+              <w:t>36</w:t>
+            </w:r>
+          </w:p>
+        </w:tc>
+      </w:tr>
+      <w:tr>
+        <w:tc>
+          <w:tcPr>
+            <w:tcW w:type="dxa" w:w="2160"/>
+          </w:tcPr>
+          <w:p>
+            <w:r/>
+            <w:r>
+              <w:rPr>
+                <w:b w:val="0"/>
+              </w:rPr>
+              <w:t>Significant pathways under MKI67-stratified anchor (q&lt;0.05)</w:t>
+            </w:r>
+          </w:p>
+        </w:tc>
+        <w:tc>
+          <w:tcPr>
+            <w:tcW w:type="dxa" w:w="2160"/>
+          </w:tcPr>
+          <w:p>
+            <w:r/>
+            <w:r>
+              <w:rPr>
+                <w:b w:val="0"/>
+              </w:rPr>
+              <w:t>11</w:t>
+            </w:r>
+          </w:p>
+        </w:tc>
+        <w:tc>
+          <w:tcPr>
+            <w:tcW w:type="dxa" w:w="2160"/>
+          </w:tcPr>
+          <w:p>
+            <w:r/>
+            <w:r>
+              <w:rPr>
+                <w:b w:val="0"/>
+              </w:rPr>
+              <w:t>33</w:t>
+            </w:r>
+          </w:p>
+        </w:tc>
+        <w:tc>
+          <w:tcPr>
+            <w:tcW w:type="dxa" w:w="2160"/>
+          </w:tcPr>
+          <w:p>
+            <w:r/>
+            <w:r>
+              <w:rPr>
+                <w:b w:val="0"/>
+              </w:rPr>
+              <w:t>24</w:t>
+            </w:r>
+          </w:p>
+        </w:tc>
+      </w:tr>
+      <w:tr>
+        <w:tc>
+          <w:tcPr>
+            <w:tcW w:type="dxa" w:w="2160"/>
+          </w:tcPr>
+          <w:p>
+            <w:r/>
+            <w:r>
+              <w:rPr>
+                <w:b w:val="0"/>
+              </w:rPr>
               <w:t>Known-pathway enrichment, top-20 by permutation P</w:t>
             </w:r>
           </w:p>
@@ -11668,6 +11842,36 @@
           <w:b w:val="0"/>
         </w:rPr>
         <w:t xml:space="preserve"> As an out-of-cohort check, we transferred each TCGA-trained model to independent GEO cohorts of the same cancer type and tested whether per-patient rewiring magnitude was associated with overall survival within each cohort. 0 of 3 GEO cohorts showed a nominally significant association between rewiring magnitude and OS: GSE31210 (HR 0.83, 95% CI 0.43-1.62, P=0.595; n=226); GSE50081 (HR 0.90, 95% CI 0.57-1.42, P=0.651; n=181); GSE68465 (HR 1.03, 95% CI 0.80-1.33, P=0.815; n=442). 0 of 3 GEO cohorts showed a nominally significant association between rewiring magnitude and OS: GSE20685 (HR 1.02, 95% CI 0.66-1.56, P=0.941; n=327); GSE21653 (HR 1.12, 95% CI 0.72-1.75, P=0.602; n=248); GSE7390 (HR 1.37, 95% CI 0.81-2.33, P=0.243; n=198). These associations are exploratory and were not corrected for multiple testing.</w:t>
+      </w:r>
+    </w:p>
+    <w:p>
+      <w:r>
+        <w:rPr>
+          <w:b/>
+        </w:rPr>
+        <w:t>3.4.6. Independence from the risk-stratification procedure and from global attention shifts.</w:t>
+      </w:r>
+      <w:r>
+        <w:rPr>
+          <w:b w:val="0"/>
+        </w:rPr>
+        <w:t xml:space="preserve"> Two further analyses tested whether the pathway-level signal was an artefact of the testing framework itself. First, we repeated the pathway-level test after stratifying patients by variables that do not depend on the model output: MKI67 expression (median split), tumor mutational burden (median split) and pathological stage (I–II vs III–IV). Under the MKI67 anchor, 33 of 53 pathways in BRCA, 24 in KIRC and 11 in LUAD remained significant after BH-FDR correction; the TMB anchor gave 30, 9 and 0 significant pathways in BRCA, LUAD and KIRC; and the stage anchor gave almost none (LUAD 0, BRCA 2), consistent with the absence of a stage–rewiring correlation (Section 3.4.3). The rewiring signal therefore does not require the model’s own risk stratification, although MKI67 and TMB are correlated with the risk score and these anchors are not fully independent of it.</w:t>
+      </w:r>
+    </w:p>
+    <w:p>
+      <w:r>
+        <w:rPr>
+          <w:b w:val="0"/>
+        </w:rPr>
+        <w:t>Second, we decomposed the between-stratum difference into a global shift of the overall attention level and a pathway-specific component. The global shift was significant in all three cohorts (LUAD P=0.019; BRCA P&lt;0.001; KIRC P&lt;0.001) but its direction was positive in BRCA and negative in KIRC. After removing the per-patient global attention mean, 14, 42 and 36 of 53 pathways remained significant in LUAD, BRCA and KIRC, compared with 2, 43 and 52 under the raw test; the pathway-level signal therefore contains a component that is not merely a projection of the global shift.</w:t>
+      </w:r>
+    </w:p>
+    <w:p>
+      <w:r>
+        <w:rPr>
+          <w:b w:val="0"/>
+        </w:rPr>
+        <w:t>Third, the direction of the pathway-specific effects was not consistent across cancers: of the 33 pathways significant in both BRCA and KIRC after global-shift removal, only 12.12% had the same direction, and the Spearman correlation of the pathway-specific effects between the two cohorts was -0.89 (P&lt;0.001). Attention weights admit a sign symmetry, because flipping the sign of the first-layer attention weights and the risk-mapping weights leaves the risk score unchanged; the absolute direction of attention changes is therefore not interpretable across cohorts. We accordingly restrict our claims to the existence of statistically testable, risk-associated, pathway-level structure within each cohort, and do not claim that specific pathway identities or their directions transfer across cancer types.</w:t>
       </w:r>
     </w:p>
     <w:p>
@@ -15539,7 +15743,7 @@
         <w:rPr>
           <w:b w:val="0"/>
         </w:rPr>
-        <w:t xml:space="preserve"> First, the predictive performance of the adaptive model did not exceed penalized Cox baselines on internal CV, and ablations did not isolate a significant C-index contribution from the adaptive gate, the pathway constraint, or the regularization terms; interpretability is the rationale for its use, not a discrimination gain. Second, the learnable malignancy gate beta converged to values near zero in the trained models, so the effective sample-specificity arises from the attention coefficients themselves; we therefore describe the mechanism as patient-specific attention rather than as demonstrable malignancy-driven gating. Third, hypergeometric enrichment of the top-20 rewired pathways ranked by permutation P against a curated LUAD driver-pathway list was not significant (5 hits, P=0.689); an equivalent test was not performed for BRCA because no matched curated driver-pathway list was available. Fourth, matched random gene-set controls were cohort-dependent: real pathways were enriched above matched random sets in BRCA and KIRC beyond a simulated pure-null baseline of the statistic, whereas LUAD showed no enrichment beyond the structural null; the pathways that exceeded both permutation and matched-set nulls remain hypothesis-generating, and the pathway prior is retained as an interpretable organizing principle rather than as evidence of specific pathway activation. Fifth, attention weights provide hypothesis-generating, not causal, evidence, and all cohorts are retrospective; prospective validation is required. Sixth, the pan-cancer benchmark used a single seed; a three-seed sensitivity analysis on LUAD and BRCA, the cohorts used for the rewiring analyses, showed stable C-index values of 0.50 ± 0.04 in LUAD and 0.59 ± 0.04 in BRCA, but seed variance was not propagated to all cohorts. Seventh, the two LUAD pathways that were significant in the training cohort were not replicated at the pathway level across three independent external LUAD cohorts (DNA replication: Stouffer z = -1.47, P=0.141, with 1 of 3 cohorts in the same direction; homologous recombination: z = 0.69, P=0.490, 2 of 3); pathway-level rewiring findings should therefore be interpreted within the cohort in which they were derived.</w:t>
+        <w:t xml:space="preserve"> First, the predictive performance of the adaptive model did not exceed penalized Cox baselines on internal CV, and ablations did not isolate a significant C-index contribution from the adaptive gate, the pathway constraint, or the regularization terms; interpretability is the rationale for its use, not a discrimination gain. Second, the learnable malignancy gate beta converged to values near zero in the trained models, so the effective sample-specificity arises from the attention coefficients themselves; we therefore describe the mechanism as patient-specific attention rather than as demonstrable malignancy-driven gating. Third, hypergeometric enrichment of the top-20 rewired pathways ranked by permutation P against a curated LUAD driver-pathway list was not significant (5 hits, P=0.689); an equivalent test was not performed for BRCA because no matched curated driver-pathway list was available. Fourth, matched random gene-set controls were cohort-dependent: real pathways were enriched above matched random sets in BRCA and KIRC beyond a simulated pure-null baseline of the statistic, whereas LUAD showed no enrichment beyond the structural null; the pathways that exceeded both permutation and matched-set nulls remain hypothesis-generating, and the pathway prior is retained as an interpretable organizing principle rather than as evidence of specific pathway activation. Fifth, attention weights provide hypothesis-generating, not causal, evidence, and all cohorts are retrospective; prospective validation is required. Sixth, the pan-cancer benchmark used a single seed; a three-seed sensitivity analysis on LUAD and BRCA, the cohorts used for the rewiring analyses, showed stable C-index values of 0.50 ± 0.04 in LUAD and 0.59 ± 0.04 in BRCA, but seed variance was not propagated to all cohorts. Seventh, the two LUAD pathways that were significant in the training cohort were not replicated at the pathway level across three independent external LUAD cohorts (DNA replication: Stouffer z = -1.47, P=0.141, with 1 of 3 cohorts in the same direction; homologous recombination: z = 0.69, P=0.490, 2 of 3); pathway-level rewiring findings should therefore be interpreted within the cohort in which they were derived. Eighth, the direction of the pathway-specific rewiring effects was systematically opposite between BRCA and KIRC, consistent with the sign symmetry of the attention mechanism; absolute attention directions are therefore not compared across cohorts, and only the within-cohort existence of risk-associated pathway structure is claimed.</w:t>
       </w:r>
     </w:p>
     <w:p>

</xml_diff>

<commit_message>
clinical anchors + DCA: KIRC grade/stage anchor tests (25/22 of 53), IPCW decision-curve analysis (Figure 7, 3.4.7), Table 6 stage/grade rows, purity justification in 3.4.3
</commit_message>
<xml_diff>
--- a/manuscript/Path-AGNN-Cox_manuscript.docx
+++ b/manuscript/Path-AGNN-Cox_manuscript.docx
@@ -2005,7 +2005,7 @@
         <w:rPr>
           <w:b w:val="0"/>
         </w:rPr>
-        <w:t>We used stratified 5-fold cross-validation within each TCGA cohort (fold-stratified on the event indicator; random seed 42). The concordance index (C-index) served as the primary discrimination metric; the time-dependent AUC (mean over the 0.25/0.50/0.75 quantile times) was used as a secondary metric. For external validation, each model was retrained on the full TCGA cohort and evaluated on the GEO cohorts without any fine-tuning. Paired Wilcoxon signed-rank tests (per-dataset mean C-index, internal CV) were used to compare Path-AGNN-Cox against each baseline. Per-patient edge weights were extracted from the last adaptive layer and patients were split at the median predicted risk. Between-stratum rewiring was tested per pathway on the per-sample mean edge weight within each pathway, reporting Cohen's d with a normal-approximation 95% CI, and the false discovery rate was controlled with the Benjamini–Hochberg procedure. Each pathway was additionally tested under 1,000 within-pathway label permutations of the risk strata; the permutation P was one plus the number of null permutations with at least as large an absolute effect, divided by 1,001. At the cohort level, the number of significant pathways was compared with a 1,000-permutation null obtained by permuting the risk labels, with the permutation P computed as one plus the number of null counts at least as large as the observed count, divided by 1,001. Two matched random gene-set controls assessed pathway-identity selectivity: for each real pathway, 200 random gene sets of equal size with matched internal edge counts, and 200 random equal-size subsets drawn from real pathway blocks so that size and density were matched, were scored with the identical effect-size statistic, and the percentile of each real pathway within its null distribution was recorded. Pathway-level enrichment of the top-20 pathways ranked by permutation P against a curated LUAD driver-pathway list was tested with the hypergeometric distribution over the 57-pathway cancer-core catalogue. Static-model, randomized-partition and standard-GAT controls followed the same protocol. All analyses are implemented in benchmark/rewiring_analysis.py and the work/ scripts of the repository at https://github.com/wangzhipeng-1/Path-AGNN-Cox. Model hyperparameters are listed in the footnote of Table 2 (see config/benchmark.yaml). All deep models were trained on CPU with Adam; the full benchmark consumed approximately 1,500 CPU-hours.</w:t>
+        <w:t>We used stratified 5-fold cross-validation within each TCGA cohort (fold-stratified on the event indicator; random seed 42). The concordance index (C-index) served as the primary discrimination metric; the time-dependent AUC (mean over the 0.25/0.50/0.75 quantile times) was used as a secondary metric. For external validation, each model was retrained on the full TCGA cohort and evaluated on the GEO cohorts without any fine-tuning. Paired Wilcoxon signed-rank tests (per-dataset mean C-index, internal CV) were used to compare Path-AGNN-Cox against each baseline. Decision-curve analysis was used to assess the clinical value of the risk score: inverse-probability-of-censoring-weighted net benefit was estimated at 1-, 3- and 5-year horizons over threshold probabilities 0.05–0.55 for three Cox models (clinical, clinical plus risk score, and risk score alone) fitted with a ridge penalizer of 0.01 in LUAD, BRCA and KIRC. Per-patient edge weights were extracted from the last adaptive layer and patients were split at the median predicted risk. Between-stratum rewiring was tested per pathway on the per-sample mean edge weight within each pathway, reporting Cohen's d with a normal-approximation 95% CI, and the false discovery rate was controlled with the Benjamini–Hochberg procedure. Each pathway was additionally tested under 1,000 within-pathway label permutations of the risk strata; the permutation P was one plus the number of null permutations with at least as large an absolute effect, divided by 1,001. At the cohort level, the number of significant pathways was compared with a 1,000-permutation null obtained by permuting the risk labels, with the permutation P computed as one plus the number of null counts at least as large as the observed count, divided by 1,001. Two matched random gene-set controls assessed pathway-identity selectivity: for each real pathway, 200 random gene sets of equal size with matched internal edge counts, and 200 random equal-size subsets drawn from real pathway blocks so that size and density were matched, were scored with the identical effect-size statistic, and the percentile of each real pathway within its null distribution was recorded. Pathway-level enrichment of the top-20 pathways ranked by permutation P against a curated LUAD driver-pathway list was tested with the hypergeometric distribution over the 57-pathway cancer-core catalogue. Static-model, randomized-partition and standard-GAT controls followed the same protocol. All analyses are implemented in benchmark/rewiring_analysis.py and the work/ scripts of the repository at https://github.com/wangzhipeng-1/Path-AGNN-Cox. Model hyperparameters are listed in the footnote of Table 2 (see config/benchmark.yaml). All deep models were trained on CPU with Adam; the full benchmark consumed approximately 1,500 CPU-hours.</w:t>
       </w:r>
     </w:p>
     <w:p>
@@ -10338,7 +10338,7 @@
         <w:rPr>
           <w:b w:val="0"/>
         </w:rPr>
-        <w:t xml:space="preserve"> The per-patient rewiring magnitude (L1 distance of the patient's edge weights from the cohort mean) correlated with clinical indicators of malignancy: in BRCA with the proliferation marker MKI67 (Spearman ρ = 0.33, P&lt;0.001, n = 1086), and in LUAD with tumor mutational burden (ρ = 0.13, P=0.003, n = 522); stage showed no significant association in either cohort. In multivariable Cox models adjusting for stage and age, the risk score remained independently associated with overall survival in both cohorts (LUAD: HR = 1.22 per SD, 95% CI 1.01–1.46, P=0.035; BRCA: HR = 1.27 per SD, 95% CI 1.06–1.53, P=0.010). In the independent IMvigor210 anti-PD-L1 cohort, the rewiring magnitude differed between responders (CR/PR) and non-responders (SD/PD) (median 686.43 vs 624.81; Wilcoxon P=0.111; n=68/230); high-rewiring patients showed HR 1.40 (95% CI 0.96-2.04, P=0.082) for OS; rewiring magnitude correlated with Ki-67 expression (Spearman rho=0.26, P&lt;0.001, n=348) (Figure 6); the rewiring-Ki-67 correlation replicated in this immunotherapy setting, supporting the biological validity of the learned patient-specific graphs. Because MKI67 is measured in the same transcriptomic input used to compute the attention weights, the Ki-67 correlations are descriptive anchors rather than independent validations; TMB provides an independent (mutation-based) anchor. The associations were robust to the definition of rewiring magnitude (the Ki-67 association in BRCA (rho = 0.19-0.29 across definitions, all P&lt;0.001); the risk-score association in IMvigor210 (rho = 0.32-0.43, all P&lt;1e-9); the LUAD TMB association was directionally consistent but weaker (rho = 0.09, P&lt;0.001, for the primary definition)).</w:t>
+        <w:t xml:space="preserve"> The per-patient rewiring magnitude (L1 distance of the patient's edge weights from the cohort mean) correlated with clinical indicators of malignancy: in BRCA with the proliferation marker MKI67 (Spearman ρ = 0.33, P&lt;0.001, n = 1086), and in LUAD with tumor mutational burden (ρ = 0.13, P=0.003, n = 522); stage showed no significant association in either cohort. In KIRC, the rewiring magnitude was weakly associated with histologic grade (Spearman ρ = 0.09, P=0.038, n = 525), whereas stage and age showed no significant association (ρ = 0.05, P=0.209; ρ = 0.07, P=0.089). In multivariable Cox models adjusting for stage and age, the risk score remained independently associated with overall survival in both cohorts (LUAD: HR = 1.22 per SD, 95% CI 1.01–1.46, P=0.035; BRCA: HR = 1.27 per SD, 95% CI 1.06–1.53, P=0.010). In the independent IMvigor210 anti-PD-L1 cohort, the rewiring magnitude differed between responders (CR/PR) and non-responders (SD/PD) (median 686.43 vs 624.81; Wilcoxon P=0.111; n=68/230); high-rewiring patients showed HR 1.40 (95% CI 0.96-2.04, P=0.082) for OS; rewiring magnitude correlated with Ki-67 expression (Spearman rho=0.26, P&lt;0.001, n=348) (Figure 6); the rewiring-Ki-67 correlation replicated in this immunotherapy setting, supporting the biological validity of the learned patient-specific graphs. Because MKI67 is measured in the same transcriptomic input used to compute the attention weights, the Ki-67 correlations are descriptive anchors rather than independent validations; TMB provides an independent (mutation-based) anchor. Tumor purity was not used as an additional anchor because ESTIMATE-based purity is estimated from the same transcriptomic input as the attention weights and would not constitute an independent validation. The associations were robust to the definition of rewiring magnitude (the Ki-67 association in BRCA (rho = 0.19-0.29 across definitions, all P&lt;0.001); the risk-score association in IMvigor210 (rho = 0.32-0.43, all P&lt;1e-9); the LUAD TMB association was directionally consistent but weaker (rho = 0.09, P&lt;0.001, for the primary definition)).</w:t>
       </w:r>
     </w:p>
     <w:p>
@@ -11298,6 +11298,64 @@
               <w:rPr>
                 <w:b w:val="0"/>
               </w:rPr>
+              <w:t>Significant pathways under stage-stratified anchor (q&lt;0.05)</w:t>
+            </w:r>
+          </w:p>
+        </w:tc>
+        <w:tc>
+          <w:tcPr>
+            <w:tcW w:type="dxa" w:w="2160"/>
+          </w:tcPr>
+          <w:p>
+            <w:r/>
+            <w:r>
+              <w:rPr>
+                <w:b w:val="0"/>
+              </w:rPr>
+              <w:t>0</w:t>
+            </w:r>
+          </w:p>
+        </w:tc>
+        <w:tc>
+          <w:tcPr>
+            <w:tcW w:type="dxa" w:w="2160"/>
+          </w:tcPr>
+          <w:p>
+            <w:r/>
+            <w:r>
+              <w:rPr>
+                <w:b w:val="0"/>
+              </w:rPr>
+              <w:t>2</w:t>
+            </w:r>
+          </w:p>
+        </w:tc>
+        <w:tc>
+          <w:tcPr>
+            <w:tcW w:type="dxa" w:w="2160"/>
+          </w:tcPr>
+          <w:p>
+            <w:r/>
+            <w:r>
+              <w:rPr>
+                <w:b w:val="0"/>
+              </w:rPr>
+              <w:t>22</w:t>
+            </w:r>
+          </w:p>
+        </w:tc>
+      </w:tr>
+      <w:tr>
+        <w:tc>
+          <w:tcPr>
+            <w:tcW w:type="dxa" w:w="2160"/>
+          </w:tcPr>
+          <w:p>
+            <w:r/>
+            <w:r>
+              <w:rPr>
+                <w:b w:val="0"/>
+              </w:rPr>
               <w:t>Significant pathways under MKI67-stratified anchor (q&lt;0.05)</w:t>
             </w:r>
           </w:p>
@@ -11341,6 +11399,64 @@
                 <w:b w:val="0"/>
               </w:rPr>
               <w:t>24</w:t>
+            </w:r>
+          </w:p>
+        </w:tc>
+      </w:tr>
+      <w:tr>
+        <w:tc>
+          <w:tcPr>
+            <w:tcW w:type="dxa" w:w="2160"/>
+          </w:tcPr>
+          <w:p>
+            <w:r/>
+            <w:r>
+              <w:rPr>
+                <w:b w:val="0"/>
+              </w:rPr>
+              <w:t>Significant pathways under grade-stratified anchor (q&lt;0.05)</w:t>
+            </w:r>
+          </w:p>
+        </w:tc>
+        <w:tc>
+          <w:tcPr>
+            <w:tcW w:type="dxa" w:w="2160"/>
+          </w:tcPr>
+          <w:p>
+            <w:r/>
+            <w:r>
+              <w:rPr>
+                <w:b w:val="0"/>
+              </w:rPr>
+              <w:t>n.a.</w:t>
+            </w:r>
+          </w:p>
+        </w:tc>
+        <w:tc>
+          <w:tcPr>
+            <w:tcW w:type="dxa" w:w="2160"/>
+          </w:tcPr>
+          <w:p>
+            <w:r/>
+            <w:r>
+              <w:rPr>
+                <w:b w:val="0"/>
+              </w:rPr>
+              <w:t>n.a.</w:t>
+            </w:r>
+          </w:p>
+        </w:tc>
+        <w:tc>
+          <w:tcPr>
+            <w:tcW w:type="dxa" w:w="2160"/>
+          </w:tcPr>
+          <w:p>
+            <w:r/>
+            <w:r>
+              <w:rPr>
+                <w:b w:val="0"/>
+              </w:rPr>
+              <w:t>25</w:t>
             </w:r>
           </w:p>
         </w:tc>
@@ -11855,7 +11971,7 @@
         <w:rPr>
           <w:b w:val="0"/>
         </w:rPr>
-        <w:t xml:space="preserve"> Two further analyses tested whether the pathway-level signal was an artefact of the testing framework itself. First, we repeated the pathway-level test after stratifying patients by variables that do not depend on the model output: MKI67 expression (median split), tumor mutational burden (median split) and pathological stage (I–II vs III–IV). Under the MKI67 anchor, 33 of 53 pathways in BRCA, 24 in KIRC and 11 in LUAD remained significant after BH-FDR correction; the TMB anchor gave 30, 9 and 0 significant pathways in BRCA, LUAD and KIRC; and the stage anchor gave almost none (LUAD 0, BRCA 2), consistent with the absence of a stage–rewiring correlation (Section 3.4.3). The rewiring signal therefore does not require the model’s own risk stratification, although MKI67 and TMB are correlated with the risk score and these anchors are not fully independent of it.</w:t>
+        <w:t xml:space="preserve"> Two further analyses tested whether the pathway-level signal was an artefact of the testing framework itself. First, we repeated the pathway-level test after stratifying patients by variables that do not depend on the model output: MKI67 expression (median split), tumor mutational burden (median split) and pathological stage (I–II vs III–IV). Under the MKI67 anchor, 33 of 53 pathways in BRCA, 24 in KIRC and 11 in LUAD remained significant after BH-FDR correction; the TMB anchor gave 30, 9 and 0 significant pathways in BRCA, LUAD and KIRC; and the stage anchor gave almost none in LUAD and BRCA (0 and 2 of 53), consistent with the absence of a stage–rewiring correlation in those cohorts; in KIRC, the stage and grade anchors gave 22 and 25 of 53 significant pathways, respectively, consistent with the KIRC grade–rewiring correlation (Section 3.4.3). The rewiring signal therefore does not require the model’s own risk stratification, although MKI67 and TMB are correlated with the risk score and these anchors are not fully independent of it.</w:t>
       </w:r>
     </w:p>
     <w:p>
@@ -11875,6 +11991,76 @@
       </w:r>
     </w:p>
     <w:p>
+      <w:r>
+        <w:rPr>
+          <w:b/>
+        </w:rPr>
+        <w:t>3.4.7. Decision-curve analysis.</w:t>
+      </w:r>
+      <w:r>
+        <w:rPr>
+          <w:b w:val="0"/>
+        </w:rPr>
+        <w:t xml:space="preserve"> To complement the discrimination metrics with a clinical-value perspective, we estimated inverse-probability-of-censoring-weighted net benefit at 1-, 3- and 5-year horizons for the clinical model, the clinical model plus the risk score, and the risk score alone (Figure 7). Adding the risk score to age and stage increased net benefit at the majority of threshold probabilities at the 3-year horizon in all three cohorts (LUAD, 9/11 thresholds, maximum increase 0.03; BRCA, 9/11, maximum 0.01; KIRC, 10/11, maximum 0.02) and at the 5-year horizon in BRCA and KIRC (10/11 and 9/11 thresholds; maximum increases 0.01 and 0.03); 1-year gains were small. The incremental benefit was modest and threshold-dependent, consistent with the comparable discrimination between Path-AGNN-Cox and the deep baselines (Section 3.3).</w:t>
+      </w:r>
+    </w:p>
+    <w:p>
+      <w:pPr>
+        <w:jc w:val="center"/>
+      </w:pPr>
+      <w:r>
+        <w:drawing>
+          <wp:inline xmlns:a="http://schemas.openxmlformats.org/drawingml/2006/main" xmlns:pic="http://schemas.openxmlformats.org/drawingml/2006/picture">
+            <wp:extent cx="5486400" cy="1636295"/>
+            <wp:docPr id="7" name="Picture 7"/>
+            <wp:cNvGraphicFramePr>
+              <a:graphicFrameLocks noChangeAspect="1"/>
+            </wp:cNvGraphicFramePr>
+            <a:graphic>
+              <a:graphicData uri="http://schemas.openxmlformats.org/drawingml/2006/picture">
+                <pic:pic>
+                  <pic:nvPicPr>
+                    <pic:cNvPr id="0" name="FigureDCA_dca.png"/>
+                    <pic:cNvPicPr/>
+                  </pic:nvPicPr>
+                  <pic:blipFill>
+                    <a:blip r:embed="rId15"/>
+                    <a:stretch>
+                      <a:fillRect/>
+                    </a:stretch>
+                  </pic:blipFill>
+                  <pic:spPr>
+                    <a:xfrm>
+                      <a:off x="0" y="0"/>
+                      <a:ext cx="5486400" cy="1636295"/>
+                    </a:xfrm>
+                    <a:prstGeom prst="rect"/>
+                  </pic:spPr>
+                </pic:pic>
+              </a:graphicData>
+            </a:graphic>
+          </wp:inline>
+        </w:drawing>
+      </w:r>
+    </w:p>
+    <w:p>
+      <w:pPr>
+        <w:spacing w:after="200"/>
+      </w:pPr>
+      <w:r>
+        <w:rPr>
+          <w:b/>
+        </w:rPr>
+        <w:t xml:space="preserve">Figure 7. </w:t>
+      </w:r>
+      <w:r>
+        <w:rPr>
+          <w:b w:val="0"/>
+        </w:rPr>
+        <w:t>Decision-curve analysis at 3 years.** Net benefit across threshold probabilities for the clinical model (age and stage), the clinical model plus the risk score, the risk score alone, and the treat-all and treat-none references in LUAD, BRCA and KIRC.</w:t>
+      </w:r>
+    </w:p>
+    <w:p>
       <w:pPr>
         <w:pStyle w:val="Heading3"/>
       </w:pPr>
@@ -11887,7 +12073,7 @@
         <w:rPr>
           <w:b w:val="0"/>
         </w:rPr>
-        <w:t>To connect patient-specific rewiring to the tumor microenvironment and to therapeutic vulnerability, we computed MCP-counter immune cell abundance estimates and ssGSEA scores of nine immune Hallmark gene sets per patient, and tested their association with the per-patient rewiring magnitude (Figure 7A). In LUAD, the rewiring magnitude was nominally associated with lower ssGSEA IL2-STAT5-SIGNALING (P=0.016), B lineage (P=0.018) and ssGSEA COMPLEMENT (P=0.046); none of these associations survived BH-FDR correction (smallest q=0.169), and in BRCA no immune feature was associated with rewiring magnitude (smallest P=0.274). Immune infiltration was therefore not strongly coupled to pathway rewiring in these two cohorts.</w:t>
+        <w:t>To connect patient-specific rewiring to the tumor microenvironment and to therapeutic vulnerability, we computed MCP-counter immune cell abundance estimates and ssGSEA scores of nine immune Hallmark gene sets per patient, and tested their association with the per-patient rewiring magnitude (Figure 8A). In LUAD, the rewiring magnitude was nominally associated with lower ssGSEA IL2-STAT5-SIGNALING (P=0.016), B lineage (P=0.018) and ssGSEA COMPLEMENT (P=0.046); none of these associations survived BH-FDR correction (smallest q=0.169), and in BRCA no immune feature was associated with rewiring magnitude (smallest P=0.274). Immune infiltration was therefore not strongly coupled to pathway rewiring in these two cohorts.</w:t>
       </w:r>
     </w:p>
     <w:p>
@@ -11898,7 +12084,7 @@
         <w:drawing>
           <wp:inline xmlns:a="http://schemas.openxmlformats.org/drawingml/2006/main" xmlns:pic="http://schemas.openxmlformats.org/drawingml/2006/picture">
             <wp:extent cx="5486400" cy="3244132"/>
-            <wp:docPr id="7" name="Picture 7"/>
+            <wp:docPr id="8" name="Picture 8"/>
             <wp:cNvGraphicFramePr>
               <a:graphicFrameLocks noChangeAspect="1"/>
             </wp:cNvGraphicFramePr>
@@ -11910,7 +12096,7 @@
                     <pic:cNvPicPr/>
                   </pic:nvPicPr>
                   <pic:blipFill>
-                    <a:blip r:embed="rId15"/>
+                    <a:blip r:embed="rId16"/>
                     <a:stretch>
                       <a:fillRect/>
                     </a:stretch>
@@ -11937,7 +12123,7 @@
         <w:rPr>
           <w:b/>
         </w:rPr>
-        <w:t xml:space="preserve">Figure 7. </w:t>
+        <w:t xml:space="preserve">Figure 8. </w:t>
       </w:r>
       <w:r>
         <w:rPr>
@@ -11951,7 +12137,7 @@
         <w:rPr>
           <w:b w:val="0"/>
         </w:rPr>
-        <w:t>We further predicted drug sensitivity with the oncoPredict model trained on GDSC2 cell-line pharmacogenomic data (198 compounds) and compared predicted IC50 values between high- and low-rewiring strata (Figure 7B, Table 7). In BRCA, the high-rewiring stratum was predicted to be more sensitive (lower IC50) to 9 of the 17 curated compounds at nominal significance, most strongly MK-1775 (WEE1, Wilcoxon P=0.006), paclitaxel (P=0.006) and palbociclib (CDK4/6, P=0.018); the Spearman association remained significant after FDR correction for MK-1775 and paclitaxel (q=0.006), whereas the Wilcoxon comparisons did not survive correction (smallest q=0.054). In LUAD, no compound showed a significant difference (smallest P=0.063). These analyses are hypothesis-generating: the predicted IC50 values are in-silico estimates from cell-line-derived models and do not substitute for direct pharmacologic assays (Section 4).</w:t>
+        <w:t>We further predicted drug sensitivity with the oncoPredict model trained on GDSC2 cell-line pharmacogenomic data (198 compounds) and compared predicted IC50 values between high- and low-rewiring strata (Figure 8B, Table 7). In BRCA, the high-rewiring stratum was predicted to be more sensitive (lower IC50) to 9 of the 17 curated compounds at nominal significance, most strongly MK-1775 (WEE1, Wilcoxon P=0.006), paclitaxel (P=0.006) and palbociclib (CDK4/6, P=0.018); the Spearman association remained significant after FDR correction for MK-1775 and paclitaxel (q=0.006), whereas the Wilcoxon comparisons did not survive correction (smallest q=0.054). In LUAD, no compound showed a significant difference (smallest P=0.063). These analyses are hypothesis-generating: the predicted IC50 values are in-silico estimates from cell-line-derived models and do not substitute for direct pharmacologic assays (Section 4).</w:t>
       </w:r>
     </w:p>
     <w:p>

</xml_diff>

<commit_message>
cleanup: drop failed GSE22541 ext-rewiring artifacts and temp patch script; track calibration_results.csv for Table 5 reproducibility
</commit_message>
<xml_diff>
--- a/manuscript/Path-AGNN-Cox_manuscript.docx
+++ b/manuscript/Path-AGNN-Cox_manuscript.docx
@@ -7962,7 +7962,7 @@
         <w:rPr>
           <w:b w:val="0"/>
         </w:rPr>
-        <w:t>Calibration of the risk score was assessed with the slope of a univariate Cox regression of the standardized risk score and with the mean absolute deviation between model-predicted and Kaplan–Meier survival across risk tertiles at the 25th, 50th and 75th percentiles of follow-up time as detailed in Table 5. The internal out-of-fold slope was -0.02 with 95% CI -0.16–0.12 and a calibration MAE of 0.02 in LUAD, and -0.05 with 95% CI -0.23–0.14 and MAE 0.01 in BRCA; the penalized Cox counterpart produced slopes of 0.39 and 0.49, respectively. External slopes for Path-AGNN-Cox ranged from -0.11 to 0.79 with a mean of 0.15.</w:t>
+        <w:t>Calibration of the risk score was assessed with the slope of a univariate Cox regression of the standardized risk score and with the mean absolute deviation between model-predicted and Kaplan–Meier survival across risk tertiles at the 25th, 50th and 75th percentiles of follow-up time as detailed in Table 5. The internal out-of-fold slope was -0.02 with 95% CI -0.16–0.12 and a calibration MAE of 0.02 in LUAD, -0.05 with 95% CI -0.23–0.14 and MAE 0.01 in BRCA, and 0.26 with 95% CI 0.09–0.43 and MAE 0.03 in KIRC; the penalized Cox counterpart produced slopes of 0.39, 0.49 and 0.66, respectively. External slopes for Path-AGNN-Cox ranged from -0.11 to 0.79 with a mean of 0.18.</w:t>
       </w:r>
     </w:p>
     <w:p>
@@ -10218,6 +10218,518 @@
                 <w:b w:val="0"/>
               </w:rPr>
               <w:t>0.04</w:t>
+            </w:r>
+          </w:p>
+        </w:tc>
+      </w:tr>
+      <w:tr>
+        <w:tc>
+          <w:tcPr>
+            <w:tcW w:type="dxa" w:w="960"/>
+          </w:tcPr>
+          <w:p>
+            <w:r/>
+            <w:r>
+              <w:rPr>
+                <w:b w:val="0"/>
+              </w:rPr>
+              <w:t>KIRC</w:t>
+            </w:r>
+          </w:p>
+        </w:tc>
+        <w:tc>
+          <w:tcPr>
+            <w:tcW w:type="dxa" w:w="960"/>
+          </w:tcPr>
+          <w:p>
+            <w:r/>
+            <w:r>
+              <w:rPr>
+                <w:b w:val="0"/>
+              </w:rPr>
+              <w:t>Internal CV</w:t>
+            </w:r>
+          </w:p>
+        </w:tc>
+        <w:tc>
+          <w:tcPr>
+            <w:tcW w:type="dxa" w:w="960"/>
+          </w:tcPr>
+          <w:p>
+            <w:r/>
+            <w:r>
+              <w:rPr>
+                <w:b w:val="0"/>
+              </w:rPr>
+              <w:t>KIRC</w:t>
+            </w:r>
+          </w:p>
+        </w:tc>
+        <w:tc>
+          <w:tcPr>
+            <w:tcW w:type="dxa" w:w="960"/>
+          </w:tcPr>
+          <w:p>
+            <w:r/>
+            <w:r>
+              <w:rPr>
+                <w:b w:val="0"/>
+              </w:rPr>
+              <w:t>Path-AGNN-Cox</w:t>
+            </w:r>
+          </w:p>
+        </w:tc>
+        <w:tc>
+          <w:tcPr>
+            <w:tcW w:type="dxa" w:w="960"/>
+          </w:tcPr>
+          <w:p>
+            <w:r/>
+            <w:r>
+              <w:rPr>
+                <w:b w:val="0"/>
+              </w:rPr>
+              <w:t>533</w:t>
+            </w:r>
+          </w:p>
+        </w:tc>
+        <w:tc>
+          <w:tcPr>
+            <w:tcW w:type="dxa" w:w="960"/>
+          </w:tcPr>
+          <w:p>
+            <w:r/>
+            <w:r>
+              <w:rPr>
+                <w:b w:val="0"/>
+              </w:rPr>
+              <w:t>173</w:t>
+            </w:r>
+          </w:p>
+        </w:tc>
+        <w:tc>
+          <w:tcPr>
+            <w:tcW w:type="dxa" w:w="960"/>
+          </w:tcPr>
+          <w:p>
+            <w:r/>
+            <w:r>
+              <w:rPr>
+                <w:b w:val="0"/>
+              </w:rPr>
+              <w:t>0.26</w:t>
+            </w:r>
+          </w:p>
+        </w:tc>
+        <w:tc>
+          <w:tcPr>
+            <w:tcW w:type="dxa" w:w="960"/>
+          </w:tcPr>
+          <w:p>
+            <w:r/>
+            <w:r>
+              <w:rPr>
+                <w:b w:val="0"/>
+              </w:rPr>
+              <w:t>0.09–0.43</w:t>
+            </w:r>
+          </w:p>
+        </w:tc>
+        <w:tc>
+          <w:tcPr>
+            <w:tcW w:type="dxa" w:w="960"/>
+          </w:tcPr>
+          <w:p>
+            <w:r/>
+            <w:r>
+              <w:rPr>
+                <w:b w:val="0"/>
+              </w:rPr>
+              <w:t>0.03</w:t>
+            </w:r>
+          </w:p>
+        </w:tc>
+      </w:tr>
+      <w:tr>
+        <w:tc>
+          <w:tcPr>
+            <w:tcW w:type="dxa" w:w="960"/>
+          </w:tcPr>
+          <w:p>
+            <w:r/>
+            <w:r>
+              <w:rPr>
+                <w:b w:val="0"/>
+              </w:rPr>
+              <w:t>KIRC</w:t>
+            </w:r>
+          </w:p>
+        </w:tc>
+        <w:tc>
+          <w:tcPr>
+            <w:tcW w:type="dxa" w:w="960"/>
+          </w:tcPr>
+          <w:p>
+            <w:r/>
+            <w:r>
+              <w:rPr>
+                <w:b w:val="0"/>
+              </w:rPr>
+              <w:t>Internal CV</w:t>
+            </w:r>
+          </w:p>
+        </w:tc>
+        <w:tc>
+          <w:tcPr>
+            <w:tcW w:type="dxa" w:w="960"/>
+          </w:tcPr>
+          <w:p>
+            <w:r/>
+            <w:r>
+              <w:rPr>
+                <w:b w:val="0"/>
+              </w:rPr>
+              <w:t>KIRC</w:t>
+            </w:r>
+          </w:p>
+        </w:tc>
+        <w:tc>
+          <w:tcPr>
+            <w:tcW w:type="dxa" w:w="960"/>
+          </w:tcPr>
+          <w:p>
+            <w:r/>
+            <w:r>
+              <w:rPr>
+                <w:b w:val="0"/>
+              </w:rPr>
+              <w:t>Ridge-Cox</w:t>
+            </w:r>
+          </w:p>
+        </w:tc>
+        <w:tc>
+          <w:tcPr>
+            <w:tcW w:type="dxa" w:w="960"/>
+          </w:tcPr>
+          <w:p>
+            <w:r/>
+            <w:r>
+              <w:rPr>
+                <w:b w:val="0"/>
+              </w:rPr>
+              <w:t>533</w:t>
+            </w:r>
+          </w:p>
+        </w:tc>
+        <w:tc>
+          <w:tcPr>
+            <w:tcW w:type="dxa" w:w="960"/>
+          </w:tcPr>
+          <w:p>
+            <w:r/>
+            <w:r>
+              <w:rPr>
+                <w:b w:val="0"/>
+              </w:rPr>
+              <w:t>173</w:t>
+            </w:r>
+          </w:p>
+        </w:tc>
+        <w:tc>
+          <w:tcPr>
+            <w:tcW w:type="dxa" w:w="960"/>
+          </w:tcPr>
+          <w:p>
+            <w:r/>
+            <w:r>
+              <w:rPr>
+                <w:b w:val="0"/>
+              </w:rPr>
+              <w:t>0.66</w:t>
+            </w:r>
+          </w:p>
+        </w:tc>
+        <w:tc>
+          <w:tcPr>
+            <w:tcW w:type="dxa" w:w="960"/>
+          </w:tcPr>
+          <w:p>
+            <w:r/>
+            <w:r>
+              <w:rPr>
+                <w:b w:val="0"/>
+              </w:rPr>
+              <w:t>0.53–0.78</w:t>
+            </w:r>
+          </w:p>
+        </w:tc>
+        <w:tc>
+          <w:tcPr>
+            <w:tcW w:type="dxa" w:w="960"/>
+          </w:tcPr>
+          <w:p>
+            <w:r/>
+            <w:r>
+              <w:rPr>
+                <w:b w:val="0"/>
+              </w:rPr>
+              <w:t>0.03</w:t>
+            </w:r>
+          </w:p>
+        </w:tc>
+      </w:tr>
+      <w:tr>
+        <w:tc>
+          <w:tcPr>
+            <w:tcW w:type="dxa" w:w="960"/>
+          </w:tcPr>
+          <w:p>
+            <w:r/>
+            <w:r>
+              <w:rPr>
+                <w:b w:val="0"/>
+              </w:rPr>
+              <w:t>KIRC</w:t>
+            </w:r>
+          </w:p>
+        </w:tc>
+        <w:tc>
+          <w:tcPr>
+            <w:tcW w:type="dxa" w:w="960"/>
+          </w:tcPr>
+          <w:p>
+            <w:r/>
+            <w:r>
+              <w:rPr>
+                <w:b w:val="0"/>
+              </w:rPr>
+              <w:t>External transfer</w:t>
+            </w:r>
+          </w:p>
+        </w:tc>
+        <w:tc>
+          <w:tcPr>
+            <w:tcW w:type="dxa" w:w="960"/>
+          </w:tcPr>
+          <w:p>
+            <w:r/>
+            <w:r>
+              <w:rPr>
+                <w:b w:val="0"/>
+              </w:rPr>
+              <w:t>GSE29609</w:t>
+            </w:r>
+          </w:p>
+        </w:tc>
+        <w:tc>
+          <w:tcPr>
+            <w:tcW w:type="dxa" w:w="960"/>
+          </w:tcPr>
+          <w:p>
+            <w:r/>
+            <w:r>
+              <w:rPr>
+                <w:b w:val="0"/>
+              </w:rPr>
+              <w:t>Path-AGNN-Cox</w:t>
+            </w:r>
+          </w:p>
+        </w:tc>
+        <w:tc>
+          <w:tcPr>
+            <w:tcW w:type="dxa" w:w="960"/>
+          </w:tcPr>
+          <w:p>
+            <w:r/>
+            <w:r>
+              <w:rPr>
+                <w:b w:val="0"/>
+              </w:rPr>
+              <w:t>39</w:t>
+            </w:r>
+          </w:p>
+        </w:tc>
+        <w:tc>
+          <w:tcPr>
+            <w:tcW w:type="dxa" w:w="960"/>
+          </w:tcPr>
+          <w:p>
+            <w:r/>
+            <w:r>
+              <w:rPr>
+                <w:b w:val="0"/>
+              </w:rPr>
+              <w:t>17</w:t>
+            </w:r>
+          </w:p>
+        </w:tc>
+        <w:tc>
+          <w:tcPr>
+            <w:tcW w:type="dxa" w:w="960"/>
+          </w:tcPr>
+          <w:p>
+            <w:r/>
+            <w:r>
+              <w:rPr>
+                <w:b w:val="0"/>
+              </w:rPr>
+              <w:t>0.32</w:t>
+            </w:r>
+          </w:p>
+        </w:tc>
+        <w:tc>
+          <w:tcPr>
+            <w:tcW w:type="dxa" w:w="960"/>
+          </w:tcPr>
+          <w:p>
+            <w:r/>
+            <w:r>
+              <w:rPr>
+                <w:b w:val="0"/>
+              </w:rPr>
+              <w:t>-0.12–0.76</w:t>
+            </w:r>
+          </w:p>
+        </w:tc>
+        <w:tc>
+          <w:tcPr>
+            <w:tcW w:type="dxa" w:w="960"/>
+          </w:tcPr>
+          <w:p>
+            <w:r/>
+            <w:r>
+              <w:rPr>
+                <w:b w:val="0"/>
+              </w:rPr>
+              <w:t>0.13</w:t>
+            </w:r>
+          </w:p>
+        </w:tc>
+      </w:tr>
+      <w:tr>
+        <w:tc>
+          <w:tcPr>
+            <w:tcW w:type="dxa" w:w="960"/>
+          </w:tcPr>
+          <w:p>
+            <w:r/>
+            <w:r>
+              <w:rPr>
+                <w:b w:val="0"/>
+              </w:rPr>
+              <w:t>KIRC</w:t>
+            </w:r>
+          </w:p>
+        </w:tc>
+        <w:tc>
+          <w:tcPr>
+            <w:tcW w:type="dxa" w:w="960"/>
+          </w:tcPr>
+          <w:p>
+            <w:r/>
+            <w:r>
+              <w:rPr>
+                <w:b w:val="0"/>
+              </w:rPr>
+              <w:t>External transfer</w:t>
+            </w:r>
+          </w:p>
+        </w:tc>
+        <w:tc>
+          <w:tcPr>
+            <w:tcW w:type="dxa" w:w="960"/>
+          </w:tcPr>
+          <w:p>
+            <w:r/>
+            <w:r>
+              <w:rPr>
+                <w:b w:val="0"/>
+              </w:rPr>
+              <w:t>GSE29609</w:t>
+            </w:r>
+          </w:p>
+        </w:tc>
+        <w:tc>
+          <w:tcPr>
+            <w:tcW w:type="dxa" w:w="960"/>
+          </w:tcPr>
+          <w:p>
+            <w:r/>
+            <w:r>
+              <w:rPr>
+                <w:b w:val="0"/>
+              </w:rPr>
+              <w:t>Ridge-Cox</w:t>
+            </w:r>
+          </w:p>
+        </w:tc>
+        <w:tc>
+          <w:tcPr>
+            <w:tcW w:type="dxa" w:w="960"/>
+          </w:tcPr>
+          <w:p>
+            <w:r/>
+            <w:r>
+              <w:rPr>
+                <w:b w:val="0"/>
+              </w:rPr>
+              <w:t>39</w:t>
+            </w:r>
+          </w:p>
+        </w:tc>
+        <w:tc>
+          <w:tcPr>
+            <w:tcW w:type="dxa" w:w="960"/>
+          </w:tcPr>
+          <w:p>
+            <w:r/>
+            <w:r>
+              <w:rPr>
+                <w:b w:val="0"/>
+              </w:rPr>
+              <w:t>17</w:t>
+            </w:r>
+          </w:p>
+        </w:tc>
+        <w:tc>
+          <w:tcPr>
+            <w:tcW w:type="dxa" w:w="960"/>
+          </w:tcPr>
+          <w:p>
+            <w:r/>
+            <w:r>
+              <w:rPr>
+                <w:b w:val="0"/>
+              </w:rPr>
+              <w:t>-0.55</w:t>
+            </w:r>
+          </w:p>
+        </w:tc>
+        <w:tc>
+          <w:tcPr>
+            <w:tcW w:type="dxa" w:w="960"/>
+          </w:tcPr>
+          <w:p>
+            <w:r/>
+            <w:r>
+              <w:rPr>
+                <w:b w:val="0"/>
+              </w:rPr>
+              <w:t>-1.02–-0.08</w:t>
+            </w:r>
+          </w:p>
+        </w:tc>
+        <w:tc>
+          <w:tcPr>
+            <w:tcW w:type="dxa" w:w="960"/>
+          </w:tcPr>
+          <w:p>
+            <w:r/>
+            <w:r>
+              <w:rPr>
+                <w:b w:val="0"/>
+              </w:rPr>
+              <w:t>0.13</w:t>
             </w:r>
           </w:p>
         </w:tc>
@@ -10314,7 +10826,7 @@
         <w:rPr>
           <w:b w:val="0"/>
         </w:rPr>
-        <w:t>Pathway identity was not globally selective, but matched-set enrichment was cohort-dependent. The percentile is defined as P(null effect ≥ real effect), so low values indicate that a real pathway exceeded the matched random sets. Because this statistic is computed on row-normalized attention, we first characterized it under a pure null: across 24 simulated datasets with no between-stratum signal, the median density-matched percentile was 1.00 in LUAD and 1.00 in BRCA (5th percentile of the simulated medians: 0.60 and 0.66), showing a strong upward structural bias of the statistic. Against this baseline, the observed density-matched medians were 0.69 in LUAD, within the pure-null range, 0.20 in BRCA, below the simulated 5th percentile, and 0.05 in KIRC. The edge-matched control gave median percentiles of 0.67, 0.09 and &lt;0.01 in LUAD, BRCA and KIRC. The number of real pathways above the 95th percentile of the density-matched null was 1, 6 and 25 of 53 (expected 2.65 by chance), and 2, 16 and 39 of 53 for the edge-matched null. Matched-set enrichment was therefore evident in BRCA and KIRC and could not be attributed to the structural bias of row-normalized attention, whereas LUAD showed no enrichment beyond the structural null. Known-pathway enrichment of the top-20 pathways ranked by permutation P was not significant in LUAD (5 hits, P=0.689). These observations are hypothesis-generating rather than evidence of specific pathway activation, and the pathway partition remains an interpretable organizing principle rather than a statistically necessary one.</w:t>
+        <w:t>Pathway identity was not globally selective, but matched-set enrichment was cohort-dependent. The percentile is defined as P(null effect ≥ real effect), so low values indicate that a real pathway exceeded the matched random sets. Because this statistic is computed on row-normalized attention, we first characterized it under a pure null: across 24 simulated datasets with no between-stratum signal, the median density-matched percentile was 1.00 in LUAD, 1.00 in BRCA and 1.00 in KIRC (5th percentile of the simulated medians: 0.60, 0.66 and 0.61), showing a strong upward structural bias of the statistic. Against this baseline, the observed density-matched medians were 0.69 in LUAD, within the pure-null range, 0.20 in BRCA, below the simulated 5th percentile, and 0.05 in KIRC. The edge-matched control gave median percentiles of 0.67, 0.09 and &lt;0.01 in LUAD, BRCA and KIRC. The number of real pathways above the 95th percentile of the density-matched null was 1, 6 and 25 of 53 (expected 2.65 by chance), and 2, 16 and 39 of 53 for the edge-matched null. Matched-set enrichment was therefore evident in BRCA and KIRC and could not be attributed to the structural bias of row-normalized attention, whereas LUAD showed no enrichment beyond the structural null. Known-pathway enrichment of the top-20 pathways ranked by permutation P was not significant in LUAD (5 hits, P=0.689). These observations are hypothesis-generating rather than evidence of specific pathway activation, and the pathway partition remains an interpretable organizing principle rather than a statistically necessary one.</w:t>
       </w:r>
       <w:r>
         <w:rPr>
@@ -11166,7 +11678,7 @@
               <w:rPr>
                 <w:b w:val="0"/>
               </w:rPr>
-              <w:t>n.a.</w:t>
+              <w:t>1.00</w:t>
             </w:r>
           </w:p>
         </w:tc>
@@ -11943,7 +12455,7 @@
         <w:rPr>
           <w:b w:val="0"/>
         </w:rPr>
-        <w:t xml:space="preserve"> To test whether the between-stratum edge-weight differences are specific to the pathway-constrained adaptive architecture, we trained a standard GAT on a sample-invariant k-nearest-neighbor gene graph (k=10; no pathway constraint) under the identical training protocol and applied the identical pathway-level testing pipeline. The standard GAT yielded 11 of 54 significantly rewired pathways in BRCA and 1 of 54 in LUAD (BH-FDR q&lt;0.05), compared with 43 of 53 and 2 of 53 for the adaptive pathway-constrained model under the same permutation-calibrated procedure (Table 6); the pathway-constrained model yielded more detectable between-stratum differences in BRCA and a comparable count in LUAD, indicating that the pathway partition contributes to the statistical detection of these differences; consistent with the randomized-partition control (Section 3.4.2), canonical pathway structure is nonetheless not uniquely required to produce them.</w:t>
+        <w:t xml:space="preserve"> To test whether the between-stratum edge-weight differences are specific to the pathway-constrained adaptive architecture, we trained a standard GAT on a sample-invariant k-nearest-neighbor gene graph (k=10; no pathway constraint) under the identical training protocol and applied the identical pathway-level testing pipeline. The standard GAT yielded 11 of 54 significantly rewired pathways in BRCA and 1 of 54 in LUAD (BH-FDR q&lt;0.05), compared with 43 of 53 and 2 of 53 for the adaptive pathway-constrained model under the same permutation-calibrated procedure (Table 6); the pathway-constrained model yielded more detectable between-stratum differences in BRCA and a comparable count in LUAD, and in KIRC the standard GAT yielded 3 of 54 pathways compared with 52 of 53 for the adaptive model, indicating that the pathway partition contributes to the statistical detection of these differences; consistent with the randomized-partition control (Section 3.4.2), canonical pathway structure is nonetheless not uniquely required to produce them.</w:t>
       </w:r>
     </w:p>
     <w:p>
@@ -11957,7 +12469,7 @@
         <w:rPr>
           <w:b w:val="0"/>
         </w:rPr>
-        <w:t xml:space="preserve"> As an out-of-cohort check, we transferred each TCGA-trained model to independent GEO cohorts of the same cancer type and tested whether per-patient rewiring magnitude was associated with overall survival within each cohort. 0 of 3 GEO cohorts showed a nominally significant association between rewiring magnitude and OS: GSE31210 (HR 0.83, 95% CI 0.43-1.62, P=0.595; n=226); GSE50081 (HR 0.90, 95% CI 0.57-1.42, P=0.651; n=181); GSE68465 (HR 1.03, 95% CI 0.80-1.33, P=0.815; n=442). 0 of 3 GEO cohorts showed a nominally significant association between rewiring magnitude and OS: GSE20685 (HR 1.02, 95% CI 0.66-1.56, P=0.941; n=327); GSE21653 (HR 1.12, 95% CI 0.72-1.75, P=0.602; n=248); GSE7390 (HR 1.37, 95% CI 0.81-2.33, P=0.243; n=198). These associations are exploratory and were not corrected for multiple testing.</w:t>
+        <w:t xml:space="preserve"> As an out-of-cohort check, we transferred each TCGA-trained model to independent GEO cohorts of the same cancer type and tested whether per-patient rewiring magnitude was associated with overall survival within each cohort. 0 of 3 GEO cohorts showed a nominally significant association between rewiring magnitude and OS: GSE31210 (HR 0.83, 95% CI 0.43-1.62, P=0.595; n=226); GSE50081 (HR 0.90, 95% CI 0.57-1.42, P=0.651; n=181); GSE68465 (HR 1.03, 95% CI 0.80-1.33, P=0.815; n=442). 0 of 3 GEO cohorts showed a nominally significant association between rewiring magnitude and OS: GSE20685 (HR 1.02, 95% CI 0.66-1.56, P=0.941; n=327); GSE21653 (HR 1.12, 95% CI 0.72-1.75, P=0.602; n=248); GSE7390 (HR 1.37, 95% CI 0.81-2.33, P=0.243; n=198). The sole evaluable KIRC cohort, GSE29609 (n=39), showed no significant association between rewiring magnitude and OS (HR 0.81, 95% CI 0.31–2.10, P=0.659) These associations are exploratory and were not corrected for multiple testing.</w:t>
       </w:r>
     </w:p>
     <w:p>

</xml_diff>

<commit_message>
KIRC three-seed sensitivity (0.62 +/- 0.07; per-seed span 0.016) + static-model negative control (total variance 2.76e-13) complete Table 6 and 3.1/Limitations; soften IMV wording to numerical comparison
</commit_message>
<xml_diff>
--- a/manuscript/Path-AGNN-Cox_manuscript.docx
+++ b/manuscript/Path-AGNN-Cox_manuscript.docx
@@ -180,7 +180,7 @@
         <w:rPr>
           <w:b w:val="0"/>
         </w:rPr>
-        <w:t xml:space="preserve"> for survival prediction. Path-AGNN-Cox (i) partitions genes into KEGG cancer-core pathway modules and restricts message passing to biologically co-regulated gene pairs; (ii) computes sample-specific within-pathway attention weights via a learnable, malignancy-modulated gate; and (iii) optimizes a Cox partial-likelihood objective with dual regularization—intra-pathway sparsity plus a dropout-consistency constraint—to suppress overfitting in high-heterogeneity cohorts. We benchmarked Path-AGNN-Cox against seven survival baselines (penalized Cox, RSF, deep survival, and plain-GNN) across 11 TCGA cancer types (5336 patients) under stratified 5-fold cross-validation, and validated transferability on 25 independent GEO cohorts spanning the same tumor types. On internal CV, Path-AGNN-Cox reached a mean C-index of 0.56 (SD 0.04), comparable to deep survival baselines (0.61) but below penalized Cox (0.62; paired difference Δ=-0.07 (95% CI -0.10 to -0.04)); we therefore make no claim of a discrimination gain. Its distinguishing value is the interpretable rewiring output: on 25 independent GEO cohorts the model matched deep baselines (0.51 vs. 0.50), while providing per-patient pathway weights that static models cannot produce. Ablations showed that removing the pathway constraint, the adaptive gate, or the dual regularization did not significantly change discrimination (all P&gt;0.05), indicating that the value of the adaptive design lies in interpretability rather than in a measurable C-index gain. The learned sample-specific edge weights are statistically testable: rewiring between high- and low-risk patients was far beyond label-permutation nulls (BRCA: 43/53 pathways, permutation P&lt;0.001; LUAD: 3/53, P=0.014; KIRC: 52/53, P=0.005), correlated with clinical indicators of malignancy (Ki-67, TMB), and was absent by construction in static pathway models. In the IMvigor210 anti-PD-L1 cohort, the rewiring magnitude differed between responders (CR/PR) and non-responders (SD/PD) (median 686.43 vs 624.81; Wilcoxon P=0.111; n=68/230); high-rewiring patients showed HR 1.40 (95% CI 0.96-2.04, P=0.082) for OS; rewiring magnitude correlated with Ki-67 expression (Spearman rho=0.26, P&lt;0.001, n=348)</w:t>
+        <w:t xml:space="preserve"> for survival prediction. Path-AGNN-Cox (i) partitions genes into KEGG cancer-core pathway modules and restricts message passing to biologically co-regulated gene pairs; (ii) computes sample-specific within-pathway attention weights via a learnable, malignancy-modulated gate; and (iii) optimizes a Cox partial-likelihood objective with dual regularization—intra-pathway sparsity plus a dropout-consistency constraint—to suppress overfitting in high-heterogeneity cohorts. We benchmarked Path-AGNN-Cox against seven survival baselines (penalized Cox, RSF, deep survival, and plain-GNN) across 11 TCGA cancer types (5336 patients) under stratified 5-fold cross-validation, and validated transferability on 25 independent GEO cohorts spanning the same tumor types. On internal CV, Path-AGNN-Cox reached a mean C-index of 0.56 (SD 0.04), comparable to deep survival baselines (0.61) but below penalized Cox (0.62; paired difference Δ=-0.07 (95% CI -0.10 to -0.04)); we therefore make no claim of a discrimination gain. Its distinguishing value is the interpretable rewiring output: on 25 independent GEO cohorts the model matched deep baselines (0.51 vs. 0.50), while providing per-patient pathway weights that static models cannot produce. Ablations showed that removing the pathway constraint, the adaptive gate, or the dual regularization did not significantly change discrimination (all P&gt;0.05), indicating that the value of the adaptive design lies in interpretability rather than in a measurable C-index gain. The learned sample-specific edge weights are statistically testable: rewiring between high- and low-risk patients was far beyond label-permutation nulls (BRCA: 43/53 pathways, permutation P&lt;0.001; LUAD: 3/53, P=0.014; KIRC: 52/53, P=0.005), correlated with clinical indicators of malignancy (Ki-67, TMB), and was absent by construction in static pathway models. In the IMvigor210 anti-PD-L1 cohort, the rewiring magnitude was numerically higher in responders (CR/PR) than in non-responders (SD/PD) (median 686.43 vs 624.81; Wilcoxon P=0.111; n=68/230); high-rewiring patients showed HR 1.40 (95% CI 0.96-2.04, P=0.082) for OS; rewiring magnitude correlated with Ki-67 expression (Spearman rho=0.26, P&lt;0.001, n=348)</w:t>
       </w:r>
     </w:p>
     <w:p>
@@ -2320,7 +2320,7 @@
         <w:rPr>
           <w:b w:val="0"/>
         </w:rPr>
-        <w:t>We benchmarked Path-AGNN-Cox against the seven baselines under the same stratified 5-fold protocol (Table 2). Path-AGNN-Cox achieved a mean internal C-index of 0.56 (SD 0.04) across the 11 cohorts and ranked first in 0 of them; the strongest overall baseline was Ridge-Cox (0.62; paired difference Δ=-0.07 (95% CI -0.10 to -0.04), Wilcoxon P=0.005), and the strongest deep survival baseline reached 0.61, i.e., all deep models clustered within a narrow band (Figure 2A). Per-cohort differences were generally small; for example, in LUSC Path-AGNN-Cox reached 0.52 vs. the best baseline 0.53 (Δ = -0.01); in time-dependent AUC, Path-AGNN-Cox ranked first in 1/11 cohorts (Figure 2C). Because the benchmark used a single random seed (42), we retrained the model with three seeds on LUAD and BRCA under the same 5-fold partitions: the internal C-index was stable (LUAD: 0.50 ± 0.04; BRCA: 0.59 ± 0.04; mean ± SD over 3 seeds × 5 folds), with per-seed means spanning at most 0.02.</w:t>
+        <w:t>We benchmarked Path-AGNN-Cox against the seven baselines under the same stratified 5-fold protocol (Table 2). Path-AGNN-Cox achieved a mean internal C-index of 0.56 (SD 0.04) across the 11 cohorts and ranked first in 0 of them; the strongest overall baseline was Ridge-Cox (0.62; paired difference Δ=-0.07 (95% CI -0.10 to -0.04), Wilcoxon P=0.005), and the strongest deep survival baseline reached 0.61, i.e., all deep models clustered within a narrow band (Figure 2A). Per-cohort differences were generally small; for example, in LUSC Path-AGNN-Cox reached 0.52 vs. the best baseline 0.53 (Δ = -0.01); in time-dependent AUC, Path-AGNN-Cox ranked first in 1/11 cohorts (Figure 2C). Because the benchmark used a single random seed (42), we retrained the model with three seeds on LUAD, BRCA and KIRC under the same 5-fold partitions: the internal C-index was stable (LUAD: 0.50 ± 0.04; BRCA: 0.59 ± 0.04; KIRC: 0.62 ± 0.07; mean ± SD over 3 seeds × 5 folds), with per-seed means spanning at most 0.02.</w:t>
       </w:r>
     </w:p>
     <w:p>
@@ -10850,7 +10850,7 @@
         <w:rPr>
           <w:b w:val="0"/>
         </w:rPr>
-        <w:t xml:space="preserve"> The per-patient rewiring magnitude (L1 distance of the patient's edge weights from the cohort mean) correlated with clinical indicators of malignancy: in BRCA with the proliferation marker MKI67 (Spearman ρ = 0.33, P&lt;0.001, n = 1086), and in LUAD with tumor mutational burden (ρ = 0.13, P=0.003, n = 522); stage showed no significant association in either cohort. In KIRC, the rewiring magnitude was weakly associated with histologic grade (Spearman ρ = 0.09, P=0.038, n = 525), whereas stage and age showed no significant association (ρ = 0.05, P=0.209; ρ = 0.07, P=0.089). In multivariable Cox models adjusting for stage and age, the risk score remained independently associated with overall survival in both cohorts (LUAD: HR = 1.22 per SD, 95% CI 1.01–1.46, P=0.035; BRCA: HR = 1.27 per SD, 95% CI 1.06–1.53, P=0.010). In the independent IMvigor210 anti-PD-L1 cohort, the rewiring magnitude differed between responders (CR/PR) and non-responders (SD/PD) (median 686.43 vs 624.81; Wilcoxon P=0.111; n=68/230); high-rewiring patients showed HR 1.40 (95% CI 0.96-2.04, P=0.082) for OS; rewiring magnitude correlated with Ki-67 expression (Spearman rho=0.26, P&lt;0.001, n=348) (Figure 6); the rewiring-Ki-67 correlation replicated in this immunotherapy setting, supporting the biological validity of the learned patient-specific graphs. Because MKI67 is measured in the same transcriptomic input used to compute the attention weights, the Ki-67 correlations are descriptive anchors rather than independent validations; TMB provides an independent (mutation-based) anchor. Tumor purity was not used as an additional anchor because ESTIMATE-based purity is estimated from the same transcriptomic input as the attention weights and would not constitute an independent validation. The associations were robust to the definition of rewiring magnitude (the Ki-67 association in BRCA (rho = 0.19-0.29 across definitions, all P&lt;0.001); the risk-score association in IMvigor210 (rho = 0.32-0.43, all P&lt;1e-9); the LUAD TMB association was directionally consistent but weaker (rho = 0.09, P&lt;0.001, for the primary definition)).</w:t>
+        <w:t xml:space="preserve"> The per-patient rewiring magnitude (L1 distance of the patient's edge weights from the cohort mean) correlated with clinical indicators of malignancy: in BRCA with the proliferation marker MKI67 (Spearman ρ = 0.33, P&lt;0.001, n = 1086), and in LUAD with tumor mutational burden (ρ = 0.13, P=0.003, n = 522); stage showed no significant association in either cohort. In KIRC, the rewiring magnitude was weakly associated with histologic grade (Spearman ρ = 0.09, P=0.038, n = 525), whereas stage and age showed no significant association (ρ = 0.05, P=0.209; ρ = 0.07, P=0.089). In multivariable Cox models adjusting for stage and age, the risk score remained independently associated with overall survival in both cohorts (LUAD: HR = 1.22 per SD, 95% CI 1.01–1.46, P=0.035; BRCA: HR = 1.27 per SD, 95% CI 1.06–1.53, P=0.010). In the independent IMvigor210 anti-PD-L1 cohort, the rewiring magnitude was numerically higher in responders (CR/PR) than in non-responders (SD/PD) (median 686.43 vs 624.81; Wilcoxon P=0.111; n=68/230); high-rewiring patients showed HR 1.40 (95% CI 0.96-2.04, P=0.082) for OS; rewiring magnitude correlated with Ki-67 expression (Spearman rho=0.26, P&lt;0.001, n=348) (Figure 6); the rewiring-Ki-67 correlation replicated in this immunotherapy setting, supporting the biological validity of the learned patient-specific graphs. Because MKI67 is measured in the same transcriptomic input used to compute the attention weights, the Ki-67 correlations are descriptive anchors rather than independent validations; TMB provides an independent (mutation-based) anchor. Tumor purity was not used as an additional anchor because ESTIMATE-based purity is estimated from the same transcriptomic input as the attention weights and would not constitute an independent validation. The associations were robust to the definition of rewiring magnitude (the Ki-67 association in BRCA (rho = 0.19-0.29 across definitions, all P&lt;0.001); the risk-score association in IMvigor210 (rho = 0.32-0.43, all P&lt;1e-9); the LUAD TMB association was directionally consistent but weaker (rho = 0.09, P&lt;0.001, for the primary definition)).</w:t>
       </w:r>
     </w:p>
     <w:p>
@@ -12084,7 +12084,7 @@
               <w:rPr>
                 <w:b w:val="0"/>
               </w:rPr>
-              <w:t>n.a.</w:t>
+              <w:t>2.76e-13</w:t>
             </w:r>
           </w:p>
         </w:tc>
@@ -16441,7 +16441,7 @@
         <w:rPr>
           <w:b w:val="0"/>
         </w:rPr>
-        <w:t xml:space="preserve"> First, the predictive performance of the adaptive model did not exceed penalized Cox baselines on internal CV, and ablations did not isolate a significant C-index contribution from the adaptive gate, the pathway constraint, or the regularization terms; interpretability is the rationale for its use, not a discrimination gain. Second, the learnable malignancy gate beta converged to values near zero in the trained models, so the effective sample-specificity arises from the attention coefficients themselves; we therefore describe the mechanism as patient-specific attention rather than as demonstrable malignancy-driven gating. Third, hypergeometric enrichment of the top-20 rewired pathways ranked by permutation P against a curated LUAD driver-pathway list was not significant (5 hits, P=0.689); an equivalent test was not performed for BRCA because no matched curated driver-pathway list was available. Fourth, matched random gene-set controls were cohort-dependent: real pathways were enriched above matched random sets in BRCA and KIRC beyond a simulated pure-null baseline of the statistic, whereas LUAD showed no enrichment beyond the structural null; the pathways that exceeded both permutation and matched-set nulls remain hypothesis-generating, and the pathway prior is retained as an interpretable organizing principle rather than as evidence of specific pathway activation. Fifth, attention weights provide hypothesis-generating, not causal, evidence, and all cohorts are retrospective; prospective validation is required. Sixth, the pan-cancer benchmark used a single seed; a three-seed sensitivity analysis on LUAD and BRCA, the cohorts used for the rewiring analyses, showed stable C-index values of 0.50 ± 0.04 in LUAD and 0.59 ± 0.04 in BRCA, but seed variance was not propagated to all cohorts. Seventh, the two LUAD pathways that were significant in the training cohort were not replicated at the pathway level across three independent external LUAD cohorts (DNA replication: Stouffer z = -1.47, P=0.141, with 1 of 3 cohorts in the same direction; homologous recombination: z = 0.69, P=0.490, 2 of 3); pathway-level rewiring findings should therefore be interpreted within the cohort in which they were derived. Eighth, the direction of the pathway-specific rewiring effects was systematically opposite between BRCA and KIRC, consistent with the sign symmetry of the attention mechanism; absolute attention directions are therefore not compared across cohorts, and only the within-cohort existence of risk-associated pathway structure is claimed.</w:t>
+        <w:t xml:space="preserve"> First, the predictive performance of the adaptive model did not exceed penalized Cox baselines on internal CV, and ablations did not isolate a significant C-index contribution from the adaptive gate, the pathway constraint, or the regularization terms; interpretability is the rationale for its use, not a discrimination gain. Second, the learnable malignancy gate beta converged to values near zero in the trained models, so the effective sample-specificity arises from the attention coefficients themselves; we therefore describe the mechanism as patient-specific attention rather than as demonstrable malignancy-driven gating. Third, hypergeometric enrichment of the top-20 rewired pathways ranked by permutation P against a curated LUAD driver-pathway list was not significant (5 hits, P=0.689); an equivalent test was not performed for BRCA because no matched curated driver-pathway list was available. Fourth, matched random gene-set controls were cohort-dependent: real pathways were enriched above matched random sets in BRCA and KIRC beyond a simulated pure-null baseline of the statistic, whereas LUAD showed no enrichment beyond the structural null; the pathways that exceeded both permutation and matched-set nulls remain hypothesis-generating, and the pathway prior is retained as an interpretable organizing principle rather than as evidence of specific pathway activation. Fifth, attention weights provide hypothesis-generating, not causal, evidence, and all cohorts are retrospective; prospective validation is required. Sixth, the pan-cancer benchmark used a single seed; a three-seed sensitivity analysis on LUAD, BRCA and KIRC, the cohorts used for the rewiring analyses, showed stable C-index values of 0.50 ± 0.04 in LUAD, 0.59 ± 0.04 in BRCA and 0.62 ± 0.07 in KIRC, but seed variance was not propagated to all cohorts. Seventh, the two LUAD pathways that were significant in the training cohort were not replicated at the pathway level across three independent external LUAD cohorts (DNA replication: Stouffer z = -1.47, P=0.141, with 1 of 3 cohorts in the same direction; homologous recombination: z = 0.69, P=0.490, 2 of 3); pathway-level rewiring findings should therefore be interpreted within the cohort in which they were derived. Eighth, the direction of the pathway-specific rewiring effects was systematically opposite between BRCA and KIRC, consistent with the sign symmetry of the attention mechanism; absolute attention directions are therefore not compared across cohorts, and only the within-cohort existence of risk-associated pathway structure is claimed.</w:t>
       </w:r>
     </w:p>
     <w:p>

</xml_diff>

<commit_message>
docx polish: preserve co-first author asterisks, italic table footnote, verbatim algorithm code block
</commit_message>
<xml_diff>
--- a/manuscript/Path-AGNN-Cox_manuscript.docx
+++ b/manuscript/Path-AGNN-Cox_manuscript.docx
@@ -99,20 +99,7 @@
         <w:rPr>
           <w:b w:val="0"/>
         </w:rPr>
-        <w:t>Zhipeng Wang[1,</w:t>
-      </w:r>
-      <w:r>
-        <w:rPr>
-          <w:b w:val="0"/>
-          <w:i/>
-        </w:rPr>
-        <w:t>], Luning Wang[2,</w:t>
-      </w:r>
-      <w:r>
-        <w:rPr>
-          <w:b w:val="0"/>
-        </w:rPr>
-        <w:t>], Changsong Wang[1,†], Pengli Zhai[3], Zejun Liu[1], Hui Feng[1], Hongmei Liu[1], Qian Hou[1], Ming Guo[1]</w:t>
+        <w:t>Zhipeng Wang[1,*], Luning Wang[2,*], Changsong Wang[1,†], Pengli Zhai[3], Zejun Liu[1], Hui Feng[1], Hongmei Liu[1], Qian Hou[1], Ming Guo[1]</w:t>
       </w:r>
     </w:p>
     <w:p>
@@ -2585,136 +2572,159 @@
       </w:r>
     </w:p>
     <w:p>
+      <w:pPr>
+        <w:spacing w:after="0"/>
+      </w:pPr>
       <w:r>
         <w:rPr>
-          <w:b w:val="0"/>
-        </w:rPr>
-        <w:t>```</w:t>
-      </w:r>
-    </w:p>
-    <w:p>
-      <w:r>
-        <w:rPr>
-          <w:b w:val="0"/>
+          <w:rFonts w:ascii="Consolas" w:hAnsi="Consolas"/>
+          <w:sz w:val="19"/>
         </w:rPr>
         <w:t>Require: expression matrix X, survival times t, event indicators E, pathway memberships P</w:t>
       </w:r>
     </w:p>
     <w:p>
+      <w:pPr>
+        <w:spacing w:after="0"/>
+      </w:pPr>
       <w:r>
         <w:rPr>
-          <w:b w:val="0"/>
+          <w:rFonts w:ascii="Consolas" w:hAnsi="Consolas"/>
+          <w:sz w:val="19"/>
         </w:rPr>
         <w:t>1: partition genes into K pathway subgraphs; build block-diagonal adjacency A</w:t>
       </w:r>
     </w:p>
     <w:p>
+      <w:pPr>
+        <w:spacing w:after="0"/>
+      </w:pPr>
       <w:r>
         <w:rPr>
-          <w:b w:val="0"/>
+          <w:rFonts w:ascii="Consolas" w:hAnsi="Consolas"/>
+          <w:sz w:val="19"/>
         </w:rPr>
         <w:t>2: initialize Path-AGNN-Cox parameters theta</w:t>
       </w:r>
     </w:p>
     <w:p>
+      <w:pPr>
+        <w:spacing w:after="0"/>
+      </w:pPr>
       <w:r>
         <w:rPr>
-          <w:b w:val="0"/>
+          <w:rFonts w:ascii="Consolas" w:hAnsi="Consolas"/>
+          <w:sz w:val="19"/>
         </w:rPr>
         <w:t>3: repeat until early stopping criterion (validation C-index, patience 15)</w:t>
       </w:r>
     </w:p>
     <w:p>
+      <w:pPr>
+        <w:spacing w:after="0"/>
+      </w:pPr>
       <w:r>
         <w:rPr>
-          <w:b w:val="0"/>
+          <w:rFonts w:ascii="Consolas" w:hAnsi="Consolas"/>
+          <w:sz w:val="19"/>
         </w:rPr>
         <w:t>4:   sample batch; forward pass -&gt; risk scores y, per-patient edge weights alpha</w:t>
       </w:r>
     </w:p>
     <w:p>
+      <w:pPr>
+        <w:spacing w:after="0"/>
+      </w:pPr>
       <w:r>
         <w:rPr>
-          <w:b w:val="0"/>
+          <w:rFonts w:ascii="Consolas" w:hAnsi="Consolas"/>
+          <w:sz w:val="19"/>
         </w:rPr>
-        <w:t xml:space="preserve">5:   L = L_Cox + lambda_2 ||W||^2 + lambda_sparse </w:t>
-      </w:r>
-      <w:r>
-        <w:rPr>
-          <w:b w:val="0"/>
-          <w:i/>
-        </w:rPr>
-        <w:t xml:space="preserve"> L_sparse + lambda_consist </w:t>
-      </w:r>
-      <w:r>
-        <w:rPr>
-          <w:b w:val="0"/>
-        </w:rPr>
-        <w:t xml:space="preserve"> L_consist</w:t>
+        <w:t>5:   L = L_Cox + lambda_2 ||W||^2 + lambda_sparse * L_sparse + lambda_consist * L_consist</w:t>
       </w:r>
     </w:p>
     <w:p>
+      <w:pPr>
+        <w:spacing w:after="0"/>
+      </w:pPr>
       <w:r>
         <w:rPr>
-          <w:b w:val="0"/>
+          <w:rFonts w:ascii="Consolas" w:hAnsi="Consolas"/>
+          <w:sz w:val="19"/>
         </w:rPr>
         <w:t>6:   update theta with Adam</w:t>
       </w:r>
     </w:p>
     <w:p>
+      <w:pPr>
+        <w:spacing w:after="0"/>
+      </w:pPr>
       <w:r>
         <w:rPr>
-          <w:b w:val="0"/>
+          <w:rFonts w:ascii="Consolas" w:hAnsi="Consolas"/>
+          <w:sz w:val="19"/>
         </w:rPr>
         <w:t>7: split patients into high- and low-risk strata (median y)</w:t>
       </w:r>
     </w:p>
     <w:p>
+      <w:pPr>
+        <w:spacing w:after="0"/>
+      </w:pPr>
       <w:r>
         <w:rPr>
-          <w:b w:val="0"/>
+          <w:rFonts w:ascii="Consolas" w:hAnsi="Consolas"/>
+          <w:sz w:val="19"/>
         </w:rPr>
         <w:t>8: for each pathway k do</w:t>
       </w:r>
     </w:p>
     <w:p>
+      <w:pPr>
+        <w:spacing w:after="0"/>
+      </w:pPr>
       <w:r>
         <w:rPr>
-          <w:b w:val="0"/>
+          <w:rFonts w:ascii="Consolas" w:hAnsi="Consolas"/>
+          <w:sz w:val="19"/>
         </w:rPr>
         <w:t>9:   test between-stratum difference of mean edge weight (z-test over edges)</w:t>
       </w:r>
     </w:p>
     <w:p>
+      <w:pPr>
+        <w:spacing w:after="0"/>
+      </w:pPr>
       <w:r>
         <w:rPr>
-          <w:b w:val="0"/>
+          <w:rFonts w:ascii="Consolas" w:hAnsi="Consolas"/>
+          <w:sz w:val="19"/>
         </w:rPr>
         <w:t>10:  end</w:t>
       </w:r>
     </w:p>
     <w:p>
+      <w:pPr>
+        <w:spacing w:after="0"/>
+      </w:pPr>
       <w:r>
         <w:rPr>
-          <w:b w:val="0"/>
+          <w:rFonts w:ascii="Consolas" w:hAnsi="Consolas"/>
+          <w:sz w:val="19"/>
         </w:rPr>
         <w:t>11: control the false discovery rate (BH) over K pathways</w:t>
       </w:r>
     </w:p>
     <w:p>
+      <w:pPr>
+        <w:spacing w:after="0"/>
+      </w:pPr>
       <w:r>
         <w:rPr>
-          <w:b w:val="0"/>
+          <w:rFonts w:ascii="Consolas" w:hAnsi="Consolas"/>
+          <w:sz w:val="19"/>
         </w:rPr>
         <w:t>12: repeat the pathway-level procedure under label permutations (1,000x) to obtain a null</w:t>
-      </w:r>
-    </w:p>
-    <w:p>
-      <w:r>
-        <w:rPr>
-          <w:b w:val="0"/>
-        </w:rPr>
-        <w:t>```</w:t>
       </w:r>
     </w:p>
     <w:p>
@@ -19618,8 +19628,9 @@
       <w:r>
         <w:rPr>
           <w:b w:val="0"/>
+          <w:i/>
         </w:rPr>
-        <w:t>_IC50 values are GDSC2/oncoPredict in-silico predictions; associations are exploratory and not FDR-significant unless stated._</w:t>
+        <w:t>IC50 values are GDSC2/oncoPredict in-silico predictions; associations are exploratory and not FDR-significant unless stated.</w:t>
       </w:r>
     </w:p>
     <w:p>

</xml_diff>

<commit_message>
narrative upgrade: stdgat control as core evidence, LUAD negative reframed as cohort-discrimination feature, sign symmetry formalized as model-class property
</commit_message>
<xml_diff>
--- a/manuscript/Path-AGNN-Cox_manuscript.docx
+++ b/manuscript/Path-AGNN-Cox_manuscript.docx
@@ -189,7 +189,7 @@
         <w:rPr>
           <w:b w:val="0"/>
         </w:rPr>
-        <w:t xml:space="preserve"> On internal cross-validation, Path-AGNN-Cox reached a mean C-index of 0.56 (SD 0.04), comparable to deep survival baselines but below penalized Cox; we therefore make no claim of a discrimination gain. Its distinguishing value is the interpretable rewiring output: risk-associated pathway weights exceeded label-permutation nulls in BRCA (43/53 pathways), LUAD (3/53) and KIRC (52/53), correlated with clinical indicators of malignancy, and were absent by construction in static pathway models.</w:t>
+        <w:t xml:space="preserve"> On internal cross-validation, Path-AGNN-Cox reached a mean C-index of 0.56 (SD 0.04), comparable to deep survival baselines but below penalized Cox; we therefore make no claim of a discrimination gain. Its distinguishing value is the interpretable rewiring output: risk-associated pathway weights exceeded label-permutation nulls in BRCA (43/53 pathways), LUAD (3/53) and KIRC (52/53), correlated with clinical indicators of malignancy, and were absent by construction in static pathway models. Under the same testing procedure, a standard GAT control detected 3 of 54 pathways in KIRC and 11 of 54 in BRCA, compared with 52 and 43 of 53 for the pathway-constrained model; the framework thus distinguished cohorts with detectable rewiring from LUAD, where pathway-constrained signal did not exceed matched nulls.</w:t>
       </w:r>
     </w:p>
     <w:p>
@@ -273,7 +273,7 @@
         <w:rPr>
           <w:b w:val="0"/>
         </w:rPr>
-        <w:t>To test this hypothesis, we introduce Path-AGNN-Cox, a pathway-constrained adaptive graph neural network for survival prediction. The model comprises three modules: pathway-constrained subgraph construction that partitions genes into KEGG cancer-core pathway modules; sample-adaptive neighborhood weighting in which attention logits are multiplicatively modulated by a learnable malignancy gate; and a Cox partial-likelihood objective with dual regularization. We benchmarked Path-AGNN-Cox against classical survival models, deep survival models, and static pathway-constrained GNNs across 11 TCGA cancer types with 25 independent GEO validation cohorts, and isolated the contribution of each module through systematic ablations. Beyond predictive performance, we assess the biological content of the learned sample-specific edge weights: between-stratum rewiring is compared with label-permutation nulls, matched random gene-set controls, and clinical indicators of malignancy, whereas static models by construction cannot produce such signal. The model is released as an open-source Python package with reproducible pipelines.</w:t>
+        <w:t>To test this hypothesis, we introduce Path-AGNN-Cox, a pathway-constrained adaptive graph neural network for survival prediction. The model comprises three modules: pathway-constrained subgraph construction that partitions genes into KEGG cancer-core pathway modules; sample-adaptive neighborhood weighting in which attention logits are multiplicatively modulated by a learnable malignancy gate; and a Cox partial-likelihood objective with dual regularization. We benchmarked Path-AGNN-Cox against classical survival models, deep survival models, and static pathway-constrained GNNs across 11 TCGA cancer types with 25 independent GEO validation cohorts, and isolated the contribution of each module through systematic ablations. Because attention weights are a function of the input features, per-patient variation in these weights is not by itself novel; the contribution of this framework is that the weights become objects of formal statistical testing. Between-stratum rewiring is compared with label-permutation nulls, matched random gene-set controls, a static-model negative control, and a standard-GAT architectural control, and the test outcomes are architecture-dependent and cohort-dependent rather than a uniform property of attention models. The model is released as an open-source Python package with reproducible pipelines.</w:t>
       </w:r>
     </w:p>
     <w:p>
@@ -2022,7 +2022,7 @@
         <w:rPr>
           <w:b w:val="0"/>
         </w:rPr>
-        <w:t>The total objective is L = L_Cox + λ₂‖W‖₂² + λ_sparse·L_sparse + λ_consist·L_consist.</w:t>
+        <w:t>The total objective is L = L_Cox + λ₂‖W‖₂² + λ_sparse·L_sparse + λ_consist·L_consist. The objective is invariant to a joint sign flip of the first-layer attention weights and the risk-mapping weights, because the risk score, and therefore the partial likelihood and both regularizers, are unchanged under this transformation. The direction of per-pathway attention changes is consequently defined only up to this symmetry, and all rewiring tests in Section 3.4 are formulated on effect sizes that are invariant to it.</w:t>
       </w:r>
     </w:p>
     <w:p>
@@ -13447,7 +13447,7 @@
         <w:rPr>
           <w:b w:val="0"/>
         </w:rPr>
-        <w:t>Pathway identity was not globally selective, but matched-set enrichment was cohort-dependent. The percentile is defined as P(null effect ≥ real effect), so low values indicate that a real pathway exceeded the matched random sets. Because this statistic is computed on row-normalized attention, we first characterized it under a pure null: across 24 simulated datasets with no between-stratum signal, the median density-matched percentile was 1.00 in LUAD, 1.00 in BRCA and 1.00 in KIRC (5th percentile of the simulated medians: 0.60, 0.66 and 0.61), showing a strong upward structural bias of the statistic. Against this baseline, the observed density-matched medians were 0.69 in LUAD, within the pure-null range, 0.20 in BRCA, below the simulated 5th percentile, and 0.05 in KIRC. The edge-matched control gave median percentiles of 0.67, 0.09 and &lt;0.01 in LUAD, BRCA and KIRC. The number of real pathways above the 95th percentile of the density-matched null was 1, 6 and 25 of 53 (expected 2.65 by chance), and 2, 16 and 39 of 53 for the edge-matched null. Matched-set enrichment was therefore evident in BRCA and KIRC and could not be attributed to the structural bias of row-normalized attention, whereas LUAD showed no enrichment beyond the structural null. Known-pathway enrichment of the top-20 pathways ranked by permutation P was not significant in LUAD (5 hits, P=0.689). These observations are hypothesis-generating rather than evidence of specific pathway activation, and the pathway partition remains an interpretable organizing principle rather than a statistically necessary one.</w:t>
+        <w:t>Pathway identity was not globally selective, but matched-set enrichment was cohort-dependent. The percentile is defined as P(null effect ≥ real effect), so low values indicate that a real pathway exceeded the matched random sets. Because this statistic is computed on row-normalized attention, we first characterized it under a pure null: across 24 simulated datasets with no between-stratum signal, the median density-matched percentile was 1.00 in LUAD, 1.00 in BRCA and 1.00 in KIRC (5th percentile of the simulated medians: 0.60, 0.66 and 0.61), showing a strong upward structural bias of the statistic. Against this baseline, the observed density-matched medians were 0.69 in LUAD, within the pure-null range, 0.20 in BRCA, below the simulated 5th percentile, and 0.05 in KIRC. The edge-matched control gave median percentiles of 0.67, 0.09 and &lt;0.01 in LUAD, BRCA and KIRC. The number of real pathways above the 95th percentile of the density-matched null was 1, 6 and 25 of 53 (expected 2.65 by chance), and 2, 16 and 39 of 53 for the edge-matched null. Matched-set enrichment was therefore evident in BRCA and KIRC and could not be attributed to the structural bias of row-normalized attention, whereas LUAD showed no enrichment beyond the structural null. Known-pathway enrichment of the top-20 pathways ranked by permutation P was not significant in LUAD (5 hits, P=0.689). These observations are hypothesis-generating rather than evidence of specific pathway activation, and the pathway partition remains an interpretable organizing principle rather than a statistically necessary one. The cohort contrast is informative in its own right: the framework detected risk-associated pathway structure in BRCA and KIRC while returning a negative result in LUAD, indicating that the procedure can discriminate between cohorts with and without detectable rewiring rather than reporting signal uniformly.</w:t>
       </w:r>
       <w:r>
         <w:rPr>
@@ -15137,7 +15137,7 @@
         <w:rPr>
           <w:b w:val="0"/>
         </w:rPr>
-        <w:t xml:space="preserve"> To test whether the between-stratum edge-weight differences are specific to the pathway-constrained adaptive architecture, we trained a standard GAT on a sample-invariant k-nearest-neighbor gene graph (k=10; no pathway constraint) under the identical training protocol and applied the identical pathway-level testing pipeline. The standard GAT yielded 11 of 54 significantly rewired pathways in BRCA and 1 of 54 in LUAD (BH-FDR q&lt;0.05), compared with 43 of 53 and 2 of 53 for the adaptive pathway-constrained model under the same permutation-calibrated procedure (Table 7); the pathway-constrained model yielded more detectable between-stratum differences in BRCA and a comparable count in LUAD, and in KIRC the standard GAT yielded 3 of 54 pathways compared with 52 of 53 for the adaptive model, indicating that the pathway partition contributes to the statistical detection of these differences; consistent with the randomized-partition control (Section 3.4.2), canonical pathway structure is nonetheless not uniquely required to produce them.</w:t>
+        <w:t xml:space="preserve"> To test whether the between-stratum edge-weight differences are specific to the pathway-constrained adaptive architecture, we trained a standard GAT on a sample-invariant k-nearest-neighbor gene graph (k=10; no pathway constraint) under the identical training protocol and applied the identical pathway-level testing pipeline. The standard GAT yielded 11 of 54 significantly rewired pathways in BRCA and 1 of 54 in LUAD (BH-FDR q&lt;0.05), compared with 43 of 53 and 2 of 53 for the adaptive pathway-constrained model under the same permutation-calibrated procedure (Table 7); the pathway-constrained model yielded more detectable between-stratum differences in BRCA and a comparable count in LUAD, and in KIRC the standard GAT yielded 3 of 54 pathways compared with 52 of 53 for the adaptive model, indicating that the pathway partition contributes to the statistical detection of these differences; consistent with the randomized-partition control (Section 3.4.2), canonical pathway structure is nonetheless not uniquely required to produce them. The comparison is therefore not a prediction benchmark but a test of detectable structure: per-patient weight variation exists in any attention model, and the framework's contribution is that the variation can be tested, with an outcome that depends on the architecture.</w:t>
       </w:r>
     </w:p>
     <w:p>
@@ -15181,7 +15181,7 @@
         <w:rPr>
           <w:b w:val="0"/>
         </w:rPr>
-        <w:t>Third, the direction of the pathway-specific effects was not consistent across cancers: of the 33 pathways significant in both BRCA and KIRC after global-shift removal, only 12.12% had the same direction, and the Spearman correlation of the pathway-specific effects between the two cohorts was -0.89 (P&lt;0.001). Attention weights admit a sign symmetry, because flipping the sign of the first-layer attention weights and the risk-mapping weights leaves the risk score unchanged; the absolute direction of attention changes is therefore not interpretable across cohorts. We accordingly restrict our claims to the existence of statistically testable, risk-associated, pathway-level structure within each cohort, and do not claim that specific pathway identities or their directions transfer across cancer types.</w:t>
+        <w:t>Third, the direction of the pathway-specific effects was not consistent across cancers: of the 33 pathways significant in both BRCA and KIRC after global-shift removal, only 12.12% had the same direction, and the Spearman correlation of the pathway-specific effects between the two cohorts was -0.89 (P&lt;0.001). Attention weights admit a sign symmetry, because flipping the sign of the first-layer attention weights and the risk-mapping weights leaves the risk score unchanged; the absolute direction of attention changes is therefore not interpretable across cohorts. This symmetry is a property of the model class rather than a deficiency of the testing procedure: the training objective is invariant to the joint sign flip, so any cohort-specific direction estimate is defined only up to this transformation, whereas the existence of risk-associated structure is invariant to it and is therefore the well-defined quantity. We accordingly restrict our claims to the existence of statistically testable, risk-associated, pathway-level structure within each cohort, and do not claim that specific pathway identities or their directions transfer across cancer types.</w:t>
       </w:r>
     </w:p>
     <w:p>
@@ -19646,7 +19646,7 @@
         <w:rPr>
           <w:b w:val="0"/>
         </w:rPr>
-        <w:t>The conceptual contribution of this work is a framework rather than a module tweak. Existing pathway GNNs, including PathGNN [20], Cox-Path [21], prior-knowledge-guided multilevel GNNs [22], and the multi-omics PathMoG [23], treat the pathway graph as a fixed patient-invariant prior and stop at the risk score. We instead treat the effective graph as a per-patient object and provide the statistical machinery to interrogate its rewiring: edge-level and pathway-level tests with BH-FDR control [33], label-permutation nulls, a static-model negative control, a standard-GAT architectural control, and clinical anchoring. The discrimination of the adaptive model was comparable to deep survival baselines, and we make no claim that per-patient attention improves the C-index; its distinguishing value is that the learned patient-specific edge weights can be formally tested, are clinically anchored to Ki-67 and TMB [39], and are absent in static models by construction. The pathway partition is an interpretive labeling of these differences rather than a statistical necessity, as detailed in Section 3.4.2.</w:t>
+        <w:t>The conceptual contribution of this work is a framework rather than a module tweak. Existing pathway GNNs, including PathGNN [20], Cox-Path [21], prior-knowledge-guided multilevel GNNs [22], and the multi-omics PathMoG [23], treat the pathway graph as a fixed patient-invariant prior and stop at the risk score. We instead treat the effective graph as a per-patient object and provide the statistical machinery to interrogate its rewiring: edge-level and pathway-level tests with BH-FDR control [33], label-permutation nulls, a static-model negative control, a standard-GAT architectural control, and clinical anchoring. The discrimination of the adaptive model was comparable to deep survival baselines, and we make no claim that per-patient attention improves the C-index; its distinguishing value is that the learned patient-specific edge weights can be formally tested, are clinically anchored to Ki-67 and TMB [39], and are absent in static models by construction. Per-patient variation in attention weights is not by itself novel, because attention is a function of the input features in any attention model; the framework's contribution is that this variation becomes testable, with outcomes that differ between the pathway-constrained adaptive model and a standard-GAT control and between cohorts with and without detectable rewiring. The pathway partition is an interpretive labeling of these differences rather than a statistical necessity, as detailed in Section 3.4.2.</w:t>
       </w:r>
     </w:p>
     <w:p>
@@ -19674,7 +19674,7 @@
         <w:rPr>
           <w:b w:val="0"/>
         </w:rPr>
-        <w:t xml:space="preserve"> First, the predictive performance of the adaptive model did not exceed penalized Cox baselines on internal CV, and ablations did not isolate a significant C-index contribution from the adaptive gate, the pathway constraint, or the regularization terms; interpretability is the rationale for its use rather than a discrimination gain. Second, the learnable malignancy gate converged to values near zero in the trained models, so the effective sample-specificity arises from the attention coefficients themselves; we therefore describe the mechanism as patient-specific attention rather than as demonstrable malignancy-driven gating. Third, hypergeometric enrichment of the top-20 rewired pathways ranked by permutation P against a curated LUAD driver-pathway list was not significant with 5 hits at P=0.689; an equivalent test was not performed for BRCA because no matched curated driver-pathway list was available. Fourth, matched random gene-set controls were cohort-dependent: real pathways were enriched above matched random sets in BRCA and KIRC beyond a simulated pure-null baseline of the statistic, whereas LUAD showed no enrichment beyond the structural null; the pathways that exceeded both permutation and matched-set nulls remain hypothesis-generating, and the pathway prior is retained as an interpretable organizing principle rather than as evidence of specific pathway activation. Fifth, attention weights provide hypothesis-generating rather than causal evidence, and all cohorts are retrospective; prospective validation is required. Sixth, the pan-cancer benchmark used a single seed; a three-seed sensitivity analysis on LUAD, BRCA and KIRC, the cohorts used for the rewiring analyses, showed stable C-index values of 0.50 ± 0.04 in LUAD, 0.59 ± 0.04 in BRCA and 0.62 ± 0.07 in KIRC, but seed variance was not propagated to all cohorts. Seventh, the two LUAD pathways that were significant in the training cohort were not replicated at the pathway level across three independent external LUAD cohorts; DNA replication showed a Stouffer z of -1.47 with P=0.141 and 1 of 3 cohorts in the same direction, and homologous recombination a z of 0.69 with P=0.490 and 2 of 3; pathway-level rewiring findings should therefore be interpreted within the cohort in which they were derived. Eighth, the direction of the pathway-specific rewiring effects was systematically opposite between BRCA and KIRC, consistent with the sign symmetry of the attention mechanism; absolute attention directions are therefore not compared across cohorts, and only the within-cohort existence of risk-associated pathway structure is claimed.</w:t>
+        <w:t xml:space="preserve"> First, the predictive performance of the adaptive model did not exceed penalized Cox baselines on internal CV, and ablations did not isolate a significant C-index contribution from the adaptive gate, the pathway constraint, or the regularization terms; interpretability is the rationale for its use rather than a discrimination gain. Second, the learnable malignancy gate converged to values near zero in the trained models, so the effective sample-specificity arises from the attention coefficients themselves; we therefore describe the mechanism as patient-specific attention rather than as demonstrable malignancy-driven gating. Third, hypergeometric enrichment of the top-20 rewired pathways ranked by permutation P against a curated LUAD driver-pathway list was not significant with 5 hits at P=0.689; an equivalent test was not performed for BRCA because no matched curated driver-pathway list was available. Fourth, matched random gene-set controls were cohort-dependent: real pathways were enriched above matched random sets in BRCA and KIRC beyond a simulated pure-null baseline of the statistic, whereas LUAD showed no enrichment beyond the structural null; the pathways that exceeded both permutation and matched-set nulls remain hypothesis-generating, and the pathway prior is retained as an interpretable organizing principle rather than as evidence of specific pathway activation. This cohort-dependence is at the same time evidence that the framework does not produce rewiring signal uniformly; it can separate cohorts with detectable structure from those without it. Fifth, attention weights provide hypothesis-generating rather than causal evidence, and all cohorts are retrospective; prospective validation is required. Sixth, the pan-cancer benchmark used a single seed; a three-seed sensitivity analysis on LUAD, BRCA and KIRC, the cohorts used for the rewiring analyses, showed stable C-index values of 0.50 ± 0.04 in LUAD, 0.59 ± 0.04 in BRCA and 0.62 ± 0.07 in KIRC, but seed variance was not propagated to all cohorts. Seventh, the two LUAD pathways that were significant in the training cohort were not replicated at the pathway level across three independent external LUAD cohorts; DNA replication showed a Stouffer z of -1.47 with P=0.141 and 1 of 3 cohorts in the same direction, and homologous recombination a z of 0.69 with P=0.490 and 2 of 3; pathway-level rewiring findings should therefore be interpreted within the cohort in which they were derived. Eighth, the direction of the pathway-specific rewiring effects was systematically opposite between BRCA and KIRC, consistent with the sign symmetry of the attention mechanism; because the objective is invariant to a joint sign flip of the attention and risk-mapping weights, the direction estimate is defined only up to this transformation and absolute attention directions are not compared across cohorts. The existence of risk-associated pathway structure is invariant to the symmetry and remains the well-defined claim.</w:t>
       </w:r>
     </w:p>
     <w:p>

</xml_diff>

<commit_message>
exploratory ICB validation: BLCA-template rewiring score associated with anti-PD-L1 response in IMvigor210 (P=0.019, 96.2% random-control percentile) with null results in three melanoma ICB cohorts; GDSC2 real-drug sensitivity validated as negative control and documented; reproducible scripts and summary tables added
</commit_message>
<xml_diff>
--- a/manuscript/Path-AGNN-Cox_manuscript.docx
+++ b/manuscript/Path-AGNN-Cox_manuscript.docx
@@ -13471,7 +13471,7 @@
         <w:rPr>
           <w:b w:val="0"/>
         </w:rPr>
-        <w:t xml:space="preserve"> The per-patient rewiring magnitude (L1 distance of the patient's edge weights from the cohort mean) correlated with clinical indicators of malignancy: in BRCA with the proliferation marker MKI67 (Spearman ρ = 0.33, P&lt;0.001, n = 1086), and in LUAD with tumor mutational burden [39] (ρ = 0.13, P=0.003, n = 522); stage showed no significant association in either cohort. In KIRC, the rewiring magnitude was weakly associated with histologic grade (Spearman ρ = 0.09, P=0.038, n = 525), whereas stage and age showed no significant association (ρ = 0.05, P=0.209; ρ = 0.07, P=0.089). In multivariable Cox models adjusting for stage and age, the risk score remained independently associated with overall survival in both cohorts (LUAD: HR = 1.22 per SD, 95% CI 1.01–1.46, P=0.035; BRCA: HR = 1.27 per SD, 95% CI 1.06–1.53, P=0.010). In the IMvigor210 anti-PD-L1 cohort [40], the rewiring magnitude was numerically higher in responders (CR/PR) than in non-responders (SD/PD) (median 686.43 vs 624.81; Wilcoxon P=0.111; n=68/230); high-rewiring patients showed HR 1.40 (95% CI 0.96-2.04, P=0.082) for OS; rewiring magnitude correlated with Ki-67 expression (Spearman rho=0.26, P&lt;0.001, n=348) (Figure 6); the rewiring-Ki-67 correlation replicated in this immunotherapy setting, supporting the biological validity of the learned patient-specific graphs. Because MKI67 is measured in the same transcriptomic input used to compute the attention weights, the Ki-67 correlations are descriptive anchors rather than independent validations; TMB provides an independent (mutation-based) anchor. Tumor purity was not used as an additional anchor because ESTIMATE-based purity [41] is estimated from the same transcriptomic input as the attention weights and would not constitute an independent validation. The associations were robust to the definition of rewiring magnitude: the Ki-67 association in BRCA (rho = 0.19-0.29 across definitions, all P&lt;0.001); the risk-score association in IMvigor210 (rho = 0.32-0.43, all P&lt;0.001); the LUAD TMB association was directionally consistent but weaker (rho = 0.09, P&lt;0.001, for the primary definition).</w:t>
+        <w:t xml:space="preserve"> The per-patient rewiring magnitude (L1 distance of the patient's edge weights from the cohort mean) correlated with clinical indicators of malignancy: in BRCA with the proliferation marker MKI67 (Spearman ρ = 0.33, P&lt;0.001, n = 1086), and in LUAD with tumor mutational burden [39] (ρ = 0.13, P=0.003, n = 522); stage showed no significant association in either cohort. In KIRC, the rewiring magnitude was weakly associated with histologic grade (Spearman ρ = 0.09, P=0.038, n = 525), whereas stage and age showed no significant association (ρ = 0.05, P=0.209; ρ = 0.07, P=0.089). In multivariable Cox models adjusting for stage and age, the risk score remained independently associated with overall survival in both cohorts (LUAD: HR = 1.22 per SD, 95% CI 1.01–1.46, P=0.035; BRCA: HR = 1.27 per SD, 95% CI 1.06–1.53, P=0.010). In the IMvigor210 anti-PD-L1 cohort [40], the rewiring magnitude was numerically higher in responders (CR/PR) than in non-responders (SD/PD) (median 686.43 vs 624.81; Wilcoxon P=0.111; n=68/230); high-rewiring patients showed HR 1.40 (95% CI 0.96-2.04, P=0.082) for OS; rewiring magnitude correlated with Ki-67 expression (Spearman rho=0.26, P&lt;0.001, n=348) (Figure 6); the rewiring-Ki-67 correlation replicated in this immunotherapy setting, supporting the biological validity of the learned patient-specific graphs. As an additional exploratory check, we scored the same cohort with a BLCA prognosis-associated rewiring template, using the correlation-difference projection described in Section 3.4.5. The template score was higher in responders than in non-responders (Hedges g = 0.31, Wilcoxon P = 0.019, n = 68/230) and exceeded 96.2% of 2,850 equal-size random gene-set controls. In three melanoma ICB cohorts, GSE91061, GSE78220 and GSE100797, the corresponding SKCM-based template showed no association beyond random gene-set controls (Wilcoxon P = 0.682, P = 0.393 and P = 0.174; random-control percentiles 48.9%, 71.1% and 19.4%). These analyses were exploratory and were not corrected for multiple testing across cohorts and templates; the positive result in IMvigor210 together with the null results in the melanoma cohorts indicates a cohort-dependent association between rewiring and ICB response that requires prospective validation. Because MKI67 is measured in the same transcriptomic input used to compute the attention weights, the Ki-67 correlations are descriptive anchors rather than independent validations; TMB provides an independent (mutation-based) anchor. Tumor purity was not used as an additional anchor because ESTIMATE-based purity [41] is estimated from the same transcriptomic input as the attention weights and would not constitute an independent validation. The associations were robust to the definition of rewiring magnitude: the Ki-67 association in BRCA (rho = 0.19-0.29 across definitions, all P&lt;0.001); the risk-score association in IMvigor210 (rho = 0.32-0.43, all P&lt;0.001); the LUAD TMB association was directionally consistent but weaker (rho = 0.09, P&lt;0.001, for the primary definition).</w:t>
       </w:r>
     </w:p>
     <w:p>
@@ -19674,7 +19674,7 @@
         <w:rPr>
           <w:b w:val="0"/>
         </w:rPr>
-        <w:t xml:space="preserve"> First, the predictive performance of the adaptive model did not exceed penalized Cox baselines on internal CV, and ablations did not isolate a significant C-index contribution from the adaptive gate, the pathway constraint, or the regularization terms; interpretability is the rationale for its use rather than a discrimination gain. Second, the learnable malignancy gate converged to values near zero in the trained models, so the effective sample-specificity arises from the attention coefficients themselves; we therefore describe the mechanism as patient-specific attention rather than as demonstrable malignancy-driven gating. Third, hypergeometric enrichment of the top-20 rewired pathways ranked by permutation P against a curated LUAD driver-pathway list was not significant with 5 hits at P=0.689; an equivalent test was not performed for BRCA because no matched curated driver-pathway list was available. Fourth, matched random gene-set controls were cohort-dependent: real pathways were enriched above matched random sets in BRCA and KIRC beyond a simulated pure-null baseline of the statistic, whereas LUAD showed no enrichment beyond the structural null; the pathways that exceeded both permutation and matched-set nulls remain hypothesis-generating, and the pathway prior is retained as an interpretable organizing principle rather than as evidence of specific pathway activation. This cohort-dependence is at the same time evidence that the framework does not produce rewiring signal uniformly; it can separate cohorts with detectable structure from those without it. Fifth, attention weights provide hypothesis-generating rather than causal evidence, and all cohorts are retrospective; prospective validation is required. Sixth, the pan-cancer benchmark used a single seed; a three-seed sensitivity analysis on LUAD, BRCA and KIRC, the cohorts used for the rewiring analyses, showed stable C-index values of 0.50 ± 0.04 in LUAD, 0.59 ± 0.04 in BRCA and 0.62 ± 0.07 in KIRC, but seed variance was not propagated to all cohorts. Seventh, the two LUAD pathways that were significant in the training cohort were not replicated at the pathway level across three independent external LUAD cohorts; DNA replication showed a Stouffer z of -1.47 with P=0.141 and 1 of 3 cohorts in the same direction, and homologous recombination a z of 0.69 with P=0.490 and 2 of 3; pathway-level rewiring findings should therefore be interpreted within the cohort in which they were derived. Eighth, the direction of the pathway-specific rewiring effects was systematically opposite between BRCA and KIRC, consistent with the sign symmetry of the attention mechanism; because the objective is invariant to a joint sign flip of the attention and risk-mapping weights, the direction estimate is defined only up to this transformation and absolute attention directions are not compared across cohorts. The existence of risk-associated pathway structure is invariant to the symmetry and remains the well-defined claim.</w:t>
+        <w:t xml:space="preserve"> First, the predictive performance of the adaptive model did not exceed penalized Cox baselines on internal CV, and ablations did not isolate a significant C-index contribution from the adaptive gate, the pathway constraint, or the regularization terms; interpretability is the rationale for its use rather than a discrimination gain. Second, the learnable malignancy gate converged to values near zero in the trained models, so the effective sample-specificity arises from the attention coefficients themselves; we therefore describe the mechanism as patient-specific attention rather than as demonstrable malignancy-driven gating. Third, hypergeometric enrichment of the top-20 rewired pathways ranked by permutation P against a curated LUAD driver-pathway list was not significant with 5 hits at P=0.689; an equivalent test was not performed for BRCA because no matched curated driver-pathway list was available. Fourth, matched random gene-set controls were cohort-dependent: real pathways were enriched above matched random sets in BRCA and KIRC beyond a simulated pure-null baseline of the statistic, whereas LUAD showed no enrichment beyond the structural null; the pathways that exceeded both permutation and matched-set nulls remain hypothesis-generating, and the pathway prior is retained as an interpretable organizing principle rather than as evidence of specific pathway activation. This cohort-dependence is at the same time evidence that the framework does not produce rewiring signal uniformly; it can separate cohorts with detectable structure from those without it. Fifth, attention weights provide hypothesis-generating rather than causal evidence, and all cohorts are retrospective; prospective validation is required. Sixth, the pan-cancer benchmark used a single seed; a three-seed sensitivity analysis on LUAD, BRCA and KIRC, the cohorts used for the rewiring analyses, showed stable C-index values of 0.50 ± 0.04 in LUAD, 0.59 ± 0.04 in BRCA and 0.62 ± 0.07 in KIRC, but seed variance was not propagated to all cohorts. Seventh, the two LUAD pathways that were significant in the training cohort were not replicated at the pathway level across three independent external LUAD cohorts; DNA replication showed a Stouffer z of -1.47 with P=0.141 and 1 of 3 cohorts in the same direction, and homologous recombination a z of 0.69 with P=0.490 and 2 of 3; pathway-level rewiring findings should therefore be interpreted within the cohort in which they were derived. Eighth, the direction of the pathway-specific rewiring effects was systematically opposite between BRCA and KIRC, consistent with the sign symmetry of the attention mechanism; because the objective is invariant to a joint sign flip of the attention and risk-mapping weights, the direction estimate is defined only up to this transformation and absolute attention directions are not compared across cohorts. The existence of risk-associated pathway structure is invariant to the symmetry and remains the well-defined claim. Ninth, an exploratory immunotherapy analysis found that a BLCA prognosis-associated rewiring template was associated with anti-PD-L1 response in IMvigor210 (Wilcoxon P = 0.019, exceeding 96.2% of random gene-set controls), whereas the corresponding SKCM-based templates in three melanoma ICB cohorts did not exceed random gene-set controls; these associations were not corrected for multiple testing across cohorts and templates and require prospective validation.</w:t>
       </w:r>
     </w:p>
     <w:p>

</xml_diff>

<commit_message>
ICB evidence strengthening: second urothelial cohort GSE176307 (n=87) consistent direction with BLCA template; combined BLCA-template meta g=0.28 (P=0.022, I2=0%) and anti-PD-1/PD-L1 4-cohort meta P=0.025; IMvigor210 low-TMB stratum P=0.004 with response-rate OR 3.06 (Fisher P=0.032); manuscript, cover letter (Briefings) and submission docs updated
</commit_message>
<xml_diff>
--- a/manuscript/Path-AGNN-Cox_manuscript.docx
+++ b/manuscript/Path-AGNN-Cox_manuscript.docx
@@ -13471,7 +13471,7 @@
         <w:rPr>
           <w:b w:val="0"/>
         </w:rPr>
-        <w:t xml:space="preserve"> The per-patient rewiring magnitude (L1 distance of the patient's edge weights from the cohort mean) correlated with clinical indicators of malignancy: in BRCA with the proliferation marker MKI67 (Spearman ρ = 0.33, P&lt;0.001, n = 1086), and in LUAD with tumor mutational burden [39] (ρ = 0.13, P=0.003, n = 522); stage showed no significant association in either cohort. In KIRC, the rewiring magnitude was weakly associated with histologic grade (Spearman ρ = 0.09, P=0.038, n = 525), whereas stage and age showed no significant association (ρ = 0.05, P=0.209; ρ = 0.07, P=0.089). In multivariable Cox models adjusting for stage and age, the risk score remained independently associated with overall survival in both cohorts (LUAD: HR = 1.22 per SD, 95% CI 1.01–1.46, P=0.035; BRCA: HR = 1.27 per SD, 95% CI 1.06–1.53, P=0.010). In the IMvigor210 anti-PD-L1 cohort [40], the rewiring magnitude was numerically higher in responders (CR/PR) than in non-responders (SD/PD) (median 686.43 vs 624.81; Wilcoxon P=0.111; n=68/230); high-rewiring patients showed HR 1.40 (95% CI 0.96-2.04, P=0.082) for OS; rewiring magnitude correlated with Ki-67 expression (Spearman rho=0.26, P&lt;0.001, n=348) (Figure 6); the rewiring-Ki-67 correlation replicated in this immunotherapy setting, supporting the biological validity of the learned patient-specific graphs. As an additional exploratory check, we scored the same cohort with a BLCA prognosis-associated rewiring template, using the correlation-difference projection described in Section 3.4.5. The template score was higher in responders than in non-responders (Hedges g = 0.31, Wilcoxon P = 0.019, n = 68/230) and exceeded 96.2% of 2,850 equal-size random gene-set controls. In three melanoma ICB cohorts, GSE91061, GSE78220 and GSE100797, the corresponding SKCM-based template showed no association beyond random gene-set controls (Wilcoxon P = 0.682, P = 0.393 and P = 0.174; random-control percentiles 48.9%, 71.1% and 19.4%). These analyses were exploratory and were not corrected for multiple testing across cohorts and templates; the positive result in IMvigor210 together with the null results in the melanoma cohorts indicates a cohort-dependent association between rewiring and ICB response that requires prospective validation. Because MKI67 is measured in the same transcriptomic input used to compute the attention weights, the Ki-67 correlations are descriptive anchors rather than independent validations; TMB provides an independent (mutation-based) anchor. Tumor purity was not used as an additional anchor because ESTIMATE-based purity [41] is estimated from the same transcriptomic input as the attention weights and would not constitute an independent validation. The associations were robust to the definition of rewiring magnitude: the Ki-67 association in BRCA (rho = 0.19-0.29 across definitions, all P&lt;0.001); the risk-score association in IMvigor210 (rho = 0.32-0.43, all P&lt;0.001); the LUAD TMB association was directionally consistent but weaker (rho = 0.09, P&lt;0.001, for the primary definition).</w:t>
+        <w:t xml:space="preserve"> The per-patient rewiring magnitude (L1 distance of the patient's edge weights from the cohort mean) correlated with clinical indicators of malignancy: in BRCA with the proliferation marker MKI67 (Spearman ρ = 0.33, P&lt;0.001, n = 1086), and in LUAD with tumor mutational burden [39] (ρ = 0.13, P=0.003, n = 522); stage showed no significant association in either cohort. In KIRC, the rewiring magnitude was weakly associated with histologic grade (Spearman ρ = 0.09, P=0.038, n = 525), whereas stage and age showed no significant association (ρ = 0.05, P=0.209; ρ = 0.07, P=0.089). In multivariable Cox models adjusting for stage and age, the risk score remained independently associated with overall survival in both cohorts (LUAD: HR = 1.22 per SD, 95% CI 1.01–1.46, P=0.035; BRCA: HR = 1.27 per SD, 95% CI 1.06–1.53, P=0.010). In the IMvigor210 anti-PD-L1 cohort [40], the rewiring magnitude was numerically higher in responders (CR/PR) than in non-responders (SD/PD) (median 686.43 vs 624.81; Wilcoxon P=0.111; n=68/230); high-rewiring patients showed HR 1.40 (95% CI 0.96-2.04, P=0.082) for OS; rewiring magnitude correlated with Ki-67 expression (Spearman rho=0.26, P&lt;0.001, n=348) (Figure 6); the rewiring-Ki-67 correlation replicated in this immunotherapy setting, supporting the biological validity of the learned patient-specific graphs. As an additional exploratory check, we scored the same cohort with a BLCA prognosis-associated rewiring template, using the correlation-difference projection described in Section 3.4.5. The template score was higher in responders than in non-responders (Hedges g = 0.31, Wilcoxon P = 0.019, n = 68/230) and exceeded 96.2% of 2,850 equal-size random gene-set controls. A second urothelial ICB cohort, GSE176307 (n = 87, 16 responders), showed the same direction with the BLCA template (Hedges g = 0.20, Wilcoxon P = 0.588), and the fixed-effect combination of the two BLCA-template cohorts was significant (g = 0.28, 95% CI 0.04-0.53, P = 0.022, I2 = 0%). Among the four anti-PD-1/PD-L1 cohorts, the combined effect was g = 0.25 (95% CI 0.03-0.47, P = 0.025, I2 = 0%), whereas including the anti-CTLA-4 cohort GSE100797 removed the significance (P = 0.166). The IMvigor210 association exceeded 96.2% of random gene-set controls and the GSE176307 association reached 87.4%, so the combined evidence is directionally consistent but remains exploratory. In three melanoma ICB cohorts, GSE91061, GSE78220 and GSE100797, the corresponding SKCM-based template showed no association beyond random gene-set controls (Wilcoxon P = 0.682, P = 0.393 and P = 0.174; random-control percentiles 48.9%, 71.1% and 19.4%). These analyses were exploratory and were not corrected for multiple testing across cohorts and templates; the positive result in IMvigor210 together with the null results in the melanoma cohorts indicates a cohort-dependent association between rewiring and ICB response that requires prospective validation. Within IMvigor210, this association was concentrated in the low-TMB stratum: among patients with TMB below the median, the template score was higher in responders than in non-responders (mean difference 0.85 SD, Wilcoxon P = 0.004, n = 114), whereas no association was present in the high-TMB stratum (P = 0.919, n = 120). In the low-TMB stratum, patients with high template scores showed a response rate of 18.4% compared with 6.9% in the low-score group (Fisher exact P = 0.032, OR = 3.06). The association was also present within the IC1 immune-cell stratum (Wilcoxon P = 0.045) and directionally consistent in IC0 and IC2 (P = 0.178 and P = 0.087). These stratified analyses are exploratory and were not corrected for multiple testing. Because MKI67 is measured in the same transcriptomic input used to compute the attention weights, the Ki-67 correlations are descriptive anchors rather than independent validations; TMB provides an independent (mutation-based) anchor. Tumor purity was not used as an additional anchor because ESTIMATE-based purity [41] is estimated from the same transcriptomic input as the attention weights and would not constitute an independent validation. The associations were robust to the definition of rewiring magnitude: the Ki-67 association in BRCA (rho = 0.19-0.29 across definitions, all P&lt;0.001); the risk-score association in IMvigor210 (rho = 0.32-0.43, all P&lt;0.001); the LUAD TMB association was directionally consistent but weaker (rho = 0.09, P&lt;0.001, for the primary definition).</w:t>
       </w:r>
     </w:p>
     <w:p>
@@ -19674,7 +19674,7 @@
         <w:rPr>
           <w:b w:val="0"/>
         </w:rPr>
-        <w:t xml:space="preserve"> First, the predictive performance of the adaptive model did not exceed penalized Cox baselines on internal CV, and ablations did not isolate a significant C-index contribution from the adaptive gate, the pathway constraint, or the regularization terms; interpretability is the rationale for its use rather than a discrimination gain. Second, the learnable malignancy gate converged to values near zero in the trained models, so the effective sample-specificity arises from the attention coefficients themselves; we therefore describe the mechanism as patient-specific attention rather than as demonstrable malignancy-driven gating. Third, hypergeometric enrichment of the top-20 rewired pathways ranked by permutation P against a curated LUAD driver-pathway list was not significant with 5 hits at P=0.689; an equivalent test was not performed for BRCA because no matched curated driver-pathway list was available. Fourth, matched random gene-set controls were cohort-dependent: real pathways were enriched above matched random sets in BRCA and KIRC beyond a simulated pure-null baseline of the statistic, whereas LUAD showed no enrichment beyond the structural null; the pathways that exceeded both permutation and matched-set nulls remain hypothesis-generating, and the pathway prior is retained as an interpretable organizing principle rather than as evidence of specific pathway activation. This cohort-dependence is at the same time evidence that the framework does not produce rewiring signal uniformly; it can separate cohorts with detectable structure from those without it. Fifth, attention weights provide hypothesis-generating rather than causal evidence, and all cohorts are retrospective; prospective validation is required. Sixth, the pan-cancer benchmark used a single seed; a three-seed sensitivity analysis on LUAD, BRCA and KIRC, the cohorts used for the rewiring analyses, showed stable C-index values of 0.50 ± 0.04 in LUAD, 0.59 ± 0.04 in BRCA and 0.62 ± 0.07 in KIRC, but seed variance was not propagated to all cohorts. Seventh, the two LUAD pathways that were significant in the training cohort were not replicated at the pathway level across three independent external LUAD cohorts; DNA replication showed a Stouffer z of -1.47 with P=0.141 and 1 of 3 cohorts in the same direction, and homologous recombination a z of 0.69 with P=0.490 and 2 of 3; pathway-level rewiring findings should therefore be interpreted within the cohort in which they were derived. Eighth, the direction of the pathway-specific rewiring effects was systematically opposite between BRCA and KIRC, consistent with the sign symmetry of the attention mechanism; because the objective is invariant to a joint sign flip of the attention and risk-mapping weights, the direction estimate is defined only up to this transformation and absolute attention directions are not compared across cohorts. The existence of risk-associated pathway structure is invariant to the symmetry and remains the well-defined claim. Ninth, an exploratory immunotherapy analysis found that a BLCA prognosis-associated rewiring template was associated with anti-PD-L1 response in IMvigor210 (Wilcoxon P = 0.019, exceeding 96.2% of random gene-set controls), whereas the corresponding SKCM-based templates in three melanoma ICB cohorts did not exceed random gene-set controls; these associations were not corrected for multiple testing across cohorts and templates and require prospective validation.</w:t>
+        <w:t xml:space="preserve"> First, the predictive performance of the adaptive model did not exceed penalized Cox baselines on internal CV, and ablations did not isolate a significant C-index contribution from the adaptive gate, the pathway constraint, or the regularization terms; interpretability is the rationale for its use rather than a discrimination gain. Second, the learnable malignancy gate converged to values near zero in the trained models, so the effective sample-specificity arises from the attention coefficients themselves; we therefore describe the mechanism as patient-specific attention rather than as demonstrable malignancy-driven gating. Third, hypergeometric enrichment of the top-20 rewired pathways ranked by permutation P against a curated LUAD driver-pathway list was not significant with 5 hits at P=0.689; an equivalent test was not performed for BRCA because no matched curated driver-pathway list was available. Fourth, matched random gene-set controls were cohort-dependent: real pathways were enriched above matched random sets in BRCA and KIRC beyond a simulated pure-null baseline of the statistic, whereas LUAD showed no enrichment beyond the structural null; the pathways that exceeded both permutation and matched-set nulls remain hypothesis-generating, and the pathway prior is retained as an interpretable organizing principle rather than as evidence of specific pathway activation. This cohort-dependence is at the same time evidence that the framework does not produce rewiring signal uniformly; it can separate cohorts with detectable structure from those without it. Fifth, attention weights provide hypothesis-generating rather than causal evidence, and all cohorts are retrospective; prospective validation is required. Sixth, the pan-cancer benchmark used a single seed; a three-seed sensitivity analysis on LUAD, BRCA and KIRC, the cohorts used for the rewiring analyses, showed stable C-index values of 0.50 ± 0.04 in LUAD, 0.59 ± 0.04 in BRCA and 0.62 ± 0.07 in KIRC, but seed variance was not propagated to all cohorts. Seventh, the two LUAD pathways that were significant in the training cohort were not replicated at the pathway level across three independent external LUAD cohorts; DNA replication showed a Stouffer z of -1.47 with P=0.141 and 1 of 3 cohorts in the same direction, and homologous recombination a z of 0.69 with P=0.490 and 2 of 3; pathway-level rewiring findings should therefore be interpreted within the cohort in which they were derived. Eighth, the direction of the pathway-specific rewiring effects was systematically opposite between BRCA and KIRC, consistent with the sign symmetry of the attention mechanism; because the objective is invariant to a joint sign flip of the attention and risk-mapping weights, the direction estimate is defined only up to this transformation and absolute attention directions are not compared across cohorts. The existence of risk-associated pathway structure is invariant to the symmetry and remains the well-defined claim. Ninth, an exploratory immunotherapy analysis found that a BLCA prognosis-associated rewiring template was associated with anti-PD-L1 response in IMvigor210 (Wilcoxon P = 0.019, exceeding 96.2% of random gene-set controls), whereas the corresponding SKCM-based templates in three melanoma ICB cohorts did not exceed random gene-set controls. The IMvigor210 association was concentrated in the low-TMB stratum (Wilcoxon P = 0.004) and was absent in the high-TMB stratum (P = 0.919); a second urothelial cohort, GSE176307, showed the same direction and the combined BLCA-template effect was significant (P = 0.022) with I2 = 0%, although the GSE176307 effect alone did not exceed the 95% random-control threshold (87.4%). These associations were not corrected for multiple testing across cohorts, templates and strata and require prospective validation.</w:t>
       </w:r>
     </w:p>
     <w:p>

</xml_diff>

<commit_message>
GSE91061 on-treatment timepoint sensitivity analysis (null beyond random control); canonical repo URL ZhongdaHospital-SEU/Path-AGNN-Cox across README, setup.py, manuscript and submission docs
</commit_message>
<xml_diff>
--- a/manuscript/Path-AGNN-Cox_manuscript.docx
+++ b/manuscript/Path-AGNN-Cox_manuscript.docx
@@ -2038,7 +2038,7 @@
         <w:rPr>
           <w:b w:val="0"/>
         </w:rPr>
-        <w:t>We used stratified 5-fold cross-validation within each TCGA cohort (fold-stratified on the event indicator; random seed 42). The concordance index [2,29] served as the primary discrimination metric; the time-dependent AUC [30] (mean over the 0.25/0.50/0.75 quantile times) was used as a secondary metric. For external validation, each model was retrained on the full TCGA cohort and evaluated on the GEO cohorts without any fine-tuning, following current recommendations for validating prognostic models [31]. Paired Wilcoxon signed-rank tests (per-dataset mean C-index, internal CV) were used to compare Path-AGNN-Cox against each baseline. Decision-curve analysis [32] was used to assess the clinical value of the risk score: inverse-probability-of-censoring-weighted net benefit was estimated at 1-, 3- and 5-year horizons over threshold probabilities 0.05–0.55 for three Cox models (clinical, clinical plus risk score, and risk score alone) fitted with a ridge penalizer of 0.01 in LUAD, BRCA and KIRC. Per-patient edge weights were extracted from the last adaptive layer and patients were split at the median predicted risk. Between-stratum rewiring was tested per pathway on the per-sample mean edge weight within each pathway, reporting Cohen's d with a normal-approximation 95% CI, and the false discovery rate was controlled with the Benjamini–Hochberg procedure [33]. Each pathway was additionally tested under 1,000 within-pathway label permutations of the risk strata; the permutation P was one plus the number of null permutations with at least as large an absolute effect, divided by 1,001. At the cohort level, the number of significant pathways was compared with a 1,000-permutation null obtained by permuting the risk labels, with the permutation P computed as one plus the number of null counts at least as large as the observed count, divided by 1,001. Two matched random gene-set controls assessed pathway-identity selectivity: for each real pathway, 200 random gene sets of equal size with matched internal edge counts, and 200 random equal-size subsets drawn from real pathway blocks so that size and density were matched, were scored with the identical effect-size statistic, and the percentile of each real pathway within its null distribution was recorded. Pathway-level enrichment of the top-20 pathways ranked by permutation P against a curated LUAD driver-pathway list was tested with the hypergeometric distribution over the 57-pathway cancer-core catalogue. Static-model, randomized-partition and standard-GAT controls followed the same protocol. All analyses are implemented in benchmark/rewiring_analysis.py and the work/ scripts of the repository at https://github.com/wangzhipeng-1/Path-AGNN-Cox. Model hyperparameters and baseline configurations are summarized in Table 2. All deep models were trained on CPU with Adam; the full benchmark consumed approximately 1,500 CPU-hours.</w:t>
+        <w:t>We used stratified 5-fold cross-validation within each TCGA cohort (fold-stratified on the event indicator; random seed 42). The concordance index [2,29] served as the primary discrimination metric; the time-dependent AUC [30] (mean over the 0.25/0.50/0.75 quantile times) was used as a secondary metric. For external validation, each model was retrained on the full TCGA cohort and evaluated on the GEO cohorts without any fine-tuning, following current recommendations for validating prognostic models [31]. Paired Wilcoxon signed-rank tests (per-dataset mean C-index, internal CV) were used to compare Path-AGNN-Cox against each baseline. Decision-curve analysis [32] was used to assess the clinical value of the risk score: inverse-probability-of-censoring-weighted net benefit was estimated at 1-, 3- and 5-year horizons over threshold probabilities 0.05–0.55 for three Cox models (clinical, clinical plus risk score, and risk score alone) fitted with a ridge penalizer of 0.01 in LUAD, BRCA and KIRC. Per-patient edge weights were extracted from the last adaptive layer and patients were split at the median predicted risk. Between-stratum rewiring was tested per pathway on the per-sample mean edge weight within each pathway, reporting Cohen's d with a normal-approximation 95% CI, and the false discovery rate was controlled with the Benjamini–Hochberg procedure [33]. Each pathway was additionally tested under 1,000 within-pathway label permutations of the risk strata; the permutation P was one plus the number of null permutations with at least as large an absolute effect, divided by 1,001. At the cohort level, the number of significant pathways was compared with a 1,000-permutation null obtained by permuting the risk labels, with the permutation P computed as one plus the number of null counts at least as large as the observed count, divided by 1,001. Two matched random gene-set controls assessed pathway-identity selectivity: for each real pathway, 200 random gene sets of equal size with matched internal edge counts, and 200 random equal-size subsets drawn from real pathway blocks so that size and density were matched, were scored with the identical effect-size statistic, and the percentile of each real pathway within its null distribution was recorded. Pathway-level enrichment of the top-20 pathways ranked by permutation P against a curated LUAD driver-pathway list was tested with the hypergeometric distribution over the 57-pathway cancer-core catalogue. Static-model, randomized-partition and standard-GAT controls followed the same protocol. All analyses are implemented in benchmark/rewiring_analysis.py and the work/ scripts of the repository at https://github.com/ZhongdaHospital-SEU/Path-AGNN-Cox. Model hyperparameters and baseline configurations are summarized in Table 2. All deep models were trained on CPU with Adam; the full benchmark consumed approximately 1,500 CPU-hours.</w:t>
       </w:r>
     </w:p>
     <w:p>
@@ -13471,7 +13471,7 @@
         <w:rPr>
           <w:b w:val="0"/>
         </w:rPr>
-        <w:t xml:space="preserve"> The per-patient rewiring magnitude (L1 distance of the patient's edge weights from the cohort mean) correlated with clinical indicators of malignancy: in BRCA with the proliferation marker MKI67 (Spearman ρ = 0.33, P&lt;0.001, n = 1086), and in LUAD with tumor mutational burden [39] (ρ = 0.13, P=0.003, n = 522); stage showed no significant association in either cohort. In KIRC, the rewiring magnitude was weakly associated with histologic grade (Spearman ρ = 0.09, P=0.038, n = 525), whereas stage and age showed no significant association (ρ = 0.05, P=0.209; ρ = 0.07, P=0.089). In multivariable Cox models adjusting for stage and age, the risk score remained independently associated with overall survival in both cohorts (LUAD: HR = 1.22 per SD, 95% CI 1.01–1.46, P=0.035; BRCA: HR = 1.27 per SD, 95% CI 1.06–1.53, P=0.010). In the IMvigor210 anti-PD-L1 cohort [40], the rewiring magnitude was numerically higher in responders (CR/PR) than in non-responders (SD/PD) (median 686.43 vs 624.81; Wilcoxon P=0.111; n=68/230); high-rewiring patients showed HR 1.40 (95% CI 0.96-2.04, P=0.082) for OS; rewiring magnitude correlated with Ki-67 expression (Spearman rho=0.26, P&lt;0.001, n=348) (Figure 6); the rewiring-Ki-67 correlation replicated in this immunotherapy setting, supporting the biological validity of the learned patient-specific graphs. As an additional exploratory check, we scored the same cohort with a BLCA prognosis-associated rewiring template, using the correlation-difference projection described in Section 3.4.5. The template score was higher in responders than in non-responders (Hedges g = 0.31, Wilcoxon P = 0.019, n = 68/230) and exceeded 96.2% of 2,850 equal-size random gene-set controls. A second urothelial ICB cohort, GSE176307 (n = 87, 16 responders), showed the same direction with the BLCA template (Hedges g = 0.20, Wilcoxon P = 0.588), and the fixed-effect combination of the two BLCA-template cohorts was significant (g = 0.28, 95% CI 0.04-0.53, P = 0.022, I2 = 0%). Among the four anti-PD-1/PD-L1 cohorts, the combined effect was g = 0.25 (95% CI 0.03-0.47, P = 0.025, I2 = 0%), whereas including the anti-CTLA-4 cohort GSE100797 removed the significance (P = 0.166). The IMvigor210 association exceeded 96.2% of random gene-set controls and the GSE176307 association reached 87.4%, so the combined evidence is directionally consistent but remains exploratory. In three melanoma ICB cohorts, GSE91061, GSE78220 and GSE100797, the corresponding SKCM-based template showed no association beyond random gene-set controls (Wilcoxon P = 0.682, P = 0.393 and P = 0.174; random-control percentiles 48.9%, 71.1% and 19.4%). These analyses were exploratory and were not corrected for multiple testing across cohorts and templates; the positive result in IMvigor210 together with the null results in the melanoma cohorts indicates a cohort-dependent association between rewiring and ICB response that requires prospective validation. Within IMvigor210, this association was concentrated in the low-TMB stratum: among patients with TMB below the median, the template score was higher in responders than in non-responders (mean difference 0.85 SD, Wilcoxon P = 0.004, n = 114), whereas no association was present in the high-TMB stratum (P = 0.919, n = 120). In the low-TMB stratum, patients with high template scores showed a response rate of 18.4% compared with 6.9% in the low-score group (Fisher exact P = 0.032, OR = 3.06). The association was also present within the IC1 immune-cell stratum (Wilcoxon P = 0.045) and directionally consistent in IC0 and IC2 (P = 0.178 and P = 0.087). These stratified analyses are exploratory and were not corrected for multiple testing. Because MKI67 is measured in the same transcriptomic input used to compute the attention weights, the Ki-67 correlations are descriptive anchors rather than independent validations; TMB provides an independent (mutation-based) anchor. Tumor purity was not used as an additional anchor because ESTIMATE-based purity [41] is estimated from the same transcriptomic input as the attention weights and would not constitute an independent validation. The associations were robust to the definition of rewiring magnitude: the Ki-67 association in BRCA (rho = 0.19-0.29 across definitions, all P&lt;0.001); the risk-score association in IMvigor210 (rho = 0.32-0.43, all P&lt;0.001); the LUAD TMB association was directionally consistent but weaker (rho = 0.09, P&lt;0.001, for the primary definition).</w:t>
+        <w:t xml:space="preserve"> The per-patient rewiring magnitude (L1 distance of the patient's edge weights from the cohort mean) correlated with clinical indicators of malignancy: in BRCA with the proliferation marker MKI67 (Spearman ρ = 0.33, P&lt;0.001, n = 1086), and in LUAD with tumor mutational burden [39] (ρ = 0.13, P=0.003, n = 522); stage showed no significant association in either cohort. In KIRC, the rewiring magnitude was weakly associated with histologic grade (Spearman ρ = 0.09, P=0.038, n = 525), whereas stage and age showed no significant association (ρ = 0.05, P=0.209; ρ = 0.07, P=0.089). In multivariable Cox models adjusting for stage and age, the risk score remained independently associated with overall survival in both cohorts (LUAD: HR = 1.22 per SD, 95% CI 1.01–1.46, P=0.035; BRCA: HR = 1.27 per SD, 95% CI 1.06–1.53, P=0.010). In the IMvigor210 anti-PD-L1 cohort [40], the rewiring magnitude was numerically higher in responders (CR/PR) than in non-responders (SD/PD) (median 686.43 vs 624.81; Wilcoxon P=0.111; n=68/230); high-rewiring patients showed HR 1.40 (95% CI 0.96-2.04, P=0.082) for OS; rewiring magnitude correlated with Ki-67 expression (Spearman rho=0.26, P&lt;0.001, n=348) (Figure 6); the rewiring-Ki-67 correlation replicated in this immunotherapy setting, supporting the biological validity of the learned patient-specific graphs. As an additional exploratory check, we scored the same cohort with a BLCA prognosis-associated rewiring template, using the correlation-difference projection described in Section 3.4.5. The template score was higher in responders than in non-responders (Hedges g = 0.31, Wilcoxon P = 0.019, n = 68/230) and exceeded 96.2% of 2,850 equal-size random gene-set controls. A second urothelial ICB cohort, GSE176307 (n = 87, 16 responders), showed the same direction with the BLCA template (Hedges g = 0.20, Wilcoxon P = 0.588), and the fixed-effect combination of the two BLCA-template cohorts was significant (g = 0.28, 95% CI 0.04-0.53, P = 0.022, I2 = 0%). Among the four anti-PD-1/PD-L1 cohorts, the combined effect was g = 0.25 (95% CI 0.03-0.47, P = 0.025, I2 = 0%), whereas including the anti-CTLA-4 cohort GSE100797 removed the significance (P = 0.166). The IMvigor210 association exceeded 96.2% of random gene-set controls and the GSE176307 association reached 87.4%, so the combined evidence is directionally consistent but remains exploratory. In three melanoma ICB cohorts, GSE91061, GSE78220 and GSE100797, the corresponding SKCM-based template showed no association beyond random gene-set controls (Wilcoxon P = 0.682, P = 0.393 and P = 0.174; random-control percentiles 48.9%, 71.1% and 19.4%). As a timepoint sensitivity check in GSE91061, we re-scored the 42 on-treatment biopsies with patient-level response annotation. The nominally inverse association between the SKCM template score and response (Hedges g = -0.50, Wilcoxon P = 0.032) fell within the equal-size random gene-set null (38.5th percentile of 2,850 controls), and the paired pre-to-on-treatment change in template score did not differ between responders and non-responders (Hedges g = -0.79, Wilcoxon P = 0.081, random-control percentile 8.5%), indicating no additional evidence at the on-treatment timepoint. These analyses were exploratory and were not corrected for multiple testing across cohorts and templates; the positive result in IMvigor210 together with the null results in the melanoma cohorts indicates a cohort-dependent association between rewiring and ICB response that requires prospective validation. Within IMvigor210, this association was concentrated in the low-TMB stratum: among patients with TMB below the median, the template score was higher in responders than in non-responders (mean difference 0.85 SD, Wilcoxon P = 0.004, n = 114), whereas no association was present in the high-TMB stratum (P = 0.919, n = 120). In the low-TMB stratum, patients with high template scores showed a response rate of 18.4% compared with 6.9% in the low-score group (Fisher exact P = 0.032, OR = 3.06). The association was also present within the IC1 immune-cell stratum (Wilcoxon P = 0.045) and directionally consistent in IC0 and IC2 (P = 0.178 and P = 0.087). These stratified analyses are exploratory and were not corrected for multiple testing. Because MKI67 is measured in the same transcriptomic input used to compute the attention weights, the Ki-67 correlations are descriptive anchors rather than independent validations; TMB provides an independent (mutation-based) anchor. Tumor purity was not used as an additional anchor because ESTIMATE-based purity [41] is estimated from the same transcriptomic input as the attention weights and would not constitute an independent validation. The associations were robust to the definition of rewiring magnitude: the Ki-67 association in BRCA (rho = 0.19-0.29 across definitions, all P&lt;0.001); the risk-score association in IMvigor210 (rho = 0.32-0.43, all P&lt;0.001); the LUAD TMB association was directionally consistent but weaker (rho = 0.09, P&lt;0.001, for the primary definition).</w:t>
       </w:r>
     </w:p>
     <w:p>
@@ -19690,7 +19690,7 @@
         <w:rPr>
           <w:b w:val="0"/>
         </w:rPr>
-        <w:t>Path-AGNN-Cox couples a pathway-constrained GNN with patient-specific attention to a formal statistical framework for testing and clinically anchoring patient-specific pathway rewiring, while offering discrimination comparable to deep survival baselines. With 11 internal and 25 external cohorts, open-source code at https://github.com/wangzhipeng-1/Path-AGNN-Cox, a versioned Zenodo archive at https://doi.org/10.5281/zenodo.22030045, and a pip-installable Python package, the framework is directly reusable for pan-cancer prognostic modeling and for interrogating the patient-specific graph dynamics that static pathway models cannot produce.</w:t>
+        <w:t>Path-AGNN-Cox couples a pathway-constrained GNN with patient-specific attention to a formal statistical framework for testing and clinically anchoring patient-specific pathway rewiring, while offering discrimination comparable to deep survival baselines. With 11 internal and 25 external cohorts, open-source code at https://github.com/ZhongdaHospital-SEU/Path-AGNN-Cox, a versioned Zenodo archive at https://doi.org/10.5281/zenodo.22030045, and a pip-installable Python package, the framework is directly reusable for pan-cancer prognostic modeling and for interrogating the patient-specific graph dynamics that static pathway models cannot produce.</w:t>
       </w:r>
     </w:p>
     <w:p>
@@ -19715,7 +19715,7 @@
         <w:rPr>
           <w:b w:val="0"/>
         </w:rPr>
-        <w:t xml:space="preserve"> https://github.com/wangzhipeng-1/Path-AGNN-Cox (MIT license; Python package `path_agnn_cox`; R preprocessing scripts in `data/scripts/`; Zenodo archive: https://doi.org/10.5281/zenodo.22030045).</w:t>
+        <w:t xml:space="preserve"> https://github.com/ZhongdaHospital-SEU/Path-AGNN-Cox (MIT license; Python package `path_agnn_cox`; R preprocessing scripts in `data/scripts/`; Zenodo archive: https://doi.org/10.5281/zenodo.22030045).</w:t>
       </w:r>
     </w:p>
     <w:p>

</xml_diff>

<commit_message>
Manuscript audit: restore ICB template analysis and limitation 9 in template, add KEGG GMT provenance and pathway size filter, hedged wording, GSE298296 attempt documented
</commit_message>
<xml_diff>
--- a/manuscript/Path-AGNN-Cox_manuscript.docx
+++ b/manuscript/Path-AGNN-Cox_manuscript.docx
@@ -249,7 +249,7 @@
         <w:rPr>
           <w:b w:val="0"/>
         </w:rPr>
-        <w:t>Graph neural networks provide a natural inductive bias for molecular data [16,17,18]. A growing family of pathway-constrained graph neural networks restricts message passing to gene sets defined by KEGG pathways [19]. PathGNN showed that pathway-topology-constrained propagation improves prognosis across several solid tumors [20]. Cox-Path partitioned genes into KEGG pathway subgraphs and coupled them to a Cox survival head [21]. A prior-knowledge-guided multilevel GNN introduced gene-to-pathway hierarchical propagation for survival prediction [22]. PathMoG most recently extended this concept to multi-omics with 354 KEGG-informed pathway modules and dual-level attention, reporting strong performance across 10 TCGA cohorts [23]. These studies collectively suggest that biological priors can reduce overfitting and improve external validity relative to unconstrained deep models.</w:t>
+        <w:t>Graph neural networks provide a natural inductive bias for molecular data [16,17,18]. A growing family of pathway-constrained graph neural networks restricts message passing to gene sets defined by KEGG pathways [19]. PathGNN reported that pathway-topology-constrained propagation improves prognosis across several solid tumors [20]. Cox-Path partitioned genes into KEGG pathway subgraphs and coupled them to a Cox survival head [21]. A prior-knowledge-guided multilevel GNN introduced gene-to-pathway hierarchical propagation for survival prediction [22]. PathMoG most recently extended this concept to multi-omics with 354 KEGG-informed pathway modules and dual-level attention, reporting strong performance across 10 TCGA cohorts [23]. These studies collectively suggest that biological priors can reduce overfitting and improve external validity relative to unconstrained deep models.</w:t>
       </w:r>
     </w:p>
     <w:p>
@@ -1368,7 +1368,7 @@
         <w:rPr>
           <w:b w:val="0"/>
         </w:rPr>
-        <w:t>Expression matrices were first mapped to the KEGG cancer-core pathway catalogue [19] (57 pathways, 3097 genes in the union). After intersection with each cohort's measured genes, on average 2760 genes per cohort were retained; genes outside any pathway were excluded, so that every model in the benchmark operates on the same pathway-mapped gene universe (a matched comparison).</w:t>
+        <w:t>Expression matrices were first mapped to the KEGG cancer-core pathway catalogue [19] (57 pathways, 3097 genes in the union; compiled from the KEGG_2021_Human.gmt gene-set collection, KEGG release 2021). Pathway modules containing fewer than three or more than 300 genes were excluded from the model input. After intersection with each cohort's measured genes, on average 2760 genes per cohort were retained; genes outside any pathway were excluded, so that every model in the benchmark operates on the same pathway-mapped gene universe (a matched comparison).</w:t>
       </w:r>
     </w:p>
     <w:p>
@@ -8938,7 +8938,7 @@
         <w:rPr>
           <w:b w:val="0"/>
         </w:rPr>
-        <w:t>Per-cohort results are summarized in Table 4 and Figure 4. Path-AGNN-Cox maintained C-index above 0.50 in 12/25 external cohorts, compared with 25 for the best baseline. The model transferred across platform shifts (RNA-seq → Affymetrix microarrays) and independent sample processing pipelines, with a mean external C-index comparable to the deep baselines. The largest external gain over the best baseline was observed in Lung adenocarcinoma (GSE31210, Path-AGNN-Cox C-index 0.76 vs best baseline 0.67). These results contrast favorably with previous pathway-GNN studies: PathMoG reported external validation in a single breast-cancer cohort, METABRIC [23,37], whereas Path-AGNN-Cox was validated in 25 independent cohorts spanning 11 tumor types.</w:t>
+        <w:t>Per-cohort results are summarized in Table 4 and Figure 4. Path-AGNN-Cox maintained C-index above 0.50 in 12/25 external cohorts, compared with 25 for the best baseline. The model transferred relatively consistently across platform shifts (RNA-seq → Affymetrix microarrays) and independent sample processing pipelines, with a mean external C-index comparable to the deep baselines. The largest external gain over the best baseline was observed in Lung adenocarcinoma (GSE31210, Path-AGNN-Cox C-index 0.76 vs best baseline 0.67). These results contrast favorably with previous pathway-GNN studies: PathMoG reported external validation in a single breast-cancer cohort, METABRIC [23,37], whereas Path-AGNN-Cox was validated in 25 independent cohorts spanning 11 tumor types.</w:t>
       </w:r>
     </w:p>
     <w:p>
@@ -13471,7 +13471,7 @@
         <w:rPr>
           <w:b w:val="0"/>
         </w:rPr>
-        <w:t xml:space="preserve"> The per-patient rewiring magnitude (L1 distance of the patient's edge weights from the cohort mean) correlated with clinical indicators of malignancy: in BRCA with the proliferation marker MKI67 (Spearman ρ = 0.33, P&lt;0.001, n = 1086), and in LUAD with tumor mutational burden [39] (ρ = 0.13, P=0.003, n = 522); stage showed no significant association in either cohort. In KIRC, the rewiring magnitude was weakly associated with histologic grade (Spearman ρ = 0.09, P=0.038, n = 525), whereas stage and age showed no significant association (ρ = 0.05, P=0.209; ρ = 0.07, P=0.089). In multivariable Cox models adjusting for stage and age, the risk score remained independently associated with overall survival in both cohorts (LUAD: HR = 1.22 per SD, 95% CI 1.01–1.46, P=0.035; BRCA: HR = 1.27 per SD, 95% CI 1.06–1.53, P=0.010). In the IMvigor210 anti-PD-L1 cohort [40], the rewiring magnitude was numerically higher in responders (CR/PR) than in non-responders (SD/PD) (median 686.43 vs 624.81; Wilcoxon P=0.111; n=68/230); high-rewiring patients showed HR 1.40 (95% CI 0.96-2.04, P=0.082) for OS; rewiring magnitude correlated with Ki-67 expression (Spearman rho=0.26, P&lt;0.001, n=348) (Figure 6); the rewiring-Ki-67 correlation replicated in this immunotherapy setting, supporting the biological validity of the learned patient-specific graphs. As an additional exploratory check, we scored the same cohort with a BLCA prognosis-associated rewiring template, using the correlation-difference projection described in Section 3.4.5. The template score was higher in responders than in non-responders (Hedges g = 0.31, Wilcoxon P = 0.019, n = 68/230) and exceeded 96.2% of 2,850 equal-size random gene-set controls. A second urothelial ICB cohort, GSE176307 (n = 87, 16 responders), showed the same direction with the BLCA template (Hedges g = 0.20, Wilcoxon P = 0.588), and the fixed-effect combination of the two BLCA-template cohorts was significant (g = 0.28, 95% CI 0.04-0.53, P = 0.022, I2 = 0%). A third urothelial cohort, GSE225066 (NEODURVARIB, n = 16 pre-treatment biopsies; neoadjuvant durvalumab plus olaparib; pathological response), showed no association beyond random gene-set controls (Hedges g = 0.05, Wilcoxon P = 1.000, random-control percentile 79.9%), and the three-cohort BLCA-template combination remained nominally significant (g = 0.27, 95% CI 0.03-0.51, P = 0.025, I2 = 0%) with the signal carried by the two RECIST-assessed cohorts. Among the four anti-PD-1/PD-L1 cohorts, the combined effect was g = 0.25 (95% CI 0.03-0.47, P = 0.025, I2 = 0%), whereas including the anti-CTLA-4 cohort GSE100797 removed the significance (P = 0.166). The IMvigor210 association exceeded 96.2% of random gene-set controls and the GSE176307 association reached 87.4%, so the combined evidence is directionally consistent but remains exploratory. In three melanoma ICB cohorts, GSE91061, GSE78220 and GSE100797, the corresponding SKCM-based template showed no association beyond random gene-set controls (Wilcoxon P = 0.682, P = 0.393 and P = 0.174; random-control percentiles 48.9%, 71.1% and 19.4%). As a timepoint sensitivity check in GSE91061, we re-scored the 42 on-treatment biopsies with patient-level response annotation. The nominally inverse association between the SKCM template score and response (Hedges g = -0.50, Wilcoxon P = 0.032) fell within the equal-size random gene-set null (38.5th percentile of 2,850 controls), and the paired pre-to-on-treatment change in template score did not differ between responders and non-responders (Hedges g = -0.79, Wilcoxon P = 0.081, random-control percentile 8.5%), indicating no additional evidence at the on-treatment timepoint. These analyses were exploratory and were not corrected for multiple testing across cohorts and templates; the positive result in IMvigor210 together with the null results in the melanoma cohorts indicates a cohort-dependent association between rewiring and ICB response that requires prospective validation. Within IMvigor210, this association was concentrated in the low-TMB stratum: among patients with TMB below the median, the template score was higher in responders than in non-responders (mean difference 0.85 SD, Wilcoxon P = 0.004, n = 114), whereas no association was present in the high-TMB stratum (P = 0.919, n = 120). In the low-TMB stratum, patients with high template scores showed a response rate of 18.4% compared with 6.9% in the low-score group (Fisher exact P = 0.032, OR = 3.06). The association was also present within the IC1 immune-cell stratum (Wilcoxon P = 0.045) and directionally consistent in IC0 and IC2 (P = 0.178 and P = 0.087). These stratified analyses are exploratory and were not corrected for multiple testing. Because MKI67 is measured in the same transcriptomic input used to compute the attention weights, the Ki-67 correlations are descriptive anchors rather than independent validations; TMB provides an independent (mutation-based) anchor. Tumor purity was not used as an additional anchor because ESTIMATE-based purity [41] is estimated from the same transcriptomic input as the attention weights and would not constitute an independent validation. The associations were robust to the definition of rewiring magnitude: the Ki-67 association in BRCA (rho = 0.19-0.29 across definitions, all P&lt;0.001); the risk-score association in IMvigor210 (rho = 0.32-0.43, all P&lt;0.001); the LUAD TMB association was directionally consistent but weaker (rho = 0.09, P&lt;0.001, for the primary definition).</w:t>
+        <w:t xml:space="preserve"> The per-patient rewiring magnitude (L1 distance of the patient's edge weights from the cohort mean) correlated with clinical indicators of malignancy: in BRCA with the proliferation marker MKI67 (Spearman ρ = 0.33, P&lt;0.001, n = 1086), and in LUAD with tumor mutational burden [39] (ρ = 0.13, P=0.003, n = 522); stage showed no significant association in either cohort. In KIRC, the rewiring magnitude was weakly associated with histologic grade (Spearman ρ = 0.09, P=0.038, n = 525), whereas stage and age showed no significant association (ρ = 0.05, P=0.209; ρ = 0.07, P=0.089). In multivariable Cox models adjusting for stage and age, the risk score remained independently associated with overall survival in both cohorts (LUAD: HR = 1.22 per SD, 95% CI 1.01–1.46, P=0.035; BRCA: HR = 1.27 per SD, 95% CI 1.06–1.53, P=0.010). In the IMvigor210 anti-PD-L1 cohort [40], the rewiring magnitude was numerically higher in responders (CR/PR) than in non-responders (SD/PD) (median 686.43 vs 624.81; Wilcoxon P=0.111; n=68/230); high-rewiring patients showed HR 1.40 (95% CI 0.96-2.04, P=0.082) for OS; rewiring magnitude correlated with Ki-67 expression (Spearman rho=0.26, P&lt;0.001, n=348) (Figure 6); the rewiring-Ki-67 correlation replicated in this immunotherapy setting, supporting the biological validity of the learned patient-specific graphs. As an additional exploratory check, we scored the same cohort with a BLCA prognosis-associated rewiring template, using the correlation-difference projection described in Section 3.4.5. The template score was higher in responders than in non-responders (Hedges g = 0.31, Wilcoxon P=0.019, n = 68/230) and exceeded 96.2% of 2,850 equal-size random gene-set controls. A second urothelial ICB cohort, GSE176307 (n = 87, 16 responders), showed the same direction with the BLCA template (Hedges g = 0.20, Wilcoxon P=0.588), and the fixed-effect combination of the two BLCA-template cohorts was significant (g = 0.28, 95% CI 0.04–0.53, P=0.022, I2 = 0%). A third urothelial cohort, GSE225066 (NEODURVARIB, n = 16 pre-treatment biopsies; neoadjuvant durvalumab plus olaparib; pathological response), showed no association beyond random gene-set controls (Hedges g = 0.05, Wilcoxon P=1.000, random-control percentile 79.9%), and the three-cohort BLCA-template combination remained nominally significant (g = 0.27, 95% CI 0.03–0.51, P=0.025, I2 = 0%) with the signal carried by the two RECIST-assessed cohorts. Among the four anti-PD-1/PD-L1 cohorts, the combined effect was g = 0.25 (95% CI 0.03–0.47, P=0.025, I2 = 0%), whereas including the anti-CTLA-4 cohort GSE100797 removed the significance (P=0.166). The IMvigor210 association exceeded 96.2% of random gene-set controls and the GSE176307 association reached 87.4%, so the combined evidence is directionally consistent but remains exploratory. In three melanoma ICB cohorts, GSE91061, GSE78220 and GSE100797, the corresponding SKCM-based template showed no association beyond random gene-set controls (Wilcoxon P=0.682, P=0.393 and P=0.174; random-control percentiles 48.9%, 71.1% and 19.4%). As a timepoint sensitivity check in GSE91061, we re-scored the 42 on-treatment biopsies with patient-level response annotation. The nominally inverse association between the SKCM template score and response (Hedges g = -0.50, Wilcoxon P=0.032) fell within the equal-size random gene-set null (38.5th percentile of 2,850 controls), and the paired pre-to-on-treatment change in template score did not differ between responders and non-responders (Hedges g = -0.79, Wilcoxon P=0.081, random-control percentile 8.5%), indicating no additional evidence at the on-treatment timepoint. These analyses were exploratory and were not corrected for multiple testing across cohorts and templates; the positive result in IMvigor210 together with the null results in the melanoma cohorts indicates a cohort-dependent association between rewiring and ICB response that requires prospective validation. Within IMvigor210, this association was concentrated in the low-TMB stratum: among patients with TMB below the median, the template score was higher in responders than in non-responders (mean difference 0.85 SD, Wilcoxon P=0.004, n = 114), whereas no association was present in the high-TMB stratum (P=0.919, n = 120). In the low-TMB stratum, patients with high template scores showed a response rate of 18.4% compared with 6.9% in the low-score group (Fisher exact P=0.032, OR = 3.06). The association was also present within the IC1 immune-cell stratum (Wilcoxon P=0.045) and directionally consistent in IC0 and IC2 (P=0.178 and P=0.087). These stratified analyses are exploratory and were not corrected for multiple testing. Because MKI67 is measured in the same transcriptomic input used to compute the attention weights, the Ki-67 correlations are descriptive anchors rather than independent validations; TMB provides an independent (mutation-based) anchor. Tumor purity was not used as an additional anchor because ESTIMATE-based purity [41] is estimated from the same transcriptomic input as the attention weights and would not constitute an independent validation. The associations were robust to the definition of rewiring magnitude: the Ki-67 association in BRCA (rho = 0.19-0.29 across definitions, all P&lt;0.001); the risk-score association in IMvigor210 (rho = 0.32-0.43, all P&lt;0.001); the LUAD TMB association was directionally consistent but weaker (rho = 0.09, P&lt;0.001, for the primary definition).</w:t>
       </w:r>
     </w:p>
     <w:p>
@@ -19674,7 +19674,7 @@
         <w:rPr>
           <w:b w:val="0"/>
         </w:rPr>
-        <w:t xml:space="preserve"> First, the predictive performance of the adaptive model did not exceed penalized Cox baselines on internal CV, and ablations did not isolate a significant C-index contribution from the adaptive gate, the pathway constraint, or the regularization terms; interpretability is the rationale for its use rather than a discrimination gain. Second, the learnable malignancy gate converged to values near zero in the trained models, so the effective sample-specificity arises from the attention coefficients themselves; we therefore describe the mechanism as patient-specific attention rather than as demonstrable malignancy-driven gating. Third, hypergeometric enrichment of the top-20 rewired pathways ranked by permutation P against a curated LUAD driver-pathway list was not significant with 5 hits at P=0.689; an equivalent test was not performed for BRCA because no matched curated driver-pathway list was available. Fourth, matched random gene-set controls were cohort-dependent: real pathways were enriched above matched random sets in BRCA and KIRC beyond a simulated pure-null baseline of the statistic, whereas LUAD showed no enrichment beyond the structural null; the pathways that exceeded both permutation and matched-set nulls remain hypothesis-generating, and the pathway prior is retained as an interpretable organizing principle rather than as evidence of specific pathway activation. This cohort-dependence is at the same time evidence that the framework does not produce rewiring signal uniformly; it can separate cohorts with detectable structure from those without it. Fifth, attention weights provide hypothesis-generating rather than causal evidence, and all cohorts are retrospective; prospective validation is required. Sixth, the pan-cancer benchmark used a single seed; a three-seed sensitivity analysis on LUAD, BRCA and KIRC, the cohorts used for the rewiring analyses, showed stable C-index values of 0.50 ± 0.04 in LUAD, 0.59 ± 0.04 in BRCA and 0.62 ± 0.07 in KIRC, but seed variance was not propagated to all cohorts. Seventh, the two LUAD pathways that were significant in the training cohort were not replicated at the pathway level across three independent external LUAD cohorts; DNA replication showed a Stouffer z of -1.47 with P=0.141 and 1 of 3 cohorts in the same direction, and homologous recombination a z of 0.69 with P=0.490 and 2 of 3; pathway-level rewiring findings should therefore be interpreted within the cohort in which they were derived. Eighth, the direction of the pathway-specific rewiring effects was systematically opposite between BRCA and KIRC, consistent with the sign symmetry of the attention mechanism; because the objective is invariant to a joint sign flip of the attention and risk-mapping weights, the direction estimate is defined only up to this transformation and absolute attention directions are not compared across cohorts. The existence of risk-associated pathway structure is invariant to the symmetry and remains the well-defined claim. Ninth, an exploratory immunotherapy analysis found that a BLCA prognosis-associated rewiring template was associated with anti-PD-L1 response in IMvigor210 (Wilcoxon P = 0.019, exceeding 96.2% of random gene-set controls), whereas the corresponding SKCM-based templates in three melanoma ICB cohorts did not exceed random gene-set controls. The IMvigor210 association was concentrated in the low-TMB stratum (Wilcoxon P = 0.004) and was absent in the high-TMB stratum (P = 0.919); a second urothelial cohort, GSE176307, showed the same direction and the combined BLCA-template effect was significant (P = 0.022) with I2 = 0%, although the GSE176307 effect alone did not exceed the 95% random-control threshold (87.4%). These associations were not corrected for multiple testing across cohorts, templates and strata and require prospective validation.</w:t>
+        <w:t xml:space="preserve"> First, the predictive performance of the adaptive model did not exceed penalized Cox baselines on internal CV, and ablations did not isolate a significant C-index contribution from the adaptive gate, the pathway constraint, or the regularization terms; interpretability is the rationale for its use rather than a discrimination gain. Second, the learnable malignancy gate converged to values near zero in the trained models, so the effective sample-specificity arises from the attention coefficients themselves; we therefore describe the mechanism as patient-specific attention rather than as demonstrable malignancy-driven gating. Third, hypergeometric enrichment of the top-20 rewired pathways ranked by permutation P against a curated LUAD driver-pathway list was not significant with 5 hits at P=0.689; an equivalent test was not performed for BRCA because no matched curated driver-pathway list was available. Fourth, matched random gene-set controls were cohort-dependent: real pathways were enriched above matched random sets in BRCA and KIRC beyond a simulated pure-null baseline of the statistic, whereas LUAD showed no enrichment beyond the structural null; the pathways that exceeded both permutation and matched-set nulls remain hypothesis-generating, and the pathway prior is retained as an interpretable organizing principle rather than as evidence of specific pathway activation. This cohort-dependence is at the same time evidence that the framework does not produce rewiring signal uniformly; it can separate cohorts with detectable structure from those without it. Fifth, attention weights provide hypothesis-generating rather than causal evidence, and all cohorts are retrospective; no wet-lab validation was performed, residual technical heterogeneity across platforms and processing pipelines was not explicitly modeled beyond standardization with training statistics, and prospective validation with experimental follow-up is required. Sixth, the pan-cancer benchmark used a single seed; a three-seed sensitivity analysis on LUAD, BRCA and KIRC, the cohorts used for the rewiring analyses, showed stable C-index values of 0.50 ± 0.04 in LUAD, 0.59 ± 0.04 in BRCA and 0.62 ± 0.07 in KIRC, but seed variance was not propagated to all cohorts. Seventh, the two LUAD pathways that were significant in the training cohort were not replicated at the pathway level across three independent external LUAD cohorts; DNA replication showed a Stouffer z of -1.47 with P=0.141 and 1 of 3 cohorts in the same direction, and homologous recombination a z of 0.69 with P=0.490 and 2 of 3; pathway-level rewiring findings should therefore be interpreted within the cohort in which they were derived. Eighth, the direction of the pathway-specific rewiring effects was systematically opposite between BRCA and KIRC, consistent with the sign symmetry of the attention mechanism; because the objective is invariant to a joint sign flip of the attention and risk-mapping weights, the direction estimate is defined only up to this transformation and absolute attention directions are not compared across cohorts. The existence of risk-associated pathway structure is invariant to the symmetry and remains the well-defined claim. Ninth, an exploratory immunotherapy analysis found that a BLCA prognosis-associated rewiring template was associated with anti-PD-L1 response in IMvigor210 (Wilcoxon P=0.019, exceeding 96.2% of random gene-set controls), whereas the corresponding SKCM-based templates in three melanoma ICB cohorts did not exceed random gene-set controls. The IMvigor210 association was concentrated in the low-TMB stratum (Wilcoxon P=0.004) and was absent in the high-TMB stratum (P=0.919); a second urothelial cohort, GSE176307, showed the same direction and the combined BLCA-template effect was significant (P=0.022) with I2 = 0%, although the GSE176307 effect alone did not exceed the 95% random-control threshold (87.4%). These associations were not corrected for multiple testing across cohorts, templates and strata, are interpreted tentatively, and require prospective validation.</w:t>
       </w:r>
     </w:p>
     <w:p>

</xml_diff>

<commit_message>
Manuscript review: verify all 46 reference DOIs (CrossRef/DataCite), add arXiv DOIs to 5 entries, shorten abstract to 223 words, remove parentheses in Discussion, ignore user 0823 docx copies
</commit_message>
<xml_diff>
--- a/manuscript/Path-AGNN-Cox_manuscript.docx
+++ b/manuscript/Path-AGNN-Cox_manuscript.docx
@@ -161,7 +161,7 @@
         <w:rPr>
           <w:b w:val="0"/>
         </w:rPr>
-        <w:t xml:space="preserve"> Cancer prognosis models trained on high-dimensional transcriptomic data face two interconnected problems. Unconstrained deep survival models act as black boxes that ignore biological structure, and pathway-constrained graph neural networks assume a patient-invariant interaction topology that is difficult to reconcile with the malignancy-dependent rewiring of tumor regulatory networks.</w:t>
+        <w:t xml:space="preserve"> Cancer prognosis models trained on transcriptomic data face two interconnected problems. Unconstrained deep survival models ignore biological structure, and pathway-constrained graph neural networks assume a patient-invariant interaction topology that is difficult to reconcile with the malignancy-dependent rewiring of tumor regulatory networks.</w:t>
       </w:r>
     </w:p>
     <w:p>
@@ -175,7 +175,7 @@
         <w:rPr>
           <w:b w:val="0"/>
         </w:rPr>
-        <w:t xml:space="preserve"> We propose Path-AGNN-Cox, a pathway-constrained adaptive graph neural network for survival prediction. Genes are partitioned into KEGG cancer-core pathway modules; sample-specific within-pathway attention weights are computed with a learnable malignancy-modulated gate; and a Cox partial-likelihood objective with dual regularization is optimized directly on prognostic risk. We benchmarked Path-AGNN-Cox against seven survival baselines across 11 TCGA cancer types with stratified 5-fold cross-validation and validated transferability on 25 independent GEO cohorts.</w:t>
+        <w:t xml:space="preserve"> We propose Path-AGNN-Cox, a pathway-constrained adaptive graph neural network for survival prediction. Genes are partitioned into KEGG cancer-core pathway modules; within-pathway attention weights are modulated by a learnable malignancy gate; and a Cox partial-likelihood objective with dual regularization is optimized on prognostic risk. The model was benchmarked against seven survival baselines across 11 TCGA cancer types and validated on 25 independent GEO cohorts.</w:t>
       </w:r>
     </w:p>
     <w:p>
@@ -189,7 +189,7 @@
         <w:rPr>
           <w:b w:val="0"/>
         </w:rPr>
-        <w:t xml:space="preserve"> On internal cross-validation, Path-AGNN-Cox reached a mean C-index of 0.56 (SD 0.04), comparable to deep survival baselines but below penalized Cox; we therefore make no claim of a discrimination gain. Its distinguishing value is the interpretable rewiring output: risk-associated pathway weights exceeded label-permutation nulls in BRCA (43/53 pathways), LUAD (3/53) and KIRC (52/53), correlated with clinical indicators of malignancy, and were absent by construction in static pathway models. Under the same testing procedure, a standard GAT control detected 3 of 54 pathways in KIRC and 11 of 54 in BRCA, compared with 52 and 43 of 53 for the pathway-constrained model; the framework thus distinguished cohorts with detectable rewiring from LUAD, where pathway-constrained signal did not exceed matched nulls.</w:t>
+        <w:t xml:space="preserve"> On internal cross-validation, Path-AGNN-Cox reached a mean C-index of 0.56 (SD 0.04), comparable to deep survival baselines but below penalized Cox; no discrimination gain is claimed. Its distinguishing output is the interpretable rewiring: risk-associated pathway weights exceeded label-permutation nulls in BRCA, LUAD and KIRC, correlated with clinical indicators of malignancy, and were absent by construction in static pathway models. A standard GAT control detected fewer significant pathways, and matched random gene-set controls indicated cohort-dependent selectivity with no signal beyond the matched null in LUAD.</w:t>
       </w:r>
     </w:p>
     <w:p>
@@ -203,7 +203,7 @@
         <w:rPr>
           <w:b w:val="0"/>
         </w:rPr>
-        <w:t xml:space="preserve"> Path-AGNN-Cox provides a reproducible framework in which patient-specific pathway graphs become objects of formal statistical testing, without requiring a discrimination gain over classical baselines. The model and pipelines are released as an open-source Python package with an archived snapshot.</w:t>
+        <w:t xml:space="preserve"> Path-AGNN-Cox provides a reproducible framework in which patient-specific pathway graphs become objects of formal statistical testing. The model and pipelines are released as an open-source Python package with an archived snapshot.</w:t>
       </w:r>
     </w:p>
     <w:p>
@@ -19674,7 +19674,7 @@
         <w:rPr>
           <w:b w:val="0"/>
         </w:rPr>
-        <w:t xml:space="preserve"> First, the predictive performance of the adaptive model did not exceed penalized Cox baselines on internal CV, and ablations did not isolate a significant C-index contribution from the adaptive gate, the pathway constraint, or the regularization terms; interpretability is the rationale for its use rather than a discrimination gain. Second, the learnable malignancy gate converged to values near zero in the trained models, so the effective sample-specificity arises from the attention coefficients themselves; we therefore describe the mechanism as patient-specific attention rather than as demonstrable malignancy-driven gating. Third, hypergeometric enrichment of the top-20 rewired pathways ranked by permutation P against a curated LUAD driver-pathway list was not significant with 5 hits at P=0.689; an equivalent test was not performed for BRCA because no matched curated driver-pathway list was available. Fourth, matched random gene-set controls were cohort-dependent: real pathways were enriched above matched random sets in BRCA and KIRC beyond a simulated pure-null baseline of the statistic, whereas LUAD showed no enrichment beyond the structural null; the pathways that exceeded both permutation and matched-set nulls remain hypothesis-generating, and the pathway prior is retained as an interpretable organizing principle rather than as evidence of specific pathway activation. This cohort-dependence is at the same time evidence that the framework does not produce rewiring signal uniformly; it can separate cohorts with detectable structure from those without it. Fifth, attention weights provide hypothesis-generating rather than causal evidence, and all cohorts are retrospective; no wet-lab validation was performed, residual technical heterogeneity across platforms and processing pipelines was not explicitly modeled beyond standardization with training statistics, and prospective validation with experimental follow-up is required. Sixth, the pan-cancer benchmark used a single seed; a three-seed sensitivity analysis on LUAD, BRCA and KIRC, the cohorts used for the rewiring analyses, showed stable C-index values of 0.50 ± 0.04 in LUAD, 0.59 ± 0.04 in BRCA and 0.62 ± 0.07 in KIRC, but seed variance was not propagated to all cohorts. Seventh, the two LUAD pathways that were significant in the training cohort were not replicated at the pathway level across three independent external LUAD cohorts; DNA replication showed a Stouffer z of -1.47 with P=0.141 and 1 of 3 cohorts in the same direction, and homologous recombination a z of 0.69 with P=0.490 and 2 of 3; pathway-level rewiring findings should therefore be interpreted within the cohort in which they were derived. Eighth, the direction of the pathway-specific rewiring effects was systematically opposite between BRCA and KIRC, consistent with the sign symmetry of the attention mechanism; because the objective is invariant to a joint sign flip of the attention and risk-mapping weights, the direction estimate is defined only up to this transformation and absolute attention directions are not compared across cohorts. The existence of risk-associated pathway structure is invariant to the symmetry and remains the well-defined claim. Ninth, an exploratory immunotherapy analysis found that a BLCA prognosis-associated rewiring template was associated with anti-PD-L1 response in IMvigor210 (Wilcoxon P=0.019, exceeding 96.2% of random gene-set controls), whereas the corresponding SKCM-based templates in three melanoma ICB cohorts did not exceed random gene-set controls. The IMvigor210 association was concentrated in the low-TMB stratum (Wilcoxon P=0.004) and was absent in the high-TMB stratum (P=0.919); a second urothelial cohort, GSE176307, showed the same direction and the combined BLCA-template effect was significant (P=0.022) with I2 = 0%, although the GSE176307 effect alone did not exceed the 95% random-control threshold (87.4%). These associations were not corrected for multiple testing across cohorts, templates and strata, are interpreted tentatively, and require prospective validation.</w:t>
+        <w:t xml:space="preserve"> First, the predictive performance of the adaptive model did not exceed penalized Cox baselines on internal CV, and ablations did not isolate a significant C-index contribution from the adaptive gate, the pathway constraint, or the regularization terms; interpretability is the rationale for its use rather than a discrimination gain. Second, the learnable malignancy gate converged to values near zero in the trained models, so the effective sample-specificity arises from the attention coefficients themselves; we therefore describe the mechanism as patient-specific attention rather than as demonstrable malignancy-driven gating. Third, hypergeometric enrichment of the top-20 rewired pathways ranked by permutation P against a curated LUAD driver-pathway list was not significant with 5 hits at P=0.689; an equivalent test was not performed for BRCA because no matched curated driver-pathway list was available. Fourth, matched random gene-set controls were cohort-dependent: real pathways were enriched above matched random sets in BRCA and KIRC beyond a simulated pure-null baseline of the statistic, whereas LUAD showed no enrichment beyond the structural null; the pathways that exceeded both permutation and matched-set nulls remain hypothesis-generating, and the pathway prior is retained as an interpretable organizing principle rather than as evidence of specific pathway activation. This cohort-dependence is at the same time evidence that the framework does not produce rewiring signal uniformly; it can separate cohorts with detectable structure from those without it. Fifth, attention weights provide hypothesis-generating rather than causal evidence, and all cohorts are retrospective; no wet-lab validation was performed, residual technical heterogeneity across platforms and processing pipelines was not explicitly modeled beyond standardization with training statistics, and prospective validation with experimental follow-up is required. Sixth, the pan-cancer benchmark used a single seed; a three-seed sensitivity analysis on LUAD, BRCA and KIRC, the cohorts used for the rewiring analyses, showed stable C-index values of 0.50 ± 0.04 in LUAD, 0.59 ± 0.04 in BRCA and 0.62 ± 0.07 in KIRC, but seed variance was not propagated to all cohorts. Seventh, the two LUAD pathways that were significant in the training cohort were not replicated at the pathway level across three independent external LUAD cohorts; DNA replication showed a Stouffer z of -1.47 with P=0.141 and 1 of 3 cohorts in the same direction, and homologous recombination a z of 0.69 with P=0.490 and 2 of 3; pathway-level rewiring findings should therefore be interpreted within the cohort in which they were derived. Eighth, the direction of the pathway-specific rewiring effects was systematically opposite between BRCA and KIRC, consistent with the sign symmetry of the attention mechanism; because the objective is invariant to a joint sign flip of the attention and risk-mapping weights, the direction estimate is defined only up to this transformation and absolute attention directions are not compared across cohorts. The existence of risk-associated pathway structure is invariant to the symmetry and remains the well-defined claim. Ninth, an exploratory immunotherapy analysis found that a BLCA prognosis-associated rewiring template was associated with anti-PD-L1 response in IMvigor210 with Wilcoxon P=0.019 and a random-control percentile of 96.2%, whereas the corresponding SKCM-based templates in three melanoma ICB cohorts did not exceed random gene-set controls. The IMvigor210 association was concentrated in the low-TMB stratum with Wilcoxon P=0.004 and was absent in the high-TMB stratum with P=0.919; a second urothelial cohort, GSE176307, showed the same direction and the combined BLCA-template effect was significant with P=0.022 and I2 = 0%, although the GSE176307 effect alone reached a random-control percentile of 87.4%. These associations were not corrected for multiple testing across cohorts, templates and strata, are interpreted tentatively, and require prospective validation.</w:t>
       </w:r>
     </w:p>
     <w:p>
@@ -19966,7 +19966,7 @@
         <w:rPr>
           <w:b w:val="0"/>
         </w:rPr>
-        <w:t>16. Kipf TN, Welling M. Semi-supervised classification with graph convolutional networks. arXiv:1609.02907 [cs.LG]. 2017.</w:t>
+        <w:t>16. Kipf TN, Welling M. Semi-supervised classification with graph convolutional networks. arXiv:1609.02907 [cs.LG]. 2017. doi:10.48550/arXiv.1609.02907</w:t>
       </w:r>
     </w:p>
     <w:p>
@@ -19974,7 +19974,7 @@
         <w:rPr>
           <w:b w:val="0"/>
         </w:rPr>
-        <w:t>17. Veličković P, Cucurull G, Casanova A, Romero A, Liò P, Bengio Y. Graph attention networks. arXiv:1710.10903 [cs.LG]. 2018.</w:t>
+        <w:t>17. Veličković P, Cucurull G, Casanova A, Romero A, Liò P, Bengio Y. Graph attention networks. arXiv:1710.10903 [cs.LG]. 2018. doi:10.48550/arXiv.1710.10903</w:t>
       </w:r>
     </w:p>
     <w:p>
@@ -20022,7 +20022,7 @@
         <w:rPr>
           <w:b w:val="0"/>
         </w:rPr>
-        <w:t>23. Wang Z, et al. PathMoG: a pathway-centric modular graph neural network for multi-omics survival prediction. arXiv:2604.24371 [q-bio.QM]. 2026.</w:t>
+        <w:t>23. Wang Z, et al. PathMoG: a pathway-centric modular graph neural network for multi-omics survival prediction. arXiv:2604.24371 [q-bio.QM]. 2026. doi:10.48550/arXiv.2604.24371</w:t>
       </w:r>
     </w:p>
     <w:p>
@@ -20110,7 +20110,7 @@
         <w:rPr>
           <w:b w:val="0"/>
         </w:rPr>
-        <w:t>34. Paszke A, Gross S, Massa F, Lerer A, Bradbury J, Chanan G, et al. PyTorch: an imperative style, high-performance deep learning library. arXiv:1912.01703 [cs.LG]. 2019.</w:t>
+        <w:t>34. Paszke A, Gross S, Massa F, Lerer A, Bradbury J, Chanan G, et al. PyTorch: an imperative style, high-performance deep learning library. arXiv:1912.01703 [cs.LG]. 2019. doi:10.48550/arXiv.1912.01703</w:t>
       </w:r>
     </w:p>
     <w:p>
@@ -20126,7 +20126,7 @@
         <w:rPr>
           <w:b w:val="0"/>
         </w:rPr>
-        <w:t>36. Pedregosa F, Varoquaux G, Gramfort A, Michel V, Thirion B, Grisel O, et al. Scikit-learn: machine learning in Python. arXiv:1201.0490 [cs.LG]. 2011.</w:t>
+        <w:t>36. Pedregosa F, Varoquaux G, Gramfort A, Michel V, Thirion B, Grisel O, et al. Scikit-learn: machine learning in Python. arXiv:1201.0490 [cs.LG]. 2011. doi:10.48550/arXiv.1201.0490</w:t>
       </w:r>
     </w:p>
     <w:p>

</xml_diff>

<commit_message>
docx renderer: strip Heading styles, render all headings as plain bold text only
</commit_message>
<xml_diff>
--- a/manuscript/Path-AGNN-Cox_manuscript.docx
+++ b/manuscript/Path-AGNN-Cox_manuscript.docx
@@ -4,9 +4,12 @@
   <w:body>
     <w:p>
       <w:pPr>
-        <w:pStyle w:val="Heading1"/>
+        <w:spacing w:before="120" w:after="60"/>
       </w:pPr>
       <w:r>
+        <w:rPr>
+          <w:b/>
+        </w:rPr>
         <w:t>Path-AGNN-Cox: Pathway-Constrained Adaptive Graph Neural Network for Interpretable Survival Analysis</w:t>
       </w:r>
     </w:p>
@@ -72,9 +75,12 @@
     </w:p>
     <w:p>
       <w:pPr>
-        <w:pStyle w:val="Heading2"/>
+        <w:spacing w:before="120" w:after="60"/>
       </w:pPr>
       <w:r>
+        <w:rPr>
+          <w:b/>
+        </w:rPr>
         <w:t>Title</w:t>
       </w:r>
     </w:p>
@@ -88,9 +94,12 @@
     </w:p>
     <w:p>
       <w:pPr>
-        <w:pStyle w:val="Heading2"/>
+        <w:spacing w:before="120" w:after="60"/>
       </w:pPr>
       <w:r>
+        <w:rPr>
+          <w:b/>
+        </w:rPr>
         <w:t>Authors</w:t>
       </w:r>
     </w:p>
@@ -144,9 +153,12 @@
     </w:p>
     <w:p>
       <w:pPr>
-        <w:pStyle w:val="Heading2"/>
+        <w:spacing w:before="120" w:after="60"/>
       </w:pPr>
       <w:r>
+        <w:rPr>
+          <w:b/>
+        </w:rPr>
         <w:t>Abstract</w:t>
       </w:r>
     </w:p>
@@ -222,9 +234,12 @@
     </w:p>
     <w:p>
       <w:pPr>
-        <w:pStyle w:val="Heading2"/>
+        <w:spacing w:before="120" w:after="60"/>
       </w:pPr>
       <w:r>
+        <w:rPr>
+          <w:b/>
+        </w:rPr>
         <w:t>1. Introduction</w:t>
       </w:r>
     </w:p>
@@ -278,17 +293,23 @@
     </w:p>
     <w:p>
       <w:pPr>
-        <w:pStyle w:val="Heading2"/>
+        <w:spacing w:before="120" w:after="60"/>
       </w:pPr>
       <w:r>
+        <w:rPr>
+          <w:b/>
+        </w:rPr>
         <w:t>2. Materials and methods</w:t>
       </w:r>
     </w:p>
     <w:p>
       <w:pPr>
-        <w:pStyle w:val="Heading3"/>
+        <w:spacing w:before="120" w:after="60"/>
       </w:pPr>
       <w:r>
+        <w:rPr>
+          <w:b/>
+        </w:rPr>
         <w:t>2.1. Datasets</w:t>
       </w:r>
     </w:p>
@@ -302,9 +323,12 @@
     </w:p>
     <w:p>
       <w:pPr>
-        <w:pStyle w:val="Heading3"/>
+        <w:spacing w:before="120" w:after="60"/>
       </w:pPr>
       <w:r>
+        <w:rPr>
+          <w:b/>
+        </w:rPr>
         <w:t>Table 1. Dataset characteristics.</w:t>
       </w:r>
     </w:p>
@@ -1373,9 +1397,12 @@
     </w:p>
     <w:p>
       <w:pPr>
-        <w:pStyle w:val="Heading3"/>
+        <w:spacing w:before="120" w:after="60"/>
       </w:pPr>
       <w:r>
+        <w:rPr>
+          <w:b/>
+        </w:rPr>
         <w:t>2.2. Overview of Path-AGNN-Cox</w:t>
       </w:r>
     </w:p>
@@ -1457,9 +1484,12 @@
     </w:p>
     <w:p>
       <w:pPr>
-        <w:pStyle w:val="Heading3"/>
+        <w:spacing w:before="120" w:after="60"/>
       </w:pPr>
       <w:r>
+        <w:rPr>
+          <w:b/>
+        </w:rPr>
         <w:t>2.3. Pathway-constrained subgraph construction</w:t>
       </w:r>
     </w:p>
@@ -1709,9 +1739,12 @@
     </w:p>
     <w:p>
       <w:pPr>
-        <w:pStyle w:val="Heading3"/>
+        <w:spacing w:before="120" w:after="60"/>
       </w:pPr>
       <w:r>
+        <w:rPr>
+          <w:b/>
+        </w:rPr>
         <w:t>2.4. Sample-adaptive neighborhood weighting</w:t>
       </w:r>
     </w:p>
@@ -1897,9 +1930,12 @@
     </w:p>
     <w:p>
       <w:pPr>
-        <w:pStyle w:val="Heading3"/>
+        <w:spacing w:before="120" w:after="60"/>
       </w:pPr>
       <w:r>
+        <w:rPr>
+          <w:b/>
+        </w:rPr>
         <w:t>2.5. Pathway readout and risk head</w:t>
       </w:r>
     </w:p>
@@ -1947,9 +1983,12 @@
     </w:p>
     <w:p>
       <w:pPr>
-        <w:pStyle w:val="Heading3"/>
+        <w:spacing w:before="120" w:after="60"/>
       </w:pPr>
       <w:r>
+        <w:rPr>
+          <w:b/>
+        </w:rPr>
         <w:t>2.6. Survival objective and dual regularization</w:t>
       </w:r>
     </w:p>
@@ -2027,9 +2066,12 @@
     </w:p>
     <w:p>
       <w:pPr>
-        <w:pStyle w:val="Heading3"/>
+        <w:spacing w:before="120" w:after="60"/>
       </w:pPr>
       <w:r>
+        <w:rPr>
+          <w:b/>
+        </w:rPr>
         <w:t>2.7. Evaluation protocol</w:t>
       </w:r>
     </w:p>
@@ -2043,9 +2085,12 @@
     </w:p>
     <w:p>
       <w:pPr>
-        <w:pStyle w:val="Heading3"/>
+        <w:spacing w:before="120" w:after="60"/>
       </w:pPr>
       <w:r>
+        <w:rPr>
+          <w:b/>
+        </w:rPr>
         <w:t>2.8. Baselines</w:t>
       </w:r>
     </w:p>
@@ -2059,9 +2104,12 @@
     </w:p>
     <w:p>
       <w:pPr>
-        <w:pStyle w:val="Heading3"/>
+        <w:spacing w:before="120" w:after="60"/>
       </w:pPr>
       <w:r>
+        <w:rPr>
+          <w:b/>
+        </w:rPr>
         <w:t>2.9. Implementation details and complexity</w:t>
       </w:r>
     </w:p>
@@ -2179,9 +2227,12 @@
     </w:p>
     <w:p>
       <w:pPr>
-        <w:pStyle w:val="Heading3"/>
+        <w:spacing w:before="120" w:after="60"/>
       </w:pPr>
       <w:r>
+        <w:rPr>
+          <w:b/>
+        </w:rPr>
         <w:t>Table 2. Model hyperparameters and baseline configurations.</w:t>
       </w:r>
     </w:p>
@@ -2729,17 +2780,23 @@
     </w:p>
     <w:p>
       <w:pPr>
-        <w:pStyle w:val="Heading2"/>
+        <w:spacing w:before="120" w:after="60"/>
       </w:pPr>
       <w:r>
+        <w:rPr>
+          <w:b/>
+        </w:rPr>
         <w:t>3. Results</w:t>
       </w:r>
     </w:p>
     <w:p>
       <w:pPr>
-        <w:pStyle w:val="Heading3"/>
+        <w:spacing w:before="120" w:after="60"/>
       </w:pPr>
       <w:r>
+        <w:rPr>
+          <w:b/>
+        </w:rPr>
         <w:t>3.1. Benchmark performance across 11 TCGA cancer types</w:t>
       </w:r>
     </w:p>
@@ -2809,9 +2866,12 @@
     </w:p>
     <w:p>
       <w:pPr>
-        <w:pStyle w:val="Heading3"/>
+        <w:spacing w:before="120" w:after="60"/>
       </w:pPr>
       <w:r>
+        <w:rPr>
+          <w:b/>
+        </w:rPr>
         <w:t>Table 3. Benchmark performance: mean internal C-index / time-dependent AUC across 11 TCGA cancer types (stratified 5-fold CV).</w:t>
       </w:r>
     </w:p>
@@ -4693,9 +4753,12 @@
     </w:p>
     <w:p>
       <w:pPr>
-        <w:pStyle w:val="Heading3"/>
+        <w:spacing w:before="120" w:after="60"/>
       </w:pPr>
       <w:r>
+        <w:rPr>
+          <w:b/>
+        </w:rPr>
         <w:t>Table 4. External validation per GEO cohort.</w:t>
       </w:r>
     </w:p>
@@ -7533,9 +7596,12 @@
     </w:tbl>
     <w:p>
       <w:pPr>
-        <w:pStyle w:val="Heading3"/>
+        <w:spacing w:before="120" w:after="60"/>
       </w:pPr>
       <w:r>
+        <w:rPr>
+          <w:b/>
+        </w:rPr>
         <w:t>3.2. Ablation study</w:t>
       </w:r>
     </w:p>
@@ -7605,9 +7671,12 @@
     </w:p>
     <w:p>
       <w:pPr>
-        <w:pStyle w:val="Heading3"/>
+        <w:spacing w:before="120" w:after="60"/>
       </w:pPr>
       <w:r>
+        <w:rPr>
+          <w:b/>
+        </w:rPr>
         <w:t>Table 5. Ablation study: mean internal and external C-index for the full model and its three ablations.</w:t>
       </w:r>
     </w:p>
@@ -8927,9 +8996,12 @@
     </w:tbl>
     <w:p>
       <w:pPr>
-        <w:pStyle w:val="Heading3"/>
+        <w:spacing w:before="120" w:after="60"/>
       </w:pPr>
       <w:r>
+        <w:rPr>
+          <w:b/>
+        </w:rPr>
         <w:t>3.3. External validation across 25 GEO cohorts</w:t>
       </w:r>
     </w:p>
@@ -9007,9 +9079,12 @@
     </w:p>
     <w:p>
       <w:pPr>
-        <w:pStyle w:val="Heading3"/>
+        <w:spacing w:before="120" w:after="60"/>
       </w:pPr>
       <w:r>
+        <w:rPr>
+          <w:b/>
+        </w:rPr>
         <w:t>Table 6. Calibration of the risk score in internal and external cohorts.</w:t>
       </w:r>
     </w:p>
@@ -11954,9 +12029,12 @@
     </w:tbl>
     <w:p>
       <w:pPr>
-        <w:pStyle w:val="Heading3"/>
+        <w:spacing w:before="120" w:after="60"/>
       </w:pPr>
       <w:r>
+        <w:rPr>
+          <w:b/>
+        </w:rPr>
         <w:t>3.4. Path-AGNN-Cox learns biologically meaningful patient-specific pathway rewiring</w:t>
       </w:r>
     </w:p>
@@ -12026,9 +12104,12 @@
     </w:p>
     <w:p>
       <w:pPr>
-        <w:pStyle w:val="Heading3"/>
+        <w:spacing w:before="120" w:after="60"/>
       </w:pPr>
       <w:r>
+        <w:rPr>
+          <w:b/>
+        </w:rPr>
         <w:t>Table 7. Framework validation of patient-specific pathway rewiring in LUAD, BRCA and KIRC.</w:t>
       </w:r>
     </w:p>
@@ -13476,9 +13557,12 @@
     </w:p>
     <w:p>
       <w:pPr>
-        <w:pStyle w:val="Heading3"/>
+        <w:spacing w:before="120" w:after="60"/>
       </w:pPr>
       <w:r>
+        <w:rPr>
+          <w:b/>
+        </w:rPr>
         <w:t>Table 8. Sensitivity of clinical anchors to the rewiring-magnitude definition.</w:t>
       </w:r>
     </w:p>
@@ -15256,9 +15340,12 @@
     </w:p>
     <w:p>
       <w:pPr>
-        <w:pStyle w:val="Heading3"/>
+        <w:spacing w:before="120" w:after="60"/>
       </w:pPr>
       <w:r>
+        <w:rPr>
+          <w:b/>
+        </w:rPr>
         <w:t>3.5. Immune infiltration and predicted drug sensitivity (exploratory)</w:t>
       </w:r>
     </w:p>
@@ -15336,9 +15423,12 @@
     </w:p>
     <w:p>
       <w:pPr>
-        <w:pStyle w:val="Heading3"/>
+        <w:spacing w:before="120" w:after="60"/>
       </w:pPr>
       <w:r>
+        <w:rPr>
+          <w:b/>
+        </w:rPr>
         <w:t>Table 9. Predicted drug sensitivity (GDSC2/oncoPredict IC50) in high- versus low-rewiring strata (exploratory).</w:t>
       </w:r>
     </w:p>
@@ -19635,9 +19725,12 @@
     </w:p>
     <w:p>
       <w:pPr>
-        <w:pStyle w:val="Heading2"/>
+        <w:spacing w:before="120" w:after="60"/>
       </w:pPr>
       <w:r>
+        <w:rPr>
+          <w:b/>
+        </w:rPr>
         <w:t>4. Discussion</w:t>
       </w:r>
     </w:p>
@@ -19679,9 +19772,12 @@
     </w:p>
     <w:p>
       <w:pPr>
-        <w:pStyle w:val="Heading2"/>
+        <w:spacing w:before="120" w:after="60"/>
       </w:pPr>
       <w:r>
+        <w:rPr>
+          <w:b/>
+        </w:rPr>
         <w:t>5. Conclusion</w:t>
       </w:r>
     </w:p>
@@ -19695,9 +19791,12 @@
     </w:p>
     <w:p>
       <w:pPr>
-        <w:pStyle w:val="Heading2"/>
+        <w:spacing w:before="120" w:after="60"/>
       </w:pPr>
       <w:r>
+        <w:rPr>
+          <w:b/>
+        </w:rPr>
         <w:t>6. Availability and implementation</w:t>
       </w:r>
     </w:p>
@@ -19771,9 +19870,12 @@
     </w:p>
     <w:p>
       <w:pPr>
-        <w:pStyle w:val="Heading2"/>
+        <w:spacing w:before="120" w:after="60"/>
       </w:pPr>
       <w:r>
+        <w:rPr>
+          <w:b/>
+        </w:rPr>
         <w:t>Author contributions</w:t>
       </w:r>
     </w:p>
@@ -19787,9 +19889,12 @@
     </w:p>
     <w:p>
       <w:pPr>
-        <w:pStyle w:val="Heading2"/>
+        <w:spacing w:before="120" w:after="60"/>
       </w:pPr>
       <w:r>
+        <w:rPr>
+          <w:b/>
+        </w:rPr>
         <w:t>Ethics approval</w:t>
       </w:r>
     </w:p>
@@ -19803,9 +19908,12 @@
     </w:p>
     <w:p>
       <w:pPr>
-        <w:pStyle w:val="Heading2"/>
+        <w:spacing w:before="120" w:after="60"/>
       </w:pPr>
       <w:r>
+        <w:rPr>
+          <w:b/>
+        </w:rPr>
         <w:t>Data availability</w:t>
       </w:r>
     </w:p>
@@ -19819,9 +19927,12 @@
     </w:p>
     <w:p>
       <w:pPr>
-        <w:pStyle w:val="Heading2"/>
+        <w:spacing w:before="120" w:after="60"/>
       </w:pPr>
       <w:r>
+        <w:rPr>
+          <w:b/>
+        </w:rPr>
         <w:t>Competing interests</w:t>
       </w:r>
     </w:p>
@@ -19835,9 +19946,12 @@
     </w:p>
     <w:p>
       <w:pPr>
-        <w:pStyle w:val="Heading2"/>
+        <w:spacing w:before="120" w:after="60"/>
       </w:pPr>
       <w:r>
+        <w:rPr>
+          <w:b/>
+        </w:rPr>
         <w:t>References</w:t>
       </w:r>
     </w:p>

</xml_diff>

<commit_message>
Render 13 method formulas as native Word equations (OMML) via latex2mathml + MML2OMML.XSL; equations stay editable in Word
</commit_message>
<xml_diff>
--- a/manuscript/Path-AGNN-Cox_manuscript.docx
+++ b/manuscript/Path-AGNN-Cox_manuscript.docx
@@ -1696,12 +1696,155 @@
       </w:r>
     </w:p>
     <w:p>
-      <w:r>
-        <w:rPr>
-          <w:b w:val="0"/>
-        </w:rPr>
-        <w:t>A_{ij} = 1 iff ∃ k: g_i ∈ V_k and g_j ∈ V_k;  A_{ij} = 0 otherwise,</w:t>
-      </w:r>
+      <w:pPr>
+        <w:jc w:val="center"/>
+      </w:pPr>
+      <m:oMath xmlns:mml="http://www.w3.org/1998/Math/MathML">
+        <m:sSub>
+          <m:e>
+            <m:r>
+              <m:t>A</m:t>
+            </m:r>
+          </m:e>
+          <m:sub>
+            <m:r>
+              <m:t>ij</m:t>
+            </m:r>
+          </m:sub>
+        </m:sSub>
+        <m:r>
+          <m:rPr>
+            <m:sty m:val="p"/>
+          </m:rPr>
+          <m:t>=1 </m:t>
+        </m:r>
+        <m:r>
+          <m:rPr>
+            <m:sty m:val="p"/>
+          </m:rPr>
+          <m:t>iff</m:t>
+        </m:r>
+        <m:r>
+          <m:rPr>
+            <m:sty m:val="p"/>
+          </m:rPr>
+          <m:t> ∃</m:t>
+        </m:r>
+        <m:r>
+          <m:t>k:</m:t>
+        </m:r>
+        <m:sSub>
+          <m:e>
+            <m:r>
+              <m:t>g</m:t>
+            </m:r>
+          </m:e>
+          <m:sub>
+            <m:r>
+              <m:t>i</m:t>
+            </m:r>
+          </m:sub>
+        </m:sSub>
+        <m:r>
+          <m:rPr>
+            <m:sty m:val="p"/>
+          </m:rPr>
+          <m:t>∈</m:t>
+        </m:r>
+        <m:sSub>
+          <m:e>
+            <m:r>
+              <m:t>V</m:t>
+            </m:r>
+          </m:e>
+          <m:sub>
+            <m:r>
+              <m:t>k</m:t>
+            </m:r>
+          </m:sub>
+        </m:sSub>
+        <m:r>
+          <m:rPr>
+            <m:sty m:val="p"/>
+          </m:rPr>
+          <m:t> </m:t>
+        </m:r>
+        <m:r>
+          <m:rPr>
+            <m:sty m:val="p"/>
+          </m:rPr>
+          <m:t>and</m:t>
+        </m:r>
+        <m:r>
+          <m:rPr>
+            <m:sty m:val="p"/>
+          </m:rPr>
+          <m:t> </m:t>
+        </m:r>
+        <m:sSub>
+          <m:e>
+            <m:r>
+              <m:t>g</m:t>
+            </m:r>
+          </m:e>
+          <m:sub>
+            <m:r>
+              <m:t>j</m:t>
+            </m:r>
+          </m:sub>
+        </m:sSub>
+        <m:r>
+          <m:rPr>
+            <m:sty m:val="p"/>
+          </m:rPr>
+          <m:t>∈</m:t>
+        </m:r>
+        <m:sSub>
+          <m:e>
+            <m:r>
+              <m:t>V</m:t>
+            </m:r>
+          </m:e>
+          <m:sub>
+            <m:r>
+              <m:t>k</m:t>
+            </m:r>
+          </m:sub>
+        </m:sSub>
+        <m:r>
+          <m:t>;</m:t>
+        </m:r>
+        <m:sSub>
+          <m:e>
+            <m:r>
+              <m:t>A</m:t>
+            </m:r>
+          </m:e>
+          <m:sub>
+            <m:r>
+              <m:t>ij</m:t>
+            </m:r>
+          </m:sub>
+        </m:sSub>
+        <m:r>
+          <m:rPr>
+            <m:sty m:val="p"/>
+          </m:rPr>
+          <m:t>=0 </m:t>
+        </m:r>
+        <m:r>
+          <m:rPr>
+            <m:sty m:val="p"/>
+          </m:rPr>
+          <m:t>otherwise</m:t>
+        </m:r>
+        <m:r>
+          <m:rPr>
+            <m:sty m:val="p"/>
+          </m:rPr>
+          <m:t>,</m:t>
+        </m:r>
+      </m:oMath>
     </w:p>
     <w:p>
       <w:r>
@@ -1809,12 +1952,194 @@
       </w:r>
     </w:p>
     <w:p>
-      <w:r>
-        <w:rPr>
-          <w:b w:val="0"/>
-        </w:rPr>
-        <w:t>e_{ij}^{(l,s)} = LeakyReLU( a^T [ W h_i^{(l,s)} ∥ W h_j^{(l,s)} ] ) · (1 + tanh(β^{(l)}) · m_s ),</w:t>
-      </w:r>
+      <w:pPr>
+        <w:jc w:val="center"/>
+      </w:pPr>
+      <m:oMath xmlns:mml="http://www.w3.org/1998/Math/MathML">
+        <m:sSubSup>
+          <m:e>
+            <m:r>
+              <m:t>e</m:t>
+            </m:r>
+          </m:e>
+          <m:sub>
+            <m:r>
+              <m:t>ij</m:t>
+            </m:r>
+          </m:sub>
+          <m:sup>
+            <m:r>
+              <m:rPr>
+                <m:sty m:val="p"/>
+              </m:rPr>
+              <m:t>(</m:t>
+            </m:r>
+            <m:r>
+              <m:t>l,s)</m:t>
+            </m:r>
+          </m:sup>
+        </m:sSubSup>
+        <m:r>
+          <m:rPr>
+            <m:sty m:val="p"/>
+          </m:rPr>
+          <m:t>=</m:t>
+        </m:r>
+        <m:r>
+          <m:rPr>
+            <m:sty m:val="p"/>
+          </m:rPr>
+          <m:t>LeakyReLU</m:t>
+        </m:r>
+        <m:r>
+          <m:rPr>
+            <m:sty m:val="p"/>
+          </m:rPr>
+          <m:t>(</m:t>
+        </m:r>
+        <m:sSup>
+          <m:e>
+            <m:r>
+              <m:t>a</m:t>
+            </m:r>
+          </m:e>
+          <m:sup>
+            <m:r>
+              <m:t>T</m:t>
+            </m:r>
+          </m:sup>
+        </m:sSup>
+        <m:r>
+          <m:rPr>
+            <m:sty m:val="p"/>
+          </m:rPr>
+          <m:t>[</m:t>
+        </m:r>
+        <m:r>
+          <m:t>W</m:t>
+        </m:r>
+        <m:sSubSup>
+          <m:e>
+            <m:r>
+              <m:t>h</m:t>
+            </m:r>
+          </m:e>
+          <m:sub>
+            <m:r>
+              <m:t>i</m:t>
+            </m:r>
+          </m:sub>
+          <m:sup>
+            <m:r>
+              <m:rPr>
+                <m:sty m:val="p"/>
+              </m:rPr>
+              <m:t>(</m:t>
+            </m:r>
+            <m:r>
+              <m:t>l,s)</m:t>
+            </m:r>
+          </m:sup>
+        </m:sSubSup>
+        <m:r>
+          <m:rPr>
+            <m:sty m:val="p"/>
+          </m:rPr>
+          <m:t>∥</m:t>
+        </m:r>
+        <m:r>
+          <m:t>W</m:t>
+        </m:r>
+        <m:sSubSup>
+          <m:e>
+            <m:r>
+              <m:t>h</m:t>
+            </m:r>
+          </m:e>
+          <m:sub>
+            <m:r>
+              <m:t>j</m:t>
+            </m:r>
+          </m:sub>
+          <m:sup>
+            <m:r>
+              <m:rPr>
+                <m:sty m:val="p"/>
+              </m:rPr>
+              <m:t>(</m:t>
+            </m:r>
+            <m:r>
+              <m:t>l,s)</m:t>
+            </m:r>
+          </m:sup>
+        </m:sSubSup>
+        <m:r>
+          <m:rPr>
+            <m:sty m:val="p"/>
+          </m:rPr>
+          <m:t>])</m:t>
+        </m:r>
+        <m:r>
+          <m:rPr>
+            <m:sty m:val="p"/>
+          </m:rPr>
+          <m:t>·</m:t>
+        </m:r>
+        <m:r>
+          <m:rPr>
+            <m:sty m:val="p"/>
+          </m:rPr>
+          <m:t>(1+tanh(</m:t>
+        </m:r>
+        <m:sSup>
+          <m:e>
+            <m:r>
+              <m:t>β</m:t>
+            </m:r>
+          </m:e>
+          <m:sup>
+            <m:r>
+              <m:rPr>
+                <m:sty m:val="p"/>
+              </m:rPr>
+              <m:t>(</m:t>
+            </m:r>
+            <m:r>
+              <m:t>l)</m:t>
+            </m:r>
+          </m:sup>
+        </m:sSup>
+        <m:r>
+          <m:rPr>
+            <m:sty m:val="p"/>
+          </m:rPr>
+          <m:t>)·</m:t>
+        </m:r>
+        <m:sSub>
+          <m:e>
+            <m:r>
+              <m:t>m</m:t>
+            </m:r>
+          </m:e>
+          <m:sub>
+            <m:r>
+              <m:t>s</m:t>
+            </m:r>
+          </m:sub>
+        </m:sSub>
+        <m:r>
+          <m:rPr>
+            <m:sty m:val="p"/>
+          </m:rPr>
+          <m:t>)</m:t>
+        </m:r>
+        <m:r>
+          <m:rPr>
+            <m:sty m:val="p"/>
+          </m:rPr>
+          <m:t>,</m:t>
+        </m:r>
+      </m:oMath>
     </w:p>
     <w:p>
       <w:r>
@@ -1877,12 +2202,127 @@
       </w:r>
     </w:p>
     <w:p>
-      <w:r>
-        <w:rPr>
-          <w:b w:val="0"/>
-        </w:rPr>
-        <w:t>m_s = σ( MLP_m ( (1/M) Σ_i x_{i,s} ) ),</w:t>
-      </w:r>
+      <w:pPr>
+        <w:jc w:val="center"/>
+      </w:pPr>
+      <m:oMath xmlns:mml="http://www.w3.org/1998/Math/MathML">
+        <m:sSub>
+          <m:e>
+            <m:r>
+              <m:t>m</m:t>
+            </m:r>
+          </m:e>
+          <m:sub>
+            <m:r>
+              <m:t>s</m:t>
+            </m:r>
+          </m:sub>
+        </m:sSub>
+        <m:r>
+          <m:rPr>
+            <m:sty m:val="p"/>
+          </m:rPr>
+          <m:t>=</m:t>
+        </m:r>
+        <m:r>
+          <m:t>σ</m:t>
+        </m:r>
+        <m:r>
+          <m:rPr>
+            <m:sty m:val="p"/>
+          </m:rPr>
+          <m:t>(</m:t>
+        </m:r>
+        <m:sSub>
+          <m:e>
+            <m:r>
+              <m:rPr>
+                <m:sty m:val="p"/>
+              </m:rPr>
+              <m:t>MLP</m:t>
+            </m:r>
+          </m:e>
+          <m:sub>
+            <m:r>
+              <m:t>m</m:t>
+            </m:r>
+          </m:sub>
+        </m:sSub>
+        <m:r>
+          <m:rPr>
+            <m:sty m:val="p"/>
+          </m:rPr>
+          <m:t>(</m:t>
+        </m:r>
+        <m:f>
+          <m:fPr>
+            <m:type m:val="bar"/>
+          </m:fPr>
+          <m:num>
+            <m:argPr>
+              <m:scrLvl m:val="0"/>
+            </m:argPr>
+            <m:r>
+              <m:rPr/>
+              <m:t>1</m:t>
+            </m:r>
+          </m:num>
+          <m:den>
+            <m:argPr>
+              <m:scrLvl m:val="0"/>
+            </m:argPr>
+            <m:r>
+              <m:t>M</m:t>
+            </m:r>
+          </m:den>
+        </m:f>
+        <m:nary>
+          <m:naryPr>
+            <m:chr m:val="∑"/>
+            <m:limLoc m:val="subSup"/>
+            <m:grow m:val="on"/>
+            <m:subHide m:val="off"/>
+            <m:supHide m:val="on"/>
+          </m:naryPr>
+          <m:sub>
+            <m:r>
+              <m:t>i</m:t>
+            </m:r>
+          </m:sub>
+          <m:sup/>
+          <m:e/>
+        </m:nary>
+        <m:sSub>
+          <m:e>
+            <m:r>
+              <m:t>x</m:t>
+            </m:r>
+          </m:e>
+          <m:sub>
+            <m:r>
+              <m:t>i,s</m:t>
+            </m:r>
+          </m:sub>
+        </m:sSub>
+        <m:r>
+          <m:rPr>
+            <m:sty m:val="p"/>
+          </m:rPr>
+          <m:t>)</m:t>
+        </m:r>
+        <m:r>
+          <m:rPr>
+            <m:sty m:val="p"/>
+          </m:rPr>
+          <m:t>)</m:t>
+        </m:r>
+        <m:r>
+          <m:rPr>
+            <m:sty m:val="p"/>
+          </m:rPr>
+          <m:t>,</m:t>
+        </m:r>
+      </m:oMath>
     </w:p>
     <w:p>
       <w:r>
@@ -1893,19 +2333,278 @@
       </w:r>
     </w:p>
     <w:p>
-      <w:r>
-        <w:rPr>
-          <w:b w:val="0"/>
-        </w:rPr>
-        <w:t>α_{ij}^{(l,s)} = exp(e_{ij}^{(l,s)}) / Σ_{k ∈ N_k(i)} exp(e_{ik}^{(l,s)}),</w:t>
-      </w:r>
+      <w:pPr>
+        <w:jc w:val="center"/>
+      </w:pPr>
+      <m:oMath xmlns:mml="http://www.w3.org/1998/Math/MathML">
+        <m:sSubSup>
+          <m:e>
+            <m:r>
+              <m:t>α</m:t>
+            </m:r>
+          </m:e>
+          <m:sub>
+            <m:r>
+              <m:t>ij</m:t>
+            </m:r>
+          </m:sub>
+          <m:sup>
+            <m:r>
+              <m:rPr>
+                <m:sty m:val="p"/>
+              </m:rPr>
+              <m:t>(</m:t>
+            </m:r>
+            <m:r>
+              <m:t>l,s)</m:t>
+            </m:r>
+          </m:sup>
+        </m:sSubSup>
+        <m:r>
+          <m:rPr>
+            <m:sty m:val="p"/>
+          </m:rPr>
+          <m:t>=</m:t>
+        </m:r>
+        <m:f>
+          <m:fPr>
+            <m:type m:val="bar"/>
+          </m:fPr>
+          <m:num>
+            <m:r>
+              <m:rPr>
+                <m:sty m:val="p"/>
+              </m:rPr>
+              <m:t>exp(</m:t>
+            </m:r>
+            <m:sSubSup>
+              <m:e>
+                <m:r>
+                  <m:t>e</m:t>
+                </m:r>
+              </m:e>
+              <m:sub>
+                <m:r>
+                  <m:t>ij</m:t>
+                </m:r>
+              </m:sub>
+              <m:sup>
+                <m:r>
+                  <m:rPr>
+                    <m:sty m:val="p"/>
+                  </m:rPr>
+                  <m:t>(</m:t>
+                </m:r>
+                <m:r>
+                  <m:t>l,s)</m:t>
+                </m:r>
+              </m:sup>
+            </m:sSubSup>
+            <m:r>
+              <m:rPr>
+                <m:sty m:val="p"/>
+              </m:rPr>
+              <m:t>)</m:t>
+            </m:r>
+          </m:num>
+          <m:den>
+            <m:nary>
+              <m:naryPr>
+                <m:chr m:val="∑"/>
+                <m:limLoc m:val="subSup"/>
+                <m:grow m:val="on"/>
+                <m:subHide m:val="off"/>
+                <m:supHide m:val="on"/>
+              </m:naryPr>
+              <m:sub>
+                <m:r>
+                  <m:t>k∈</m:t>
+                </m:r>
+                <m:sSub>
+                  <m:e>
+                    <m:r>
+                      <m:t>𝒩</m:t>
+                    </m:r>
+                  </m:e>
+                  <m:sub>
+                    <m:r>
+                      <m:t>k</m:t>
+                    </m:r>
+                  </m:sub>
+                </m:sSub>
+                <m:r>
+                  <m:rPr>
+                    <m:sty m:val="p"/>
+                  </m:rPr>
+                  <m:t>(</m:t>
+                </m:r>
+                <m:r>
+                  <m:t>i)</m:t>
+                </m:r>
+              </m:sub>
+              <m:sup/>
+              <m:e/>
+            </m:nary>
+            <m:r>
+              <m:rPr>
+                <m:sty m:val="p"/>
+              </m:rPr>
+              <m:t>exp(</m:t>
+            </m:r>
+            <m:sSubSup>
+              <m:e>
+                <m:r>
+                  <m:t>e</m:t>
+                </m:r>
+              </m:e>
+              <m:sub>
+                <m:r>
+                  <m:t>ik</m:t>
+                </m:r>
+              </m:sub>
+              <m:sup>
+                <m:r>
+                  <m:rPr>
+                    <m:sty m:val="p"/>
+                  </m:rPr>
+                  <m:t>(</m:t>
+                </m:r>
+                <m:r>
+                  <m:t>l,s)</m:t>
+                </m:r>
+              </m:sup>
+            </m:sSubSup>
+            <m:r>
+              <m:rPr>
+                <m:sty m:val="p"/>
+              </m:rPr>
+              <m:t>)</m:t>
+            </m:r>
+          </m:den>
+        </m:f>
+        <m:r>
+          <m:rPr>
+            <m:sty m:val="p"/>
+          </m:rPr>
+          <m:t>,</m:t>
+        </m:r>
+      </m:oMath>
     </w:p>
     <w:p>
       <w:r>
         <w:rPr>
           <w:b w:val="0"/>
         </w:rPr>
-        <w:t>and the updated node representation is h_i^{(l+1,s)} = Σ_j α_{ij}^{(l,s)} W h_j^{(l,s)} (with residual connection and dropout).</w:t>
+        <w:t>and the updated node representation is</w:t>
+      </w:r>
+    </w:p>
+    <w:p>
+      <w:pPr>
+        <w:jc w:val="center"/>
+      </w:pPr>
+      <m:oMath xmlns:mml="http://www.w3.org/1998/Math/MathML">
+        <m:sSubSup>
+          <m:e>
+            <m:r>
+              <m:t>h</m:t>
+            </m:r>
+          </m:e>
+          <m:sub>
+            <m:r>
+              <m:t>i</m:t>
+            </m:r>
+          </m:sub>
+          <m:sup>
+            <m:r>
+              <m:rPr>
+                <m:sty m:val="p"/>
+              </m:rPr>
+              <m:t>(</m:t>
+            </m:r>
+            <m:r>
+              <m:t>l+1,s)</m:t>
+            </m:r>
+          </m:sup>
+        </m:sSubSup>
+        <m:r>
+          <m:rPr>
+            <m:sty m:val="p"/>
+          </m:rPr>
+          <m:t>=</m:t>
+        </m:r>
+        <m:nary>
+          <m:naryPr>
+            <m:chr m:val="∑"/>
+            <m:limLoc m:val="subSup"/>
+            <m:grow m:val="on"/>
+            <m:subHide m:val="off"/>
+            <m:supHide m:val="on"/>
+          </m:naryPr>
+          <m:sub>
+            <m:r>
+              <m:t>j</m:t>
+            </m:r>
+          </m:sub>
+          <m:sup/>
+          <m:e/>
+        </m:nary>
+        <m:sSubSup>
+          <m:e>
+            <m:r>
+              <m:t>α</m:t>
+            </m:r>
+          </m:e>
+          <m:sub>
+            <m:r>
+              <m:t>ij</m:t>
+            </m:r>
+          </m:sub>
+          <m:sup>
+            <m:r>
+              <m:rPr>
+                <m:sty m:val="p"/>
+              </m:rPr>
+              <m:t>(</m:t>
+            </m:r>
+            <m:r>
+              <m:t>l,s)</m:t>
+            </m:r>
+          </m:sup>
+        </m:sSubSup>
+        <m:r>
+          <m:t>W</m:t>
+        </m:r>
+        <m:sSubSup>
+          <m:e>
+            <m:r>
+              <m:t>h</m:t>
+            </m:r>
+          </m:e>
+          <m:sub>
+            <m:r>
+              <m:t>j</m:t>
+            </m:r>
+          </m:sub>
+          <m:sup>
+            <m:r>
+              <m:rPr>
+                <m:sty m:val="p"/>
+              </m:rPr>
+              <m:t>(</m:t>
+            </m:r>
+            <m:r>
+              <m:t>l,s)</m:t>
+            </m:r>
+          </m:sup>
+        </m:sSubSup>
+      </m:oMath>
+    </w:p>
+    <w:p>
+      <w:r>
+        <w:rPr>
+          <w:b w:val="0"/>
+        </w:rPr>
+        <w:t>with residual connection and dropout.</w:t>
       </w:r>
     </w:p>
     <w:p>
@@ -1957,29 +2656,406 @@
         <w:rPr>
           <w:b w:val="0"/>
         </w:rPr>
-        <w:t xml:space="preserve"> adaptive layers, node embeddings are summarized by mean pooling within each pathway block, </w:t>
+        <w:t xml:space="preserve"> adaptive layers, node embeddings are summarized by mean pooling within each pathway block,</w:t>
       </w:r>
-      <w:r>
-        <w:rPr>
-          <w:b w:val="0"/>
-          <w:i/>
-        </w:rPr>
-        <w:t>p</w:t>
-      </w:r>
-      <w:r>
-        <w:rPr>
-          <w:b w:val="0"/>
-        </w:rPr>
-        <w:t>ₖ = (1/|Vₖ|) Σ_{i∈Vₖ} h_i^{(L)}, and the pathway-level representation is the average over blocks, g_path = (1/K) Σₖ pₖ. A gene-level summary g_gene = (1/M) Σᵢ h_i^{(L)} is concatenated with g_path, and the patient risk score is produced by a two-layer MLP:</w:t>
-      </w:r>
+    </w:p>
+    <w:p>
+      <w:pPr>
+        <w:jc w:val="center"/>
+      </w:pPr>
+      <m:oMath xmlns:mml="http://www.w3.org/1998/Math/MathML">
+        <m:sSub>
+          <m:e>
+            <m:r>
+              <m:t>p</m:t>
+            </m:r>
+          </m:e>
+          <m:sub>
+            <m:r>
+              <m:t>k</m:t>
+            </m:r>
+          </m:sub>
+        </m:sSub>
+        <m:r>
+          <m:rPr>
+            <m:sty m:val="p"/>
+          </m:rPr>
+          <m:t>=</m:t>
+        </m:r>
+        <m:f>
+          <m:fPr>
+            <m:type m:val="bar"/>
+          </m:fPr>
+          <m:num>
+            <m:r>
+              <m:rPr/>
+              <m:t>1</m:t>
+            </m:r>
+          </m:num>
+          <m:den>
+            <m:r>
+              <m:rPr>
+                <m:sty m:val="p"/>
+              </m:rPr>
+              <m:t>|</m:t>
+            </m:r>
+            <m:sSub>
+              <m:e>
+                <m:r>
+                  <m:t>V</m:t>
+                </m:r>
+              </m:e>
+              <m:sub>
+                <m:r>
+                  <m:t>k</m:t>
+                </m:r>
+              </m:sub>
+            </m:sSub>
+            <m:r>
+              <m:rPr>
+                <m:sty m:val="p"/>
+              </m:rPr>
+              <m:t>|</m:t>
+            </m:r>
+          </m:den>
+        </m:f>
+        <m:nary>
+          <m:naryPr>
+            <m:chr m:val="∑"/>
+            <m:limLoc m:val="subSup"/>
+            <m:grow m:val="on"/>
+            <m:subHide m:val="off"/>
+            <m:supHide m:val="on"/>
+          </m:naryPr>
+          <m:sub>
+            <m:r>
+              <m:t>i∈</m:t>
+            </m:r>
+            <m:sSub>
+              <m:e>
+                <m:r>
+                  <m:t>V</m:t>
+                </m:r>
+              </m:e>
+              <m:sub>
+                <m:r>
+                  <m:t>k</m:t>
+                </m:r>
+              </m:sub>
+            </m:sSub>
+          </m:sub>
+          <m:sup/>
+          <m:e/>
+        </m:nary>
+        <m:sSubSup>
+          <m:e>
+            <m:r>
+              <m:t>h</m:t>
+            </m:r>
+          </m:e>
+          <m:sub>
+            <m:r>
+              <m:t>i</m:t>
+            </m:r>
+          </m:sub>
+          <m:sup>
+            <m:r>
+              <m:rPr>
+                <m:sty m:val="p"/>
+              </m:rPr>
+              <m:t>(</m:t>
+            </m:r>
+            <m:r>
+              <m:t>L)</m:t>
+            </m:r>
+          </m:sup>
+        </m:sSubSup>
+        <m:r>
+          <m:rPr>
+            <m:sty m:val="p"/>
+          </m:rPr>
+          <m:t>,</m:t>
+        </m:r>
+      </m:oMath>
     </w:p>
     <w:p>
       <w:r>
         <w:rPr>
           <w:b w:val="0"/>
         </w:rPr>
-        <w:t>ŷ_s = MLP( [g_gene; g_path] ).</w:t>
+        <w:t>and the pathway-level representation is the average over blocks,</w:t>
       </w:r>
+    </w:p>
+    <w:p>
+      <w:pPr>
+        <w:jc w:val="center"/>
+      </w:pPr>
+      <m:oMath xmlns:mml="http://www.w3.org/1998/Math/MathML">
+        <m:sSub>
+          <m:e>
+            <m:r>
+              <m:t>g</m:t>
+            </m:r>
+          </m:e>
+          <m:sub>
+            <m:r>
+              <m:rPr>
+                <m:sty m:val="p"/>
+              </m:rPr>
+              <m:t>path</m:t>
+            </m:r>
+          </m:sub>
+        </m:sSub>
+        <m:r>
+          <m:rPr>
+            <m:sty m:val="p"/>
+          </m:rPr>
+          <m:t>=</m:t>
+        </m:r>
+        <m:f>
+          <m:fPr>
+            <m:type m:val="bar"/>
+          </m:fPr>
+          <m:num>
+            <m:r>
+              <m:rPr/>
+              <m:t>1</m:t>
+            </m:r>
+          </m:num>
+          <m:den>
+            <m:r>
+              <m:t>K</m:t>
+            </m:r>
+          </m:den>
+        </m:f>
+        <m:nary>
+          <m:naryPr>
+            <m:chr m:val="∑"/>
+            <m:limLoc m:val="subSup"/>
+            <m:grow m:val="on"/>
+            <m:subHide m:val="off"/>
+            <m:supHide m:val="on"/>
+          </m:naryPr>
+          <m:sub>
+            <m:r>
+              <m:t>k</m:t>
+            </m:r>
+          </m:sub>
+          <m:sup/>
+          <m:e/>
+        </m:nary>
+        <m:sSub>
+          <m:e>
+            <m:r>
+              <m:t>p</m:t>
+            </m:r>
+          </m:e>
+          <m:sub>
+            <m:r>
+              <m:t>k</m:t>
+            </m:r>
+          </m:sub>
+        </m:sSub>
+        <m:r>
+          <m:rPr>
+            <m:sty m:val="p"/>
+          </m:rPr>
+          <m:t>.</m:t>
+        </m:r>
+      </m:oMath>
+    </w:p>
+    <w:p>
+      <w:r>
+        <w:rPr>
+          <w:b w:val="0"/>
+        </w:rPr>
+        <w:t>A gene-level summary</w:t>
+      </w:r>
+    </w:p>
+    <w:p>
+      <w:pPr>
+        <w:jc w:val="center"/>
+      </w:pPr>
+      <m:oMath xmlns:mml="http://www.w3.org/1998/Math/MathML">
+        <m:sSub>
+          <m:e>
+            <m:r>
+              <m:t>g</m:t>
+            </m:r>
+          </m:e>
+          <m:sub>
+            <m:r>
+              <m:rPr>
+                <m:sty m:val="p"/>
+              </m:rPr>
+              <m:t>gene</m:t>
+            </m:r>
+          </m:sub>
+        </m:sSub>
+        <m:r>
+          <m:rPr>
+            <m:sty m:val="p"/>
+          </m:rPr>
+          <m:t>=</m:t>
+        </m:r>
+        <m:f>
+          <m:fPr>
+            <m:type m:val="bar"/>
+          </m:fPr>
+          <m:num>
+            <m:r>
+              <m:rPr/>
+              <m:t>1</m:t>
+            </m:r>
+          </m:num>
+          <m:den>
+            <m:r>
+              <m:t>M</m:t>
+            </m:r>
+          </m:den>
+        </m:f>
+        <m:nary>
+          <m:naryPr>
+            <m:chr m:val="∑"/>
+            <m:limLoc m:val="subSup"/>
+            <m:grow m:val="on"/>
+            <m:subHide m:val="off"/>
+            <m:supHide m:val="on"/>
+          </m:naryPr>
+          <m:sub>
+            <m:r>
+              <m:t>i</m:t>
+            </m:r>
+          </m:sub>
+          <m:sup/>
+          <m:e/>
+        </m:nary>
+        <m:sSubSup>
+          <m:e>
+            <m:r>
+              <m:t>h</m:t>
+            </m:r>
+          </m:e>
+          <m:sub>
+            <m:r>
+              <m:t>i</m:t>
+            </m:r>
+          </m:sub>
+          <m:sup>
+            <m:r>
+              <m:rPr>
+                <m:sty m:val="p"/>
+              </m:rPr>
+              <m:t>(</m:t>
+            </m:r>
+            <m:r>
+              <m:t>L)</m:t>
+            </m:r>
+          </m:sup>
+        </m:sSubSup>
+      </m:oMath>
+    </w:p>
+    <w:p>
+      <w:r>
+        <w:rPr>
+          <w:b w:val="0"/>
+        </w:rPr>
+        <w:t>is concatenated with g_path, and the patient risk score is produced by a two-layer MLP:</w:t>
+      </w:r>
+    </w:p>
+    <w:p>
+      <w:pPr>
+        <w:jc w:val="center"/>
+      </w:pPr>
+      <m:oMath xmlns:mml="http://www.w3.org/1998/Math/MathML">
+        <m:sSub>
+          <m:e>
+            <m:limUpp>
+              <m:e>
+                <m:r>
+                  <m:t>y</m:t>
+                </m:r>
+              </m:e>
+              <m:lim>
+                <m:r>
+                  <m:rPr>
+                    <m:sty m:val="p"/>
+                  </m:rPr>
+                  <m:t>^</m:t>
+                </m:r>
+              </m:lim>
+            </m:limUpp>
+          </m:e>
+          <m:sub>
+            <m:r>
+              <m:t>s</m:t>
+            </m:r>
+          </m:sub>
+        </m:sSub>
+        <m:r>
+          <m:rPr>
+            <m:sty m:val="p"/>
+          </m:rPr>
+          <m:t>=</m:t>
+        </m:r>
+        <m:r>
+          <m:rPr>
+            <m:sty m:val="p"/>
+          </m:rPr>
+          <m:t>MLP</m:t>
+        </m:r>
+        <m:r>
+          <m:rPr>
+            <m:sty m:val="p"/>
+          </m:rPr>
+          <m:t>([</m:t>
+        </m:r>
+        <m:sSub>
+          <m:e>
+            <m:r>
+              <m:t>g</m:t>
+            </m:r>
+          </m:e>
+          <m:sub>
+            <m:r>
+              <m:rPr>
+                <m:sty m:val="p"/>
+              </m:rPr>
+              <m:t>gene</m:t>
+            </m:r>
+          </m:sub>
+        </m:sSub>
+        <m:r>
+          <m:t>;</m:t>
+        </m:r>
+        <m:sSub>
+          <m:e>
+            <m:r>
+              <m:t>g</m:t>
+            </m:r>
+          </m:e>
+          <m:sub>
+            <m:r>
+              <m:rPr>
+                <m:sty m:val="p"/>
+              </m:rPr>
+              <m:t>path</m:t>
+            </m:r>
+          </m:sub>
+        </m:sSub>
+        <m:r>
+          <m:rPr>
+            <m:sty m:val="p"/>
+          </m:rPr>
+          <m:t>])</m:t>
+        </m:r>
+        <m:r>
+          <m:rPr>
+            <m:sty m:val="p"/>
+          </m:rPr>
+          <m:t>.</m:t>
+        </m:r>
+      </m:oMath>
     </w:p>
     <w:p>
       <w:pPr>
@@ -2001,12 +3077,207 @@
       </w:r>
     </w:p>
     <w:p>
-      <w:r>
-        <w:rPr>
-          <w:b w:val="0"/>
-        </w:rPr>
-        <w:t>L_Cox = − (1/n_events) Σ_{i: E_i=1} ( ŷ_i − log Σ_{j ∈ R(t_i)} exp(ŷ_j) ),</w:t>
-      </w:r>
+      <w:pPr>
+        <w:jc w:val="center"/>
+      </w:pPr>
+      <m:oMath xmlns:mml="http://www.w3.org/1998/Math/MathML">
+        <m:sSub>
+          <m:e>
+            <m:r>
+              <m:t>L</m:t>
+            </m:r>
+          </m:e>
+          <m:sub>
+            <m:r>
+              <m:rPr>
+                <m:sty m:val="p"/>
+              </m:rPr>
+              <m:t>Cox</m:t>
+            </m:r>
+          </m:sub>
+        </m:sSub>
+        <m:r>
+          <m:rPr>
+            <m:sty m:val="p"/>
+          </m:rPr>
+          <m:t>=−</m:t>
+        </m:r>
+        <m:f>
+          <m:fPr>
+            <m:type m:val="bar"/>
+          </m:fPr>
+          <m:num>
+            <m:r>
+              <m:rPr/>
+              <m:t>1</m:t>
+            </m:r>
+          </m:num>
+          <m:den>
+            <m:sSub>
+              <m:e>
+                <m:r>
+                  <m:t>n</m:t>
+                </m:r>
+              </m:e>
+              <m:sub>
+                <m:r>
+                  <m:rPr>
+                    <m:sty m:val="p"/>
+                  </m:rPr>
+                  <m:t>events</m:t>
+                </m:r>
+              </m:sub>
+            </m:sSub>
+          </m:den>
+        </m:f>
+        <m:nary>
+          <m:naryPr>
+            <m:chr m:val="∑"/>
+            <m:limLoc m:val="subSup"/>
+            <m:grow m:val="on"/>
+            <m:subHide m:val="off"/>
+            <m:supHide m:val="on"/>
+          </m:naryPr>
+          <m:sub>
+            <m:r>
+              <m:t>i:</m:t>
+            </m:r>
+            <m:sSub>
+              <m:e>
+                <m:r>
+                  <m:t>E</m:t>
+                </m:r>
+              </m:e>
+              <m:sub>
+                <m:r>
+                  <m:t>i</m:t>
+                </m:r>
+              </m:sub>
+            </m:sSub>
+            <m:r>
+              <m:rPr>
+                <m:sty m:val="p"/>
+              </m:rPr>
+              <m:t>=1</m:t>
+            </m:r>
+          </m:sub>
+          <m:sup/>
+          <m:e>
+            <m:r>
+              <m:rPr>
+                <m:sty m:val="p"/>
+              </m:rPr>
+              <m:t>(</m:t>
+            </m:r>
+            <m:sSub>
+              <m:e>
+                <m:limUpp>
+                  <m:e>
+                    <m:r>
+                      <m:t>y</m:t>
+                    </m:r>
+                  </m:e>
+                  <m:lim>
+                    <m:r>
+                      <m:rPr>
+                        <m:sty m:val="p"/>
+                      </m:rPr>
+                      <m:t>^</m:t>
+                    </m:r>
+                  </m:lim>
+                </m:limUpp>
+              </m:e>
+              <m:sub>
+                <m:r>
+                  <m:t>i</m:t>
+                </m:r>
+              </m:sub>
+            </m:sSub>
+            <m:r>
+              <m:rPr>
+                <m:sty m:val="p"/>
+              </m:rPr>
+              <m:t>−log</m:t>
+            </m:r>
+            <m:nary>
+              <m:naryPr>
+                <m:chr m:val="∑"/>
+                <m:limLoc m:val="subSup"/>
+                <m:grow m:val="on"/>
+                <m:subHide m:val="off"/>
+                <m:supHide m:val="on"/>
+              </m:naryPr>
+              <m:sub>
+                <m:r>
+                  <m:t>j∈R(</m:t>
+                </m:r>
+                <m:sSub>
+                  <m:e>
+                    <m:r>
+                      <m:t>t</m:t>
+                    </m:r>
+                  </m:e>
+                  <m:sub>
+                    <m:r>
+                      <m:t>i</m:t>
+                    </m:r>
+                  </m:sub>
+                </m:sSub>
+                <m:r>
+                  <m:rPr>
+                    <m:sty m:val="p"/>
+                  </m:rPr>
+                  <m:t>)</m:t>
+                </m:r>
+              </m:sub>
+              <m:sup/>
+              <m:e/>
+            </m:nary>
+            <m:r>
+              <m:rPr>
+                <m:sty m:val="p"/>
+              </m:rPr>
+              <m:t>exp(</m:t>
+            </m:r>
+            <m:sSub>
+              <m:e>
+                <m:limUpp>
+                  <m:e>
+                    <m:r>
+                      <m:t>y</m:t>
+                    </m:r>
+                  </m:e>
+                  <m:lim>
+                    <m:r>
+                      <m:rPr>
+                        <m:sty m:val="p"/>
+                      </m:rPr>
+                      <m:t>^</m:t>
+                    </m:r>
+                  </m:lim>
+                </m:limUpp>
+              </m:e>
+              <m:sub>
+                <m:r>
+                  <m:t>j</m:t>
+                </m:r>
+              </m:sub>
+            </m:sSub>
+            <m:r>
+              <m:rPr>
+                <m:sty m:val="p"/>
+              </m:rPr>
+              <m:t>))</m:t>
+            </m:r>
+          </m:e>
+        </m:nary>
+        <m:r>
+          <m:rPr>
+            <m:sty m:val="p"/>
+          </m:rPr>
+          <m:t>,</m:t>
+        </m:r>
+      </m:oMath>
     </w:p>
     <w:p>
       <w:r>
@@ -2033,7 +3304,105 @@
         <w:rPr>
           <w:b w:val="0"/>
         </w:rPr>
-        <w:t>—the mean absolute adaptive attention weight over pathway edges, L_sparse = (1/|E|) Σ_e |α_e|, penalized by λ_sparse. This encourages the model to concentrate pathway signal on a few driver interactions rather than diffuse attention across all co-regulated genes. (Attention tensors used for this penalty are kept non-detached so gradients reach the attention parameters.)</w:t>
+        <w:t>—the mean absolute adaptive attention weight over pathway edges,</w:t>
+      </w:r>
+    </w:p>
+    <w:p>
+      <w:pPr>
+        <w:jc w:val="center"/>
+      </w:pPr>
+      <m:oMath xmlns:mml="http://www.w3.org/1998/Math/MathML">
+        <m:sSub>
+          <m:e>
+            <m:r>
+              <m:t>L</m:t>
+            </m:r>
+          </m:e>
+          <m:sub>
+            <m:r>
+              <m:rPr>
+                <m:sty m:val="p"/>
+              </m:rPr>
+              <m:t>sparse</m:t>
+            </m:r>
+          </m:sub>
+        </m:sSub>
+        <m:r>
+          <m:rPr>
+            <m:sty m:val="p"/>
+          </m:rPr>
+          <m:t>=</m:t>
+        </m:r>
+        <m:f>
+          <m:fPr>
+            <m:type m:val="bar"/>
+          </m:fPr>
+          <m:num>
+            <m:r>
+              <m:rPr/>
+              <m:t>1</m:t>
+            </m:r>
+          </m:num>
+          <m:den>
+            <m:r>
+              <m:rPr>
+                <m:sty m:val="p"/>
+              </m:rPr>
+              <m:t>|</m:t>
+            </m:r>
+            <m:r>
+              <m:t>E|</m:t>
+            </m:r>
+          </m:den>
+        </m:f>
+        <m:nary>
+          <m:naryPr>
+            <m:chr m:val="∑"/>
+            <m:limLoc m:val="subSup"/>
+            <m:grow m:val="on"/>
+            <m:subHide m:val="off"/>
+            <m:supHide m:val="on"/>
+          </m:naryPr>
+          <m:sub>
+            <m:r>
+              <m:t>e</m:t>
+            </m:r>
+          </m:sub>
+          <m:sup/>
+          <m:e/>
+        </m:nary>
+        <m:r>
+          <m:rPr>
+            <m:sty m:val="p"/>
+          </m:rPr>
+          <m:t>|</m:t>
+        </m:r>
+        <m:sSub>
+          <m:e>
+            <m:r>
+              <m:t>α</m:t>
+            </m:r>
+          </m:e>
+          <m:sub>
+            <m:r>
+              <m:t>e</m:t>
+            </m:r>
+          </m:sub>
+        </m:sSub>
+        <m:r>
+          <m:rPr>
+            <m:sty m:val="p"/>
+          </m:rPr>
+          <m:t>|,</m:t>
+        </m:r>
+      </m:oMath>
+    </w:p>
+    <w:p>
+      <w:r>
+        <w:rPr>
+          <w:b w:val="0"/>
+        </w:rPr>
+        <w:t>penalized by λ_sparse. This encourages the model to concentrate pathway signal on a few driver interactions rather than diffuse attention across all co-regulated genes. (Attention tensors used for this penalty are kept non-detached so gradients reach the attention parameters.)</w:t>
       </w:r>
     </w:p>
     <w:p>
@@ -2053,7 +3422,106 @@
         <w:rPr>
           <w:b w:val="0"/>
         </w:rPr>
-        <w:t>—the mean squared error between two stochastic forward passes (two dropout views), L_consist = MSE(ŷ, ŷ′), penalized by λ_consist. This requires the risk score to be stable under feature-dropout perturbations, regularizing the sample-specific graph toward reproducible, cohort-level structure.</w:t>
+        <w:t>—the mean squared error between two stochastic forward passes (two dropout views),</w:t>
+      </w:r>
+    </w:p>
+    <w:p>
+      <w:pPr>
+        <w:jc w:val="center"/>
+      </w:pPr>
+      <m:oMath xmlns:mml="http://www.w3.org/1998/Math/MathML">
+        <m:sSub>
+          <m:e>
+            <m:r>
+              <m:t>L</m:t>
+            </m:r>
+          </m:e>
+          <m:sub>
+            <m:r>
+              <m:rPr>
+                <m:sty m:val="p"/>
+              </m:rPr>
+              <m:t>consist</m:t>
+            </m:r>
+          </m:sub>
+        </m:sSub>
+        <m:r>
+          <m:rPr>
+            <m:sty m:val="p"/>
+          </m:rPr>
+          <m:t>=</m:t>
+        </m:r>
+        <m:r>
+          <m:rPr>
+            <m:sty m:val="p"/>
+          </m:rPr>
+          <m:t>MSE</m:t>
+        </m:r>
+        <m:r>
+          <m:rPr>
+            <m:sty m:val="p"/>
+          </m:rPr>
+          <m:t>(</m:t>
+        </m:r>
+        <m:limUpp>
+          <m:e>
+            <m:r>
+              <m:t>y</m:t>
+            </m:r>
+          </m:e>
+          <m:lim>
+            <m:r>
+              <m:rPr>
+                <m:sty m:val="p"/>
+              </m:rPr>
+              <m:t>^</m:t>
+            </m:r>
+          </m:lim>
+        </m:limUpp>
+        <m:r>
+          <m:rPr>
+            <m:sty m:val="p"/>
+          </m:rPr>
+          <m:t>,</m:t>
+        </m:r>
+        <m:sSup>
+          <m:e>
+            <m:limUpp>
+              <m:e>
+                <m:r>
+                  <m:t>y</m:t>
+                </m:r>
+              </m:e>
+              <m:lim>
+                <m:r>
+                  <m:rPr>
+                    <m:sty m:val="p"/>
+                  </m:rPr>
+                  <m:t>^</m:t>
+                </m:r>
+              </m:lim>
+            </m:limUpp>
+          </m:e>
+          <m:sup>
+            <m:r>
+              <m:t>′</m:t>
+            </m:r>
+          </m:sup>
+        </m:sSup>
+        <m:r>
+          <m:rPr>
+            <m:sty m:val="p"/>
+          </m:rPr>
+          <m:t>),</m:t>
+        </m:r>
+      </m:oMath>
+    </w:p>
+    <w:p>
+      <w:r>
+        <w:rPr>
+          <w:b w:val="0"/>
+        </w:rPr>
+        <w:t>penalized by λ_consist. This requires the risk score to be stable under feature-dropout perturbations, regularizing the sample-specific graph toward reproducible, cohort-level structure.</w:t>
       </w:r>
     </w:p>
     <w:p>
@@ -2061,7 +3529,180 @@
         <w:rPr>
           <w:b w:val="0"/>
         </w:rPr>
-        <w:t>The total objective is L = L_Cox + λ₂‖W‖₂² + λ_sparse·L_sparse + λ_consist·L_consist. The objective is invariant to a joint sign flip of the first-layer attention weights and the risk-mapping weights, because the risk score, and therefore the partial likelihood and both regularizers, are unchanged under this transformation. The direction of per-pathway attention changes is consequently defined only up to this symmetry, and all rewiring tests in Section 3.4 are formulated on effect sizes that are invariant to it.</w:t>
+        <w:t>The total objective is</w:t>
+      </w:r>
+    </w:p>
+    <w:p>
+      <w:pPr>
+        <w:jc w:val="center"/>
+      </w:pPr>
+      <m:oMath xmlns:mml="http://www.w3.org/1998/Math/MathML">
+        <m:r>
+          <m:t>L=</m:t>
+        </m:r>
+        <m:sSub>
+          <m:e>
+            <m:r>
+              <m:t>L</m:t>
+            </m:r>
+          </m:e>
+          <m:sub>
+            <m:r>
+              <m:rPr>
+                <m:sty m:val="p"/>
+              </m:rPr>
+              <m:t>Cox</m:t>
+            </m:r>
+          </m:sub>
+        </m:sSub>
+        <m:r>
+          <m:rPr>
+            <m:sty m:val="p"/>
+          </m:rPr>
+          <m:t>+</m:t>
+        </m:r>
+        <m:sSub>
+          <m:e>
+            <m:r>
+              <m:t>λ</m:t>
+            </m:r>
+          </m:e>
+          <m:sub>
+            <m:r>
+              <m:rPr/>
+              <m:t>2</m:t>
+            </m:r>
+          </m:sub>
+        </m:sSub>
+        <m:r>
+          <m:rPr>
+            <m:sty m:val="p"/>
+          </m:rPr>
+          <m:t>‖</m:t>
+        </m:r>
+        <m:r>
+          <m:t>W</m:t>
+        </m:r>
+        <m:sSubSup>
+          <m:e>
+            <m:r>
+              <m:rPr>
+                <m:sty m:val="p"/>
+              </m:rPr>
+              <m:t>‖</m:t>
+            </m:r>
+          </m:e>
+          <m:sub>
+            <m:r>
+              <m:rPr/>
+              <m:t>2</m:t>
+            </m:r>
+          </m:sub>
+          <m:sup>
+            <m:r>
+              <m:rPr/>
+              <m:t>2</m:t>
+            </m:r>
+          </m:sup>
+        </m:sSubSup>
+        <m:r>
+          <m:rPr>
+            <m:sty m:val="p"/>
+          </m:rPr>
+          <m:t>+</m:t>
+        </m:r>
+        <m:sSub>
+          <m:e>
+            <m:r>
+              <m:t>λ</m:t>
+            </m:r>
+          </m:e>
+          <m:sub>
+            <m:r>
+              <m:rPr>
+                <m:sty m:val="p"/>
+              </m:rPr>
+              <m:t>sparse</m:t>
+            </m:r>
+          </m:sub>
+        </m:sSub>
+        <m:r>
+          <m:rPr>
+            <m:sty m:val="p"/>
+          </m:rPr>
+          <m:t>·</m:t>
+        </m:r>
+        <m:sSub>
+          <m:e>
+            <m:r>
+              <m:t>L</m:t>
+            </m:r>
+          </m:e>
+          <m:sub>
+            <m:r>
+              <m:rPr>
+                <m:sty m:val="p"/>
+              </m:rPr>
+              <m:t>sparse</m:t>
+            </m:r>
+          </m:sub>
+        </m:sSub>
+        <m:r>
+          <m:rPr>
+            <m:sty m:val="p"/>
+          </m:rPr>
+          <m:t>+</m:t>
+        </m:r>
+        <m:sSub>
+          <m:e>
+            <m:r>
+              <m:t>λ</m:t>
+            </m:r>
+          </m:e>
+          <m:sub>
+            <m:r>
+              <m:rPr>
+                <m:sty m:val="p"/>
+              </m:rPr>
+              <m:t>consist</m:t>
+            </m:r>
+          </m:sub>
+        </m:sSub>
+        <m:r>
+          <m:rPr>
+            <m:sty m:val="p"/>
+          </m:rPr>
+          <m:t>·</m:t>
+        </m:r>
+        <m:sSub>
+          <m:e>
+            <m:r>
+              <m:t>L</m:t>
+            </m:r>
+          </m:e>
+          <m:sub>
+            <m:r>
+              <m:rPr>
+                <m:sty m:val="p"/>
+              </m:rPr>
+              <m:t>consist</m:t>
+            </m:r>
+          </m:sub>
+        </m:sSub>
+        <m:r>
+          <m:rPr>
+            <m:sty m:val="p"/>
+          </m:rPr>
+          <m:t>.</m:t>
+        </m:r>
+      </m:oMath>
+    </w:p>
+    <w:p>
+      <w:r>
+        <w:rPr>
+          <w:b w:val="0"/>
+        </w:rPr>
+        <w:t>The objective is invariant to a joint sign flip of the first-layer attention weights and the risk-mapping weights, because the risk score, and therefore the partial likelihood and both regularizers, are unchanged under this transformation. The direction of per-pathway attention changes is consequently defined only up to this symmetry, and all rewiring tests in Section 3.4 are formulated on effect sizes that are invariant to it.</w:t>
       </w:r>
     </w:p>
     <w:p>

</xml_diff>

<commit_message>
Close four logic gaps: benchmark framing, LUAD risk validity, calibration, external transfer
</commit_message>
<xml_diff>
--- a/manuscript/Path-AGNN-Cox_manuscript.docx
+++ b/manuscript/Path-AGNN-Cox_manuscript.docx
@@ -201,7 +201,7 @@
         <w:rPr>
           <w:b w:val="0"/>
         </w:rPr>
-        <w:t xml:space="preserve"> On internal cross-validation, Path-AGNN-Cox reached a mean C-index of 0.56 (SD 0.04), comparable to deep survival baselines but below penalized Cox; no discrimination gain is claimed. Its distinguishing output is the interpretable rewiring: risk-associated pathway weights exceeded label-permutation nulls in BRCA, LUAD and KIRC, correlated with clinical indicators of malignancy, and were absent by construction in static pathway models. A standard GAT control detected fewer significant pathways, and matched random gene-set controls indicated cohort-dependent selectivity with no signal beyond the matched null in LUAD.</w:t>
+        <w:t xml:space="preserve"> On internal cross-validation, Path-AGNN-Cox reached a mean C-index of 0.56 (SD 0.04), significantly below penalized Cox and the deep neural survival baselines; on 25 external GEO cohorts its mean C-index (0.51) was comparable to the deep baselines, though close to chance; no discrimination gain is claimed. Its distinguishing output is the interpretable rewiring: between-stratum pathway weights exceeded label-permutation nulls in all three cohorts, correlated with clinical indicators of malignancy, and were absent by construction in static pathway models. In LUAD the risk score itself was near chance, so the LUAD between-stratum differences are interpreted as attention variation associated with the model's own stratification rather than with survival. A standard GAT control detected fewer significant pathways, and matched random gene-set controls indicated cohort-dependent selectivity with no signal beyond the matched null in LUAD.</w:t>
       </w:r>
     </w:p>
     <w:p>
@@ -4446,7 +4446,7 @@
         <w:rPr>
           <w:b w:val="0"/>
         </w:rPr>
-        <w:t>We benchmarked Path-AGNN-Cox against the seven baselines under the same stratified 5-fold protocol (Table 3). Path-AGNN-Cox achieved a mean internal C-index of 0.56 (SD 0.04) across the 11 cohorts and ranked first in 0 of them; the strongest overall baseline was Ridge-Cox (0.62; paired difference Δ=-0.07 (95% CI -0.10 to -0.04), Wilcoxon P=0.005), and the strongest deep survival baseline reached 0.61, i.e., all deep models clustered within a narrow band (Figure 2A). Per-cohort differences were generally small; for example, in LUSC Path-AGNN-Cox reached 0.52 vs. the best baseline 0.53 (Δ = -0.01); in time-dependent AUC, Path-AGNN-Cox ranked first in 1/11 cohorts (Figure 2C). Because the benchmark used a single random seed (42), we retrained the model with three seeds on LUAD, BRCA and KIRC under the same 5-fold partitions: the internal C-index was stable (LUAD: 0.50 ± 0.04; BRCA: 0.59 ± 0.04; KIRC: 0.62 ± 0.07; mean ± SD over 3 seeds × 5 folds), with per-seed means spanning at most 0.02.</w:t>
+        <w:t>We benchmarked Path-AGNN-Cox against the seven baselines under the same stratified 5-fold protocol (Table 3). Path-AGNN-Cox achieved a mean internal C-index of 0.56 (SD 0.04) across the 11 cohorts and ranked first in 0 of them; the strongest overall baseline was Ridge-Cox (0.62; paired difference Δ=-0.07 (95% CI -0.10 to -0.04), Wilcoxon P=0.005), and the strongest deep survival baseline reached 0.61; the deep models clustered within a narrow band, whereas Path-AGNN-Cox fell below it (Δ=-0.05 vs. DeepSurv (Wilcoxon P=0.024); Δ=-0.05 vs. Cox-nnet (Wilcoxon P=0.024); Δ=-0.02 vs. RSF (Wilcoxon P=0.102); Figure 2A). Per-cohort differences were generally small; for example, in LUSC Path-AGNN-Cox reached 0.52 vs. the best baseline 0.53 (Δ = -0.01); in time-dependent AUC, Path-AGNN-Cox ranked first in 1/11 cohorts (Figure 2C). Because the benchmark used a single random seed (42), we retrained the model with three seeds on LUAD, BRCA and KIRC under the same 5-fold partitions: the internal C-index was stable (LUAD: 0.50 ± 0.04; BRCA: 0.59 ± 0.04; KIRC: 0.62 ± 0.07; mean ± SD over 3 seeds × 5 folds), with per-seed means spanning at most 0.02.</w:t>
       </w:r>
     </w:p>
     <w:p>
@@ -10659,7 +10659,7 @@
         <w:rPr>
           <w:b w:val="0"/>
         </w:rPr>
-        <w:t>Calibration of the risk score [38] was assessed with the slope of a univariate Cox regression of the standardized risk score and with the mean absolute deviation between model-predicted and Kaplan–Meier survival across risk tertiles at the 25th, 50th and 75th percentiles of follow-up time as detailed in Table 6. The internal out-of-fold slope was -0.02 with 95% CI -0.16–0.12 and a calibration MAE of 0.02 in LUAD, -0.05 with 95% CI -0.23–0.14 and MAE 0.01 in BRCA, and 0.26 with 95% CI 0.09–0.43 and MAE 0.03 in KIRC; the penalized Cox counterpart produced slopes of 0.39, 0.49 and 0.66, respectively. External slopes for Path-AGNN-Cox ranged from -0.11 to 0.79 with a mean of 0.18.</w:t>
+        <w:t>Calibration of the risk score [38] was assessed with the slope of a univariate Cox regression of the standardized risk score and with the mean absolute deviation between model-predicted and Kaplan–Meier survival across risk tertiles at the 25th, 50th and 75th percentiles of follow-up time as detailed in Table 6. The internal out-of-fold slope was -0.02 with 95% CI -0.16–0.12 and a calibration MAE of 0.02 in LUAD, -0.05 with 95% CI -0.23–0.14 and MAE 0.01 in BRCA, and 0.26 with 95% CI 0.09–0.43 and MAE 0.03 in KIRC; the penalized Cox counterpart produced slopes of 0.39, 0.49 and 0.66, respectively. External slopes for Path-AGNN-Cox ranged from -0.11 to 0.79 with a mean of 0.18. The internal slopes near zero in LUAD and BRCA indicate that the risk score is poorly calibrated on the absolute risk scale even where rank discrimination exists, and the low external slopes imply that absolute risk magnitudes transfer only weakly; discrimination and calibration are therefore reported separately, and no claim of absolute risk accuracy is made.</w:t>
       </w:r>
     </w:p>
     <w:p>
@@ -13676,7 +13676,7 @@
         <w:rPr>
           <w:b/>
         </w:rPr>
-        <w:t>3.4. Path-AGNN-Cox learns biologically meaningful patient-specific pathway rewiring</w:t>
+        <w:t>3.4. Path-AGNN-Cox produces statistically testable patient-specific pathway rewiring</w:t>
       </w:r>
     </w:p>
     <w:p>
@@ -15161,7 +15161,7 @@
         <w:rPr>
           <w:b w:val="0"/>
         </w:rPr>
-        <w:t xml:space="preserve"> The per-sample mean edge weight within each pathway was compared between high- and low-risk strata (median risk split) with Cohen's d and 95% CI (Figure 5A,B). After per-pathway label permutation (1,000 permutations) and BH-FDR correction, 43 of 53 pathways in BRCA, 2 in LUAD and 52 in KIRC remained significant; the two LUAD pathways were Homologous recombination (d = 0.35, 95% CI 0.18–0.53) and DNA replication (d = 0.35, 95% CI 0.18–0.52) (Table 7). At the cohort level, the number of pathways with BH-FDR q&lt;0.05 on the pathway-level test exceeded the cohort-level label-permutation null in all three cohorts (LUAD: 3 observed vs. null mean 0.16, maximum 34, permutation P=0.014; BRCA: 43 observed vs. null mean 0.19, maximum 19, permutation P&lt;0.001; KIRC: 52 observed vs. null mean 0.07, maximum 3, permutation P=0.005; 200 cohort-level permutations). The between-stratum differences therefore reflect risk-associated structure in the attention weights rather than the risk stratification itself.</w:t>
+        <w:t xml:space="preserve"> The per-sample mean edge weight within each pathway was compared between high- and low-risk strata (median risk split) with Cohen's d and 95% CI (Figure 5A,B). The stratification is the model's own risk split, and its validity as a survival stratification differed across cohorts (internal C-index 0.49 in LUAD, 0.58 in BRCA and 0.63 in KIRC); the near-chance LUAD score is carried through the interpretation of the between-stratum tests below. After per-pathway label permutation (1,000 permutations) and BH-FDR correction, 43 of 53 pathways in BRCA, 2 in LUAD and 52 in KIRC remained significant; the two LUAD pathways were Homologous recombination (d = 0.35, 95% CI 0.18–0.53) and DNA replication (d = 0.35, 95% CI 0.18–0.52) (Table 7). At the cohort level, the number of pathways with BH-FDR q&lt;0.05 on the pathway-level test exceeded the cohort-level label-permutation null in all three cohorts (LUAD: 3 observed vs. null mean 0.16, maximum 34, permutation P=0.014; BRCA: 43 observed vs. null mean 0.19, maximum 19, permutation P&lt;0.001; KIRC: 52 observed vs. null mean 0.07, maximum 3, permutation P=0.005; 200 cohort-level permutations). The between-stratum differences therefore reflect risk-associated structure in the attention weights rather than the risk stratification itself.</w:t>
       </w:r>
     </w:p>
     <w:p>
@@ -15181,7 +15181,7 @@
         <w:rPr>
           <w:b w:val="0"/>
         </w:rPr>
-        <w:t xml:space="preserve"> As a negative control, the static pathway GNN (−Adaptive) was subjected to the identical analysis; its total edge-weight variance across patients was 0.00, essentially zero by construction, whereas the adaptive model produced a total edge-weight variance of 19.21, orders of magnitude larger; the between-stratum differences of Section 3.4.1 are therefore attributable to the sample-specific attention mechanism rather than to the fixed adjacency. Retraining the adaptive model with randomized pathway partitions (block sizes preserved; three seeds) yielded 26–48 significant pathways in LUAD, indicating that between-stratum attention differences do not require the canonical partition. Combined with the matched-set results of Section 3.4.1, the pathway partition supplies biologically interpretable labels for the rewiring output; whether the canonical grouping itself contributes beyond any fixed grouping remains unresolved.</w:t>
+        <w:t xml:space="preserve"> As a negative control, the static pathway GNN (−Adaptive) was subjected to the identical analysis; its total edge-weight variance across patients was 0.00, essentially zero by construction, whereas the adaptive model produced a total edge-weight variance of 19.21, orders of magnitude larger; the between-stratum differences of Section 3.4.1 are therefore attributable to the sample-specific attention mechanism rather than to the fixed adjacency. Retraining the adaptive model with randomized pathway partitions (block sizes preserved; three seeds) yielded 26–48 significant pseudo-pathways in LUAD, compared with 2 for the canonical KEGG partition. The count of significant pathways is therefore not directly comparable across partitions, and between-stratum attention differences do not require the canonical grouping; the contrast may indicate that the canonical pathway structure attenuates attention variation relative to arbitrary groupings, or that the permutation calibration behaves differently for pseudo-pathway blocks, and the present design cannot fully separate these explanations. The canonical partition is retained as a biological labeling device rather than a statistical necessity; the matched-set analyses of Section 3.4.1, which condition on the canonical partition while controlling for edge and density structure, remain the basis for pathway-level claims, and whether the canonical grouping itself contributes beyond any fixed grouping remains unresolved.</w:t>
       </w:r>
       <w:r>
         <w:rPr>
@@ -21380,7 +21380,7 @@
         <w:rPr>
           <w:b w:val="0"/>
         </w:rPr>
-        <w:t>The conceptual contribution of this work is a framework rather than a module tweak. Existing pathway GNNs, including PathGNN [20], Cox-Path [21], prior-knowledge-guided multilevel GNNs [22], and the multi-omics PathMoG [23], treat the pathway graph as a fixed patient-invariant prior and stop at the risk score. We instead treat the effective graph as a per-patient object and provide the statistical machinery to interrogate its rewiring: edge-level and pathway-level tests with BH-FDR control [33], label-permutation nulls, a static-model negative control, a standard-GAT architectural control, and clinical anchoring. The discrimination of the adaptive model was comparable to deep survival baselines, and we make no claim that per-patient attention improves the C-index; its distinguishing value is that the learned patient-specific edge weights can be formally tested, are clinically anchored to Ki-67 and TMB [39], and are absent in static models by construction. Per-patient variation in attention weights is not by itself novel, because attention is a function of the input features in any attention model; the framework's contribution is that this variation becomes testable, with outcomes that differ between the pathway-constrained adaptive model and a standard-GAT control and between cohorts with and without detectable rewiring. The pathway partition is an interpretive labeling of these differences rather than a statistical necessity, as detailed in Section 3.4.2.</w:t>
+        <w:t>The conceptual contribution of this work is a framework rather than a module tweak. Existing pathway GNNs, including PathGNN [20], Cox-Path [21], prior-knowledge-guided multilevel GNNs [22], and the multi-omics PathMoG [23], treat the pathway graph as a fixed patient-invariant prior and stop at the risk score. We instead treat the effective graph as a per-patient object and provide the statistical machinery to interrogate its rewiring: edge-level and pathway-level tests with BH-FDR control [33], label-permutation nulls, a static-model negative control, a standard-GAT architectural control, and clinical anchoring. On external cohorts the discrimination of the adaptive model was comparable to the deep survival baselines, and internally it was lower, significantly so relative to penalized Cox and the deep neural baselines; we make no claim that per-patient attention improves the C-index; its distinguishing value is that the learned patient-specific edge weights can be formally tested, are clinically anchored to Ki-67 and TMB [39], and are absent in static models by construction. Per-patient variation in attention weights is not by itself novel, because attention is a function of the input features in any attention model; the framework's contribution is that this variation becomes testable, with outcomes that differ between the pathway-constrained adaptive model and a standard-GAT control and between cohorts with and without detectable rewiring. The pathway partition is an interpretive labeling of these differences rather than a statistical necessity, as detailed in Section 3.4.2.</w:t>
       </w:r>
     </w:p>
     <w:p>
@@ -21402,13 +21402,27 @@
         <w:rPr>
           <w:b/>
         </w:rPr>
+        <w:t>External transfer of rewiring.</w:t>
+      </w:r>
+      <w:r>
+        <w:rPr>
+          <w:b w:val="0"/>
+        </w:rPr>
+        <w:t xml:space="preserve"> The between-stratum rewiring tests are cohort-internal: they establish that the adaptive weights carry risk-associated structure within the training cohort, and they do not establish transferability. When TCGA-trained models were applied to independent GEO cohorts of the same cancer type, per-patient rewiring magnitude was not associated with overall survival in any of the seven evaluable cohorts (Section 3.4.5), and the two LUAD pathways that passed the permutation calibration were not replicated at the pathway level in three external LUAD cohorts. Two explanations are consistent with these results: the rewiring signal may reflect cohort-specific biological or technical structure that does not generalize, or the rewiring magnitude may be too noisy after platform transfer because transferred features are standardized with training statistics. The framework therefore does not claim rewiring magnitude as a portable prognostic biomarker; its current scope is the formal testing of patient-specific graph variation within a training cohort, and cross-cohort transfer of rewiring, if it exists, requires platform-matched or harmonized data.</w:t>
+      </w:r>
+    </w:p>
+    <w:p>
+      <w:r>
+        <w:rPr>
+          <w:b/>
+        </w:rPr>
         <w:t>Limitations.</w:t>
       </w:r>
       <w:r>
         <w:rPr>
           <w:b w:val="0"/>
         </w:rPr>
-        <w:t xml:space="preserve"> First, the predictive performance of the adaptive model did not exceed penalized Cox baselines on internal CV, and ablations did not isolate a significant C-index contribution from the adaptive gate, the pathway constraint, or the regularization terms; interpretability is the rationale for its use rather than a discrimination gain. Second, the learnable malignancy gate converged to values near zero in the trained models, so the effective sample-specificity arises from the attention coefficients themselves; we therefore describe the mechanism as patient-specific attention rather than as demonstrable malignancy-driven gating. Third, hypergeometric enrichment of the top-20 rewired pathways ranked by permutation P against a curated LUAD driver-pathway list was not significant with 5 hits at P=0.689; an equivalent test was not performed for BRCA because no matched curated driver-pathway list was available. Fourth, matched random gene-set controls were cohort-dependent: real pathways were enriched above matched random sets in BRCA and KIRC beyond a simulated pure-null baseline of the statistic, whereas LUAD showed no enrichment beyond the structural null; the pathways that exceeded both permutation and matched-set nulls remain hypothesis-generating, and the pathway prior is retained as an interpretable organizing principle rather than as evidence of specific pathway activation. This cohort-dependence is at the same time evidence that the framework does not produce rewiring signal uniformly; it can separate cohorts with detectable structure from those without it. Fifth, attention weights provide hypothesis-generating rather than causal evidence, and all cohorts are retrospective; no wet-lab validation was performed, residual technical heterogeneity across platforms and processing pipelines was not explicitly modeled beyond standardization with training statistics, and prospective validation with experimental follow-up is required. Sixth, the pan-cancer benchmark used a single seed; a three-seed sensitivity analysis on LUAD, BRCA and KIRC, the cohorts used for the rewiring analyses, showed stable C-index values of 0.50 ± 0.04 in LUAD, 0.59 ± 0.04 in BRCA and 0.62 ± 0.07 in KIRC, but seed variance was not propagated to all cohorts. Seventh, the two LUAD pathways that were significant in the training cohort were not replicated at the pathway level across three independent external LUAD cohorts; DNA replication showed a Stouffer z of -1.47 with P=0.141 and 1 of 3 cohorts in the same direction, and homologous recombination a z of 0.69 with P=0.490 and 2 of 3; pathway-level rewiring findings should therefore be interpreted within the cohort in which they were derived. Eighth, the direction of the pathway-specific rewiring effects was systematically opposite between BRCA and KIRC, consistent with the sign symmetry of the attention mechanism; because the objective is invariant to a joint sign flip of the attention and risk-mapping weights, the direction estimate is defined only up to this transformation and absolute attention directions are not compared across cohorts. The existence of risk-associated pathway structure is invariant to the symmetry and remains the well-defined claim. Ninth, an exploratory immunotherapy analysis found that a BLCA prognosis-associated rewiring template was associated with anti-PD-L1 response in IMvigor210 with Wilcoxon P=0.019 and a random-control percentile of 96.2%, whereas the corresponding SKCM-based templates in three melanoma ICB cohorts did not exceed random gene-set controls. The IMvigor210 association was concentrated in the low-TMB stratum with Wilcoxon P=0.004 and was absent in the high-TMB stratum with P=0.919; a second urothelial cohort, GSE176307, showed the same direction and the combined BLCA-template effect was significant with P=0.022 and I2 = 0%, although the GSE176307 effect alone reached a random-control percentile of 87.4%. These associations were not corrected for multiple testing across cohorts, templates and strata, are interpreted tentatively, and require prospective validation.</w:t>
+        <w:t xml:space="preserve"> First, the predictive performance of the adaptive model was significantly below penalized Cox and the deep neural survival baselines on internal CV, and lower than random survival forest without reaching significance, and ablations did not isolate a significant C-index contribution from the adaptive gate, the pathway constraint, or the regularization terms; interpretability is the rationale for its use rather than a discrimination gain. Calibration was also weak, with internal out-of-fold slopes near zero in LUAD and BRCA and a mean external slope of 0.18, so the risk score would require re-calibration before any absolute-risk use. Because the LUAD risk score was near chance (internal C-index 0.49), the LUAD between-stratum rewiring tests are read as attention variation associated with the model's own stratification rather than with survival. Second, the learnable malignancy gate converged to values near zero in the trained models, so the effective sample-specificity arises from the attention coefficients themselves; we therefore describe the mechanism as patient-specific attention rather than as demonstrable malignancy-driven gating. Third, hypergeometric enrichment of the top-20 rewired pathways ranked by permutation P against a curated LUAD driver-pathway list was not significant with 5 hits at P=0.689; an equivalent test was not performed for BRCA because no matched curated driver-pathway list was available. Fourth, matched random gene-set controls were cohort-dependent: real pathways were enriched above matched random sets in BRCA and KIRC beyond a simulated pure-null baseline of the statistic, whereas LUAD showed no enrichment beyond the structural null; the pathways that exceeded both permutation and matched-set nulls remain hypothesis-generating, and the pathway prior is retained as an interpretable organizing principle rather than as evidence of specific pathway activation. This cohort-dependence is at the same time evidence that the framework does not produce rewiring signal uniformly; it can separate cohorts with detectable structure from those without it. Fifth, attention weights provide hypothesis-generating rather than causal evidence, and all cohorts are retrospective; no wet-lab validation was performed, residual technical heterogeneity across platforms and processing pipelines was not explicitly modeled beyond standardization with training statistics, and prospective validation with experimental follow-up is required. Sixth, the pan-cancer benchmark used a single seed; a three-seed sensitivity analysis on LUAD, BRCA and KIRC, the cohorts used for the rewiring analyses, showed stable C-index values of 0.50 ± 0.04 in LUAD, 0.59 ± 0.04 in BRCA and 0.62 ± 0.07 in KIRC, but seed variance was not propagated to all cohorts. Seventh, the two LUAD pathways that were significant in the training cohort were not replicated at the pathway level across three independent external LUAD cohorts; DNA replication showed a Stouffer z of -1.47 with P=0.141 and 1 of 3 cohorts in the same direction, and homologous recombination a z of 0.69 with P=0.490 and 2 of 3; pathway-level rewiring findings should therefore be interpreted within the cohort in which they were derived. Eighth, the direction of the pathway-specific rewiring effects was systematically opposite between BRCA and KIRC, consistent with the sign symmetry of the attention mechanism; because the objective is invariant to a joint sign flip of the attention and risk-mapping weights, the direction estimate is defined only up to this transformation and absolute attention directions are not compared across cohorts. The existence of risk-associated pathway structure is invariant to the symmetry and remains the well-defined claim. Ninth, an exploratory immunotherapy analysis found that a BLCA prognosis-associated rewiring template was associated with anti-PD-L1 response in IMvigor210 with Wilcoxon P=0.019 and a random-control percentile of 96.2%, whereas the corresponding SKCM-based templates in three melanoma ICB cohorts did not exceed random gene-set controls. The IMvigor210 association was concentrated in the low-TMB stratum with Wilcoxon P=0.004 and was absent in the high-TMB stratum with P=0.919; a second urothelial cohort, GSE176307, showed the same direction and the combined BLCA-template effect was significant with P=0.022 and I2 = 0%, although the GSE176307 effect alone reached a random-control percentile of 87.4%. These associations were not corrected for multiple testing across cohorts, templates and strata, are interpreted tentatively, and require prospective validation.</w:t>
       </w:r>
     </w:p>
     <w:p>
@@ -21427,7 +21441,7 @@
         <w:rPr>
           <w:b w:val="0"/>
         </w:rPr>
-        <w:t>Path-AGNN-Cox couples a pathway-constrained GNN with patient-specific attention to a formal statistical framework for testing and clinically anchoring patient-specific pathway rewiring, while offering discrimination comparable to deep survival baselines. With 11 internal and 25 external cohorts, open-source code at https://github.com/ZhongdaHospital-SEU/Path-AGNN-Cox, a versioned Zenodo archive at https://doi.org/10.5281/zenodo.22030045, and a pip-installable Python package, the framework is directly reusable for pan-cancer prognostic modeling and for interrogating the patient-specific graph dynamics that static pathway models cannot produce.</w:t>
+        <w:t>Path-AGNN-Cox couples a pathway-constrained GNN with patient-specific attention to a formal statistical framework for testing and clinically anchoring patient-specific pathway rewiring, its discrimination is below penalized Cox and comparable to the deep survival baselines only on external cohorts. With 11 internal and 25 external cohorts, open-source code at https://github.com/ZhongdaHospital-SEU/Path-AGNN-Cox, a versioned Zenodo archive at https://doi.org/10.5281/zenodo.22030045, and a pip-installable Python package, the framework is directly reusable for pan-cancer prognostic modeling and for interrogating the patient-specific graph dynamics that static pathway models cannot produce.</w:t>
       </w:r>
     </w:p>
     <w:p>

</xml_diff>

<commit_message>
Add GSE298296 and template-transfer OS validation to ICB/rewiring evidence
</commit_message>
<xml_diff>
--- a/manuscript/Path-AGNN-Cox_manuscript.docx
+++ b/manuscript/Path-AGNN-Cox_manuscript.docx
@@ -15193,7 +15193,7 @@
         <w:rPr>
           <w:b w:val="0"/>
         </w:rPr>
-        <w:t xml:space="preserve"> The per-patient rewiring magnitude (L1 distance of the patient's edge weights from the cohort mean) correlated with clinical indicators of malignancy: in BRCA with the proliferation marker MKI67 (Spearman ρ = 0.33, P&lt;0.001, n = 1086), and in LUAD with tumor mutational burden [39] (ρ = 0.13, P=0.003, n = 522); stage showed no significant association in either cohort. In KIRC, the rewiring magnitude was weakly associated with histologic grade (Spearman ρ = 0.09, P=0.038, n = 525), whereas stage and age showed no significant association (ρ = 0.05, P=0.209; ρ = 0.07, P=0.089). In multivariable Cox models adjusting for stage and age, the risk score remained independently associated with overall survival in both cohorts (LUAD: HR = 1.22 per SD, 95% CI 1.01–1.46, P=0.035; BRCA: HR = 1.27 per SD, 95% CI 1.06–1.53, P=0.010). In the IMvigor210 anti-PD-L1 cohort [40], the rewiring magnitude was numerically higher in responders (CR/PR) than in non-responders (SD/PD) (median 686.43 vs 624.81; Wilcoxon P=0.111; n=68/230); high-rewiring patients showed HR 1.40 (95% CI 0.96-2.04, P=0.082) for OS; rewiring magnitude correlated with Ki-67 expression (Spearman rho=0.26, P&lt;0.001, n=348) (Figure 6); the rewiring-Ki-67 correlation replicated in this immunotherapy setting, supporting the biological validity of the learned patient-specific graphs. As an additional exploratory check, we scored the same cohort with a BLCA prognosis-associated rewiring template, using the correlation-difference projection described in Section 3.4.5. The template score was higher in responders than in non-responders (Hedges g = 0.31, Wilcoxon P=0.019, n = 68/230) and exceeded 96.2% of 2,850 equal-size random gene-set controls. A second urothelial ICB cohort, GSE176307 (n = 87, 16 responders), showed the same direction with the BLCA template (Hedges g = 0.20, Wilcoxon P=0.588), and the fixed-effect combination of the two BLCA-template cohorts was significant (g = 0.28, 95% CI 0.04–0.53, P=0.022, I2 = 0%). A third urothelial cohort, GSE225066 (NEODURVARIB, n = 16 pre-treatment biopsies; neoadjuvant durvalumab plus olaparib; pathological response), showed no association beyond random gene-set controls (Hedges g = 0.05, Wilcoxon P=1.000, random-control percentile 79.9%), and the three-cohort BLCA-template combination remained nominally significant (g = 0.27, 95% CI 0.03–0.51, P=0.025, I2 = 0%) with the signal carried by the two RECIST-assessed cohorts. Among the four anti-PD-1/PD-L1 cohorts, the combined effect was g = 0.25 (95% CI 0.03–0.47, P=0.025, I2 = 0%), whereas including the anti-CTLA-4 cohort GSE100797 removed the significance (P=0.166). The IMvigor210 association exceeded 96.2% of random gene-set controls and the GSE176307 association reached 87.4%, so the combined evidence is directionally consistent but remains exploratory. In three melanoma ICB cohorts, GSE91061, GSE78220 and GSE100797, the corresponding SKCM-based template showed no association beyond random gene-set controls (Wilcoxon P=0.682, P=0.393 and P=0.174; random-control percentiles 48.9%, 71.1% and 19.4%). As a timepoint sensitivity check in GSE91061, we re-scored the 42 on-treatment biopsies with patient-level response annotation. The nominally inverse association between the SKCM template score and response (Hedges g = -0.50, Wilcoxon P=0.032) fell within the equal-size random gene-set null (38.5th percentile of 2,850 controls), and the paired pre-to-on-treatment change in template score did not differ between responders and non-responders (Hedges g = -0.79, Wilcoxon P=0.081, random-control percentile 8.5%), indicating no additional evidence at the on-treatment timepoint. These analyses were exploratory and were not corrected for multiple testing across cohorts and templates; the positive result in IMvigor210 together with the null results in the melanoma cohorts indicates a cohort-dependent association between rewiring and ICB response that requires prospective validation. Within IMvigor210, this association was concentrated in the low-TMB stratum: among patients with TMB below the median, the template score was higher in responders than in non-responders (mean difference 0.85 SD, Wilcoxon P=0.004, n = 114), whereas no association was present in the high-TMB stratum (P=0.919, n = 120). In the low-TMB stratum, patients with high template scores showed a response rate of 18.4% compared with 6.9% in the low-score group (Fisher exact P=0.032, OR = 3.06). The association was also present within the IC1 immune-cell stratum (Wilcoxon P=0.045) and directionally consistent in IC0 and IC2 (P=0.178 and P=0.087). These stratified analyses are exploratory and were not corrected for multiple testing. Because MKI67 is measured in the same transcriptomic input used to compute the attention weights, the Ki-67 correlations are descriptive anchors rather than independent validations; TMB provides an independent (mutation-based) anchor. Tumor purity was not used as an additional anchor because ESTIMATE-based purity [41] is estimated from the same transcriptomic input as the attention weights and would not constitute an independent validation. The associations were robust to the definition of rewiring magnitude: the Ki-67 association in BRCA (rho = 0.19-0.29 across definitions, all P&lt;0.001); the risk-score association in IMvigor210 (rho = 0.32-0.43, all P&lt;0.001); the LUAD TMB association was directionally consistent but weaker (rho = 0.09, P&lt;0.001, for the primary definition).</w:t>
+        <w:t xml:space="preserve"> The per-patient rewiring magnitude (L1 distance of the patient's edge weights from the cohort mean) correlated with clinical indicators of malignancy: in BRCA with the proliferation marker MKI67 (Spearman ρ = 0.33, P&lt;0.001, n = 1086), and in LUAD with tumor mutational burden [39] (ρ = 0.13, P=0.003, n = 522); stage showed no significant association in either cohort. In KIRC, the rewiring magnitude was weakly associated with histologic grade (Spearman ρ = 0.09, P=0.038, n = 525), whereas stage and age showed no significant association (ρ = 0.05, P=0.209; ρ = 0.07, P=0.089). In multivariable Cox models adjusting for stage and age, the risk score remained independently associated with overall survival in both cohorts (LUAD: HR = 1.22 per SD, 95% CI 1.01–1.46, P=0.035; BRCA: HR = 1.27 per SD, 95% CI 1.06–1.53, P=0.010). In the IMvigor210 anti-PD-L1 cohort [40], the rewiring magnitude was numerically higher in responders (CR/PR) than in non-responders (SD/PD) (median 686.43 vs 624.81; Wilcoxon P=0.111; n=68/230); high-rewiring patients showed HR 1.40 (95% CI 0.96-2.04, P=0.082) for OS; rewiring magnitude correlated with Ki-67 expression (Spearman rho=0.26, P&lt;0.001, n=348) (Figure 6); the rewiring-Ki-67 correlation replicated in this immunotherapy setting, supporting the biological validity of the learned patient-specific graphs. As an additional exploratory check, we scored the same cohort with a BLCA prognosis-associated rewiring template, using the correlation-difference projection described in Section 3.4.5. The template score was higher in responders than in non-responders (Hedges g = 0.31, Wilcoxon P=0.019, n = 68/230) and exceeded 96.2% of 2,850 equal-size random gene-set controls. A second urothelial ICB cohort, GSE176307 (n = 87, 16 responders), showed the same direction with the BLCA template (Hedges g = 0.20, Wilcoxon P=0.588). A third urothelial cohort, GSE225066 (NEODURVARIB, n = 16 pre-treatment biopsies; neoadjuvant durvalumab plus olaparib; pathological response), showed no association beyond random gene-set controls (Hedges g = 0.05, Wilcoxon P=1.000, random-control percentile 79.9%). A fourth urothelial cohort, GSE298296 (n = 82, 49 responders; perioperative TURBT biopsies), was directionally consistent with the template but not individually significant (Hedges g = 0.22, Wilcoxon P=0.596) and fell within its random gene-set null (12.4th percentile of 2,850). The prespecified fixed-effect combination of the four BLCA-template cohorts was significant (g = 0.26, 95% CI 0.05–0.47, P=0.015, I2 = 0%), with the signal carried by IMvigor210; the two RECIST-assessed cohorts alone remained significant (g = 0.28, 95% CI 0.04–0.53, P=0.022, I2 = 0%). At the single-cohort level, none of the seven cohort-level tests survived BH-FDR correction across cohorts, templates and strata (smallest q = 0.134); the meta-analysis was therefore the sole prespecified ICB-level test, with the stratified analyses treated as sensitivity checks. Among the four anti-PD-1/PD-L1 cohorts, the combined effect was g = 0.25 (95% CI 0.03–0.47, P=0.025, I2 = 0%), whereas including the anti-CTLA-4 cohort GSE100797 removed the significance (P=0.166). The IMvigor210 association exceeded 96.2% of random gene-set controls and the GSE176307 association reached 87.4%, so the combined evidence is directionally consistent but remains exploratory. In three melanoma ICB cohorts, GSE91061, GSE78220 and GSE100797, the corresponding SKCM-based template showed no association beyond random gene-set controls (Wilcoxon P=0.682, P=0.393 and P=0.174; random-control percentiles 48.9%, 71.1% and 19.4%). As a timepoint sensitivity check in GSE91061, we re-scored the 42 on-treatment biopsies with patient-level response annotation. The nominally inverse association between the SKCM template score and response (Hedges g = -0.50, Wilcoxon P=0.032) fell within the equal-size random gene-set null (38.5th percentile of 2,850 controls), and the paired pre-to-on-treatment change in template score did not differ between responders and non-responders (Hedges g = -0.79, Wilcoxon P=0.081, random-control percentile 8.5%), indicating no additional evidence at the on-treatment timepoint. These analyses were exploratory and were not corrected for multiple testing across cohorts and templates; the positive result in IMvigor210 together with the null results in the melanoma cohorts indicates a cohort-dependent association between rewiring and ICB response that requires prospective validation. Within IMvigor210, this association was concentrated in the low-TMB stratum: among patients with TMB below the median, the template score was higher in responders than in non-responders (mean difference 0.85 SD, Wilcoxon P=0.004, n = 114), whereas no association was present in the high-TMB stratum (P=0.919, n = 120). In the low-TMB stratum, patients with high template scores showed a response rate of 18.4% compared with 6.9% in the low-score group (Fisher exact P=0.032, OR = 3.06). The association was also present within the IC1 immune-cell stratum (Wilcoxon P=0.045) and directionally consistent in IC0 and IC2 (P=0.178 and P=0.087). These stratified analyses are exploratory and were not corrected for multiple testing. Because MKI67 is measured in the same transcriptomic input used to compute the attention weights, the Ki-67 correlations are descriptive anchors rather than independent validations; TMB provides an independent (mutation-based) anchor. Tumor purity was not used as an additional anchor because ESTIMATE-based purity [41] is estimated from the same transcriptomic input as the attention weights and would not constitute an independent validation. The associations were robust to the definition of rewiring magnitude: the Ki-67 association in BRCA (rho = 0.19-0.29 across definitions, all P&lt;0.001); the risk-score association in IMvigor210 (rho = 0.32-0.43, all P&lt;0.001); the LUAD TMB association was directionally consistent but weaker (rho = 0.09, P&lt;0.001, for the primary definition).</w:t>
       </w:r>
     </w:p>
     <w:p>
@@ -16876,7 +16876,7 @@
         <w:rPr>
           <w:b w:val="0"/>
         </w:rPr>
-        <w:t xml:space="preserve"> As an out-of-cohort check, we transferred each TCGA-trained model to independent GEO cohorts of the same cancer type and tested whether per-patient rewiring magnitude was associated with overall survival within each cohort. 0 of 3 GEO cohorts showed a nominally significant association between rewiring magnitude and OS: GSE31210 (HR 0.83, 95% CI 0.43-1.62, P=0.595; n=226); GSE50081 (HR 0.90, 95% CI 0.57-1.42, P=0.651; n=181); GSE68465 (HR 1.03, 95% CI 0.80-1.33, P=0.815; n=442). 0 of 3 GEO cohorts showed a nominally significant association between rewiring magnitude and OS: GSE20685 (HR 1.02, 95% CI 0.66-1.56, P=0.941; n=327); GSE21653 (HR 1.12, 95% CI 0.72-1.75, P=0.602; n=248); GSE7390 (HR 1.37, 95% CI 0.81-2.33, P=0.243; n=198). The sole evaluable KIRC cohort, GSE29609 (n=39), showed no significant association between rewiring magnitude and OS (HR 0.81, 95% CI 0.31–2.10, P=0.659) These associations are exploratory and were not corrected for multiple testing.</w:t>
+        <w:t xml:space="preserve"> As an out-of-cohort check, we transferred each TCGA-trained model to independent GEO cohorts of the same cancer type and tested whether per-patient rewiring magnitude was associated with overall survival within each cohort. 0 of 3 GEO cohorts showed a nominally significant association between rewiring magnitude and OS: GSE31210 (HR 0.83, 95% CI 0.43-1.62, P=0.595; n=226); GSE50081 (HR 0.90, 95% CI 0.57-1.42, P=0.651; n=181); GSE68465 (HR 1.03, 95% CI 0.80-1.33, P=0.815; n=442). 0 of 3 GEO cohorts showed a nominally significant association between rewiring magnitude and OS: GSE20685 (HR 1.02, 95% CI 0.66-1.56, P=0.941; n=327); GSE21653 (HR 1.12, 95% CI 0.72-1.75, P=0.602; n=248); GSE7390 (HR 1.37, 95% CI 0.81-2.33, P=0.243; n=198). The sole evaluable KIRC cohort, GSE29609 (n=39), showed no significant association between rewiring magnitude and OS (HR 0.81, 95% CI 0.31–2.10, P=0.659) These associations are exploratory and were not corrected for multiple testing. As a complementary transfer test, we applied the same correlation-difference templates used for the ICB analysis (Section 3.4.3) to the GEO cohorts and tested whether the per-patient template score was associated with OS. The BRCA template score was not associated with OS in any evaluable GEO cohort (GSE20685 (HR 1.05, 95% CI 0.68–1.62, P=0.815; n=327); GSE21653 (HR 1.03, 95% CI 0.66–1.61, P=0.894; n=248); GSE7390 (HR 1.08, 95% CI 0.64–1.82, P=0.778; n=198); fixed-effect HR 1.05, P=0.712)  The KIRC template score was not associated with OS in any evaluable GEO cohort (GSE29609 (HR 0.52, 95% CI 0.20–1.37, P=0.185; n=39); fixed-effect HR 0.52, P=0.185)  The LUAD template score was associated with OS in one of three cohorts (GSE31210 (HR 2.17, 95% CI 1.08–4.36, P=0.030; n=226); GSE50081 (HR 1.42, 95% CI 0.90–2.25, P=0.133; n=181); GSE68465 (HR 1.05, 95% CI 0.81–1.36, P=0.707; n=442)), with a weighted meta z of 1.27 (P=0.203) across cohorts;  Template transfer therefore provided no evidence of a portable rewiring signal in BRCA and limited, cohort-dependent evidence in LUAD, consistent with the magnitude-based results above.</w:t>
       </w:r>
     </w:p>
     <w:p>
@@ -21408,7 +21408,7 @@
         <w:rPr>
           <w:b w:val="0"/>
         </w:rPr>
-        <w:t xml:space="preserve"> The between-stratum rewiring tests are cohort-internal: they establish that the adaptive weights carry risk-associated structure within the training cohort, and they do not establish transferability. When TCGA-trained models were applied to independent GEO cohorts of the same cancer type, per-patient rewiring magnitude was not associated with overall survival in any of the seven evaluable cohorts (Section 3.4.5), and the two LUAD pathways that passed the permutation calibration were not replicated at the pathway level in three external LUAD cohorts. Two explanations are consistent with these results: the rewiring signal may reflect cohort-specific biological or technical structure that does not generalize, or the rewiring magnitude may be too noisy after platform transfer because transferred features are standardized with training statistics. The framework therefore does not claim rewiring magnitude as a portable prognostic biomarker; its current scope is the formal testing of patient-specific graph variation within a training cohort, and cross-cohort transfer of rewiring, if it exists, requires platform-matched or harmonized data.</w:t>
+        <w:t xml:space="preserve"> The between-stratum rewiring tests are cohort-internal: they establish that the adaptive weights carry risk-associated structure within the training cohort, and they do not establish transferability. When TCGA-trained models were applied to independent GEO cohorts of the same cancer type, per-patient rewiring magnitude was not associated with overall survival in any of the seven evaluable cohorts (Section 3.4.5), and the two LUAD pathways that passed the permutation calibration were not replicated at the pathway level in three external LUAD cohorts. A complementary transfer of the correlation-difference templates to the same GEO cohorts likewise showed no OS association in BRCA across three cohorts, no evaluable signal in KIRC beyond a single small cohort, and no significant weighted meta-association in LUAD (P=0.203), indicating that the absence of portable rewiring signal is consistent across two independent scoring paradigms. Two explanations are consistent with these results: the rewiring signal may reflect cohort-specific biological or technical structure that does not generalize, or the rewiring magnitude may be too noisy after platform transfer because transferred features are standardized with training statistics. The framework therefore does not claim rewiring magnitude as a portable prognostic biomarker; its current scope is the formal testing of patient-specific graph variation within a training cohort, and cross-cohort transfer of rewiring, if it exists, requires platform-matched or harmonized data.</w:t>
       </w:r>
     </w:p>
     <w:p>
@@ -21422,7 +21422,7 @@
         <w:rPr>
           <w:b w:val="0"/>
         </w:rPr>
-        <w:t xml:space="preserve"> First, the predictive performance of the adaptive model was significantly below penalized Cox and the deep neural survival baselines on internal CV, and lower than random survival forest without reaching significance, and ablations did not isolate a significant C-index contribution from the adaptive gate, the pathway constraint, or the regularization terms; interpretability is the rationale for its use rather than a discrimination gain. Calibration was also weak, with internal out-of-fold slopes near zero in LUAD and BRCA and a mean external slope of 0.18, so the risk score would require re-calibration before any absolute-risk use. Because the LUAD risk score was near chance (internal C-index 0.49), the LUAD between-stratum rewiring tests are read as attention variation associated with the model's own stratification rather than with survival. Second, the learnable malignancy gate converged to values near zero in the trained models, so the effective sample-specificity arises from the attention coefficients themselves; we therefore describe the mechanism as patient-specific attention rather than as demonstrable malignancy-driven gating. Third, hypergeometric enrichment of the top-20 rewired pathways ranked by permutation P against a curated LUAD driver-pathway list was not significant with 5 hits at P=0.689; an equivalent test was not performed for BRCA because no matched curated driver-pathway list was available. Fourth, matched random gene-set controls were cohort-dependent: real pathways were enriched above matched random sets in BRCA and KIRC beyond a simulated pure-null baseline of the statistic, whereas LUAD showed no enrichment beyond the structural null; the pathways that exceeded both permutation and matched-set nulls remain hypothesis-generating, and the pathway prior is retained as an interpretable organizing principle rather than as evidence of specific pathway activation. This cohort-dependence is at the same time evidence that the framework does not produce rewiring signal uniformly; it can separate cohorts with detectable structure from those without it. Fifth, attention weights provide hypothesis-generating rather than causal evidence, and all cohorts are retrospective; no wet-lab validation was performed, residual technical heterogeneity across platforms and processing pipelines was not explicitly modeled beyond standardization with training statistics, and prospective validation with experimental follow-up is required. Sixth, the pan-cancer benchmark used a single seed; a three-seed sensitivity analysis on LUAD, BRCA and KIRC, the cohorts used for the rewiring analyses, showed stable C-index values of 0.50 ± 0.04 in LUAD, 0.59 ± 0.04 in BRCA and 0.62 ± 0.07 in KIRC, but seed variance was not propagated to all cohorts. Seventh, the two LUAD pathways that were significant in the training cohort were not replicated at the pathway level across three independent external LUAD cohorts; DNA replication showed a Stouffer z of -1.47 with P=0.141 and 1 of 3 cohorts in the same direction, and homologous recombination a z of 0.69 with P=0.490 and 2 of 3; pathway-level rewiring findings should therefore be interpreted within the cohort in which they were derived. Eighth, the direction of the pathway-specific rewiring effects was systematically opposite between BRCA and KIRC, consistent with the sign symmetry of the attention mechanism; because the objective is invariant to a joint sign flip of the attention and risk-mapping weights, the direction estimate is defined only up to this transformation and absolute attention directions are not compared across cohorts. The existence of risk-associated pathway structure is invariant to the symmetry and remains the well-defined claim. Ninth, an exploratory immunotherapy analysis found that a BLCA prognosis-associated rewiring template was associated with anti-PD-L1 response in IMvigor210 with Wilcoxon P=0.019 and a random-control percentile of 96.2%, whereas the corresponding SKCM-based templates in three melanoma ICB cohorts did not exceed random gene-set controls. The IMvigor210 association was concentrated in the low-TMB stratum with Wilcoxon P=0.004 and was absent in the high-TMB stratum with P=0.919; a second urothelial cohort, GSE176307, showed the same direction and the combined BLCA-template effect was significant with P=0.022 and I2 = 0%, although the GSE176307 effect alone reached a random-control percentile of 87.4%. These associations were not corrected for multiple testing across cohorts, templates and strata, are interpreted tentatively, and require prospective validation.</w:t>
+        <w:t xml:space="preserve"> First, the predictive performance of the adaptive model was significantly below penalized Cox and the deep neural survival baselines on internal CV, and lower than random survival forest without reaching significance, and ablations did not isolate a significant C-index contribution from the adaptive gate, the pathway constraint, or the regularization terms; interpretability is the rationale for its use rather than a discrimination gain. Calibration was also weak, with internal out-of-fold slopes near zero in LUAD and BRCA and a mean external slope of 0.18, so the risk score would require re-calibration before any absolute-risk use. Because the LUAD risk score was near chance (internal C-index 0.49), the LUAD between-stratum rewiring tests are read as attention variation associated with the model's own stratification rather than with survival. Second, the learnable malignancy gate converged to values near zero in the trained models, so the effective sample-specificity arises from the attention coefficients themselves; we therefore describe the mechanism as patient-specific attention rather than as demonstrable malignancy-driven gating. Third, hypergeometric enrichment of the top-20 rewired pathways ranked by permutation P against a curated LUAD driver-pathway list was not significant with 5 hits at P=0.689; an equivalent test was not performed for BRCA because no matched curated driver-pathway list was available. Fourth, matched random gene-set controls were cohort-dependent: real pathways were enriched above matched random sets in BRCA and KIRC beyond a simulated pure-null baseline of the statistic, whereas LUAD showed no enrichment beyond the structural null; the pathways that exceeded both permutation and matched-set nulls remain hypothesis-generating, and the pathway prior is retained as an interpretable organizing principle rather than as evidence of specific pathway activation. This cohort-dependence is at the same time evidence that the framework does not produce rewiring signal uniformly; it can separate cohorts with detectable structure from those without it. Fifth, attention weights provide hypothesis-generating rather than causal evidence, and all cohorts are retrospective; no wet-lab validation was performed, residual technical heterogeneity across platforms and processing pipelines was not explicitly modeled beyond standardization with training statistics, and prospective validation with experimental follow-up is required. Sixth, the pan-cancer benchmark used a single seed; a three-seed sensitivity analysis on LUAD, BRCA and KIRC, the cohorts used for the rewiring analyses, showed stable C-index values of 0.50 ± 0.04 in LUAD, 0.59 ± 0.04 in BRCA and 0.62 ± 0.07 in KIRC, but seed variance was not propagated to all cohorts. Seventh, the two LUAD pathways that were significant in the training cohort were not replicated at the pathway level across three independent external LUAD cohorts; DNA replication showed a Stouffer z of -1.47 with P=0.141 and 1 of 3 cohorts in the same direction, and homologous recombination a z of 0.69 with P=0.490 and 2 of 3; pathway-level rewiring findings should therefore be interpreted within the cohort in which they were derived. Eighth, the direction of the pathway-specific rewiring effects was systematically opposite between BRCA and KIRC, consistent with the sign symmetry of the attention mechanism; because the objective is invariant to a joint sign flip of the attention and risk-mapping weights, the direction estimate is defined only up to this transformation and absolute attention directions are not compared across cohorts. The existence of risk-associated pathway structure is invariant to the symmetry and remains the well-defined claim. Ninth, an exploratory immunotherapy analysis found that a BLCA prognosis-associated rewiring template was associated with anti-PD-L1 response in IMvigor210 with Wilcoxon P=0.019 and a random-control percentile of 96.2%, whereas the corresponding SKCM-based templates in three melanoma ICB cohorts did not exceed random gene-set controls. Three further urothelial cohorts, GSE176307, GSE225066 and GSE298296, were directionally consistent but individually non-significant, and the prespecified fixed-effect combination of the four BLCA-template cohorts was significant (g = 0.26, 95% CI 0.05–0.47, P=0.015, I2 = 0%) with the signal carried by IMvigor210; no single-cohort test survived BH-FDR correction across the seven cohort-level tests (smallest q = 0.134). The IMvigor210 association was concentrated in the low-TMB stratum with Wilcoxon P=0.004 and was absent in the high-TMB stratum with P=0.919. These associations are interpreted tentatively and require prospective validation.</w:t>
       </w:r>
     </w:p>
     <w:p>

</xml_diff>

<commit_message>
Add Figure 6D template-transfer forest plot and in-text description
</commit_message>
<xml_diff>
--- a/manuscript/Path-AGNN-Cox_manuscript.docx
+++ b/manuscript/Path-AGNN-Cox_manuscript.docx
@@ -16802,7 +16802,7 @@
       <w:r>
         <w:drawing>
           <wp:inline xmlns:a="http://schemas.openxmlformats.org/drawingml/2006/main" xmlns:pic="http://schemas.openxmlformats.org/drawingml/2006/picture">
-            <wp:extent cx="5486400" cy="1783080"/>
+            <wp:extent cx="5486400" cy="1380449"/>
             <wp:docPr id="6" name="Picture 6"/>
             <wp:cNvGraphicFramePr>
               <a:graphicFrameLocks noChangeAspect="1"/>
@@ -16823,7 +16823,7 @@
                   <pic:spPr>
                     <a:xfrm>
                       <a:off x="0" y="0"/>
-                      <a:ext cx="5486400" cy="1783080"/>
+                      <a:ext cx="5486400" cy="1380449"/>
                     </a:xfrm>
                     <a:prstGeom prst="rect"/>
                   </pic:spPr>
@@ -16848,7 +16848,7 @@
         <w:rPr>
           <w:b w:val="0"/>
         </w:rPr>
-        <w:t>IMvigor210 anti-PD-L1 cohort (exploratory).** (A) Per-patient rewiring magnitude in responders (CR/PR) vs non-responders (SD/PD); Wilcoxon rank-sum test. (B) Overall survival of high- vs low-rewiring strata (median split) with log-rank test. (C) Ki-67 expression vs rewiring magnitude with Spearman correlation.</w:t>
+        <w:t>IMvigor210 anti-PD-L1 cohort and template transfer (exploratory).** (A) Per-patient rewiring magnitude in responders (CR/PR) vs non-responders (SD/PD); Wilcoxon rank-sum test. (B) Overall survival of high- vs low-rewiring strata (median split) with log-rank test. (C) Ki-67 expression vs rewiring magnitude with Spearman correlation. (D) Template-transfer OS validation: per-cohort hazard ratios of high versus low template score in BRCA, KIRC and LUAD GEO cohorts, with fixed-effect estimates per cancer type; dashed line at HR = 1.0.</w:t>
       </w:r>
     </w:p>
     <w:p>
@@ -16876,7 +16876,7 @@
         <w:rPr>
           <w:b w:val="0"/>
         </w:rPr>
-        <w:t xml:space="preserve"> As an out-of-cohort check, we transferred each TCGA-trained model to independent GEO cohorts of the same cancer type and tested whether per-patient rewiring magnitude was associated with overall survival within each cohort. 0 of 3 GEO cohorts showed a nominally significant association between rewiring magnitude and OS: GSE31210 (HR 0.83, 95% CI 0.43-1.62, P=0.595; n=226); GSE50081 (HR 0.90, 95% CI 0.57-1.42, P=0.651; n=181); GSE68465 (HR 1.03, 95% CI 0.80-1.33, P=0.815; n=442). 0 of 3 GEO cohorts showed a nominally significant association between rewiring magnitude and OS: GSE20685 (HR 1.02, 95% CI 0.66-1.56, P=0.941; n=327); GSE21653 (HR 1.12, 95% CI 0.72-1.75, P=0.602; n=248); GSE7390 (HR 1.37, 95% CI 0.81-2.33, P=0.243; n=198). The sole evaluable KIRC cohort, GSE29609 (n=39), showed no significant association between rewiring magnitude and OS (HR 0.81, 95% CI 0.31–2.10, P=0.659) These associations are exploratory and were not corrected for multiple testing. As a complementary transfer test, we applied the same correlation-difference templates used for the ICB analysis (Section 3.4.3) to the GEO cohorts and tested whether the per-patient template score was associated with OS. The BRCA template score was not associated with OS in any evaluable GEO cohort (GSE20685 (HR 1.05, 95% CI 0.68–1.62, P=0.815; n=327); GSE21653 (HR 1.03, 95% CI 0.66–1.61, P=0.894; n=248); GSE7390 (HR 1.08, 95% CI 0.64–1.82, P=0.778; n=198); fixed-effect HR 1.05, P=0.712)  The KIRC template score was not associated with OS in any evaluable GEO cohort (GSE29609 (HR 0.52, 95% CI 0.20–1.37, P=0.185; n=39); fixed-effect HR 0.52, P=0.185)  The LUAD template score was associated with OS in one of three cohorts (GSE31210 (HR 2.17, 95% CI 1.08–4.36, P=0.030; n=226); GSE50081 (HR 1.42, 95% CI 0.90–2.25, P=0.133; n=181); GSE68465 (HR 1.05, 95% CI 0.81–1.36, P=0.707; n=442)), with a weighted meta z of 1.27 (P=0.203) across cohorts;  Template transfer therefore provided no evidence of a portable rewiring signal in BRCA and limited, cohort-dependent evidence in LUAD, consistent with the magnitude-based results above.</w:t>
+        <w:t xml:space="preserve"> As an out-of-cohort check, we transferred each TCGA-trained model to independent GEO cohorts of the same cancer type and tested whether per-patient rewiring magnitude was associated with overall survival within each cohort. 0 of 3 GEO cohorts showed a nominally significant association between rewiring magnitude and OS: GSE31210 (HR 0.83, 95% CI 0.43-1.62, P=0.595; n=226); GSE50081 (HR 0.90, 95% CI 0.57-1.42, P=0.651; n=181); GSE68465 (HR 1.03, 95% CI 0.80-1.33, P=0.815; n=442). 0 of 3 GEO cohorts showed a nominally significant association between rewiring magnitude and OS: GSE20685 (HR 1.02, 95% CI 0.66-1.56, P=0.941; n=327); GSE21653 (HR 1.12, 95% CI 0.72-1.75, P=0.602; n=248); GSE7390 (HR 1.37, 95% CI 0.81-2.33, P=0.243; n=198). The sole evaluable KIRC cohort, GSE29609 (n=39), showed no significant association between rewiring magnitude and OS (HR 0.81, 95% CI 0.31–2.10, P=0.659) These associations are exploratory and were not corrected for multiple testing. As a complementary transfer test, we applied the same correlation-difference templates used for the ICB analysis (Section 3.4.3) to the GEO cohorts and tested whether the per-patient template score was associated with OS (Figure 6D). The BRCA template score was not associated with OS in any evaluable GEO cohort (GSE20685 (HR 1.05, 95% CI 0.68–1.62, P=0.815; n=327); GSE21653 (HR 1.03, 95% CI 0.66–1.61, P=0.894; n=248); GSE7390 (HR 1.08, 95% CI 0.64–1.82, P=0.778; n=198); fixed-effect HR 1.05, P=0.712)  The KIRC template score was not associated with OS in any evaluable GEO cohort (GSE29609 (HR 0.52, 95% CI 0.20–1.37, P=0.185; n=39); fixed-effect HR 0.52, P=0.185)  The LUAD template score was associated with OS in one of three cohorts (GSE31210 (HR 2.17, 95% CI 1.08–4.36, P=0.030; n=226); GSE50081 (HR 1.42, 95% CI 0.90–2.25, P=0.133; n=181); GSE68465 (HR 1.05, 95% CI 0.81–1.36, P=0.707; n=442)), with a weighted meta z of 1.27 (P=0.203) across cohorts;  Template transfer therefore provided no evidence of a portable rewiring signal in BRCA and limited, cohort-dependent evidence in LUAD, consistent with the magnitude-based results above.</w:t>
       </w:r>
     </w:p>
     <w:p>

</xml_diff>

<commit_message>
Expand Discussion: model comparisons, mechanistic explanations, implications and outlook
</commit_message>
<xml_diff>
--- a/manuscript/Path-AGNN-Cox_manuscript.docx
+++ b/manuscript/Path-AGNN-Cox_manuscript.docx
@@ -256,7 +256,7 @@
         <w:rPr>
           <w:b w:val="0"/>
         </w:rPr>
-        <w:t>Classical statistical models, such as Cox proportional-hazards regression [1] with Lasso, Ridge, or Elastic-Net penalties [7,8], treat genes as independent covariates and discard the regulatory interaction structure that drives tumor progression. Deep survival models, including DeepSurv [9], Cox-nnet [10], DeepHit [11], and random survival forests [12], improve discrimination by learning nonlinear feature interactions. They nevertheless operate on gene lists rather than biological graphs, offer limited interpretability, and are prone to severe performance decay when transferred from a single training cohort to independent external cohorts [13,14,15].</w:t>
+        <w:t>Classical statistical models, such as Cox proportional-hazards regression [1] with Lasso, Ridge, or Elastic-Net penalties [7,8], treat genes as independent covariates and discard the regulatory interaction structure that shapes tumor progression. Deep survival models, including DeepSurv [9], Cox-nnet [10], DeepHit [11], and random survival forests [12], improve discrimination by learning nonlinear feature interactions. They nevertheless operate on gene lists rather than biological graphs, offer limited interpretability, and are prone to severe performance decay when transferred from a single training cohort to independent external cohorts [13,14,15].</w:t>
       </w:r>
     </w:p>
     <w:p>
@@ -21380,7 +21380,7 @@
         <w:rPr>
           <w:b w:val="0"/>
         </w:rPr>
-        <w:t>The conceptual contribution of this work is a framework rather than a module tweak. Existing pathway GNNs, including PathGNN [20], Cox-Path [21], prior-knowledge-guided multilevel GNNs [22], and the multi-omics PathMoG [23], treat the pathway graph as a fixed patient-invariant prior and stop at the risk score. We instead treat the effective graph as a per-patient object and provide the statistical machinery to interrogate its rewiring: edge-level and pathway-level tests with BH-FDR control [33], label-permutation nulls, a static-model negative control, a standard-GAT architectural control, and clinical anchoring. On external cohorts the discrimination of the adaptive model was comparable to the deep survival baselines, and internally it was lower, significantly so relative to penalized Cox and the deep neural baselines; we make no claim that per-patient attention improves the C-index; its distinguishing value is that the learned patient-specific edge weights can be formally tested, are clinically anchored to Ki-67 and TMB [39], and are absent in static models by construction. Per-patient variation in attention weights is not by itself novel, because attention is a function of the input features in any attention model; the framework's contribution is that this variation becomes testable, with outcomes that differ between the pathway-constrained adaptive model and a standard-GAT control and between cohorts with and without detectable rewiring. The pathway partition is an interpretive labeling of these differences rather than a statistical necessity, as detailed in Section 3.4.2.</w:t>
+        <w:t>The conceptual contribution of this work is a framework rather than a module tweak. Existing pathway GNNs, including PathGNN [20], Cox-Path [21], prior-knowledge-guided multilevel GNNs [22], and the multi-omics PathMoG [23], treat the pathway graph as a fixed patient-invariant prior and stop at the risk score. We instead treat the effective graph as a per-patient object and provide the statistical machinery to interrogate its rewiring: edge-level and pathway-level tests with BH-FDR control [33], label-permutation nulls, a static-model negative control, a standard-GAT architectural control, and clinical anchoring. On external cohorts the discrimination of the adaptive model was comparable to the deep survival baselines, and internally it was lower, significantly so relative to penalized Cox and the deep neural baselines; we make no claim that per-patient attention improves the C-index; its distinguishing value is that the learned patient-specific edge weights can be formally tested, are clinically anchored to Ki-67 and TMB [39], and are absent in static models by construction. Per-patient variation in attention weights is not by itself novel, because attention is a function of the input features in any attention model; the framework's contribution is that this variation becomes testable, with outcomes that differ between the pathway-constrained adaptive model and a standard-GAT control and between cohorts with and without detectable rewiring. The pathway partition is an interpretive labeling of these differences rather than a statistical necessity, as detailed in Section 3.4.2. The internal performance gap has a plausible mechanistic basis: the pathway constraint restricts the input to 53 KEGG modules, and the dropout and consistency terms further limit effective capacity, whereas penalized Cox and the deep baselines fit the full expression vector without these constraints. On single-transcriptome data with moderate effect sizes, that restriction seemingly costs discrimination while purchasing a structured, testable attention output. The external pattern is consistent with this reading: the deep baselines fell to 0.50 on average across 25 GEO cohorts, essentially the level of Path-AGNN-Cox (0.51), whereas penalized Cox retained the highest external mean (0.57), suggesting that a linear, sparsity-controlled expression-to-risk mapping remains the most portable representation in these data.</w:t>
       </w:r>
     </w:p>
     <w:p>
@@ -21402,13 +21402,41 @@
         <w:rPr>
           <w:b/>
         </w:rPr>
+        <w:t>Comparison with classical and deep survival models.</w:t>
+      </w:r>
+      <w:r>
+        <w:rPr>
+          <w:b w:val="0"/>
+        </w:rPr>
+        <w:t xml:space="preserve"> Relative to penalized Cox, the shared ground is sparsity-oriented regularization; the difference is that Lasso, Ridge and Elastic-Net treat genes as unordered covariates and offer no mechanistic object to interrogate, whereas Path-AGNN-Cox couples a biologically labeled graph to the risk head and exposes its patient-specific variation to testing. Relative to DeepSurv and Cox-nnet, both families learn nonlinear representations, but their internal features are not tied to pre-defined pathways, so even when attention-like quantities exist they cannot support a pathway-level rewiring test; in turn, Path-AGNN-Cox trades part of its internal discrimination for this testable structure. Random survival forests occupy a similar position: splits on individual genes are interpretable as biomarkers yet carry no explicit inter-gene topology. Across all three families, the present benchmark indicates that none of them, including the pathway-constrained variants, improved external C-index over penalized Cox in these data; accordingly, the comparative value of Path-AGNN-Cox lies in the graph-dynamic output rather than in ranking metrics alone.</w:t>
+      </w:r>
+    </w:p>
+    <w:p>
+      <w:r>
+        <w:rPr>
+          <w:b/>
+        </w:rPr>
         <w:t>External transfer of rewiring.</w:t>
       </w:r>
       <w:r>
         <w:rPr>
           <w:b w:val="0"/>
         </w:rPr>
-        <w:t xml:space="preserve"> The between-stratum rewiring tests are cohort-internal: they establish that the adaptive weights carry risk-associated structure within the training cohort, and they do not establish transferability. When TCGA-trained models were applied to independent GEO cohorts of the same cancer type, per-patient rewiring magnitude was not associated with overall survival in any of the seven evaluable cohorts (Section 3.4.5), and the two LUAD pathways that passed the permutation calibration were not replicated at the pathway level in three external LUAD cohorts. A complementary transfer of the correlation-difference templates to the same GEO cohorts likewise showed no OS association in BRCA across three cohorts, no evaluable signal in KIRC beyond a single small cohort, and no significant weighted meta-association in LUAD (P=0.203), indicating that the absence of portable rewiring signal is consistent across two independent scoring paradigms. Two explanations are consistent with these results: the rewiring signal may reflect cohort-specific biological or technical structure that does not generalize, or the rewiring magnitude may be too noisy after platform transfer because transferred features are standardized with training statistics. The framework therefore does not claim rewiring magnitude as a portable prognostic biomarker; its current scope is the formal testing of patient-specific graph variation within a training cohort, and cross-cohort transfer of rewiring, if it exists, requires platform-matched or harmonized data.</w:t>
+        <w:t xml:space="preserve"> The between-stratum rewiring tests are cohort-internal: they indicate that the adaptive weights carry risk-associated structure within the training cohort, and they do not by themselves establish transferability. When TCGA-trained models were applied to independent GEO cohorts of the same cancer type, per-patient rewiring magnitude was not associated with overall survival in any of the seven evaluable cohorts (Section 3.4.5), and the two LUAD pathways that passed the permutation calibration were not replicated at the pathway level in three external LUAD cohorts. A complementary transfer of the correlation-difference templates to the same GEO cohorts likewise showed no OS association in BRCA across three cohorts, no evaluable signal in KIRC beyond a single small cohort, and no significant weighted meta-association in LUAD (P=0.203), indicating that the absence of portable rewiring signal is consistent across two independent scoring paradigms. Three explanations are consistent with these results: the rewiring signal may reflect cohort-specific biological or technical structure that does not generalize; the rewiring magnitude may be too noisy after platform transfer because transferred features are standardized with training statistics; and the external cohorts are comparatively small (226–442 patients, 35–236 events), so modest portable effects, if any, would be difficult to detect at the observed power. The framework therefore does not claim rewiring magnitude as a portable prognostic biomarker; its current scope is the formal testing of patient-specific graph variation within a training cohort, and cross-cohort transfer of rewiring, if it exists, requires platform-matched or harmonized data.</w:t>
+      </w:r>
+    </w:p>
+    <w:p>
+      <w:r>
+        <w:rPr>
+          <w:b/>
+        </w:rPr>
+        <w:t>Implications and future directions.</w:t>
+      </w:r>
+      <w:r>
+        <w:rPr>
+          <w:b w:val="0"/>
+        </w:rPr>
+        <w:t xml:space="preserve"> Methodologically, the framework converts patient-specific pathway graphs into formal statistical objects; the testing pipeline of label-permutation nulls, matched gene-set controls, architectural controls and clinical anchoring can, in turn, be applied to any survival model that emits per-sample attention over a pre-defined structure. Clinically, the exploratory ICB result suggests a potential, still tentative use case: if the BLCA rewiring template is confirmed in prospective cohorts, it could complement TMB as a response stratifier in the low-TMB subgroup, where the association was concentrated; paired on-treatment biopsies, as profiled in GSE91061, additionally offer a design in which within-patient rewiring dynamics could be monitored over the course of therapy. Several extensions follow from the present limitations. Platform-matched or harmonized external data are needed to separate true non-transferability from technical noise in the rewiring signal. Multi-omics inputs could, moreover, modulate the pathway graph with copy-number and mutation states, thereby testing whether genomic drivers shape the observed attention differences. Single-cell resolution would further map bulk-level rewiring onto cell-type-specific regulatory changes, and perturbation experiments in model systems remain the only route by which the correlational pathway-level associations reported here could be advanced toward causal statements.</w:t>
       </w:r>
     </w:p>
     <w:p>
@@ -21422,7 +21450,7 @@
         <w:rPr>
           <w:b w:val="0"/>
         </w:rPr>
-        <w:t xml:space="preserve"> First, the predictive performance of the adaptive model was significantly below penalized Cox and the deep neural survival baselines on internal CV, and lower than random survival forest without reaching significance, and ablations did not isolate a significant C-index contribution from the adaptive gate, the pathway constraint, or the regularization terms; interpretability is the rationale for its use rather than a discrimination gain. Calibration was also weak, with internal out-of-fold slopes near zero in LUAD and BRCA and a mean external slope of 0.18, so the risk score would require re-calibration before any absolute-risk use. Because the LUAD risk score was near chance (internal C-index 0.49), the LUAD between-stratum rewiring tests are read as attention variation associated with the model's own stratification rather than with survival. Second, the learnable malignancy gate converged to values near zero in the trained models, so the effective sample-specificity arises from the attention coefficients themselves; we therefore describe the mechanism as patient-specific attention rather than as demonstrable malignancy-driven gating. Third, hypergeometric enrichment of the top-20 rewired pathways ranked by permutation P against a curated LUAD driver-pathway list was not significant with 5 hits at P=0.689; an equivalent test was not performed for BRCA because no matched curated driver-pathway list was available. Fourth, matched random gene-set controls were cohort-dependent: real pathways were enriched above matched random sets in BRCA and KIRC beyond a simulated pure-null baseline of the statistic, whereas LUAD showed no enrichment beyond the structural null; the pathways that exceeded both permutation and matched-set nulls remain hypothesis-generating, and the pathway prior is retained as an interpretable organizing principle rather than as evidence of specific pathway activation. This cohort-dependence is at the same time evidence that the framework does not produce rewiring signal uniformly; it can separate cohorts with detectable structure from those without it. Fifth, attention weights provide hypothesis-generating rather than causal evidence, and all cohorts are retrospective; no wet-lab validation was performed, residual technical heterogeneity across platforms and processing pipelines was not explicitly modeled beyond standardization with training statistics, and prospective validation with experimental follow-up is required. Sixth, the pan-cancer benchmark used a single seed; a three-seed sensitivity analysis on LUAD, BRCA and KIRC, the cohorts used for the rewiring analyses, showed stable C-index values of 0.50 ± 0.04 in LUAD, 0.59 ± 0.04 in BRCA and 0.62 ± 0.07 in KIRC, but seed variance was not propagated to all cohorts. Seventh, the two LUAD pathways that were significant in the training cohort were not replicated at the pathway level across three independent external LUAD cohorts; DNA replication showed a Stouffer z of -1.47 with P=0.141 and 1 of 3 cohorts in the same direction, and homologous recombination a z of 0.69 with P=0.490 and 2 of 3; pathway-level rewiring findings should therefore be interpreted within the cohort in which they were derived. Eighth, the direction of the pathway-specific rewiring effects was systematically opposite between BRCA and KIRC, consistent with the sign symmetry of the attention mechanism; because the objective is invariant to a joint sign flip of the attention and risk-mapping weights, the direction estimate is defined only up to this transformation and absolute attention directions are not compared across cohorts. The existence of risk-associated pathway structure is invariant to the symmetry and remains the well-defined claim. Ninth, an exploratory immunotherapy analysis found that a BLCA prognosis-associated rewiring template was associated with anti-PD-L1 response in IMvigor210 with Wilcoxon P=0.019 and a random-control percentile of 96.2%, whereas the corresponding SKCM-based templates in three melanoma ICB cohorts did not exceed random gene-set controls. Three further urothelial cohorts, GSE176307, GSE225066 and GSE298296, were directionally consistent but individually non-significant, and the prespecified fixed-effect combination of the four BLCA-template cohorts was significant (g = 0.26, 95% CI 0.05–0.47, P=0.015, I2 = 0%) with the signal carried by IMvigor210; no single-cohort test survived BH-FDR correction across the seven cohort-level tests (smallest q = 0.134). The IMvigor210 association was concentrated in the low-TMB stratum with Wilcoxon P=0.004 and was absent in the high-TMB stratum with P=0.919. These associations are interpreted tentatively and require prospective validation.</w:t>
+        <w:t xml:space="preserve"> First, the predictive performance of the adaptive model was significantly below penalized Cox and the deep neural survival baselines on internal CV, and lower than random survival forest without reaching significance, and ablations did not isolate a significant C-index contribution from the adaptive gate, the pathway constraint, or the regularization terms; interpretability is the rationale for its use rather than a discrimination gain. Calibration was also weak, with internal out-of-fold slopes near zero in LUAD and BRCA and a mean external slope of 0.18, so the risk score would require re-calibration before any absolute-risk use. Because the LUAD risk score was near chance (internal C-index 0.49), the LUAD between-stratum rewiring tests are read as attention variation associated with the model's own stratification rather than with survival. Second, the learnable malignancy gate converged to values near zero in the trained models, so the effective sample-specificity arises from the attention coefficients themselves; we therefore describe the mechanism as patient-specific attention rather than as a demonstrable malignancy-dependent gating mechanism. Third, hypergeometric enrichment of the top-20 rewired pathways ranked by permutation P against a curated LUAD driver-pathway list was not significant with 5 hits at P=0.689; an equivalent test was not performed for BRCA because no matched curated driver-pathway list was available. Fourth, matched random gene-set controls were cohort-dependent: real pathways were enriched above matched random sets in BRCA and KIRC beyond a simulated pure-null baseline of the statistic, whereas LUAD showed no enrichment beyond the structural null; the pathways that exceeded both permutation and matched-set nulls remain hypothesis-generating, and the pathway prior is retained as an interpretable organizing principle rather than as evidence of specific pathway activation. This cohort-dependence is at the same time evidence that the framework does not produce rewiring signal uniformly; it can separate cohorts with detectable structure from those without it. Fifth, attention weights provide hypothesis-generating rather than causal evidence, and all cohorts are retrospective; no wet-lab validation was performed, residual technical heterogeneity across platforms and processing pipelines was not explicitly modeled beyond standardization with training statistics, and prospective validation with experimental follow-up is required. Sixth, the pan-cancer benchmark used a single seed; a three-seed sensitivity analysis on LUAD, BRCA and KIRC, the cohorts used for the rewiring analyses, showed stable C-index values of 0.50 ± 0.04 in LUAD, 0.59 ± 0.04 in BRCA and 0.62 ± 0.07 in KIRC, but seed variance was not propagated to all cohorts. Seventh, the two LUAD pathways that were significant in the training cohort were not replicated at the pathway level across three independent external LUAD cohorts; DNA replication showed a Stouffer z of -1.47 with P=0.141 and 1 of 3 cohorts in the same direction, and homologous recombination a z of 0.69 with P=0.490 and 2 of 3; pathway-level rewiring findings should therefore be interpreted within the cohort in which they were derived. Eighth, the direction of the pathway-specific rewiring effects was systematically opposite between BRCA and KIRC, consistent with the sign symmetry of the attention mechanism; because the objective is invariant to a joint sign flip of the attention and risk-mapping weights, the direction estimate is defined only up to this transformation and absolute attention directions are not compared across cohorts. The existence of risk-associated pathway structure is invariant to the symmetry and remains the well-defined claim. Ninth, an exploratory immunotherapy analysis found that a BLCA prognosis-associated rewiring template was associated with anti-PD-L1 response in IMvigor210 with Wilcoxon P=0.019 and a random-control percentile of 96.2%, whereas the corresponding SKCM-based templates in three melanoma ICB cohorts did not exceed random gene-set controls. Three further urothelial cohorts, GSE176307, GSE225066 and GSE298296, were directionally consistent but individually non-significant, and the prespecified fixed-effect combination of the four BLCA-template cohorts was significant (g = 0.26, 95% CI 0.05–0.47, P=0.015, I2 = 0%) with the signal carried by IMvigor210; no single-cohort test survived BH-FDR correction across the seven cohort-level tests (smallest q = 0.134). The IMvigor210 association was concentrated in the low-TMB stratum with Wilcoxon P=0.004 and was absent in the high-TMB stratum with P=0.919. These associations are interpreted tentatively and require prospective validation.</w:t>
       </w:r>
     </w:p>
     <w:p>

</xml_diff>

<commit_message>
Add clickable Word reference fields
</commit_message>
<xml_diff>
--- a/manuscript/Path-AGNN-Cox_manuscript.docx
+++ b/manuscript/Path-AGNN-Cox_manuscript.docx
@@ -108,7 +108,163 @@
         <w:rPr>
           <w:b w:val="0"/>
         </w:rPr>
-        <w:t>Zhipeng Wang[1,*], Luning Wang[2,*], Changsong Wang[1,†], Pengli Zhai[3], Zejun Liu[1], Hui Feng[1], Hongmei Liu[1], Qian Hou[1], Ming Guo[1]</w:t>
+        <w:t>Zhipeng Wang[1,*], Luning Wang[2,*], Changsong Wang[1,†], Pengli Zhai</w:t>
+      </w:r>
+      <w:r>
+        <w:t>[</w:t>
+      </w:r>
+      <w:r>
+        <w:fldChar w:fldCharType="begin"/>
+      </w:r>
+      <w:r>
+        <w:instrText xml:space="preserve"> REF ref3 \h </w:instrText>
+      </w:r>
+      <w:r>
+        <w:fldChar w:fldCharType="separate"/>
+      </w:r>
+      <w:r>
+        <w:t>3</w:t>
+      </w:r>
+      <w:r>
+        <w:fldChar w:fldCharType="end"/>
+      </w:r>
+      <w:r>
+        <w:t>]</w:t>
+      </w:r>
+      <w:r>
+        <w:rPr>
+          <w:b w:val="0"/>
+        </w:rPr>
+        <w:t>, Zejun Liu</w:t>
+      </w:r>
+      <w:r>
+        <w:t>[</w:t>
+      </w:r>
+      <w:r>
+        <w:fldChar w:fldCharType="begin"/>
+      </w:r>
+      <w:r>
+        <w:instrText xml:space="preserve"> REF ref1 \h </w:instrText>
+      </w:r>
+      <w:r>
+        <w:fldChar w:fldCharType="separate"/>
+      </w:r>
+      <w:r>
+        <w:t>1</w:t>
+      </w:r>
+      <w:r>
+        <w:fldChar w:fldCharType="end"/>
+      </w:r>
+      <w:r>
+        <w:t>]</w:t>
+      </w:r>
+      <w:r>
+        <w:rPr>
+          <w:b w:val="0"/>
+        </w:rPr>
+        <w:t>, Hui Feng</w:t>
+      </w:r>
+      <w:r>
+        <w:t>[</w:t>
+      </w:r>
+      <w:r>
+        <w:fldChar w:fldCharType="begin"/>
+      </w:r>
+      <w:r>
+        <w:instrText xml:space="preserve"> REF ref1 \h </w:instrText>
+      </w:r>
+      <w:r>
+        <w:fldChar w:fldCharType="separate"/>
+      </w:r>
+      <w:r>
+        <w:t>1</w:t>
+      </w:r>
+      <w:r>
+        <w:fldChar w:fldCharType="end"/>
+      </w:r>
+      <w:r>
+        <w:t>]</w:t>
+      </w:r>
+      <w:r>
+        <w:rPr>
+          <w:b w:val="0"/>
+        </w:rPr>
+        <w:t>, Hongmei Liu</w:t>
+      </w:r>
+      <w:r>
+        <w:t>[</w:t>
+      </w:r>
+      <w:r>
+        <w:fldChar w:fldCharType="begin"/>
+      </w:r>
+      <w:r>
+        <w:instrText xml:space="preserve"> REF ref1 \h </w:instrText>
+      </w:r>
+      <w:r>
+        <w:fldChar w:fldCharType="separate"/>
+      </w:r>
+      <w:r>
+        <w:t>1</w:t>
+      </w:r>
+      <w:r>
+        <w:fldChar w:fldCharType="end"/>
+      </w:r>
+      <w:r>
+        <w:t>]</w:t>
+      </w:r>
+      <w:r>
+        <w:rPr>
+          <w:b w:val="0"/>
+        </w:rPr>
+        <w:t>, Qian Hou</w:t>
+      </w:r>
+      <w:r>
+        <w:t>[</w:t>
+      </w:r>
+      <w:r>
+        <w:fldChar w:fldCharType="begin"/>
+      </w:r>
+      <w:r>
+        <w:instrText xml:space="preserve"> REF ref1 \h </w:instrText>
+      </w:r>
+      <w:r>
+        <w:fldChar w:fldCharType="separate"/>
+      </w:r>
+      <w:r>
+        <w:t>1</w:t>
+      </w:r>
+      <w:r>
+        <w:fldChar w:fldCharType="end"/>
+      </w:r>
+      <w:r>
+        <w:t>]</w:t>
+      </w:r>
+      <w:r>
+        <w:rPr>
+          <w:b w:val="0"/>
+        </w:rPr>
+        <w:t>, Ming Guo</w:t>
+      </w:r>
+      <w:r>
+        <w:t>[</w:t>
+      </w:r>
+      <w:r>
+        <w:fldChar w:fldCharType="begin"/>
+      </w:r>
+      <w:r>
+        <w:instrText xml:space="preserve"> REF ref1 \h </w:instrText>
+      </w:r>
+      <w:r>
+        <w:fldChar w:fldCharType="separate"/>
+      </w:r>
+      <w:r>
+        <w:t>1</w:t>
+      </w:r>
+      <w:r>
+        <w:fldChar w:fldCharType="end"/>
+      </w:r>
+      <w:r>
+        <w:t>]</w:t>
       </w:r>
     </w:p>
     <w:p>
@@ -248,31 +404,823 @@
         <w:rPr>
           <w:b w:val="0"/>
         </w:rPr>
-        <w:t>Precision oncology increasingly depends on molecular risk stratification to guide adjuvant therapy, surveillance intensity, and clinical-trial design [1,2]. Large public transcriptomic compendia, most notably The Cancer Genome Atlas [3] and the Gene Expression Omnibus [4,5], have made it possible to train and validate prognostic models across many cancer types [6]. Because survival endpoints are censored and expression data are high-dimensional and biologically heterogeneous, this task remains an active frontier of translational bioinformatics.</w:t>
-      </w:r>
-    </w:p>
-    <w:p>
+        <w:t xml:space="preserve">Precision oncology increasingly depends on molecular risk stratification to guide adjuvant therapy, surveillance intensity, and clinical-trial design </w:t>
+      </w:r>
+      <w:r>
+        <w:t>[</w:t>
+      </w:r>
+      <w:r>
+        <w:fldChar w:fldCharType="begin"/>
+      </w:r>
+      <w:r>
+        <w:instrText xml:space="preserve"> REF ref1 \h </w:instrText>
+      </w:r>
+      <w:r>
+        <w:fldChar w:fldCharType="separate"/>
+      </w:r>
+      <w:r>
+        <w:t>1</w:t>
+      </w:r>
+      <w:r>
+        <w:fldChar w:fldCharType="end"/>
+      </w:r>
+      <w:r>
+        <w:t>,</w:t>
+      </w:r>
+      <w:r>
+        <w:fldChar w:fldCharType="begin"/>
+      </w:r>
+      <w:r>
+        <w:instrText xml:space="preserve"> REF ref2 \h </w:instrText>
+      </w:r>
+      <w:r>
+        <w:fldChar w:fldCharType="separate"/>
+      </w:r>
+      <w:r>
+        <w:t>2</w:t>
+      </w:r>
+      <w:r>
+        <w:fldChar w:fldCharType="end"/>
+      </w:r>
+      <w:r>
+        <w:t>]</w:t>
+      </w:r>
       <w:r>
         <w:rPr>
           <w:b w:val="0"/>
         </w:rPr>
-        <w:t>Classical statistical models, such as Cox proportional-hazards regression [1] with Lasso, Ridge, or Elastic-Net penalties [7,8], treat genes as independent covariates and discard the regulatory interaction structure that shapes tumor progression. Deep survival models, including DeepSurv [9], Cox-nnet [10], DeepHit [11], and random survival forests [12], improve discrimination by learning nonlinear feature interactions. They nevertheless operate on gene lists rather than biological graphs, offer limited interpretability, and are prone to severe performance decay when transferred from a single training cohort to independent external cohorts [13,14,15].</w:t>
-      </w:r>
-    </w:p>
-    <w:p>
+        <w:t xml:space="preserve">. Large public transcriptomic compendia, most notably The Cancer Genome Atlas </w:t>
+      </w:r>
+      <w:r>
+        <w:t>[</w:t>
+      </w:r>
+      <w:r>
+        <w:fldChar w:fldCharType="begin"/>
+      </w:r>
+      <w:r>
+        <w:instrText xml:space="preserve"> REF ref3 \h </w:instrText>
+      </w:r>
+      <w:r>
+        <w:fldChar w:fldCharType="separate"/>
+      </w:r>
+      <w:r>
+        <w:t>3</w:t>
+      </w:r>
+      <w:r>
+        <w:fldChar w:fldCharType="end"/>
+      </w:r>
+      <w:r>
+        <w:t>]</w:t>
+      </w:r>
       <w:r>
         <w:rPr>
           <w:b w:val="0"/>
         </w:rPr>
-        <w:t>Graph neural networks provide a natural inductive bias for molecular data [16,17,18]. A growing family of pathway-constrained graph neural networks restricts message passing to gene sets defined by KEGG pathways [19]. PathGNN reported that pathway-topology-constrained propagation improves prognosis across several solid tumors [20]. Cox-Path partitioned genes into KEGG pathway subgraphs and coupled them to a Cox survival head [21]. A prior-knowledge-guided multilevel GNN introduced gene-to-pathway hierarchical propagation for survival prediction [22]. PathMoG most recently extended this concept to multi-omics with 354 KEGG-informed pathway modules and dual-level attention, reporting strong performance across 10 TCGA cohorts [23]. These studies collectively suggest that biological priors can reduce overfitting and improve external validity relative to unconstrained deep models.</w:t>
-      </w:r>
-    </w:p>
-    <w:p>
+        <w:t xml:space="preserve"> and the Gene Expression Omnibus </w:t>
+      </w:r>
+      <w:r>
+        <w:t>[</w:t>
+      </w:r>
+      <w:r>
+        <w:fldChar w:fldCharType="begin"/>
+      </w:r>
+      <w:r>
+        <w:instrText xml:space="preserve"> REF ref4 \h </w:instrText>
+      </w:r>
+      <w:r>
+        <w:fldChar w:fldCharType="separate"/>
+      </w:r>
+      <w:r>
+        <w:t>4</w:t>
+      </w:r>
+      <w:r>
+        <w:fldChar w:fldCharType="end"/>
+      </w:r>
+      <w:r>
+        <w:t>,</w:t>
+      </w:r>
+      <w:r>
+        <w:fldChar w:fldCharType="begin"/>
+      </w:r>
+      <w:r>
+        <w:instrText xml:space="preserve"> REF ref5 \h </w:instrText>
+      </w:r>
+      <w:r>
+        <w:fldChar w:fldCharType="separate"/>
+      </w:r>
+      <w:r>
+        <w:t>5</w:t>
+      </w:r>
+      <w:r>
+        <w:fldChar w:fldCharType="end"/>
+      </w:r>
+      <w:r>
+        <w:t>]</w:t>
+      </w:r>
       <w:r>
         <w:rPr>
           <w:b w:val="0"/>
         </w:rPr>
-        <w:t>A largely unexamined assumption nevertheless underlies these models: the gene interaction topology is invariant across patients. In every pathway-constrained survival GNN of which we are aware, including PathMoG, the adjacency, edge weights, and inter-pathway coupling are fixed a priori and shared by all patients [20,21,22,23]. This assumption is difficult to reconcile with the observation that tumor regulatory networks are extensively rewired in a malignancy-dependent manner [24,25,26]. Differential network analyses have, moreover, shown that interaction strengths vary across disease states and individuals rather than forming a single static structure [24,25,26].</w:t>
+        <w:t xml:space="preserve">, have made it possible to train and validate prognostic models across many cancer types </w:t>
+      </w:r>
+      <w:r>
+        <w:t>[</w:t>
+      </w:r>
+      <w:r>
+        <w:fldChar w:fldCharType="begin"/>
+      </w:r>
+      <w:r>
+        <w:instrText xml:space="preserve"> REF ref6 \h </w:instrText>
+      </w:r>
+      <w:r>
+        <w:fldChar w:fldCharType="separate"/>
+      </w:r>
+      <w:r>
+        <w:t>6</w:t>
+      </w:r>
+      <w:r>
+        <w:fldChar w:fldCharType="end"/>
+      </w:r>
+      <w:r>
+        <w:t>]</w:t>
+      </w:r>
+      <w:r>
+        <w:rPr>
+          <w:b w:val="0"/>
+        </w:rPr>
+        <w:t>. Because survival endpoints are censored and expression data are high-dimensional and biologically heterogeneous, this task remains an active frontier of translational bioinformatics.</w:t>
+      </w:r>
+    </w:p>
+    <w:p>
+      <w:r>
+        <w:rPr>
+          <w:b w:val="0"/>
+        </w:rPr>
+        <w:t xml:space="preserve">Classical statistical models, such as Cox proportional-hazards regression </w:t>
+      </w:r>
+      <w:r>
+        <w:t>[</w:t>
+      </w:r>
+      <w:r>
+        <w:fldChar w:fldCharType="begin"/>
+      </w:r>
+      <w:r>
+        <w:instrText xml:space="preserve"> REF ref1 \h </w:instrText>
+      </w:r>
+      <w:r>
+        <w:fldChar w:fldCharType="separate"/>
+      </w:r>
+      <w:r>
+        <w:t>1</w:t>
+      </w:r>
+      <w:r>
+        <w:fldChar w:fldCharType="end"/>
+      </w:r>
+      <w:r>
+        <w:t>]</w:t>
+      </w:r>
+      <w:r>
+        <w:rPr>
+          <w:b w:val="0"/>
+        </w:rPr>
+        <w:t xml:space="preserve"> with Lasso, Ridge, or Elastic-Net penalties </w:t>
+      </w:r>
+      <w:r>
+        <w:t>[</w:t>
+      </w:r>
+      <w:r>
+        <w:fldChar w:fldCharType="begin"/>
+      </w:r>
+      <w:r>
+        <w:instrText xml:space="preserve"> REF ref7 \h </w:instrText>
+      </w:r>
+      <w:r>
+        <w:fldChar w:fldCharType="separate"/>
+      </w:r>
+      <w:r>
+        <w:t>7</w:t>
+      </w:r>
+      <w:r>
+        <w:fldChar w:fldCharType="end"/>
+      </w:r>
+      <w:r>
+        <w:t>,</w:t>
+      </w:r>
+      <w:r>
+        <w:fldChar w:fldCharType="begin"/>
+      </w:r>
+      <w:r>
+        <w:instrText xml:space="preserve"> REF ref8 \h </w:instrText>
+      </w:r>
+      <w:r>
+        <w:fldChar w:fldCharType="separate"/>
+      </w:r>
+      <w:r>
+        <w:t>8</w:t>
+      </w:r>
+      <w:r>
+        <w:fldChar w:fldCharType="end"/>
+      </w:r>
+      <w:r>
+        <w:t>]</w:t>
+      </w:r>
+      <w:r>
+        <w:rPr>
+          <w:b w:val="0"/>
+        </w:rPr>
+        <w:t xml:space="preserve">, treat genes as independent covariates and discard the regulatory interaction structure that shapes tumor progression. Deep survival models, including DeepSurv </w:t>
+      </w:r>
+      <w:r>
+        <w:t>[</w:t>
+      </w:r>
+      <w:r>
+        <w:fldChar w:fldCharType="begin"/>
+      </w:r>
+      <w:r>
+        <w:instrText xml:space="preserve"> REF ref9 \h </w:instrText>
+      </w:r>
+      <w:r>
+        <w:fldChar w:fldCharType="separate"/>
+      </w:r>
+      <w:r>
+        <w:t>9</w:t>
+      </w:r>
+      <w:r>
+        <w:fldChar w:fldCharType="end"/>
+      </w:r>
+      <w:r>
+        <w:t>]</w:t>
+      </w:r>
+      <w:r>
+        <w:rPr>
+          <w:b w:val="0"/>
+        </w:rPr>
+        <w:t xml:space="preserve">, Cox-nnet </w:t>
+      </w:r>
+      <w:r>
+        <w:t>[</w:t>
+      </w:r>
+      <w:r>
+        <w:fldChar w:fldCharType="begin"/>
+      </w:r>
+      <w:r>
+        <w:instrText xml:space="preserve"> REF ref10 \h </w:instrText>
+      </w:r>
+      <w:r>
+        <w:fldChar w:fldCharType="separate"/>
+      </w:r>
+      <w:r>
+        <w:t>10</w:t>
+      </w:r>
+      <w:r>
+        <w:fldChar w:fldCharType="end"/>
+      </w:r>
+      <w:r>
+        <w:t>]</w:t>
+      </w:r>
+      <w:r>
+        <w:rPr>
+          <w:b w:val="0"/>
+        </w:rPr>
+        <w:t xml:space="preserve">, DeepHit </w:t>
+      </w:r>
+      <w:r>
+        <w:t>[</w:t>
+      </w:r>
+      <w:r>
+        <w:fldChar w:fldCharType="begin"/>
+      </w:r>
+      <w:r>
+        <w:instrText xml:space="preserve"> REF ref11 \h </w:instrText>
+      </w:r>
+      <w:r>
+        <w:fldChar w:fldCharType="separate"/>
+      </w:r>
+      <w:r>
+        <w:t>11</w:t>
+      </w:r>
+      <w:r>
+        <w:fldChar w:fldCharType="end"/>
+      </w:r>
+      <w:r>
+        <w:t>]</w:t>
+      </w:r>
+      <w:r>
+        <w:rPr>
+          <w:b w:val="0"/>
+        </w:rPr>
+        <w:t xml:space="preserve">, and random survival forests </w:t>
+      </w:r>
+      <w:r>
+        <w:t>[</w:t>
+      </w:r>
+      <w:r>
+        <w:fldChar w:fldCharType="begin"/>
+      </w:r>
+      <w:r>
+        <w:instrText xml:space="preserve"> REF ref12 \h </w:instrText>
+      </w:r>
+      <w:r>
+        <w:fldChar w:fldCharType="separate"/>
+      </w:r>
+      <w:r>
+        <w:t>12</w:t>
+      </w:r>
+      <w:r>
+        <w:fldChar w:fldCharType="end"/>
+      </w:r>
+      <w:r>
+        <w:t>]</w:t>
+      </w:r>
+      <w:r>
+        <w:rPr>
+          <w:b w:val="0"/>
+        </w:rPr>
+        <w:t xml:space="preserve">, improve discrimination by learning nonlinear feature interactions. They nevertheless operate on gene lists rather than biological graphs, offer limited interpretability, and are prone to severe performance decay when transferred from a single training cohort to independent external cohorts </w:t>
+      </w:r>
+      <w:r>
+        <w:t>[</w:t>
+      </w:r>
+      <w:r>
+        <w:fldChar w:fldCharType="begin"/>
+      </w:r>
+      <w:r>
+        <w:instrText xml:space="preserve"> REF ref13 \h </w:instrText>
+      </w:r>
+      <w:r>
+        <w:fldChar w:fldCharType="separate"/>
+      </w:r>
+      <w:r>
+        <w:t>13</w:t>
+      </w:r>
+      <w:r>
+        <w:fldChar w:fldCharType="end"/>
+      </w:r>
+      <w:r>
+        <w:t>,</w:t>
+      </w:r>
+      <w:r>
+        <w:fldChar w:fldCharType="begin"/>
+      </w:r>
+      <w:r>
+        <w:instrText xml:space="preserve"> REF ref14 \h </w:instrText>
+      </w:r>
+      <w:r>
+        <w:fldChar w:fldCharType="separate"/>
+      </w:r>
+      <w:r>
+        <w:t>14</w:t>
+      </w:r>
+      <w:r>
+        <w:fldChar w:fldCharType="end"/>
+      </w:r>
+      <w:r>
+        <w:t>,</w:t>
+      </w:r>
+      <w:r>
+        <w:fldChar w:fldCharType="begin"/>
+      </w:r>
+      <w:r>
+        <w:instrText xml:space="preserve"> REF ref15 \h </w:instrText>
+      </w:r>
+      <w:r>
+        <w:fldChar w:fldCharType="separate"/>
+      </w:r>
+      <w:r>
+        <w:t>15</w:t>
+      </w:r>
+      <w:r>
+        <w:fldChar w:fldCharType="end"/>
+      </w:r>
+      <w:r>
+        <w:t>]</w:t>
+      </w:r>
+      <w:r>
+        <w:rPr>
+          <w:b w:val="0"/>
+        </w:rPr>
+        <w:t>.</w:t>
+      </w:r>
+    </w:p>
+    <w:p>
+      <w:r>
+        <w:rPr>
+          <w:b w:val="0"/>
+        </w:rPr>
+        <w:t xml:space="preserve">Graph neural networks provide a natural inductive bias for molecular data </w:t>
+      </w:r>
+      <w:r>
+        <w:t>[</w:t>
+      </w:r>
+      <w:r>
+        <w:fldChar w:fldCharType="begin"/>
+      </w:r>
+      <w:r>
+        <w:instrText xml:space="preserve"> REF ref16 \h </w:instrText>
+      </w:r>
+      <w:r>
+        <w:fldChar w:fldCharType="separate"/>
+      </w:r>
+      <w:r>
+        <w:t>16</w:t>
+      </w:r>
+      <w:r>
+        <w:fldChar w:fldCharType="end"/>
+      </w:r>
+      <w:r>
+        <w:t>,</w:t>
+      </w:r>
+      <w:r>
+        <w:fldChar w:fldCharType="begin"/>
+      </w:r>
+      <w:r>
+        <w:instrText xml:space="preserve"> REF ref17 \h </w:instrText>
+      </w:r>
+      <w:r>
+        <w:fldChar w:fldCharType="separate"/>
+      </w:r>
+      <w:r>
+        <w:t>17</w:t>
+      </w:r>
+      <w:r>
+        <w:fldChar w:fldCharType="end"/>
+      </w:r>
+      <w:r>
+        <w:t>,</w:t>
+      </w:r>
+      <w:r>
+        <w:fldChar w:fldCharType="begin"/>
+      </w:r>
+      <w:r>
+        <w:instrText xml:space="preserve"> REF ref18 \h </w:instrText>
+      </w:r>
+      <w:r>
+        <w:fldChar w:fldCharType="separate"/>
+      </w:r>
+      <w:r>
+        <w:t>18</w:t>
+      </w:r>
+      <w:r>
+        <w:fldChar w:fldCharType="end"/>
+      </w:r>
+      <w:r>
+        <w:t>]</w:t>
+      </w:r>
+      <w:r>
+        <w:rPr>
+          <w:b w:val="0"/>
+        </w:rPr>
+        <w:t xml:space="preserve">. A growing family of pathway-constrained graph neural networks restricts message passing to gene sets defined by KEGG pathways </w:t>
+      </w:r>
+      <w:r>
+        <w:t>[</w:t>
+      </w:r>
+      <w:r>
+        <w:fldChar w:fldCharType="begin"/>
+      </w:r>
+      <w:r>
+        <w:instrText xml:space="preserve"> REF ref19 \h </w:instrText>
+      </w:r>
+      <w:r>
+        <w:fldChar w:fldCharType="separate"/>
+      </w:r>
+      <w:r>
+        <w:t>19</w:t>
+      </w:r>
+      <w:r>
+        <w:fldChar w:fldCharType="end"/>
+      </w:r>
+      <w:r>
+        <w:t>]</w:t>
+      </w:r>
+      <w:r>
+        <w:rPr>
+          <w:b w:val="0"/>
+        </w:rPr>
+        <w:t xml:space="preserve">. PathGNN reported that pathway-topology-constrained propagation improves prognosis across several solid tumors </w:t>
+      </w:r>
+      <w:r>
+        <w:t>[</w:t>
+      </w:r>
+      <w:r>
+        <w:fldChar w:fldCharType="begin"/>
+      </w:r>
+      <w:r>
+        <w:instrText xml:space="preserve"> REF ref20 \h </w:instrText>
+      </w:r>
+      <w:r>
+        <w:fldChar w:fldCharType="separate"/>
+      </w:r>
+      <w:r>
+        <w:t>20</w:t>
+      </w:r>
+      <w:r>
+        <w:fldChar w:fldCharType="end"/>
+      </w:r>
+      <w:r>
+        <w:t>]</w:t>
+      </w:r>
+      <w:r>
+        <w:rPr>
+          <w:b w:val="0"/>
+        </w:rPr>
+        <w:t xml:space="preserve">. Cox-Path partitioned genes into KEGG pathway subgraphs and coupled them to a Cox survival head </w:t>
+      </w:r>
+      <w:r>
+        <w:t>[</w:t>
+      </w:r>
+      <w:r>
+        <w:fldChar w:fldCharType="begin"/>
+      </w:r>
+      <w:r>
+        <w:instrText xml:space="preserve"> REF ref21 \h </w:instrText>
+      </w:r>
+      <w:r>
+        <w:fldChar w:fldCharType="separate"/>
+      </w:r>
+      <w:r>
+        <w:t>21</w:t>
+      </w:r>
+      <w:r>
+        <w:fldChar w:fldCharType="end"/>
+      </w:r>
+      <w:r>
+        <w:t>]</w:t>
+      </w:r>
+      <w:r>
+        <w:rPr>
+          <w:b w:val="0"/>
+        </w:rPr>
+        <w:t xml:space="preserve">. A prior-knowledge-guided multilevel GNN introduced gene-to-pathway hierarchical propagation for survival prediction </w:t>
+      </w:r>
+      <w:r>
+        <w:t>[</w:t>
+      </w:r>
+      <w:r>
+        <w:fldChar w:fldCharType="begin"/>
+      </w:r>
+      <w:r>
+        <w:instrText xml:space="preserve"> REF ref22 \h </w:instrText>
+      </w:r>
+      <w:r>
+        <w:fldChar w:fldCharType="separate"/>
+      </w:r>
+      <w:r>
+        <w:t>22</w:t>
+      </w:r>
+      <w:r>
+        <w:fldChar w:fldCharType="end"/>
+      </w:r>
+      <w:r>
+        <w:t>]</w:t>
+      </w:r>
+      <w:r>
+        <w:rPr>
+          <w:b w:val="0"/>
+        </w:rPr>
+        <w:t xml:space="preserve">. PathMoG most recently extended this concept to multi-omics with 354 KEGG-informed pathway modules and dual-level attention, reporting strong performance across 10 TCGA cohorts </w:t>
+      </w:r>
+      <w:r>
+        <w:t>[</w:t>
+      </w:r>
+      <w:r>
+        <w:fldChar w:fldCharType="begin"/>
+      </w:r>
+      <w:r>
+        <w:instrText xml:space="preserve"> REF ref23 \h </w:instrText>
+      </w:r>
+      <w:r>
+        <w:fldChar w:fldCharType="separate"/>
+      </w:r>
+      <w:r>
+        <w:t>23</w:t>
+      </w:r>
+      <w:r>
+        <w:fldChar w:fldCharType="end"/>
+      </w:r>
+      <w:r>
+        <w:t>]</w:t>
+      </w:r>
+      <w:r>
+        <w:rPr>
+          <w:b w:val="0"/>
+        </w:rPr>
+        <w:t>. These studies collectively suggest that biological priors can reduce overfitting and improve external validity relative to unconstrained deep models.</w:t>
+      </w:r>
+    </w:p>
+    <w:p>
+      <w:r>
+        <w:rPr>
+          <w:b w:val="0"/>
+        </w:rPr>
+        <w:t xml:space="preserve">A largely unexamined assumption nevertheless underlies these models: the gene interaction topology is invariant across patients. In every pathway-constrained survival GNN of which we are aware, including PathMoG, the adjacency, edge weights, and inter-pathway coupling are fixed a priori and shared by all patients </w:t>
+      </w:r>
+      <w:r>
+        <w:t>[</w:t>
+      </w:r>
+      <w:r>
+        <w:fldChar w:fldCharType="begin"/>
+      </w:r>
+      <w:r>
+        <w:instrText xml:space="preserve"> REF ref20 \h </w:instrText>
+      </w:r>
+      <w:r>
+        <w:fldChar w:fldCharType="separate"/>
+      </w:r>
+      <w:r>
+        <w:t>20</w:t>
+      </w:r>
+      <w:r>
+        <w:fldChar w:fldCharType="end"/>
+      </w:r>
+      <w:r>
+        <w:t>,</w:t>
+      </w:r>
+      <w:r>
+        <w:fldChar w:fldCharType="begin"/>
+      </w:r>
+      <w:r>
+        <w:instrText xml:space="preserve"> REF ref21 \h </w:instrText>
+      </w:r>
+      <w:r>
+        <w:fldChar w:fldCharType="separate"/>
+      </w:r>
+      <w:r>
+        <w:t>21</w:t>
+      </w:r>
+      <w:r>
+        <w:fldChar w:fldCharType="end"/>
+      </w:r>
+      <w:r>
+        <w:t>,</w:t>
+      </w:r>
+      <w:r>
+        <w:fldChar w:fldCharType="begin"/>
+      </w:r>
+      <w:r>
+        <w:instrText xml:space="preserve"> REF ref22 \h </w:instrText>
+      </w:r>
+      <w:r>
+        <w:fldChar w:fldCharType="separate"/>
+      </w:r>
+      <w:r>
+        <w:t>22</w:t>
+      </w:r>
+      <w:r>
+        <w:fldChar w:fldCharType="end"/>
+      </w:r>
+      <w:r>
+        <w:t>,</w:t>
+      </w:r>
+      <w:r>
+        <w:fldChar w:fldCharType="begin"/>
+      </w:r>
+      <w:r>
+        <w:instrText xml:space="preserve"> REF ref23 \h </w:instrText>
+      </w:r>
+      <w:r>
+        <w:fldChar w:fldCharType="separate"/>
+      </w:r>
+      <w:r>
+        <w:t>23</w:t>
+      </w:r>
+      <w:r>
+        <w:fldChar w:fldCharType="end"/>
+      </w:r>
+      <w:r>
+        <w:t>]</w:t>
+      </w:r>
+      <w:r>
+        <w:rPr>
+          <w:b w:val="0"/>
+        </w:rPr>
+        <w:t xml:space="preserve">. This assumption is difficult to reconcile with the observation that tumor regulatory networks are extensively rewired in a malignancy-dependent manner </w:t>
+      </w:r>
+      <w:r>
+        <w:t>[</w:t>
+      </w:r>
+      <w:r>
+        <w:fldChar w:fldCharType="begin"/>
+      </w:r>
+      <w:r>
+        <w:instrText xml:space="preserve"> REF ref24 \h </w:instrText>
+      </w:r>
+      <w:r>
+        <w:fldChar w:fldCharType="separate"/>
+      </w:r>
+      <w:r>
+        <w:t>24</w:t>
+      </w:r>
+      <w:r>
+        <w:fldChar w:fldCharType="end"/>
+      </w:r>
+      <w:r>
+        <w:t>,</w:t>
+      </w:r>
+      <w:r>
+        <w:fldChar w:fldCharType="begin"/>
+      </w:r>
+      <w:r>
+        <w:instrText xml:space="preserve"> REF ref25 \h </w:instrText>
+      </w:r>
+      <w:r>
+        <w:fldChar w:fldCharType="separate"/>
+      </w:r>
+      <w:r>
+        <w:t>25</w:t>
+      </w:r>
+      <w:r>
+        <w:fldChar w:fldCharType="end"/>
+      </w:r>
+      <w:r>
+        <w:t>,</w:t>
+      </w:r>
+      <w:r>
+        <w:fldChar w:fldCharType="begin"/>
+      </w:r>
+      <w:r>
+        <w:instrText xml:space="preserve"> REF ref26 \h </w:instrText>
+      </w:r>
+      <w:r>
+        <w:fldChar w:fldCharType="separate"/>
+      </w:r>
+      <w:r>
+        <w:t>26</w:t>
+      </w:r>
+      <w:r>
+        <w:fldChar w:fldCharType="end"/>
+      </w:r>
+      <w:r>
+        <w:t>]</w:t>
+      </w:r>
+      <w:r>
+        <w:rPr>
+          <w:b w:val="0"/>
+        </w:rPr>
+        <w:t xml:space="preserve">. Differential network analyses have, moreover, shown that interaction strengths vary across disease states and individuals rather than forming a single static structure </w:t>
+      </w:r>
+      <w:r>
+        <w:t>[</w:t>
+      </w:r>
+      <w:r>
+        <w:fldChar w:fldCharType="begin"/>
+      </w:r>
+      <w:r>
+        <w:instrText xml:space="preserve"> REF ref24 \h </w:instrText>
+      </w:r>
+      <w:r>
+        <w:fldChar w:fldCharType="separate"/>
+      </w:r>
+      <w:r>
+        <w:t>24</w:t>
+      </w:r>
+      <w:r>
+        <w:fldChar w:fldCharType="end"/>
+      </w:r>
+      <w:r>
+        <w:t>,</w:t>
+      </w:r>
+      <w:r>
+        <w:fldChar w:fldCharType="begin"/>
+      </w:r>
+      <w:r>
+        <w:instrText xml:space="preserve"> REF ref25 \h </w:instrText>
+      </w:r>
+      <w:r>
+        <w:fldChar w:fldCharType="separate"/>
+      </w:r>
+      <w:r>
+        <w:t>25</w:t>
+      </w:r>
+      <w:r>
+        <w:fldChar w:fldCharType="end"/>
+      </w:r>
+      <w:r>
+        <w:t>,</w:t>
+      </w:r>
+      <w:r>
+        <w:fldChar w:fldCharType="begin"/>
+      </w:r>
+      <w:r>
+        <w:instrText xml:space="preserve"> REF ref26 \h </w:instrText>
+      </w:r>
+      <w:r>
+        <w:fldChar w:fldCharType="separate"/>
+      </w:r>
+      <w:r>
+        <w:t>26</w:t>
+      </w:r>
+      <w:r>
+        <w:fldChar w:fldCharType="end"/>
+      </w:r>
+      <w:r>
+        <w:t>]</w:t>
+      </w:r>
+      <w:r>
+        <w:rPr>
+          <w:b w:val="0"/>
+        </w:rPr>
+        <w:t>.</w:t>
       </w:r>
     </w:p>
     <w:p>
@@ -318,7 +1266,106 @@
         <w:rPr>
           <w:b w:val="0"/>
         </w:rPr>
-        <w:t>We evaluated Path-AGNN-Cox on a harmonized pan-cancer cohort of 5336 patients from 11 TCGA cancer types (BLCA, BRCA, COAD, GBM, HNSC, KIRC, LIHC, LUAD, LUSC, OV, STAD), where each patient was represented by RNA-sequencing expression from UCSC Xena [6], log2-transformed and z-scored within training folds, and overall-survival annotation extracted with TCGAbiolinks [27]. These cohorts span diverse tissue origins, event rates, and sample sizes (1896 events; Table 1), providing a rigorous testbed for generalizability. For independent external validation without any fine-tuning, we additionally compiled 25 GEO microarray cohorts [4,5] (Affymetrix; expression values were taken directly from the GEO series matrix files as provided by the data contributors; Table 1), covering every tumor type in the training panel—e.g., three independent lung adenocarcinoma cohorts (GSE31210, GSE50081, GSE68465), three breast cancer cohorts (GSE20685, GSE21653, GSE7390), and three colon cancer cohorts (GSE14333, GSE17536, GSE39582). All preprocessing parameters (gene filtering, standardization) were estimated within training folds to avoid information leakage; external cohorts were standardized with training-cohort statistics and missing genes were set to zero (the training-space mean) at the tensor-materialization stage.</w:t>
+        <w:t xml:space="preserve">We evaluated Path-AGNN-Cox on a harmonized pan-cancer cohort of 5336 patients from 11 TCGA cancer types (BLCA, BRCA, COAD, GBM, HNSC, KIRC, LIHC, LUAD, LUSC, OV, STAD), where each patient was represented by RNA-sequencing expression from UCSC Xena </w:t>
+      </w:r>
+      <w:r>
+        <w:t>[</w:t>
+      </w:r>
+      <w:r>
+        <w:fldChar w:fldCharType="begin"/>
+      </w:r>
+      <w:r>
+        <w:instrText xml:space="preserve"> REF ref6 \h </w:instrText>
+      </w:r>
+      <w:r>
+        <w:fldChar w:fldCharType="separate"/>
+      </w:r>
+      <w:r>
+        <w:t>6</w:t>
+      </w:r>
+      <w:r>
+        <w:fldChar w:fldCharType="end"/>
+      </w:r>
+      <w:r>
+        <w:t>]</w:t>
+      </w:r>
+      <w:r>
+        <w:rPr>
+          <w:b w:val="0"/>
+        </w:rPr>
+        <w:t xml:space="preserve">, log2-transformed and z-scored within training folds, and overall-survival annotation extracted with TCGAbiolinks </w:t>
+      </w:r>
+      <w:r>
+        <w:t>[</w:t>
+      </w:r>
+      <w:r>
+        <w:fldChar w:fldCharType="begin"/>
+      </w:r>
+      <w:r>
+        <w:instrText xml:space="preserve"> REF ref27 \h </w:instrText>
+      </w:r>
+      <w:r>
+        <w:fldChar w:fldCharType="separate"/>
+      </w:r>
+      <w:r>
+        <w:t>27</w:t>
+      </w:r>
+      <w:r>
+        <w:fldChar w:fldCharType="end"/>
+      </w:r>
+      <w:r>
+        <w:t>]</w:t>
+      </w:r>
+      <w:r>
+        <w:rPr>
+          <w:b w:val="0"/>
+        </w:rPr>
+        <w:t xml:space="preserve">. These cohorts span diverse tissue origins, event rates, and sample sizes (1896 events; Table 1), providing a rigorous testbed for generalizability. For independent external validation without any fine-tuning, we additionally compiled 25 GEO microarray cohorts </w:t>
+      </w:r>
+      <w:r>
+        <w:t>[</w:t>
+      </w:r>
+      <w:r>
+        <w:fldChar w:fldCharType="begin"/>
+      </w:r>
+      <w:r>
+        <w:instrText xml:space="preserve"> REF ref4 \h </w:instrText>
+      </w:r>
+      <w:r>
+        <w:fldChar w:fldCharType="separate"/>
+      </w:r>
+      <w:r>
+        <w:t>4</w:t>
+      </w:r>
+      <w:r>
+        <w:fldChar w:fldCharType="end"/>
+      </w:r>
+      <w:r>
+        <w:t>,</w:t>
+      </w:r>
+      <w:r>
+        <w:fldChar w:fldCharType="begin"/>
+      </w:r>
+      <w:r>
+        <w:instrText xml:space="preserve"> REF ref5 \h </w:instrText>
+      </w:r>
+      <w:r>
+        <w:fldChar w:fldCharType="separate"/>
+      </w:r>
+      <w:r>
+        <w:t>5</w:t>
+      </w:r>
+      <w:r>
+        <w:fldChar w:fldCharType="end"/>
+      </w:r>
+      <w:r>
+        <w:t>]</w:t>
+      </w:r>
+      <w:r>
+        <w:rPr>
+          <w:b w:val="0"/>
+        </w:rPr>
+        <w:t xml:space="preserve"> (Affymetrix; expression values were taken directly from the GEO series matrix files as provided by the data contributors; Table 1), covering every tumor type in the training panel—e.g., three independent lung adenocarcinoma cohorts (GSE31210, GSE50081, GSE68465), three breast cancer cohorts (GSE20685, GSE21653, GSE7390), and three colon cancer cohorts (GSE14333, GSE17536, GSE39582). All preprocessing parameters (gene filtering, standardization) were estimated within training folds to avoid information leakage; external cohorts were standardized with training-cohort statistics and missing genes were set to zero (the training-space mean) at the tensor-materialization stage.</w:t>
       </w:r>
     </w:p>
     <w:p>
@@ -1376,7 +2423,34 @@
         <w:rPr>
           <w:b w:val="0"/>
         </w:rPr>
-        <w:t>For the GEO cohorts, probes were mapped to gene symbols using the platform annotation tables downloaded from NCBI GEO [4] (e.g., GPL570, GPL96, GPL6480); duplicate gene symbols were collapsed by maximum mean expression, and per-gene missing values were imputed with the gene-wise mean within each cohort. Survival endpoints were harmonized to overall survival in days: GEO follow-up times reported in months or years were converted with 365.25/12 or 365.25 days per unit, respectively, and TCGA overall-survival time was derived from GDC clinical annotations, that is, days to death or days to last follow-up. Because each TCGA cohort was modeled separately and each GEO cohort was validated independently without pooling, no cross-cohort batch correction was required.</w:t>
+        <w:t xml:space="preserve">For the GEO cohorts, probes were mapped to gene symbols using the platform annotation tables downloaded from NCBI GEO </w:t>
+      </w:r>
+      <w:r>
+        <w:t>[</w:t>
+      </w:r>
+      <w:r>
+        <w:fldChar w:fldCharType="begin"/>
+      </w:r>
+      <w:r>
+        <w:instrText xml:space="preserve"> REF ref4 \h </w:instrText>
+      </w:r>
+      <w:r>
+        <w:fldChar w:fldCharType="separate"/>
+      </w:r>
+      <w:r>
+        <w:t>4</w:t>
+      </w:r>
+      <w:r>
+        <w:fldChar w:fldCharType="end"/>
+      </w:r>
+      <w:r>
+        <w:t>]</w:t>
+      </w:r>
+      <w:r>
+        <w:rPr>
+          <w:b w:val="0"/>
+        </w:rPr>
+        <w:t xml:space="preserve"> (e.g., GPL570, GPL96, GPL6480); duplicate gene symbols were collapsed by maximum mean expression, and per-gene missing values were imputed with the gene-wise mean within each cohort. Survival endpoints were harmonized to overall survival in days: GEO follow-up times reported in months or years were converted with 365.25/12 or 365.25 days per unit, respectively, and TCGA overall-survival time was derived from GDC clinical annotations, that is, days to death or days to last follow-up. Because each TCGA cohort was modeled separately and each GEO cohort was validated independently without pooling, no cross-cohort batch correction was required.</w:t>
       </w:r>
     </w:p>
     <w:p>
@@ -1392,7 +2466,34 @@
         <w:rPr>
           <w:b w:val="0"/>
         </w:rPr>
-        <w:t>Expression matrices were first mapped to the KEGG cancer-core pathway catalogue [19] (57 pathways, 3097 genes in the union; compiled from the KEGG_2021_Human.gmt gene-set collection, KEGG release 2021). Pathway modules containing fewer than three or more than 300 genes were excluded from the model input. After intersection with each cohort's measured genes, on average 2760 genes per cohort were retained; genes outside any pathway were excluded, so that every model in the benchmark operates on the same pathway-mapped gene universe (a matched comparison).</w:t>
+        <w:t xml:space="preserve">Expression matrices were first mapped to the KEGG cancer-core pathway catalogue </w:t>
+      </w:r>
+      <w:r>
+        <w:t>[</w:t>
+      </w:r>
+      <w:r>
+        <w:fldChar w:fldCharType="begin"/>
+      </w:r>
+      <w:r>
+        <w:instrText xml:space="preserve"> REF ref19 \h </w:instrText>
+      </w:r>
+      <w:r>
+        <w:fldChar w:fldCharType="separate"/>
+      </w:r>
+      <w:r>
+        <w:t>19</w:t>
+      </w:r>
+      <w:r>
+        <w:fldChar w:fldCharType="end"/>
+      </w:r>
+      <w:r>
+        <w:t>]</w:t>
+      </w:r>
+      <w:r>
+        <w:rPr>
+          <w:b w:val="0"/>
+        </w:rPr>
+        <w:t xml:space="preserve"> (57 pathways, 3097 genes in the union; compiled from the KEGG_2021_Human.gmt gene-set collection, KEGG release 2021). Pathway modules containing fewer than three or more than 300 genes were excluded from the model input. After intersection with each cohort's measured genes, on average 2760 genes per cohort were retained; genes outside any pathway were excluded, so that every model in the benchmark operates on the same pathway-mapped gene universe (a matched comparison).</w:t>
       </w:r>
     </w:p>
     <w:p>
@@ -3073,7 +4174,52 @@
         <w:rPr>
           <w:b w:val="0"/>
         </w:rPr>
-        <w:t>Model parameters are optimized by the negative Cox partial likelihood with Breslow tie handling [1,28],</w:t>
+        <w:t xml:space="preserve">Model parameters are optimized by the negative Cox partial likelihood with Breslow tie handling </w:t>
+      </w:r>
+      <w:r>
+        <w:t>[</w:t>
+      </w:r>
+      <w:r>
+        <w:fldChar w:fldCharType="begin"/>
+      </w:r>
+      <w:r>
+        <w:instrText xml:space="preserve"> REF ref1 \h </w:instrText>
+      </w:r>
+      <w:r>
+        <w:fldChar w:fldCharType="separate"/>
+      </w:r>
+      <w:r>
+        <w:t>1</w:t>
+      </w:r>
+      <w:r>
+        <w:fldChar w:fldCharType="end"/>
+      </w:r>
+      <w:r>
+        <w:t>,</w:t>
+      </w:r>
+      <w:r>
+        <w:fldChar w:fldCharType="begin"/>
+      </w:r>
+      <w:r>
+        <w:instrText xml:space="preserve"> REF ref28 \h </w:instrText>
+      </w:r>
+      <w:r>
+        <w:fldChar w:fldCharType="separate"/>
+      </w:r>
+      <w:r>
+        <w:t>28</w:t>
+      </w:r>
+      <w:r>
+        <w:fldChar w:fldCharType="end"/>
+      </w:r>
+      <w:r>
+        <w:t>]</w:t>
+      </w:r>
+      <w:r>
+        <w:rPr>
+          <w:b w:val="0"/>
+        </w:rPr>
+        <w:t>,</w:t>
       </w:r>
     </w:p>
     <w:p>
@@ -3721,7 +4867,160 @@
         <w:rPr>
           <w:b w:val="0"/>
         </w:rPr>
-        <w:t>We used stratified 5-fold cross-validation within each TCGA cohort (fold-stratified on the event indicator; random seed 42). The concordance index [2,29] served as the primary discrimination metric; the time-dependent AUC [30] (mean over the 0.25/0.50/0.75 quantile times) was used as a secondary metric. For external validation, each model was retrained on the full TCGA cohort and evaluated on the GEO cohorts without any fine-tuning, following current recommendations for validating prognostic models [31]. Paired Wilcoxon signed-rank tests (per-dataset mean C-index, internal CV) were used to compare Path-AGNN-Cox against each baseline. Decision-curve analysis [32] was used to assess the clinical value of the risk score: inverse-probability-of-censoring-weighted net benefit was estimated at 1-, 3- and 5-year horizons over threshold probabilities 0.05–0.55 for three Cox models (clinical, clinical plus risk score, and risk score alone) fitted with a ridge penalizer of 0.01 in LUAD, BRCA and KIRC. Per-patient edge weights were extracted from the last adaptive layer and patients were split at the median predicted risk. Between-stratum rewiring was tested per pathway on the per-sample mean edge weight within each pathway, reporting Cohen's d with a normal-approximation 95% CI, and the false discovery rate was controlled with the Benjamini–Hochberg procedure [33]. Each pathway was additionally tested under 1,000 within-pathway label permutations of the risk strata; the permutation P was one plus the number of null permutations with at least as large an absolute effect, divided by 1,001. At the cohort level, the number of significant pathways was compared with a 1,000-permutation null obtained by permuting the risk labels, with the permutation P computed as one plus the number of null counts at least as large as the observed count, divided by 1,001. Two matched random gene-set controls assessed pathway-identity selectivity: for each real pathway, 200 random gene sets of equal size with matched internal edge counts, and 200 random equal-size subsets drawn from real pathway blocks so that size and density were matched, were scored with the identical effect-size statistic, and the percentile of each real pathway within its null distribution was recorded. Pathway-level enrichment of the top-20 pathways ranked by permutation P against a curated LUAD driver-pathway list was tested with the hypergeometric distribution over the 57-pathway cancer-core catalogue. Static-model, randomized-partition and standard-GAT controls followed the same protocol. All analyses are implemented in benchmark/rewiring_analysis.py and the work/ scripts of the repository at https://github.com/ZhongdaHospital-SEU/Path-AGNN-Cox. Model hyperparameters and baseline configurations are summarized in Table 2. All deep models were trained on CPU with Adam; the full benchmark consumed approximately 1,500 CPU-hours.</w:t>
+        <w:t xml:space="preserve">We used stratified 5-fold cross-validation within each TCGA cohort (fold-stratified on the event indicator; random seed 42). The concordance index </w:t>
+      </w:r>
+      <w:r>
+        <w:t>[</w:t>
+      </w:r>
+      <w:r>
+        <w:fldChar w:fldCharType="begin"/>
+      </w:r>
+      <w:r>
+        <w:instrText xml:space="preserve"> REF ref2 \h </w:instrText>
+      </w:r>
+      <w:r>
+        <w:fldChar w:fldCharType="separate"/>
+      </w:r>
+      <w:r>
+        <w:t>2</w:t>
+      </w:r>
+      <w:r>
+        <w:fldChar w:fldCharType="end"/>
+      </w:r>
+      <w:r>
+        <w:t>,</w:t>
+      </w:r>
+      <w:r>
+        <w:fldChar w:fldCharType="begin"/>
+      </w:r>
+      <w:r>
+        <w:instrText xml:space="preserve"> REF ref29 \h </w:instrText>
+      </w:r>
+      <w:r>
+        <w:fldChar w:fldCharType="separate"/>
+      </w:r>
+      <w:r>
+        <w:t>29</w:t>
+      </w:r>
+      <w:r>
+        <w:fldChar w:fldCharType="end"/>
+      </w:r>
+      <w:r>
+        <w:t>]</w:t>
+      </w:r>
+      <w:r>
+        <w:rPr>
+          <w:b w:val="0"/>
+        </w:rPr>
+        <w:t xml:space="preserve"> served as the primary discrimination metric; the time-dependent AUC </w:t>
+      </w:r>
+      <w:r>
+        <w:t>[</w:t>
+      </w:r>
+      <w:r>
+        <w:fldChar w:fldCharType="begin"/>
+      </w:r>
+      <w:r>
+        <w:instrText xml:space="preserve"> REF ref30 \h </w:instrText>
+      </w:r>
+      <w:r>
+        <w:fldChar w:fldCharType="separate"/>
+      </w:r>
+      <w:r>
+        <w:t>30</w:t>
+      </w:r>
+      <w:r>
+        <w:fldChar w:fldCharType="end"/>
+      </w:r>
+      <w:r>
+        <w:t>]</w:t>
+      </w:r>
+      <w:r>
+        <w:rPr>
+          <w:b w:val="0"/>
+        </w:rPr>
+        <w:t xml:space="preserve"> (mean over the 0.25/0.50/0.75 quantile times) was used as a secondary metric. For external validation, each model was retrained on the full TCGA cohort and evaluated on the GEO cohorts without any fine-tuning, following current recommendations for validating prognostic models </w:t>
+      </w:r>
+      <w:r>
+        <w:t>[</w:t>
+      </w:r>
+      <w:r>
+        <w:fldChar w:fldCharType="begin"/>
+      </w:r>
+      <w:r>
+        <w:instrText xml:space="preserve"> REF ref31 \h </w:instrText>
+      </w:r>
+      <w:r>
+        <w:fldChar w:fldCharType="separate"/>
+      </w:r>
+      <w:r>
+        <w:t>31</w:t>
+      </w:r>
+      <w:r>
+        <w:fldChar w:fldCharType="end"/>
+      </w:r>
+      <w:r>
+        <w:t>]</w:t>
+      </w:r>
+      <w:r>
+        <w:rPr>
+          <w:b w:val="0"/>
+        </w:rPr>
+        <w:t xml:space="preserve">. Paired Wilcoxon signed-rank tests (per-dataset mean C-index, internal CV) were used to compare Path-AGNN-Cox against each baseline. Decision-curve analysis </w:t>
+      </w:r>
+      <w:r>
+        <w:t>[</w:t>
+      </w:r>
+      <w:r>
+        <w:fldChar w:fldCharType="begin"/>
+      </w:r>
+      <w:r>
+        <w:instrText xml:space="preserve"> REF ref32 \h </w:instrText>
+      </w:r>
+      <w:r>
+        <w:fldChar w:fldCharType="separate"/>
+      </w:r>
+      <w:r>
+        <w:t>32</w:t>
+      </w:r>
+      <w:r>
+        <w:fldChar w:fldCharType="end"/>
+      </w:r>
+      <w:r>
+        <w:t>]</w:t>
+      </w:r>
+      <w:r>
+        <w:rPr>
+          <w:b w:val="0"/>
+        </w:rPr>
+        <w:t xml:space="preserve"> was used to assess the clinical value of the risk score: inverse-probability-of-censoring-weighted net benefit was estimated at 1-, 3- and 5-year horizons over threshold probabilities 0.05–0.55 for three Cox models (clinical, clinical plus risk score, and risk score alone) fitted with a ridge penalizer of 0.01 in LUAD, BRCA and KIRC. Per-patient edge weights were extracted from the last adaptive layer and patients were split at the median predicted risk. Between-stratum rewiring was tested per pathway on the per-sample mean edge weight within each pathway, reporting Cohen's d with a normal-approximation 95% CI, and the false discovery rate was controlled with the Benjamini–Hochberg procedure </w:t>
+      </w:r>
+      <w:r>
+        <w:t>[</w:t>
+      </w:r>
+      <w:r>
+        <w:fldChar w:fldCharType="begin"/>
+      </w:r>
+      <w:r>
+        <w:instrText xml:space="preserve"> REF ref33 \h </w:instrText>
+      </w:r>
+      <w:r>
+        <w:fldChar w:fldCharType="separate"/>
+      </w:r>
+      <w:r>
+        <w:t>33</w:t>
+      </w:r>
+      <w:r>
+        <w:fldChar w:fldCharType="end"/>
+      </w:r>
+      <w:r>
+        <w:t>]</w:t>
+      </w:r>
+      <w:r>
+        <w:rPr>
+          <w:b w:val="0"/>
+        </w:rPr>
+        <w:t>. Each pathway was additionally tested under 1,000 within-pathway label permutations of the risk strata; the permutation P was one plus the number of null permutations with at least as large an absolute effect, divided by 1,001. At the cohort level, the number of significant pathways was compared with a 1,000-permutation null obtained by permuting the risk labels, with the permutation P computed as one plus the number of null counts at least as large as the observed count, divided by 1,001. Two matched random gene-set controls assessed pathway-identity selectivity: for each real pathway, 200 random gene sets of equal size with matched internal edge counts, and 200 random equal-size subsets drawn from real pathway blocks so that size and density were matched, were scored with the identical effect-size statistic, and the percentile of each real pathway within its null distribution was recorded. Pathway-level enrichment of the top-20 pathways ranked by permutation P against a curated LUAD driver-pathway list was tested with the hypergeometric distribution over the 57-pathway cancer-core catalogue. Static-model, randomized-partition and standard-GAT controls followed the same protocol. All analyses are implemented in benchmark/rewiring_analysis.py and the work/ scripts of the repository at https://github.com/ZhongdaHospital-SEU/Path-AGNN-Cox. Model hyperparameters and baseline configurations are summarized in Table 2. All deep models were trained on CPU with Adam; the full benchmark consumed approximately 1,500 CPU-hours.</w:t>
       </w:r>
     </w:p>
     <w:p>
@@ -3759,7 +5058,88 @@
         <w:rPr>
           <w:b w:val="0"/>
         </w:rPr>
-        <w:t>Path-AGNN-Cox was implemented in Python 3.10 with PyTorch [34] on CPU, and all survival statistics were computed with lifelines [35]; cross-validation splits and tree baselines were implemented with scikit-learn [36]. Models were trained</w:t>
+        <w:t xml:space="preserve">Path-AGNN-Cox was implemented in Python 3.10 with PyTorch </w:t>
+      </w:r>
+      <w:r>
+        <w:t>[</w:t>
+      </w:r>
+      <w:r>
+        <w:fldChar w:fldCharType="begin"/>
+      </w:r>
+      <w:r>
+        <w:instrText xml:space="preserve"> REF ref34 \h </w:instrText>
+      </w:r>
+      <w:r>
+        <w:fldChar w:fldCharType="separate"/>
+      </w:r>
+      <w:r>
+        <w:t>34</w:t>
+      </w:r>
+      <w:r>
+        <w:fldChar w:fldCharType="end"/>
+      </w:r>
+      <w:r>
+        <w:t>]</w:t>
+      </w:r>
+      <w:r>
+        <w:rPr>
+          <w:b w:val="0"/>
+        </w:rPr>
+        <w:t xml:space="preserve"> on CPU, and all survival statistics were computed with lifelines </w:t>
+      </w:r>
+      <w:r>
+        <w:t>[</w:t>
+      </w:r>
+      <w:r>
+        <w:fldChar w:fldCharType="begin"/>
+      </w:r>
+      <w:r>
+        <w:instrText xml:space="preserve"> REF ref35 \h </w:instrText>
+      </w:r>
+      <w:r>
+        <w:fldChar w:fldCharType="separate"/>
+      </w:r>
+      <w:r>
+        <w:t>35</w:t>
+      </w:r>
+      <w:r>
+        <w:fldChar w:fldCharType="end"/>
+      </w:r>
+      <w:r>
+        <w:t>]</w:t>
+      </w:r>
+      <w:r>
+        <w:rPr>
+          <w:b w:val="0"/>
+        </w:rPr>
+        <w:t xml:space="preserve">; cross-validation splits and tree baselines were implemented with scikit-learn </w:t>
+      </w:r>
+      <w:r>
+        <w:t>[</w:t>
+      </w:r>
+      <w:r>
+        <w:fldChar w:fldCharType="begin"/>
+      </w:r>
+      <w:r>
+        <w:instrText xml:space="preserve"> REF ref36 \h </w:instrText>
+      </w:r>
+      <w:r>
+        <w:fldChar w:fldCharType="separate"/>
+      </w:r>
+      <w:r>
+        <w:t>36</w:t>
+      </w:r>
+      <w:r>
+        <w:fldChar w:fldCharType="end"/>
+      </w:r>
+      <w:r>
+        <w:t>]</w:t>
+      </w:r>
+      <w:r>
+        <w:rPr>
+          <w:b w:val="0"/>
+        </w:rPr>
+        <w:t>. Models were trained</w:t>
       </w:r>
     </w:p>
     <w:p>
@@ -4207,7 +5587,46 @@
               <w:rPr>
                 <w:b w:val="0"/>
               </w:rPr>
-              <w:t>hidden [32, 16]</w:t>
+              <w:t xml:space="preserve">hidden </w:t>
+            </w:r>
+            <w:r>
+              <w:t>[</w:t>
+            </w:r>
+            <w:r>
+              <w:fldChar w:fldCharType="begin"/>
+            </w:r>
+            <w:r>
+              <w:instrText xml:space="preserve"> REF ref32 \h </w:instrText>
+            </w:r>
+            <w:r>
+              <w:fldChar w:fldCharType="separate"/>
+            </w:r>
+            <w:r>
+              <w:t>32</w:t>
+            </w:r>
+            <w:r>
+              <w:fldChar w:fldCharType="end"/>
+            </w:r>
+            <w:r>
+              <w:t>,</w:t>
+            </w:r>
+            <w:r>
+              <w:fldChar w:fldCharType="begin"/>
+            </w:r>
+            <w:r>
+              <w:instrText xml:space="preserve"> REF ref16 \h </w:instrText>
+            </w:r>
+            <w:r>
+              <w:fldChar w:fldCharType="separate"/>
+            </w:r>
+            <w:r>
+              <w:t>16</w:t>
+            </w:r>
+            <w:r>
+              <w:fldChar w:fldCharType="end"/>
+            </w:r>
+            <w:r>
+              <w:t>]</w:t>
             </w:r>
           </w:p>
         </w:tc>
@@ -4243,7 +5662,19 @@
               <w:rPr>
                 <w:b w:val="0"/>
               </w:rPr>
-              <w:t>hidden [64], dropout 0.0</w:t>
+              <w:t xml:space="preserve">hidden </w:t>
+            </w:r>
+            <w:r>
+              <w:rPr>
+                <w:b w:val="0"/>
+              </w:rPr>
+              <w:t>[64]</w:t>
+            </w:r>
+            <w:r>
+              <w:rPr>
+                <w:b w:val="0"/>
+              </w:rPr>
+              <w:t>, dropout 0.0</w:t>
             </w:r>
           </w:p>
         </w:tc>
@@ -10651,15 +12082,87 @@
         <w:rPr>
           <w:b w:val="0"/>
         </w:rPr>
-        <w:t>Per-cohort results are summarized in Table 4 and Figure 4. Path-AGNN-Cox maintained C-index above 0.50 in 12/25 external cohorts, compared with 25 for the best baseline. The model transferred relatively consistently across platform shifts (RNA-seq → Affymetrix microarrays) and independent sample processing pipelines, with a mean external C-index comparable to the deep baselines. The largest external gain over the best baseline was observed in Lung adenocarcinoma (GSE31210, Path-AGNN-Cox C-index 0.76 vs best baseline 0.67). These results contrast favorably with previous pathway-GNN studies: PathMoG reported external validation in a single breast-cancer cohort, METABRIC [23,37], whereas Path-AGNN-Cox was validated in 25 independent cohorts spanning 11 tumor types.</w:t>
-      </w:r>
-    </w:p>
-    <w:p>
+        <w:t xml:space="preserve">Per-cohort results are summarized in Table 4 and Figure 4. Path-AGNN-Cox maintained C-index above 0.50 in 12/25 external cohorts, compared with 25 for the best baseline. The model transferred relatively consistently across platform shifts (RNA-seq → Affymetrix microarrays) and independent sample processing pipelines, with a mean external C-index comparable to the deep baselines. The largest external gain over the best baseline was observed in Lung adenocarcinoma (GSE31210, Path-AGNN-Cox C-index 0.76 vs best baseline 0.67). These results contrast favorably with previous pathway-GNN studies: PathMoG reported external validation in a single breast-cancer cohort, METABRIC </w:t>
+      </w:r>
+      <w:r>
+        <w:t>[</w:t>
+      </w:r>
+      <w:r>
+        <w:fldChar w:fldCharType="begin"/>
+      </w:r>
+      <w:r>
+        <w:instrText xml:space="preserve"> REF ref23 \h </w:instrText>
+      </w:r>
+      <w:r>
+        <w:fldChar w:fldCharType="separate"/>
+      </w:r>
+      <w:r>
+        <w:t>23</w:t>
+      </w:r>
+      <w:r>
+        <w:fldChar w:fldCharType="end"/>
+      </w:r>
+      <w:r>
+        <w:t>,</w:t>
+      </w:r>
+      <w:r>
+        <w:fldChar w:fldCharType="begin"/>
+      </w:r>
+      <w:r>
+        <w:instrText xml:space="preserve"> REF ref37 \h </w:instrText>
+      </w:r>
+      <w:r>
+        <w:fldChar w:fldCharType="separate"/>
+      </w:r>
+      <w:r>
+        <w:t>37</w:t>
+      </w:r>
+      <w:r>
+        <w:fldChar w:fldCharType="end"/>
+      </w:r>
+      <w:r>
+        <w:t>]</w:t>
+      </w:r>
       <w:r>
         <w:rPr>
           <w:b w:val="0"/>
         </w:rPr>
-        <w:t>Calibration of the risk score [38] was assessed with the slope of a univariate Cox regression of the standardized risk score and with the mean absolute deviation between model-predicted and Kaplan–Meier survival across risk tertiles at the 25th, 50th and 75th percentiles of follow-up time as detailed in Table 6. The internal out-of-fold slope was -0.02 with 95% CI -0.16–0.12 and a calibration MAE of 0.02 in LUAD, -0.05 with 95% CI -0.23–0.14 and MAE 0.01 in BRCA, and 0.26 with 95% CI 0.09–0.43 and MAE 0.03 in KIRC; the penalized Cox counterpart produced slopes of 0.39, 0.49 and 0.66, respectively. External slopes for Path-AGNN-Cox ranged from -0.11 to 0.79 with a mean of 0.18. The internal slopes near zero in LUAD and BRCA indicate that the risk score is poorly calibrated on the absolute risk scale even where rank discrimination exists, and the low external slopes imply that absolute risk magnitudes transfer only weakly; discrimination and calibration are therefore reported separately, and no claim of absolute risk accuracy is made.</w:t>
+        <w:t>, whereas Path-AGNN-Cox was validated in 25 independent cohorts spanning 11 tumor types.</w:t>
+      </w:r>
+    </w:p>
+    <w:p>
+      <w:r>
+        <w:rPr>
+          <w:b w:val="0"/>
+        </w:rPr>
+        <w:t xml:space="preserve">Calibration of the risk score </w:t>
+      </w:r>
+      <w:r>
+        <w:t>[</w:t>
+      </w:r>
+      <w:r>
+        <w:fldChar w:fldCharType="begin"/>
+      </w:r>
+      <w:r>
+        <w:instrText xml:space="preserve"> REF ref38 \h </w:instrText>
+      </w:r>
+      <w:r>
+        <w:fldChar w:fldCharType="separate"/>
+      </w:r>
+      <w:r>
+        <w:t>38</w:t>
+      </w:r>
+      <w:r>
+        <w:fldChar w:fldCharType="end"/>
+      </w:r>
+      <w:r>
+        <w:t>]</w:t>
+      </w:r>
+      <w:r>
+        <w:rPr>
+          <w:b w:val="0"/>
+        </w:rPr>
+        <w:t xml:space="preserve"> was assessed with the slope of a univariate Cox regression of the standardized risk score and with the mean absolute deviation between model-predicted and Kaplan–Meier survival across risk tertiles at the 25th, 50th and 75th percentiles of follow-up time as detailed in Table 6. The internal out-of-fold slope was -0.02 with 95% CI -0.16–0.12 and a calibration MAE of 0.02 in LUAD, -0.05 with 95% CI -0.23–0.14 and MAE 0.01 in BRCA, and 0.26 with 95% CI 0.09–0.43 and MAE 0.03 in KIRC; the penalized Cox counterpart produced slopes of 0.39, 0.49 and 0.66, respectively. External slopes for Path-AGNN-Cox ranged from -0.11 to 0.79 with a mean of 0.18. The internal slopes near zero in LUAD and BRCA indicate that the risk score is poorly calibrated on the absolute risk scale even where rank discrimination exists, and the low external slopes imply that absolute risk magnitudes transfer only weakly; discrimination and calibration are therefore reported separately, and no claim of absolute risk accuracy is made.</w:t>
       </w:r>
     </w:p>
     <w:p>
@@ -15193,7 +16696,88 @@
         <w:rPr>
           <w:b w:val="0"/>
         </w:rPr>
-        <w:t xml:space="preserve"> The per-patient rewiring magnitude (L1 distance of the patient's edge weights from the cohort mean) correlated with clinical indicators of malignancy: in BRCA with the proliferation marker MKI67 (Spearman ρ = 0.33, P&lt;0.001, n = 1086), and in LUAD with tumor mutational burden [39] (ρ = 0.13, P=0.003, n = 522); stage showed no significant association in either cohort. In KIRC, the rewiring magnitude was weakly associated with histologic grade (Spearman ρ = 0.09, P=0.038, n = 525), whereas stage and age showed no significant association (ρ = 0.05, P=0.209; ρ = 0.07, P=0.089). In multivariable Cox models adjusting for stage and age, the risk score remained independently associated with overall survival in both cohorts (LUAD: HR = 1.22 per SD, 95% CI 1.01–1.46, P=0.035; BRCA: HR = 1.27 per SD, 95% CI 1.06–1.53, P=0.010). In the IMvigor210 anti-PD-L1 cohort [40], the rewiring magnitude was numerically higher in responders (CR/PR) than in non-responders (SD/PD) (median 686.43 vs 624.81; Wilcoxon P=0.111; n=68/230); high-rewiring patients showed HR 1.40 (95% CI 0.96-2.04, P=0.082) for OS; rewiring magnitude correlated with Ki-67 expression (Spearman rho=0.26, P&lt;0.001, n=348) (Figure 6); the rewiring-Ki-67 correlation replicated in this immunotherapy setting, supporting the biological validity of the learned patient-specific graphs. As an additional exploratory check, we scored the same cohort with a BLCA prognosis-associated rewiring template, using the correlation-difference projection described in Section 3.4.5. The template score was higher in responders than in non-responders (Hedges g = 0.31, Wilcoxon P=0.019, n = 68/230) and exceeded 96.2% of 2,850 equal-size random gene-set controls. A second urothelial ICB cohort, GSE176307 (n = 87, 16 responders), showed the same direction with the BLCA template (Hedges g = 0.20, Wilcoxon P=0.588). A third urothelial cohort, GSE225066 (NEODURVARIB, n = 16 pre-treatment biopsies; neoadjuvant durvalumab plus olaparib; pathological response), showed no association beyond random gene-set controls (Hedges g = 0.05, Wilcoxon P=1.000, random-control percentile 79.9%). A fourth urothelial cohort, GSE298296 (n = 82, 49 responders; perioperative TURBT biopsies), was directionally consistent with the template but not individually significant (Hedges g = 0.22, Wilcoxon P=0.596) and fell within its random gene-set null (12.4th percentile of 2,850). The prespecified fixed-effect combination of the four BLCA-template cohorts was significant (g = 0.26, 95% CI 0.05–0.47, P=0.015, I2 = 0%), with the signal carried by IMvigor210; the two RECIST-assessed cohorts alone remained significant (g = 0.28, 95% CI 0.04–0.53, P=0.022, I2 = 0%). At the single-cohort level, none of the seven cohort-level tests survived BH-FDR correction across cohorts, templates and strata (smallest q = 0.134); the meta-analysis was therefore the sole prespecified ICB-level test, with the stratified analyses treated as sensitivity checks. Among the four anti-PD-1/PD-L1 cohorts, the combined effect was g = 0.25 (95% CI 0.03–0.47, P=0.025, I2 = 0%), whereas including the anti-CTLA-4 cohort GSE100797 removed the significance (P=0.166). The IMvigor210 association exceeded 96.2% of random gene-set controls and the GSE176307 association reached 87.4%, so the combined evidence is directionally consistent but remains exploratory. In three melanoma ICB cohorts, GSE91061, GSE78220 and GSE100797, the corresponding SKCM-based template showed no association beyond random gene-set controls (Wilcoxon P=0.682, P=0.393 and P=0.174; random-control percentiles 48.9%, 71.1% and 19.4%). As a timepoint sensitivity check in GSE91061, we re-scored the 42 on-treatment biopsies with patient-level response annotation. The nominally inverse association between the SKCM template score and response (Hedges g = -0.50, Wilcoxon P=0.032) fell within the equal-size random gene-set null (38.5th percentile of 2,850 controls), and the paired pre-to-on-treatment change in template score did not differ between responders and non-responders (Hedges g = -0.79, Wilcoxon P=0.081, random-control percentile 8.5%), indicating no additional evidence at the on-treatment timepoint. These analyses were exploratory and were not corrected for multiple testing across cohorts and templates; the positive result in IMvigor210 together with the null results in the melanoma cohorts indicates a cohort-dependent association between rewiring and ICB response that requires prospective validation. Within IMvigor210, this association was concentrated in the low-TMB stratum: among patients with TMB below the median, the template score was higher in responders than in non-responders (mean difference 0.85 SD, Wilcoxon P=0.004, n = 114), whereas no association was present in the high-TMB stratum (P=0.919, n = 120). In the low-TMB stratum, patients with high template scores showed a response rate of 18.4% compared with 6.9% in the low-score group (Fisher exact P=0.032, OR = 3.06). The association was also present within the IC1 immune-cell stratum (Wilcoxon P=0.045) and directionally consistent in IC0 and IC2 (P=0.178 and P=0.087). These stratified analyses are exploratory and were not corrected for multiple testing. Because MKI67 is measured in the same transcriptomic input used to compute the attention weights, the Ki-67 correlations are descriptive anchors rather than independent validations; TMB provides an independent (mutation-based) anchor. Tumor purity was not used as an additional anchor because ESTIMATE-based purity [41] is estimated from the same transcriptomic input as the attention weights and would not constitute an independent validation. The associations were robust to the definition of rewiring magnitude: the Ki-67 association in BRCA (rho = 0.19-0.29 across definitions, all P&lt;0.001); the risk-score association in IMvigor210 (rho = 0.32-0.43, all P&lt;0.001); the LUAD TMB association was directionally consistent but weaker (rho = 0.09, P&lt;0.001, for the primary definition).</w:t>
+        <w:t xml:space="preserve"> The per-patient rewiring magnitude (L1 distance of the patient's edge weights from the cohort mean) correlated with clinical indicators of malignancy: in BRCA with the proliferation marker MKI67 (Spearman ρ = 0.33, P&lt;0.001, n = 1086), and in LUAD with tumor mutational burden </w:t>
+      </w:r>
+      <w:r>
+        <w:t>[</w:t>
+      </w:r>
+      <w:r>
+        <w:fldChar w:fldCharType="begin"/>
+      </w:r>
+      <w:r>
+        <w:instrText xml:space="preserve"> REF ref39 \h </w:instrText>
+      </w:r>
+      <w:r>
+        <w:fldChar w:fldCharType="separate"/>
+      </w:r>
+      <w:r>
+        <w:t>39</w:t>
+      </w:r>
+      <w:r>
+        <w:fldChar w:fldCharType="end"/>
+      </w:r>
+      <w:r>
+        <w:t>]</w:t>
+      </w:r>
+      <w:r>
+        <w:rPr>
+          <w:b w:val="0"/>
+        </w:rPr>
+        <w:t xml:space="preserve"> (ρ = 0.13, P=0.003, n = 522); stage showed no significant association in either cohort. In KIRC, the rewiring magnitude was weakly associated with histologic grade (Spearman ρ = 0.09, P=0.038, n = 525), whereas stage and age showed no significant association (ρ = 0.05, P=0.209; ρ = 0.07, P=0.089). In multivariable Cox models adjusting for stage and age, the risk score remained independently associated with overall survival in both cohorts (LUAD: HR = 1.22 per SD, 95% CI 1.01–1.46, P=0.035; BRCA: HR = 1.27 per SD, 95% CI 1.06–1.53, P=0.010). In the IMvigor210 anti-PD-L1 cohort </w:t>
+      </w:r>
+      <w:r>
+        <w:t>[</w:t>
+      </w:r>
+      <w:r>
+        <w:fldChar w:fldCharType="begin"/>
+      </w:r>
+      <w:r>
+        <w:instrText xml:space="preserve"> REF ref40 \h </w:instrText>
+      </w:r>
+      <w:r>
+        <w:fldChar w:fldCharType="separate"/>
+      </w:r>
+      <w:r>
+        <w:t>40</w:t>
+      </w:r>
+      <w:r>
+        <w:fldChar w:fldCharType="end"/>
+      </w:r>
+      <w:r>
+        <w:t>]</w:t>
+      </w:r>
+      <w:r>
+        <w:rPr>
+          <w:b w:val="0"/>
+        </w:rPr>
+        <w:t xml:space="preserve">, the rewiring magnitude was numerically higher in responders (CR/PR) than in non-responders (SD/PD) (median 686.43 vs 624.81; Wilcoxon P=0.111; n=68/230); high-rewiring patients showed HR 1.40 (95% CI 0.96-2.04, P=0.082) for OS; rewiring magnitude correlated with Ki-67 expression (Spearman rho=0.26, P&lt;0.001, n=348) (Figure 6); the rewiring-Ki-67 correlation replicated in this immunotherapy setting, supporting the biological validity of the learned patient-specific graphs. As an additional exploratory check, we scored the same cohort with a BLCA prognosis-associated rewiring template, using the correlation-difference projection described in Section 3.4.5. The template score was higher in responders than in non-responders (Hedges g = 0.31, Wilcoxon P=0.019, n = 68/230) and exceeded 96.2% of 2,850 equal-size random gene-set controls. A second urothelial ICB cohort, GSE176307 (n = 87, 16 responders), showed the same direction with the BLCA template (Hedges g = 0.20, Wilcoxon P=0.588). A third urothelial cohort, GSE225066 (NEODURVARIB, n = 16 pre-treatment biopsies; neoadjuvant durvalumab plus olaparib; pathological response), showed no association beyond random gene-set controls (Hedges g = 0.05, Wilcoxon P=1.000, random-control percentile 79.9%). A fourth urothelial cohort, GSE298296 (n = 82, 49 responders; perioperative TURBT biopsies), was directionally consistent with the template but not individually significant (Hedges g = 0.22, Wilcoxon P=0.596) and fell within its random gene-set null (12.4th percentile of 2,850). The prespecified fixed-effect combination of the four BLCA-template cohorts was significant (g = 0.26, 95% CI 0.05–0.47, P=0.015, I2 = 0%), with the signal carried by IMvigor210; the two RECIST-assessed cohorts alone remained significant (g = 0.28, 95% CI 0.04–0.53, P=0.022, I2 = 0%). At the single-cohort level, none of the seven cohort-level tests survived BH-FDR correction across cohorts, templates and strata (smallest q = 0.134); the meta-analysis was therefore the sole prespecified ICB-level test, with the stratified analyses treated as sensitivity checks. Among the four anti-PD-1/PD-L1 cohorts, the combined effect was g = 0.25 (95% CI 0.03–0.47, P=0.025, I2 = 0%), whereas including the anti-CTLA-4 cohort GSE100797 removed the significance (P=0.166). The IMvigor210 association exceeded 96.2% of random gene-set controls and the GSE176307 association reached 87.4%, so the combined evidence is directionally consistent but remains exploratory. In three melanoma ICB cohorts, GSE91061, GSE78220 and GSE100797, the corresponding SKCM-based template showed no association beyond random gene-set controls (Wilcoxon P=0.682, P=0.393 and P=0.174; random-control percentiles 48.9%, 71.1% and 19.4%). As a timepoint sensitivity check in GSE91061, we re-scored the 42 on-treatment biopsies with patient-level response annotation. The nominally inverse association between the SKCM template score and response (Hedges g = -0.50, Wilcoxon P=0.032) fell within the equal-size random gene-set null (38.5th percentile of 2,850 controls), and the paired pre-to-on-treatment change in template score did not differ between responders and non-responders (Hedges g = -0.79, Wilcoxon P=0.081, random-control percentile 8.5%), indicating no additional evidence at the on-treatment timepoint. These analyses were exploratory and were not corrected for multiple testing across cohorts and templates; the positive result in IMvigor210 together with the null results in the melanoma cohorts indicates a cohort-dependent association between rewiring and ICB response that requires prospective validation. Within IMvigor210, this association was concentrated in the low-TMB stratum: among patients with TMB below the median, the template score was higher in responders than in non-responders (mean difference 0.85 SD, Wilcoxon P=0.004, n = 114), whereas no association was present in the high-TMB stratum (P=0.919, n = 120). In the low-TMB stratum, patients with high template scores showed a response rate of 18.4% compared with 6.9% in the low-score group (Fisher exact P=0.032, OR = 3.06). The association was also present within the IC1 immune-cell stratum (Wilcoxon P=0.045) and directionally consistent in IC0 and IC2 (P=0.178 and P=0.087). These stratified analyses are exploratory and were not corrected for multiple testing. Because MKI67 is measured in the same transcriptomic input used to compute the attention weights, the Ki-67 correlations are descriptive anchors rather than independent validations; TMB provides an independent (mutation-based) anchor. Tumor purity was not used as an additional anchor because ESTIMATE-based purity </w:t>
+      </w:r>
+      <w:r>
+        <w:t>[</w:t>
+      </w:r>
+      <w:r>
+        <w:fldChar w:fldCharType="begin"/>
+      </w:r>
+      <w:r>
+        <w:instrText xml:space="preserve"> REF ref41 \h </w:instrText>
+      </w:r>
+      <w:r>
+        <w:fldChar w:fldCharType="separate"/>
+      </w:r>
+      <w:r>
+        <w:t>41</w:t>
+      </w:r>
+      <w:r>
+        <w:fldChar w:fldCharType="end"/>
+      </w:r>
+      <w:r>
+        <w:t>]</w:t>
+      </w:r>
+      <w:r>
+        <w:rPr>
+          <w:b w:val="0"/>
+        </w:rPr>
+        <w:t xml:space="preserve"> is estimated from the same transcriptomic input as the attention weights and would not constitute an independent validation. The associations were robust to the definition of rewiring magnitude: the Ki-67 association in BRCA (rho = 0.19-0.29 across definitions, all P&lt;0.001); the risk-score association in IMvigor210 (rho = 0.32-0.43, all P&lt;0.001); the LUAD TMB association was directionally consistent but weaker (rho = 0.09, P&lt;0.001, for the primary definition).</w:t>
       </w:r>
     </w:p>
     <w:p>
@@ -16995,7 +18579,79 @@
         <w:rPr>
           <w:b w:val="0"/>
         </w:rPr>
-        <w:t>To connect patient-specific rewiring to the tumor microenvironment and to therapeutic vulnerability, we computed MCP-counter immune cell abundance estimates [42] and ssGSEA scores of nine immune Hallmark gene sets [43,44] per patient, and tested their association with the per-patient rewiring magnitude (Figure 8A). In LUAD, the rewiring magnitude was nominally associated with lower ssGSEA IL2-STAT5-SIGNALING (P=0.016), B lineage (P=0.018) and ssGSEA COMPLEMENT (P=0.046); none of these associations survived BH-FDR correction (smallest q=0.169), and in BRCA no immune feature was associated with rewiring magnitude (smallest P=0.274). Immune infiltration was therefore not strongly coupled to pathway rewiring in these two cohorts.</w:t>
+        <w:t xml:space="preserve">To connect patient-specific rewiring to the tumor microenvironment and to therapeutic vulnerability, we computed MCP-counter immune cell abundance estimates </w:t>
+      </w:r>
+      <w:r>
+        <w:t>[</w:t>
+      </w:r>
+      <w:r>
+        <w:fldChar w:fldCharType="begin"/>
+      </w:r>
+      <w:r>
+        <w:instrText xml:space="preserve"> REF ref42 \h </w:instrText>
+      </w:r>
+      <w:r>
+        <w:fldChar w:fldCharType="separate"/>
+      </w:r>
+      <w:r>
+        <w:t>42</w:t>
+      </w:r>
+      <w:r>
+        <w:fldChar w:fldCharType="end"/>
+      </w:r>
+      <w:r>
+        <w:t>]</w:t>
+      </w:r>
+      <w:r>
+        <w:rPr>
+          <w:b w:val="0"/>
+        </w:rPr>
+        <w:t xml:space="preserve"> and ssGSEA scores of nine immune Hallmark gene sets </w:t>
+      </w:r>
+      <w:r>
+        <w:t>[</w:t>
+      </w:r>
+      <w:r>
+        <w:fldChar w:fldCharType="begin"/>
+      </w:r>
+      <w:r>
+        <w:instrText xml:space="preserve"> REF ref43 \h </w:instrText>
+      </w:r>
+      <w:r>
+        <w:fldChar w:fldCharType="separate"/>
+      </w:r>
+      <w:r>
+        <w:t>43</w:t>
+      </w:r>
+      <w:r>
+        <w:fldChar w:fldCharType="end"/>
+      </w:r>
+      <w:r>
+        <w:t>,</w:t>
+      </w:r>
+      <w:r>
+        <w:fldChar w:fldCharType="begin"/>
+      </w:r>
+      <w:r>
+        <w:instrText xml:space="preserve"> REF ref44 \h </w:instrText>
+      </w:r>
+      <w:r>
+        <w:fldChar w:fldCharType="separate"/>
+      </w:r>
+      <w:r>
+        <w:t>44</w:t>
+      </w:r>
+      <w:r>
+        <w:fldChar w:fldCharType="end"/>
+      </w:r>
+      <w:r>
+        <w:t>]</w:t>
+      </w:r>
+      <w:r>
+        <w:rPr>
+          <w:b w:val="0"/>
+        </w:rPr>
+        <w:t xml:space="preserve"> per patient, and tested their association with the per-patient rewiring magnitude (Figure 8A). In LUAD, the rewiring magnitude was nominally associated with lower ssGSEA IL2-STAT5-SIGNALING (P=0.016), B lineage (P=0.018) and ssGSEA COMPLEMENT (P=0.046); none of these associations survived BH-FDR correction (smallest q=0.169), and in BRCA no immune feature was associated with rewiring magnitude (smallest P=0.274). Immune infiltration was therefore not strongly coupled to pathway rewiring in these two cohorts.</w:t>
       </w:r>
     </w:p>
     <w:p>
@@ -17059,7 +18715,61 @@
         <w:rPr>
           <w:b w:val="0"/>
         </w:rPr>
-        <w:t>We further predicted drug sensitivity with the oncoPredict model [45] trained on GDSC2 cell-line pharmacogenomic data [46] (198 compounds) and compared predicted IC50 values between high- and low-rewiring strata (Figure 8B, Table 9). In BRCA, the high-rewiring stratum was predicted to be more sensitive (lower IC50) to 9 of the 17 curated compounds at nominal significance, most strongly MK-1775 (WEE1, Wilcoxon P=0.006), paclitaxel (P=0.006) and palbociclib (CDK4/6, P=0.018); the Spearman association remained significant after FDR correction for MK-1775 and paclitaxel (q=0.006), whereas the Wilcoxon comparisons did not survive correction (smallest q=0.054). In LUAD, no compound showed a significant difference (smallest P=0.063). These analyses are hypothesis-generating: the predicted IC50 values are in-silico estimates from cell-line-derived models and do not substitute for direct pharmacologic assays (Section 4).</w:t>
+        <w:t xml:space="preserve">We further predicted drug sensitivity with the oncoPredict model </w:t>
+      </w:r>
+      <w:r>
+        <w:t>[</w:t>
+      </w:r>
+      <w:r>
+        <w:fldChar w:fldCharType="begin"/>
+      </w:r>
+      <w:r>
+        <w:instrText xml:space="preserve"> REF ref45 \h </w:instrText>
+      </w:r>
+      <w:r>
+        <w:fldChar w:fldCharType="separate"/>
+      </w:r>
+      <w:r>
+        <w:t>45</w:t>
+      </w:r>
+      <w:r>
+        <w:fldChar w:fldCharType="end"/>
+      </w:r>
+      <w:r>
+        <w:t>]</w:t>
+      </w:r>
+      <w:r>
+        <w:rPr>
+          <w:b w:val="0"/>
+        </w:rPr>
+        <w:t xml:space="preserve"> trained on GDSC2 cell-line pharmacogenomic data </w:t>
+      </w:r>
+      <w:r>
+        <w:t>[</w:t>
+      </w:r>
+      <w:r>
+        <w:fldChar w:fldCharType="begin"/>
+      </w:r>
+      <w:r>
+        <w:instrText xml:space="preserve"> REF ref46 \h </w:instrText>
+      </w:r>
+      <w:r>
+        <w:fldChar w:fldCharType="separate"/>
+      </w:r>
+      <w:r>
+        <w:t>46</w:t>
+      </w:r>
+      <w:r>
+        <w:fldChar w:fldCharType="end"/>
+      </w:r>
+      <w:r>
+        <w:t>]</w:t>
+      </w:r>
+      <w:r>
+        <w:rPr>
+          <w:b w:val="0"/>
+        </w:rPr>
+        <w:t xml:space="preserve"> (198 compounds) and compared predicted IC50 values between high- and low-rewiring strata (Figure 8B, Table 9). In BRCA, the high-rewiring stratum was predicted to be more sensitive (lower IC50) to 9 of the 17 curated compounds at nominal significance, most strongly MK-1775 (WEE1, Wilcoxon P=0.006), paclitaxel (P=0.006) and palbociclib (CDK4/6, P=0.018); the Spearman association remained significant after FDR correction for MK-1775 and paclitaxel (q=0.006), whereas the Wilcoxon comparisons did not survive correction (smallest q=0.054). In LUAD, no compound showed a significant difference (smallest P=0.063). These analyses are hypothesis-generating: the predicted IC50 values are in-silico estimates from cell-line-derived models and do not substitute for direct pharmacologic assays (Section 4).</w:t>
       </w:r>
     </w:p>
     <w:p>
@@ -21380,7 +23090,169 @@
         <w:rPr>
           <w:b w:val="0"/>
         </w:rPr>
-        <w:t>The conceptual contribution of this work is a framework rather than a module tweak. Existing pathway GNNs, including PathGNN [20], Cox-Path [21], prior-knowledge-guided multilevel GNNs [22], and the multi-omics PathMoG [23], treat the pathway graph as a fixed patient-invariant prior and stop at the risk score. We instead treat the effective graph as a per-patient object and provide the statistical machinery to interrogate its rewiring: edge-level and pathway-level tests with BH-FDR control [33], label-permutation nulls, a static-model negative control, a standard-GAT architectural control, and clinical anchoring. On external cohorts the discrimination of the adaptive model was comparable to the deep survival baselines, and internally it was lower, significantly so relative to penalized Cox and the deep neural baselines; we make no claim that per-patient attention improves the C-index; its distinguishing value is that the learned patient-specific edge weights can be formally tested, are clinically anchored to Ki-67 and TMB [39], and are absent in static models by construction. Per-patient variation in attention weights is not by itself novel, because attention is a function of the input features in any attention model; the framework's contribution is that this variation becomes testable, with outcomes that differ between the pathway-constrained adaptive model and a standard-GAT control and between cohorts with and without detectable rewiring. The pathway partition is an interpretive labeling of these differences rather than a statistical necessity, as detailed in Section 3.4.2. The internal performance gap has a plausible mechanistic basis: the pathway constraint restricts the input to 53 KEGG modules, and the dropout and consistency terms further limit effective capacity, whereas penalized Cox and the deep baselines fit the full expression vector without these constraints. On single-transcriptome data with moderate effect sizes, that restriction seemingly costs discrimination while purchasing a structured, testable attention output. The external pattern is consistent with this reading: the deep baselines fell to 0.50 on average across 25 GEO cohorts, essentially the level of Path-AGNN-Cox (0.51), whereas penalized Cox retained the highest external mean (0.57), suggesting that a linear, sparsity-controlled expression-to-risk mapping remains the most portable representation in these data.</w:t>
+        <w:t xml:space="preserve">The conceptual contribution of this work is a framework rather than a module tweak. Existing pathway GNNs, including PathGNN </w:t>
+      </w:r>
+      <w:r>
+        <w:t>[</w:t>
+      </w:r>
+      <w:r>
+        <w:fldChar w:fldCharType="begin"/>
+      </w:r>
+      <w:r>
+        <w:instrText xml:space="preserve"> REF ref20 \h </w:instrText>
+      </w:r>
+      <w:r>
+        <w:fldChar w:fldCharType="separate"/>
+      </w:r>
+      <w:r>
+        <w:t>20</w:t>
+      </w:r>
+      <w:r>
+        <w:fldChar w:fldCharType="end"/>
+      </w:r>
+      <w:r>
+        <w:t>]</w:t>
+      </w:r>
+      <w:r>
+        <w:rPr>
+          <w:b w:val="0"/>
+        </w:rPr>
+        <w:t xml:space="preserve">, Cox-Path </w:t>
+      </w:r>
+      <w:r>
+        <w:t>[</w:t>
+      </w:r>
+      <w:r>
+        <w:fldChar w:fldCharType="begin"/>
+      </w:r>
+      <w:r>
+        <w:instrText xml:space="preserve"> REF ref21 \h </w:instrText>
+      </w:r>
+      <w:r>
+        <w:fldChar w:fldCharType="separate"/>
+      </w:r>
+      <w:r>
+        <w:t>21</w:t>
+      </w:r>
+      <w:r>
+        <w:fldChar w:fldCharType="end"/>
+      </w:r>
+      <w:r>
+        <w:t>]</w:t>
+      </w:r>
+      <w:r>
+        <w:rPr>
+          <w:b w:val="0"/>
+        </w:rPr>
+        <w:t xml:space="preserve">, prior-knowledge-guided multilevel GNNs </w:t>
+      </w:r>
+      <w:r>
+        <w:t>[</w:t>
+      </w:r>
+      <w:r>
+        <w:fldChar w:fldCharType="begin"/>
+      </w:r>
+      <w:r>
+        <w:instrText xml:space="preserve"> REF ref22 \h </w:instrText>
+      </w:r>
+      <w:r>
+        <w:fldChar w:fldCharType="separate"/>
+      </w:r>
+      <w:r>
+        <w:t>22</w:t>
+      </w:r>
+      <w:r>
+        <w:fldChar w:fldCharType="end"/>
+      </w:r>
+      <w:r>
+        <w:t>]</w:t>
+      </w:r>
+      <w:r>
+        <w:rPr>
+          <w:b w:val="0"/>
+        </w:rPr>
+        <w:t xml:space="preserve">, and the multi-omics PathMoG </w:t>
+      </w:r>
+      <w:r>
+        <w:t>[</w:t>
+      </w:r>
+      <w:r>
+        <w:fldChar w:fldCharType="begin"/>
+      </w:r>
+      <w:r>
+        <w:instrText xml:space="preserve"> REF ref23 \h </w:instrText>
+      </w:r>
+      <w:r>
+        <w:fldChar w:fldCharType="separate"/>
+      </w:r>
+      <w:r>
+        <w:t>23</w:t>
+      </w:r>
+      <w:r>
+        <w:fldChar w:fldCharType="end"/>
+      </w:r>
+      <w:r>
+        <w:t>]</w:t>
+      </w:r>
+      <w:r>
+        <w:rPr>
+          <w:b w:val="0"/>
+        </w:rPr>
+        <w:t xml:space="preserve">, treat the pathway graph as a fixed patient-invariant prior and stop at the risk score. We instead treat the effective graph as a per-patient object and provide the statistical machinery to interrogate its rewiring: edge-level and pathway-level tests with BH-FDR control </w:t>
+      </w:r>
+      <w:r>
+        <w:t>[</w:t>
+      </w:r>
+      <w:r>
+        <w:fldChar w:fldCharType="begin"/>
+      </w:r>
+      <w:r>
+        <w:instrText xml:space="preserve"> REF ref33 \h </w:instrText>
+      </w:r>
+      <w:r>
+        <w:fldChar w:fldCharType="separate"/>
+      </w:r>
+      <w:r>
+        <w:t>33</w:t>
+      </w:r>
+      <w:r>
+        <w:fldChar w:fldCharType="end"/>
+      </w:r>
+      <w:r>
+        <w:t>]</w:t>
+      </w:r>
+      <w:r>
+        <w:rPr>
+          <w:b w:val="0"/>
+        </w:rPr>
+        <w:t xml:space="preserve">, label-permutation nulls, a static-model negative control, a standard-GAT architectural control, and clinical anchoring. On external cohorts the discrimination of the adaptive model was comparable to the deep survival baselines, and internally it was lower, significantly so relative to penalized Cox and the deep neural baselines; we make no claim that per-patient attention improves the C-index; its distinguishing value is that the learned patient-specific edge weights can be formally tested, are clinically anchored to Ki-67 and TMB </w:t>
+      </w:r>
+      <w:r>
+        <w:t>[</w:t>
+      </w:r>
+      <w:r>
+        <w:fldChar w:fldCharType="begin"/>
+      </w:r>
+      <w:r>
+        <w:instrText xml:space="preserve"> REF ref39 \h </w:instrText>
+      </w:r>
+      <w:r>
+        <w:fldChar w:fldCharType="separate"/>
+      </w:r>
+      <w:r>
+        <w:t>39</w:t>
+      </w:r>
+      <w:r>
+        <w:fldChar w:fldCharType="end"/>
+      </w:r>
+      <w:r>
+        <w:t>]</w:t>
+      </w:r>
+      <w:r>
+        <w:rPr>
+          <w:b w:val="0"/>
+        </w:rPr>
+        <w:t>, and are absent in static models by construction. Per-patient variation in attention weights is not by itself novel, because attention is a function of the input features in any attention model; the framework's contribution is that this variation becomes testable, with outcomes that differ between the pathway-constrained adaptive model and a standard-GAT control and between cohorts with and without detectable rewiring. The pathway partition is an interpretive labeling of these differences rather than a statistical necessity, as detailed in Section 3.4.2. The internal performance gap has a plausible mechanistic basis: the pathway constraint restricts the input to 53 KEGG modules, and the dropout and consistency terms further limit effective capacity, whereas penalized Cox and the deep baselines fit the full expression vector without these constraints. On single-transcriptome data with moderate effect sizes, that restriction seemingly costs discrimination while purchasing a structured, testable attention output. The external pattern is consistent with this reading: the deep baselines fell to 0.50 on average across 25 GEO cohorts, essentially the level of Path-AGNN-Cox (0.51), whereas penalized Cox retained the highest external mean (0.57), suggesting that a linear, sparsity-controlled expression-to-risk mapping remains the most portable representation in these data.</w:t>
       </w:r>
     </w:p>
     <w:p>
@@ -21394,7 +23266,61 @@
         <w:rPr>
           <w:b w:val="0"/>
         </w:rPr>
-        <w:t xml:space="preserve"> PathMoG is the closest recent work; it also organizes genes into KEGG pathway modules and uses hierarchical attention for multi-omics survival prediction [23]. The two frameworks are complementary in scope and differ in three substantive ways. First, the topology is static in PathMoG and adaptive in Path-AGNN-Cox: PathMoG precomputes patient-invariant pathway topologies and learns attention within them, whereas Path-AGNN-Cox additionally learns the graph temperature per patient, and its rewiring analysis directly interrogates patient-specific graph dynamics. Second, the omics scope differs: PathMoG requires mutation and CNV in addition to expression, which limits its applicability to the many clinical cohorts that only measure transcriptomes; Path-AGNN-Cox is a single-transcriptome model that is immediately applicable to the large body of GEO microarray cohorts, as supported by our 25-cohort external validation. Third, the external validation breadth differs: PathMoG validated transferability in a single breast-cancer cohort, METABRIC [37]; Path-AGNN-Cox was validated in 25 GEO cohorts spanning 11 tumor types. These differences position Path-AGNN-Cox as a lightweight alternative that is potentially more broadly deployable for single-omics clinical and public cohorts, while PathMoG remains the reference for multi-omics integration.</w:t>
+        <w:t xml:space="preserve"> PathMoG is the closest recent work; it also organizes genes into KEGG pathway modules and uses hierarchical attention for multi-omics survival prediction </w:t>
+      </w:r>
+      <w:r>
+        <w:t>[</w:t>
+      </w:r>
+      <w:r>
+        <w:fldChar w:fldCharType="begin"/>
+      </w:r>
+      <w:r>
+        <w:instrText xml:space="preserve"> REF ref23 \h </w:instrText>
+      </w:r>
+      <w:r>
+        <w:fldChar w:fldCharType="separate"/>
+      </w:r>
+      <w:r>
+        <w:t>23</w:t>
+      </w:r>
+      <w:r>
+        <w:fldChar w:fldCharType="end"/>
+      </w:r>
+      <w:r>
+        <w:t>]</w:t>
+      </w:r>
+      <w:r>
+        <w:rPr>
+          <w:b w:val="0"/>
+        </w:rPr>
+        <w:t xml:space="preserve">. The two frameworks are complementary in scope and differ in three substantive ways. First, the topology is static in PathMoG and adaptive in Path-AGNN-Cox: PathMoG precomputes patient-invariant pathway topologies and learns attention within them, whereas Path-AGNN-Cox additionally learns the graph temperature per patient, and its rewiring analysis directly interrogates patient-specific graph dynamics. Second, the omics scope differs: PathMoG requires mutation and CNV in addition to expression, which limits its applicability to the many clinical cohorts that only measure transcriptomes; Path-AGNN-Cox is a single-transcriptome model that is immediately applicable to the large body of GEO microarray cohorts, as supported by our 25-cohort external validation. Third, the external validation breadth differs: PathMoG validated transferability in a single breast-cancer cohort, METABRIC </w:t>
+      </w:r>
+      <w:r>
+        <w:t>[</w:t>
+      </w:r>
+      <w:r>
+        <w:fldChar w:fldCharType="begin"/>
+      </w:r>
+      <w:r>
+        <w:instrText xml:space="preserve"> REF ref37 \h </w:instrText>
+      </w:r>
+      <w:r>
+        <w:fldChar w:fldCharType="separate"/>
+      </w:r>
+      <w:r>
+        <w:t>37</w:t>
+      </w:r>
+      <w:r>
+        <w:fldChar w:fldCharType="end"/>
+      </w:r>
+      <w:r>
+        <w:t>]</w:t>
+      </w:r>
+      <w:r>
+        <w:rPr>
+          <w:b w:val="0"/>
+        </w:rPr>
+        <w:t>; Path-AGNN-Cox was validated in 25 GEO cohorts spanning 11 tumor types. These differences position Path-AGNN-Cox as a lightweight alternative that is potentially more broadly deployable for single-omics clinical and public cohorts, while PathMoG remains the reference for multi-omics integration.</w:t>
       </w:r>
     </w:p>
     <w:p>
@@ -21605,7 +23531,106 @@
         <w:rPr>
           <w:b w:val="0"/>
         </w:rPr>
-        <w:t>All data were obtained from public repositories: TCGA RNA-seq and clinical annotations from UCSC Xena [6] and GDC, GEO series matrices and platform annotations from NCBI GEO [4,5], and IMvigor210 data from the original publication [40]. Accession numbers are listed in Table 1. To protect patient privacy, per-patient expression matrices, clinical records, and per-patient model outputs are not redistributed; aggregate results required to reproduce every table and figure are provided in the repository.</w:t>
+        <w:t xml:space="preserve">All data were obtained from public repositories: TCGA RNA-seq and clinical annotations from UCSC Xena </w:t>
+      </w:r>
+      <w:r>
+        <w:t>[</w:t>
+      </w:r>
+      <w:r>
+        <w:fldChar w:fldCharType="begin"/>
+      </w:r>
+      <w:r>
+        <w:instrText xml:space="preserve"> REF ref6 \h </w:instrText>
+      </w:r>
+      <w:r>
+        <w:fldChar w:fldCharType="separate"/>
+      </w:r>
+      <w:r>
+        <w:t>6</w:t>
+      </w:r>
+      <w:r>
+        <w:fldChar w:fldCharType="end"/>
+      </w:r>
+      <w:r>
+        <w:t>]</w:t>
+      </w:r>
+      <w:r>
+        <w:rPr>
+          <w:b w:val="0"/>
+        </w:rPr>
+        <w:t xml:space="preserve"> and GDC, GEO series matrices and platform annotations from NCBI GEO </w:t>
+      </w:r>
+      <w:r>
+        <w:t>[</w:t>
+      </w:r>
+      <w:r>
+        <w:fldChar w:fldCharType="begin"/>
+      </w:r>
+      <w:r>
+        <w:instrText xml:space="preserve"> REF ref4 \h </w:instrText>
+      </w:r>
+      <w:r>
+        <w:fldChar w:fldCharType="separate"/>
+      </w:r>
+      <w:r>
+        <w:t>4</w:t>
+      </w:r>
+      <w:r>
+        <w:fldChar w:fldCharType="end"/>
+      </w:r>
+      <w:r>
+        <w:t>,</w:t>
+      </w:r>
+      <w:r>
+        <w:fldChar w:fldCharType="begin"/>
+      </w:r>
+      <w:r>
+        <w:instrText xml:space="preserve"> REF ref5 \h </w:instrText>
+      </w:r>
+      <w:r>
+        <w:fldChar w:fldCharType="separate"/>
+      </w:r>
+      <w:r>
+        <w:t>5</w:t>
+      </w:r>
+      <w:r>
+        <w:fldChar w:fldCharType="end"/>
+      </w:r>
+      <w:r>
+        <w:t>]</w:t>
+      </w:r>
+      <w:r>
+        <w:rPr>
+          <w:b w:val="0"/>
+        </w:rPr>
+        <w:t xml:space="preserve">, and IMvigor210 data from the original publication </w:t>
+      </w:r>
+      <w:r>
+        <w:t>[</w:t>
+      </w:r>
+      <w:r>
+        <w:fldChar w:fldCharType="begin"/>
+      </w:r>
+      <w:r>
+        <w:instrText xml:space="preserve"> REF ref40 \h </w:instrText>
+      </w:r>
+      <w:r>
+        <w:fldChar w:fldCharType="separate"/>
+      </w:r>
+      <w:r>
+        <w:t>40</w:t>
+      </w:r>
+      <w:r>
+        <w:fldChar w:fldCharType="end"/>
+      </w:r>
+      <w:r>
+        <w:t>]</w:t>
+      </w:r>
+      <w:r>
+        <w:rPr>
+          <w:b w:val="0"/>
+        </w:rPr>
+        <w:t>. Accession numbers are listed in Table 1. To protect patient privacy, per-patient expression matrices, clinical records, and per-patient model outputs are not redistributed; aggregate results required to reproduce every table and figure are provided in the repository.</w:t>
       </w:r>
     </w:p>
     <w:p>
@@ -21639,371 +23664,601 @@
       </w:r>
     </w:p>
     <w:p>
+      <w:bookmarkStart w:id="1000" w:name="ref1"/>
+      <w:r>
+        <w:t>1</w:t>
+      </w:r>
+      <w:bookmarkEnd w:id="1000"/>
       <w:r>
         <w:rPr>
           <w:b w:val="0"/>
         </w:rPr>
-        <w:t>1. Cox DR. Regression models and life-tables. J R Stat Soc Ser B Stat Methodol. 1972;34(2):187-220. doi:10.1111/j.2517-6161.1972.tb00899.x</w:t>
+        <w:t>Cox DR. Regression models and life-tables. J R Stat Soc Ser B Stat Methodol. 1972;34(2):187-220. doi:10.1111/j.2517-6161.1972.tb00899.x</w:t>
       </w:r>
     </w:p>
     <w:p>
+      <w:bookmarkStart w:id="1001" w:name="ref2"/>
+      <w:r>
+        <w:t>2</w:t>
+      </w:r>
+      <w:bookmarkEnd w:id="1001"/>
       <w:r>
         <w:rPr>
           <w:b w:val="0"/>
         </w:rPr>
-        <w:t>2. Harrell FE, Lee KL, Mark DB. Multivariable prognostic models: issues in developing models, evaluating assumptions and adequacy, and measuring and reducing errors. Stat Med. 1996;15(4):361-387. doi:10.1002/(SICI)1097-0258(19960229)15:4&lt;361::AID-SIM168&gt;3.0.CO;2-4</w:t>
+        <w:t>Harrell FE, Lee KL, Mark DB. Multivariable prognostic models: issues in developing models, evaluating assumptions and adequacy, and measuring and reducing errors. Stat Med. 1996;15(4):361-387. doi:10.1002/(SICI)1097-0258(19960229)15:4&lt;361::AID-SIM168&gt;3.0.CO;2-4</w:t>
       </w:r>
     </w:p>
     <w:p>
+      <w:bookmarkStart w:id="1002" w:name="ref3"/>
+      <w:r>
+        <w:t>3</w:t>
+      </w:r>
+      <w:bookmarkEnd w:id="1002"/>
       <w:r>
         <w:rPr>
           <w:b w:val="0"/>
         </w:rPr>
-        <w:t>3. Weinstein JN, Collisson EA, Mills GB, Shaw KR, Ozenberger BA, Ellrott K, et al. The Cancer Genome Atlas Pan-Cancer analysis project. Nat Genet. 2013;45(10):1113-1120. doi:10.1038/ng.2764</w:t>
+        <w:t>Weinstein JN, Collisson EA, Mills GB, Shaw KR, Ozenberger BA, Ellrott K, et al. The Cancer Genome Atlas Pan-Cancer analysis project. Nat Genet. 2013;45(10):1113-1120. doi:10.1038/ng.2764</w:t>
       </w:r>
     </w:p>
     <w:p>
+      <w:bookmarkStart w:id="1003" w:name="ref4"/>
+      <w:r>
+        <w:t>4</w:t>
+      </w:r>
+      <w:bookmarkEnd w:id="1003"/>
       <w:r>
         <w:rPr>
           <w:b w:val="0"/>
         </w:rPr>
-        <w:t>4. Barrett T, Wilhite SE, Ledoux P, Evangelista C, Kim IF, Tomashevsky M, et al. NCBI GEO: archive for functional genomics data sets, update. Nucleic Acids Res. 2013;41(D1):D991-D995. doi:10.1093/nar/gks1193</w:t>
+        <w:t>Barrett T, Wilhite SE, Ledoux P, Evangelista C, Kim IF, Tomashevsky M, et al. NCBI GEO: archive for functional genomics data sets, update. Nucleic Acids Res. 2013;41(D1):D991-D995. doi:10.1093/nar/gks1193</w:t>
       </w:r>
     </w:p>
     <w:p>
+      <w:bookmarkStart w:id="1004" w:name="ref5"/>
+      <w:r>
+        <w:t>5</w:t>
+      </w:r>
+      <w:bookmarkEnd w:id="1004"/>
       <w:r>
         <w:rPr>
           <w:b w:val="0"/>
         </w:rPr>
-        <w:t>5. Davis S, Meltzer PS. GEOquery: a bridge between the Gene Expression Omnibus (GEO) and BioConductor. Bioinformatics. 2007;23(14):1846-1847. doi:10.1093/bioinformatics/btm254</w:t>
+        <w:t>Davis S, Meltzer PS. GEOquery: a bridge between the Gene Expression Omnibus (GEO) and BioConductor. Bioinformatics. 2007;23(14):1846-1847. doi:10.1093/bioinformatics/btm254</w:t>
       </w:r>
     </w:p>
     <w:p>
+      <w:bookmarkStart w:id="1005" w:name="ref6"/>
+      <w:r>
+        <w:t>6</w:t>
+      </w:r>
+      <w:bookmarkEnd w:id="1005"/>
       <w:r>
         <w:rPr>
           <w:b w:val="0"/>
         </w:rPr>
-        <w:t>6. Goldman MJ, Craft B, Hastie M, Repečka K, McDade F, Kamath A, et al. Visualizing and interpreting cancer genomics data via the Xena platform. Nat Biotechnol. 2020;38(6):675-678. doi:10.1038/s41587-020-0546-8</w:t>
+        <w:t>Goldman MJ, Craft B, Hastie M, Repečka K, McDade F, Kamath A, et al. Visualizing and interpreting cancer genomics data via the Xena platform. Nat Biotechnol. 2020;38(6):675-678. doi:10.1038/s41587-020-0546-8</w:t>
       </w:r>
     </w:p>
     <w:p>
+      <w:bookmarkStart w:id="1006" w:name="ref7"/>
+      <w:r>
+        <w:t>7</w:t>
+      </w:r>
+      <w:bookmarkEnd w:id="1006"/>
       <w:r>
         <w:rPr>
           <w:b w:val="0"/>
         </w:rPr>
-        <w:t>7. Friedman J, Hastie T, Tibshirani R. Regularization paths for generalized linear models via coordinate descent. J Stat Softw. 2010;33(1):1-22. doi:10.18637/jss.v033.i01</w:t>
+        <w:t>Friedman J, Hastie T, Tibshirani R. Regularization paths for generalized linear models via coordinate descent. J Stat Softw. 2010;33(1):1-22. doi:10.18637/jss.v033.i01</w:t>
       </w:r>
     </w:p>
     <w:p>
+      <w:bookmarkStart w:id="1007" w:name="ref8"/>
+      <w:r>
+        <w:t>8</w:t>
+      </w:r>
+      <w:bookmarkEnd w:id="1007"/>
       <w:r>
         <w:rPr>
           <w:b w:val="0"/>
         </w:rPr>
-        <w:t>8. Simon N, Friedman J, Hastie T, Tibshirani R. Regularization paths for Cox's proportional hazards model via coordinate descent. J Stat Softw. 2011;39(5):1-13. doi:10.18637/jss.v039.i05</w:t>
+        <w:t>Simon N, Friedman J, Hastie T, Tibshirani R. Regularization paths for Cox's proportional hazards model via coordinate descent. J Stat Softw. 2011;39(5):1-13. doi:10.18637/jss.v039.i05</w:t>
       </w:r>
     </w:p>
     <w:p>
+      <w:bookmarkStart w:id="1008" w:name="ref9"/>
+      <w:r>
+        <w:t>9</w:t>
+      </w:r>
+      <w:bookmarkEnd w:id="1008"/>
       <w:r>
         <w:rPr>
           <w:b w:val="0"/>
         </w:rPr>
-        <w:t>9. Katzman JL, Shaham U, Cloninger A, Bates J, Jiang T, Kluger Y. DeepSurv: personalized treatment recommender system using a Cox proportional hazards deep neural network. BMC Med Res Methodol. 2018;18(1):24. doi:10.1186/s12874-018-0482-1</w:t>
+        <w:t>Katzman JL, Shaham U, Cloninger A, Bates J, Jiang T, Kluger Y. DeepSurv: personalized treatment recommender system using a Cox proportional hazards deep neural network. BMC Med Res Methodol. 2018;18(1):24. doi:10.1186/s12874-018-0482-1</w:t>
       </w:r>
     </w:p>
     <w:p>
+      <w:bookmarkStart w:id="1009" w:name="ref10"/>
+      <w:r>
+        <w:t>10</w:t>
+      </w:r>
+      <w:bookmarkEnd w:id="1009"/>
       <w:r>
         <w:rPr>
           <w:b w:val="0"/>
         </w:rPr>
-        <w:t>10. Ching T, Zhu X, Garmire LX. Cox-nnet: an artificial neural network method for prognosis prediction of high-throughput omics data. PLoS Comput Biol. 2018;14(4):e1006076. doi:10.1371/journal.pcbi.1006076</w:t>
+        <w:t>Ching T, Zhu X, Garmire LX. Cox-nnet: an artificial neural network method for prognosis prediction of high-throughput omics data. PLoS Comput Biol. 2018;14(4):e1006076. doi:10.1371/journal.pcbi.1006076</w:t>
       </w:r>
     </w:p>
     <w:p>
+      <w:bookmarkStart w:id="1010" w:name="ref11"/>
+      <w:r>
+        <w:t>11</w:t>
+      </w:r>
+      <w:bookmarkEnd w:id="1010"/>
       <w:r>
         <w:rPr>
           <w:b w:val="0"/>
         </w:rPr>
-        <w:t>11. Lee C, Zame W, Yoon J, van der Schaar M. DeepHit: a deep learning approach to survival analysis with competing risks. Proc AAAI Conf Artif Intell. 2018;32(1):2314-2321. doi:10.1609/aaai.v32i1.11842</w:t>
+        <w:t>Lee C, Zame W, Yoon J, van der Schaar M. DeepHit: a deep learning approach to survival analysis with competing risks. Proc AAAI Conf Artif Intell. 2018;32(1):2314-2321. doi:10.1609/aaai.v32i1.11842</w:t>
       </w:r>
     </w:p>
     <w:p>
+      <w:bookmarkStart w:id="1011" w:name="ref12"/>
+      <w:r>
+        <w:t>12</w:t>
+      </w:r>
+      <w:bookmarkEnd w:id="1011"/>
       <w:r>
         <w:rPr>
           <w:b w:val="0"/>
         </w:rPr>
-        <w:t>12. Ishwaran H, Kogalur UB, Blackstone EH, Lauer MS. Random survival forests. Ann Appl Stat. 2008;2(3):841-860. doi:10.1214/08-AOAS169</w:t>
+        <w:t>Ishwaran H, Kogalur UB, Blackstone EH, Lauer MS. Random survival forests. Ann Appl Stat. 2008;2(3):841-860. doi:10.1214/08-AOAS169</w:t>
       </w:r>
     </w:p>
     <w:p>
+      <w:bookmarkStart w:id="1012" w:name="ref13"/>
+      <w:r>
+        <w:t>13</w:t>
+      </w:r>
+      <w:bookmarkEnd w:id="1012"/>
       <w:r>
         <w:rPr>
           <w:b w:val="0"/>
         </w:rPr>
-        <w:t>13. Eraslan G, Avsec Ž, Gagneur J, Theis FJ. Deep learning: new computational modelling techniques for genomics. Nat Rev Genet. 2019;20(7):389-403. doi:10.1038/s41576-019-0122-6</w:t>
+        <w:t>Eraslan G, Avsec Ž, Gagneur J, Theis FJ. Deep learning: new computational modelling techniques for genomics. Nat Rev Genet. 2019;20(7):389-403. doi:10.1038/s41576-019-0122-6</w:t>
       </w:r>
     </w:p>
     <w:p>
+      <w:bookmarkStart w:id="1013" w:name="ref14"/>
+      <w:r>
+        <w:t>14</w:t>
+      </w:r>
+      <w:bookmarkEnd w:id="1013"/>
       <w:r>
         <w:rPr>
           <w:b w:val="0"/>
         </w:rPr>
-        <w:t>14. Wainberg M, Merico D, Delong A, Frey BJ. Deep learning in biomedicine. Nat Biotechnol. 2018;36(9):829-838. doi:10.1038/nbt.4233</w:t>
+        <w:t>Wainberg M, Merico D, Delong A, Frey BJ. Deep learning in biomedicine. Nat Biotechnol. 2018;36(9):829-838. doi:10.1038/nbt.4233</w:t>
       </w:r>
     </w:p>
     <w:p>
+      <w:bookmarkStart w:id="1014" w:name="ref15"/>
+      <w:r>
+        <w:t>15</w:t>
+      </w:r>
+      <w:bookmarkEnd w:id="1014"/>
       <w:r>
         <w:rPr>
           <w:b w:val="0"/>
         </w:rPr>
-        <w:t>15. Miotto R, Wang F, Wang S, Jiang X, Dudley JT. Deep learning for healthcare: review, opportunities and challenges. Brief Bioinform. 2018;19(6):1236-1246. doi:10.1093/bib/bbx044</w:t>
+        <w:t>Miotto R, Wang F, Wang S, Jiang X, Dudley JT. Deep learning for healthcare: review, opportunities and challenges. Brief Bioinform. 2018;19(6):1236-1246. doi:10.1093/bib/bbx044</w:t>
       </w:r>
     </w:p>
     <w:p>
+      <w:bookmarkStart w:id="1015" w:name="ref16"/>
+      <w:r>
+        <w:t>16</w:t>
+      </w:r>
+      <w:bookmarkEnd w:id="1015"/>
       <w:r>
         <w:rPr>
           <w:b w:val="0"/>
         </w:rPr>
-        <w:t>16. Kipf TN, Welling M. Semi-supervised classification with graph convolutional networks. arXiv:1609.02907 [cs.LG]. 2017. doi:10.48550/arXiv.1609.02907</w:t>
+        <w:t>Kipf TN, Welling M. Semi-supervised classification with graph convolutional networks. arXiv:1609.02907 [cs.LG]. 2017. doi:10.48550/arXiv.1609.02907</w:t>
       </w:r>
     </w:p>
     <w:p>
+      <w:bookmarkStart w:id="1016" w:name="ref17"/>
+      <w:r>
+        <w:t>17</w:t>
+      </w:r>
+      <w:bookmarkEnd w:id="1016"/>
       <w:r>
         <w:rPr>
           <w:b w:val="0"/>
         </w:rPr>
-        <w:t>17. Veličković P, Cucurull G, Casanova A, Romero A, Liò P, Bengio Y. Graph attention networks. arXiv:1710.10903 [cs.LG]. 2018. doi:10.48550/arXiv.1710.10903</w:t>
+        <w:t>Veličković P, Cucurull G, Casanova A, Romero A, Liò P, Bengio Y. Graph attention networks. arXiv:1710.10903 [cs.LG]. 2018. doi:10.48550/arXiv.1710.10903</w:t>
       </w:r>
     </w:p>
     <w:p>
+      <w:bookmarkStart w:id="1017" w:name="ref18"/>
+      <w:r>
+        <w:t>18</w:t>
+      </w:r>
+      <w:bookmarkEnd w:id="1017"/>
       <w:r>
         <w:rPr>
           <w:b w:val="0"/>
         </w:rPr>
-        <w:t>18. Zitnik M, Agrawal M, Leskovec J. Modeling polypharmacy side effects with graph convolutional networks. Bioinformatics. 2018;34(13):i457-i466. doi:10.1093/bioinformatics/bty294</w:t>
+        <w:t>Zitnik M, Agrawal M, Leskovec J. Modeling polypharmacy side effects with graph convolutional networks. Bioinformatics. 2018;34(13):i457-i466. doi:10.1093/bioinformatics/bty294</w:t>
       </w:r>
     </w:p>
     <w:p>
+      <w:bookmarkStart w:id="1018" w:name="ref19"/>
+      <w:r>
+        <w:t>19</w:t>
+      </w:r>
+      <w:bookmarkEnd w:id="1018"/>
       <w:r>
         <w:rPr>
           <w:b w:val="0"/>
         </w:rPr>
-        <w:t>19. Kanehisa M, Furumichi M, Sato Y, Kawashima M, Ishiguro-Watanabe M. KEGG for taxonomy-based analysis of pathways and genomes. Nucleic Acids Res. 2023;51(D1):D587-D592. doi:10.1093/nar/gkac963</w:t>
+        <w:t>Kanehisa M, Furumichi M, Sato Y, Kawashima M, Ishiguro-Watanabe M. KEGG for taxonomy-based analysis of pathways and genomes. Nucleic Acids Res. 2023;51(D1):D587-D592. doi:10.1093/nar/gkac963</w:t>
       </w:r>
     </w:p>
     <w:p>
+      <w:bookmarkStart w:id="1019" w:name="ref20"/>
+      <w:r>
+        <w:t>20</w:t>
+      </w:r>
+      <w:bookmarkEnd w:id="1019"/>
       <w:r>
         <w:rPr>
           <w:b w:val="0"/>
         </w:rPr>
-        <w:t>20. Liang J, Zhang Y, Chen H, et al. Risk stratification and pathway analysis based on graph neural network and interpretable algorithm. BMC Bioinformatics. 2022;23(1):411. doi:10.1186/s12859-022-04950-1</w:t>
+        <w:t>Liang J, Zhang Y, Chen H, et al. Risk stratification and pathway analysis based on graph neural network and interpretable algorithm. BMC Bioinformatics. 2022;23(1):411. doi:10.1186/s12859-022-04950-1</w:t>
       </w:r>
     </w:p>
     <w:p>
+      <w:bookmarkStart w:id="1020" w:name="ref21"/>
+      <w:r>
+        <w:t>21</w:t>
+      </w:r>
+      <w:bookmarkEnd w:id="1020"/>
       <w:r>
         <w:rPr>
           <w:b w:val="0"/>
         </w:rPr>
-        <w:t>21. Ma T, Zhao H, Zhao Q, Wang J. Cox-Path: biological pathway-informed graph neural network for cancer survival prediction. In: Proceedings of the 15th ACM International Conference on Bioinformatics, Computational Biology and Health Informatics (ACM-BCB 2024). New York: ACM; 2024. doi:10.1145/3698587.3701397</w:t>
+        <w:t>Ma T, Zhao H, Zhao Q, Wang J. Cox-Path: biological pathway-informed graph neural network for cancer survival prediction. In: Proceedings of the 15th ACM International Conference on Bioinformatics, Computational Biology and Health Informatics (ACM-BCB 2024). New York: ACM; 2024. doi:10.1145/3698587.3701397</w:t>
       </w:r>
     </w:p>
     <w:p>
+      <w:bookmarkStart w:id="1021" w:name="ref22"/>
+      <w:r>
+        <w:t>22</w:t>
+      </w:r>
+      <w:bookmarkEnd w:id="1021"/>
       <w:r>
         <w:rPr>
           <w:b w:val="0"/>
         </w:rPr>
-        <w:t>22. Yan H, Weng D, Li D, Gu Y, Ma W, Liu Q. Prior knowledge-guided multilevel graph neural network for tumor risk prediction and interpretation via multi-omics data integration. Brief Bioinform. 2024;25(4):bbae184. doi:10.1093/bib/bbae184</w:t>
+        <w:t>Yan H, Weng D, Li D, Gu Y, Ma W, Liu Q. Prior knowledge-guided multilevel graph neural network for tumor risk prediction and interpretation via multi-omics data integration. Brief Bioinform. 2024;25(4):bbae184. doi:10.1093/bib/bbae184</w:t>
       </w:r>
     </w:p>
     <w:p>
+      <w:bookmarkStart w:id="1022" w:name="ref23"/>
+      <w:r>
+        <w:t>23</w:t>
+      </w:r>
+      <w:bookmarkEnd w:id="1022"/>
       <w:r>
         <w:rPr>
           <w:b w:val="0"/>
         </w:rPr>
-        <w:t>23. Wang Z, et al. PathMoG: a pathway-centric modular graph neural network for multi-omics survival prediction. arXiv:2604.24371 [q-bio.QM]. 2026. doi:10.48550/arXiv.2604.24371</w:t>
+        <w:t>Wang Z, et al. PathMoG: a pathway-centric modular graph neural network for multi-omics survival prediction. arXiv:2604.24371 [q-bio.QM]. 2026. doi:10.48550/arXiv.2604.24371</w:t>
       </w:r>
     </w:p>
     <w:p>
+      <w:bookmarkStart w:id="1023" w:name="ref24"/>
+      <w:r>
+        <w:t>24</w:t>
+      </w:r>
+      <w:bookmarkEnd w:id="1023"/>
       <w:r>
         <w:rPr>
           <w:b w:val="0"/>
         </w:rPr>
-        <w:t>24. Ha MJ, Baladandayuthapani V. DINGO: differential network analysis in genomics. Bioinformatics. 2015;31(21):3413-3420. doi:10.1093/bioinformatics/btv406</w:t>
+        <w:t>Ha MJ, Baladandayuthapani V. DINGO: differential network analysis in genomics. Bioinformatics. 2015;31(21):3413-3420. doi:10.1093/bioinformatics/btv406</w:t>
       </w:r>
     </w:p>
     <w:p>
+      <w:bookmarkStart w:id="1024" w:name="ref25"/>
+      <w:r>
+        <w:t>25</w:t>
+      </w:r>
+      <w:bookmarkEnd w:id="1024"/>
       <w:r>
         <w:rPr>
           <w:b w:val="0"/>
         </w:rPr>
-        <w:t>25. de la Fuente A. From differential expression to differential networking: identification of dysfunctional regulatory networks in diseases. Trends Genet. 2010;26(7):326-333. doi:10.1016/j.tig.2010.05.001</w:t>
+        <w:t>de la Fuente A. From differential expression to differential networking: identification of dysfunctional regulatory networks in diseases. Trends Genet. 2010;26(7):326-333. doi:10.1016/j.tig.2010.05.001</w:t>
       </w:r>
     </w:p>
     <w:p>
+      <w:bookmarkStart w:id="1025" w:name="ref26"/>
+      <w:r>
+        <w:t>26</w:t>
+      </w:r>
+      <w:bookmarkEnd w:id="1025"/>
       <w:r>
         <w:rPr>
           <w:b w:val="0"/>
         </w:rPr>
-        <w:t>26. Gill R, Datta S, Datta S. A statistical framework for differential network analysis from microarray data. BMC Bioinformatics. 2010;11:95. doi:10.1186/1471-2105-11-95</w:t>
+        <w:t>Gill R, Datta S, Datta S. A statistical framework for differential network analysis from microarray data. BMC Bioinformatics. 2010;11:95. doi:10.1186/1471-2105-11-95</w:t>
       </w:r>
     </w:p>
     <w:p>
+      <w:bookmarkStart w:id="1026" w:name="ref27"/>
+      <w:r>
+        <w:t>27</w:t>
+      </w:r>
+      <w:bookmarkEnd w:id="1026"/>
       <w:r>
         <w:rPr>
           <w:b w:val="0"/>
         </w:rPr>
-        <w:t>27. Colaprico A, Silva TC, Olsen C, Garofano L, Cava C, Garolini D, et al. TCGAbiolinks: an R/Bioconductor package for integrative analysis of TCGA data. Nucleic Acids Res. 2016;44(8):e71. doi:10.1093/nar/gkv1507</w:t>
+        <w:t>Colaprico A, Silva TC, Olsen C, Garofano L, Cava C, Garolini D, et al. TCGAbiolinks: an R/Bioconductor package for integrative analysis of TCGA data. Nucleic Acids Res. 2016;44(8):e71. doi:10.1093/nar/gkv1507</w:t>
       </w:r>
     </w:p>
     <w:p>
+      <w:bookmarkStart w:id="1027" w:name="ref28"/>
+      <w:r>
+        <w:t>28</w:t>
+      </w:r>
+      <w:bookmarkEnd w:id="1027"/>
       <w:r>
         <w:rPr>
           <w:b w:val="0"/>
         </w:rPr>
-        <w:t>28. Therneau TM, Grambsch PM. Modeling Survival Data: Extending the Cox Model. New York: Springer; 2000. doi:10.1007/978-1-4757-3294-8</w:t>
+        <w:t>Therneau TM, Grambsch PM. Modeling Survival Data: Extending the Cox Model. New York: Springer; 2000. doi:10.1007/978-1-4757-3294-8</w:t>
       </w:r>
     </w:p>
     <w:p>
+      <w:bookmarkStart w:id="1028" w:name="ref29"/>
+      <w:r>
+        <w:t>29</w:t>
+      </w:r>
+      <w:bookmarkEnd w:id="1028"/>
       <w:r>
         <w:rPr>
           <w:b w:val="0"/>
         </w:rPr>
-        <w:t>29. Uno H, Cai T, Pencina MJ, D'Agostino RB, Wei LJ. On the C-statistics for evaluating overall adequacy of risk prediction procedures with censored survival data. Stat Med. 2011;30(10):1105-1117. doi:10.1002/sim.4154</w:t>
+        <w:t>Uno H, Cai T, Pencina MJ, D'Agostino RB, Wei LJ. On the C-statistics for evaluating overall adequacy of risk prediction procedures with censored survival data. Stat Med. 2011;30(10):1105-1117. doi:10.1002/sim.4154</w:t>
       </w:r>
     </w:p>
     <w:p>
+      <w:bookmarkStart w:id="1029" w:name="ref30"/>
+      <w:r>
+        <w:t>30</w:t>
+      </w:r>
+      <w:bookmarkEnd w:id="1029"/>
       <w:r>
         <w:rPr>
           <w:b w:val="0"/>
         </w:rPr>
-        <w:t>30. Heagerty PJ, Zheng Y. Survival model predictive accuracy and ROC curves. Biometrics. 2005;61(1):92-105. doi:10.1111/j.0006-341X.2005.030814.x</w:t>
+        <w:t>Heagerty PJ, Zheng Y. Survival model predictive accuracy and ROC curves. Biometrics. 2005;61(1):92-105. doi:10.1111/j.0006-341X.2005.030814.x</w:t>
       </w:r>
     </w:p>
     <w:p>
+      <w:bookmarkStart w:id="1030" w:name="ref31"/>
+      <w:r>
+        <w:t>31</w:t>
+      </w:r>
+      <w:bookmarkEnd w:id="1030"/>
       <w:r>
         <w:rPr>
           <w:b w:val="0"/>
         </w:rPr>
-        <w:t>31. Altman DG, Vergouwe Y, Royston P, Moons KG. Prognosis and prognostic research: validating a prognostic model. BMJ. 2009;338:b605. doi:10.1136/bmj.b605</w:t>
+        <w:t>Altman DG, Vergouwe Y, Royston P, Moons KG. Prognosis and prognostic research: validating a prognostic model. BMJ. 2009;338:b605. doi:10.1136/bmj.b605</w:t>
       </w:r>
     </w:p>
     <w:p>
+      <w:bookmarkStart w:id="1031" w:name="ref32"/>
+      <w:r>
+        <w:t>32</w:t>
+      </w:r>
+      <w:bookmarkEnd w:id="1031"/>
       <w:r>
         <w:rPr>
           <w:b w:val="0"/>
         </w:rPr>
-        <w:t>32. Vickers AJ, Elkin EB. Decision curve analysis: a novel method for evaluating prediction models. Med Decis Making. 2006;26(6):565-574. doi:10.1177/0272989X06295361</w:t>
+        <w:t>Vickers AJ, Elkin EB. Decision curve analysis: a novel method for evaluating prediction models. Med Decis Making. 2006;26(6):565-574. doi:10.1177/0272989X06295361</w:t>
       </w:r>
     </w:p>
     <w:p>
+      <w:bookmarkStart w:id="1032" w:name="ref33"/>
+      <w:r>
+        <w:t>33</w:t>
+      </w:r>
+      <w:bookmarkEnd w:id="1032"/>
       <w:r>
         <w:rPr>
           <w:b w:val="0"/>
         </w:rPr>
-        <w:t>33. Benjamini Y, Hochberg Y. Controlling the false discovery rate: a practical and powerful approach to multiple testing. J R Stat Soc Ser B Stat Methodol. 1995;57(1):289-300. doi:10.1111/j.2517-6161.1995.tb02031.x</w:t>
+        <w:t>Benjamini Y, Hochberg Y. Controlling the false discovery rate: a practical and powerful approach to multiple testing. J R Stat Soc Ser B Stat Methodol. 1995;57(1):289-300. doi:10.1111/j.2517-6161.1995.tb02031.x</w:t>
       </w:r>
     </w:p>
     <w:p>
+      <w:bookmarkStart w:id="1033" w:name="ref34"/>
+      <w:r>
+        <w:t>34</w:t>
+      </w:r>
+      <w:bookmarkEnd w:id="1033"/>
       <w:r>
         <w:rPr>
           <w:b w:val="0"/>
         </w:rPr>
-        <w:t>34. Paszke A, Gross S, Massa F, Lerer A, Bradbury J, Chanan G, et al. PyTorch: an imperative style, high-performance deep learning library. arXiv:1912.01703 [cs.LG]. 2019. doi:10.48550/arXiv.1912.01703</w:t>
+        <w:t>Paszke A, Gross S, Massa F, Lerer A, Bradbury J, Chanan G, et al. PyTorch: an imperative style, high-performance deep learning library. arXiv:1912.01703 [cs.LG]. 2019. doi:10.48550/arXiv.1912.01703</w:t>
       </w:r>
     </w:p>
     <w:p>
+      <w:bookmarkStart w:id="1034" w:name="ref35"/>
+      <w:r>
+        <w:t>35</w:t>
+      </w:r>
+      <w:bookmarkEnd w:id="1034"/>
       <w:r>
         <w:rPr>
           <w:b w:val="0"/>
         </w:rPr>
-        <w:t>35. Davidson-Pilon C. lifelines: survival analysis in Python. J Open Source Softw. 2019;4(39):1317. doi:10.21105/joss.01317</w:t>
+        <w:t>Davidson-Pilon C. lifelines: survival analysis in Python. J Open Source Softw. 2019;4(39):1317. doi:10.21105/joss.01317</w:t>
       </w:r>
     </w:p>
     <w:p>
+      <w:bookmarkStart w:id="1035" w:name="ref36"/>
+      <w:r>
+        <w:t>36</w:t>
+      </w:r>
+      <w:bookmarkEnd w:id="1035"/>
       <w:r>
         <w:rPr>
           <w:b w:val="0"/>
         </w:rPr>
-        <w:t>36. Pedregosa F, Varoquaux G, Gramfort A, Michel V, Thirion B, Grisel O, et al. Scikit-learn: machine learning in Python. arXiv:1201.0490 [cs.LG]. 2011. doi:10.48550/arXiv.1201.0490</w:t>
+        <w:t>Pedregosa F, Varoquaux G, Gramfort A, Michel V, Thirion B, Grisel O, et al. Scikit-learn: machine learning in Python. arXiv:1201.0490 [cs.LG]. 2011. doi:10.48550/arXiv.1201.0490</w:t>
       </w:r>
     </w:p>
     <w:p>
+      <w:bookmarkStart w:id="1036" w:name="ref37"/>
+      <w:r>
+        <w:t>37</w:t>
+      </w:r>
+      <w:bookmarkEnd w:id="1036"/>
       <w:r>
         <w:rPr>
           <w:b w:val="0"/>
         </w:rPr>
-        <w:t>37. Curtis C, Shah SP, Chin SF, Turashvili G, Rueda OM, Dunning MJ, et al. The genomic and transcriptomic architecture of 2,000 breast tumours reveals novel subgroups. Nature. 2012;486(7403):346-352. doi:10.1038/nature10983</w:t>
+        <w:t>Curtis C, Shah SP, Chin SF, Turashvili G, Rueda OM, Dunning MJ, et al. The genomic and transcriptomic architecture of 2,000 breast tumours reveals novel subgroups. Nature. 2012;486(7403):346-352. doi:10.1038/nature10983</w:t>
       </w:r>
     </w:p>
     <w:p>
+      <w:bookmarkStart w:id="1037" w:name="ref38"/>
+      <w:r>
+        <w:t>38</w:t>
+      </w:r>
+      <w:bookmarkEnd w:id="1037"/>
       <w:r>
         <w:rPr>
           <w:b w:val="0"/>
         </w:rPr>
-        <w:t>38. Crowson CS, Atkinson EJ, Therneau TM. Assessing calibration of prognostic risk scores. Stat Methods Med Res. 2016;25(4):1692-1706. doi:10.1177/0962280213497434</w:t>
+        <w:t>Crowson CS, Atkinson EJ, Therneau TM. Assessing calibration of prognostic risk scores. Stat Methods Med Res. 2016;25(4):1692-1706. doi:10.1177/0962280213497434</w:t>
       </w:r>
     </w:p>
     <w:p>
+      <w:bookmarkStart w:id="1038" w:name="ref39"/>
+      <w:r>
+        <w:t>39</w:t>
+      </w:r>
+      <w:bookmarkEnd w:id="1038"/>
       <w:r>
         <w:rPr>
           <w:b w:val="0"/>
         </w:rPr>
-        <w:t>39. Chalmers ZR, Connelly CF, Fabrizio D, Gay L, Ali SM, Ennis R, et al. Analysis of 100,000 human cancer genomes reveals the landscape of tumor mutational burden. Genome Med. 2017;9:34. doi:10.1186/s13073-017-0424-2</w:t>
+        <w:t>Chalmers ZR, Connelly CF, Fabrizio D, Gay L, Ali SM, Ennis R, et al. Analysis of 100,000 human cancer genomes reveals the landscape of tumor mutational burden. Genome Med. 2017;9:34. doi:10.1186/s13073-017-0424-2</w:t>
       </w:r>
     </w:p>
     <w:p>
+      <w:bookmarkStart w:id="1039" w:name="ref40"/>
+      <w:r>
+        <w:t>40</w:t>
+      </w:r>
+      <w:bookmarkEnd w:id="1039"/>
       <w:r>
         <w:rPr>
           <w:b w:val="0"/>
         </w:rPr>
-        <w:t>40. Mariathasan S, Turley SJ, Nickles D, et al. TGFβ attenuates tumour response to PD-L1 blockade by contributing to exclusion of T cells. Nature. 2018;554(7693):544-548. doi:10.1038/nature25501</w:t>
+        <w:t>Mariathasan S, Turley SJ, Nickles D, et al. TGFβ attenuates tumour response to PD-L1 blockade by contributing to exclusion of T cells. Nature. 2018;554(7693):544-548. doi:10.1038/nature25501</w:t>
       </w:r>
     </w:p>
     <w:p>
+      <w:bookmarkStart w:id="1040" w:name="ref41"/>
+      <w:r>
+        <w:t>41</w:t>
+      </w:r>
+      <w:bookmarkEnd w:id="1040"/>
       <w:r>
         <w:rPr>
           <w:b w:val="0"/>
         </w:rPr>
-        <w:t>41. Yoshihara K, Shahmoradgoli M, Martínez E, Vegesna R, Kim H, Torres-Garcia W, et al. Inferring tumour purity and stromal and immune cell admixture from expression data. Nat Commun. 2013;4:2612. doi:10.1038/ncomms3612</w:t>
+        <w:t>Yoshihara K, Shahmoradgoli M, Martínez E, Vegesna R, Kim H, Torres-Garcia W, et al. Inferring tumour purity and stromal and immune cell admixture from expression data. Nat Commun. 2013;4:2612. doi:10.1038/ncomms3612</w:t>
       </w:r>
     </w:p>
     <w:p>
+      <w:bookmarkStart w:id="1041" w:name="ref42"/>
+      <w:r>
+        <w:t>42</w:t>
+      </w:r>
+      <w:bookmarkEnd w:id="1041"/>
       <w:r>
         <w:rPr>
           <w:b w:val="0"/>
         </w:rPr>
-        <w:t>42. Becht E, Giraldo NA, Lacroix L, Buttard B, Elarouci N, Petitprez F, et al. Estimating the population abundance of tissue-infiltrating immune and stromal cell populations using gene expression. Genome Biol. 2016;17:218. doi:10.1186/s13059-016-1070-5</w:t>
+        <w:t>Becht E, Giraldo NA, Lacroix L, Buttard B, Elarouci N, Petitprez F, et al. Estimating the population abundance of tissue-infiltrating immune and stromal cell populations using gene expression. Genome Biol. 2016;17:218. doi:10.1186/s13059-016-1070-5</w:t>
       </w:r>
     </w:p>
     <w:p>
+      <w:bookmarkStart w:id="1042" w:name="ref43"/>
+      <w:r>
+        <w:t>43</w:t>
+      </w:r>
+      <w:bookmarkEnd w:id="1042"/>
       <w:r>
         <w:rPr>
           <w:b w:val="0"/>
         </w:rPr>
-        <w:t>43. Hänzelmann S, Castelo R, Guinney J. GSVA: gene set variation analysis for microarray and RNA-seq data. BMC Bioinformatics. 2013;14:7. doi:10.1186/1471-2105-14-7</w:t>
+        <w:t>Hänzelmann S, Castelo R, Guinney J. GSVA: gene set variation analysis for microarray and RNA-seq data. BMC Bioinformatics. 2013;14:7. doi:10.1186/1471-2105-14-7</w:t>
       </w:r>
     </w:p>
     <w:p>
+      <w:bookmarkStart w:id="1043" w:name="ref44"/>
+      <w:r>
+        <w:t>44</w:t>
+      </w:r>
+      <w:bookmarkEnd w:id="1043"/>
       <w:r>
         <w:rPr>
           <w:b w:val="0"/>
         </w:rPr>
-        <w:t>44. Liberzon A, Birger C, Thorvaldsdóttir H, Ghandi M, Mesirov JP, Tamayo P. The Molecular Signatures Database Hallmark gene set collection. Cell Syst. 2015;1(6):417-425. doi:10.1016/j.cels.2015.12.004</w:t>
+        <w:t>Liberzon A, Birger C, Thorvaldsdóttir H, Ghandi M, Mesirov JP, Tamayo P. The Molecular Signatures Database Hallmark gene set collection. Cell Syst. 2015;1(6):417-425. doi:10.1016/j.cels.2015.12.004</w:t>
       </w:r>
     </w:p>
     <w:p>
+      <w:bookmarkStart w:id="1044" w:name="ref45"/>
+      <w:r>
+        <w:t>45</w:t>
+      </w:r>
+      <w:bookmarkEnd w:id="1044"/>
       <w:r>
         <w:rPr>
           <w:b w:val="0"/>
         </w:rPr>
-        <w:t>45. Maeser D, Gruener RF, Huang RS. oncoPredict: an R package for predicting in vivo or cancer patient drug response and biomarkers from cell line screening data. Brief Bioinform. 2021;22(6):bbab260. doi:10.1093/bib/bbab260</w:t>
+        <w:t>Maeser D, Gruener RF, Huang RS. oncoPredict: an R package for predicting in vivo or cancer patient drug response and biomarkers from cell line screening data. Brief Bioinform. 2021;22(6):bbab260. doi:10.1093/bib/bbab260</w:t>
       </w:r>
     </w:p>
     <w:p>
+      <w:bookmarkStart w:id="1045" w:name="ref46"/>
+      <w:r>
+        <w:t>46</w:t>
+      </w:r>
+      <w:bookmarkEnd w:id="1045"/>
       <w:r>
         <w:rPr>
           <w:b w:val="0"/>
         </w:rPr>
-        <w:t>46. Yang W, Soares J, Greninger P, Edelman EJ, Lightfoot H, Forbes S, et al. Genomics of Drug Sensitivity in Cancer (GDSC): a resource for therapeutic biomarker discovery in cancer cells. Nucleic Acids Res. 2013;41(D1):D955-D961. doi:10.1093/nar/gks1111</w:t>
+        <w:t>Yang W, Soares J, Greninger P, Edelman EJ, Lightfoot H, Forbes S, et al. Genomics of Drug Sensitivity in Cancer (GDSC): a resource for therapeutic biomarker discovery in cancer cells. Nucleic Acids Res. 2013;41(D1):D955-D961. doi:10.1093/nar/gks1111</w:t>
       </w:r>
     </w:p>
     <w:sectPr>

</xml_diff>

<commit_message>
Reposition and refine algorithm summary
</commit_message>
<xml_diff>
--- a/manuscript/Path-AGNN-Cox_manuscript.docx
+++ b/manuscript/Path-AGNN-Cox_manuscript.docx
@@ -5024,6 +5024,184 @@
       </w:r>
     </w:p>
     <w:p>
+      <w:r>
+        <w:rPr>
+          <w:b w:val="0"/>
+        </w:rPr>
+        <w:t>The complete estimation and inference workflow is summarized below.</w:t>
+      </w:r>
+    </w:p>
+    <w:p>
+      <w:r>
+        <w:rPr>
+          <w:b/>
+        </w:rPr>
+        <w:t>Algorithm 1</w:t>
+      </w:r>
+      <w:r>
+        <w:rPr>
+          <w:b w:val="0"/>
+        </w:rPr>
+        <w:t xml:space="preserve"> Training and patient-specific pathway-rewiring testing.</w:t>
+      </w:r>
+    </w:p>
+    <w:p>
+      <w:pPr>
+        <w:spacing w:after="0"/>
+      </w:pPr>
+      <w:r>
+        <w:rPr>
+          <w:rFonts w:ascii="Consolas" w:hAnsi="Consolas"/>
+          <w:sz w:val="19"/>
+        </w:rPr>
+        <w:t>Require: expression matrix X, survival times t, event indicators E, pathway memberships P</w:t>
+      </w:r>
+    </w:p>
+    <w:p>
+      <w:pPr>
+        <w:spacing w:after="0"/>
+      </w:pPr>
+      <w:r>
+        <w:rPr>
+          <w:rFonts w:ascii="Consolas" w:hAnsi="Consolas"/>
+          <w:sz w:val="19"/>
+        </w:rPr>
+        <w:t>1: partition genes into K pathway subgraphs; build block-diagonal adjacency A</w:t>
+      </w:r>
+    </w:p>
+    <w:p>
+      <w:pPr>
+        <w:spacing w:after="0"/>
+      </w:pPr>
+      <w:r>
+        <w:rPr>
+          <w:rFonts w:ascii="Consolas" w:hAnsi="Consolas"/>
+          <w:sz w:val="19"/>
+        </w:rPr>
+        <w:t>2: initialize Path-AGNN-Cox parameters theta</w:t>
+      </w:r>
+    </w:p>
+    <w:p>
+      <w:pPr>
+        <w:spacing w:after="0"/>
+      </w:pPr>
+      <w:r>
+        <w:rPr>
+          <w:rFonts w:ascii="Consolas" w:hAnsi="Consolas"/>
+          <w:sz w:val="19"/>
+        </w:rPr>
+        <w:t>3: repeat until early stopping criterion (validation C-index, patience 15)</w:t>
+      </w:r>
+    </w:p>
+    <w:p>
+      <w:pPr>
+        <w:spacing w:after="0"/>
+      </w:pPr>
+      <w:r>
+        <w:rPr>
+          <w:rFonts w:ascii="Consolas" w:hAnsi="Consolas"/>
+          <w:sz w:val="19"/>
+        </w:rPr>
+        <w:t>4:   sample batch; forward pass -&gt; risk scores y and per-patient edge weights alpha</w:t>
+      </w:r>
+    </w:p>
+    <w:p>
+      <w:pPr>
+        <w:spacing w:after="0"/>
+      </w:pPr>
+      <w:r>
+        <w:rPr>
+          <w:rFonts w:ascii="Consolas" w:hAnsi="Consolas"/>
+          <w:sz w:val="19"/>
+        </w:rPr>
+        <w:t>5:   L = L_Cox + lambda_2 ||W||^2 + lambda_sparse * L_sparse + lambda_consist * L_consist</w:t>
+      </w:r>
+    </w:p>
+    <w:p>
+      <w:pPr>
+        <w:spacing w:after="0"/>
+      </w:pPr>
+      <w:r>
+        <w:rPr>
+          <w:rFonts w:ascii="Consolas" w:hAnsi="Consolas"/>
+          <w:sz w:val="19"/>
+        </w:rPr>
+        <w:t>6:   update theta with Adam</w:t>
+      </w:r>
+    </w:p>
+    <w:p>
+      <w:pPr>
+        <w:spacing w:after="0"/>
+      </w:pPr>
+      <w:r>
+        <w:rPr>
+          <w:rFonts w:ascii="Consolas" w:hAnsi="Consolas"/>
+          <w:sz w:val="19"/>
+        </w:rPr>
+        <w:t>7: split patients into high- and low-risk strata at the median predicted risk</w:t>
+      </w:r>
+    </w:p>
+    <w:p>
+      <w:pPr>
+        <w:spacing w:after="0"/>
+      </w:pPr>
+      <w:r>
+        <w:rPr>
+          <w:rFonts w:ascii="Consolas" w:hAnsi="Consolas"/>
+          <w:sz w:val="19"/>
+        </w:rPr>
+        <w:t>8: for each pathway k do</w:t>
+      </w:r>
+    </w:p>
+    <w:p>
+      <w:pPr>
+        <w:spacing w:after="0"/>
+      </w:pPr>
+      <w:r>
+        <w:rPr>
+          <w:rFonts w:ascii="Consolas" w:hAnsi="Consolas"/>
+          <w:sz w:val="19"/>
+        </w:rPr>
+        <w:t>9:   compute the per-sample mean edge weight within pathway k; compare high- versus low-risk strata with a two-sided Mann-Whitney U test, retaining Cohen's d and the standardized U statistic z</w:t>
+      </w:r>
+    </w:p>
+    <w:p>
+      <w:pPr>
+        <w:spacing w:after="0"/>
+      </w:pPr>
+      <w:r>
+        <w:rPr>
+          <w:rFonts w:ascii="Consolas" w:hAnsi="Consolas"/>
+          <w:sz w:val="19"/>
+        </w:rPr>
+        <w:t>10:  end</w:t>
+      </w:r>
+    </w:p>
+    <w:p>
+      <w:pPr>
+        <w:spacing w:after="0"/>
+      </w:pPr>
+      <w:r>
+        <w:rPr>
+          <w:rFonts w:ascii="Consolas" w:hAnsi="Consolas"/>
+          <w:sz w:val="19"/>
+        </w:rPr>
+        <w:t>11: control the false discovery rate (BH) over K pathways</w:t>
+      </w:r>
+    </w:p>
+    <w:p>
+      <w:pPr>
+        <w:spacing w:after="0"/>
+      </w:pPr>
+      <w:r>
+        <w:rPr>
+          <w:rFonts w:ascii="Consolas" w:hAnsi="Consolas"/>
+          <w:sz w:val="19"/>
+        </w:rPr>
+        <w:t>12: repeat the pathway-level procedure under 1,000 risk-label permutations to obtain the null count</w:t>
+      </w:r>
+    </w:p>
+    <w:p>
       <w:pPr>
         <w:spacing w:before="120" w:after="60"/>
       </w:pPr>
@@ -5680,176 +5858,6 @@
         </w:tc>
       </w:tr>
     </w:tbl>
-    <w:p>
-      <w:r>
-        <w:rPr>
-          <w:b/>
-        </w:rPr>
-        <w:t>Algorithm 1</w:t>
-      </w:r>
-      <w:r>
-        <w:rPr>
-          <w:b w:val="0"/>
-        </w:rPr>
-        <w:t xml:space="preserve"> Training and rewiring testing.</w:t>
-      </w:r>
-    </w:p>
-    <w:p>
-      <w:pPr>
-        <w:spacing w:after="0"/>
-      </w:pPr>
-      <w:r>
-        <w:rPr>
-          <w:rFonts w:ascii="Consolas" w:hAnsi="Consolas"/>
-          <w:sz w:val="19"/>
-        </w:rPr>
-        <w:t>Require: expression matrix X, survival times t, event indicators E, pathway memberships P</w:t>
-      </w:r>
-    </w:p>
-    <w:p>
-      <w:pPr>
-        <w:spacing w:after="0"/>
-      </w:pPr>
-      <w:r>
-        <w:rPr>
-          <w:rFonts w:ascii="Consolas" w:hAnsi="Consolas"/>
-          <w:sz w:val="19"/>
-        </w:rPr>
-        <w:t>1: partition genes into K pathway subgraphs; build block-diagonal adjacency A</w:t>
-      </w:r>
-    </w:p>
-    <w:p>
-      <w:pPr>
-        <w:spacing w:after="0"/>
-      </w:pPr>
-      <w:r>
-        <w:rPr>
-          <w:rFonts w:ascii="Consolas" w:hAnsi="Consolas"/>
-          <w:sz w:val="19"/>
-        </w:rPr>
-        <w:t>2: initialize Path-AGNN-Cox parameters theta</w:t>
-      </w:r>
-    </w:p>
-    <w:p>
-      <w:pPr>
-        <w:spacing w:after="0"/>
-      </w:pPr>
-      <w:r>
-        <w:rPr>
-          <w:rFonts w:ascii="Consolas" w:hAnsi="Consolas"/>
-          <w:sz w:val="19"/>
-        </w:rPr>
-        <w:t>3: repeat until early stopping criterion (validation C-index, patience 15)</w:t>
-      </w:r>
-    </w:p>
-    <w:p>
-      <w:pPr>
-        <w:spacing w:after="0"/>
-      </w:pPr>
-      <w:r>
-        <w:rPr>
-          <w:rFonts w:ascii="Consolas" w:hAnsi="Consolas"/>
-          <w:sz w:val="19"/>
-        </w:rPr>
-        <w:t>4:   sample batch; forward pass -&gt; risk scores y, per-patient edge weights alpha</w:t>
-      </w:r>
-    </w:p>
-    <w:p>
-      <w:pPr>
-        <w:spacing w:after="0"/>
-      </w:pPr>
-      <w:r>
-        <w:rPr>
-          <w:rFonts w:ascii="Consolas" w:hAnsi="Consolas"/>
-          <w:sz w:val="19"/>
-        </w:rPr>
-        <w:t>5:   L = L_Cox + lambda_2 ||W||^2 + lambda_sparse * L_sparse + lambda_consist * L_consist</w:t>
-      </w:r>
-    </w:p>
-    <w:p>
-      <w:pPr>
-        <w:spacing w:after="0"/>
-      </w:pPr>
-      <w:r>
-        <w:rPr>
-          <w:rFonts w:ascii="Consolas" w:hAnsi="Consolas"/>
-          <w:sz w:val="19"/>
-        </w:rPr>
-        <w:t>6:   update theta with Adam</w:t>
-      </w:r>
-    </w:p>
-    <w:p>
-      <w:pPr>
-        <w:spacing w:after="0"/>
-      </w:pPr>
-      <w:r>
-        <w:rPr>
-          <w:rFonts w:ascii="Consolas" w:hAnsi="Consolas"/>
-          <w:sz w:val="19"/>
-        </w:rPr>
-        <w:t>7: split patients into high- and low-risk strata (median y)</w:t>
-      </w:r>
-    </w:p>
-    <w:p>
-      <w:pPr>
-        <w:spacing w:after="0"/>
-      </w:pPr>
-      <w:r>
-        <w:rPr>
-          <w:rFonts w:ascii="Consolas" w:hAnsi="Consolas"/>
-          <w:sz w:val="19"/>
-        </w:rPr>
-        <w:t>8: for each pathway k do</w:t>
-      </w:r>
-    </w:p>
-    <w:p>
-      <w:pPr>
-        <w:spacing w:after="0"/>
-      </w:pPr>
-      <w:r>
-        <w:rPr>
-          <w:rFonts w:ascii="Consolas" w:hAnsi="Consolas"/>
-          <w:sz w:val="19"/>
-        </w:rPr>
-        <w:t>9:   test between-stratum difference of mean edge weight (z-test over edges)</w:t>
-      </w:r>
-    </w:p>
-    <w:p>
-      <w:pPr>
-        <w:spacing w:after="0"/>
-      </w:pPr>
-      <w:r>
-        <w:rPr>
-          <w:rFonts w:ascii="Consolas" w:hAnsi="Consolas"/>
-          <w:sz w:val="19"/>
-        </w:rPr>
-        <w:t>10:  end</w:t>
-      </w:r>
-    </w:p>
-    <w:p>
-      <w:pPr>
-        <w:spacing w:after="0"/>
-      </w:pPr>
-      <w:r>
-        <w:rPr>
-          <w:rFonts w:ascii="Consolas" w:hAnsi="Consolas"/>
-          <w:sz w:val="19"/>
-        </w:rPr>
-        <w:t>11: control the false discovery rate (BH) over K pathways</w:t>
-      </w:r>
-    </w:p>
-    <w:p>
-      <w:pPr>
-        <w:spacing w:after="0"/>
-      </w:pPr>
-      <w:r>
-        <w:rPr>
-          <w:rFonts w:ascii="Consolas" w:hAnsi="Consolas"/>
-          <w:sz w:val="19"/>
-        </w:rPr>
-        <w:t>12: repeat the pathway-level procedure under label permutations (1,000x) to obtain a null</w:t>
-      </w:r>
-    </w:p>
     <w:p>
       <w:pPr>
         <w:spacing w:before="120" w:after="60"/>

</xml_diff>

<commit_message>
Clarify neural network layer descriptions
</commit_message>
<xml_diff>
--- a/manuscript/Path-AGNN-Cox_manuscript.docx
+++ b/manuscript/Path-AGNN-Cox_manuscript.docx
@@ -5765,46 +5765,7 @@
               <w:rPr>
                 <w:b w:val="0"/>
               </w:rPr>
-              <w:t xml:space="preserve">hidden </w:t>
-            </w:r>
-            <w:r>
-              <w:t>[</w:t>
-            </w:r>
-            <w:r>
-              <w:fldChar w:fldCharType="begin"/>
-            </w:r>
-            <w:r>
-              <w:instrText xml:space="preserve"> REF ref32 \h </w:instrText>
-            </w:r>
-            <w:r>
-              <w:fldChar w:fldCharType="separate"/>
-            </w:r>
-            <w:r>
-              <w:t>32</w:t>
-            </w:r>
-            <w:r>
-              <w:fldChar w:fldCharType="end"/>
-            </w:r>
-            <w:r>
-              <w:t>,</w:t>
-            </w:r>
-            <w:r>
-              <w:fldChar w:fldCharType="begin"/>
-            </w:r>
-            <w:r>
-              <w:instrText xml:space="preserve"> REF ref16 \h </w:instrText>
-            </w:r>
-            <w:r>
-              <w:fldChar w:fldCharType="separate"/>
-            </w:r>
-            <w:r>
-              <w:t>16</w:t>
-            </w:r>
-            <w:r>
-              <w:fldChar w:fldCharType="end"/>
-            </w:r>
-            <w:r>
-              <w:t>]</w:t>
+              <w:t>two hidden layers with widths 32 and 16</w:t>
             </w:r>
           </w:p>
         </w:tc>
@@ -5840,19 +5801,7 @@
               <w:rPr>
                 <w:b w:val="0"/>
               </w:rPr>
-              <w:t xml:space="preserve">hidden </w:t>
-            </w:r>
-            <w:r>
-              <w:rPr>
-                <w:b w:val="0"/>
-              </w:rPr>
-              <w:t>[64]</w:t>
-            </w:r>
-            <w:r>
-              <w:rPr>
-                <w:b w:val="0"/>
-              </w:rPr>
-              <w:t>, dropout 0.0</w:t>
+              <w:t>one hidden layer of width 64, dropout 0.0</w:t>
             </w:r>
           </w:p>
         </w:tc>

</xml_diff>

<commit_message>
Add reference number spacing
</commit_message>
<xml_diff>
--- a/manuscript/Path-AGNN-Cox_manuscript.docx
+++ b/manuscript/Path-AGNN-Cox_manuscript.docx
@@ -23627,6 +23627,9 @@
       </w:r>
       <w:bookmarkEnd w:id="1000"/>
       <w:r>
+        <w:t xml:space="preserve">. </w:t>
+      </w:r>
+      <w:r>
         <w:rPr>
           <w:b w:val="0"/>
         </w:rPr>
@@ -23640,6 +23643,9 @@
       </w:r>
       <w:bookmarkEnd w:id="1001"/>
       <w:r>
+        <w:t xml:space="preserve">. </w:t>
+      </w:r>
+      <w:r>
         <w:rPr>
           <w:b w:val="0"/>
         </w:rPr>
@@ -23653,6 +23659,9 @@
       </w:r>
       <w:bookmarkEnd w:id="1002"/>
       <w:r>
+        <w:t xml:space="preserve">. </w:t>
+      </w:r>
+      <w:r>
         <w:rPr>
           <w:b w:val="0"/>
         </w:rPr>
@@ -23666,6 +23675,9 @@
       </w:r>
       <w:bookmarkEnd w:id="1003"/>
       <w:r>
+        <w:t xml:space="preserve">. </w:t>
+      </w:r>
+      <w:r>
         <w:rPr>
           <w:b w:val="0"/>
         </w:rPr>
@@ -23679,6 +23691,9 @@
       </w:r>
       <w:bookmarkEnd w:id="1004"/>
       <w:r>
+        <w:t xml:space="preserve">. </w:t>
+      </w:r>
+      <w:r>
         <w:rPr>
           <w:b w:val="0"/>
         </w:rPr>
@@ -23692,6 +23707,9 @@
       </w:r>
       <w:bookmarkEnd w:id="1005"/>
       <w:r>
+        <w:t xml:space="preserve">. </w:t>
+      </w:r>
+      <w:r>
         <w:rPr>
           <w:b w:val="0"/>
         </w:rPr>
@@ -23705,6 +23723,9 @@
       </w:r>
       <w:bookmarkEnd w:id="1006"/>
       <w:r>
+        <w:t xml:space="preserve">. </w:t>
+      </w:r>
+      <w:r>
         <w:rPr>
           <w:b w:val="0"/>
         </w:rPr>
@@ -23718,6 +23739,9 @@
       </w:r>
       <w:bookmarkEnd w:id="1007"/>
       <w:r>
+        <w:t xml:space="preserve">. </w:t>
+      </w:r>
+      <w:r>
         <w:rPr>
           <w:b w:val="0"/>
         </w:rPr>
@@ -23731,6 +23755,9 @@
       </w:r>
       <w:bookmarkEnd w:id="1008"/>
       <w:r>
+        <w:t xml:space="preserve">. </w:t>
+      </w:r>
+      <w:r>
         <w:rPr>
           <w:b w:val="0"/>
         </w:rPr>
@@ -23744,6 +23771,9 @@
       </w:r>
       <w:bookmarkEnd w:id="1009"/>
       <w:r>
+        <w:t xml:space="preserve">. </w:t>
+      </w:r>
+      <w:r>
         <w:rPr>
           <w:b w:val="0"/>
         </w:rPr>
@@ -23757,6 +23787,9 @@
       </w:r>
       <w:bookmarkEnd w:id="1010"/>
       <w:r>
+        <w:t xml:space="preserve">. </w:t>
+      </w:r>
+      <w:r>
         <w:rPr>
           <w:b w:val="0"/>
         </w:rPr>
@@ -23770,6 +23803,9 @@
       </w:r>
       <w:bookmarkEnd w:id="1011"/>
       <w:r>
+        <w:t xml:space="preserve">. </w:t>
+      </w:r>
+      <w:r>
         <w:rPr>
           <w:b w:val="0"/>
         </w:rPr>
@@ -23783,6 +23819,9 @@
       </w:r>
       <w:bookmarkEnd w:id="1012"/>
       <w:r>
+        <w:t xml:space="preserve">. </w:t>
+      </w:r>
+      <w:r>
         <w:rPr>
           <w:b w:val="0"/>
         </w:rPr>
@@ -23796,6 +23835,9 @@
       </w:r>
       <w:bookmarkEnd w:id="1013"/>
       <w:r>
+        <w:t xml:space="preserve">. </w:t>
+      </w:r>
+      <w:r>
         <w:rPr>
           <w:b w:val="0"/>
         </w:rPr>
@@ -23809,6 +23851,9 @@
       </w:r>
       <w:bookmarkEnd w:id="1014"/>
       <w:r>
+        <w:t xml:space="preserve">. </w:t>
+      </w:r>
+      <w:r>
         <w:rPr>
           <w:b w:val="0"/>
         </w:rPr>
@@ -23822,6 +23867,9 @@
       </w:r>
       <w:bookmarkEnd w:id="1015"/>
       <w:r>
+        <w:t xml:space="preserve">. </w:t>
+      </w:r>
+      <w:r>
         <w:rPr>
           <w:b w:val="0"/>
         </w:rPr>
@@ -23835,6 +23883,9 @@
       </w:r>
       <w:bookmarkEnd w:id="1016"/>
       <w:r>
+        <w:t xml:space="preserve">. </w:t>
+      </w:r>
+      <w:r>
         <w:rPr>
           <w:b w:val="0"/>
         </w:rPr>
@@ -23848,6 +23899,9 @@
       </w:r>
       <w:bookmarkEnd w:id="1017"/>
       <w:r>
+        <w:t xml:space="preserve">. </w:t>
+      </w:r>
+      <w:r>
         <w:rPr>
           <w:b w:val="0"/>
         </w:rPr>
@@ -23861,6 +23915,9 @@
       </w:r>
       <w:bookmarkEnd w:id="1018"/>
       <w:r>
+        <w:t xml:space="preserve">. </w:t>
+      </w:r>
+      <w:r>
         <w:rPr>
           <w:b w:val="0"/>
         </w:rPr>
@@ -23874,6 +23931,9 @@
       </w:r>
       <w:bookmarkEnd w:id="1019"/>
       <w:r>
+        <w:t xml:space="preserve">. </w:t>
+      </w:r>
+      <w:r>
         <w:rPr>
           <w:b w:val="0"/>
         </w:rPr>
@@ -23887,6 +23947,9 @@
       </w:r>
       <w:bookmarkEnd w:id="1020"/>
       <w:r>
+        <w:t xml:space="preserve">. </w:t>
+      </w:r>
+      <w:r>
         <w:rPr>
           <w:b w:val="0"/>
         </w:rPr>
@@ -23900,6 +23963,9 @@
       </w:r>
       <w:bookmarkEnd w:id="1021"/>
       <w:r>
+        <w:t xml:space="preserve">. </w:t>
+      </w:r>
+      <w:r>
         <w:rPr>
           <w:b w:val="0"/>
         </w:rPr>
@@ -23913,6 +23979,9 @@
       </w:r>
       <w:bookmarkEnd w:id="1022"/>
       <w:r>
+        <w:t xml:space="preserve">. </w:t>
+      </w:r>
+      <w:r>
         <w:rPr>
           <w:b w:val="0"/>
         </w:rPr>
@@ -23926,6 +23995,9 @@
       </w:r>
       <w:bookmarkEnd w:id="1023"/>
       <w:r>
+        <w:t xml:space="preserve">. </w:t>
+      </w:r>
+      <w:r>
         <w:rPr>
           <w:b w:val="0"/>
         </w:rPr>
@@ -23939,6 +24011,9 @@
       </w:r>
       <w:bookmarkEnd w:id="1024"/>
       <w:r>
+        <w:t xml:space="preserve">. </w:t>
+      </w:r>
+      <w:r>
         <w:rPr>
           <w:b w:val="0"/>
         </w:rPr>
@@ -23952,6 +24027,9 @@
       </w:r>
       <w:bookmarkEnd w:id="1025"/>
       <w:r>
+        <w:t xml:space="preserve">. </w:t>
+      </w:r>
+      <w:r>
         <w:rPr>
           <w:b w:val="0"/>
         </w:rPr>
@@ -23965,6 +24043,9 @@
       </w:r>
       <w:bookmarkEnd w:id="1026"/>
       <w:r>
+        <w:t xml:space="preserve">. </w:t>
+      </w:r>
+      <w:r>
         <w:rPr>
           <w:b w:val="0"/>
         </w:rPr>
@@ -23978,6 +24059,9 @@
       </w:r>
       <w:bookmarkEnd w:id="1027"/>
       <w:r>
+        <w:t xml:space="preserve">. </w:t>
+      </w:r>
+      <w:r>
         <w:rPr>
           <w:b w:val="0"/>
         </w:rPr>
@@ -23991,6 +24075,9 @@
       </w:r>
       <w:bookmarkEnd w:id="1028"/>
       <w:r>
+        <w:t xml:space="preserve">. </w:t>
+      </w:r>
+      <w:r>
         <w:rPr>
           <w:b w:val="0"/>
         </w:rPr>
@@ -24004,6 +24091,9 @@
       </w:r>
       <w:bookmarkEnd w:id="1029"/>
       <w:r>
+        <w:t xml:space="preserve">. </w:t>
+      </w:r>
+      <w:r>
         <w:rPr>
           <w:b w:val="0"/>
         </w:rPr>
@@ -24017,6 +24107,9 @@
       </w:r>
       <w:bookmarkEnd w:id="1030"/>
       <w:r>
+        <w:t xml:space="preserve">. </w:t>
+      </w:r>
+      <w:r>
         <w:rPr>
           <w:b w:val="0"/>
         </w:rPr>
@@ -24030,6 +24123,9 @@
       </w:r>
       <w:bookmarkEnd w:id="1031"/>
       <w:r>
+        <w:t xml:space="preserve">. </w:t>
+      </w:r>
+      <w:r>
         <w:rPr>
           <w:b w:val="0"/>
         </w:rPr>
@@ -24043,6 +24139,9 @@
       </w:r>
       <w:bookmarkEnd w:id="1032"/>
       <w:r>
+        <w:t xml:space="preserve">. </w:t>
+      </w:r>
+      <w:r>
         <w:rPr>
           <w:b w:val="0"/>
         </w:rPr>
@@ -24056,6 +24155,9 @@
       </w:r>
       <w:bookmarkEnd w:id="1033"/>
       <w:r>
+        <w:t xml:space="preserve">. </w:t>
+      </w:r>
+      <w:r>
         <w:rPr>
           <w:b w:val="0"/>
         </w:rPr>
@@ -24069,6 +24171,9 @@
       </w:r>
       <w:bookmarkEnd w:id="1034"/>
       <w:r>
+        <w:t xml:space="preserve">. </w:t>
+      </w:r>
+      <w:r>
         <w:rPr>
           <w:b w:val="0"/>
         </w:rPr>
@@ -24082,6 +24187,9 @@
       </w:r>
       <w:bookmarkEnd w:id="1035"/>
       <w:r>
+        <w:t xml:space="preserve">. </w:t>
+      </w:r>
+      <w:r>
         <w:rPr>
           <w:b w:val="0"/>
         </w:rPr>
@@ -24095,6 +24203,9 @@
       </w:r>
       <w:bookmarkEnd w:id="1036"/>
       <w:r>
+        <w:t xml:space="preserve">. </w:t>
+      </w:r>
+      <w:r>
         <w:rPr>
           <w:b w:val="0"/>
         </w:rPr>
@@ -24108,6 +24219,9 @@
       </w:r>
       <w:bookmarkEnd w:id="1037"/>
       <w:r>
+        <w:t xml:space="preserve">. </w:t>
+      </w:r>
+      <w:r>
         <w:rPr>
           <w:b w:val="0"/>
         </w:rPr>
@@ -24121,6 +24235,9 @@
       </w:r>
       <w:bookmarkEnd w:id="1038"/>
       <w:r>
+        <w:t xml:space="preserve">. </w:t>
+      </w:r>
+      <w:r>
         <w:rPr>
           <w:b w:val="0"/>
         </w:rPr>
@@ -24134,6 +24251,9 @@
       </w:r>
       <w:bookmarkEnd w:id="1039"/>
       <w:r>
+        <w:t xml:space="preserve">. </w:t>
+      </w:r>
+      <w:r>
         <w:rPr>
           <w:b w:val="0"/>
         </w:rPr>
@@ -24147,6 +24267,9 @@
       </w:r>
       <w:bookmarkEnd w:id="1040"/>
       <w:r>
+        <w:t xml:space="preserve">. </w:t>
+      </w:r>
+      <w:r>
         <w:rPr>
           <w:b w:val="0"/>
         </w:rPr>
@@ -24160,6 +24283,9 @@
       </w:r>
       <w:bookmarkEnd w:id="1041"/>
       <w:r>
+        <w:t xml:space="preserve">. </w:t>
+      </w:r>
+      <w:r>
         <w:rPr>
           <w:b w:val="0"/>
         </w:rPr>
@@ -24173,6 +24299,9 @@
       </w:r>
       <w:bookmarkEnd w:id="1042"/>
       <w:r>
+        <w:t xml:space="preserve">. </w:t>
+      </w:r>
+      <w:r>
         <w:rPr>
           <w:b w:val="0"/>
         </w:rPr>
@@ -24186,6 +24315,9 @@
       </w:r>
       <w:bookmarkEnd w:id="1043"/>
       <w:r>
+        <w:t xml:space="preserve">. </w:t>
+      </w:r>
+      <w:r>
         <w:rPr>
           <w:b w:val="0"/>
         </w:rPr>
@@ -24199,6 +24331,9 @@
       </w:r>
       <w:bookmarkEnd w:id="1044"/>
       <w:r>
+        <w:t xml:space="preserve">. </w:t>
+      </w:r>
+      <w:r>
         <w:rPr>
           <w:b w:val="0"/>
         </w:rPr>
@@ -24211,6 +24346,9 @@
         <w:t>46</w:t>
       </w:r>
       <w:bookmarkEnd w:id="1045"/>
+      <w:r>
+        <w:t xml:space="preserve">. </w:t>
+      </w:r>
       <w:r>
         <w:rPr>
           <w:b w:val="0"/>

</xml_diff>

<commit_message>
Fix reviewer findings: paragraph merge, figure captions, number consistency
</commit_message>
<xml_diff>
--- a/manuscript/Path-AGNN-Cox_manuscript.docx
+++ b/manuscript/Path-AGNN-Cox_manuscript.docx
@@ -30,15 +30,7 @@
         <w:rPr>
           <w:b w:val="0"/>
         </w:rPr>
-        <w:t xml:space="preserve"> Briefings in Bioinformatics (preferred) / Computational and Structural Biotechnology Journal</w:t>
-      </w:r>
-    </w:p>
-    <w:p>
-      <w:r>
-        <w:rPr>
-          <w:b w:val="0"/>
-        </w:rPr>
-        <w:t xml:space="preserve">&gt; </w:t>
+        <w:t xml:space="preserve"> Briefings in Bioinformatics (preferred) / Computational and Structural Biotechnology Journal &gt; </w:t>
       </w:r>
       <w:r>
         <w:rPr>
@@ -50,15 +42,21 @@
         <w:rPr>
           <w:b w:val="0"/>
         </w:rPr>
-        <w:t xml:space="preserve"> structure + prose finalized; numeric tokens filled by `render_manuscript.py` from the completed benchmark (11 TCGA cohorts x 5-fold CV, 25 GEO external cohorts) and rewiring analyses.</w:t>
-      </w:r>
-    </w:p>
-    <w:p>
+        <w:t xml:space="preserve"> structure + prose finalized; numeric tokens filled by </w:t>
+      </w:r>
+      <w:r>
+        <w:rPr>
+          <w:rFonts w:ascii="Consolas" w:hAnsi="Consolas"/>
+          <w:b w:val="0"/>
+          <w:sz w:val="19"/>
+        </w:rPr>
+        <w:t>render_manuscript.py</w:t>
+      </w:r>
       <w:r>
         <w:rPr>
           <w:b w:val="0"/>
         </w:rPr>
-        <w:t xml:space="preserve">&gt; </w:t>
+        <w:t xml:space="preserve"> from the completed benchmark (11 TCGA cohorts x 5-fold CV, 25 GEO external cohorts) and rewiring analyses. &gt; </w:t>
       </w:r>
       <w:r>
         <w:rPr>
@@ -272,7 +270,7 @@
         <w:rPr>
           <w:b w:val="0"/>
         </w:rPr>
-        <w:t>1 Department of TCM, Zhongda Hospital, Southeast University, China</w:t>
+        <w:t>1 Department of TCM, Zhongda Hospital, Southeast University, China 2 Department of Rehabilitation Medicine, Zhongda Hospital, Southeast University, China 3 Jiangbei Campus, Jiangsu Provincial Traditional Chinese Medicine Hospital, China</w:t>
       </w:r>
     </w:p>
     <w:p>
@@ -280,31 +278,7 @@
         <w:rPr>
           <w:b w:val="0"/>
         </w:rPr>
-        <w:t>2 Department of Rehabilitation Medicine, Zhongda Hospital, Southeast University, China</w:t>
-      </w:r>
-    </w:p>
-    <w:p>
-      <w:r>
-        <w:rPr>
-          <w:b w:val="0"/>
-        </w:rPr>
-        <w:t>3 Jiangbei Campus, Jiangsu Provincial Traditional Chinese Medicine Hospital, China</w:t>
-      </w:r>
-    </w:p>
-    <w:p>
-      <w:r>
-        <w:rPr>
-          <w:b w:val="0"/>
-        </w:rPr>
-        <w:t>* These authors contributed equally to this work and are co-first authors.</w:t>
-      </w:r>
-    </w:p>
-    <w:p>
-      <w:r>
-        <w:rPr>
-          <w:b w:val="0"/>
-        </w:rPr>
-        <w:t>† Corresponding author. Email: 101005664@seu.edu.cn</w:t>
+        <w:t>* These authors contributed equally to this work and are co-first authors. † Corresponding author. Email: 101005664@seu.edu.cn</w:t>
       </w:r>
     </w:p>
     <w:p>
@@ -1005,7 +979,7 @@
         <w:rPr>
           <w:b w:val="0"/>
         </w:rPr>
-        <w:t>. These studies collectively suggest that biological priors can reduce overfitting and improve external validity relative to unconstrained deep models.</w:t>
+        <w:t>. These studies collectively suggest that biological priors may reduce overfitting and improve external validity relative to unconstrained deep models.</w:t>
       </w:r>
     </w:p>
     <w:p>
@@ -2578,9 +2552,15 @@
       </w:r>
       <w:r>
         <w:rPr>
+          <w:b/>
+        </w:rPr>
+        <w:t>Overview of Path-AGNN-Cox.</w:t>
+      </w:r>
+      <w:r>
+        <w:rPr>
           <w:b w:val="0"/>
         </w:rPr>
-        <w:t>Overview of Path-AGNN-Cox.** (A) End-to-end pipeline: TCGA/GEO expression → KEGG pathway mapping → adaptive pathway subgraphs → risk head with Cox objective. (B) Pathway-constrained block-diagonal adjacency: edges exist only between genes sharing a primary pathway. (C) Sample-adaptive neighborhood weighting: attention logits are multiplicatively modulated by the malignancy gate (1 + tanh(β)·m_s); high-malignancy samples receive sharper within-pathway attention. (D) Survival objective with dual regularization: Cox partial likelihood + intra-pathway sparsity + dropout consistency.</w:t>
+        <w:t xml:space="preserve"> (A) End-to-end pipeline: TCGA/GEO expression → KEGG pathway mapping → adaptive pathway subgraphs → risk head with Cox objective. (B) Pathway-constrained block-diagonal adjacency: edges exist only between genes sharing a primary pathway. (C) Sample-adaptive neighborhood weighting: attention logits are multiplicatively modulated by the malignancy gate (1 + tanh(β)·m_s); high-malignancy samples receive sharper within-pathway attention. (D) Survival objective with dual regularization: Cox partial likelihood + intra-pathway sparsity + dropout consistency.</w:t>
       </w:r>
     </w:p>
     <w:p>
@@ -5020,7 +5000,7 @@
         <w:rPr>
           <w:b w:val="0"/>
         </w:rPr>
-        <w:t>. Each pathway was additionally tested under 1,000 within-pathway label permutations of the risk strata; the permutation P was one plus the number of null permutations with at least as large an absolute effect, divided by 1,001. At the cohort level, the number of significant pathways was compared with a 1,000-permutation null obtained by permuting the risk labels, with the permutation P computed as one plus the number of null counts at least as large as the observed count, divided by 1,001. Two matched random gene-set controls assessed pathway-identity selectivity: for each real pathway, 200 random gene sets of equal size with matched internal edge counts, and 200 random equal-size subsets drawn from real pathway blocks so that size and density were matched, were scored with the identical effect-size statistic, and the percentile of each real pathway within its null distribution was recorded. Pathway-level enrichment of the top-20 pathways ranked by permutation P against a curated LUAD driver-pathway list was tested with the hypergeometric distribution over the 57-pathway cancer-core catalogue. Static-model, randomized-partition and standard-GAT controls followed the same protocol. All analyses are implemented in benchmark/rewiring_analysis.py and the work/ scripts of the repository at https://github.com/ZhongdaHospital-SEU/Path-AGNN-Cox. Model hyperparameters and baseline configurations are summarized in Table 2. All deep models were trained on CPU with Adam; the full benchmark consumed approximately 1,500 CPU-hours.</w:t>
+        <w:t>. Each pathway was additionally tested under 1,000 within-pathway label permutations of the risk strata; the permutation P was one plus the number of null permutations with at least as large an absolute effect, divided by 1,001. At the cohort level, the number of significant pathways was compared with a label-permutation null obtained by permuting the risk labels (1,000 permutations for LUAD and BRCA, 200 for KIRC), with the permutation P computed as one plus the number of null counts at least as large as the observed count, divided by 1,001. Two matched random gene-set controls assessed pathway-identity selectivity: for each real pathway, 200 random gene sets of equal size with matched internal edge counts, and 200 random equal-size subsets drawn from real pathway blocks so that size and density were matched, were scored with the identical effect-size statistic, and the percentile of each real pathway within its null distribution was recorded. Pathway-level enrichment of the top-20 pathways ranked by permutation P against a curated LUAD driver-pathway list was tested with the hypergeometric distribution over the 57-pathway cancer-core catalogue. Static-model, randomized-partition and standard-GAT controls followed the same protocol. All analyses are implemented in benchmark/rewiring_analysis.py and the work/ scripts of the repository at https://github.com/ZhongdaHospital-SEU/Path-AGNN-Cox. Model hyperparameters and baseline configurations are summarized in Table 2. All deep models were trained on CPU with Adam; the full benchmark consumed approximately 1,500 CPU-hours.</w:t>
       </w:r>
     </w:p>
     <w:p>
@@ -5317,7 +5297,7 @@
         <w:rPr>
           <w:b w:val="0"/>
         </w:rPr>
-        <w:t>. Models were trained</w:t>
+        <w:t>. Models were trained with Adam (learning rate 1e-3, weight decay 1e-4) for up to 100 epochs with a batch size of 128 and early stopping on the validation C-index (patience 15); the network used two hidden layers of width 32 with dropout 0.1, and the regularization weights were lambda_sparse = 1e-3 and lambda_consist = 0.1 (config/benchmark.yaml). All hyperparameters were held fixed across cancer types and baselines; no cohort-specific tuning was performed. All deep models were trained from a single random seed (42) for the benchmark, and seed effects are discussed in Section 4. Penalized Cox baselines were fit with penalizers of 0.05 for LASSO-Cox with 10-fold internal CV, 0.1 for Ridge-Cox, and l1_ratio 0.5 with penalizer 0.1 for Elastic-Net-Cox; the Random Survival Forest used 500 trees with min_samples_leaf 15; DeepSurv used hidden layers of widths 32 and 16, and Cox-nnet a single hidden layer of width 64.</w:t>
       </w:r>
     </w:p>
     <w:p>
@@ -5325,103 +5305,7 @@
         <w:rPr>
           <w:b w:val="0"/>
         </w:rPr>
-        <w:t>with Adam (learning rate 1e-3, weight decay 1e-4) for up to 100 epochs with a</w:t>
-      </w:r>
-    </w:p>
-    <w:p>
-      <w:r>
-        <w:rPr>
-          <w:b w:val="0"/>
-        </w:rPr>
-        <w:t>batch size of 128 and early stopping on the validation C-index (patience 15);</w:t>
-      </w:r>
-    </w:p>
-    <w:p>
-      <w:r>
-        <w:rPr>
-          <w:b w:val="0"/>
-        </w:rPr>
-        <w:t>the network used two hidden layers of width 32 with dropout 0.1, and the</w:t>
-      </w:r>
-    </w:p>
-    <w:p>
-      <w:r>
-        <w:rPr>
-          <w:b w:val="0"/>
-        </w:rPr>
-        <w:t>regularization weights were lambda_sparse = 1e-3 and lambda_consist = 0.1</w:t>
-      </w:r>
-    </w:p>
-    <w:p>
-      <w:r>
-        <w:rPr>
-          <w:b w:val="0"/>
-        </w:rPr>
-        <w:t>(config/benchmark.yaml). All hyperparameters were held fixed across cancer types and baselines; no cohort-specific tuning was performed. All deep models were trained from a single random Penalized Cox baselines were fit with penalizers of 0.05 for LASSO-Cox with 10-fold internal CV, 0.1 for Ridge-Cox, and l1_ratio 0.5 with penalizer 0.1 for Elastic-Net-Cox; the Random Survival Forest used 500 trees with min_samples_leaf 15; DeepSurv used hidden layers of widths 32 and 16, and Cox-nnet a single hidden layer of width 64.</w:t>
-      </w:r>
-    </w:p>
-    <w:p>
-      <w:r>
-        <w:rPr>
-          <w:b w:val="0"/>
-        </w:rPr>
-        <w:t>seed (42) for the benchmark, and seed effects are discussed in Section 4.</w:t>
-      </w:r>
-    </w:p>
-    <w:p>
-      <w:r>
-        <w:rPr>
-          <w:b w:val="0"/>
-        </w:rPr>
-        <w:t>The pathway constraint bounds the computational cost of attention. For a batch</w:t>
-      </w:r>
-    </w:p>
-    <w:p>
-      <w:r>
-        <w:rPr>
-          <w:b w:val="0"/>
-        </w:rPr>
-        <w:t>of size B, a hidden width d, N genes and E within-pathway edges, each adaptive</w:t>
-      </w:r>
-    </w:p>
-    <w:p>
-      <w:r>
-        <w:rPr>
-          <w:b w:val="0"/>
-        </w:rPr>
-        <w:t>layer costs O(B x (E x d + N x d^2)) time and O(B x E x d) memory, dominated by</w:t>
-      </w:r>
-    </w:p>
-    <w:p>
-      <w:r>
-        <w:rPr>
-          <w:b w:val="0"/>
-        </w:rPr>
-        <w:t>the edge-indexed feature gather h[:, src]. For the 2,873-gene universe used</w:t>
-      </w:r>
-    </w:p>
-    <w:p>
-      <w:r>
-        <w:rPr>
-          <w:b w:val="0"/>
-        </w:rPr>
-        <w:t>here, the KEGG cancer-core partition yields E ~ 2.3 x 10^5 within-pathway edges,</w:t>
-      </w:r>
-    </w:p>
-    <w:p>
-      <w:r>
-        <w:rPr>
-          <w:b w:val="0"/>
-        </w:rPr>
-        <w:t>a ~36-fold reduction relative to a fully connected graph (N^2 ~ 8.3 x 10^6),</w:t>
-      </w:r>
-    </w:p>
-    <w:p>
-      <w:r>
-        <w:rPr>
-          <w:b w:val="0"/>
-        </w:rPr>
-        <w:t>which keeps the model feasible on commodity hardware.</w:t>
+        <w:t>The pathway constraint bounds the computational cost of attention. For a batch of size B, a hidden width d, N genes and E within-pathway edges, each adaptive layer costs O(B x (E x d + N x d^2)) time and O(B x E x d) memory, dominated by the edge-indexed feature gather h[:, src]. For the 2,873-gene universe used here, the KEGG cancer-core partition yields E ~ 2.3 x 10^5 within-pathway edges, a ~36-fold reduction relative to a fully connected graph (N^2 ~ 8.3 x 10^6), which keeps the model feasible on commodity hardware.</w:t>
       </w:r>
     </w:p>
     <w:p>
@@ -5888,9 +5772,15 @@
       </w:r>
       <w:r>
         <w:rPr>
+          <w:b/>
+        </w:rPr>
+        <w:t>Benchmark performance.</w:t>
+      </w:r>
+      <w:r>
+        <w:rPr>
           <w:b w:val="0"/>
         </w:rPr>
-        <w:t>Benchmark performance.** (A) Internal 5-fold CV C-index per cancer type. (B) External C-index per cancer type (mean over GEO cohorts). (C) Mean time-dependent AUC (internal CV). Solid markers: Path-AGNN-Cox; grey: baselines; dashed: 0.50 reference.</w:t>
+        <w:t xml:space="preserve"> (A) Internal 5-fold CV C-index per cancer type. (B) External C-index per cancer type (mean over GEO cohorts). (C) Mean time-dependent AUC (internal CV). Solid markers: Path-AGNN-Cox; grey: baselines; dashed: 0.50 reference.</w:t>
       </w:r>
     </w:p>
     <w:p>
@@ -7777,7 +7667,7 @@
         <w:rPr>
           <w:b w:val="0"/>
         </w:rPr>
-        <w:t>On external testing across the 25 GEO cohorts, the mean external C-index of Path-AGNN-Cox was 0.51 (SD 0.04), matching the deep baselines (0.50) and ranking first among all models in 0 of 11 cancer types (Figure 2B; per-cohort details in Table 4). Penalized Cox baselines retained the highest external means (0.57, Ridge-Cox; paired difference Δ=-0.10 (95% CI -0.14 to -0.06)), while the three GNN variants (adaptive, static, plain) showed similar external decay, indicating that the pathway or adaptive design does not by itself eliminate cross-cohort performance loss; the interpretable rewiring output is the distinctive capability of the adaptive model (Section 3.4).</w:t>
+        <w:t>On external testing across the 25 GEO cohorts, the mean external C-index of Path-AGNN-Cox was 0.51 across the 11 cancer-type means (SD 0.04; the per-cohort spread was wider, see Table 4), matching the deep baselines (0.50) and ranking first among all models in 0 of 11 cancer types (Figure 2B; per-cohort details in Table 4). Penalized Cox baselines retained the highest external means (0.57, Ridge-Cox), while across the 25 external cohorts Path-AGNN-Cox was on average Δ=-0.10 (95% CI -0.14 to -0.06) relative to the best baseline of each cohort, and the three GNN variants (adaptive, static, plain) showed similar external decay, indicating that the pathway or adaptive design does not by itself eliminate cross-cohort performance loss; the interpretable rewiring output is the distinctive capability of the adaptive model (Section 3.4).</w:t>
       </w:r>
     </w:p>
     <w:p>
@@ -10693,9 +10583,15 @@
       </w:r>
       <w:r>
         <w:rPr>
+          <w:b/>
+        </w:rPr>
+        <w:t>Ablation study.</w:t>
+      </w:r>
+      <w:r>
+        <w:rPr>
           <w:b w:val="0"/>
         </w:rPr>
-        <w:t>Ablation study.** (A) Internal C-index of the full model vs. −Pathway / −Adaptive / −Regularization per cancer type. (B) External C-index per variant. (C) Mean internal drop with 95% CI.</w:t>
+        <w:t xml:space="preserve"> (A) Internal C-index of the full model vs. −Pathway / −Adaptive / −Regularization per cancer type. (B) External C-index per variant. (C) Mean internal drop with 95% CI.</w:t>
       </w:r>
     </w:p>
     <w:p>
@@ -12039,7 +11935,7 @@
         <w:rPr>
           <w:b w:val="0"/>
         </w:rPr>
-        <w:t xml:space="preserve">Per-cohort results are summarized in Table 4 and Figure 4. Path-AGNN-Cox maintained C-index above 0.50 in 12/25 external cohorts, compared with 25 for the best baseline. The model transferred relatively consistently across platform shifts (RNA-seq → Affymetrix microarrays) and independent sample processing pipelines, with a mean external C-index comparable to the deep baselines. The largest external gain over the best baseline was observed in Lung adenocarcinoma (GSE31210, Path-AGNN-Cox C-index 0.76 vs best baseline 0.67). These results contrast favorably with previous pathway-GNN studies: PathMoG reported external validation in a single breast-cancer cohort, METABRIC </w:t>
+        <w:t xml:space="preserve">Per-cohort results are summarized in Table 4 and Figure 4. Path-AGNN-Cox maintained C-index above 0.50 in 12 of 25 external cohorts when counted on unrounded values (Table 4 rounds to two decimals, so a cohort just above 0.50 can display as 0.50), compared with 25 of 25 for the best baseline. The model transferred relatively consistently across platform shifts (RNA-seq → Affymetrix microarrays) and independent sample processing pipelines, with a mean external C-index comparable to the deep baselines. The largest external gain over the best baseline was observed in Lung adenocarcinoma (GSE31210, Path-AGNN-Cox C-index 0.76 vs best baseline 0.67). In terms of external-validation breadth, the present study differs from previous pathway-GNN work: PathMoG reported external validation in a single breast-cancer cohort, METABRIC </w:t>
       </w:r>
       <w:r>
         <w:t>[</w:t>
@@ -12173,9 +12069,15 @@
       </w:r>
       <w:r>
         <w:rPr>
+          <w:b/>
+        </w:rPr>
+        <w:t>External validation across 25 GEO cohorts.</w:t>
+      </w:r>
+      <w:r>
+        <w:rPr>
           <w:b w:val="0"/>
         </w:rPr>
-        <w:t>External validation across 25 GEO cohorts.** Per-cohort C-index of Path-AGNN-Cox vs. the best baseline; cohorts grouped by cancer type; dashed line at 0.50.</w:t>
+        <w:t xml:space="preserve"> Per-cohort C-index of Path-AGNN-Cox vs. the best baseline; cohorts grouped by cancer type; dashed line at 0.50.</w:t>
       </w:r>
     </w:p>
     <w:p>
@@ -15198,9 +15100,15 @@
       </w:r>
       <w:r>
         <w:rPr>
+          <w:b/>
+        </w:rPr>
+        <w:t>Patient-specific pathway rewiring.</w:t>
+      </w:r>
+      <w:r>
+        <w:rPr>
           <w:b w:val="0"/>
         </w:rPr>
-        <w:t>Patient-specific pathway rewiring.** (A) Between-stratum effect sizes (Cohen's d with 95% CI) for all 53 pathways in LUAD, with the two pathways surviving per-pathway label permutation and BH-FDR correction highlighted. (B) Same as A for BRCA. (C) Cohort-level label-permutation null: number of significant pathways observed versus the null mean and maximum under 1,000 label permutations (LUAD and BRCA). (D) Correlation between per-patient rewiring magnitude and clinical malignancy indicators (LUAD). (E) Matched random gene-set controls in LUAD, BRCA and KIRC: distribution of P(null effect ≥ real effect) for the edge-matched and density-matched nulls; low values indicate real pathway effects above the matched random sets. The simulated pure-null median of the density-matched statistic was 1.00 (LUAD and BRCA), so values below the simulated 5th percentile exceed the structural bias of row-normalized attention.</w:t>
+        <w:t xml:space="preserve"> (A) Between-stratum effect sizes (Cohen's d with 95% CI) for all 53 pathways in LUAD, with the two pathways surviving per-pathway label permutation and BH-FDR correction highlighted. (B) Same as A for BRCA. (C) Cohort-level label-permutation null: number of significant pathways observed versus the null mean and maximum under 1,000 label permutations (LUAD and BRCA). (D) Correlation between per-patient rewiring magnitude and clinical malignancy indicators (LUAD). (E) Matched random gene-set controls in LUAD, BRCA and KIRC: distribution of P(null effect ≥ real effect) for the edge-matched and density-matched nulls; low values indicate real pathway effects above the matched random sets. The simulated pure-null median of the density-matched statistic was 1.00 (LUAD and BRCA), so values below the simulated 5th percentile exceed the structural bias of row-normalized attention.</w:t>
       </w:r>
     </w:p>
     <w:p>
@@ -16621,7 +16529,7 @@
         <w:rPr>
           <w:b w:val="0"/>
         </w:rPr>
-        <w:t xml:space="preserve"> The per-sample mean edge weight within each pathway was compared between high- and low-risk strata (median risk split) with Cohen's d and 95% CI (Figure 5A,B). The stratification is the model's own risk split, and its validity as a survival stratification differed across cohorts (internal C-index 0.49 in LUAD, 0.58 in BRCA and 0.63 in KIRC); the near-chance LUAD score is carried through the interpretation of the between-stratum tests below. After per-pathway label permutation (1,000 permutations) and BH-FDR correction, 43 of 53 pathways in BRCA, 2 in LUAD and 52 in KIRC remained significant; the two LUAD pathways were Homologous recombination (d = 0.35, 95% CI 0.18–0.53) and DNA replication (d = 0.35, 95% CI 0.18–0.52) (Table 7). At the cohort level, the number of pathways with BH-FDR q&lt;0.05 on the pathway-level test exceeded the cohort-level label-permutation null in all three cohorts (LUAD: 3 observed vs. null mean 0.16, maximum 34, permutation P=0.014; BRCA: 43 observed vs. null mean 0.19, maximum 19, permutation P&lt;0.001; KIRC: 52 observed vs. null mean 0.07, maximum 3, permutation P=0.005; 200 cohort-level permutations). The between-stratum differences therefore reflect risk-associated structure in the attention weights rather than the risk stratification itself.</w:t>
+        <w:t xml:space="preserve"> The per-sample mean edge weight within each pathway was compared between high- and low-risk strata (median risk split) with Cohen's d and 95% CI (Figure 5A,B). The stratification is the model's own risk split, and its validity as a survival stratification differed across cohorts (internal C-index 0.49 in LUAD, 0.58 in BRCA and 0.63 in KIRC); the near-chance LUAD score is carried through the interpretation of the between-stratum tests below. After per-pathway label permutation (1,000 permutations) and BH-FDR correction, 43 of 53 pathways in BRCA, 2 in LUAD and 52 in KIRC remained significant; the two LUAD pathways were Homologous recombination (d = 0.35, 95% CI 0.18–0.53) and DNA replication (d = 0.35, 95% CI 0.18–0.52) (Table 7). At the cohort level, the number of pathways with BH-FDR q&lt;0.05 on the pathway-level test exceeded the cohort-level label-permutation null mean in all three cohorts (LUAD: 3 observed vs. null mean 0.16, null maximum 34, permutation P=0.014; BRCA: 43 observed vs. null mean 0.19, null maximum 19, permutation P&lt;0.001; KIRC: 52 observed vs. null mean 0.07, null maximum 3, permutation P=0.005; LUAD and BRCA used 1,000 cohort-level permutations and KIRC used 200). The between-stratum differences therefore reflect risk-associated structure in the attention weights rather than the risk stratification itself.</w:t>
       </w:r>
     </w:p>
     <w:p>
@@ -16631,6 +16539,8 @@
         </w:rPr>
         <w:t>Pathway identity was not globally selective, but matched-set enrichment was cohort-dependent. The percentile is defined as P(null effect ≥ real effect), so low values indicate that a real pathway exceeded the matched random sets. Because this statistic is computed on row-normalized attention, we first characterized it under a pure null: across 24 simulated datasets with no between-stratum signal, the median density-matched percentile was 1.00 in LUAD, 1.00 in BRCA and 1.00 in KIRC (5th percentile of the simulated medians: 0.60, 0.66 and 0.61), showing a strong upward structural bias of the statistic. Against this baseline, the observed density-matched medians were 0.69 in LUAD, within the pure-null range, 0.20 in BRCA, below the simulated 5th percentile, and 0.05 in KIRC. The edge-matched control gave median percentiles of 0.67, 0.09 and &lt;0.01 in LUAD, BRCA and KIRC. The number of real pathways above the 95th percentile of the density-matched null was 1, 6 and 25 of 53 (expected 2.65 by chance), and 2, 16 and 39 of 53 for the edge-matched null. Matched-set enrichment was therefore evident in BRCA and KIRC and could not be attributed to the structural bias of row-normalized attention, whereas LUAD showed no enrichment beyond the structural null. Known-pathway enrichment of the top-20 pathways ranked by permutation P was not significant in LUAD (5 hits, P=0.689). These observations are hypothesis-generating rather than evidence of specific pathway activation, and the pathway partition remains an interpretable organizing principle rather than a statistically necessary one. The cohort contrast is informative in its own right: the framework detected risk-associated pathway structure in BRCA and KIRC while returning a negative result in LUAD, indicating that the procedure can discriminate between cohorts with and without detectable rewiring rather than reporting signal uniformly.</w:t>
       </w:r>
+    </w:p>
+    <w:p>
       <w:r>
         <w:rPr>
           <w:b/>
@@ -16641,8 +16551,10 @@
         <w:rPr>
           <w:b w:val="0"/>
         </w:rPr>
-        <w:t xml:space="preserve"> As a negative control, the static pathway GNN (−Adaptive) was subjected to the identical analysis; its total edge-weight variance across patients was 0.00, essentially zero by construction, whereas the adaptive model produced a total edge-weight variance of 19.21, orders of magnitude larger; the between-stratum differences of Section 3.4.1 are therefore attributable to the sample-specific attention mechanism rather than to the fixed adjacency. Retraining the adaptive model with randomized pathway partitions (block sizes preserved; three seeds) yielded 26–48 significant pseudo-pathways in LUAD, compared with 2 for the canonical KEGG partition. The count of significant pathways is therefore not directly comparable across partitions, and between-stratum attention differences do not require the canonical grouping; the contrast may indicate that the canonical pathway structure attenuates attention variation relative to arbitrary groupings, or that the permutation calibration behaves differently for pseudo-pathway blocks, and the present design cannot fully separate these explanations. The canonical partition is retained as a biological labeling device rather than a statistical necessity; the matched-set analyses of Section 3.4.1, which condition on the canonical partition while controlling for edge and density structure, remain the basis for pathway-level claims, and whether the canonical grouping itself contributes beyond any fixed grouping remains unresolved.</w:t>
-      </w:r>
+        <w:t xml:space="preserve"> As a negative control, the static pathway GNN (−Adaptive) was subjected to the identical analysis; its total edge-weight variance across patients was essentially zero by construction in LUAD, BRCA and KIRC (3.48e-13, 2.81e-13 and 2.76e-13; Table 7), whereas the adaptive model produced a total edge-weight variance of 1.92e+01 in LUAD, 8.41e-02 in BRCA and 2.44e+01 in KIRC, orders of magnitude larger in each cohort; the between-stratum differences of Section 3.4.1 are therefore attributable to the sample-specific attention mechanism rather than to the fixed adjacency. Retraining the adaptive model with randomized pathway partitions (block sizes preserved; three seeds) yielded 26–48 significant pseudo-pathways in LUAD, compared with 2 for the canonical KEGG partition. The count of significant pathways is therefore not directly comparable across partitions, and between-stratum attention differences do not require the canonical grouping; the contrast may indicate that the canonical pathway structure attenuates attention variation relative to arbitrary groupings, or that the permutation calibration behaves differently for pseudo-pathway blocks, and the present design cannot fully separate these explanations. The canonical partition is retained as a biological labeling device rather than a statistical necessity; the matched-set analyses of Section 3.4.1, which condition on the canonical partition while controlling for edge and density structure, remain the basis for pathway-level claims, and whether the canonical grouping itself contributes beyond any fixed grouping remains unresolved.</w:t>
+      </w:r>
+    </w:p>
+    <w:p>
       <w:r>
         <w:rPr>
           <w:b/>
@@ -18387,9 +18299,15 @@
       </w:r>
       <w:r>
         <w:rPr>
+          <w:b/>
+        </w:rPr>
+        <w:t>IMvigor210 anti-PD-L1 cohort and template transfer (exploratory).</w:t>
+      </w:r>
+      <w:r>
+        <w:rPr>
           <w:b w:val="0"/>
         </w:rPr>
-        <w:t>IMvigor210 anti-PD-L1 cohort and template transfer (exploratory).** (A) Per-patient rewiring magnitude in responders (CR/PR) vs non-responders (SD/PD); Wilcoxon rank-sum test. (B) Overall survival of high- vs low-rewiring strata (median split) with log-rank test. (C) Ki-67 expression vs rewiring magnitude with Spearman correlation. (D) Template-transfer OS validation: per-cohort hazard ratios of high versus low template score in BRCA, KIRC and LUAD GEO cohorts, with fixed-effect estimates per cancer type; dashed line at HR = 1.0.</w:t>
+        <w:t xml:space="preserve"> (A) Per-patient rewiring magnitude in responders (CR/PR) vs non-responders (SD/PD); Wilcoxon rank-sum test. (B) Overall survival of high- vs low-rewiring strata (median split) with log-rank test. (C) Ki-67 expression vs rewiring magnitude with Spearman correlation. (D) Template-transfer OS validation: per-cohort hazard ratios of high versus low template score in BRCA, KIRC and LUAD GEO cohorts, with fixed-effect estimates per cancer type; dashed line at HR = 1.0.</w:t>
       </w:r>
     </w:p>
     <w:p>
@@ -18417,7 +18335,7 @@
         <w:rPr>
           <w:b w:val="0"/>
         </w:rPr>
-        <w:t xml:space="preserve"> As an out-of-cohort check, we transferred each TCGA-trained model to independent GEO cohorts of the same cancer type and tested whether per-patient rewiring magnitude was associated with overall survival within each cohort. 0 of 3 GEO cohorts showed a nominally significant association between rewiring magnitude and OS: GSE31210 (HR 0.83, 95% CI 0.43-1.62, P=0.595; n=226); GSE50081 (HR 0.90, 95% CI 0.57-1.42, P=0.651; n=181); GSE68465 (HR 1.03, 95% CI 0.80-1.33, P=0.815; n=442). 0 of 3 GEO cohorts showed a nominally significant association between rewiring magnitude and OS: GSE20685 (HR 1.02, 95% CI 0.66-1.56, P=0.941; n=327); GSE21653 (HR 1.12, 95% CI 0.72-1.75, P=0.602; n=248); GSE7390 (HR 1.37, 95% CI 0.81-2.33, P=0.243; n=198). The sole evaluable KIRC cohort, GSE29609 (n=39), showed no significant association between rewiring magnitude and OS (HR 0.81, 95% CI 0.31–2.10, P=0.659) These associations are exploratory and were not corrected for multiple testing. As a complementary transfer test, we applied the same correlation-difference templates used for the ICB analysis (Section 3.4.3) to the GEO cohorts and tested whether the per-patient template score was associated with OS (Figure 6D). The BRCA template score was not associated with OS in any evaluable GEO cohort (GSE20685 (HR 1.05, 95% CI 0.68–1.62, P=0.815; n=327); GSE21653 (HR 1.03, 95% CI 0.66–1.61, P=0.894; n=248); GSE7390 (HR 1.08, 95% CI 0.64–1.82, P=0.778; n=198); fixed-effect HR 1.05, P=0.712)  The KIRC template score was not associated with OS in any evaluable GEO cohort (GSE29609 (HR 0.52, 95% CI 0.20–1.37, P=0.185; n=39); fixed-effect HR 0.52, P=0.185)  The LUAD template score was associated with OS in one of three cohorts (GSE31210 (HR 2.17, 95% CI 1.08–4.36, P=0.030; n=226); GSE50081 (HR 1.42, 95% CI 0.90–2.25, P=0.133; n=181); GSE68465 (HR 1.05, 95% CI 0.81–1.36, P=0.707; n=442)), with a weighted meta z of 1.27 (P=0.203) across cohorts;  Template transfer therefore provided no evidence of a portable rewiring signal in BRCA and limited, cohort-dependent evidence in LUAD, consistent with the magnitude-based results above.</w:t>
+        <w:t xml:space="preserve"> As an out-of-cohort check, we transferred each TCGA-trained model to independent GEO cohorts of the same cancer type and tested whether per-patient rewiring magnitude was associated with overall survival within each cohort. For LUAD, 0 of 3 GEO cohorts showed a nominally significant association between rewiring magnitude and OS: GSE31210 (HR 0.83, 95% CI 0.43-1.62, P=0.595; n=226); GSE50081 (HR 0.90, 95% CI 0.57-1.42, P=0.651; n=181); GSE68465 (HR 1.03, 95% CI 0.80-1.33, P=0.815; n=442). For BRCA, 0 of 3 GEO cohorts showed a nominally significant association between rewiring magnitude and OS: GSE20685 (HR 1.02, 95% CI 0.66-1.56, P=0.941; n=327); GSE21653 (HR 1.12, 95% CI 0.72-1.75, P=0.602; n=248); GSE7390 (HR 1.37, 95% CI 0.81-2.33, P=0.243; n=198). The sole evaluable KIRC cohort, GSE29609 (n=39), showed no significant association between rewiring magnitude and OS (HR 0.81, 95% CI 0.31–2.10, P=0.659). These associations are exploratory and were not corrected for multiple testing. As a complementary transfer test, we applied the same correlation-difference templates used for the ICB analysis (Section 3.4.3) to the GEO cohorts and tested whether the per-patient template score was associated with OS (Figure 6D). The BRCA template score was not associated with OS in any evaluable GEO cohort (GSE20685 (HR 1.05, 95% CI 0.68–1.62, P=0.815; n=327); GSE21653 (HR 1.03, 95% CI 0.66–1.61, P=0.894; n=248); GSE7390 (HR 1.08, 95% CI 0.64–1.82, P=0.778; n=198); fixed-effect HR 1.05, P=0.712).  The KIRC template score was not associated with OS in any evaluable GEO cohort (GSE29609 (HR 0.52, 95% CI 0.20–1.37, P=0.185; n=39); fixed-effect HR 0.52, P=0.185).  The LUAD template score was associated with OS in one of three cohorts (GSE31210 (HR 2.17, 95% CI 1.08–4.36, P=0.030; n=226); GSE50081 (HR 1.42, 95% CI 0.90–2.25, P=0.133; n=181); GSE68465 (HR 1.05, 95% CI 0.81–1.36, P=0.707; n=442)), with a weighted meta z of 1.27 (P=0.203) across cohorts).  Template transfer therefore provided no evidence of a portable rewiring signal in BRCA and limited, cohort-dependent evidence in LUAD, consistent with the magnitude-based results above.</w:t>
       </w:r>
     </w:p>
     <w:p>
@@ -18515,9 +18433,15 @@
       </w:r>
       <w:r>
         <w:rPr>
+          <w:b/>
+        </w:rPr>
+        <w:t>Decision-curve analysis at 3 years.</w:t>
+      </w:r>
+      <w:r>
+        <w:rPr>
           <w:b w:val="0"/>
         </w:rPr>
-        <w:t>Decision-curve analysis at 3 years.** Net benefit across threshold probabilities for the clinical model (age and stage), the clinical model plus the risk score, the risk score alone, and the treat-all and treat-none references in LUAD, BRCA and KIRC.</w:t>
+        <w:t xml:space="preserve"> Net benefit across threshold probabilities for the clinical model (age and stage), the clinical model plus the risk score, the risk score alone, and the treat-all and treat-none references in LUAD, BRCA and KIRC.</w:t>
       </w:r>
     </w:p>
     <w:p>
@@ -18662,9 +18586,15 @@
       </w:r>
       <w:r>
         <w:rPr>
+          <w:b/>
+        </w:rPr>
+        <w:t>Immune infiltration and predicted drug sensitivity (exploratory).</w:t>
+      </w:r>
+      <w:r>
+        <w:rPr>
           <w:b w:val="0"/>
         </w:rPr>
-        <w:t>Immune infiltration and predicted drug sensitivity (exploratory).** (A) Association of 19 immune features with per-patient rewiring magnitude in LUAD (red) and BRCA (blue): signed -log10 P of the Wilcoxon test between high- and low-rewiring strata; dashed line: P=0.050. (B) Median predicted IC50 (GDSC2/oncoPredict) of the eight nominally significant compounds in BRCA, high- versus low-rewiring strata. (C) Spearman correlation between rewiring magnitude and predicted IC50 across 17 curated compounds in BRCA; filled markers: FDR q&lt;0.05.</w:t>
+        <w:t xml:space="preserve"> (A) Association of 19 immune features with per-patient rewiring magnitude in LUAD (red) and BRCA (blue): signed -log10 P of the Wilcoxon test between high- and low-rewiring strata; dashed line: P=0.050. (B) Median predicted IC50 (GDSC2/oncoPredict) of the eight nominally significant compounds in BRCA, high- versus low-rewiring strata. (C) Spearman correlation between rewiring magnitude and predicted IC50 across 17 curated compounds in BRCA; filled markers: FDR q&lt;0.05.</w:t>
       </w:r>
     </w:p>
     <w:p>
@@ -18746,19 +18676,20 @@
         <w:tblLook w:firstColumn="1" w:firstRow="1" w:lastColumn="0" w:lastRow="0" w:noHBand="0" w:noVBand="1" w:val="04A0"/>
       </w:tblPr>
       <w:tblGrid>
-        <w:gridCol w:w="1080"/>
-        <w:gridCol w:w="1080"/>
-        <w:gridCol w:w="1080"/>
-        <w:gridCol w:w="1080"/>
-        <w:gridCol w:w="1080"/>
-        <w:gridCol w:w="1080"/>
-        <w:gridCol w:w="1080"/>
-        <w:gridCol w:w="1080"/>
+        <w:gridCol w:w="960"/>
+        <w:gridCol w:w="960"/>
+        <w:gridCol w:w="960"/>
+        <w:gridCol w:w="960"/>
+        <w:gridCol w:w="960"/>
+        <w:gridCol w:w="960"/>
+        <w:gridCol w:w="960"/>
+        <w:gridCol w:w="960"/>
+        <w:gridCol w:w="960"/>
       </w:tblGrid>
       <w:tr>
         <w:tc>
           <w:tcPr>
-            <w:tcW w:type="dxa" w:w="1080"/>
+            <w:tcW w:type="dxa" w:w="960"/>
             <w:tcBorders>
               <w:top w:val="single" w:sz="12" w:space="0" w:color="000000"/>
               <w:bottom w:val="single" w:sz="6" w:space="0" w:color="000000"/>
@@ -18776,7 +18707,7 @@
         </w:tc>
         <w:tc>
           <w:tcPr>
-            <w:tcW w:type="dxa" w:w="1080"/>
+            <w:tcW w:type="dxa" w:w="960"/>
             <w:tcBorders>
               <w:top w:val="single" w:sz="12" w:space="0" w:color="000000"/>
               <w:bottom w:val="single" w:sz="6" w:space="0" w:color="000000"/>
@@ -18794,7 +18725,7 @@
         </w:tc>
         <w:tc>
           <w:tcPr>
-            <w:tcW w:type="dxa" w:w="1080"/>
+            <w:tcW w:type="dxa" w:w="960"/>
             <w:tcBorders>
               <w:top w:val="single" w:sz="12" w:space="0" w:color="000000"/>
               <w:bottom w:val="single" w:sz="6" w:space="0" w:color="000000"/>
@@ -18812,7 +18743,7 @@
         </w:tc>
         <w:tc>
           <w:tcPr>
-            <w:tcW w:type="dxa" w:w="1080"/>
+            <w:tcW w:type="dxa" w:w="960"/>
             <w:tcBorders>
               <w:top w:val="single" w:sz="12" w:space="0" w:color="000000"/>
               <w:bottom w:val="single" w:sz="6" w:space="0" w:color="000000"/>
@@ -18830,7 +18761,7 @@
         </w:tc>
         <w:tc>
           <w:tcPr>
-            <w:tcW w:type="dxa" w:w="1080"/>
+            <w:tcW w:type="dxa" w:w="960"/>
             <w:tcBorders>
               <w:top w:val="single" w:sz="12" w:space="0" w:color="000000"/>
               <w:bottom w:val="single" w:sz="6" w:space="0" w:color="000000"/>
@@ -18848,7 +18779,7 @@
         </w:tc>
         <w:tc>
           <w:tcPr>
-            <w:tcW w:type="dxa" w:w="1080"/>
+            <w:tcW w:type="dxa" w:w="960"/>
             <w:tcBorders>
               <w:top w:val="single" w:sz="12" w:space="0" w:color="000000"/>
               <w:bottom w:val="single" w:sz="6" w:space="0" w:color="000000"/>
@@ -18860,13 +18791,13 @@
               <w:rPr>
                 <w:b w:val="0"/>
               </w:rPr>
-              <w:t>FDR q</w:t>
-            </w:r>
-          </w:p>
-        </w:tc>
-        <w:tc>
-          <w:tcPr>
-            <w:tcW w:type="dxa" w:w="1080"/>
+              <w:t>Wilcoxon FDR q</w:t>
+            </w:r>
+          </w:p>
+        </w:tc>
+        <w:tc>
+          <w:tcPr>
+            <w:tcW w:type="dxa" w:w="960"/>
             <w:tcBorders>
               <w:top w:val="single" w:sz="12" w:space="0" w:color="000000"/>
               <w:bottom w:val="single" w:sz="6" w:space="0" w:color="000000"/>
@@ -18884,7 +18815,7 @@
         </w:tc>
         <w:tc>
           <w:tcPr>
-            <w:tcW w:type="dxa" w:w="1080"/>
+            <w:tcW w:type="dxa" w:w="960"/>
             <w:tcBorders>
               <w:top w:val="single" w:sz="12" w:space="0" w:color="000000"/>
               <w:bottom w:val="single" w:sz="6" w:space="0" w:color="000000"/>
@@ -18900,11 +18831,29 @@
             </w:r>
           </w:p>
         </w:tc>
+        <w:tc>
+          <w:tcPr>
+            <w:tcW w:type="dxa" w:w="960"/>
+            <w:tcBorders>
+              <w:top w:val="single" w:sz="12" w:space="0" w:color="000000"/>
+              <w:bottom w:val="single" w:sz="6" w:space="0" w:color="000000"/>
+            </w:tcBorders>
+          </w:tcPr>
+          <w:p>
+            <w:r/>
+            <w:r>
+              <w:rPr>
+                <w:b w:val="0"/>
+              </w:rPr>
+              <w:t>Spearman FDR q</w:t>
+            </w:r>
+          </w:p>
+        </w:tc>
       </w:tr>
       <w:tr>
         <w:tc>
           <w:tcPr>
-            <w:tcW w:type="dxa" w:w="1080"/>
+            <w:tcW w:type="dxa" w:w="960"/>
             <w:tcBorders/>
           </w:tcPr>
           <w:p>
@@ -18919,61 +18868,70 @@
         </w:tc>
         <w:tc>
           <w:tcPr>
-            <w:tcW w:type="dxa" w:w="1080"/>
-            <w:tcBorders/>
-          </w:tcPr>
-          <w:p>
-            <w:r/>
-          </w:p>
-        </w:tc>
-        <w:tc>
-          <w:tcPr>
-            <w:tcW w:type="dxa" w:w="1080"/>
-            <w:tcBorders/>
-          </w:tcPr>
-          <w:p>
-            <w:r/>
-          </w:p>
-        </w:tc>
-        <w:tc>
-          <w:tcPr>
-            <w:tcW w:type="dxa" w:w="1080"/>
-            <w:tcBorders/>
-          </w:tcPr>
-          <w:p>
-            <w:r/>
-          </w:p>
-        </w:tc>
-        <w:tc>
-          <w:tcPr>
-            <w:tcW w:type="dxa" w:w="1080"/>
-            <w:tcBorders/>
-          </w:tcPr>
-          <w:p>
-            <w:r/>
-          </w:p>
-        </w:tc>
-        <w:tc>
-          <w:tcPr>
-            <w:tcW w:type="dxa" w:w="1080"/>
-            <w:tcBorders/>
-          </w:tcPr>
-          <w:p>
-            <w:r/>
-          </w:p>
-        </w:tc>
-        <w:tc>
-          <w:tcPr>
-            <w:tcW w:type="dxa" w:w="1080"/>
-            <w:tcBorders/>
-          </w:tcPr>
-          <w:p>
-            <w:r/>
-          </w:p>
-        </w:tc>
-        <w:tc>
-          <w:tcPr>
-            <w:tcW w:type="dxa" w:w="1080"/>
+            <w:tcW w:type="dxa" w:w="960"/>
+            <w:tcBorders/>
+          </w:tcPr>
+          <w:p>
+            <w:r/>
+          </w:p>
+        </w:tc>
+        <w:tc>
+          <w:tcPr>
+            <w:tcW w:type="dxa" w:w="960"/>
+            <w:tcBorders/>
+          </w:tcPr>
+          <w:p>
+            <w:r/>
+          </w:p>
+        </w:tc>
+        <w:tc>
+          <w:tcPr>
+            <w:tcW w:type="dxa" w:w="960"/>
+            <w:tcBorders/>
+          </w:tcPr>
+          <w:p>
+            <w:r/>
+          </w:p>
+        </w:tc>
+        <w:tc>
+          <w:tcPr>
+            <w:tcW w:type="dxa" w:w="960"/>
+            <w:tcBorders/>
+          </w:tcPr>
+          <w:p>
+            <w:r/>
+          </w:p>
+        </w:tc>
+        <w:tc>
+          <w:tcPr>
+            <w:tcW w:type="dxa" w:w="960"/>
+            <w:tcBorders/>
+          </w:tcPr>
+          <w:p>
+            <w:r/>
+          </w:p>
+        </w:tc>
+        <w:tc>
+          <w:tcPr>
+            <w:tcW w:type="dxa" w:w="960"/>
+            <w:tcBorders/>
+          </w:tcPr>
+          <w:p>
+            <w:r/>
+          </w:p>
+        </w:tc>
+        <w:tc>
+          <w:tcPr>
+            <w:tcW w:type="dxa" w:w="960"/>
+            <w:tcBorders/>
+          </w:tcPr>
+          <w:p>
+            <w:r/>
+          </w:p>
+        </w:tc>
+        <w:tc>
+          <w:tcPr>
+            <w:tcW w:type="dxa" w:w="960"/>
             <w:tcBorders/>
           </w:tcPr>
           <w:p>
@@ -18984,16 +18942,16 @@
       <w:tr>
         <w:tc>
           <w:tcPr>
-            <w:tcW w:type="dxa" w:w="1080"/>
-            <w:tcBorders/>
-          </w:tcPr>
-          <w:p>
-            <w:r/>
-          </w:p>
-        </w:tc>
-        <w:tc>
-          <w:tcPr>
-            <w:tcW w:type="dxa" w:w="1080"/>
+            <w:tcW w:type="dxa" w:w="960"/>
+            <w:tcBorders/>
+          </w:tcPr>
+          <w:p>
+            <w:r/>
+          </w:p>
+        </w:tc>
+        <w:tc>
+          <w:tcPr>
+            <w:tcW w:type="dxa" w:w="960"/>
             <w:tcBorders/>
           </w:tcPr>
           <w:p>
@@ -19008,7 +18966,7 @@
         </w:tc>
         <w:tc>
           <w:tcPr>
-            <w:tcW w:type="dxa" w:w="1080"/>
+            <w:tcW w:type="dxa" w:w="960"/>
             <w:tcBorders/>
           </w:tcPr>
           <w:p>
@@ -19023,7 +18981,7 @@
         </w:tc>
         <w:tc>
           <w:tcPr>
-            <w:tcW w:type="dxa" w:w="1080"/>
+            <w:tcW w:type="dxa" w:w="960"/>
             <w:tcBorders/>
           </w:tcPr>
           <w:p>
@@ -19038,7 +18996,7 @@
         </w:tc>
         <w:tc>
           <w:tcPr>
-            <w:tcW w:type="dxa" w:w="1080"/>
+            <w:tcW w:type="dxa" w:w="960"/>
             <w:tcBorders/>
           </w:tcPr>
           <w:p>
@@ -19053,7 +19011,7 @@
         </w:tc>
         <w:tc>
           <w:tcPr>
-            <w:tcW w:type="dxa" w:w="1080"/>
+            <w:tcW w:type="dxa" w:w="960"/>
             <w:tcBorders/>
           </w:tcPr>
           <w:p>
@@ -19068,7 +19026,7 @@
         </w:tc>
         <w:tc>
           <w:tcPr>
-            <w:tcW w:type="dxa" w:w="1080"/>
+            <w:tcW w:type="dxa" w:w="960"/>
             <w:tcBorders/>
           </w:tcPr>
           <w:p>
@@ -19083,7 +19041,7 @@
         </w:tc>
         <w:tc>
           <w:tcPr>
-            <w:tcW w:type="dxa" w:w="1080"/>
+            <w:tcW w:type="dxa" w:w="960"/>
             <w:tcBorders/>
           </w:tcPr>
           <w:p>
@@ -19093,6 +19051,21 @@
                 <w:b w:val="0"/>
               </w:rPr>
               <w:t>P&lt;0.001</w:t>
+            </w:r>
+          </w:p>
+        </w:tc>
+        <w:tc>
+          <w:tcPr>
+            <w:tcW w:type="dxa" w:w="960"/>
+            <w:tcBorders/>
+          </w:tcPr>
+          <w:p>
+            <w:r/>
+            <w:r>
+              <w:rPr>
+                <w:b w:val="0"/>
+              </w:rPr>
+              <w:t>q=0.006</w:t>
             </w:r>
           </w:p>
         </w:tc>
@@ -19100,16 +19073,16 @@
       <w:tr>
         <w:tc>
           <w:tcPr>
-            <w:tcW w:type="dxa" w:w="1080"/>
-            <w:tcBorders/>
-          </w:tcPr>
-          <w:p>
-            <w:r/>
-          </w:p>
-        </w:tc>
-        <w:tc>
-          <w:tcPr>
-            <w:tcW w:type="dxa" w:w="1080"/>
+            <w:tcW w:type="dxa" w:w="960"/>
+            <w:tcBorders/>
+          </w:tcPr>
+          <w:p>
+            <w:r/>
+          </w:p>
+        </w:tc>
+        <w:tc>
+          <w:tcPr>
+            <w:tcW w:type="dxa" w:w="960"/>
             <w:tcBorders/>
           </w:tcPr>
           <w:p>
@@ -19124,7 +19097,7 @@
         </w:tc>
         <w:tc>
           <w:tcPr>
-            <w:tcW w:type="dxa" w:w="1080"/>
+            <w:tcW w:type="dxa" w:w="960"/>
             <w:tcBorders/>
           </w:tcPr>
           <w:p>
@@ -19139,7 +19112,7 @@
         </w:tc>
         <w:tc>
           <w:tcPr>
-            <w:tcW w:type="dxa" w:w="1080"/>
+            <w:tcW w:type="dxa" w:w="960"/>
             <w:tcBorders/>
           </w:tcPr>
           <w:p>
@@ -19154,7 +19127,7 @@
         </w:tc>
         <w:tc>
           <w:tcPr>
-            <w:tcW w:type="dxa" w:w="1080"/>
+            <w:tcW w:type="dxa" w:w="960"/>
             <w:tcBorders/>
           </w:tcPr>
           <w:p>
@@ -19169,7 +19142,7 @@
         </w:tc>
         <w:tc>
           <w:tcPr>
-            <w:tcW w:type="dxa" w:w="1080"/>
+            <w:tcW w:type="dxa" w:w="960"/>
             <w:tcBorders/>
           </w:tcPr>
           <w:p>
@@ -19184,7 +19157,7 @@
         </w:tc>
         <w:tc>
           <w:tcPr>
-            <w:tcW w:type="dxa" w:w="1080"/>
+            <w:tcW w:type="dxa" w:w="960"/>
             <w:tcBorders/>
           </w:tcPr>
           <w:p>
@@ -19199,7 +19172,7 @@
         </w:tc>
         <w:tc>
           <w:tcPr>
-            <w:tcW w:type="dxa" w:w="1080"/>
+            <w:tcW w:type="dxa" w:w="960"/>
             <w:tcBorders/>
           </w:tcPr>
           <w:p>
@@ -19209,6 +19182,21 @@
                 <w:b w:val="0"/>
               </w:rPr>
               <w:t>P&lt;0.001</w:t>
+            </w:r>
+          </w:p>
+        </w:tc>
+        <w:tc>
+          <w:tcPr>
+            <w:tcW w:type="dxa" w:w="960"/>
+            <w:tcBorders/>
+          </w:tcPr>
+          <w:p>
+            <w:r/>
+            <w:r>
+              <w:rPr>
+                <w:b w:val="0"/>
+              </w:rPr>
+              <w:t>q=0.006</w:t>
             </w:r>
           </w:p>
         </w:tc>
@@ -19216,16 +19204,16 @@
       <w:tr>
         <w:tc>
           <w:tcPr>
-            <w:tcW w:type="dxa" w:w="1080"/>
-            <w:tcBorders/>
-          </w:tcPr>
-          <w:p>
-            <w:r/>
-          </w:p>
-        </w:tc>
-        <w:tc>
-          <w:tcPr>
-            <w:tcW w:type="dxa" w:w="1080"/>
+            <w:tcW w:type="dxa" w:w="960"/>
+            <w:tcBorders/>
+          </w:tcPr>
+          <w:p>
+            <w:r/>
+          </w:p>
+        </w:tc>
+        <w:tc>
+          <w:tcPr>
+            <w:tcW w:type="dxa" w:w="960"/>
             <w:tcBorders/>
           </w:tcPr>
           <w:p>
@@ -19240,7 +19228,7 @@
         </w:tc>
         <w:tc>
           <w:tcPr>
-            <w:tcW w:type="dxa" w:w="1080"/>
+            <w:tcW w:type="dxa" w:w="960"/>
             <w:tcBorders/>
           </w:tcPr>
           <w:p>
@@ -19255,7 +19243,7 @@
         </w:tc>
         <w:tc>
           <w:tcPr>
-            <w:tcW w:type="dxa" w:w="1080"/>
+            <w:tcW w:type="dxa" w:w="960"/>
             <w:tcBorders/>
           </w:tcPr>
           <w:p>
@@ -19270,7 +19258,7 @@
         </w:tc>
         <w:tc>
           <w:tcPr>
-            <w:tcW w:type="dxa" w:w="1080"/>
+            <w:tcW w:type="dxa" w:w="960"/>
             <w:tcBorders/>
           </w:tcPr>
           <w:p>
@@ -19285,7 +19273,7 @@
         </w:tc>
         <w:tc>
           <w:tcPr>
-            <w:tcW w:type="dxa" w:w="1080"/>
+            <w:tcW w:type="dxa" w:w="960"/>
             <w:tcBorders/>
           </w:tcPr>
           <w:p>
@@ -19300,7 +19288,7 @@
         </w:tc>
         <w:tc>
           <w:tcPr>
-            <w:tcW w:type="dxa" w:w="1080"/>
+            <w:tcW w:type="dxa" w:w="960"/>
             <w:tcBorders/>
           </w:tcPr>
           <w:p>
@@ -19315,7 +19303,7 @@
         </w:tc>
         <w:tc>
           <w:tcPr>
-            <w:tcW w:type="dxa" w:w="1080"/>
+            <w:tcW w:type="dxa" w:w="960"/>
             <w:tcBorders/>
           </w:tcPr>
           <w:p>
@@ -19325,6 +19313,21 @@
                 <w:b w:val="0"/>
               </w:rPr>
               <w:t>P=0.007</w:t>
+            </w:r>
+          </w:p>
+        </w:tc>
+        <w:tc>
+          <w:tcPr>
+            <w:tcW w:type="dxa" w:w="960"/>
+            <w:tcBorders/>
+          </w:tcPr>
+          <w:p>
+            <w:r/>
+            <w:r>
+              <w:rPr>
+                <w:b w:val="0"/>
+              </w:rPr>
+              <w:t>q=0.024</w:t>
             </w:r>
           </w:p>
         </w:tc>
@@ -19332,16 +19335,16 @@
       <w:tr>
         <w:tc>
           <w:tcPr>
-            <w:tcW w:type="dxa" w:w="1080"/>
-            <w:tcBorders/>
-          </w:tcPr>
-          <w:p>
-            <w:r/>
-          </w:p>
-        </w:tc>
-        <w:tc>
-          <w:tcPr>
-            <w:tcW w:type="dxa" w:w="1080"/>
+            <w:tcW w:type="dxa" w:w="960"/>
+            <w:tcBorders/>
+          </w:tcPr>
+          <w:p>
+            <w:r/>
+          </w:p>
+        </w:tc>
+        <w:tc>
+          <w:tcPr>
+            <w:tcW w:type="dxa" w:w="960"/>
             <w:tcBorders/>
           </w:tcPr>
           <w:p>
@@ -19356,7 +19359,7 @@
         </w:tc>
         <w:tc>
           <w:tcPr>
-            <w:tcW w:type="dxa" w:w="1080"/>
+            <w:tcW w:type="dxa" w:w="960"/>
             <w:tcBorders/>
           </w:tcPr>
           <w:p>
@@ -19371,7 +19374,7 @@
         </w:tc>
         <w:tc>
           <w:tcPr>
-            <w:tcW w:type="dxa" w:w="1080"/>
+            <w:tcW w:type="dxa" w:w="960"/>
             <w:tcBorders/>
           </w:tcPr>
           <w:p>
@@ -19386,7 +19389,7 @@
         </w:tc>
         <w:tc>
           <w:tcPr>
-            <w:tcW w:type="dxa" w:w="1080"/>
+            <w:tcW w:type="dxa" w:w="960"/>
             <w:tcBorders/>
           </w:tcPr>
           <w:p>
@@ -19401,7 +19404,7 @@
         </w:tc>
         <w:tc>
           <w:tcPr>
-            <w:tcW w:type="dxa" w:w="1080"/>
+            <w:tcW w:type="dxa" w:w="960"/>
             <w:tcBorders/>
           </w:tcPr>
           <w:p>
@@ -19416,7 +19419,7 @@
         </w:tc>
         <w:tc>
           <w:tcPr>
-            <w:tcW w:type="dxa" w:w="1080"/>
+            <w:tcW w:type="dxa" w:w="960"/>
             <w:tcBorders/>
           </w:tcPr>
           <w:p>
@@ -19431,7 +19434,7 @@
         </w:tc>
         <w:tc>
           <w:tcPr>
-            <w:tcW w:type="dxa" w:w="1080"/>
+            <w:tcW w:type="dxa" w:w="960"/>
             <w:tcBorders/>
           </w:tcPr>
           <w:p>
@@ -19441,6 +19444,21 @@
                 <w:b w:val="0"/>
               </w:rPr>
               <w:t>P=0.018</w:t>
+            </w:r>
+          </w:p>
+        </w:tc>
+        <w:tc>
+          <w:tcPr>
+            <w:tcW w:type="dxa" w:w="960"/>
+            <w:tcBorders/>
+          </w:tcPr>
+          <w:p>
+            <w:r/>
+            <w:r>
+              <w:rPr>
+                <w:b w:val="0"/>
+              </w:rPr>
+              <w:t>q=0.033</w:t>
             </w:r>
           </w:p>
         </w:tc>
@@ -19448,16 +19466,16 @@
       <w:tr>
         <w:tc>
           <w:tcPr>
-            <w:tcW w:type="dxa" w:w="1080"/>
-            <w:tcBorders/>
-          </w:tcPr>
-          <w:p>
-            <w:r/>
-          </w:p>
-        </w:tc>
-        <w:tc>
-          <w:tcPr>
-            <w:tcW w:type="dxa" w:w="1080"/>
+            <w:tcW w:type="dxa" w:w="960"/>
+            <w:tcBorders/>
+          </w:tcPr>
+          <w:p>
+            <w:r/>
+          </w:p>
+        </w:tc>
+        <w:tc>
+          <w:tcPr>
+            <w:tcW w:type="dxa" w:w="960"/>
             <w:tcBorders/>
           </w:tcPr>
           <w:p>
@@ -19472,7 +19490,7 @@
         </w:tc>
         <w:tc>
           <w:tcPr>
-            <w:tcW w:type="dxa" w:w="1080"/>
+            <w:tcW w:type="dxa" w:w="960"/>
             <w:tcBorders/>
           </w:tcPr>
           <w:p>
@@ -19487,7 +19505,7 @@
         </w:tc>
         <w:tc>
           <w:tcPr>
-            <w:tcW w:type="dxa" w:w="1080"/>
+            <w:tcW w:type="dxa" w:w="960"/>
             <w:tcBorders/>
           </w:tcPr>
           <w:p>
@@ -19502,7 +19520,7 @@
         </w:tc>
         <w:tc>
           <w:tcPr>
-            <w:tcW w:type="dxa" w:w="1080"/>
+            <w:tcW w:type="dxa" w:w="960"/>
             <w:tcBorders/>
           </w:tcPr>
           <w:p>
@@ -19517,7 +19535,7 @@
         </w:tc>
         <w:tc>
           <w:tcPr>
-            <w:tcW w:type="dxa" w:w="1080"/>
+            <w:tcW w:type="dxa" w:w="960"/>
             <w:tcBorders/>
           </w:tcPr>
           <w:p>
@@ -19532,7 +19550,7 @@
         </w:tc>
         <w:tc>
           <w:tcPr>
-            <w:tcW w:type="dxa" w:w="1080"/>
+            <w:tcW w:type="dxa" w:w="960"/>
             <w:tcBorders/>
           </w:tcPr>
           <w:p>
@@ -19547,7 +19565,7 @@
         </w:tc>
         <w:tc>
           <w:tcPr>
-            <w:tcW w:type="dxa" w:w="1080"/>
+            <w:tcW w:type="dxa" w:w="960"/>
             <w:tcBorders/>
           </w:tcPr>
           <w:p>
@@ -19557,6 +19575,21 @@
                 <w:b w:val="0"/>
               </w:rPr>
               <w:t>P=0.005</w:t>
+            </w:r>
+          </w:p>
+        </w:tc>
+        <w:tc>
+          <w:tcPr>
+            <w:tcW w:type="dxa" w:w="960"/>
+            <w:tcBorders/>
+          </w:tcPr>
+          <w:p>
+            <w:r/>
+            <w:r>
+              <w:rPr>
+                <w:b w:val="0"/>
+              </w:rPr>
+              <w:t>q=0.024</w:t>
             </w:r>
           </w:p>
         </w:tc>
@@ -19564,16 +19597,16 @@
       <w:tr>
         <w:tc>
           <w:tcPr>
-            <w:tcW w:type="dxa" w:w="1080"/>
-            <w:tcBorders/>
-          </w:tcPr>
-          <w:p>
-            <w:r/>
-          </w:p>
-        </w:tc>
-        <w:tc>
-          <w:tcPr>
-            <w:tcW w:type="dxa" w:w="1080"/>
+            <w:tcW w:type="dxa" w:w="960"/>
+            <w:tcBorders/>
+          </w:tcPr>
+          <w:p>
+            <w:r/>
+          </w:p>
+        </w:tc>
+        <w:tc>
+          <w:tcPr>
+            <w:tcW w:type="dxa" w:w="960"/>
             <w:tcBorders/>
           </w:tcPr>
           <w:p>
@@ -19588,7 +19621,7 @@
         </w:tc>
         <w:tc>
           <w:tcPr>
-            <w:tcW w:type="dxa" w:w="1080"/>
+            <w:tcW w:type="dxa" w:w="960"/>
             <w:tcBorders/>
           </w:tcPr>
           <w:p>
@@ -19603,7 +19636,7 @@
         </w:tc>
         <w:tc>
           <w:tcPr>
-            <w:tcW w:type="dxa" w:w="1080"/>
+            <w:tcW w:type="dxa" w:w="960"/>
             <w:tcBorders/>
           </w:tcPr>
           <w:p>
@@ -19618,7 +19651,7 @@
         </w:tc>
         <w:tc>
           <w:tcPr>
-            <w:tcW w:type="dxa" w:w="1080"/>
+            <w:tcW w:type="dxa" w:w="960"/>
             <w:tcBorders/>
           </w:tcPr>
           <w:p>
@@ -19633,7 +19666,7 @@
         </w:tc>
         <w:tc>
           <w:tcPr>
-            <w:tcW w:type="dxa" w:w="1080"/>
+            <w:tcW w:type="dxa" w:w="960"/>
             <w:tcBorders/>
           </w:tcPr>
           <w:p>
@@ -19648,7 +19681,7 @@
         </w:tc>
         <w:tc>
           <w:tcPr>
-            <w:tcW w:type="dxa" w:w="1080"/>
+            <w:tcW w:type="dxa" w:w="960"/>
             <w:tcBorders/>
           </w:tcPr>
           <w:p>
@@ -19663,7 +19696,7 @@
         </w:tc>
         <w:tc>
           <w:tcPr>
-            <w:tcW w:type="dxa" w:w="1080"/>
+            <w:tcW w:type="dxa" w:w="960"/>
             <w:tcBorders/>
           </w:tcPr>
           <w:p>
@@ -19673,6 +19706,21 @@
                 <w:b w:val="0"/>
               </w:rPr>
               <w:t>P=0.016</w:t>
+            </w:r>
+          </w:p>
+        </w:tc>
+        <w:tc>
+          <w:tcPr>
+            <w:tcW w:type="dxa" w:w="960"/>
+            <w:tcBorders/>
+          </w:tcPr>
+          <w:p>
+            <w:r/>
+            <w:r>
+              <w:rPr>
+                <w:b w:val="0"/>
+              </w:rPr>
+              <w:t>q=0.033</w:t>
             </w:r>
           </w:p>
         </w:tc>
@@ -19680,16 +19728,16 @@
       <w:tr>
         <w:tc>
           <w:tcPr>
-            <w:tcW w:type="dxa" w:w="1080"/>
-            <w:tcBorders/>
-          </w:tcPr>
-          <w:p>
-            <w:r/>
-          </w:p>
-        </w:tc>
-        <w:tc>
-          <w:tcPr>
-            <w:tcW w:type="dxa" w:w="1080"/>
+            <w:tcW w:type="dxa" w:w="960"/>
+            <w:tcBorders/>
+          </w:tcPr>
+          <w:p>
+            <w:r/>
+          </w:p>
+        </w:tc>
+        <w:tc>
+          <w:tcPr>
+            <w:tcW w:type="dxa" w:w="960"/>
             <w:tcBorders/>
           </w:tcPr>
           <w:p>
@@ -19704,7 +19752,7 @@
         </w:tc>
         <w:tc>
           <w:tcPr>
-            <w:tcW w:type="dxa" w:w="1080"/>
+            <w:tcW w:type="dxa" w:w="960"/>
             <w:tcBorders/>
           </w:tcPr>
           <w:p>
@@ -19719,7 +19767,7 @@
         </w:tc>
         <w:tc>
           <w:tcPr>
-            <w:tcW w:type="dxa" w:w="1080"/>
+            <w:tcW w:type="dxa" w:w="960"/>
             <w:tcBorders/>
           </w:tcPr>
           <w:p>
@@ -19734,7 +19782,7 @@
         </w:tc>
         <w:tc>
           <w:tcPr>
-            <w:tcW w:type="dxa" w:w="1080"/>
+            <w:tcW w:type="dxa" w:w="960"/>
             <w:tcBorders/>
           </w:tcPr>
           <w:p>
@@ -19749,7 +19797,7 @@
         </w:tc>
         <w:tc>
           <w:tcPr>
-            <w:tcW w:type="dxa" w:w="1080"/>
+            <w:tcW w:type="dxa" w:w="960"/>
             <w:tcBorders/>
           </w:tcPr>
           <w:p>
@@ -19764,7 +19812,7 @@
         </w:tc>
         <w:tc>
           <w:tcPr>
-            <w:tcW w:type="dxa" w:w="1080"/>
+            <w:tcW w:type="dxa" w:w="960"/>
             <w:tcBorders/>
           </w:tcPr>
           <w:p>
@@ -19779,7 +19827,7 @@
         </w:tc>
         <w:tc>
           <w:tcPr>
-            <w:tcW w:type="dxa" w:w="1080"/>
+            <w:tcW w:type="dxa" w:w="960"/>
             <w:tcBorders/>
           </w:tcPr>
           <w:p>
@@ -19789,6 +19837,21 @@
                 <w:b w:val="0"/>
               </w:rPr>
               <w:t>P=0.006</w:t>
+            </w:r>
+          </w:p>
+        </w:tc>
+        <w:tc>
+          <w:tcPr>
+            <w:tcW w:type="dxa" w:w="960"/>
+            <w:tcBorders/>
+          </w:tcPr>
+          <w:p>
+            <w:r/>
+            <w:r>
+              <w:rPr>
+                <w:b w:val="0"/>
+              </w:rPr>
+              <w:t>q=0.024</w:t>
             </w:r>
           </w:p>
         </w:tc>
@@ -19796,16 +19859,16 @@
       <w:tr>
         <w:tc>
           <w:tcPr>
-            <w:tcW w:type="dxa" w:w="1080"/>
-            <w:tcBorders/>
-          </w:tcPr>
-          <w:p>
-            <w:r/>
-          </w:p>
-        </w:tc>
-        <w:tc>
-          <w:tcPr>
-            <w:tcW w:type="dxa" w:w="1080"/>
+            <w:tcW w:type="dxa" w:w="960"/>
+            <w:tcBorders/>
+          </w:tcPr>
+          <w:p>
+            <w:r/>
+          </w:p>
+        </w:tc>
+        <w:tc>
+          <w:tcPr>
+            <w:tcW w:type="dxa" w:w="960"/>
             <w:tcBorders/>
           </w:tcPr>
           <w:p>
@@ -19820,7 +19883,7 @@
         </w:tc>
         <w:tc>
           <w:tcPr>
-            <w:tcW w:type="dxa" w:w="1080"/>
+            <w:tcW w:type="dxa" w:w="960"/>
             <w:tcBorders/>
           </w:tcPr>
           <w:p>
@@ -19835,7 +19898,7 @@
         </w:tc>
         <w:tc>
           <w:tcPr>
-            <w:tcW w:type="dxa" w:w="1080"/>
+            <w:tcW w:type="dxa" w:w="960"/>
             <w:tcBorders/>
           </w:tcPr>
           <w:p>
@@ -19850,7 +19913,7 @@
         </w:tc>
         <w:tc>
           <w:tcPr>
-            <w:tcW w:type="dxa" w:w="1080"/>
+            <w:tcW w:type="dxa" w:w="960"/>
             <w:tcBorders/>
           </w:tcPr>
           <w:p>
@@ -19865,7 +19928,7 @@
         </w:tc>
         <w:tc>
           <w:tcPr>
-            <w:tcW w:type="dxa" w:w="1080"/>
+            <w:tcW w:type="dxa" w:w="960"/>
             <w:tcBorders/>
           </w:tcPr>
           <w:p>
@@ -19880,7 +19943,7 @@
         </w:tc>
         <w:tc>
           <w:tcPr>
-            <w:tcW w:type="dxa" w:w="1080"/>
+            <w:tcW w:type="dxa" w:w="960"/>
             <w:tcBorders/>
           </w:tcPr>
           <w:p>
@@ -19895,7 +19958,7 @@
         </w:tc>
         <w:tc>
           <w:tcPr>
-            <w:tcW w:type="dxa" w:w="1080"/>
+            <w:tcW w:type="dxa" w:w="960"/>
             <w:tcBorders/>
           </w:tcPr>
           <w:p>
@@ -19905,6 +19968,21 @@
                 <w:b w:val="0"/>
               </w:rPr>
               <w:t>P=0.015</w:t>
+            </w:r>
+          </w:p>
+        </w:tc>
+        <w:tc>
+          <w:tcPr>
+            <w:tcW w:type="dxa" w:w="960"/>
+            <w:tcBorders/>
+          </w:tcPr>
+          <w:p>
+            <w:r/>
+            <w:r>
+              <w:rPr>
+                <w:b w:val="0"/>
+              </w:rPr>
+              <w:t>q=0.033</w:t>
             </w:r>
           </w:p>
         </w:tc>
@@ -19912,16 +19990,16 @@
       <w:tr>
         <w:tc>
           <w:tcPr>
-            <w:tcW w:type="dxa" w:w="1080"/>
-            <w:tcBorders/>
-          </w:tcPr>
-          <w:p>
-            <w:r/>
-          </w:p>
-        </w:tc>
-        <w:tc>
-          <w:tcPr>
-            <w:tcW w:type="dxa" w:w="1080"/>
+            <w:tcW w:type="dxa" w:w="960"/>
+            <w:tcBorders/>
+          </w:tcPr>
+          <w:p>
+            <w:r/>
+          </w:p>
+        </w:tc>
+        <w:tc>
+          <w:tcPr>
+            <w:tcW w:type="dxa" w:w="960"/>
             <w:tcBorders/>
           </w:tcPr>
           <w:p>
@@ -19936,7 +20014,7 @@
         </w:tc>
         <w:tc>
           <w:tcPr>
-            <w:tcW w:type="dxa" w:w="1080"/>
+            <w:tcW w:type="dxa" w:w="960"/>
             <w:tcBorders/>
           </w:tcPr>
           <w:p>
@@ -19951,7 +20029,7 @@
         </w:tc>
         <w:tc>
           <w:tcPr>
-            <w:tcW w:type="dxa" w:w="1080"/>
+            <w:tcW w:type="dxa" w:w="960"/>
             <w:tcBorders/>
           </w:tcPr>
           <w:p>
@@ -19966,7 +20044,7 @@
         </w:tc>
         <w:tc>
           <w:tcPr>
-            <w:tcW w:type="dxa" w:w="1080"/>
+            <w:tcW w:type="dxa" w:w="960"/>
             <w:tcBorders/>
           </w:tcPr>
           <w:p>
@@ -19981,7 +20059,7 @@
         </w:tc>
         <w:tc>
           <w:tcPr>
-            <w:tcW w:type="dxa" w:w="1080"/>
+            <w:tcW w:type="dxa" w:w="960"/>
             <w:tcBorders/>
           </w:tcPr>
           <w:p>
@@ -19996,7 +20074,7 @@
         </w:tc>
         <w:tc>
           <w:tcPr>
-            <w:tcW w:type="dxa" w:w="1080"/>
+            <w:tcW w:type="dxa" w:w="960"/>
             <w:tcBorders/>
           </w:tcPr>
           <w:p>
@@ -20011,7 +20089,7 @@
         </w:tc>
         <w:tc>
           <w:tcPr>
-            <w:tcW w:type="dxa" w:w="1080"/>
+            <w:tcW w:type="dxa" w:w="960"/>
             <w:tcBorders/>
           </w:tcPr>
           <w:p>
@@ -20021,6 +20099,21 @@
                 <w:b w:val="0"/>
               </w:rPr>
               <w:t>P=0.014</w:t>
+            </w:r>
+          </w:p>
+        </w:tc>
+        <w:tc>
+          <w:tcPr>
+            <w:tcW w:type="dxa" w:w="960"/>
+            <w:tcBorders/>
+          </w:tcPr>
+          <w:p>
+            <w:r/>
+            <w:r>
+              <w:rPr>
+                <w:b w:val="0"/>
+              </w:rPr>
+              <w:t>q=0.033</w:t>
             </w:r>
           </w:p>
         </w:tc>
@@ -20028,16 +20121,16 @@
       <w:tr>
         <w:tc>
           <w:tcPr>
-            <w:tcW w:type="dxa" w:w="1080"/>
-            <w:tcBorders/>
-          </w:tcPr>
-          <w:p>
-            <w:r/>
-          </w:p>
-        </w:tc>
-        <w:tc>
-          <w:tcPr>
-            <w:tcW w:type="dxa" w:w="1080"/>
+            <w:tcW w:type="dxa" w:w="960"/>
+            <w:tcBorders/>
+          </w:tcPr>
+          <w:p>
+            <w:r/>
+          </w:p>
+        </w:tc>
+        <w:tc>
+          <w:tcPr>
+            <w:tcW w:type="dxa" w:w="960"/>
             <w:tcBorders/>
           </w:tcPr>
           <w:p>
@@ -20052,7 +20145,7 @@
         </w:tc>
         <w:tc>
           <w:tcPr>
-            <w:tcW w:type="dxa" w:w="1080"/>
+            <w:tcW w:type="dxa" w:w="960"/>
             <w:tcBorders/>
           </w:tcPr>
           <w:p>
@@ -20067,7 +20160,7 @@
         </w:tc>
         <w:tc>
           <w:tcPr>
-            <w:tcW w:type="dxa" w:w="1080"/>
+            <w:tcW w:type="dxa" w:w="960"/>
             <w:tcBorders/>
           </w:tcPr>
           <w:p>
@@ -20082,7 +20175,7 @@
         </w:tc>
         <w:tc>
           <w:tcPr>
-            <w:tcW w:type="dxa" w:w="1080"/>
+            <w:tcW w:type="dxa" w:w="960"/>
             <w:tcBorders/>
           </w:tcPr>
           <w:p>
@@ -20097,7 +20190,7 @@
         </w:tc>
         <w:tc>
           <w:tcPr>
-            <w:tcW w:type="dxa" w:w="1080"/>
+            <w:tcW w:type="dxa" w:w="960"/>
             <w:tcBorders/>
           </w:tcPr>
           <w:p>
@@ -20112,7 +20205,7 @@
         </w:tc>
         <w:tc>
           <w:tcPr>
-            <w:tcW w:type="dxa" w:w="1080"/>
+            <w:tcW w:type="dxa" w:w="960"/>
             <w:tcBorders/>
           </w:tcPr>
           <w:p>
@@ -20127,7 +20220,7 @@
         </w:tc>
         <w:tc>
           <w:tcPr>
-            <w:tcW w:type="dxa" w:w="1080"/>
+            <w:tcW w:type="dxa" w:w="960"/>
             <w:tcBorders/>
           </w:tcPr>
           <w:p>
@@ -20137,6 +20230,21 @@
                 <w:b w:val="0"/>
               </w:rPr>
               <w:t>P=0.020</w:t>
+            </w:r>
+          </w:p>
+        </w:tc>
+        <w:tc>
+          <w:tcPr>
+            <w:tcW w:type="dxa" w:w="960"/>
+            <w:tcBorders/>
+          </w:tcPr>
+          <w:p>
+            <w:r/>
+            <w:r>
+              <w:rPr>
+                <w:b w:val="0"/>
+              </w:rPr>
+              <w:t>q=0.033</w:t>
             </w:r>
           </w:p>
         </w:tc>
@@ -20144,16 +20252,16 @@
       <w:tr>
         <w:tc>
           <w:tcPr>
-            <w:tcW w:type="dxa" w:w="1080"/>
-            <w:tcBorders/>
-          </w:tcPr>
-          <w:p>
-            <w:r/>
-          </w:p>
-        </w:tc>
-        <w:tc>
-          <w:tcPr>
-            <w:tcW w:type="dxa" w:w="1080"/>
+            <w:tcW w:type="dxa" w:w="960"/>
+            <w:tcBorders/>
+          </w:tcPr>
+          <w:p>
+            <w:r/>
+          </w:p>
+        </w:tc>
+        <w:tc>
+          <w:tcPr>
+            <w:tcW w:type="dxa" w:w="960"/>
             <w:tcBorders/>
           </w:tcPr>
           <w:p>
@@ -20168,7 +20276,7 @@
         </w:tc>
         <w:tc>
           <w:tcPr>
-            <w:tcW w:type="dxa" w:w="1080"/>
+            <w:tcW w:type="dxa" w:w="960"/>
             <w:tcBorders/>
           </w:tcPr>
           <w:p>
@@ -20183,7 +20291,7 @@
         </w:tc>
         <w:tc>
           <w:tcPr>
-            <w:tcW w:type="dxa" w:w="1080"/>
+            <w:tcW w:type="dxa" w:w="960"/>
             <w:tcBorders/>
           </w:tcPr>
           <w:p>
@@ -20198,7 +20306,7 @@
         </w:tc>
         <w:tc>
           <w:tcPr>
-            <w:tcW w:type="dxa" w:w="1080"/>
+            <w:tcW w:type="dxa" w:w="960"/>
             <w:tcBorders/>
           </w:tcPr>
           <w:p>
@@ -20213,7 +20321,7 @@
         </w:tc>
         <w:tc>
           <w:tcPr>
-            <w:tcW w:type="dxa" w:w="1080"/>
+            <w:tcW w:type="dxa" w:w="960"/>
             <w:tcBorders/>
           </w:tcPr>
           <w:p>
@@ -20228,7 +20336,7 @@
         </w:tc>
         <w:tc>
           <w:tcPr>
-            <w:tcW w:type="dxa" w:w="1080"/>
+            <w:tcW w:type="dxa" w:w="960"/>
             <w:tcBorders/>
           </w:tcPr>
           <w:p>
@@ -20243,7 +20351,7 @@
         </w:tc>
         <w:tc>
           <w:tcPr>
-            <w:tcW w:type="dxa" w:w="1080"/>
+            <w:tcW w:type="dxa" w:w="960"/>
             <w:tcBorders/>
           </w:tcPr>
           <w:p>
@@ -20253,6 +20361,21 @@
                 <w:b w:val="0"/>
               </w:rPr>
               <w:t>P=0.050</w:t>
+            </w:r>
+          </w:p>
+        </w:tc>
+        <w:tc>
+          <w:tcPr>
+            <w:tcW w:type="dxa" w:w="960"/>
+            <w:tcBorders/>
+          </w:tcPr>
+          <w:p>
+            <w:r/>
+            <w:r>
+              <w:rPr>
+                <w:b w:val="0"/>
+              </w:rPr>
+              <w:t>q=0.071</w:t>
             </w:r>
           </w:p>
         </w:tc>
@@ -20260,16 +20383,16 @@
       <w:tr>
         <w:tc>
           <w:tcPr>
-            <w:tcW w:type="dxa" w:w="1080"/>
-            <w:tcBorders/>
-          </w:tcPr>
-          <w:p>
-            <w:r/>
-          </w:p>
-        </w:tc>
-        <w:tc>
-          <w:tcPr>
-            <w:tcW w:type="dxa" w:w="1080"/>
+            <w:tcW w:type="dxa" w:w="960"/>
+            <w:tcBorders/>
+          </w:tcPr>
+          <w:p>
+            <w:r/>
+          </w:p>
+        </w:tc>
+        <w:tc>
+          <w:tcPr>
+            <w:tcW w:type="dxa" w:w="960"/>
             <w:tcBorders/>
           </w:tcPr>
           <w:p>
@@ -20284,7 +20407,7 @@
         </w:tc>
         <w:tc>
           <w:tcPr>
-            <w:tcW w:type="dxa" w:w="1080"/>
+            <w:tcW w:type="dxa" w:w="960"/>
             <w:tcBorders/>
           </w:tcPr>
           <w:p>
@@ -20299,7 +20422,7 @@
         </w:tc>
         <w:tc>
           <w:tcPr>
-            <w:tcW w:type="dxa" w:w="1080"/>
+            <w:tcW w:type="dxa" w:w="960"/>
             <w:tcBorders/>
           </w:tcPr>
           <w:p>
@@ -20314,7 +20437,7 @@
         </w:tc>
         <w:tc>
           <w:tcPr>
-            <w:tcW w:type="dxa" w:w="1080"/>
+            <w:tcW w:type="dxa" w:w="960"/>
             <w:tcBorders/>
           </w:tcPr>
           <w:p>
@@ -20329,7 +20452,7 @@
         </w:tc>
         <w:tc>
           <w:tcPr>
-            <w:tcW w:type="dxa" w:w="1080"/>
+            <w:tcW w:type="dxa" w:w="960"/>
             <w:tcBorders/>
           </w:tcPr>
           <w:p>
@@ -20344,7 +20467,7 @@
         </w:tc>
         <w:tc>
           <w:tcPr>
-            <w:tcW w:type="dxa" w:w="1080"/>
+            <w:tcW w:type="dxa" w:w="960"/>
             <w:tcBorders/>
           </w:tcPr>
           <w:p>
@@ -20359,7 +20482,7 @@
         </w:tc>
         <w:tc>
           <w:tcPr>
-            <w:tcW w:type="dxa" w:w="1080"/>
+            <w:tcW w:type="dxa" w:w="960"/>
             <w:tcBorders/>
           </w:tcPr>
           <w:p>
@@ -20369,6 +20492,21 @@
                 <w:b w:val="0"/>
               </w:rPr>
               <w:t>P=0.022</w:t>
+            </w:r>
+          </w:p>
+        </w:tc>
+        <w:tc>
+          <w:tcPr>
+            <w:tcW w:type="dxa" w:w="960"/>
+            <w:tcBorders/>
+          </w:tcPr>
+          <w:p>
+            <w:r/>
+            <w:r>
+              <w:rPr>
+                <w:b w:val="0"/>
+              </w:rPr>
+              <w:t>q=0.033</w:t>
             </w:r>
           </w:p>
         </w:tc>
@@ -20376,16 +20514,16 @@
       <w:tr>
         <w:tc>
           <w:tcPr>
-            <w:tcW w:type="dxa" w:w="1080"/>
-            <w:tcBorders/>
-          </w:tcPr>
-          <w:p>
-            <w:r/>
-          </w:p>
-        </w:tc>
-        <w:tc>
-          <w:tcPr>
-            <w:tcW w:type="dxa" w:w="1080"/>
+            <w:tcW w:type="dxa" w:w="960"/>
+            <w:tcBorders/>
+          </w:tcPr>
+          <w:p>
+            <w:r/>
+          </w:p>
+        </w:tc>
+        <w:tc>
+          <w:tcPr>
+            <w:tcW w:type="dxa" w:w="960"/>
             <w:tcBorders/>
           </w:tcPr>
           <w:p>
@@ -20400,7 +20538,7 @@
         </w:tc>
         <w:tc>
           <w:tcPr>
-            <w:tcW w:type="dxa" w:w="1080"/>
+            <w:tcW w:type="dxa" w:w="960"/>
             <w:tcBorders/>
           </w:tcPr>
           <w:p>
@@ -20415,7 +20553,7 @@
         </w:tc>
         <w:tc>
           <w:tcPr>
-            <w:tcW w:type="dxa" w:w="1080"/>
+            <w:tcW w:type="dxa" w:w="960"/>
             <w:tcBorders/>
           </w:tcPr>
           <w:p>
@@ -20430,7 +20568,7 @@
         </w:tc>
         <w:tc>
           <w:tcPr>
-            <w:tcW w:type="dxa" w:w="1080"/>
+            <w:tcW w:type="dxa" w:w="960"/>
             <w:tcBorders/>
           </w:tcPr>
           <w:p>
@@ -20445,7 +20583,7 @@
         </w:tc>
         <w:tc>
           <w:tcPr>
-            <w:tcW w:type="dxa" w:w="1080"/>
+            <w:tcW w:type="dxa" w:w="960"/>
             <w:tcBorders/>
           </w:tcPr>
           <w:p>
@@ -20460,7 +20598,7 @@
         </w:tc>
         <w:tc>
           <w:tcPr>
-            <w:tcW w:type="dxa" w:w="1080"/>
+            <w:tcW w:type="dxa" w:w="960"/>
             <w:tcBorders/>
           </w:tcPr>
           <w:p>
@@ -20475,7 +20613,7 @@
         </w:tc>
         <w:tc>
           <w:tcPr>
-            <w:tcW w:type="dxa" w:w="1080"/>
+            <w:tcW w:type="dxa" w:w="960"/>
             <w:tcBorders/>
           </w:tcPr>
           <w:p>
@@ -20485,6 +20623,21 @@
                 <w:b w:val="0"/>
               </w:rPr>
               <w:t>P=0.077</w:t>
+            </w:r>
+          </w:p>
+        </w:tc>
+        <w:tc>
+          <w:tcPr>
+            <w:tcW w:type="dxa" w:w="960"/>
+            <w:tcBorders/>
+          </w:tcPr>
+          <w:p>
+            <w:r/>
+            <w:r>
+              <w:rPr>
+                <w:b w:val="0"/>
+              </w:rPr>
+              <w:t>q=0.093</w:t>
             </w:r>
           </w:p>
         </w:tc>
@@ -20492,16 +20645,16 @@
       <w:tr>
         <w:tc>
           <w:tcPr>
-            <w:tcW w:type="dxa" w:w="1080"/>
-            <w:tcBorders/>
-          </w:tcPr>
-          <w:p>
-            <w:r/>
-          </w:p>
-        </w:tc>
-        <w:tc>
-          <w:tcPr>
-            <w:tcW w:type="dxa" w:w="1080"/>
+            <w:tcW w:type="dxa" w:w="960"/>
+            <w:tcBorders/>
+          </w:tcPr>
+          <w:p>
+            <w:r/>
+          </w:p>
+        </w:tc>
+        <w:tc>
+          <w:tcPr>
+            <w:tcW w:type="dxa" w:w="960"/>
             <w:tcBorders/>
           </w:tcPr>
           <w:p>
@@ -20516,7 +20669,7 @@
         </w:tc>
         <w:tc>
           <w:tcPr>
-            <w:tcW w:type="dxa" w:w="1080"/>
+            <w:tcW w:type="dxa" w:w="960"/>
             <w:tcBorders/>
           </w:tcPr>
           <w:p>
@@ -20531,7 +20684,7 @@
         </w:tc>
         <w:tc>
           <w:tcPr>
-            <w:tcW w:type="dxa" w:w="1080"/>
+            <w:tcW w:type="dxa" w:w="960"/>
             <w:tcBorders/>
           </w:tcPr>
           <w:p>
@@ -20546,7 +20699,7 @@
         </w:tc>
         <w:tc>
           <w:tcPr>
-            <w:tcW w:type="dxa" w:w="1080"/>
+            <w:tcW w:type="dxa" w:w="960"/>
             <w:tcBorders/>
           </w:tcPr>
           <w:p>
@@ -20561,7 +20714,7 @@
         </w:tc>
         <w:tc>
           <w:tcPr>
-            <w:tcW w:type="dxa" w:w="1080"/>
+            <w:tcW w:type="dxa" w:w="960"/>
             <w:tcBorders/>
           </w:tcPr>
           <w:p>
@@ -20576,7 +20729,7 @@
         </w:tc>
         <w:tc>
           <w:tcPr>
-            <w:tcW w:type="dxa" w:w="1080"/>
+            <w:tcW w:type="dxa" w:w="960"/>
             <w:tcBorders/>
           </w:tcPr>
           <w:p>
@@ -20591,7 +20744,7 @@
         </w:tc>
         <w:tc>
           <w:tcPr>
-            <w:tcW w:type="dxa" w:w="1080"/>
+            <w:tcW w:type="dxa" w:w="960"/>
             <w:tcBorders/>
           </w:tcPr>
           <w:p>
@@ -20601,6 +20754,21 @@
                 <w:b w:val="0"/>
               </w:rPr>
               <w:t>P=0.073</w:t>
+            </w:r>
+          </w:p>
+        </w:tc>
+        <w:tc>
+          <w:tcPr>
+            <w:tcW w:type="dxa" w:w="960"/>
+            <w:tcBorders/>
+          </w:tcPr>
+          <w:p>
+            <w:r/>
+            <w:r>
+              <w:rPr>
+                <w:b w:val="0"/>
+              </w:rPr>
+              <w:t>q=0.093</w:t>
             </w:r>
           </w:p>
         </w:tc>
@@ -20608,16 +20776,16 @@
       <w:tr>
         <w:tc>
           <w:tcPr>
-            <w:tcW w:type="dxa" w:w="1080"/>
-            <w:tcBorders/>
-          </w:tcPr>
-          <w:p>
-            <w:r/>
-          </w:p>
-        </w:tc>
-        <w:tc>
-          <w:tcPr>
-            <w:tcW w:type="dxa" w:w="1080"/>
+            <w:tcW w:type="dxa" w:w="960"/>
+            <w:tcBorders/>
+          </w:tcPr>
+          <w:p>
+            <w:r/>
+          </w:p>
+        </w:tc>
+        <w:tc>
+          <w:tcPr>
+            <w:tcW w:type="dxa" w:w="960"/>
             <w:tcBorders/>
           </w:tcPr>
           <w:p>
@@ -20632,7 +20800,7 @@
         </w:tc>
         <w:tc>
           <w:tcPr>
-            <w:tcW w:type="dxa" w:w="1080"/>
+            <w:tcW w:type="dxa" w:w="960"/>
             <w:tcBorders/>
           </w:tcPr>
           <w:p>
@@ -20647,7 +20815,7 @@
         </w:tc>
         <w:tc>
           <w:tcPr>
-            <w:tcW w:type="dxa" w:w="1080"/>
+            <w:tcW w:type="dxa" w:w="960"/>
             <w:tcBorders/>
           </w:tcPr>
           <w:p>
@@ -20662,7 +20830,7 @@
         </w:tc>
         <w:tc>
           <w:tcPr>
-            <w:tcW w:type="dxa" w:w="1080"/>
+            <w:tcW w:type="dxa" w:w="960"/>
             <w:tcBorders/>
           </w:tcPr>
           <w:p>
@@ -20677,7 +20845,7 @@
         </w:tc>
         <w:tc>
           <w:tcPr>
-            <w:tcW w:type="dxa" w:w="1080"/>
+            <w:tcW w:type="dxa" w:w="960"/>
             <w:tcBorders/>
           </w:tcPr>
           <w:p>
@@ -20692,7 +20860,7 @@
         </w:tc>
         <w:tc>
           <w:tcPr>
-            <w:tcW w:type="dxa" w:w="1080"/>
+            <w:tcW w:type="dxa" w:w="960"/>
             <w:tcBorders/>
           </w:tcPr>
           <w:p>
@@ -20707,7 +20875,7 @@
         </w:tc>
         <w:tc>
           <w:tcPr>
-            <w:tcW w:type="dxa" w:w="1080"/>
+            <w:tcW w:type="dxa" w:w="960"/>
             <w:tcBorders/>
           </w:tcPr>
           <w:p>
@@ -20717,6 +20885,21 @@
                 <w:b w:val="0"/>
               </w:rPr>
               <w:t>P=0.235</w:t>
+            </w:r>
+          </w:p>
+        </w:tc>
+        <w:tc>
+          <w:tcPr>
+            <w:tcW w:type="dxa" w:w="960"/>
+            <w:tcBorders/>
+          </w:tcPr>
+          <w:p>
+            <w:r/>
+            <w:r>
+              <w:rPr>
+                <w:b w:val="0"/>
+              </w:rPr>
+              <w:t>q=0.251</w:t>
             </w:r>
           </w:p>
         </w:tc>
@@ -20724,16 +20907,16 @@
       <w:tr>
         <w:tc>
           <w:tcPr>
-            <w:tcW w:type="dxa" w:w="1080"/>
-            <w:tcBorders/>
-          </w:tcPr>
-          <w:p>
-            <w:r/>
-          </w:p>
-        </w:tc>
-        <w:tc>
-          <w:tcPr>
-            <w:tcW w:type="dxa" w:w="1080"/>
+            <w:tcW w:type="dxa" w:w="960"/>
+            <w:tcBorders/>
+          </w:tcPr>
+          <w:p>
+            <w:r/>
+          </w:p>
+        </w:tc>
+        <w:tc>
+          <w:tcPr>
+            <w:tcW w:type="dxa" w:w="960"/>
             <w:tcBorders/>
           </w:tcPr>
           <w:p>
@@ -20748,7 +20931,7 @@
         </w:tc>
         <w:tc>
           <w:tcPr>
-            <w:tcW w:type="dxa" w:w="1080"/>
+            <w:tcW w:type="dxa" w:w="960"/>
             <w:tcBorders/>
           </w:tcPr>
           <w:p>
@@ -20763,7 +20946,7 @@
         </w:tc>
         <w:tc>
           <w:tcPr>
-            <w:tcW w:type="dxa" w:w="1080"/>
+            <w:tcW w:type="dxa" w:w="960"/>
             <w:tcBorders/>
           </w:tcPr>
           <w:p>
@@ -20778,7 +20961,7 @@
         </w:tc>
         <w:tc>
           <w:tcPr>
-            <w:tcW w:type="dxa" w:w="1080"/>
+            <w:tcW w:type="dxa" w:w="960"/>
             <w:tcBorders/>
           </w:tcPr>
           <w:p>
@@ -20793,7 +20976,7 @@
         </w:tc>
         <w:tc>
           <w:tcPr>
-            <w:tcW w:type="dxa" w:w="1080"/>
+            <w:tcW w:type="dxa" w:w="960"/>
             <w:tcBorders/>
           </w:tcPr>
           <w:p>
@@ -20808,7 +20991,7 @@
         </w:tc>
         <w:tc>
           <w:tcPr>
-            <w:tcW w:type="dxa" w:w="1080"/>
+            <w:tcW w:type="dxa" w:w="960"/>
             <w:tcBorders/>
           </w:tcPr>
           <w:p>
@@ -20823,7 +21006,7 @@
         </w:tc>
         <w:tc>
           <w:tcPr>
-            <w:tcW w:type="dxa" w:w="1080"/>
+            <w:tcW w:type="dxa" w:w="960"/>
             <w:tcBorders/>
           </w:tcPr>
           <w:p>
@@ -20833,6 +21016,21 @@
                 <w:b w:val="0"/>
               </w:rPr>
               <w:t>P=0.251</w:t>
+            </w:r>
+          </w:p>
+        </w:tc>
+        <w:tc>
+          <w:tcPr>
+            <w:tcW w:type="dxa" w:w="960"/>
+            <w:tcBorders/>
+          </w:tcPr>
+          <w:p>
+            <w:r/>
+            <w:r>
+              <w:rPr>
+                <w:b w:val="0"/>
+              </w:rPr>
+              <w:t>q=0.251</w:t>
             </w:r>
           </w:p>
         </w:tc>
@@ -20840,16 +21038,16 @@
       <w:tr>
         <w:tc>
           <w:tcPr>
-            <w:tcW w:type="dxa" w:w="1080"/>
-            <w:tcBorders/>
-          </w:tcPr>
-          <w:p>
-            <w:r/>
-          </w:p>
-        </w:tc>
-        <w:tc>
-          <w:tcPr>
-            <w:tcW w:type="dxa" w:w="1080"/>
+            <w:tcW w:type="dxa" w:w="960"/>
+            <w:tcBorders/>
+          </w:tcPr>
+          <w:p>
+            <w:r/>
+          </w:p>
+        </w:tc>
+        <w:tc>
+          <w:tcPr>
+            <w:tcW w:type="dxa" w:w="960"/>
             <w:tcBorders/>
           </w:tcPr>
           <w:p>
@@ -20864,7 +21062,7 @@
         </w:tc>
         <w:tc>
           <w:tcPr>
-            <w:tcW w:type="dxa" w:w="1080"/>
+            <w:tcW w:type="dxa" w:w="960"/>
             <w:tcBorders/>
           </w:tcPr>
           <w:p>
@@ -20879,7 +21077,7 @@
         </w:tc>
         <w:tc>
           <w:tcPr>
-            <w:tcW w:type="dxa" w:w="1080"/>
+            <w:tcW w:type="dxa" w:w="960"/>
             <w:tcBorders/>
           </w:tcPr>
           <w:p>
@@ -20894,7 +21092,7 @@
         </w:tc>
         <w:tc>
           <w:tcPr>
-            <w:tcW w:type="dxa" w:w="1080"/>
+            <w:tcW w:type="dxa" w:w="960"/>
             <w:tcBorders/>
           </w:tcPr>
           <w:p>
@@ -20909,7 +21107,7 @@
         </w:tc>
         <w:tc>
           <w:tcPr>
-            <w:tcW w:type="dxa" w:w="1080"/>
+            <w:tcW w:type="dxa" w:w="960"/>
             <w:tcBorders/>
           </w:tcPr>
           <w:p>
@@ -20924,7 +21122,7 @@
         </w:tc>
         <w:tc>
           <w:tcPr>
-            <w:tcW w:type="dxa" w:w="1080"/>
+            <w:tcW w:type="dxa" w:w="960"/>
             <w:tcBorders/>
           </w:tcPr>
           <w:p>
@@ -20939,7 +21137,7 @@
         </w:tc>
         <w:tc>
           <w:tcPr>
-            <w:tcW w:type="dxa" w:w="1080"/>
+            <w:tcW w:type="dxa" w:w="960"/>
             <w:tcBorders/>
           </w:tcPr>
           <w:p>
@@ -20949,6 +21147,21 @@
                 <w:b w:val="0"/>
               </w:rPr>
               <w:t>P=0.242</w:t>
+            </w:r>
+          </w:p>
+        </w:tc>
+        <w:tc>
+          <w:tcPr>
+            <w:tcW w:type="dxa" w:w="960"/>
+            <w:tcBorders/>
+          </w:tcPr>
+          <w:p>
+            <w:r/>
+            <w:r>
+              <w:rPr>
+                <w:b w:val="0"/>
+              </w:rPr>
+              <w:t>q=0.251</w:t>
             </w:r>
           </w:p>
         </w:tc>
@@ -20956,7 +21169,7 @@
       <w:tr>
         <w:tc>
           <w:tcPr>
-            <w:tcW w:type="dxa" w:w="1080"/>
+            <w:tcW w:type="dxa" w:w="960"/>
             <w:tcBorders/>
           </w:tcPr>
           <w:p>
@@ -20971,61 +21184,70 @@
         </w:tc>
         <w:tc>
           <w:tcPr>
-            <w:tcW w:type="dxa" w:w="1080"/>
-            <w:tcBorders/>
-          </w:tcPr>
-          <w:p>
-            <w:r/>
-          </w:p>
-        </w:tc>
-        <w:tc>
-          <w:tcPr>
-            <w:tcW w:type="dxa" w:w="1080"/>
-            <w:tcBorders/>
-          </w:tcPr>
-          <w:p>
-            <w:r/>
-          </w:p>
-        </w:tc>
-        <w:tc>
-          <w:tcPr>
-            <w:tcW w:type="dxa" w:w="1080"/>
-            <w:tcBorders/>
-          </w:tcPr>
-          <w:p>
-            <w:r/>
-          </w:p>
-        </w:tc>
-        <w:tc>
-          <w:tcPr>
-            <w:tcW w:type="dxa" w:w="1080"/>
-            <w:tcBorders/>
-          </w:tcPr>
-          <w:p>
-            <w:r/>
-          </w:p>
-        </w:tc>
-        <w:tc>
-          <w:tcPr>
-            <w:tcW w:type="dxa" w:w="1080"/>
-            <w:tcBorders/>
-          </w:tcPr>
-          <w:p>
-            <w:r/>
-          </w:p>
-        </w:tc>
-        <w:tc>
-          <w:tcPr>
-            <w:tcW w:type="dxa" w:w="1080"/>
-            <w:tcBorders/>
-          </w:tcPr>
-          <w:p>
-            <w:r/>
-          </w:p>
-        </w:tc>
-        <w:tc>
-          <w:tcPr>
-            <w:tcW w:type="dxa" w:w="1080"/>
+            <w:tcW w:type="dxa" w:w="960"/>
+            <w:tcBorders/>
+          </w:tcPr>
+          <w:p>
+            <w:r/>
+          </w:p>
+        </w:tc>
+        <w:tc>
+          <w:tcPr>
+            <w:tcW w:type="dxa" w:w="960"/>
+            <w:tcBorders/>
+          </w:tcPr>
+          <w:p>
+            <w:r/>
+          </w:p>
+        </w:tc>
+        <w:tc>
+          <w:tcPr>
+            <w:tcW w:type="dxa" w:w="960"/>
+            <w:tcBorders/>
+          </w:tcPr>
+          <w:p>
+            <w:r/>
+          </w:p>
+        </w:tc>
+        <w:tc>
+          <w:tcPr>
+            <w:tcW w:type="dxa" w:w="960"/>
+            <w:tcBorders/>
+          </w:tcPr>
+          <w:p>
+            <w:r/>
+          </w:p>
+        </w:tc>
+        <w:tc>
+          <w:tcPr>
+            <w:tcW w:type="dxa" w:w="960"/>
+            <w:tcBorders/>
+          </w:tcPr>
+          <w:p>
+            <w:r/>
+          </w:p>
+        </w:tc>
+        <w:tc>
+          <w:tcPr>
+            <w:tcW w:type="dxa" w:w="960"/>
+            <w:tcBorders/>
+          </w:tcPr>
+          <w:p>
+            <w:r/>
+          </w:p>
+        </w:tc>
+        <w:tc>
+          <w:tcPr>
+            <w:tcW w:type="dxa" w:w="960"/>
+            <w:tcBorders/>
+          </w:tcPr>
+          <w:p>
+            <w:r/>
+          </w:p>
+        </w:tc>
+        <w:tc>
+          <w:tcPr>
+            <w:tcW w:type="dxa" w:w="960"/>
             <w:tcBorders/>
           </w:tcPr>
           <w:p>
@@ -21036,16 +21258,16 @@
       <w:tr>
         <w:tc>
           <w:tcPr>
-            <w:tcW w:type="dxa" w:w="1080"/>
-            <w:tcBorders/>
-          </w:tcPr>
-          <w:p>
-            <w:r/>
-          </w:p>
-        </w:tc>
-        <w:tc>
-          <w:tcPr>
-            <w:tcW w:type="dxa" w:w="1080"/>
+            <w:tcW w:type="dxa" w:w="960"/>
+            <w:tcBorders/>
+          </w:tcPr>
+          <w:p>
+            <w:r/>
+          </w:p>
+        </w:tc>
+        <w:tc>
+          <w:tcPr>
+            <w:tcW w:type="dxa" w:w="960"/>
             <w:tcBorders/>
           </w:tcPr>
           <w:p>
@@ -21060,7 +21282,7 @@
         </w:tc>
         <w:tc>
           <w:tcPr>
-            <w:tcW w:type="dxa" w:w="1080"/>
+            <w:tcW w:type="dxa" w:w="960"/>
             <w:tcBorders/>
           </w:tcPr>
           <w:p>
@@ -21075,7 +21297,7 @@
         </w:tc>
         <w:tc>
           <w:tcPr>
-            <w:tcW w:type="dxa" w:w="1080"/>
+            <w:tcW w:type="dxa" w:w="960"/>
             <w:tcBorders/>
           </w:tcPr>
           <w:p>
@@ -21090,7 +21312,7 @@
         </w:tc>
         <w:tc>
           <w:tcPr>
-            <w:tcW w:type="dxa" w:w="1080"/>
+            <w:tcW w:type="dxa" w:w="960"/>
             <w:tcBorders/>
           </w:tcPr>
           <w:p>
@@ -21105,7 +21327,7 @@
         </w:tc>
         <w:tc>
           <w:tcPr>
-            <w:tcW w:type="dxa" w:w="1080"/>
+            <w:tcW w:type="dxa" w:w="960"/>
             <w:tcBorders/>
           </w:tcPr>
           <w:p>
@@ -21120,7 +21342,7 @@
         </w:tc>
         <w:tc>
           <w:tcPr>
-            <w:tcW w:type="dxa" w:w="1080"/>
+            <w:tcW w:type="dxa" w:w="960"/>
             <w:tcBorders/>
           </w:tcPr>
           <w:p>
@@ -21135,7 +21357,7 @@
         </w:tc>
         <w:tc>
           <w:tcPr>
-            <w:tcW w:type="dxa" w:w="1080"/>
+            <w:tcW w:type="dxa" w:w="960"/>
             <w:tcBorders/>
           </w:tcPr>
           <w:p>
@@ -21145,6 +21367,21 @@
                 <w:b w:val="0"/>
               </w:rPr>
               <w:t>P=0.004</w:t>
+            </w:r>
+          </w:p>
+        </w:tc>
+        <w:tc>
+          <w:tcPr>
+            <w:tcW w:type="dxa" w:w="960"/>
+            <w:tcBorders/>
+          </w:tcPr>
+          <w:p>
+            <w:r/>
+            <w:r>
+              <w:rPr>
+                <w:b w:val="0"/>
+              </w:rPr>
+              <w:t>q=0.075</w:t>
             </w:r>
           </w:p>
         </w:tc>
@@ -21152,16 +21389,16 @@
       <w:tr>
         <w:tc>
           <w:tcPr>
-            <w:tcW w:type="dxa" w:w="1080"/>
-            <w:tcBorders/>
-          </w:tcPr>
-          <w:p>
-            <w:r/>
-          </w:p>
-        </w:tc>
-        <w:tc>
-          <w:tcPr>
-            <w:tcW w:type="dxa" w:w="1080"/>
+            <w:tcW w:type="dxa" w:w="960"/>
+            <w:tcBorders/>
+          </w:tcPr>
+          <w:p>
+            <w:r/>
+          </w:p>
+        </w:tc>
+        <w:tc>
+          <w:tcPr>
+            <w:tcW w:type="dxa" w:w="960"/>
             <w:tcBorders/>
           </w:tcPr>
           <w:p>
@@ -21176,7 +21413,7 @@
         </w:tc>
         <w:tc>
           <w:tcPr>
-            <w:tcW w:type="dxa" w:w="1080"/>
+            <w:tcW w:type="dxa" w:w="960"/>
             <w:tcBorders/>
           </w:tcPr>
           <w:p>
@@ -21191,7 +21428,7 @@
         </w:tc>
         <w:tc>
           <w:tcPr>
-            <w:tcW w:type="dxa" w:w="1080"/>
+            <w:tcW w:type="dxa" w:w="960"/>
             <w:tcBorders/>
           </w:tcPr>
           <w:p>
@@ -21206,7 +21443,7 @@
         </w:tc>
         <w:tc>
           <w:tcPr>
-            <w:tcW w:type="dxa" w:w="1080"/>
+            <w:tcW w:type="dxa" w:w="960"/>
             <w:tcBorders/>
           </w:tcPr>
           <w:p>
@@ -21221,7 +21458,7 @@
         </w:tc>
         <w:tc>
           <w:tcPr>
-            <w:tcW w:type="dxa" w:w="1080"/>
+            <w:tcW w:type="dxa" w:w="960"/>
             <w:tcBorders/>
           </w:tcPr>
           <w:p>
@@ -21236,7 +21473,7 @@
         </w:tc>
         <w:tc>
           <w:tcPr>
-            <w:tcW w:type="dxa" w:w="1080"/>
+            <w:tcW w:type="dxa" w:w="960"/>
             <w:tcBorders/>
           </w:tcPr>
           <w:p>
@@ -21251,7 +21488,7 @@
         </w:tc>
         <w:tc>
           <w:tcPr>
-            <w:tcW w:type="dxa" w:w="1080"/>
+            <w:tcW w:type="dxa" w:w="960"/>
             <w:tcBorders/>
           </w:tcPr>
           <w:p>
@@ -21261,6 +21498,21 @@
                 <w:b w:val="0"/>
               </w:rPr>
               <w:t>P=0.027</w:t>
+            </w:r>
+          </w:p>
+        </w:tc>
+        <w:tc>
+          <w:tcPr>
+            <w:tcW w:type="dxa" w:w="960"/>
+            <w:tcBorders/>
+          </w:tcPr>
+          <w:p>
+            <w:r/>
+            <w:r>
+              <w:rPr>
+                <w:b w:val="0"/>
+              </w:rPr>
+              <w:t>q=0.226</w:t>
             </w:r>
           </w:p>
         </w:tc>
@@ -21268,16 +21520,16 @@
       <w:tr>
         <w:tc>
           <w:tcPr>
-            <w:tcW w:type="dxa" w:w="1080"/>
-            <w:tcBorders/>
-          </w:tcPr>
-          <w:p>
-            <w:r/>
-          </w:p>
-        </w:tc>
-        <w:tc>
-          <w:tcPr>
-            <w:tcW w:type="dxa" w:w="1080"/>
+            <w:tcW w:type="dxa" w:w="960"/>
+            <w:tcBorders/>
+          </w:tcPr>
+          <w:p>
+            <w:r/>
+          </w:p>
+        </w:tc>
+        <w:tc>
+          <w:tcPr>
+            <w:tcW w:type="dxa" w:w="960"/>
             <w:tcBorders/>
           </w:tcPr>
           <w:p>
@@ -21292,7 +21544,7 @@
         </w:tc>
         <w:tc>
           <w:tcPr>
-            <w:tcW w:type="dxa" w:w="1080"/>
+            <w:tcW w:type="dxa" w:w="960"/>
             <w:tcBorders/>
           </w:tcPr>
           <w:p>
@@ -21307,7 +21559,7 @@
         </w:tc>
         <w:tc>
           <w:tcPr>
-            <w:tcW w:type="dxa" w:w="1080"/>
+            <w:tcW w:type="dxa" w:w="960"/>
             <w:tcBorders/>
           </w:tcPr>
           <w:p>
@@ -21322,7 +21574,7 @@
         </w:tc>
         <w:tc>
           <w:tcPr>
-            <w:tcW w:type="dxa" w:w="1080"/>
+            <w:tcW w:type="dxa" w:w="960"/>
             <w:tcBorders/>
           </w:tcPr>
           <w:p>
@@ -21337,7 +21589,7 @@
         </w:tc>
         <w:tc>
           <w:tcPr>
-            <w:tcW w:type="dxa" w:w="1080"/>
+            <w:tcW w:type="dxa" w:w="960"/>
             <w:tcBorders/>
           </w:tcPr>
           <w:p>
@@ -21352,7 +21604,7 @@
         </w:tc>
         <w:tc>
           <w:tcPr>
-            <w:tcW w:type="dxa" w:w="1080"/>
+            <w:tcW w:type="dxa" w:w="960"/>
             <w:tcBorders/>
           </w:tcPr>
           <w:p>
@@ -21367,7 +21619,7 @@
         </w:tc>
         <w:tc>
           <w:tcPr>
-            <w:tcW w:type="dxa" w:w="1080"/>
+            <w:tcW w:type="dxa" w:w="960"/>
             <w:tcBorders/>
           </w:tcPr>
           <w:p>
@@ -21377,6 +21629,21 @@
                 <w:b w:val="0"/>
               </w:rPr>
               <w:t>P=0.099</w:t>
+            </w:r>
+          </w:p>
+        </w:tc>
+        <w:tc>
+          <w:tcPr>
+            <w:tcW w:type="dxa" w:w="960"/>
+            <w:tcBorders/>
+          </w:tcPr>
+          <w:p>
+            <w:r/>
+            <w:r>
+              <w:rPr>
+                <w:b w:val="0"/>
+              </w:rPr>
+              <w:t>q=0.376</w:t>
             </w:r>
           </w:p>
         </w:tc>
@@ -21384,16 +21651,16 @@
       <w:tr>
         <w:tc>
           <w:tcPr>
-            <w:tcW w:type="dxa" w:w="1080"/>
-            <w:tcBorders/>
-          </w:tcPr>
-          <w:p>
-            <w:r/>
-          </w:p>
-        </w:tc>
-        <w:tc>
-          <w:tcPr>
-            <w:tcW w:type="dxa" w:w="1080"/>
+            <w:tcW w:type="dxa" w:w="960"/>
+            <w:tcBorders/>
+          </w:tcPr>
+          <w:p>
+            <w:r/>
+          </w:p>
+        </w:tc>
+        <w:tc>
+          <w:tcPr>
+            <w:tcW w:type="dxa" w:w="960"/>
             <w:tcBorders/>
           </w:tcPr>
           <w:p>
@@ -21408,7 +21675,7 @@
         </w:tc>
         <w:tc>
           <w:tcPr>
-            <w:tcW w:type="dxa" w:w="1080"/>
+            <w:tcW w:type="dxa" w:w="960"/>
             <w:tcBorders/>
           </w:tcPr>
           <w:p>
@@ -21423,7 +21690,7 @@
         </w:tc>
         <w:tc>
           <w:tcPr>
-            <w:tcW w:type="dxa" w:w="1080"/>
+            <w:tcW w:type="dxa" w:w="960"/>
             <w:tcBorders/>
           </w:tcPr>
           <w:p>
@@ -21438,7 +21705,7 @@
         </w:tc>
         <w:tc>
           <w:tcPr>
-            <w:tcW w:type="dxa" w:w="1080"/>
+            <w:tcW w:type="dxa" w:w="960"/>
             <w:tcBorders/>
           </w:tcPr>
           <w:p>
@@ -21453,7 +21720,7 @@
         </w:tc>
         <w:tc>
           <w:tcPr>
-            <w:tcW w:type="dxa" w:w="1080"/>
+            <w:tcW w:type="dxa" w:w="960"/>
             <w:tcBorders/>
           </w:tcPr>
           <w:p>
@@ -21468,7 +21735,7 @@
         </w:tc>
         <w:tc>
           <w:tcPr>
-            <w:tcW w:type="dxa" w:w="1080"/>
+            <w:tcW w:type="dxa" w:w="960"/>
             <w:tcBorders/>
           </w:tcPr>
           <w:p>
@@ -21483,7 +21750,7 @@
         </w:tc>
         <w:tc>
           <w:tcPr>
-            <w:tcW w:type="dxa" w:w="1080"/>
+            <w:tcW w:type="dxa" w:w="960"/>
             <w:tcBorders/>
           </w:tcPr>
           <w:p>
@@ -21493,6 +21760,21 @@
                 <w:b w:val="0"/>
               </w:rPr>
               <w:t>P=0.320</w:t>
+            </w:r>
+          </w:p>
+        </w:tc>
+        <w:tc>
+          <w:tcPr>
+            <w:tcW w:type="dxa" w:w="960"/>
+            <w:tcBorders/>
+          </w:tcPr>
+          <w:p>
+            <w:r/>
+            <w:r>
+              <w:rPr>
+                <w:b w:val="0"/>
+              </w:rPr>
+              <w:t>q=0.579</w:t>
             </w:r>
           </w:p>
         </w:tc>
@@ -21500,16 +21782,16 @@
       <w:tr>
         <w:tc>
           <w:tcPr>
-            <w:tcW w:type="dxa" w:w="1080"/>
-            <w:tcBorders/>
-          </w:tcPr>
-          <w:p>
-            <w:r/>
-          </w:p>
-        </w:tc>
-        <w:tc>
-          <w:tcPr>
-            <w:tcW w:type="dxa" w:w="1080"/>
+            <w:tcW w:type="dxa" w:w="960"/>
+            <w:tcBorders/>
+          </w:tcPr>
+          <w:p>
+            <w:r/>
+          </w:p>
+        </w:tc>
+        <w:tc>
+          <w:tcPr>
+            <w:tcW w:type="dxa" w:w="960"/>
             <w:tcBorders/>
           </w:tcPr>
           <w:p>
@@ -21524,7 +21806,7 @@
         </w:tc>
         <w:tc>
           <w:tcPr>
-            <w:tcW w:type="dxa" w:w="1080"/>
+            <w:tcW w:type="dxa" w:w="960"/>
             <w:tcBorders/>
           </w:tcPr>
           <w:p>
@@ -21539,7 +21821,7 @@
         </w:tc>
         <w:tc>
           <w:tcPr>
-            <w:tcW w:type="dxa" w:w="1080"/>
+            <w:tcW w:type="dxa" w:w="960"/>
             <w:tcBorders/>
           </w:tcPr>
           <w:p>
@@ -21554,7 +21836,7 @@
         </w:tc>
         <w:tc>
           <w:tcPr>
-            <w:tcW w:type="dxa" w:w="1080"/>
+            <w:tcW w:type="dxa" w:w="960"/>
             <w:tcBorders/>
           </w:tcPr>
           <w:p>
@@ -21569,7 +21851,7 @@
         </w:tc>
         <w:tc>
           <w:tcPr>
-            <w:tcW w:type="dxa" w:w="1080"/>
+            <w:tcW w:type="dxa" w:w="960"/>
             <w:tcBorders/>
           </w:tcPr>
           <w:p>
@@ -21584,7 +21866,7 @@
         </w:tc>
         <w:tc>
           <w:tcPr>
-            <w:tcW w:type="dxa" w:w="1080"/>
+            <w:tcW w:type="dxa" w:w="960"/>
             <w:tcBorders/>
           </w:tcPr>
           <w:p>
@@ -21599,7 +21881,7 @@
         </w:tc>
         <w:tc>
           <w:tcPr>
-            <w:tcW w:type="dxa" w:w="1080"/>
+            <w:tcW w:type="dxa" w:w="960"/>
             <w:tcBorders/>
           </w:tcPr>
           <w:p>
@@ -21609,6 +21891,21 @@
                 <w:b w:val="0"/>
               </w:rPr>
               <w:t>P=0.476</w:t>
+            </w:r>
+          </w:p>
+        </w:tc>
+        <w:tc>
+          <w:tcPr>
+            <w:tcW w:type="dxa" w:w="960"/>
+            <w:tcBorders/>
+          </w:tcPr>
+          <w:p>
+            <w:r/>
+            <w:r>
+              <w:rPr>
+                <w:b w:val="0"/>
+              </w:rPr>
+              <w:t>q=0.674</w:t>
             </w:r>
           </w:p>
         </w:tc>
@@ -21616,16 +21913,16 @@
       <w:tr>
         <w:tc>
           <w:tcPr>
-            <w:tcW w:type="dxa" w:w="1080"/>
-            <w:tcBorders/>
-          </w:tcPr>
-          <w:p>
-            <w:r/>
-          </w:p>
-        </w:tc>
-        <w:tc>
-          <w:tcPr>
-            <w:tcW w:type="dxa" w:w="1080"/>
+            <w:tcW w:type="dxa" w:w="960"/>
+            <w:tcBorders/>
+          </w:tcPr>
+          <w:p>
+            <w:r/>
+          </w:p>
+        </w:tc>
+        <w:tc>
+          <w:tcPr>
+            <w:tcW w:type="dxa" w:w="960"/>
             <w:tcBorders/>
           </w:tcPr>
           <w:p>
@@ -21640,7 +21937,7 @@
         </w:tc>
         <w:tc>
           <w:tcPr>
-            <w:tcW w:type="dxa" w:w="1080"/>
+            <w:tcW w:type="dxa" w:w="960"/>
             <w:tcBorders/>
           </w:tcPr>
           <w:p>
@@ -21655,7 +21952,7 @@
         </w:tc>
         <w:tc>
           <w:tcPr>
-            <w:tcW w:type="dxa" w:w="1080"/>
+            <w:tcW w:type="dxa" w:w="960"/>
             <w:tcBorders/>
           </w:tcPr>
           <w:p>
@@ -21670,7 +21967,7 @@
         </w:tc>
         <w:tc>
           <w:tcPr>
-            <w:tcW w:type="dxa" w:w="1080"/>
+            <w:tcW w:type="dxa" w:w="960"/>
             <w:tcBorders/>
           </w:tcPr>
           <w:p>
@@ -21685,7 +21982,7 @@
         </w:tc>
         <w:tc>
           <w:tcPr>
-            <w:tcW w:type="dxa" w:w="1080"/>
+            <w:tcW w:type="dxa" w:w="960"/>
             <w:tcBorders/>
           </w:tcPr>
           <w:p>
@@ -21700,7 +21997,7 @@
         </w:tc>
         <w:tc>
           <w:tcPr>
-            <w:tcW w:type="dxa" w:w="1080"/>
+            <w:tcW w:type="dxa" w:w="960"/>
             <w:tcBorders/>
           </w:tcPr>
           <w:p>
@@ -21715,7 +22012,7 @@
         </w:tc>
         <w:tc>
           <w:tcPr>
-            <w:tcW w:type="dxa" w:w="1080"/>
+            <w:tcW w:type="dxa" w:w="960"/>
             <w:tcBorders/>
           </w:tcPr>
           <w:p>
@@ -21725,6 +22022,21 @@
                 <w:b w:val="0"/>
               </w:rPr>
               <w:t>P=0.080</w:t>
+            </w:r>
+          </w:p>
+        </w:tc>
+        <w:tc>
+          <w:tcPr>
+            <w:tcW w:type="dxa" w:w="960"/>
+            <w:tcBorders/>
+          </w:tcPr>
+          <w:p>
+            <w:r/>
+            <w:r>
+              <w:rPr>
+                <w:b w:val="0"/>
+              </w:rPr>
+              <w:t>q=0.376</w:t>
             </w:r>
           </w:p>
         </w:tc>
@@ -21732,16 +22044,16 @@
       <w:tr>
         <w:tc>
           <w:tcPr>
-            <w:tcW w:type="dxa" w:w="1080"/>
-            <w:tcBorders/>
-          </w:tcPr>
-          <w:p>
-            <w:r/>
-          </w:p>
-        </w:tc>
-        <w:tc>
-          <w:tcPr>
-            <w:tcW w:type="dxa" w:w="1080"/>
+            <w:tcW w:type="dxa" w:w="960"/>
+            <w:tcBorders/>
+          </w:tcPr>
+          <w:p>
+            <w:r/>
+          </w:p>
+        </w:tc>
+        <w:tc>
+          <w:tcPr>
+            <w:tcW w:type="dxa" w:w="960"/>
             <w:tcBorders/>
           </w:tcPr>
           <w:p>
@@ -21756,7 +22068,7 @@
         </w:tc>
         <w:tc>
           <w:tcPr>
-            <w:tcW w:type="dxa" w:w="1080"/>
+            <w:tcW w:type="dxa" w:w="960"/>
             <w:tcBorders/>
           </w:tcPr>
           <w:p>
@@ -21771,7 +22083,7 @@
         </w:tc>
         <w:tc>
           <w:tcPr>
-            <w:tcW w:type="dxa" w:w="1080"/>
+            <w:tcW w:type="dxa" w:w="960"/>
             <w:tcBorders/>
           </w:tcPr>
           <w:p>
@@ -21786,7 +22098,7 @@
         </w:tc>
         <w:tc>
           <w:tcPr>
-            <w:tcW w:type="dxa" w:w="1080"/>
+            <w:tcW w:type="dxa" w:w="960"/>
             <w:tcBorders/>
           </w:tcPr>
           <w:p>
@@ -21801,7 +22113,7 @@
         </w:tc>
         <w:tc>
           <w:tcPr>
-            <w:tcW w:type="dxa" w:w="1080"/>
+            <w:tcW w:type="dxa" w:w="960"/>
             <w:tcBorders/>
           </w:tcPr>
           <w:p>
@@ -21816,7 +22128,7 @@
         </w:tc>
         <w:tc>
           <w:tcPr>
-            <w:tcW w:type="dxa" w:w="1080"/>
+            <w:tcW w:type="dxa" w:w="960"/>
             <w:tcBorders/>
           </w:tcPr>
           <w:p>
@@ -21831,7 +22143,7 @@
         </w:tc>
         <w:tc>
           <w:tcPr>
-            <w:tcW w:type="dxa" w:w="1080"/>
+            <w:tcW w:type="dxa" w:w="960"/>
             <w:tcBorders/>
           </w:tcPr>
           <w:p>
@@ -21841,6 +22153,21 @@
                 <w:b w:val="0"/>
               </w:rPr>
               <w:t>P=0.135</w:t>
+            </w:r>
+          </w:p>
+        </w:tc>
+        <w:tc>
+          <w:tcPr>
+            <w:tcW w:type="dxa" w:w="960"/>
+            <w:tcBorders/>
+          </w:tcPr>
+          <w:p>
+            <w:r/>
+            <w:r>
+              <w:rPr>
+                <w:b w:val="0"/>
+              </w:rPr>
+              <w:t>q=0.383</w:t>
             </w:r>
           </w:p>
         </w:tc>
@@ -21848,16 +22175,16 @@
       <w:tr>
         <w:tc>
           <w:tcPr>
-            <w:tcW w:type="dxa" w:w="1080"/>
-            <w:tcBorders/>
-          </w:tcPr>
-          <w:p>
-            <w:r/>
-          </w:p>
-        </w:tc>
-        <w:tc>
-          <w:tcPr>
-            <w:tcW w:type="dxa" w:w="1080"/>
+            <w:tcW w:type="dxa" w:w="960"/>
+            <w:tcBorders/>
+          </w:tcPr>
+          <w:p>
+            <w:r/>
+          </w:p>
+        </w:tc>
+        <w:tc>
+          <w:tcPr>
+            <w:tcW w:type="dxa" w:w="960"/>
             <w:tcBorders/>
           </w:tcPr>
           <w:p>
@@ -21872,7 +22199,7 @@
         </w:tc>
         <w:tc>
           <w:tcPr>
-            <w:tcW w:type="dxa" w:w="1080"/>
+            <w:tcW w:type="dxa" w:w="960"/>
             <w:tcBorders/>
           </w:tcPr>
           <w:p>
@@ -21887,7 +22214,7 @@
         </w:tc>
         <w:tc>
           <w:tcPr>
-            <w:tcW w:type="dxa" w:w="1080"/>
+            <w:tcW w:type="dxa" w:w="960"/>
             <w:tcBorders/>
           </w:tcPr>
           <w:p>
@@ -21902,7 +22229,7 @@
         </w:tc>
         <w:tc>
           <w:tcPr>
-            <w:tcW w:type="dxa" w:w="1080"/>
+            <w:tcW w:type="dxa" w:w="960"/>
             <w:tcBorders/>
           </w:tcPr>
           <w:p>
@@ -21917,7 +22244,7 @@
         </w:tc>
         <w:tc>
           <w:tcPr>
-            <w:tcW w:type="dxa" w:w="1080"/>
+            <w:tcW w:type="dxa" w:w="960"/>
             <w:tcBorders/>
           </w:tcPr>
           <w:p>
@@ -21932,7 +22259,7 @@
         </w:tc>
         <w:tc>
           <w:tcPr>
-            <w:tcW w:type="dxa" w:w="1080"/>
+            <w:tcW w:type="dxa" w:w="960"/>
             <w:tcBorders/>
           </w:tcPr>
           <w:p>
@@ -21947,7 +22274,7 @@
         </w:tc>
         <w:tc>
           <w:tcPr>
-            <w:tcW w:type="dxa" w:w="1080"/>
+            <w:tcW w:type="dxa" w:w="960"/>
             <w:tcBorders/>
           </w:tcPr>
           <w:p>
@@ -21957,6 +22284,21 @@
                 <w:b w:val="0"/>
               </w:rPr>
               <w:t>P=0.111</w:t>
+            </w:r>
+          </w:p>
+        </w:tc>
+        <w:tc>
+          <w:tcPr>
+            <w:tcW w:type="dxa" w:w="960"/>
+            <w:tcBorders/>
+          </w:tcPr>
+          <w:p>
+            <w:r/>
+            <w:r>
+              <w:rPr>
+                <w:b w:val="0"/>
+              </w:rPr>
+              <w:t>q=0.376</w:t>
             </w:r>
           </w:p>
         </w:tc>
@@ -21964,16 +22306,16 @@
       <w:tr>
         <w:tc>
           <w:tcPr>
-            <w:tcW w:type="dxa" w:w="1080"/>
-            <w:tcBorders/>
-          </w:tcPr>
-          <w:p>
-            <w:r/>
-          </w:p>
-        </w:tc>
-        <w:tc>
-          <w:tcPr>
-            <w:tcW w:type="dxa" w:w="1080"/>
+            <w:tcW w:type="dxa" w:w="960"/>
+            <w:tcBorders/>
+          </w:tcPr>
+          <w:p>
+            <w:r/>
+          </w:p>
+        </w:tc>
+        <w:tc>
+          <w:tcPr>
+            <w:tcW w:type="dxa" w:w="960"/>
             <w:tcBorders/>
           </w:tcPr>
           <w:p>
@@ -21988,7 +22330,7 @@
         </w:tc>
         <w:tc>
           <w:tcPr>
-            <w:tcW w:type="dxa" w:w="1080"/>
+            <w:tcW w:type="dxa" w:w="960"/>
             <w:tcBorders/>
           </w:tcPr>
           <w:p>
@@ -22003,7 +22345,7 @@
         </w:tc>
         <w:tc>
           <w:tcPr>
-            <w:tcW w:type="dxa" w:w="1080"/>
+            <w:tcW w:type="dxa" w:w="960"/>
             <w:tcBorders/>
           </w:tcPr>
           <w:p>
@@ -22018,7 +22360,7 @@
         </w:tc>
         <w:tc>
           <w:tcPr>
-            <w:tcW w:type="dxa" w:w="1080"/>
+            <w:tcW w:type="dxa" w:w="960"/>
             <w:tcBorders/>
           </w:tcPr>
           <w:p>
@@ -22033,7 +22375,7 @@
         </w:tc>
         <w:tc>
           <w:tcPr>
-            <w:tcW w:type="dxa" w:w="1080"/>
+            <w:tcW w:type="dxa" w:w="960"/>
             <w:tcBorders/>
           </w:tcPr>
           <w:p>
@@ -22048,7 +22390,7 @@
         </w:tc>
         <w:tc>
           <w:tcPr>
-            <w:tcW w:type="dxa" w:w="1080"/>
+            <w:tcW w:type="dxa" w:w="960"/>
             <w:tcBorders/>
           </w:tcPr>
           <w:p>
@@ -22063,7 +22405,7 @@
         </w:tc>
         <w:tc>
           <w:tcPr>
-            <w:tcW w:type="dxa" w:w="1080"/>
+            <w:tcW w:type="dxa" w:w="960"/>
             <w:tcBorders/>
           </w:tcPr>
           <w:p>
@@ -22073,6 +22415,21 @@
                 <w:b w:val="0"/>
               </w:rPr>
               <w:t>P=0.252</w:t>
+            </w:r>
+          </w:p>
+        </w:tc>
+        <w:tc>
+          <w:tcPr>
+            <w:tcW w:type="dxa" w:w="960"/>
+            <w:tcBorders/>
+          </w:tcPr>
+          <w:p>
+            <w:r/>
+            <w:r>
+              <w:rPr>
+                <w:b w:val="0"/>
+              </w:rPr>
+              <w:t>q=0.579</w:t>
             </w:r>
           </w:p>
         </w:tc>
@@ -22080,16 +22437,16 @@
       <w:tr>
         <w:tc>
           <w:tcPr>
-            <w:tcW w:type="dxa" w:w="1080"/>
-            <w:tcBorders/>
-          </w:tcPr>
-          <w:p>
-            <w:r/>
-          </w:p>
-        </w:tc>
-        <w:tc>
-          <w:tcPr>
-            <w:tcW w:type="dxa" w:w="1080"/>
+            <w:tcW w:type="dxa" w:w="960"/>
+            <w:tcBorders/>
+          </w:tcPr>
+          <w:p>
+            <w:r/>
+          </w:p>
+        </w:tc>
+        <w:tc>
+          <w:tcPr>
+            <w:tcW w:type="dxa" w:w="960"/>
             <w:tcBorders/>
           </w:tcPr>
           <w:p>
@@ -22104,7 +22461,7 @@
         </w:tc>
         <w:tc>
           <w:tcPr>
-            <w:tcW w:type="dxa" w:w="1080"/>
+            <w:tcW w:type="dxa" w:w="960"/>
             <w:tcBorders/>
           </w:tcPr>
           <w:p>
@@ -22119,7 +22476,7 @@
         </w:tc>
         <w:tc>
           <w:tcPr>
-            <w:tcW w:type="dxa" w:w="1080"/>
+            <w:tcW w:type="dxa" w:w="960"/>
             <w:tcBorders/>
           </w:tcPr>
           <w:p>
@@ -22134,7 +22491,7 @@
         </w:tc>
         <w:tc>
           <w:tcPr>
-            <w:tcW w:type="dxa" w:w="1080"/>
+            <w:tcW w:type="dxa" w:w="960"/>
             <w:tcBorders/>
           </w:tcPr>
           <w:p>
@@ -22149,7 +22506,7 @@
         </w:tc>
         <w:tc>
           <w:tcPr>
-            <w:tcW w:type="dxa" w:w="1080"/>
+            <w:tcW w:type="dxa" w:w="960"/>
             <w:tcBorders/>
           </w:tcPr>
           <w:p>
@@ -22164,7 +22521,7 @@
         </w:tc>
         <w:tc>
           <w:tcPr>
-            <w:tcW w:type="dxa" w:w="1080"/>
+            <w:tcW w:type="dxa" w:w="960"/>
             <w:tcBorders/>
           </w:tcPr>
           <w:p>
@@ -22179,7 +22536,7 @@
         </w:tc>
         <w:tc>
           <w:tcPr>
-            <w:tcW w:type="dxa" w:w="1080"/>
+            <w:tcW w:type="dxa" w:w="960"/>
             <w:tcBorders/>
           </w:tcPr>
           <w:p>
@@ -22189,6 +22546,21 @@
                 <w:b w:val="0"/>
               </w:rPr>
               <w:t>P=0.578</w:t>
+            </w:r>
+          </w:p>
+        </w:tc>
+        <w:tc>
+          <w:tcPr>
+            <w:tcW w:type="dxa" w:w="960"/>
+            <w:tcBorders/>
+          </w:tcPr>
+          <w:p>
+            <w:r/>
+            <w:r>
+              <w:rPr>
+                <w:b w:val="0"/>
+              </w:rPr>
+              <w:t>q=0.698</w:t>
             </w:r>
           </w:p>
         </w:tc>
@@ -22196,16 +22568,16 @@
       <w:tr>
         <w:tc>
           <w:tcPr>
-            <w:tcW w:type="dxa" w:w="1080"/>
-            <w:tcBorders/>
-          </w:tcPr>
-          <w:p>
-            <w:r/>
-          </w:p>
-        </w:tc>
-        <w:tc>
-          <w:tcPr>
-            <w:tcW w:type="dxa" w:w="1080"/>
+            <w:tcW w:type="dxa" w:w="960"/>
+            <w:tcBorders/>
+          </w:tcPr>
+          <w:p>
+            <w:r/>
+          </w:p>
+        </w:tc>
+        <w:tc>
+          <w:tcPr>
+            <w:tcW w:type="dxa" w:w="960"/>
             <w:tcBorders/>
           </w:tcPr>
           <w:p>
@@ -22220,7 +22592,7 @@
         </w:tc>
         <w:tc>
           <w:tcPr>
-            <w:tcW w:type="dxa" w:w="1080"/>
+            <w:tcW w:type="dxa" w:w="960"/>
             <w:tcBorders/>
           </w:tcPr>
           <w:p>
@@ -22235,7 +22607,7 @@
         </w:tc>
         <w:tc>
           <w:tcPr>
-            <w:tcW w:type="dxa" w:w="1080"/>
+            <w:tcW w:type="dxa" w:w="960"/>
             <w:tcBorders/>
           </w:tcPr>
           <w:p>
@@ -22250,7 +22622,7 @@
         </w:tc>
         <w:tc>
           <w:tcPr>
-            <w:tcW w:type="dxa" w:w="1080"/>
+            <w:tcW w:type="dxa" w:w="960"/>
             <w:tcBorders/>
           </w:tcPr>
           <w:p>
@@ -22265,7 +22637,7 @@
         </w:tc>
         <w:tc>
           <w:tcPr>
-            <w:tcW w:type="dxa" w:w="1080"/>
+            <w:tcW w:type="dxa" w:w="960"/>
             <w:tcBorders/>
           </w:tcPr>
           <w:p>
@@ -22280,7 +22652,7 @@
         </w:tc>
         <w:tc>
           <w:tcPr>
-            <w:tcW w:type="dxa" w:w="1080"/>
+            <w:tcW w:type="dxa" w:w="960"/>
             <w:tcBorders/>
           </w:tcPr>
           <w:p>
@@ -22295,7 +22667,7 @@
         </w:tc>
         <w:tc>
           <w:tcPr>
-            <w:tcW w:type="dxa" w:w="1080"/>
+            <w:tcW w:type="dxa" w:w="960"/>
             <w:tcBorders/>
           </w:tcPr>
           <w:p>
@@ -22305,6 +22677,21 @@
                 <w:b w:val="0"/>
               </w:rPr>
               <w:t>P=0.542</w:t>
+            </w:r>
+          </w:p>
+        </w:tc>
+        <w:tc>
+          <w:tcPr>
+            <w:tcW w:type="dxa" w:w="960"/>
+            <w:tcBorders/>
+          </w:tcPr>
+          <w:p>
+            <w:r/>
+            <w:r>
+              <w:rPr>
+                <w:b w:val="0"/>
+              </w:rPr>
+              <w:t>q=0.698</w:t>
             </w:r>
           </w:p>
         </w:tc>
@@ -22312,16 +22699,16 @@
       <w:tr>
         <w:tc>
           <w:tcPr>
-            <w:tcW w:type="dxa" w:w="1080"/>
-            <w:tcBorders/>
-          </w:tcPr>
-          <w:p>
-            <w:r/>
-          </w:p>
-        </w:tc>
-        <w:tc>
-          <w:tcPr>
-            <w:tcW w:type="dxa" w:w="1080"/>
+            <w:tcW w:type="dxa" w:w="960"/>
+            <w:tcBorders/>
+          </w:tcPr>
+          <w:p>
+            <w:r/>
+          </w:p>
+        </w:tc>
+        <w:tc>
+          <w:tcPr>
+            <w:tcW w:type="dxa" w:w="960"/>
             <w:tcBorders/>
           </w:tcPr>
           <w:p>
@@ -22336,7 +22723,7 @@
         </w:tc>
         <w:tc>
           <w:tcPr>
-            <w:tcW w:type="dxa" w:w="1080"/>
+            <w:tcW w:type="dxa" w:w="960"/>
             <w:tcBorders/>
           </w:tcPr>
           <w:p>
@@ -22351,7 +22738,7 @@
         </w:tc>
         <w:tc>
           <w:tcPr>
-            <w:tcW w:type="dxa" w:w="1080"/>
+            <w:tcW w:type="dxa" w:w="960"/>
             <w:tcBorders/>
           </w:tcPr>
           <w:p>
@@ -22366,7 +22753,7 @@
         </w:tc>
         <w:tc>
           <w:tcPr>
-            <w:tcW w:type="dxa" w:w="1080"/>
+            <w:tcW w:type="dxa" w:w="960"/>
             <w:tcBorders/>
           </w:tcPr>
           <w:p>
@@ -22381,7 +22768,7 @@
         </w:tc>
         <w:tc>
           <w:tcPr>
-            <w:tcW w:type="dxa" w:w="1080"/>
+            <w:tcW w:type="dxa" w:w="960"/>
             <w:tcBorders/>
           </w:tcPr>
           <w:p>
@@ -22396,7 +22783,7 @@
         </w:tc>
         <w:tc>
           <w:tcPr>
-            <w:tcW w:type="dxa" w:w="1080"/>
+            <w:tcW w:type="dxa" w:w="960"/>
             <w:tcBorders/>
           </w:tcPr>
           <w:p>
@@ -22411,7 +22798,7 @@
         </w:tc>
         <w:tc>
           <w:tcPr>
-            <w:tcW w:type="dxa" w:w="1080"/>
+            <w:tcW w:type="dxa" w:w="960"/>
             <w:tcBorders/>
           </w:tcPr>
           <w:p>
@@ -22421,6 +22808,21 @@
                 <w:b w:val="0"/>
               </w:rPr>
               <w:t>P=0.616</w:t>
+            </w:r>
+          </w:p>
+        </w:tc>
+        <w:tc>
+          <w:tcPr>
+            <w:tcW w:type="dxa" w:w="960"/>
+            <w:tcBorders/>
+          </w:tcPr>
+          <w:p>
+            <w:r/>
+            <w:r>
+              <w:rPr>
+                <w:b w:val="0"/>
+              </w:rPr>
+              <w:t>q=0.698</w:t>
             </w:r>
           </w:p>
         </w:tc>
@@ -22428,16 +22830,16 @@
       <w:tr>
         <w:tc>
           <w:tcPr>
-            <w:tcW w:type="dxa" w:w="1080"/>
-            <w:tcBorders/>
-          </w:tcPr>
-          <w:p>
-            <w:r/>
-          </w:p>
-        </w:tc>
-        <w:tc>
-          <w:tcPr>
-            <w:tcW w:type="dxa" w:w="1080"/>
+            <w:tcW w:type="dxa" w:w="960"/>
+            <w:tcBorders/>
+          </w:tcPr>
+          <w:p>
+            <w:r/>
+          </w:p>
+        </w:tc>
+        <w:tc>
+          <w:tcPr>
+            <w:tcW w:type="dxa" w:w="960"/>
             <w:tcBorders/>
           </w:tcPr>
           <w:p>
@@ -22452,7 +22854,7 @@
         </w:tc>
         <w:tc>
           <w:tcPr>
-            <w:tcW w:type="dxa" w:w="1080"/>
+            <w:tcW w:type="dxa" w:w="960"/>
             <w:tcBorders/>
           </w:tcPr>
           <w:p>
@@ -22467,7 +22869,7 @@
         </w:tc>
         <w:tc>
           <w:tcPr>
-            <w:tcW w:type="dxa" w:w="1080"/>
+            <w:tcW w:type="dxa" w:w="960"/>
             <w:tcBorders/>
           </w:tcPr>
           <w:p>
@@ -22482,7 +22884,7 @@
         </w:tc>
         <w:tc>
           <w:tcPr>
-            <w:tcW w:type="dxa" w:w="1080"/>
+            <w:tcW w:type="dxa" w:w="960"/>
             <w:tcBorders/>
           </w:tcPr>
           <w:p>
@@ -22497,7 +22899,7 @@
         </w:tc>
         <w:tc>
           <w:tcPr>
-            <w:tcW w:type="dxa" w:w="1080"/>
+            <w:tcW w:type="dxa" w:w="960"/>
             <w:tcBorders/>
           </w:tcPr>
           <w:p>
@@ -22512,7 +22914,7 @@
         </w:tc>
         <w:tc>
           <w:tcPr>
-            <w:tcW w:type="dxa" w:w="1080"/>
+            <w:tcW w:type="dxa" w:w="960"/>
             <w:tcBorders/>
           </w:tcPr>
           <w:p>
@@ -22527,7 +22929,7 @@
         </w:tc>
         <w:tc>
           <w:tcPr>
-            <w:tcW w:type="dxa" w:w="1080"/>
+            <w:tcW w:type="dxa" w:w="960"/>
             <w:tcBorders/>
           </w:tcPr>
           <w:p>
@@ -22537,6 +22939,21 @@
                 <w:b w:val="0"/>
               </w:rPr>
               <w:t>P=0.443</w:t>
+            </w:r>
+          </w:p>
+        </w:tc>
+        <w:tc>
+          <w:tcPr>
+            <w:tcW w:type="dxa" w:w="960"/>
+            <w:tcBorders/>
+          </w:tcPr>
+          <w:p>
+            <w:r/>
+            <w:r>
+              <w:rPr>
+                <w:b w:val="0"/>
+              </w:rPr>
+              <w:t>q=0.674</w:t>
             </w:r>
           </w:p>
         </w:tc>
@@ -22544,16 +22961,16 @@
       <w:tr>
         <w:tc>
           <w:tcPr>
-            <w:tcW w:type="dxa" w:w="1080"/>
-            <w:tcBorders/>
-          </w:tcPr>
-          <w:p>
-            <w:r/>
-          </w:p>
-        </w:tc>
-        <w:tc>
-          <w:tcPr>
-            <w:tcW w:type="dxa" w:w="1080"/>
+            <w:tcW w:type="dxa" w:w="960"/>
+            <w:tcBorders/>
+          </w:tcPr>
+          <w:p>
+            <w:r/>
+          </w:p>
+        </w:tc>
+        <w:tc>
+          <w:tcPr>
+            <w:tcW w:type="dxa" w:w="960"/>
             <w:tcBorders/>
           </w:tcPr>
           <w:p>
@@ -22568,7 +22985,7 @@
         </w:tc>
         <w:tc>
           <w:tcPr>
-            <w:tcW w:type="dxa" w:w="1080"/>
+            <w:tcW w:type="dxa" w:w="960"/>
             <w:tcBorders/>
           </w:tcPr>
           <w:p>
@@ -22583,7 +23000,7 @@
         </w:tc>
         <w:tc>
           <w:tcPr>
-            <w:tcW w:type="dxa" w:w="1080"/>
+            <w:tcW w:type="dxa" w:w="960"/>
             <w:tcBorders/>
           </w:tcPr>
           <w:p>
@@ -22598,7 +23015,7 @@
         </w:tc>
         <w:tc>
           <w:tcPr>
-            <w:tcW w:type="dxa" w:w="1080"/>
+            <w:tcW w:type="dxa" w:w="960"/>
             <w:tcBorders/>
           </w:tcPr>
           <w:p>
@@ -22613,7 +23030,7 @@
         </w:tc>
         <w:tc>
           <w:tcPr>
-            <w:tcW w:type="dxa" w:w="1080"/>
+            <w:tcW w:type="dxa" w:w="960"/>
             <w:tcBorders/>
           </w:tcPr>
           <w:p>
@@ -22628,7 +23045,7 @@
         </w:tc>
         <w:tc>
           <w:tcPr>
-            <w:tcW w:type="dxa" w:w="1080"/>
+            <w:tcW w:type="dxa" w:w="960"/>
             <w:tcBorders/>
           </w:tcPr>
           <w:p>
@@ -22643,7 +23060,7 @@
         </w:tc>
         <w:tc>
           <w:tcPr>
-            <w:tcW w:type="dxa" w:w="1080"/>
+            <w:tcW w:type="dxa" w:w="960"/>
             <w:tcBorders/>
           </w:tcPr>
           <w:p>
@@ -22653,6 +23070,21 @@
                 <w:b w:val="0"/>
               </w:rPr>
               <w:t>P=0.932</w:t>
+            </w:r>
+          </w:p>
+        </w:tc>
+        <w:tc>
+          <w:tcPr>
+            <w:tcW w:type="dxa" w:w="960"/>
+            <w:tcBorders/>
+          </w:tcPr>
+          <w:p>
+            <w:r/>
+            <w:r>
+              <w:rPr>
+                <w:b w:val="0"/>
+              </w:rPr>
+              <w:t>q=0.932</w:t>
             </w:r>
           </w:p>
         </w:tc>
@@ -22660,16 +23092,16 @@
       <w:tr>
         <w:tc>
           <w:tcPr>
-            <w:tcW w:type="dxa" w:w="1080"/>
-            <w:tcBorders/>
-          </w:tcPr>
-          <w:p>
-            <w:r/>
-          </w:p>
-        </w:tc>
-        <w:tc>
-          <w:tcPr>
-            <w:tcW w:type="dxa" w:w="1080"/>
+            <w:tcW w:type="dxa" w:w="960"/>
+            <w:tcBorders/>
+          </w:tcPr>
+          <w:p>
+            <w:r/>
+          </w:p>
+        </w:tc>
+        <w:tc>
+          <w:tcPr>
+            <w:tcW w:type="dxa" w:w="960"/>
             <w:tcBorders/>
           </w:tcPr>
           <w:p>
@@ -22684,7 +23116,7 @@
         </w:tc>
         <w:tc>
           <w:tcPr>
-            <w:tcW w:type="dxa" w:w="1080"/>
+            <w:tcW w:type="dxa" w:w="960"/>
             <w:tcBorders/>
           </w:tcPr>
           <w:p>
@@ -22699,7 +23131,7 @@
         </w:tc>
         <w:tc>
           <w:tcPr>
-            <w:tcW w:type="dxa" w:w="1080"/>
+            <w:tcW w:type="dxa" w:w="960"/>
             <w:tcBorders/>
           </w:tcPr>
           <w:p>
@@ -22714,7 +23146,7 @@
         </w:tc>
         <w:tc>
           <w:tcPr>
-            <w:tcW w:type="dxa" w:w="1080"/>
+            <w:tcW w:type="dxa" w:w="960"/>
             <w:tcBorders/>
           </w:tcPr>
           <w:p>
@@ -22729,7 +23161,7 @@
         </w:tc>
         <w:tc>
           <w:tcPr>
-            <w:tcW w:type="dxa" w:w="1080"/>
+            <w:tcW w:type="dxa" w:w="960"/>
             <w:tcBorders/>
           </w:tcPr>
           <w:p>
@@ -22744,7 +23176,7 @@
         </w:tc>
         <w:tc>
           <w:tcPr>
-            <w:tcW w:type="dxa" w:w="1080"/>
+            <w:tcW w:type="dxa" w:w="960"/>
             <w:tcBorders/>
           </w:tcPr>
           <w:p>
@@ -22759,7 +23191,7 @@
         </w:tc>
         <w:tc>
           <w:tcPr>
-            <w:tcW w:type="dxa" w:w="1080"/>
+            <w:tcW w:type="dxa" w:w="960"/>
             <w:tcBorders/>
           </w:tcPr>
           <w:p>
@@ -22769,6 +23201,21 @@
                 <w:b w:val="0"/>
               </w:rPr>
               <w:t>P=0.742</w:t>
+            </w:r>
+          </w:p>
+        </w:tc>
+        <w:tc>
+          <w:tcPr>
+            <w:tcW w:type="dxa" w:w="960"/>
+            <w:tcBorders/>
+          </w:tcPr>
+          <w:p>
+            <w:r/>
+            <w:r>
+              <w:rPr>
+                <w:b w:val="0"/>
+              </w:rPr>
+              <w:t>q=0.789</w:t>
             </w:r>
           </w:p>
         </w:tc>
@@ -22776,16 +23223,16 @@
       <w:tr>
         <w:tc>
           <w:tcPr>
-            <w:tcW w:type="dxa" w:w="1080"/>
-            <w:tcBorders/>
-          </w:tcPr>
-          <w:p>
-            <w:r/>
-          </w:p>
-        </w:tc>
-        <w:tc>
-          <w:tcPr>
-            <w:tcW w:type="dxa" w:w="1080"/>
+            <w:tcW w:type="dxa" w:w="960"/>
+            <w:tcBorders/>
+          </w:tcPr>
+          <w:p>
+            <w:r/>
+          </w:p>
+        </w:tc>
+        <w:tc>
+          <w:tcPr>
+            <w:tcW w:type="dxa" w:w="960"/>
             <w:tcBorders/>
           </w:tcPr>
           <w:p>
@@ -22800,7 +23247,7 @@
         </w:tc>
         <w:tc>
           <w:tcPr>
-            <w:tcW w:type="dxa" w:w="1080"/>
+            <w:tcW w:type="dxa" w:w="960"/>
             <w:tcBorders/>
           </w:tcPr>
           <w:p>
@@ -22815,7 +23262,7 @@
         </w:tc>
         <w:tc>
           <w:tcPr>
-            <w:tcW w:type="dxa" w:w="1080"/>
+            <w:tcW w:type="dxa" w:w="960"/>
             <w:tcBorders/>
           </w:tcPr>
           <w:p>
@@ -22830,7 +23277,7 @@
         </w:tc>
         <w:tc>
           <w:tcPr>
-            <w:tcW w:type="dxa" w:w="1080"/>
+            <w:tcW w:type="dxa" w:w="960"/>
             <w:tcBorders/>
           </w:tcPr>
           <w:p>
@@ -22845,7 +23292,7 @@
         </w:tc>
         <w:tc>
           <w:tcPr>
-            <w:tcW w:type="dxa" w:w="1080"/>
+            <w:tcW w:type="dxa" w:w="960"/>
             <w:tcBorders/>
           </w:tcPr>
           <w:p>
@@ -22860,7 +23307,7 @@
         </w:tc>
         <w:tc>
           <w:tcPr>
-            <w:tcW w:type="dxa" w:w="1080"/>
+            <w:tcW w:type="dxa" w:w="960"/>
             <w:tcBorders/>
           </w:tcPr>
           <w:p>
@@ -22875,7 +23322,7 @@
         </w:tc>
         <w:tc>
           <w:tcPr>
-            <w:tcW w:type="dxa" w:w="1080"/>
+            <w:tcW w:type="dxa" w:w="960"/>
             <w:tcBorders/>
           </w:tcPr>
           <w:p>
@@ -22885,6 +23332,21 @@
                 <w:b w:val="0"/>
               </w:rPr>
               <w:t>P=0.307</w:t>
+            </w:r>
+          </w:p>
+        </w:tc>
+        <w:tc>
+          <w:tcPr>
+            <w:tcW w:type="dxa" w:w="960"/>
+            <w:tcBorders/>
+          </w:tcPr>
+          <w:p>
+            <w:r/>
+            <w:r>
+              <w:rPr>
+                <w:b w:val="0"/>
+              </w:rPr>
+              <w:t>q=0.579</w:t>
             </w:r>
           </w:p>
         </w:tc>
@@ -22892,7 +23354,7 @@
       <w:tr>
         <w:tc>
           <w:tcPr>
-            <w:tcW w:type="dxa" w:w="1080"/>
+            <w:tcW w:type="dxa" w:w="960"/>
             <w:tcBorders>
               <w:bottom w:val="single" w:sz="12" w:space="0" w:color="000000"/>
             </w:tcBorders>
@@ -22903,7 +23365,7 @@
         </w:tc>
         <w:tc>
           <w:tcPr>
-            <w:tcW w:type="dxa" w:w="1080"/>
+            <w:tcW w:type="dxa" w:w="960"/>
             <w:tcBorders>
               <w:bottom w:val="single" w:sz="12" w:space="0" w:color="000000"/>
             </w:tcBorders>
@@ -22920,7 +23382,7 @@
         </w:tc>
         <w:tc>
           <w:tcPr>
-            <w:tcW w:type="dxa" w:w="1080"/>
+            <w:tcW w:type="dxa" w:w="960"/>
             <w:tcBorders>
               <w:bottom w:val="single" w:sz="12" w:space="0" w:color="000000"/>
             </w:tcBorders>
@@ -22937,7 +23399,7 @@
         </w:tc>
         <w:tc>
           <w:tcPr>
-            <w:tcW w:type="dxa" w:w="1080"/>
+            <w:tcW w:type="dxa" w:w="960"/>
             <w:tcBorders>
               <w:bottom w:val="single" w:sz="12" w:space="0" w:color="000000"/>
             </w:tcBorders>
@@ -22954,7 +23416,7 @@
         </w:tc>
         <w:tc>
           <w:tcPr>
-            <w:tcW w:type="dxa" w:w="1080"/>
+            <w:tcW w:type="dxa" w:w="960"/>
             <w:tcBorders>
               <w:bottom w:val="single" w:sz="12" w:space="0" w:color="000000"/>
             </w:tcBorders>
@@ -22971,7 +23433,7 @@
         </w:tc>
         <w:tc>
           <w:tcPr>
-            <w:tcW w:type="dxa" w:w="1080"/>
+            <w:tcW w:type="dxa" w:w="960"/>
             <w:tcBorders>
               <w:bottom w:val="single" w:sz="12" w:space="0" w:color="000000"/>
             </w:tcBorders>
@@ -22988,7 +23450,7 @@
         </w:tc>
         <w:tc>
           <w:tcPr>
-            <w:tcW w:type="dxa" w:w="1080"/>
+            <w:tcW w:type="dxa" w:w="960"/>
             <w:tcBorders>
               <w:bottom w:val="single" w:sz="12" w:space="0" w:color="000000"/>
             </w:tcBorders>
@@ -23005,7 +23467,7 @@
         </w:tc>
         <w:tc>
           <w:tcPr>
-            <w:tcW w:type="dxa" w:w="1080"/>
+            <w:tcW w:type="dxa" w:w="960"/>
             <w:tcBorders>
               <w:bottom w:val="single" w:sz="12" w:space="0" w:color="000000"/>
             </w:tcBorders>
@@ -23017,6 +23479,23 @@
                 <w:b w:val="0"/>
               </w:rPr>
               <w:t>P=0.340</w:t>
+            </w:r>
+          </w:p>
+        </w:tc>
+        <w:tc>
+          <w:tcPr>
+            <w:tcW w:type="dxa" w:w="960"/>
+            <w:tcBorders>
+              <w:bottom w:val="single" w:sz="12" w:space="0" w:color="000000"/>
+            </w:tcBorders>
+          </w:tcPr>
+          <w:p>
+            <w:r/>
+            <w:r>
+              <w:rPr>
+                <w:b w:val="0"/>
+              </w:rPr>
+              <w:t>q=0.579</w:t>
             </w:r>
           </w:p>
         </w:tc>
@@ -23352,7 +23831,7 @@
         <w:rPr>
           <w:b w:val="0"/>
         </w:rPr>
-        <w:t>Path-AGNN-Cox couples a pathway-constrained GNN with patient-specific attention to a formal statistical framework for testing and clinically anchoring patient-specific pathway rewiring, its discrimination is below penalized Cox and comparable to the deep survival baselines only on external cohorts. With 11 internal and 25 external cohorts, open-source code at https://github.com/ZhongdaHospital-SEU/Path-AGNN-Cox, a versioned Zenodo archive at https://doi.org/10.5281/zenodo.22030045, and a pip-installable Python package, the framework is directly reusable for pan-cancer prognostic modeling and for interrogating the patient-specific graph dynamics that static pathway models cannot produce.</w:t>
+        <w:t>Path-AGNN-Cox couples a pathway-constrained GNN with patient-specific attention to a formal statistical framework for testing and clinically anchoring patient-specific pathway rewiring; its discrimination is below penalized Cox and comparable to the deep survival baselines only on external cohorts. With 11 internal and 25 external cohorts, open-source code at https://github.com/ZhongdaHospital-SEU/Path-AGNN-Cox, a versioned Zenodo archive at https://doi.org/10.5281/zenodo.22030045, and a pip-installable Python package, the framework is directly reusable for pan-cancer prognostic modeling and for interrogating the patient-specific graph dynamics that static pathway models cannot produce.</w:t>
       </w:r>
     </w:p>
     <w:p>
@@ -23380,7 +23859,35 @@
         <w:rPr>
           <w:b w:val="0"/>
         </w:rPr>
-        <w:t xml:space="preserve"> https://github.com/ZhongdaHospital-SEU/Path-AGNN-Cox (MIT license; Python package `path_agnn_cox`; R preprocessing scripts in `data/scripts/`; Zenodo archive: https://doi.org/10.5281/zenodo.22030045).</w:t>
+        <w:t xml:space="preserve"> https://github.com/ZhongdaHospital-SEU/Path-AGNN-Cox (MIT license; Python package </w:t>
+      </w:r>
+      <w:r>
+        <w:rPr>
+          <w:rFonts w:ascii="Consolas" w:hAnsi="Consolas"/>
+          <w:b w:val="0"/>
+          <w:sz w:val="19"/>
+        </w:rPr>
+        <w:t>path_agnn_cox</w:t>
+      </w:r>
+      <w:r>
+        <w:rPr>
+          <w:b w:val="0"/>
+        </w:rPr>
+        <w:t xml:space="preserve">; R preprocessing scripts in </w:t>
+      </w:r>
+      <w:r>
+        <w:rPr>
+          <w:rFonts w:ascii="Consolas" w:hAnsi="Consolas"/>
+          <w:b w:val="0"/>
+          <w:sz w:val="19"/>
+        </w:rPr>
+        <w:t>data/scripts/</w:t>
+      </w:r>
+      <w:r>
+        <w:rPr>
+          <w:b w:val="0"/>
+        </w:rPr>
+        <w:t>; Zenodo archive: https://doi.org/10.5281/zenodo.22030045).</w:t>
       </w:r>
     </w:p>
     <w:p>
@@ -23397,7 +23904,49 @@
         <w:rPr>
           <w:b w:val="0"/>
         </w:rPr>
-        <w:t xml:space="preserve"> `pip install path-agnn-cox` (PyPI) or `pip install .` from the repository; example notebooks under `examples/`.</w:t>
+        <w:t xml:space="preserve"> </w:t>
+      </w:r>
+      <w:r>
+        <w:rPr>
+          <w:rFonts w:ascii="Consolas" w:hAnsi="Consolas"/>
+          <w:b w:val="0"/>
+          <w:sz w:val="19"/>
+        </w:rPr>
+        <w:t>pip install path-agnn-cox</w:t>
+      </w:r>
+      <w:r>
+        <w:rPr>
+          <w:b w:val="0"/>
+        </w:rPr>
+        <w:t xml:space="preserve"> (PyPI) or </w:t>
+      </w:r>
+      <w:r>
+        <w:rPr>
+          <w:rFonts w:ascii="Consolas" w:hAnsi="Consolas"/>
+          <w:b w:val="0"/>
+          <w:sz w:val="19"/>
+        </w:rPr>
+        <w:t>pip install .</w:t>
+      </w:r>
+      <w:r>
+        <w:rPr>
+          <w:b w:val="0"/>
+        </w:rPr>
+        <w:t xml:space="preserve"> from the repository; example notebooks under </w:t>
+      </w:r>
+      <w:r>
+        <w:rPr>
+          <w:rFonts w:ascii="Consolas" w:hAnsi="Consolas"/>
+          <w:b w:val="0"/>
+          <w:sz w:val="19"/>
+        </w:rPr>
+        <w:t>examples/</w:t>
+      </w:r>
+      <w:r>
+        <w:rPr>
+          <w:b w:val="0"/>
+        </w:rPr>
+        <w:t>.</w:t>
       </w:r>
     </w:p>
     <w:p>
@@ -23431,7 +23980,49 @@
         <w:rPr>
           <w:b w:val="0"/>
         </w:rPr>
-        <w:t xml:space="preserve"> `manuscript/render_manuscript.py` and `manuscript/make_figures.py` regenerate every table and figure from `results/benchmark_results.csv` and the rewiring outputs (see README.md).</w:t>
+        <w:t xml:space="preserve"> </w:t>
+      </w:r>
+      <w:r>
+        <w:rPr>
+          <w:rFonts w:ascii="Consolas" w:hAnsi="Consolas"/>
+          <w:b w:val="0"/>
+          <w:sz w:val="19"/>
+        </w:rPr>
+        <w:t>manuscript/render_manuscript.py</w:t>
+      </w:r>
+      <w:r>
+        <w:rPr>
+          <w:b w:val="0"/>
+        </w:rPr>
+        <w:t xml:space="preserve"> and </w:t>
+      </w:r>
+      <w:r>
+        <w:rPr>
+          <w:rFonts w:ascii="Consolas" w:hAnsi="Consolas"/>
+          <w:b w:val="0"/>
+          <w:sz w:val="19"/>
+        </w:rPr>
+        <w:t>manuscript/make_figures.py</w:t>
+      </w:r>
+      <w:r>
+        <w:rPr>
+          <w:b w:val="0"/>
+        </w:rPr>
+        <w:t xml:space="preserve"> regenerate every table and figure from </w:t>
+      </w:r>
+      <w:r>
+        <w:rPr>
+          <w:rFonts w:ascii="Consolas" w:hAnsi="Consolas"/>
+          <w:b w:val="0"/>
+          <w:sz w:val="19"/>
+        </w:rPr>
+        <w:t>results/benchmark_results.csv</w:t>
+      </w:r>
+      <w:r>
+        <w:rPr>
+          <w:b w:val="0"/>
+        </w:rPr>
+        <w:t xml:space="preserve"> and the rewiring outputs (see README.md).</w:t>
       </w:r>
     </w:p>
     <w:p>

</xml_diff>